<commit_message>
Skriv inte diagram-mappen som standard
Diagrammen behövs för att bäddas in i Excel-fliken Sammanfattning, men
PNG-filerna behövde ingen. De ritas nu i en temporär katalog som städas
bort efter att Excel-filen skrivits.

- Ny flagga --diagram sparar dem i <utdata>/diagram som tidigare
- KONFIG: SPARA_DIAGRAM styr standardvärdet
- Användarhandledning och CLAUDE.md uppdaterade

Co-Authored-By: Claude Opus 5 <noreply@anthropic.com>
Claude-Session: https://claude.ai/code/session_011fdqX3JEZje1LF9LqpaqR8
</commit_message>
<xml_diff>
--- a/Anvandarhandledning tv3_analys.docx
+++ b/Anvandarhandledning tv3_analys.docx
@@ -45,7 +45,7 @@
         <w:t xml:space="preserve">tv3_analys.py</w:t>
       </w:r>
       <w:r>
-        <w:t xml:space="preserve"> läser en eller flera TV3-filer (Svenskt Vatten TV-fil version 3.0 med P93-koder), poängsätter varje ledningssträcka utifrån de registrerade observationerna och tar fram ett underlag för prioritering av renovering: en Excel-arbetsbok med klickbara länkar till film och bilder, fyra diagram för presentationer och ett inspektionsprotokoll i PDF per sträcka (i stil med WinCan-rapporter) med sträckdata, schematisk översikt, observationslista, inklinometerprofil och fotografier. All bearbetning sker lokalt på din dator – inga filer skickas någonstans.</w:t>
+        <w:t xml:space="preserve"> läser en eller flera TV3-filer (Svenskt Vatten TV-fil version 3.0 med P93-koder), poängsätter varje ledningssträcka utifrån de registrerade observationerna och tar fram ett underlag för prioritering av renovering: en Excel-arbetsbok med klickbara länkar till film och bilder, diagram för presentationer och ett inspektionsprotokoll i PDF per sträcka (i stil med WinCan-rapporter) med sträckdata, schematisk översikt, observationslista, inklinometerprofil och fotografier. All bearbetning sker lokalt på din dator – inga filer skickas någonstans.</w:t>
       </w:r>
     </w:p>
     <w:p>
@@ -1180,6 +1180,102 @@
                 <w:szCs w:val="20"/>
                 <w:shd w:fill="F2F2F2" w:val="clear"/>
               </w:rPr>
+              <w:t xml:space="preserve">--diagram</w:t>
+            </w:r>
+          </w:p>
+        </w:tc>
+        <w:tc>
+          <w:tcPr>
+            <w:tcW w:type="dxa" w:w="5000"/>
+            <w:tcBorders>
+              <w:top w:val="single" w:color="BFBFBF" w:sz="4"/>
+              <w:left w:val="single" w:color="BFBFBF" w:sz="4"/>
+              <w:bottom w:val="single" w:color="BFBFBF" w:sz="4"/>
+              <w:right w:val="single" w:color="BFBFBF" w:sz="4"/>
+            </w:tcBorders>
+            <w:tcMar>
+              <w:top w:type="dxa" w:w="60"/>
+              <w:left w:type="dxa" w:w="100"/>
+              <w:bottom w:type="dxa" w:w="60"/>
+              <w:right w:type="dxa" w:w="100"/>
+            </w:tcMar>
+          </w:tcPr>
+          <w:p>
+            <w:pPr>
+              <w:spacing w:after="0"/>
+            </w:pPr>
+            <w:r>
+              <w:t xml:space="preserve">Sparar diagrammen som PNG-filer i </w:t>
+            </w:r>
+            <w:r>
+              <w:rPr>
+                <w:rFonts w:ascii="Consolas" w:cs="Consolas" w:eastAsia="Consolas" w:hAnsi="Consolas"/>
+                <w:sz w:val="20"/>
+                <w:szCs w:val="20"/>
+                <w:shd w:fill="F2F2F2" w:val="clear"/>
+              </w:rPr>
+              <w:t xml:space="preserve">diagram</w:t>
+            </w:r>
+            <w:r>
+              <w:t xml:space="preserve">-mappen, t.ex. för PowerPoint. Utan flaggan bäddas de bara in i Excel-filen.</w:t>
+            </w:r>
+          </w:p>
+        </w:tc>
+        <w:tc>
+          <w:tcPr>
+            <w:tcW w:type="dxa" w:w="1760"/>
+            <w:tcBorders>
+              <w:top w:val="single" w:color="BFBFBF" w:sz="4"/>
+              <w:left w:val="single" w:color="BFBFBF" w:sz="4"/>
+              <w:bottom w:val="single" w:color="BFBFBF" w:sz="4"/>
+              <w:right w:val="single" w:color="BFBFBF" w:sz="4"/>
+            </w:tcBorders>
+            <w:tcMar>
+              <w:top w:type="dxa" w:w="60"/>
+              <w:left w:type="dxa" w:w="100"/>
+              <w:bottom w:type="dxa" w:w="60"/>
+              <w:right w:type="dxa" w:w="100"/>
+            </w:tcMar>
+          </w:tcPr>
+          <w:p>
+            <w:pPr>
+              <w:spacing w:after="0"/>
+            </w:pPr>
+            <w:r>
+              <w:t xml:space="preserve">av</w:t>
+            </w:r>
+          </w:p>
+        </w:tc>
+      </w:tr>
+      <w:tr>
+        <w:tc>
+          <w:tcPr>
+            <w:tcW w:type="dxa" w:w="2600"/>
+            <w:tcBorders>
+              <w:top w:val="single" w:color="BFBFBF" w:sz="4"/>
+              <w:left w:val="single" w:color="BFBFBF" w:sz="4"/>
+              <w:bottom w:val="single" w:color="BFBFBF" w:sz="4"/>
+              <w:right w:val="single" w:color="BFBFBF" w:sz="4"/>
+            </w:tcBorders>
+            <w:shd w:fill="F7F9FC" w:val="clear"/>
+            <w:tcMar>
+              <w:top w:type="dxa" w:w="60"/>
+              <w:left w:type="dxa" w:w="100"/>
+              <w:bottom w:type="dxa" w:w="60"/>
+              <w:right w:type="dxa" w:w="100"/>
+            </w:tcMar>
+          </w:tcPr>
+          <w:p>
+            <w:pPr>
+              <w:spacing w:after="0"/>
+            </w:pPr>
+            <w:r>
+              <w:rPr>
+                <w:rFonts w:ascii="Consolas" w:cs="Consolas" w:eastAsia="Consolas" w:hAnsi="Consolas"/>
+                <w:sz w:val="20"/>
+                <w:szCs w:val="20"/>
+                <w:shd w:fill="F2F2F2" w:val="clear"/>
+              </w:rPr>
               <w:t xml:space="preserve">--media KATALOG</w:t>
             </w:r>
           </w:p>
@@ -1193,6 +1289,7 @@
               <w:bottom w:val="single" w:color="BFBFBF" w:sz="4"/>
               <w:right w:val="single" w:color="BFBFBF" w:sz="4"/>
             </w:tcBorders>
+            <w:shd w:fill="F7F9FC" w:val="clear"/>
             <w:tcMar>
               <w:top w:type="dxa" w:w="60"/>
               <w:left w:type="dxa" w:w="100"/>
@@ -1218,6 +1315,7 @@
               <w:bottom w:val="single" w:color="BFBFBF" w:sz="4"/>
               <w:right w:val="single" w:color="BFBFBF" w:sz="4"/>
             </w:tcBorders>
+            <w:shd w:fill="F7F9FC" w:val="clear"/>
             <w:tcMar>
               <w:top w:type="dxa" w:w="60"/>
               <w:left w:type="dxa" w:w="100"/>
@@ -1451,7 +1549,7 @@
                 <w:szCs w:val="20"/>
                 <w:shd w:fill="F2F2F2" w:val="clear"/>
               </w:rPr>
-              <w:t xml:space="preserve">diagram/1_prioritetsklasser.png</w:t>
+              <w:t xml:space="preserve">diagram/*.png</w:t>
             </w:r>
           </w:p>
         </w:tc>
@@ -1477,7 +1575,19 @@
               <w:spacing w:after="0"/>
             </w:pPr>
             <w:r>
-              <w:t xml:space="preserve">Inspekterad ledningslängd per prioritetsklass.</w:t>
+              <w:t xml:space="preserve">Skrivs bara om du kör med </w:t>
+            </w:r>
+            <w:r>
+              <w:rPr>
+                <w:rFonts w:ascii="Consolas" w:cs="Consolas" w:eastAsia="Consolas" w:hAnsi="Consolas"/>
+                <w:sz w:val="20"/>
+                <w:szCs w:val="20"/>
+                <w:shd w:fill="F2F2F2" w:val="clear"/>
+              </w:rPr>
+              <w:t xml:space="preserve">--diagram</w:t>
+            </w:r>
+            <w:r>
+              <w:t xml:space="preserve">: 1_prioritetsklasser (inspekterad ledningslängd per prioritetsklass), 2_topplista (de N mest kritiska sträckorna, uppdelat på konstruktions- och driftskador), 3_observationer_per_kod (antal skadeobservationer per kod och grad) och 4_klass_per_material (prioritetsklass per material, andel av inspekterad längd).</w:t>
             </w:r>
           </w:p>
         </w:tc>
@@ -1510,7 +1620,7 @@
                 <w:szCs w:val="20"/>
                 <w:shd w:fill="F2F2F2" w:val="clear"/>
               </w:rPr>
-              <w:t xml:space="preserve">diagram/2_topplista.png</w:t>
+              <w:t xml:space="preserve">rapporter/*.pdf</w:t>
             </w:r>
           </w:p>
         </w:tc>
@@ -1535,7 +1645,19 @@
               <w:spacing w:after="0"/>
             </w:pPr>
             <w:r>
-              <w:t xml:space="preserve">De N mest kritiska sträckorna, uppdelat på konstruktions- och driftskador.</w:t>
+              <w:t xml:space="preserve">Ett inspektionsprotokoll per sträcka, namngivet </w:t>
+            </w:r>
+            <w:r>
+              <w:rPr>
+                <w:rFonts w:ascii="Consolas" w:cs="Consolas" w:eastAsia="Consolas" w:hAnsi="Consolas"/>
+                <w:sz w:val="20"/>
+                <w:szCs w:val="20"/>
+                <w:shd w:fill="F2F2F2" w:val="clear"/>
+              </w:rPr>
+              <w:t xml:space="preserve">&lt;tv3-fil&gt;_&lt;nr&gt;_&lt;klass&gt;_&lt;startbrunn&gt;-&lt;slutbrunn&gt;.pdf</w:t>
+            </w:r>
+            <w:r>
+              <w:t xml:space="preserve">. Innehåller sträckdata (material, dimension, längd, antal anslutningar, prioritetsklass, index m.m.), schematisk översikt med skador och anslutningar, observationstabell färgad efter grad, inklinometerprofil med lutning och svacka, samt de fotografier som hittats i mediamapparna.</w:t>
             </w:r>
           </w:p>
         </w:tc>
@@ -1569,7 +1691,7 @@
                 <w:szCs w:val="20"/>
                 <w:shd w:fill="F2F2F2" w:val="clear"/>
               </w:rPr>
-              <w:t xml:space="preserve">diagram/3_observationer_per_kod.png</w:t>
+              <w:t xml:space="preserve">fel.txt</w:t>
             </w:r>
           </w:p>
         </w:tc>
@@ -1583,194 +1705,6 @@
               <w:right w:val="single" w:color="BFBFBF" w:sz="4"/>
             </w:tcBorders>
             <w:shd w:fill="F7F9FC" w:val="clear"/>
-            <w:tcMar>
-              <w:top w:type="dxa" w:w="60"/>
-              <w:left w:type="dxa" w:w="100"/>
-              <w:bottom w:type="dxa" w:w="60"/>
-              <w:right w:type="dxa" w:w="100"/>
-            </w:tcMar>
-          </w:tcPr>
-          <w:p>
-            <w:pPr>
-              <w:spacing w:after="0"/>
-            </w:pPr>
-            <w:r>
-              <w:t xml:space="preserve">Antal skadeobservationer per kod och grad.</w:t>
-            </w:r>
-          </w:p>
-        </w:tc>
-      </w:tr>
-      <w:tr>
-        <w:tc>
-          <w:tcPr>
-            <w:tcW w:type="dxa" w:w="3600"/>
-            <w:tcBorders>
-              <w:top w:val="single" w:color="BFBFBF" w:sz="4"/>
-              <w:left w:val="single" w:color="BFBFBF" w:sz="4"/>
-              <w:bottom w:val="single" w:color="BFBFBF" w:sz="4"/>
-              <w:right w:val="single" w:color="BFBFBF" w:sz="4"/>
-            </w:tcBorders>
-            <w:tcMar>
-              <w:top w:type="dxa" w:w="60"/>
-              <w:left w:type="dxa" w:w="100"/>
-              <w:bottom w:type="dxa" w:w="60"/>
-              <w:right w:type="dxa" w:w="100"/>
-            </w:tcMar>
-          </w:tcPr>
-          <w:p>
-            <w:pPr>
-              <w:spacing w:after="0"/>
-            </w:pPr>
-            <w:r>
-              <w:rPr>
-                <w:rFonts w:ascii="Consolas" w:cs="Consolas" w:eastAsia="Consolas" w:hAnsi="Consolas"/>
-                <w:sz w:val="20"/>
-                <w:szCs w:val="20"/>
-                <w:shd w:fill="F2F2F2" w:val="clear"/>
-              </w:rPr>
-              <w:t xml:space="preserve">diagram/4_klass_per_material.png</w:t>
-            </w:r>
-          </w:p>
-        </w:tc>
-        <w:tc>
-          <w:tcPr>
-            <w:tcW w:type="dxa" w:w="5760"/>
-            <w:tcBorders>
-              <w:top w:val="single" w:color="BFBFBF" w:sz="4"/>
-              <w:left w:val="single" w:color="BFBFBF" w:sz="4"/>
-              <w:bottom w:val="single" w:color="BFBFBF" w:sz="4"/>
-              <w:right w:val="single" w:color="BFBFBF" w:sz="4"/>
-            </w:tcBorders>
-            <w:tcMar>
-              <w:top w:type="dxa" w:w="60"/>
-              <w:left w:type="dxa" w:w="100"/>
-              <w:bottom w:type="dxa" w:w="60"/>
-              <w:right w:type="dxa" w:w="100"/>
-            </w:tcMar>
-          </w:tcPr>
-          <w:p>
-            <w:pPr>
-              <w:spacing w:after="0"/>
-            </w:pPr>
-            <w:r>
-              <w:t xml:space="preserve">Prioritetsklass per material, andel av inspekterad längd.</w:t>
-            </w:r>
-          </w:p>
-        </w:tc>
-      </w:tr>
-      <w:tr>
-        <w:tc>
-          <w:tcPr>
-            <w:tcW w:type="dxa" w:w="3600"/>
-            <w:tcBorders>
-              <w:top w:val="single" w:color="BFBFBF" w:sz="4"/>
-              <w:left w:val="single" w:color="BFBFBF" w:sz="4"/>
-              <w:bottom w:val="single" w:color="BFBFBF" w:sz="4"/>
-              <w:right w:val="single" w:color="BFBFBF" w:sz="4"/>
-            </w:tcBorders>
-            <w:shd w:fill="F7F9FC" w:val="clear"/>
-            <w:tcMar>
-              <w:top w:type="dxa" w:w="60"/>
-              <w:left w:type="dxa" w:w="100"/>
-              <w:bottom w:type="dxa" w:w="60"/>
-              <w:right w:type="dxa" w:w="100"/>
-            </w:tcMar>
-          </w:tcPr>
-          <w:p>
-            <w:pPr>
-              <w:spacing w:after="0"/>
-            </w:pPr>
-            <w:r>
-              <w:rPr>
-                <w:rFonts w:ascii="Consolas" w:cs="Consolas" w:eastAsia="Consolas" w:hAnsi="Consolas"/>
-                <w:sz w:val="20"/>
-                <w:szCs w:val="20"/>
-                <w:shd w:fill="F2F2F2" w:val="clear"/>
-              </w:rPr>
-              <w:t xml:space="preserve">rapporter/*.pdf</w:t>
-            </w:r>
-          </w:p>
-        </w:tc>
-        <w:tc>
-          <w:tcPr>
-            <w:tcW w:type="dxa" w:w="5760"/>
-            <w:tcBorders>
-              <w:top w:val="single" w:color="BFBFBF" w:sz="4"/>
-              <w:left w:val="single" w:color="BFBFBF" w:sz="4"/>
-              <w:bottom w:val="single" w:color="BFBFBF" w:sz="4"/>
-              <w:right w:val="single" w:color="BFBFBF" w:sz="4"/>
-            </w:tcBorders>
-            <w:shd w:fill="F7F9FC" w:val="clear"/>
-            <w:tcMar>
-              <w:top w:type="dxa" w:w="60"/>
-              <w:left w:type="dxa" w:w="100"/>
-              <w:bottom w:type="dxa" w:w="60"/>
-              <w:right w:type="dxa" w:w="100"/>
-            </w:tcMar>
-          </w:tcPr>
-          <w:p>
-            <w:pPr>
-              <w:spacing w:after="0"/>
-            </w:pPr>
-            <w:r>
-              <w:t xml:space="preserve">Ett inspektionsprotokoll per sträcka, namngivet </w:t>
-            </w:r>
-            <w:r>
-              <w:rPr>
-                <w:rFonts w:ascii="Consolas" w:cs="Consolas" w:eastAsia="Consolas" w:hAnsi="Consolas"/>
-                <w:sz w:val="20"/>
-                <w:szCs w:val="20"/>
-                <w:shd w:fill="F2F2F2" w:val="clear"/>
-              </w:rPr>
-              <w:t xml:space="preserve">&lt;tv3-fil&gt;_&lt;nr&gt;_&lt;klass&gt;_&lt;startbrunn&gt;-&lt;slutbrunn&gt;.pdf</w:t>
-            </w:r>
-            <w:r>
-              <w:t xml:space="preserve">. Innehåller sträckdata (material, dimension, längd, antal anslutningar, prioritetsklass, index m.m.), schematisk översikt med skador och anslutningar, observationstabell färgad efter grad, inklinometerprofil med lutning och svacka, samt de fotografier som hittats i mediamapparna.</w:t>
-            </w:r>
-          </w:p>
-        </w:tc>
-      </w:tr>
-      <w:tr>
-        <w:tc>
-          <w:tcPr>
-            <w:tcW w:type="dxa" w:w="3600"/>
-            <w:tcBorders>
-              <w:top w:val="single" w:color="BFBFBF" w:sz="4"/>
-              <w:left w:val="single" w:color="BFBFBF" w:sz="4"/>
-              <w:bottom w:val="single" w:color="BFBFBF" w:sz="4"/>
-              <w:right w:val="single" w:color="BFBFBF" w:sz="4"/>
-            </w:tcBorders>
-            <w:tcMar>
-              <w:top w:type="dxa" w:w="60"/>
-              <w:left w:type="dxa" w:w="100"/>
-              <w:bottom w:type="dxa" w:w="60"/>
-              <w:right w:type="dxa" w:w="100"/>
-            </w:tcMar>
-          </w:tcPr>
-          <w:p>
-            <w:pPr>
-              <w:spacing w:after="0"/>
-            </w:pPr>
-            <w:r>
-              <w:rPr>
-                <w:rFonts w:ascii="Consolas" w:cs="Consolas" w:eastAsia="Consolas" w:hAnsi="Consolas"/>
-                <w:sz w:val="20"/>
-                <w:szCs w:val="20"/>
-                <w:shd w:fill="F2F2F2" w:val="clear"/>
-              </w:rPr>
-              <w:t xml:space="preserve">fel.txt</w:t>
-            </w:r>
-          </w:p>
-        </w:tc>
-        <w:tc>
-          <w:tcPr>
-            <w:tcW w:type="dxa" w:w="5760"/>
-            <w:tcBorders>
-              <w:top w:val="single" w:color="BFBFBF" w:sz="4"/>
-              <w:left w:val="single" w:color="BFBFBF" w:sz="4"/>
-              <w:bottom w:val="single" w:color="BFBFBF" w:sz="4"/>
-              <w:right w:val="single" w:color="BFBFBF" w:sz="4"/>
-            </w:tcBorders>
             <w:tcMar>
               <w:top w:type="dxa" w:w="60"/>
               <w:left w:type="dxa" w:w="100"/>
@@ -1799,7 +1733,19 @@
         <w:spacing w:after="120"/>
       </w:pPr>
       <w:r>
-        <w:t xml:space="preserve">Diagrammen är sparade i 200 dpi och kan läggas direkt i PowerPoint. Klassfärgerna är desamma i diagram och Excel: rött A, orange B, gult C, grönt D, grått E.</w:t>
+        <w:t xml:space="preserve">De två första diagrammen bäddas alltid in i fliken Sammanfattning. Med </w:t>
+      </w:r>
+      <w:r>
+        <w:rPr>
+          <w:rFonts w:ascii="Consolas" w:cs="Consolas" w:eastAsia="Consolas" w:hAnsi="Consolas"/>
+          <w:sz w:val="20"/>
+          <w:szCs w:val="20"/>
+          <w:shd w:fill="F2F2F2" w:val="clear"/>
+        </w:rPr>
+        <w:t xml:space="preserve">--diagram</w:t>
+      </w:r>
+      <w:r>
+        <w:t xml:space="preserve"> sparas alla fyra dessutom som PNG i 200 dpi och kan läggas direkt i PowerPoint. Klassfärgerna är desamma i diagram och Excel: rött A, orange B, gult C, grönt D, grått E.</w:t>
       </w:r>
     </w:p>
     <w:p>

</xml_diff>

<commit_message>
Lägg till Python Toolbox för ArcMap
arcmap/tv3_verktyg.pyt ger två verktyg med dialog i ArcToolbox:
- Skapa ledningslager: JSON-fil, ledningslager, brunnslager, brunnsfält,
  utdata, valfritt område/.lyr/CSV, tolerans, max hopp och extra fält
- Uppdatera bedömning: räknar om härledda fält efter manuell ifyllnad

skapa_ledningslager.py omstrukturerad till funktionerna skapa() och
uppdatera() som verktyget anropar (modulen laddas om vid varje körning).
execfile med KONFIG-blocket fungerar som förut. Loggning går både till
geoprocessing-meddelanden och Python-fönstret.

Testat end-to-end med en låtsas-arcpy: complex edge över tre brunnar,
gemener i brunns-ID, extra fält, omatchade par, manuell bedömning bevarad
vid omkörning, samt att .pyt-filen laddar och definierar parametrarna.

Co-Authored-By: Claude Fable 5.1 <noreply@anthropic.com>
Claude-Session: https://claude.ai/code/session_011fdqX3JEZje1LF9LqpaqR8
</commit_message>
<xml_diff>
--- a/Anvandarhandledning tv3_analys.docx
+++ b/Anvandarhandledning tv3_analys.docx
@@ -3133,7 +3133,7 @@
         <w:spacing w:after="120"/>
       </w:pPr>
       <w:r>
-        <w:t xml:space="preserve">Skriptet </w:t>
+        <w:t xml:space="preserve">Mappen </w:t>
       </w:r>
       <w:r>
         <w:rPr>
@@ -3142,10 +3142,168 @@
           <w:szCs w:val="20"/>
           <w:shd w:fill="F2F2F2" w:val="clear"/>
         </w:rPr>
-        <w:t xml:space="preserve">arcmap/skapa_ledningslager.py</w:t>
-      </w:r>
-      <w:r>
-        <w:t xml:space="preserve"> skapar ett ledningslager av bedömningarna. Det körs i ArcMaps Python-fönster med kartan öppen:</w:t>
+        <w:t xml:space="preserve">arcmap</w:t>
+      </w:r>
+      <w:r>
+        <w:t xml:space="preserve"> innehåller en verktygslåda för ArcMap 10.x. Lägg till den en gång: högerklicka i ArcToolbox-fönstret, välj </w:t>
+      </w:r>
+      <w:r>
+        <w:rPr>
+          <w:b/>
+          <w:bCs/>
+        </w:rPr>
+        <w:t xml:space="preserve">Add Toolbox</w:t>
+      </w:r>
+      <w:r>
+        <w:t xml:space="preserve"> och peka på </w:t>
+      </w:r>
+      <w:r>
+        <w:rPr>
+          <w:rFonts w:ascii="Consolas" w:cs="Consolas" w:eastAsia="Consolas" w:hAnsi="Consolas"/>
+          <w:sz w:val="20"/>
+          <w:szCs w:val="20"/>
+          <w:shd w:fill="F2F2F2" w:val="clear"/>
+        </w:rPr>
+        <w:t xml:space="preserve">arcmap/tv3_verktyg.pyt</w:t>
+      </w:r>
+      <w:r>
+        <w:t xml:space="preserve">. Verktygslådan </w:t>
+      </w:r>
+      <w:r>
+        <w:rPr>
+          <w:b/>
+          <w:bCs/>
+        </w:rPr>
+        <w:t xml:space="preserve">tv3_analys</w:t>
+      </w:r>
+      <w:r>
+        <w:t xml:space="preserve"> får två verktyg:</w:t>
+      </w:r>
+    </w:p>
+    <w:p>
+      <w:pPr>
+        <w:pStyle w:val="ListParagraph"/>
+        <w:numPr>
+          <w:ilvl w:val="0"/>
+          <w:numId w:val="3"/>
+        </w:numPr>
+        <w:spacing w:after="80"/>
+      </w:pPr>
+      <w:r>
+        <w:rPr>
+          <w:b/>
+          <w:bCs/>
+        </w:rPr>
+        <w:t xml:space="preserve">Skapa ledningslager</w:t>
+      </w:r>
+      <w:r>
+        <w:t xml:space="preserve"> – välj </w:t>
+      </w:r>
+      <w:r>
+        <w:rPr>
+          <w:rFonts w:ascii="Consolas" w:cs="Consolas" w:eastAsia="Consolas" w:hAnsi="Consolas"/>
+          <w:sz w:val="20"/>
+          <w:szCs w:val="20"/>
+          <w:shd w:fill="F2F2F2" w:val="clear"/>
+        </w:rPr>
+        <w:t xml:space="preserve">kartunderlag.json</w:t>
+      </w:r>
+      <w:r>
+        <w:t xml:space="preserve">, ledningslager, brunnslager, fältet med brunnsbeteckning (standard </w:t>
+      </w:r>
+      <w:r>
+        <w:rPr>
+          <w:rFonts w:ascii="Consolas" w:cs="Consolas" w:eastAsia="Consolas" w:hAnsi="Consolas"/>
+          <w:sz w:val="20"/>
+          <w:szCs w:val="20"/>
+          <w:shd w:fill="F2F2F2" w:val="clear"/>
+        </w:rPr>
+        <w:t xml:space="preserve">EntityID</w:t>
+      </w:r>
+      <w:r>
+        <w:t xml:space="preserve">) och var utdata ska sparas. Valfritt: ett polygonlager som begränsar sökningen, en </w:t>
+      </w:r>
+      <w:r>
+        <w:rPr>
+          <w:rFonts w:ascii="Consolas" w:cs="Consolas" w:eastAsia="Consolas" w:hAnsi="Consolas"/>
+          <w:sz w:val="20"/>
+          <w:szCs w:val="20"/>
+          <w:shd w:fill="F2F2F2" w:val="clear"/>
+        </w:rPr>
+        <w:t xml:space="preserve">.lyr</w:t>
+      </w:r>
+      <w:r>
+        <w:t xml:space="preserve">-fil med symbologi och en CSV-rapport över brunnspar som inte hittades. Under </w:t>
+      </w:r>
+      <w:r>
+        <w:rPr>
+          <w:b/>
+          <w:bCs/>
+        </w:rPr>
+        <w:t xml:space="preserve">Matchning</w:t>
+      </w:r>
+      <w:r>
+        <w:t xml:space="preserve"> finns tolerans (2 m), max antal brunnar en sträcka får passera (2) och fält från ledningslagret som ska följa med.</w:t>
+      </w:r>
+    </w:p>
+    <w:p>
+      <w:pPr>
+        <w:pStyle w:val="ListParagraph"/>
+        <w:numPr>
+          <w:ilvl w:val="0"/>
+          <w:numId w:val="3"/>
+        </w:numPr>
+        <w:spacing w:after="80"/>
+      </w:pPr>
+      <w:r>
+        <w:rPr>
+          <w:b/>
+          <w:bCs/>
+        </w:rPr>
+        <w:t xml:space="preserve">Uppdatera bedömning</w:t>
+      </w:r>
+      <w:r>
+        <w:t xml:space="preserve"> – välj lagret när du fyllt i manuella bedömningar, så räknas Gällande bedömning, Bedömningstyp och STIL om utan att geometrin rörs.</w:t>
+      </w:r>
+    </w:p>
+    <w:p>
+      <w:pPr>
+        <w:spacing w:after="120"/>
+      </w:pPr>
+      <w:r>
+        <w:t xml:space="preserve">Verktyget läser </w:t>
+      </w:r>
+      <w:r>
+        <w:rPr>
+          <w:rFonts w:ascii="Consolas" w:cs="Consolas" w:eastAsia="Consolas" w:hAnsi="Consolas"/>
+          <w:sz w:val="20"/>
+          <w:szCs w:val="20"/>
+          <w:shd w:fill="F2F2F2" w:val="clear"/>
+        </w:rPr>
+        <w:t xml:space="preserve">kartunderlag.json</w:t>
+      </w:r>
+      <w:r>
+        <w:t xml:space="preserve">, letar upp varje brunnspar i brunnslagret och klipper ut ledningen mellan brunnarna som ett eget objekt. Ledningar som passerar flera brunnar utan att vara uppdelade hanteras: varje vertexpunkt jämförs med närmaste brunn inom toleransen, och max-hopp styr hur många brunnar en sträcka får passera. Utdata i en filgeodatabas rekommenderas; en shapefil fungerar men visar inte fältalias.</w:t>
+      </w:r>
+    </w:p>
+    <w:p>
+      <w:pPr>
+        <w:spacing w:after="120"/>
+      </w:pPr>
+      <w:r>
+        <w:t xml:space="preserve">Samma sak går att köra utan dialog i ArcMaps Python-fönster, med inställningarna i KONFIG överst i </w:t>
+      </w:r>
+      <w:r>
+        <w:rPr>
+          <w:rFonts w:ascii="Consolas" w:cs="Consolas" w:eastAsia="Consolas" w:hAnsi="Consolas"/>
+          <w:sz w:val="20"/>
+          <w:szCs w:val="20"/>
+          <w:shd w:fill="F2F2F2" w:val="clear"/>
+        </w:rPr>
+        <w:t xml:space="preserve">skapa_ledningslager.py</w:t>
+      </w:r>
+      <w:r>
+        <w:t xml:space="preserve">:</w:t>
       </w:r>
     </w:p>
     <w:p>
@@ -3160,89 +3318,13 @@
           <w:sz w:val="19"/>
           <w:szCs w:val="19"/>
         </w:rPr>
-        <w:t xml:space="preserve">execfile(r'H:\PY\Filmningar\skapa_ledningslager.py')</w:t>
+        <w:t xml:space="preserve">execfile(r'H:\PY\tv3analys\arcmap\skapa_ledningslager.py')</w:t>
       </w:r>
     </w:p>
     <w:p>
       <w:pPr>
         <w:spacing w:after="120"/>
       </w:pPr>
-    </w:p>
-    <w:p>
-      <w:pPr>
-        <w:spacing w:after="120"/>
-      </w:pPr>
-      <w:r>
-        <w:t xml:space="preserve">Skriptet läser </w:t>
-      </w:r>
-      <w:r>
-        <w:rPr>
-          <w:rFonts w:ascii="Consolas" w:cs="Consolas" w:eastAsia="Consolas" w:hAnsi="Consolas"/>
-          <w:sz w:val="20"/>
-          <w:szCs w:val="20"/>
-          <w:shd w:fill="F2F2F2" w:val="clear"/>
-        </w:rPr>
-        <w:t xml:space="preserve">kartunderlag.json</w:t>
-      </w:r>
-      <w:r>
-        <w:t xml:space="preserve">, letar upp varje brunnspar i brunnslagret och klipper ut ledningen mellan brunnarna som ett eget objekt. Ledningar som passerar flera brunnar utan att vara uppdelade hanteras: varje vertexpunkt jämförs med närmaste brunn inom toleransen (standard 2 m), och </w:t>
-      </w:r>
-      <w:r>
-        <w:rPr>
-          <w:rFonts w:ascii="Consolas" w:cs="Consolas" w:eastAsia="Consolas" w:hAnsi="Consolas"/>
-          <w:sz w:val="20"/>
-          <w:szCs w:val="20"/>
-          <w:shd w:fill="F2F2F2" w:val="clear"/>
-        </w:rPr>
-        <w:t xml:space="preserve">MAX_HOPP</w:t>
-      </w:r>
-      <w:r>
-        <w:t xml:space="preserve"> styr hur många brunnar en sträcka får passera.</w:t>
-      </w:r>
-    </w:p>
-    <w:p>
-      <w:pPr>
-        <w:spacing w:after="120"/>
-      </w:pPr>
-      <w:r>
-        <w:t xml:space="preserve">Lagernamn, sökvägar och tolerans anges i KONFIG överst i skriptet. Standardvärdena är </w:t>
-      </w:r>
-      <w:r>
-        <w:rPr>
-          <w:rFonts w:ascii="Consolas" w:cs="Consolas" w:eastAsia="Consolas" w:hAnsi="Consolas"/>
-          <w:sz w:val="20"/>
-          <w:szCs w:val="20"/>
-          <w:shd w:fill="F2F2F2" w:val="clear"/>
-        </w:rPr>
-        <w:t xml:space="preserve">A Ledning</w:t>
-      </w:r>
-      <w:r>
-        <w:t xml:space="preserve">, </w:t>
-      </w:r>
-      <w:r>
-        <w:rPr>
-          <w:rFonts w:ascii="Consolas" w:cs="Consolas" w:eastAsia="Consolas" w:hAnsi="Consolas"/>
-          <w:sz w:val="20"/>
-          <w:szCs w:val="20"/>
-          <w:shd w:fill="F2F2F2" w:val="clear"/>
-        </w:rPr>
-        <w:t xml:space="preserve">A Nedstign och övriga brunnar</w:t>
-      </w:r>
-      <w:r>
-        <w:t xml:space="preserve"> och brunnsfältet </w:t>
-      </w:r>
-      <w:r>
-        <w:rPr>
-          <w:rFonts w:ascii="Consolas" w:cs="Consolas" w:eastAsia="Consolas" w:hAnsi="Consolas"/>
-          <w:sz w:val="20"/>
-          <w:szCs w:val="20"/>
-          <w:shd w:fill="F2F2F2" w:val="clear"/>
-        </w:rPr>
-        <w:t xml:space="preserve">EntityID</w:t>
-      </w:r>
-      <w:r>
-        <w:t xml:space="preserve">.</w:t>
-      </w:r>
     </w:p>
     <w:p>
       <w:pPr>
@@ -3902,7 +3984,17 @@
         <w:spacing w:after="120"/>
       </w:pPr>
       <w:r>
-        <w:t xml:space="preserve">När du fyllt i manuella bedömningar: kör skriptet igen med </w:t>
+        <w:t xml:space="preserve">När du fyllt i manuella bedömningar: kör verktyget </w:t>
+      </w:r>
+      <w:r>
+        <w:rPr>
+          <w:b/>
+          <w:bCs/>
+        </w:rPr>
+        <w:t xml:space="preserve">Uppdatera bedömning</w:t>
+      </w:r>
+      <w:r>
+        <w:t xml:space="preserve"> (eller skriptet med </w:t>
       </w:r>
       <w:r>
         <w:rPr>
@@ -3914,7 +4006,7 @@
         <w:t xml:space="preserve">BARA_UPPDATERA = True</w:t>
       </w:r>
       <w:r>
-        <w:t xml:space="preserve">. Då räknas </w:t>
+        <w:t xml:space="preserve">). Då räknas </w:t>
       </w:r>
       <w:r>
         <w:rPr>
@@ -4118,7 +4210,7 @@
         <w:t xml:space="preserve">.lyr</w:t>
       </w:r>
       <w:r>
-        <w:t xml:space="preserve"> på sökvägen i </w:t>
+        <w:t xml:space="preserve"> (högerklicka på lagret &gt; Save As Layer File) och ange filen i verktygets fält Symbologi, eller i </w:t>
       </w:r>
       <w:r>
         <w:rPr>
@@ -4130,7 +4222,7 @@
         <w:t xml:space="preserve">LYR_FIL</w:t>
       </w:r>
       <w:r>
-        <w:t xml:space="preserve">; nästa körning applicerar symbologin automatiskt.</w:t>
+        <w:t xml:space="preserve"> i skriptet; nästa körning applicerar symbologin automatiskt.</w:t>
       </w:r>
     </w:p>
     <w:p>

</xml_diff>

<commit_message>
Skapa symbologi (.lyr) via ArcObjects
arcmap/skapa_lyr.py bygger en Unique values-renderare på STIL med tio
kategorier – färg efter prioritetsklass, heldragen linje för manuell
bedömning och streckad för maskinell – sätter den på lagret i kartan via
ArcObjects (comtypes) och sparar lagret som .lyr med arcpy.mapping.

- Nytt verktyg "Skapa symbologi (.lyr)" i tv3_verktyg.pyt
- arcmap/bedomda_ledningar.lyr används som standard av Skapa ledningslager
  (verktygets Symbologi-fält och LYR_FIL i KONFIG) när filen finns
- Handledning 7.2 och CLAUDE.md uppdaterade; manuell väg kvar som reserv

Kräver comtypes < 1.2 i ArcMaps Python. Renderarbygget och lagersökningen
är testade mot låtsas-COM-objekt; själva ArcObjects-körningen är oprövad.

Co-Authored-By: Claude Fable 5.1 <noreply@anthropic.com>
Claude-Session: https://claude.ai/code/session_011fdqX3JEZje1LF9LqpaqR8
</commit_message>
<xml_diff>
--- a/Anvandarhandledning tv3_analys.docx
+++ b/Anvandarhandledning tv3_analys.docx
@@ -3268,6 +3268,38 @@
     </w:p>
     <w:p>
       <w:pPr>
+        <w:pStyle w:val="ListParagraph"/>
+        <w:numPr>
+          <w:ilvl w:val="0"/>
+          <w:numId w:val="3"/>
+        </w:numPr>
+        <w:spacing w:after="80"/>
+      </w:pPr>
+      <w:r>
+        <w:rPr>
+          <w:b/>
+          <w:bCs/>
+        </w:rPr>
+        <w:t xml:space="preserve">Skapa symbologi (.lyr)</w:t>
+      </w:r>
+      <w:r>
+        <w:t xml:space="preserve"> – bygger symbologin (färg per klass, heldragen/streckad) och sparar den som </w:t>
+      </w:r>
+      <w:r>
+        <w:rPr>
+          <w:rFonts w:ascii="Consolas" w:cs="Consolas" w:eastAsia="Consolas" w:hAnsi="Consolas"/>
+          <w:sz w:val="20"/>
+          <w:szCs w:val="20"/>
+          <w:shd w:fill="F2F2F2" w:val="clear"/>
+        </w:rPr>
+        <w:t xml:space="preserve">.lyr</w:t>
+      </w:r>
+      <w:r>
+        <w:t xml:space="preserve">, se 7.2.</w:t>
+      </w:r>
+    </w:p>
+    <w:p>
+      <w:pPr>
         <w:spacing w:after="120"/>
       </w:pPr>
       <w:r>
@@ -4058,7 +4090,27 @@
         <w:spacing w:after="120"/>
       </w:pPr>
       <w:r>
-        <w:t xml:space="preserve">Sätt symbologin en gång och spara som </w:t>
+        <w:t xml:space="preserve">Symbologin är färg efter prioritetsklass (rött A, orange B, gult C, grönt D, grått E – samma som i Excel och diagrammen), </w:t>
+      </w:r>
+      <w:r>
+        <w:rPr>
+          <w:b/>
+          <w:bCs/>
+        </w:rPr>
+        <w:t xml:space="preserve">heldragen</w:t>
+      </w:r>
+      <w:r>
+        <w:t xml:space="preserve"> linje för manuell bedömning och </w:t>
+      </w:r>
+      <w:r>
+        <w:rPr>
+          <w:b/>
+          <w:bCs/>
+        </w:rPr>
+        <w:t xml:space="preserve">streckad</w:t>
+      </w:r>
+      <w:r>
+        <w:t xml:space="preserve"> för maskinell. Den sparas som </w:t>
       </w:r>
       <w:r>
         <w:rPr>
@@ -4070,17 +4122,7 @@
         <w:t xml:space="preserve">.lyr</w:t>
       </w:r>
       <w:r>
-        <w:t xml:space="preserve">, så återanvänds den vid varje körning. I lagrets egenskaper: </w:t>
-      </w:r>
-      <w:r>
-        <w:rPr>
-          <w:b/>
-          <w:bCs/>
-        </w:rPr>
-        <w:t xml:space="preserve">Symbology &gt; Categories &gt; Unique values</w:t>
-      </w:r>
-      <w:r>
-        <w:t xml:space="preserve">, Value Field </w:t>
+        <w:t xml:space="preserve">-fil, som verktyget Skapa ledningslager applicerar automatiskt om filen ligger som </w:t>
       </w:r>
       <w:r>
         <w:rPr>
@@ -4089,31 +4131,29 @@
           <w:szCs w:val="20"/>
           <w:shd w:fill="F2F2F2" w:val="clear"/>
         </w:rPr>
-        <w:t xml:space="preserve">STIL</w:t>
-      </w:r>
-      <w:r>
-        <w:t xml:space="preserve">, och </w:t>
+        <w:t xml:space="preserve">arcmap/bedomda_ledningar.lyr</w:t>
+      </w:r>
+      <w:r>
+        <w:t xml:space="preserve"> eller anges i fältet Symbologi.</w:t>
+      </w:r>
+    </w:p>
+    <w:p>
+      <w:pPr>
+        <w:spacing w:after="120"/>
+      </w:pPr>
+      <w:r>
+        <w:t xml:space="preserve">Enklast är verktyget </w:t>
       </w:r>
       <w:r>
         <w:rPr>
           <w:b/>
           <w:bCs/>
         </w:rPr>
-        <w:t xml:space="preserve">Add All Values</w:t>
-      </w:r>
-      <w:r>
-        <w:t xml:space="preserve">. Det ger tio kategorier:</w:t>
-      </w:r>
-    </w:p>
-    <w:p>
-      <w:pPr>
-        <w:pStyle w:val="ListParagraph"/>
-        <w:numPr>
-          <w:ilvl w:val="0"/>
-          <w:numId w:val="3"/>
-        </w:numPr>
-        <w:spacing w:after="80"/>
-      </w:pPr>
+        <w:t xml:space="preserve">Skapa symbologi (.lyr)</w:t>
+      </w:r>
+      <w:r>
+        <w:t xml:space="preserve">: välj ledningslagret i kartan och var </w:t>
+      </w:r>
       <w:r>
         <w:rPr>
           <w:rFonts w:ascii="Consolas" w:cs="Consolas" w:eastAsia="Consolas" w:hAnsi="Consolas"/>
@@ -4121,10 +4161,10 @@
           <w:szCs w:val="20"/>
           <w:shd w:fill="F2F2F2" w:val="clear"/>
         </w:rPr>
-        <w:t xml:space="preserve">A - Maskinell</w:t>
-      </w:r>
-      <w:r>
-        <w:t xml:space="preserve"> … </w:t>
+        <w:t xml:space="preserve">.lyr</w:t>
+      </w:r>
+      <w:r>
+        <w:t xml:space="preserve">-filen ska sparas. Verktyget bygger renderaren, sätter den på lagret och sparar filen. Det kräver Python-paketet </w:t>
       </w:r>
       <w:r>
         <w:rPr>
@@ -4133,31 +4173,39 @@
           <w:szCs w:val="20"/>
           <w:shd w:fill="F2F2F2" w:val="clear"/>
         </w:rPr>
-        <w:t xml:space="preserve">E - Maskinell</w:t>
-      </w:r>
-      <w:r>
-        <w:t xml:space="preserve"> – </w:t>
-      </w:r>
-      <w:r>
-        <w:rPr>
-          <w:b/>
-          <w:bCs/>
-        </w:rPr>
-        <w:t xml:space="preserve">streckad</w:t>
-      </w:r>
-      <w:r>
-        <w:t xml:space="preserve"> linje i klassens färg.</w:t>
-      </w:r>
-    </w:p>
-    <w:p>
-      <w:pPr>
-        <w:pStyle w:val="ListParagraph"/>
-        <w:numPr>
-          <w:ilvl w:val="0"/>
-          <w:numId w:val="3"/>
-        </w:numPr>
-        <w:spacing w:after="80"/>
-      </w:pPr>
+        <w:t xml:space="preserve">comtypes</w:t>
+      </w:r>
+      <w:r>
+        <w:t xml:space="preserve"> i ArcMaps Python (en gång, i Kommandotolken):</w:t>
+      </w:r>
+    </w:p>
+    <w:p>
+      <w:pPr>
+        <w:shd w:fill="F2F2F2" w:val="clear"/>
+        <w:spacing w:after="0"/>
+        <w:ind w:left="280"/>
+      </w:pPr>
+      <w:r>
+        <w:rPr>
+          <w:rFonts w:ascii="Consolas" w:cs="Consolas" w:eastAsia="Consolas" w:hAnsi="Consolas"/>
+          <w:sz w:val="19"/>
+          <w:szCs w:val="19"/>
+        </w:rPr>
+        <w:t xml:space="preserve">"C:\Python27\ArcGIS10.8\Scripts\pip.exe" install "comtypes&lt;1.2"</w:t>
+      </w:r>
+    </w:p>
+    <w:p>
+      <w:pPr>
+        <w:spacing w:after="120"/>
+      </w:pPr>
+    </w:p>
+    <w:p>
+      <w:pPr>
+        <w:spacing w:after="120"/>
+      </w:pPr>
+      <w:r>
+        <w:t xml:space="preserve">Byt </w:t>
+      </w:r>
       <w:r>
         <w:rPr>
           <w:rFonts w:ascii="Consolas" w:cs="Consolas" w:eastAsia="Consolas" w:hAnsi="Consolas"/>
@@ -4165,10 +4213,28 @@
           <w:szCs w:val="20"/>
           <w:shd w:fill="F2F2F2" w:val="clear"/>
         </w:rPr>
-        <w:t xml:space="preserve">A - Manuell</w:t>
-      </w:r>
-      <w:r>
-        <w:t xml:space="preserve"> … </w:t>
+        <w:t xml:space="preserve">ArcGIS10.8</w:t>
+      </w:r>
+      <w:r>
+        <w:t xml:space="preserve"> mot din version. Första körningen tar en stund eftersom comtypes genererar kod för ArcObjects; därefter går det på några sekunder.</w:t>
+      </w:r>
+    </w:p>
+    <w:p>
+      <w:pPr>
+        <w:spacing w:after="120"/>
+      </w:pPr>
+      <w:r>
+        <w:t xml:space="preserve">Går inte det, sätt symbologin för hand en gång: i lagrets egenskaper </w:t>
+      </w:r>
+      <w:r>
+        <w:rPr>
+          <w:b/>
+          <w:bCs/>
+        </w:rPr>
+        <w:t xml:space="preserve">Symbology &gt; Categories &gt; Unique values</w:t>
+      </w:r>
+      <w:r>
+        <w:t xml:space="preserve">, Value Field </w:t>
       </w:r>
       <w:r>
         <w:rPr>
@@ -4177,28 +4243,20 @@
           <w:szCs w:val="20"/>
           <w:shd w:fill="F2F2F2" w:val="clear"/>
         </w:rPr>
-        <w:t xml:space="preserve">E - Manuell</w:t>
-      </w:r>
-      <w:r>
-        <w:t xml:space="preserve"> – </w:t>
+        <w:t xml:space="preserve">STIL</w:t>
+      </w:r>
+      <w:r>
+        <w:t xml:space="preserve">, </w:t>
       </w:r>
       <w:r>
         <w:rPr>
           <w:b/>
           <w:bCs/>
         </w:rPr>
-        <w:t xml:space="preserve">heldragen</w:t>
-      </w:r>
-      <w:r>
-        <w:t xml:space="preserve"> linje i klassens färg.</w:t>
-      </w:r>
-    </w:p>
-    <w:p>
-      <w:pPr>
-        <w:spacing w:after="120"/>
-      </w:pPr>
-      <w:r>
-        <w:t xml:space="preserve">Klassfärgerna är desamma som i Excel och diagrammen: rött A, orange B, gult C, grönt D, grått E. Spara sedan lagret som </w:t>
+        <w:t xml:space="preserve">Add All Values</w:t>
+      </w:r>
+      <w:r>
+        <w:t xml:space="preserve">. Det ger tio kategorier – </w:t>
       </w:r>
       <w:r>
         <w:rPr>
@@ -4207,10 +4265,10 @@
           <w:szCs w:val="20"/>
           <w:shd w:fill="F2F2F2" w:val="clear"/>
         </w:rPr>
-        <w:t xml:space="preserve">.lyr</w:t>
-      </w:r>
-      <w:r>
-        <w:t xml:space="preserve"> (högerklicka på lagret &gt; Save As Layer File) och ange filen i verktygets fält Symbologi, eller i </w:t>
+        <w:t xml:space="preserve">A - Manuell</w:t>
+      </w:r>
+      <w:r>
+        <w:t xml:space="preserve"> … </w:t>
       </w:r>
       <w:r>
         <w:rPr>
@@ -4219,10 +4277,46 @@
           <w:szCs w:val="20"/>
           <w:shd w:fill="F2F2F2" w:val="clear"/>
         </w:rPr>
-        <w:t xml:space="preserve">LYR_FIL</w:t>
-      </w:r>
-      <w:r>
-        <w:t xml:space="preserve"> i skriptet; nästa körning applicerar symbologin automatiskt.</w:t>
+        <w:t xml:space="preserve">E - Manuell</w:t>
+      </w:r>
+      <w:r>
+        <w:t xml:space="preserve"> heldragna och </w:t>
+      </w:r>
+      <w:r>
+        <w:rPr>
+          <w:rFonts w:ascii="Consolas" w:cs="Consolas" w:eastAsia="Consolas" w:hAnsi="Consolas"/>
+          <w:sz w:val="20"/>
+          <w:szCs w:val="20"/>
+          <w:shd w:fill="F2F2F2" w:val="clear"/>
+        </w:rPr>
+        <w:t xml:space="preserve">A - Maskinell</w:t>
+      </w:r>
+      <w:r>
+        <w:t xml:space="preserve"> … </w:t>
+      </w:r>
+      <w:r>
+        <w:rPr>
+          <w:rFonts w:ascii="Consolas" w:cs="Consolas" w:eastAsia="Consolas" w:hAnsi="Consolas"/>
+          <w:sz w:val="20"/>
+          <w:szCs w:val="20"/>
+          <w:shd w:fill="F2F2F2" w:val="clear"/>
+        </w:rPr>
+        <w:t xml:space="preserve">E - Maskinell</w:t>
+      </w:r>
+      <w:r>
+        <w:t xml:space="preserve"> streckade, i klassens färg. Spara sedan lagret som </w:t>
+      </w:r>
+      <w:r>
+        <w:rPr>
+          <w:rFonts w:ascii="Consolas" w:cs="Consolas" w:eastAsia="Consolas" w:hAnsi="Consolas"/>
+          <w:sz w:val="20"/>
+          <w:szCs w:val="20"/>
+          <w:shd w:fill="F2F2F2" w:val="clear"/>
+        </w:rPr>
+        <w:t xml:space="preserve">.lyr</w:t>
+      </w:r>
+      <w:r>
+        <w:t xml:space="preserve"> (högerklicka på lagret &gt; Save As Layer File) på samma plats.</w:t>
       </w:r>
     </w:p>
     <w:p>

</xml_diff>

<commit_message>
Lagerval som rullistor – klarar lagernamn med snedstreck
"A Rensbrunn/tillsynsbrunn" gav ERROR 000732 (does not exist): ArcMap
tolkar '/' som sökvägsavgränsare när ett lagernamn skickas som text i en
GPFeatureLayer-parameter.

- Lagerparametrarna är nu GPString med rullista av kartans lager (långa
  namn Grupp\Lager), förifyllda med standardlagren
- hitta_lager matchar kort eller långt namn och returnerar lagerobjektet
- kalla() ger lagrets dataSource + definitionsfråga till MakeFeatureLayer,
  så inget lagernamn går som text till geoprocessing (även områdeslagret)
- uppdatera() tar lagernamn, lagerobjekt eller sökväg
- Validering slår upp lagren mot kartan och kollar geometri via dataSource

Testat med låtsas-arcpy: grupplager med '/' i namnet löses upp, brunnar
läses från två lager, objekt skrivs, uppdatering via lagernamn fungerar.

Co-Authored-By: Claude Fable 5.1 <noreply@anthropic.com>
Claude-Session: https://claude.ai/code/session_011fdqX3JEZje1LF9LqpaqR8
</commit_message>
<xml_diff>
--- a/Anvandarhandledning tv3_analys.docx
+++ b/Anvandarhandledning tv3_analys.docx
@@ -3221,7 +3221,53 @@
         <w:t xml:space="preserve">EntityID</w:t>
       </w:r>
       <w:r>
-        <w:t xml:space="preserve">) och var utdata ska sparas. Valfritt: ett polygonlager som begränsar sökningen, en </w:t>
+        <w:t xml:space="preserve">) och var utdata ska sparas. Lagervalen är rullistor med kartans lager; </w:t>
+      </w:r>
+      <w:r>
+        <w:rPr>
+          <w:rFonts w:ascii="Consolas" w:cs="Consolas" w:eastAsia="Consolas" w:hAnsi="Consolas"/>
+          <w:sz w:val="20"/>
+          <w:szCs w:val="20"/>
+          <w:shd w:fill="F2F2F2" w:val="clear"/>
+        </w:rPr>
+        <w:t xml:space="preserve">A Ledning</w:t>
+      </w:r>
+      <w:r>
+        <w:t xml:space="preserve">, </w:t>
+      </w:r>
+      <w:r>
+        <w:rPr>
+          <w:rFonts w:ascii="Consolas" w:cs="Consolas" w:eastAsia="Consolas" w:hAnsi="Consolas"/>
+          <w:sz w:val="20"/>
+          <w:szCs w:val="20"/>
+          <w:shd w:fill="F2F2F2" w:val="clear"/>
+        </w:rPr>
+        <w:t xml:space="preserve">A Nedstign och övriga brunnar</w:t>
+      </w:r>
+      <w:r>
+        <w:t xml:space="preserve"> och </w:t>
+      </w:r>
+      <w:r>
+        <w:rPr>
+          <w:rFonts w:ascii="Consolas" w:cs="Consolas" w:eastAsia="Consolas" w:hAnsi="Consolas"/>
+          <w:sz w:val="20"/>
+          <w:szCs w:val="20"/>
+          <w:shd w:fill="F2F2F2" w:val="clear"/>
+        </w:rPr>
+        <w:t xml:space="preserve">A Rensbrunn/tillsynsbrunn</w:t>
+      </w:r>
+      <w:r>
+        <w:t xml:space="preserve"> är förifyllda när de finns. Ta med </w:t>
+      </w:r>
+      <w:r>
+        <w:rPr>
+          <w:b/>
+          <w:bCs/>
+        </w:rPr>
+        <w:t xml:space="preserve">alla</w:t>
+      </w:r>
+      <w:r>
+        <w:t xml:space="preserve"> lager där brunnar kan ligga – nedstigningsbrunnar och rens-/tillsynsbrunnar ligger i olika lager, och loggen visar hur många av inspektionens brunnar som hittades och vilka brunnstyper som saknas. Valfritt: ett polygonlager som begränsar sökningen, en </w:t>
       </w:r>
       <w:r>
         <w:rPr>

</xml_diff>

<commit_message>
Lägg med comtypes i arcmap/lib så ingen installation behövs
Användaren kan inte pip-installera i ArcMaps Python. comtypes 1.1.14
(MIT, sista versionen med Python 2.7-stöd, testkatalogen borttagen)
ligger nu i arcmap/lib/comtypes med licens och LASMIG.txt.
skapa_lyr.py lägger till arcmap/lib i sys.path om comtypes inte redan
finns. comtypes/gen (genererade ArcObjects-omslag) är gitignorerad;
comtypes faller själv tillbaka till %APPDATA% om mappen inte är
skrivbar.

Handledning 7.2 och CLAUDE.md uppdaterade.

Co-Authored-By: Claude Fable 5.1 <noreply@anthropic.com>
Claude-Session: https://claude.ai/code/session_011fdqX3JEZje1LF9LqpaqR8
</commit_message>
<xml_diff>
--- a/Anvandarhandledning tv3_analys.docx
+++ b/Anvandarhandledning tv3_analys.docx
@@ -4210,7 +4210,7 @@
         <w:t xml:space="preserve">.lyr</w:t>
       </w:r>
       <w:r>
-        <w:t xml:space="preserve">-filen ska sparas. Verktyget bygger renderaren, sätter den på lagret och sparar filen. Det kräver Python-paketet </w:t>
+        <w:t xml:space="preserve">-filen ska sparas. Verktyget bygger renderaren, sätter den på lagret och sparar filen. Det använder Python-paketet </w:t>
       </w:r>
       <w:r>
         <w:rPr>
@@ -4222,47 +4222,19 @@
         <w:t xml:space="preserve">comtypes</w:t>
       </w:r>
       <w:r>
-        <w:t xml:space="preserve"> i ArcMaps Python (en gång, i Kommandotolken):</w:t>
-      </w:r>
-    </w:p>
-    <w:p>
-      <w:pPr>
-        <w:shd w:fill="F2F2F2" w:val="clear"/>
-        <w:spacing w:after="0"/>
-        <w:ind w:left="280"/>
-      </w:pPr>
-      <w:r>
-        <w:rPr>
-          <w:rFonts w:ascii="Consolas" w:cs="Consolas" w:eastAsia="Consolas" w:hAnsi="Consolas"/>
-          <w:sz w:val="19"/>
-          <w:szCs w:val="19"/>
-        </w:rPr>
-        <w:t xml:space="preserve">"C:\Python27\ArcGIS10.8\Scripts\pip.exe" install "comtypes&lt;1.2"</w:t>
-      </w:r>
-    </w:p>
-    <w:p>
-      <w:pPr>
-        <w:spacing w:after="120"/>
-      </w:pPr>
-    </w:p>
-    <w:p>
-      <w:pPr>
-        <w:spacing w:after="120"/>
-      </w:pPr>
-      <w:r>
-        <w:t xml:space="preserve">Byt </w:t>
-      </w:r>
-      <w:r>
-        <w:rPr>
-          <w:rFonts w:ascii="Consolas" w:cs="Consolas" w:eastAsia="Consolas" w:hAnsi="Consolas"/>
-          <w:sz w:val="20"/>
-          <w:szCs w:val="20"/>
-          <w:shd w:fill="F2F2F2" w:val="clear"/>
-        </w:rPr>
-        <w:t xml:space="preserve">ArcGIS10.8</w:t>
-      </w:r>
-      <w:r>
-        <w:t xml:space="preserve"> mot din version. Första körningen tar en stund eftersom comtypes genererar kod för ArcObjects; därefter går det på några sekunder.</w:t>
+        <w:t xml:space="preserve">, som följer med i mappen </w:t>
+      </w:r>
+      <w:r>
+        <w:rPr>
+          <w:rFonts w:ascii="Consolas" w:cs="Consolas" w:eastAsia="Consolas" w:hAnsi="Consolas"/>
+          <w:sz w:val="20"/>
+          <w:szCs w:val="20"/>
+          <w:shd w:fill="F2F2F2" w:val="clear"/>
+        </w:rPr>
+        <w:t xml:space="preserve">arcmap/lib</w:t>
+      </w:r>
+      <w:r>
+        <w:t xml:space="preserve"> – ingen installation behövs. Första körningen tar en stund eftersom comtypes genererar kod för ArcObjects; därefter går det på några sekunder.</w:t>
       </w:r>
     </w:p>
     <w:p>

</xml_diff>

<commit_message>
Ta bort .lyr-generatorn – symbologin sätts manuellt i ArcMap
skapa_lyr.py, verktyget "Skapa symbologi (.lyr)" och det vendorade
comtypes-paketet i arcmap/lib tas bort på användarens begäran.
Stödet för .lyr-filen finns kvar: Skapa ledningslager förifyller
arcmap/bedomda_ledningar.lyr när filen finns. Handledningen 7.2
beskriver den manuella vägen (Unique values på STIL, Save As Layer File).

Co-Authored-By: Claude Fable 5.1 <noreply@anthropic.com>
Claude-Session: https://claude.ai/code/session_011fdqX3JEZje1LF9LqpaqR8
</commit_message>
<xml_diff>
--- a/Anvandarhandledning tv3_analys.docx
+++ b/Anvandarhandledning tv3_analys.docx
@@ -3314,38 +3314,6 @@
     </w:p>
     <w:p>
       <w:pPr>
-        <w:pStyle w:val="ListParagraph"/>
-        <w:numPr>
-          <w:ilvl w:val="0"/>
-          <w:numId w:val="3"/>
-        </w:numPr>
-        <w:spacing w:after="80"/>
-      </w:pPr>
-      <w:r>
-        <w:rPr>
-          <w:b/>
-          <w:bCs/>
-        </w:rPr>
-        <w:t xml:space="preserve">Skapa symbologi (.lyr)</w:t>
-      </w:r>
-      <w:r>
-        <w:t xml:space="preserve"> – bygger symbologin (färg per klass, heldragen/streckad) och sparar den som </w:t>
-      </w:r>
-      <w:r>
-        <w:rPr>
-          <w:rFonts w:ascii="Consolas" w:cs="Consolas" w:eastAsia="Consolas" w:hAnsi="Consolas"/>
-          <w:sz w:val="20"/>
-          <w:szCs w:val="20"/>
-          <w:shd w:fill="F2F2F2" w:val="clear"/>
-        </w:rPr>
-        <w:t xml:space="preserve">.lyr</w:t>
-      </w:r>
-      <w:r>
-        <w:t xml:space="preserve">, se 7.2.</w:t>
-      </w:r>
-    </w:p>
-    <w:p>
-      <w:pPr>
         <w:spacing w:after="120"/>
       </w:pPr>
       <w:r>
@@ -4156,7 +4124,7 @@
         <w:t xml:space="preserve">streckad</w:t>
       </w:r>
       <w:r>
-        <w:t xml:space="preserve"> för maskinell. Den sparas som </w:t>
+        <w:t xml:space="preserve"> för maskinell. Den sätts en gång i ArcMap och sparas som </w:t>
       </w:r>
       <w:r>
         <w:rPr>
@@ -4168,7 +4136,7 @@
         <w:t xml:space="preserve">.lyr</w:t>
       </w:r>
       <w:r>
-        <w:t xml:space="preserve">-fil, som verktyget Skapa ledningslager applicerar automatiskt om filen ligger som </w:t>
+        <w:t xml:space="preserve">-fil; verktyget Skapa ledningslager applicerar filen automatiskt om den ligger som </w:t>
       </w:r>
       <w:r>
         <w:rPr>
@@ -4180,7 +4148,7 @@
         <w:t xml:space="preserve">arcmap/bedomda_ledningar.lyr</w:t>
       </w:r>
       <w:r>
-        <w:t xml:space="preserve"> eller anges i fältet Symbologi.</w:t>
+        <w:t xml:space="preserve"> (fältet Symbologi förifylls) eller anges i fältet.</w:t>
       </w:r>
     </w:p>
     <w:p>
@@ -4188,17 +4156,17 @@
         <w:spacing w:after="120"/>
       </w:pPr>
       <w:r>
-        <w:t xml:space="preserve">Enklast är verktyget </w:t>
+        <w:t xml:space="preserve">I lagrets egenskaper: </w:t>
       </w:r>
       <w:r>
         <w:rPr>
           <w:b/>
           <w:bCs/>
         </w:rPr>
-        <w:t xml:space="preserve">Skapa symbologi (.lyr)</w:t>
-      </w:r>
-      <w:r>
-        <w:t xml:space="preserve">: välj ledningslagret i kartan och var </w:t>
+        <w:t xml:space="preserve">Symbology &gt; Categories &gt; Unique values</w:t>
+      </w:r>
+      <w:r>
+        <w:t xml:space="preserve">, Value Field </w:t>
       </w:r>
       <w:r>
         <w:rPr>
@@ -4207,10 +4175,20 @@
           <w:szCs w:val="20"/>
           <w:shd w:fill="F2F2F2" w:val="clear"/>
         </w:rPr>
-        <w:t xml:space="preserve">.lyr</w:t>
-      </w:r>
-      <w:r>
-        <w:t xml:space="preserve">-filen ska sparas. Verktyget bygger renderaren, sätter den på lagret och sparar filen. Det använder Python-paketet </w:t>
+        <w:t xml:space="preserve">STIL</w:t>
+      </w:r>
+      <w:r>
+        <w:t xml:space="preserve">, </w:t>
+      </w:r>
+      <w:r>
+        <w:rPr>
+          <w:b/>
+          <w:bCs/>
+        </w:rPr>
+        <w:t xml:space="preserve">Add All Values</w:t>
+      </w:r>
+      <w:r>
+        <w:t xml:space="preserve">. Det ger tio kategorier – </w:t>
       </w:r>
       <w:r>
         <w:rPr>
@@ -4219,10 +4197,10 @@
           <w:szCs w:val="20"/>
           <w:shd w:fill="F2F2F2" w:val="clear"/>
         </w:rPr>
-        <w:t xml:space="preserve">comtypes</w:t>
-      </w:r>
-      <w:r>
-        <w:t xml:space="preserve">, som följer med i mappen </w:t>
+        <w:t xml:space="preserve">A - Manuell</w:t>
+      </w:r>
+      <w:r>
+        <w:t xml:space="preserve"> … </w:t>
       </w:r>
       <w:r>
         <w:rPr>
@@ -4231,28 +4209,10 @@
           <w:szCs w:val="20"/>
           <w:shd w:fill="F2F2F2" w:val="clear"/>
         </w:rPr>
-        <w:t xml:space="preserve">arcmap/lib</w:t>
-      </w:r>
-      <w:r>
-        <w:t xml:space="preserve"> – ingen installation behövs. Första körningen tar en stund eftersom comtypes genererar kod för ArcObjects; därefter går det på några sekunder.</w:t>
-      </w:r>
-    </w:p>
-    <w:p>
-      <w:pPr>
-        <w:spacing w:after="120"/>
-      </w:pPr>
-      <w:r>
-        <w:t xml:space="preserve">Går inte det, sätt symbologin för hand en gång: i lagrets egenskaper </w:t>
-      </w:r>
-      <w:r>
-        <w:rPr>
-          <w:b/>
-          <w:bCs/>
-        </w:rPr>
-        <w:t xml:space="preserve">Symbology &gt; Categories &gt; Unique values</w:t>
-      </w:r>
-      <w:r>
-        <w:t xml:space="preserve">, Value Field </w:t>
+        <w:t xml:space="preserve">E - Manuell</w:t>
+      </w:r>
+      <w:r>
+        <w:t xml:space="preserve"> heldragna och </w:t>
       </w:r>
       <w:r>
         <w:rPr>
@@ -4261,20 +4221,10 @@
           <w:szCs w:val="20"/>
           <w:shd w:fill="F2F2F2" w:val="clear"/>
         </w:rPr>
-        <w:t xml:space="preserve">STIL</w:t>
-      </w:r>
-      <w:r>
-        <w:t xml:space="preserve">, </w:t>
-      </w:r>
-      <w:r>
-        <w:rPr>
-          <w:b/>
-          <w:bCs/>
-        </w:rPr>
-        <w:t xml:space="preserve">Add All Values</w:t>
-      </w:r>
-      <w:r>
-        <w:t xml:space="preserve">. Det ger tio kategorier – </w:t>
+        <w:t xml:space="preserve">A - Maskinell</w:t>
+      </w:r>
+      <w:r>
+        <w:t xml:space="preserve"> … </w:t>
       </w:r>
       <w:r>
         <w:rPr>
@@ -4283,10 +4233,10 @@
           <w:szCs w:val="20"/>
           <w:shd w:fill="F2F2F2" w:val="clear"/>
         </w:rPr>
-        <w:t xml:space="preserve">A - Manuell</w:t>
-      </w:r>
-      <w:r>
-        <w:t xml:space="preserve"> … </w:t>
+        <w:t xml:space="preserve">E - Maskinell</w:t>
+      </w:r>
+      <w:r>
+        <w:t xml:space="preserve"> streckade, i klassens färg. Spara sedan lagret som </w:t>
       </w:r>
       <w:r>
         <w:rPr>
@@ -4295,10 +4245,10 @@
           <w:szCs w:val="20"/>
           <w:shd w:fill="F2F2F2" w:val="clear"/>
         </w:rPr>
-        <w:t xml:space="preserve">E - Manuell</w:t>
-      </w:r>
-      <w:r>
-        <w:t xml:space="preserve"> heldragna och </w:t>
+        <w:t xml:space="preserve">.lyr</w:t>
+      </w:r>
+      <w:r>
+        <w:t xml:space="preserve"> (högerklicka på lagret &gt; Save As Layer File) i mappen </w:t>
       </w:r>
       <w:r>
         <w:rPr>
@@ -4307,34 +4257,10 @@
           <w:szCs w:val="20"/>
           <w:shd w:fill="F2F2F2" w:val="clear"/>
         </w:rPr>
-        <w:t xml:space="preserve">A - Maskinell</w:t>
-      </w:r>
-      <w:r>
-        <w:t xml:space="preserve"> … </w:t>
-      </w:r>
-      <w:r>
-        <w:rPr>
-          <w:rFonts w:ascii="Consolas" w:cs="Consolas" w:eastAsia="Consolas" w:hAnsi="Consolas"/>
-          <w:sz w:val="20"/>
-          <w:szCs w:val="20"/>
-          <w:shd w:fill="F2F2F2" w:val="clear"/>
-        </w:rPr>
-        <w:t xml:space="preserve">E - Maskinell</w:t>
-      </w:r>
-      <w:r>
-        <w:t xml:space="preserve"> streckade, i klassens färg. Spara sedan lagret som </w:t>
-      </w:r>
-      <w:r>
-        <w:rPr>
-          <w:rFonts w:ascii="Consolas" w:cs="Consolas" w:eastAsia="Consolas" w:hAnsi="Consolas"/>
-          <w:sz w:val="20"/>
-          <w:szCs w:val="20"/>
-          <w:shd w:fill="F2F2F2" w:val="clear"/>
-        </w:rPr>
-        <w:t xml:space="preserve">.lyr</w:t>
-      </w:r>
-      <w:r>
-        <w:t xml:space="preserve"> (högerklicka på lagret &gt; Save As Layer File) på samma plats.</w:t>
+        <w:t xml:space="preserve">arcmap</w:t>
+      </w:r>
+      <w:r>
+        <w:t xml:space="preserve">.</w:t>
       </w:r>
     </w:p>
     <w:p>

</xml_diff>

<commit_message>
Begränsa ersättningslittera till fil, sträcka eller motbrunn
Ett felaktigt littera kan vara ett riktigt littera på andra sträckor,
så en global ersättning räcker inte alltid. CSV:n har nu de valfria
kolumnerna fil, nr och motbrunn som begränsar raden till en TV3-fil,
ett sträcknummer eller filmningar där den andra brunnen är motbrunn.
Rubrikraden styr kolumnordningen (utan rubrik: fel;ratt;kommentar), och
har flera rader samma fel vinner den med flest villkor.

brunnslittera.csv innehåller användarens sex DUF 701-rättningar och
kommenterade exempel på begränsade rader. Handledning 3.3 och CLAUDE.md
uppdaterade.

Testat: tab-avgränsad fil utan nya kolumner läses som förut; regler med
fil/nr/motbrunn träffar bara avsedda sträckor och specifik rad vinner
över global; DUF 701 ger 9 rättade sträckor, klassfördelning oförändrad.

Co-Authored-By: Claude Fable 5.1 <noreply@anthropic.com>
Claude-Session: https://claude.ai/code/session_011fdqX3JEZje1LF9LqpaqR8
</commit_message>
<xml_diff>
--- a/Anvandarhandledning tv3_analys.docx
+++ b/Anvandarhandledning tv3_analys.docx
@@ -1577,7 +1577,7 @@
           <w:sz w:val="19"/>
           <w:szCs w:val="19"/>
         </w:rPr>
-        <w:t xml:space="preserve">fel;ratt;kommentar</w:t>
+        <w:t xml:space="preserve">fel;ratt;fil;nr;motbrunn;kommentar</w:t>
       </w:r>
     </w:p>
     <w:p>
@@ -1592,7 +1592,37 @@
           <w:sz w:val="19"/>
           <w:szCs w:val="19"/>
         </w:rPr>
-        <w:t xml:space="preserve">BDNB1005633;BDNB1015633;DUF 701 – heter BDNB1015633 i kartan</w:t>
+        <w:t xml:space="preserve">BDNB1005633;BDNB1015633;;;;heter BDNB1015633 i kartan – gäller överallt</w:t>
+      </w:r>
+    </w:p>
+    <w:p>
+      <w:pPr>
+        <w:shd w:fill="F2F2F2" w:val="clear"/>
+        <w:spacing w:after="0"/>
+        <w:ind w:left="280"/>
+      </w:pPr>
+      <w:r>
+        <w:rPr>
+          <w:rFonts w:ascii="Consolas" w:cs="Consolas" w:eastAsia="Consolas" w:hAnsi="Consolas"/>
+          <w:sz w:val="19"/>
+          <w:szCs w:val="19"/>
+        </w:rPr>
+        <w:t xml:space="preserve">KRB65728;KRB68728;DUF 701;60;;bara sträcka 60 i DUF 701.TV3</w:t>
+      </w:r>
+    </w:p>
+    <w:p>
+      <w:pPr>
+        <w:shd w:fill="F2F2F2" w:val="clear"/>
+        <w:spacing w:after="0"/>
+        <w:ind w:left="280"/>
+      </w:pPr>
+      <w:r>
+        <w:rPr>
+          <w:rFonts w:ascii="Consolas" w:cs="Consolas" w:eastAsia="Consolas" w:hAnsi="Consolas"/>
+          <w:sz w:val="19"/>
+          <w:szCs w:val="19"/>
+        </w:rPr>
+        <w:t xml:space="preserve">KRB65728;KRB68728;;;KTB1016017;bara filmningar mellan KRB65728 och KTB1016017</w:t>
       </w:r>
     </w:p>
     <w:p>
@@ -1610,7 +1640,28 @@
         <w:spacing w:after="80"/>
       </w:pPr>
       <w:r>
-        <w:t xml:space="preserve">En rad per brunn: felaktigt littera, rätt littera och valfri kommentar, avgränsade med </w:t>
+        <w:rPr>
+          <w:rFonts w:ascii="Consolas" w:cs="Consolas" w:eastAsia="Consolas" w:hAnsi="Consolas"/>
+          <w:sz w:val="20"/>
+          <w:szCs w:val="20"/>
+          <w:shd w:fill="F2F2F2" w:val="clear"/>
+        </w:rPr>
+        <w:t xml:space="preserve">fel</w:t>
+      </w:r>
+      <w:r>
+        <w:t xml:space="preserve"> och </w:t>
+      </w:r>
+      <w:r>
+        <w:rPr>
+          <w:rFonts w:ascii="Consolas" w:cs="Consolas" w:eastAsia="Consolas" w:hAnsi="Consolas"/>
+          <w:sz w:val="20"/>
+          <w:szCs w:val="20"/>
+          <w:shd w:fill="F2F2F2" w:val="clear"/>
+        </w:rPr>
+        <w:t xml:space="preserve">ratt</w:t>
+      </w:r>
+      <w:r>
+        <w:t xml:space="preserve"> är felaktigt respektive rätt littera. Avgränsare </w:t>
       </w:r>
       <w:r>
         <w:rPr>
@@ -1622,7 +1673,7 @@
         <w:t xml:space="preserve">;</w:t>
       </w:r>
       <w:r>
-        <w:t xml:space="preserve"> (</w:t>
+        <w:t xml:space="preserve">, </w:t>
       </w:r>
       <w:r>
         <w:rPr>
@@ -1634,7 +1685,19 @@
         <w:t xml:space="preserve">,</w:t>
       </w:r>
       <w:r>
-        <w:t xml:space="preserve"> eller tab går också). Rubrikrad och </w:t>
+        <w:t xml:space="preserve"> eller tab (filen kan redigeras i Excel). Rubrikraden bestämmer kolumnordningen; utan rubrik antas </w:t>
+      </w:r>
+      <w:r>
+        <w:rPr>
+          <w:rFonts w:ascii="Consolas" w:cs="Consolas" w:eastAsia="Consolas" w:hAnsi="Consolas"/>
+          <w:sz w:val="20"/>
+          <w:szCs w:val="20"/>
+          <w:shd w:fill="F2F2F2" w:val="clear"/>
+        </w:rPr>
+        <w:t xml:space="preserve">fel;ratt;kommentar</w:t>
+      </w:r>
+      <w:r>
+        <w:t xml:space="preserve">. </w:t>
       </w:r>
       <w:r>
         <w:rPr>
@@ -1647,6 +1710,99 @@
       </w:r>
       <w:r>
         <w:t xml:space="preserve">-rader hoppas över.</w:t>
+      </w:r>
+    </w:p>
+    <w:p>
+      <w:pPr>
+        <w:pStyle w:val="ListParagraph"/>
+        <w:numPr>
+          <w:ilvl w:val="0"/>
+          <w:numId w:val="3"/>
+        </w:numPr>
+        <w:spacing w:after="80"/>
+      </w:pPr>
+      <w:r>
+        <w:rPr>
+          <w:rFonts w:ascii="Consolas" w:cs="Consolas" w:eastAsia="Consolas" w:hAnsi="Consolas"/>
+          <w:sz w:val="20"/>
+          <w:szCs w:val="20"/>
+          <w:shd w:fill="F2F2F2" w:val="clear"/>
+        </w:rPr>
+        <w:t xml:space="preserve">fil</w:t>
+      </w:r>
+      <w:r>
+        <w:t xml:space="preserve">, </w:t>
+      </w:r>
+      <w:r>
+        <w:rPr>
+          <w:rFonts w:ascii="Consolas" w:cs="Consolas" w:eastAsia="Consolas" w:hAnsi="Consolas"/>
+          <w:sz w:val="20"/>
+          <w:szCs w:val="20"/>
+          <w:shd w:fill="F2F2F2" w:val="clear"/>
+        </w:rPr>
+        <w:t xml:space="preserve">nr</w:t>
+      </w:r>
+      <w:r>
+        <w:t xml:space="preserve"> och </w:t>
+      </w:r>
+      <w:r>
+        <w:rPr>
+          <w:rFonts w:ascii="Consolas" w:cs="Consolas" w:eastAsia="Consolas" w:hAnsi="Consolas"/>
+          <w:sz w:val="20"/>
+          <w:szCs w:val="20"/>
+          <w:shd w:fill="F2F2F2" w:val="clear"/>
+        </w:rPr>
+        <w:t xml:space="preserve">motbrunn</w:t>
+      </w:r>
+      <w:r>
+        <w:t xml:space="preserve"> är valfria och </w:t>
+      </w:r>
+      <w:r>
+        <w:rPr>
+          <w:b/>
+          <w:bCs/>
+        </w:rPr>
+        <w:t xml:space="preserve">begränsar</w:t>
+      </w:r>
+      <w:r>
+        <w:t xml:space="preserve"> raden: till en TV3-fil (filnamn, med eller utan </w:t>
+      </w:r>
+      <w:r>
+        <w:rPr>
+          <w:rFonts w:ascii="Consolas" w:cs="Consolas" w:eastAsia="Consolas" w:hAnsi="Consolas"/>
+          <w:sz w:val="20"/>
+          <w:szCs w:val="20"/>
+          <w:shd w:fill="F2F2F2" w:val="clear"/>
+        </w:rPr>
+        <w:t xml:space="preserve">.TV3</w:t>
+      </w:r>
+      <w:r>
+        <w:t xml:space="preserve">), till ett sträcknummer (kolumnen Nr i fliken Prioritering) eller till filmningar där den andra brunnen är </w:t>
+      </w:r>
+      <w:r>
+        <w:rPr>
+          <w:rFonts w:ascii="Consolas" w:cs="Consolas" w:eastAsia="Consolas" w:hAnsi="Consolas"/>
+          <w:sz w:val="20"/>
+          <w:szCs w:val="20"/>
+          <w:shd w:fill="F2F2F2" w:val="clear"/>
+        </w:rPr>
+        <w:t xml:space="preserve">motbrunn</w:t>
+      </w:r>
+      <w:r>
+        <w:t xml:space="preserve">. Använd dem när det felaktiga litterat också är ett riktigt littera på andra sträckor – då får bara den felmärkta filmningen rättningen. Tomma = gäller överallt.</w:t>
+      </w:r>
+    </w:p>
+    <w:p>
+      <w:pPr>
+        <w:pStyle w:val="ListParagraph"/>
+        <w:numPr>
+          <w:ilvl w:val="0"/>
+          <w:numId w:val="3"/>
+        </w:numPr>
+        <w:spacing w:after="80"/>
+      </w:pPr>
+      <w:r>
+        <w:t xml:space="preserve">Har flera rader samma felaktiga littera vinner den med flest villkor, så en begränsad rad kan ligga ovanpå en global.</w:t>
       </w:r>
     </w:p>
     <w:p>

</xml_diff>

<commit_message>
Ta med A Platsgjuten brunnspunkt som standardbrunnslager
Co-Authored-By: Claude Fable 5.1 <noreply@anthropic.com>
Claude-Session: https://claude.ai/code/session_011fdqX3JEZje1LF9LqpaqR8
</commit_message>
<xml_diff>
--- a/Anvandarhandledning tv3_analys.docx
+++ b/Anvandarhandledning tv3_analys.docx
@@ -3694,6 +3694,18 @@
         <w:t xml:space="preserve">A Nedstign och övriga brunnar</w:t>
       </w:r>
       <w:r>
+        <w:t xml:space="preserve">, </w:t>
+      </w:r>
+      <w:r>
+        <w:rPr>
+          <w:rFonts w:ascii="Consolas" w:cs="Consolas" w:eastAsia="Consolas" w:hAnsi="Consolas"/>
+          <w:sz w:val="20"/>
+          <w:szCs w:val="20"/>
+          <w:shd w:fill="F2F2F2" w:val="clear"/>
+        </w:rPr>
+        <w:t xml:space="preserve">A Rensbrunn/tillsynsbrunn</w:t>
+      </w:r>
+      <w:r>
         <w:t xml:space="preserve"> och </w:t>
       </w:r>
       <w:r>
@@ -3703,7 +3715,7 @@
           <w:szCs w:val="20"/>
           <w:shd w:fill="F2F2F2" w:val="clear"/>
         </w:rPr>
-        <w:t xml:space="preserve">A Rensbrunn/tillsynsbrunn</w:t>
+        <w:t xml:space="preserve">A Platsgjuten brunnspunkt</w:t>
       </w:r>
       <w:r>
         <w:t xml:space="preserve"> är förifyllda när de finns. Ta med </w:t>

</xml_diff>

<commit_message>
Fält RAPPORT och VIDEO för hyperlänkar i ArcMap
Objekten får sökvägen till sträckans PDF-rapport (löst från JSON-filens
mapp) och till filmen, så att ArcMaps fältbaserade hyperlänkar (Display
> Support Hyperlinks using field) öppnar dem vid klick. Inställningen
sparas i .lyr-filen. Loggens tips och handledningen (7.1, 7.3) beskriver
hur; CLAUDE.md uppdaterad.

Co-Authored-By: Claude Fable 5.1 <noreply@anthropic.com>
Claude-Session: https://claude.ai/code/session_011fdqX3JEZje1LF9LqpaqR8
</commit_message>
<xml_diff>
--- a/Anvandarhandledning tv3_analys.docx
+++ b/Anvandarhandledning tv3_analys.docx
@@ -4416,6 +4416,175 @@
           </w:p>
         </w:tc>
       </w:tr>
+      <w:tr>
+        <w:tc>
+          <w:tcPr>
+            <w:tcW w:type="dxa" w:w="1800"/>
+            <w:tcBorders>
+              <w:top w:val="single" w:color="BFBFBF" w:sz="4"/>
+              <w:left w:val="single" w:color="BFBFBF" w:sz="4"/>
+              <w:bottom w:val="single" w:color="BFBFBF" w:sz="4"/>
+              <w:right w:val="single" w:color="BFBFBF" w:sz="4"/>
+            </w:tcBorders>
+            <w:shd w:fill="F7F9FC" w:val="clear"/>
+            <w:tcMar>
+              <w:top w:type="dxa" w:w="60"/>
+              <w:left w:type="dxa" w:w="100"/>
+              <w:bottom w:type="dxa" w:w="60"/>
+              <w:right w:type="dxa" w:w="100"/>
+            </w:tcMar>
+          </w:tcPr>
+          <w:p>
+            <w:pPr>
+              <w:spacing w:after="0"/>
+            </w:pPr>
+            <w:r>
+              <w:rPr>
+                <w:rFonts w:ascii="Consolas" w:cs="Consolas" w:eastAsia="Consolas" w:hAnsi="Consolas"/>
+                <w:sz w:val="20"/>
+                <w:szCs w:val="20"/>
+                <w:shd w:fill="F2F2F2" w:val="clear"/>
+              </w:rPr>
+              <w:t xml:space="preserve">RAPPORT</w:t>
+            </w:r>
+          </w:p>
+        </w:tc>
+        <w:tc>
+          <w:tcPr>
+            <w:tcW w:type="dxa" w:w="2600"/>
+            <w:tcBorders>
+              <w:top w:val="single" w:color="BFBFBF" w:sz="4"/>
+              <w:left w:val="single" w:color="BFBFBF" w:sz="4"/>
+              <w:bottom w:val="single" w:color="BFBFBF" w:sz="4"/>
+              <w:right w:val="single" w:color="BFBFBF" w:sz="4"/>
+            </w:tcBorders>
+            <w:shd w:fill="F7F9FC" w:val="clear"/>
+            <w:tcMar>
+              <w:top w:type="dxa" w:w="60"/>
+              <w:left w:type="dxa" w:w="100"/>
+              <w:bottom w:type="dxa" w:w="60"/>
+              <w:right w:type="dxa" w:w="100"/>
+            </w:tcMar>
+          </w:tcPr>
+          <w:p>
+            <w:pPr>
+              <w:spacing w:after="0"/>
+            </w:pPr>
+            <w:r>
+              <w:t xml:space="preserve">Inspektionsprotokoll (PDF)</w:t>
+            </w:r>
+          </w:p>
+        </w:tc>
+        <w:tc>
+          <w:tcPr>
+            <w:tcW w:type="dxa" w:w="4960"/>
+            <w:tcBorders>
+              <w:top w:val="single" w:color="BFBFBF" w:sz="4"/>
+              <w:left w:val="single" w:color="BFBFBF" w:sz="4"/>
+              <w:bottom w:val="single" w:color="BFBFBF" w:sz="4"/>
+              <w:right w:val="single" w:color="BFBFBF" w:sz="4"/>
+            </w:tcBorders>
+            <w:shd w:fill="F7F9FC" w:val="clear"/>
+            <w:tcMar>
+              <w:top w:type="dxa" w:w="60"/>
+              <w:left w:type="dxa" w:w="100"/>
+              <w:bottom w:type="dxa" w:w="60"/>
+              <w:right w:type="dxa" w:w="100"/>
+            </w:tcMar>
+          </w:tcPr>
+          <w:p>
+            <w:pPr>
+              <w:spacing w:after="0"/>
+            </w:pPr>
+            <w:r>
+              <w:t xml:space="preserve">Fullständig sökväg till sträckans PDF-rapport, för hyperlänk (se 7.4). Tomt om inga rapporter skapades.</w:t>
+            </w:r>
+          </w:p>
+        </w:tc>
+      </w:tr>
+      <w:tr>
+        <w:tc>
+          <w:tcPr>
+            <w:tcW w:type="dxa" w:w="1800"/>
+            <w:tcBorders>
+              <w:top w:val="single" w:color="BFBFBF" w:sz="4"/>
+              <w:left w:val="single" w:color="BFBFBF" w:sz="4"/>
+              <w:bottom w:val="single" w:color="BFBFBF" w:sz="4"/>
+              <w:right w:val="single" w:color="BFBFBF" w:sz="4"/>
+            </w:tcBorders>
+            <w:tcMar>
+              <w:top w:type="dxa" w:w="60"/>
+              <w:left w:type="dxa" w:w="100"/>
+              <w:bottom w:type="dxa" w:w="60"/>
+              <w:right w:type="dxa" w:w="100"/>
+            </w:tcMar>
+          </w:tcPr>
+          <w:p>
+            <w:pPr>
+              <w:spacing w:after="0"/>
+            </w:pPr>
+            <w:r>
+              <w:rPr>
+                <w:rFonts w:ascii="Consolas" w:cs="Consolas" w:eastAsia="Consolas" w:hAnsi="Consolas"/>
+                <w:sz w:val="20"/>
+                <w:szCs w:val="20"/>
+                <w:shd w:fill="F2F2F2" w:val="clear"/>
+              </w:rPr>
+              <w:t xml:space="preserve">VIDEO</w:t>
+            </w:r>
+          </w:p>
+        </w:tc>
+        <w:tc>
+          <w:tcPr>
+            <w:tcW w:type="dxa" w:w="2600"/>
+            <w:tcBorders>
+              <w:top w:val="single" w:color="BFBFBF" w:sz="4"/>
+              <w:left w:val="single" w:color="BFBFBF" w:sz="4"/>
+              <w:bottom w:val="single" w:color="BFBFBF" w:sz="4"/>
+              <w:right w:val="single" w:color="BFBFBF" w:sz="4"/>
+            </w:tcBorders>
+            <w:tcMar>
+              <w:top w:type="dxa" w:w="60"/>
+              <w:left w:type="dxa" w:w="100"/>
+              <w:bottom w:type="dxa" w:w="60"/>
+              <w:right w:type="dxa" w:w="100"/>
+            </w:tcMar>
+          </w:tcPr>
+          <w:p>
+            <w:pPr>
+              <w:spacing w:after="0"/>
+            </w:pPr>
+            <w:r>
+              <w:t xml:space="preserve">Videofil</w:t>
+            </w:r>
+          </w:p>
+        </w:tc>
+        <w:tc>
+          <w:tcPr>
+            <w:tcW w:type="dxa" w:w="4960"/>
+            <w:tcBorders>
+              <w:top w:val="single" w:color="BFBFBF" w:sz="4"/>
+              <w:left w:val="single" w:color="BFBFBF" w:sz="4"/>
+              <w:bottom w:val="single" w:color="BFBFBF" w:sz="4"/>
+              <w:right w:val="single" w:color="BFBFBF" w:sz="4"/>
+            </w:tcBorders>
+            <w:tcMar>
+              <w:top w:type="dxa" w:w="60"/>
+              <w:left w:type="dxa" w:w="100"/>
+              <w:bottom w:type="dxa" w:w="60"/>
+              <w:right w:type="dxa" w:w="100"/>
+            </w:tcMar>
+          </w:tcPr>
+          <w:p>
+            <w:pPr>
+              <w:spacing w:after="0"/>
+            </w:pPr>
+            <w:r>
+              <w:t xml:space="preserve">Fullständig sökväg till filmen, om den hittades vid analysen.</w:t>
+            </w:r>
+          </w:p>
+        </w:tc>
+      </w:tr>
     </w:tbl>
     <w:p>
       <w:pPr>
@@ -4729,7 +4898,123 @@
         <w:pStyle w:val="Heading2"/>
       </w:pPr>
       <w:r>
-        <w:t xml:space="preserve">7.3 Sträckor som inte hittas</w:t>
+        <w:t xml:space="preserve">7.3 Öppna PDF-rapporten från kartan</w:t>
+      </w:r>
+    </w:p>
+    <w:p>
+      <w:pPr>
+        <w:spacing w:after="120"/>
+      </w:pPr>
+      <w:r>
+        <w:t xml:space="preserve">Objekten har fältet </w:t>
+      </w:r>
+      <w:r>
+        <w:rPr>
+          <w:rFonts w:ascii="Consolas" w:cs="Consolas" w:eastAsia="Consolas" w:hAnsi="Consolas"/>
+          <w:sz w:val="20"/>
+          <w:szCs w:val="20"/>
+          <w:shd w:fill="F2F2F2" w:val="clear"/>
+        </w:rPr>
+        <w:t xml:space="preserve">RAPPORT</w:t>
+      </w:r>
+      <w:r>
+        <w:t xml:space="preserve"> med sökvägen till sträckans inspektionsprotokoll. Gör en gång, i lagrets egenskaper: </w:t>
+      </w:r>
+      <w:r>
+        <w:rPr>
+          <w:b/>
+          <w:bCs/>
+        </w:rPr>
+        <w:t xml:space="preserve">Display &gt; Support Hyperlinks using field</w:t>
+      </w:r>
+      <w:r>
+        <w:t xml:space="preserve">, välj </w:t>
+      </w:r>
+      <w:r>
+        <w:rPr>
+          <w:rFonts w:ascii="Consolas" w:cs="Consolas" w:eastAsia="Consolas" w:hAnsi="Consolas"/>
+          <w:sz w:val="20"/>
+          <w:szCs w:val="20"/>
+          <w:shd w:fill="F2F2F2" w:val="clear"/>
+        </w:rPr>
+        <w:t xml:space="preserve">RAPPORT</w:t>
+      </w:r>
+      <w:r>
+        <w:t xml:space="preserve"> och </w:t>
+      </w:r>
+      <w:r>
+        <w:rPr>
+          <w:b/>
+          <w:bCs/>
+        </w:rPr>
+        <w:t xml:space="preserve">Document</w:t>
+      </w:r>
+      <w:r>
+        <w:t xml:space="preserve">. Sedan öppnar Hyperlänk-verktyget (blixten i verktygsfältet Tools) PDF:en när du klickar på en ledning, och i Identify-fönstret blir fältet klickbart. Samma sak går att göra för </w:t>
+      </w:r>
+      <w:r>
+        <w:rPr>
+          <w:rFonts w:ascii="Consolas" w:cs="Consolas" w:eastAsia="Consolas" w:hAnsi="Consolas"/>
+          <w:sz w:val="20"/>
+          <w:szCs w:val="20"/>
+          <w:shd w:fill="F2F2F2" w:val="clear"/>
+        </w:rPr>
+        <w:t xml:space="preserve">VIDEO</w:t>
+      </w:r>
+      <w:r>
+        <w:t xml:space="preserve"> om du hellre vill öppna filmen. Inställningen sparas i </w:t>
+      </w:r>
+      <w:r>
+        <w:rPr>
+          <w:rFonts w:ascii="Consolas" w:cs="Consolas" w:eastAsia="Consolas" w:hAnsi="Consolas"/>
+          <w:sz w:val="20"/>
+          <w:szCs w:val="20"/>
+          <w:shd w:fill="F2F2F2" w:val="clear"/>
+        </w:rPr>
+        <w:t xml:space="preserve">.lyr</w:t>
+      </w:r>
+      <w:r>
+        <w:t xml:space="preserve">-filen tillsammans med symbologin, så den följer med automatiskt vid nästa körning.</w:t>
+      </w:r>
+    </w:p>
+    <w:p>
+      <w:pPr>
+        <w:spacing w:after="120"/>
+      </w:pPr>
+      <w:r>
+        <w:t xml:space="preserve">Sökvägarna pekar på mappen där </w:t>
+      </w:r>
+      <w:r>
+        <w:rPr>
+          <w:rFonts w:ascii="Consolas" w:cs="Consolas" w:eastAsia="Consolas" w:hAnsi="Consolas"/>
+          <w:sz w:val="20"/>
+          <w:szCs w:val="20"/>
+          <w:shd w:fill="F2F2F2" w:val="clear"/>
+        </w:rPr>
+        <w:t xml:space="preserve">kartunderlag.json</w:t>
+      </w:r>
+      <w:r>
+        <w:t xml:space="preserve"> låg när lagret skapades (</w:t>
+      </w:r>
+      <w:r>
+        <w:rPr>
+          <w:rFonts w:ascii="Consolas" w:cs="Consolas" w:eastAsia="Consolas" w:hAnsi="Consolas"/>
+          <w:sz w:val="20"/>
+          <w:szCs w:val="20"/>
+          <w:shd w:fill="F2F2F2" w:val="clear"/>
+        </w:rPr>
+        <w:t xml:space="preserve">rapporter\…</w:t>
+      </w:r>
+      <w:r>
+        <w:t xml:space="preserve"> bredvid den). Flyttar du utdatamappen, kör verktyget igen så räknas sökvägarna om.</w:t>
+      </w:r>
+    </w:p>
+    <w:p>
+      <w:pPr>
+        <w:pStyle w:val="Heading2"/>
+      </w:pPr>
+      <w:r>
+        <w:t xml:space="preserve">7.4 Sträckor som inte hittas</w:t>
       </w:r>
     </w:p>
     <w:p>

</xml_diff>

<commit_message>
Rapport- och filmmapp för hyperlänkar när ArcMap körs på annan dator
Analysen körs lokalt men ArcMap i Citrix, så sökvägarna i JSON-filen
gäller inte där. Nya valfria parametrar rapportmapp och filmmapp
(kategori Hyperlänkar; KONFIG: RAPPORTMAPP/FILMMAPP) bygger RAPPORT och
VIDEO av filnamnet i en mapp som ArcMap-datorn ser. Utan dem som förut:
rapporter relativt JSON-filen, filmer där tv3_analys fann dem.

Co-Authored-By: Claude Fable 5.1 <noreply@anthropic.com>
Claude-Session: https://claude.ai/code/session_011fdqX3JEZje1LF9LqpaqR8
</commit_message>
<xml_diff>
--- a/Anvandarhandledning tv3_analys.docx
+++ b/Anvandarhandledning tv3_analys.docx
@@ -4982,7 +4982,29 @@
         <w:spacing w:after="120"/>
       </w:pPr>
       <w:r>
-        <w:t xml:space="preserve">Sökvägarna pekar på mappen där </w:t>
+        <w:t xml:space="preserve">Sökvägarna måste fungera </w:t>
+      </w:r>
+      <w:r>
+        <w:rPr>
+          <w:b/>
+          <w:bCs/>
+        </w:rPr>
+        <w:t xml:space="preserve">på den dator där ArcMap körs</w:t>
+      </w:r>
+      <w:r>
+        <w:t xml:space="preserve">. Kör du analysen på din egen dator men ArcMap i Citrix: lägg utdatamappen (med </w:t>
+      </w:r>
+      <w:r>
+        <w:rPr>
+          <w:rFonts w:ascii="Consolas" w:cs="Consolas" w:eastAsia="Consolas" w:hAnsi="Consolas"/>
+          <w:sz w:val="20"/>
+          <w:szCs w:val="20"/>
+          <w:shd w:fill="F2F2F2" w:val="clear"/>
+        </w:rPr>
+        <w:t xml:space="preserve">rapporter</w:t>
+      </w:r>
+      <w:r>
+        <w:t xml:space="preserve">) på en nätverksplats som Citrix-klienten når, och läs </w:t>
       </w:r>
       <w:r>
         <w:rPr>
@@ -4994,19 +5016,29 @@
         <w:t xml:space="preserve">kartunderlag.json</w:t>
       </w:r>
       <w:r>
-        <w:t xml:space="preserve"> låg när lagret skapades (</w:t>
-      </w:r>
-      <w:r>
-        <w:rPr>
-          <w:rFonts w:ascii="Consolas" w:cs="Consolas" w:eastAsia="Consolas" w:hAnsi="Consolas"/>
-          <w:sz w:val="20"/>
-          <w:szCs w:val="20"/>
-          <w:shd w:fill="F2F2F2" w:val="clear"/>
-        </w:rPr>
-        <w:t xml:space="preserve">rapporter\…</w:t>
-      </w:r>
-      <w:r>
-        <w:t xml:space="preserve"> bredvid den). Flyttar du utdatamappen, kör verktyget igen så räknas sökvägarna om.</w:t>
+        <w:t xml:space="preserve"> därifrån – PDF-sökvägarna härleds från JSON-filens mapp, så då stämmer de. Filmerna ligger på en annan plats än analysen fann dem; ange under </w:t>
+      </w:r>
+      <w:r>
+        <w:rPr>
+          <w:b/>
+          <w:bCs/>
+        </w:rPr>
+        <w:t xml:space="preserve">Hyperlänkar</w:t>
+      </w:r>
+      <w:r>
+        <w:t xml:space="preserve"> i verktyget mappen med filmerna som Citrix-klienten ser den, så byggs </w:t>
+      </w:r>
+      <w:r>
+        <w:rPr>
+          <w:rFonts w:ascii="Consolas" w:cs="Consolas" w:eastAsia="Consolas" w:hAnsi="Consolas"/>
+          <w:sz w:val="20"/>
+          <w:szCs w:val="20"/>
+          <w:shd w:fill="F2F2F2" w:val="clear"/>
+        </w:rPr>
+        <w:t xml:space="preserve">VIDEO</w:t>
+      </w:r>
+      <w:r>
+        <w:t xml:space="preserve"> av filnamnet i den mappen. På samma sätt kan rapportmappen pekas ut om den inte ligger bredvid JSON-filen. Flyttar du mapparna, kör verktyget igen så räknas sökvägarna om.</w:t>
       </w:r>
     </w:p>
     <w:p>

</xml_diff>

<commit_message>
Flagga --behall-rapporter: skriv inte om PDF-rapporter som finns
PDF-rapporterna tar en minut för DUF 701 och behöver sällan göras om.
Med --behall-rapporter (KONFIG: BEHALL_RAPPORTER) hoppas sträckor vars
PDF redan finns i utdatakatalogen över; länken i Excel och JSON sätts
ändå. Loggen visar antal skrivna och behållna.

Testat: full körning 41 rapporter, en raderad, omkörning med flaggan
skriver 1 och behåller 40 på 3 sekunder; alla 41 länkar kvar.

Co-Authored-By: Claude Fable 5.1 <noreply@anthropic.com>
Claude-Session: https://claude.ai/code/session_011fdqX3JEZje1LF9LqpaqR8
</commit_message>
<xml_diff>
--- a/Anvandarhandledning tv3_analys.docx
+++ b/Anvandarhandledning tv3_analys.docx
@@ -1195,6 +1195,102 @@
                 <w:szCs w:val="20"/>
                 <w:shd w:fill="F2F2F2" w:val="clear"/>
               </w:rPr>
+              <w:t xml:space="preserve">--behall-rapporter</w:t>
+            </w:r>
+          </w:p>
+        </w:tc>
+        <w:tc>
+          <w:tcPr>
+            <w:tcW w:type="dxa" w:w="5000"/>
+            <w:tcBorders>
+              <w:top w:val="single" w:color="BFBFBF" w:sz="4"/>
+              <w:left w:val="single" w:color="BFBFBF" w:sz="4"/>
+              <w:bottom w:val="single" w:color="BFBFBF" w:sz="4"/>
+              <w:right w:val="single" w:color="BFBFBF" w:sz="4"/>
+            </w:tcBorders>
+            <w:tcMar>
+              <w:top w:type="dxa" w:w="60"/>
+              <w:left w:type="dxa" w:w="100"/>
+              <w:bottom w:type="dxa" w:w="60"/>
+              <w:right w:type="dxa" w:w="100"/>
+            </w:tcMar>
+          </w:tcPr>
+          <w:p>
+            <w:pPr>
+              <w:spacing w:after="0"/>
+            </w:pPr>
+            <w:r>
+              <w:t xml:space="preserve">Hoppar över PDF-rapporter som redan finns i utdatamappen och skriver bara de som saknas. Länkarna i Excel pekar ändå på dem. Använd vid omkörningar när bara Excel eller kartunderlaget ska uppdateras; kör utan flaggan (eller töm mappen </w:t>
+            </w:r>
+            <w:r>
+              <w:rPr>
+                <w:rFonts w:ascii="Consolas" w:cs="Consolas" w:eastAsia="Consolas" w:hAnsi="Consolas"/>
+                <w:sz w:val="20"/>
+                <w:szCs w:val="20"/>
+                <w:shd w:fill="F2F2F2" w:val="clear"/>
+              </w:rPr>
+              <w:t xml:space="preserve">rapporter</w:t>
+            </w:r>
+            <w:r>
+              <w:t xml:space="preserve">) när rapportlayouten ändrats.</w:t>
+            </w:r>
+          </w:p>
+        </w:tc>
+        <w:tc>
+          <w:tcPr>
+            <w:tcW w:type="dxa" w:w="1760"/>
+            <w:tcBorders>
+              <w:top w:val="single" w:color="BFBFBF" w:sz="4"/>
+              <w:left w:val="single" w:color="BFBFBF" w:sz="4"/>
+              <w:bottom w:val="single" w:color="BFBFBF" w:sz="4"/>
+              <w:right w:val="single" w:color="BFBFBF" w:sz="4"/>
+            </w:tcBorders>
+            <w:tcMar>
+              <w:top w:type="dxa" w:w="60"/>
+              <w:left w:type="dxa" w:w="100"/>
+              <w:bottom w:type="dxa" w:w="60"/>
+              <w:right w:type="dxa" w:w="100"/>
+            </w:tcMar>
+          </w:tcPr>
+          <w:p>
+            <w:pPr>
+              <w:spacing w:after="0"/>
+            </w:pPr>
+            <w:r>
+              <w:t xml:space="preserve">av</w:t>
+            </w:r>
+          </w:p>
+        </w:tc>
+      </w:tr>
+      <w:tr>
+        <w:tc>
+          <w:tcPr>
+            <w:tcW w:type="dxa" w:w="2600"/>
+            <w:tcBorders>
+              <w:top w:val="single" w:color="BFBFBF" w:sz="4"/>
+              <w:left w:val="single" w:color="BFBFBF" w:sz="4"/>
+              <w:bottom w:val="single" w:color="BFBFBF" w:sz="4"/>
+              <w:right w:val="single" w:color="BFBFBF" w:sz="4"/>
+            </w:tcBorders>
+            <w:shd w:fill="F7F9FC" w:val="clear"/>
+            <w:tcMar>
+              <w:top w:type="dxa" w:w="60"/>
+              <w:left w:type="dxa" w:w="100"/>
+              <w:bottom w:type="dxa" w:w="60"/>
+              <w:right w:type="dxa" w:w="100"/>
+            </w:tcMar>
+          </w:tcPr>
+          <w:p>
+            <w:pPr>
+              <w:spacing w:after="0"/>
+            </w:pPr>
+            <w:r>
+              <w:rPr>
+                <w:rFonts w:ascii="Consolas" w:cs="Consolas" w:eastAsia="Consolas" w:hAnsi="Consolas"/>
+                <w:sz w:val="20"/>
+                <w:szCs w:val="20"/>
+                <w:shd w:fill="F2F2F2" w:val="clear"/>
+              </w:rPr>
               <w:t xml:space="preserve">--diagram</w:t>
             </w:r>
           </w:p>
@@ -1208,6 +1304,7 @@
               <w:bottom w:val="single" w:color="BFBFBF" w:sz="4"/>
               <w:right w:val="single" w:color="BFBFBF" w:sz="4"/>
             </w:tcBorders>
+            <w:shd w:fill="F7F9FC" w:val="clear"/>
             <w:tcMar>
               <w:top w:type="dxa" w:w="60"/>
               <w:left w:type="dxa" w:w="100"/>
@@ -1245,6 +1342,7 @@
               <w:bottom w:val="single" w:color="BFBFBF" w:sz="4"/>
               <w:right w:val="single" w:color="BFBFBF" w:sz="4"/>
             </w:tcBorders>
+            <w:shd w:fill="F7F9FC" w:val="clear"/>
             <w:tcMar>
               <w:top w:type="dxa" w:w="60"/>
               <w:left w:type="dxa" w:w="100"/>
@@ -1272,7 +1370,6 @@
               <w:bottom w:val="single" w:color="BFBFBF" w:sz="4"/>
               <w:right w:val="single" w:color="BFBFBF" w:sz="4"/>
             </w:tcBorders>
-            <w:shd w:fill="F7F9FC" w:val="clear"/>
             <w:tcMar>
               <w:top w:type="dxa" w:w="60"/>
               <w:left w:type="dxa" w:w="100"/>
@@ -1304,7 +1401,6 @@
               <w:bottom w:val="single" w:color="BFBFBF" w:sz="4"/>
               <w:right w:val="single" w:color="BFBFBF" w:sz="4"/>
             </w:tcBorders>
-            <w:shd w:fill="F7F9FC" w:val="clear"/>
             <w:tcMar>
               <w:top w:type="dxa" w:w="60"/>
               <w:left w:type="dxa" w:w="100"/>
@@ -1342,7 +1438,6 @@
               <w:bottom w:val="single" w:color="BFBFBF" w:sz="4"/>
               <w:right w:val="single" w:color="BFBFBF" w:sz="4"/>
             </w:tcBorders>
-            <w:shd w:fill="F7F9FC" w:val="clear"/>
             <w:tcMar>
               <w:top w:type="dxa" w:w="60"/>
               <w:left w:type="dxa" w:w="100"/>
@@ -1376,6 +1471,7 @@
               <w:bottom w:val="single" w:color="BFBFBF" w:sz="4"/>
               <w:right w:val="single" w:color="BFBFBF" w:sz="4"/>
             </w:tcBorders>
+            <w:shd w:fill="F7F9FC" w:val="clear"/>
             <w:tcMar>
               <w:top w:type="dxa" w:w="60"/>
               <w:left w:type="dxa" w:w="100"/>
@@ -1407,6 +1503,7 @@
               <w:bottom w:val="single" w:color="BFBFBF" w:sz="4"/>
               <w:right w:val="single" w:color="BFBFBF" w:sz="4"/>
             </w:tcBorders>
+            <w:shd w:fill="F7F9FC" w:val="clear"/>
             <w:tcMar>
               <w:top w:type="dxa" w:w="60"/>
               <w:left w:type="dxa" w:w="100"/>
@@ -1432,6 +1529,7 @@
               <w:bottom w:val="single" w:color="BFBFBF" w:sz="4"/>
               <w:right w:val="single" w:color="BFBFBF" w:sz="4"/>
             </w:tcBorders>
+            <w:shd w:fill="F7F9FC" w:val="clear"/>
             <w:tcMar>
               <w:top w:type="dxa" w:w="60"/>
               <w:left w:type="dxa" w:w="100"/>
@@ -1459,7 +1557,6 @@
               <w:bottom w:val="single" w:color="BFBFBF" w:sz="4"/>
               <w:right w:val="single" w:color="BFBFBF" w:sz="4"/>
             </w:tcBorders>
-            <w:shd w:fill="F7F9FC" w:val="clear"/>
             <w:tcMar>
               <w:top w:type="dxa" w:w="60"/>
               <w:left w:type="dxa" w:w="100"/>
@@ -1491,7 +1588,6 @@
               <w:bottom w:val="single" w:color="BFBFBF" w:sz="4"/>
               <w:right w:val="single" w:color="BFBFBF" w:sz="4"/>
             </w:tcBorders>
-            <w:shd w:fill="F7F9FC" w:val="clear"/>
             <w:tcMar>
               <w:top w:type="dxa" w:w="60"/>
               <w:left w:type="dxa" w:w="100"/>
@@ -1517,7 +1613,6 @@
               <w:bottom w:val="single" w:color="BFBFBF" w:sz="4"/>
               <w:right w:val="single" w:color="BFBFBF" w:sz="4"/>
             </w:tcBorders>
-            <w:shd w:fill="F7F9FC" w:val="clear"/>
             <w:tcMar>
               <w:top w:type="dxa" w:w="60"/>
               <w:left w:type="dxa" w:w="100"/>
@@ -5117,6 +5212,18 @@
       </w:r>
       <w:r>
         <w:t xml:space="preserve"> PDF-rapporterna tar ungefär en halv sekund per sträcka. Använd </w:t>
+      </w:r>
+      <w:r>
+        <w:rPr>
+          <w:rFonts w:ascii="Consolas" w:cs="Consolas" w:eastAsia="Consolas" w:hAnsi="Consolas"/>
+          <w:sz w:val="20"/>
+          <w:szCs w:val="20"/>
+          <w:shd w:fill="F2F2F2" w:val="clear"/>
+        </w:rPr>
+        <w:t xml:space="preserve">--behall-rapporter</w:t>
+      </w:r>
+      <w:r>
+        <w:t xml:space="preserve"> vid omkörningar så skrivs bara rapporter som saknas, </w:t>
       </w:r>
       <w:r>
         <w:rPr>

</xml_diff>

<commit_message>
Skriv lagret i 2D och exportera GeoJSON (WGS84) för webb-GIS
Webb-GIS:et läste varken GeoJSON-exporten från ArcMap (EPSG:3011 och
fyra koordinater per punkt, Z = -9999) eller shapefilen (PolyLineZ, och
.shx saknades i zippen).

- Utdata skrivs alltid i 2D: Z i ledningsnätverket är odefinierat
- Ny valfri parameter "GeoJSON för webb-GIS": skriv_geojson() projicerar
  varje objekt till WGS84 (projectAs 4326), skriver 2D-koordinater med
  7 decimaler, utan crs-medlem, UTF-8 – RFC 7946
- KONFIG: GEOJSON_UT för execfile-körning
- Handledning 7.4 (webb-GIS, vilka shapefil-delar som måste med) och
  CLAUDE.md uppdaterade

Testat med låtsas-arcpy: giltig FeatureCollection, LineString med
2D-koordinater i graderna, åäö korrekt, tomma strängar utan mellanslag.

Co-Authored-By: Claude Fable 5.1 <noreply@anthropic.com>
Claude-Session: https://claude.ai/code/session_011fdqX3JEZje1LF9LqpaqR8
</commit_message>
<xml_diff>
--- a/Anvandarhandledning tv3_analys.docx
+++ b/Anvandarhandledning tv3_analys.docx
@@ -5141,7 +5141,125 @@
         <w:pStyle w:val="Heading2"/>
       </w:pPr>
       <w:r>
-        <w:t xml:space="preserve">7.4 Sträckor som inte hittas</w:t>
+        <w:t xml:space="preserve">7.4 Webb-GIS och GeoJSON</w:t>
+      </w:r>
+    </w:p>
+    <w:p>
+      <w:pPr>
+        <w:spacing w:after="120"/>
+      </w:pPr>
+      <w:r>
+        <w:t xml:space="preserve">Ska lagret in i ett webb-GIS, fyll i </w:t>
+      </w:r>
+      <w:r>
+        <w:rPr>
+          <w:b/>
+          <w:bCs/>
+        </w:rPr>
+        <w:t xml:space="preserve">GeoJSON för webb-GIS</w:t>
+      </w:r>
+      <w:r>
+        <w:t xml:space="preserve"> i verktyget. Filen skrivs enligt GeoJSON-standarden (RFC 7946): koordinater i WGS84 (EPSG:4326), två dimensioner, ingen </w:t>
+      </w:r>
+      <w:r>
+        <w:rPr>
+          <w:rFonts w:ascii="Consolas" w:cs="Consolas" w:eastAsia="Consolas" w:hAnsi="Consolas"/>
+          <w:sz w:val="20"/>
+          <w:szCs w:val="20"/>
+          <w:shd w:fill="F2F2F2" w:val="clear"/>
+        </w:rPr>
+        <w:t xml:space="preserve">crs</w:t>
+      </w:r>
+      <w:r>
+        <w:t xml:space="preserve">-uppgift, UTF-8. ArcMaps egen export (Features To JSON) behåller kartans koordinatsystem (SWEREF 99 18 00) och Z/M-värden, vilket de flesta webbkartor inte läser – det är skillnaden.</w:t>
+      </w:r>
+    </w:p>
+    <w:p>
+      <w:pPr>
+        <w:spacing w:after="120"/>
+      </w:pPr>
+      <w:r>
+        <w:t xml:space="preserve">Ska shapefilen delas: en shapefil består av minst </w:t>
+      </w:r>
+      <w:r>
+        <w:rPr>
+          <w:rFonts w:ascii="Consolas" w:cs="Consolas" w:eastAsia="Consolas" w:hAnsi="Consolas"/>
+          <w:sz w:val="20"/>
+          <w:szCs w:val="20"/>
+          <w:shd w:fill="F2F2F2" w:val="clear"/>
+        </w:rPr>
+        <w:t xml:space="preserve">.shp</w:t>
+      </w:r>
+      <w:r>
+        <w:t xml:space="preserve">, </w:t>
+      </w:r>
+      <w:r>
+        <w:rPr>
+          <w:rFonts w:ascii="Consolas" w:cs="Consolas" w:eastAsia="Consolas" w:hAnsi="Consolas"/>
+          <w:sz w:val="20"/>
+          <w:szCs w:val="20"/>
+          <w:shd w:fill="F2F2F2" w:val="clear"/>
+        </w:rPr>
+        <w:t xml:space="preserve">.shx</w:t>
+      </w:r>
+      <w:r>
+        <w:t xml:space="preserve">, </w:t>
+      </w:r>
+      <w:r>
+        <w:rPr>
+          <w:rFonts w:ascii="Consolas" w:cs="Consolas" w:eastAsia="Consolas" w:hAnsi="Consolas"/>
+          <w:sz w:val="20"/>
+          <w:szCs w:val="20"/>
+          <w:shd w:fill="F2F2F2" w:val="clear"/>
+        </w:rPr>
+        <w:t xml:space="preserve">.dbf</w:t>
+      </w:r>
+      <w:r>
+        <w:t xml:space="preserve"> och </w:t>
+      </w:r>
+      <w:r>
+        <w:rPr>
+          <w:rFonts w:ascii="Consolas" w:cs="Consolas" w:eastAsia="Consolas" w:hAnsi="Consolas"/>
+          <w:sz w:val="20"/>
+          <w:szCs w:val="20"/>
+          <w:shd w:fill="F2F2F2" w:val="clear"/>
+        </w:rPr>
+        <w:t xml:space="preserve">.prj</w:t>
+      </w:r>
+      <w:r>
+        <w:t xml:space="preserve"> – alla fyra måste följa med (plus </w:t>
+      </w:r>
+      <w:r>
+        <w:rPr>
+          <w:rFonts w:ascii="Consolas" w:cs="Consolas" w:eastAsia="Consolas" w:hAnsi="Consolas"/>
+          <w:sz w:val="20"/>
+          <w:szCs w:val="20"/>
+          <w:shd w:fill="F2F2F2" w:val="clear"/>
+        </w:rPr>
+        <w:t xml:space="preserve">.cpg</w:t>
+      </w:r>
+      <w:r>
+        <w:t xml:space="preserve"> för åäö). Utan </w:t>
+      </w:r>
+      <w:r>
+        <w:rPr>
+          <w:rFonts w:ascii="Consolas" w:cs="Consolas" w:eastAsia="Consolas" w:hAnsi="Consolas"/>
+          <w:sz w:val="20"/>
+          <w:szCs w:val="20"/>
+          <w:shd w:fill="F2F2F2" w:val="clear"/>
+        </w:rPr>
+        <w:t xml:space="preserve">.shx</w:t>
+      </w:r>
+      <w:r>
+        <w:t xml:space="preserve"> går filen inte att öppna någonstans. Lagret skrivs sedan version 2 i 2D, eftersom Z-värdena i ledningsnätverket är odefinierade (−9999) och 3D-shapefiler stoppar många webb-GIS.</w:t>
+      </w:r>
+    </w:p>
+    <w:p>
+      <w:pPr>
+        <w:pStyle w:val="Heading2"/>
+      </w:pPr>
+      <w:r>
+        <w:t xml:space="preserve">7.5 Sträckor som inte hittas</w:t>
       </w:r>
     </w:p>
     <w:p>

</xml_diff>

<commit_message>
Vikta löpande skador med längden (1 enhet per 10 m, tak 5×)
Löpande skador räknades en gång oavsett längd, så en 105 m ytskada
grad 3 gav samma 10 poäng som en punktspricka. Nu multipliceras
poängen med längd / LOPANDE_ENHET_M (10 m), minst 1 och högst
LOPANDE_TAK (5). None stänger av. Parametrarna visas i Excel-fliken
Sammanfattning.

DUF 701: klasser 41/53/23/62/6 → 62/36/19/62/6, 25 sträckor byter
klass (21 B→A, 4 C→B); rang 1 SRB64009→SRB1016560 går från 290 till
315 p (898 p/100 m). Metodbeskrivning (4.1 och exemplet), handledningens
KONFIG-tabell och facit i CLAUDE.md uppdaterade.

Co-Authored-By: Claude Fable 5.1 <noreply@anthropic.com>
Claude-Session: https://claude.ai/code/session_011fdqX3JEZje1LF9LqpaqR8
</commit_message>
<xml_diff>
--- a/Anvandarhandledning tv3_analys.docx
+++ b/Anvandarhandledning tv3_analys.docx
@@ -3201,6 +3201,199 @@
             </w:pPr>
             <w:r>
               <w:t xml:space="preserve">0,5</w:t>
+            </w:r>
+          </w:p>
+        </w:tc>
+      </w:tr>
+      <w:tr>
+        <w:tc>
+          <w:tcPr>
+            <w:tcW w:type="dxa" w:w="2600"/>
+            <w:tcBorders>
+              <w:top w:val="single" w:color="BFBFBF" w:sz="4"/>
+              <w:left w:val="single" w:color="BFBFBF" w:sz="4"/>
+              <w:bottom w:val="single" w:color="BFBFBF" w:sz="4"/>
+              <w:right w:val="single" w:color="BFBFBF" w:sz="4"/>
+            </w:tcBorders>
+            <w:tcMar>
+              <w:top w:type="dxa" w:w="60"/>
+              <w:left w:type="dxa" w:w="100"/>
+              <w:bottom w:type="dxa" w:w="60"/>
+              <w:right w:type="dxa" w:w="100"/>
+            </w:tcMar>
+          </w:tcPr>
+          <w:p>
+            <w:pPr>
+              <w:spacing w:after="0"/>
+            </w:pPr>
+            <w:r>
+              <w:rPr>
+                <w:rFonts w:ascii="Consolas" w:cs="Consolas" w:eastAsia="Consolas" w:hAnsi="Consolas"/>
+                <w:sz w:val="20"/>
+                <w:szCs w:val="20"/>
+                <w:shd w:fill="F2F2F2" w:val="clear"/>
+              </w:rPr>
+              <w:t xml:space="preserve">LOPANDE_ENHET_M</w:t>
+            </w:r>
+          </w:p>
+        </w:tc>
+        <w:tc>
+          <w:tcPr>
+            <w:tcW w:type="dxa" w:w="5000"/>
+            <w:tcBorders>
+              <w:top w:val="single" w:color="BFBFBF" w:sz="4"/>
+              <w:left w:val="single" w:color="BFBFBF" w:sz="4"/>
+              <w:bottom w:val="single" w:color="BFBFBF" w:sz="4"/>
+              <w:right w:val="single" w:color="BFBFBF" w:sz="4"/>
+            </w:tcBorders>
+            <w:tcMar>
+              <w:top w:type="dxa" w:w="60"/>
+              <w:left w:type="dxa" w:w="100"/>
+              <w:bottom w:type="dxa" w:w="60"/>
+              <w:right w:type="dxa" w:w="100"/>
+            </w:tcMar>
+          </w:tcPr>
+          <w:p>
+            <w:pPr>
+              <w:spacing w:after="0"/>
+            </w:pPr>
+            <w:r>
+              <w:t xml:space="preserve">Längd (m) per poängenhet för löpande skador: poäng × längd / enhet, minst 1. </w:t>
+            </w:r>
+            <w:r>
+              <w:rPr>
+                <w:rFonts w:ascii="Consolas" w:cs="Consolas" w:eastAsia="Consolas" w:hAnsi="Consolas"/>
+                <w:sz w:val="20"/>
+                <w:szCs w:val="20"/>
+                <w:shd w:fill="F2F2F2" w:val="clear"/>
+              </w:rPr>
+              <w:t xml:space="preserve">None</w:t>
+            </w:r>
+            <w:r>
+              <w:t xml:space="preserve"> = räkna en gång oavsett längd.</w:t>
+            </w:r>
+          </w:p>
+        </w:tc>
+        <w:tc>
+          <w:tcPr>
+            <w:tcW w:type="dxa" w:w="1760"/>
+            <w:tcBorders>
+              <w:top w:val="single" w:color="BFBFBF" w:sz="4"/>
+              <w:left w:val="single" w:color="BFBFBF" w:sz="4"/>
+              <w:bottom w:val="single" w:color="BFBFBF" w:sz="4"/>
+              <w:right w:val="single" w:color="BFBFBF" w:sz="4"/>
+            </w:tcBorders>
+            <w:tcMar>
+              <w:top w:type="dxa" w:w="60"/>
+              <w:left w:type="dxa" w:w="100"/>
+              <w:bottom w:type="dxa" w:w="60"/>
+              <w:right w:type="dxa" w:w="100"/>
+            </w:tcMar>
+          </w:tcPr>
+          <w:p>
+            <w:pPr>
+              <w:spacing w:after="0"/>
+            </w:pPr>
+            <w:r>
+              <w:t xml:space="preserve">10</w:t>
+            </w:r>
+          </w:p>
+        </w:tc>
+      </w:tr>
+      <w:tr>
+        <w:tc>
+          <w:tcPr>
+            <w:tcW w:type="dxa" w:w="2600"/>
+            <w:tcBorders>
+              <w:top w:val="single" w:color="BFBFBF" w:sz="4"/>
+              <w:left w:val="single" w:color="BFBFBF" w:sz="4"/>
+              <w:bottom w:val="single" w:color="BFBFBF" w:sz="4"/>
+              <w:right w:val="single" w:color="BFBFBF" w:sz="4"/>
+            </w:tcBorders>
+            <w:shd w:fill="F7F9FC" w:val="clear"/>
+            <w:tcMar>
+              <w:top w:type="dxa" w:w="60"/>
+              <w:left w:type="dxa" w:w="100"/>
+              <w:bottom w:type="dxa" w:w="60"/>
+              <w:right w:type="dxa" w:w="100"/>
+            </w:tcMar>
+          </w:tcPr>
+          <w:p>
+            <w:pPr>
+              <w:spacing w:after="0"/>
+            </w:pPr>
+            <w:r>
+              <w:rPr>
+                <w:rFonts w:ascii="Consolas" w:cs="Consolas" w:eastAsia="Consolas" w:hAnsi="Consolas"/>
+                <w:sz w:val="20"/>
+                <w:szCs w:val="20"/>
+                <w:shd w:fill="F2F2F2" w:val="clear"/>
+              </w:rPr>
+              <w:t xml:space="preserve">LOPANDE_TAK</w:t>
+            </w:r>
+          </w:p>
+        </w:tc>
+        <w:tc>
+          <w:tcPr>
+            <w:tcW w:type="dxa" w:w="5000"/>
+            <w:tcBorders>
+              <w:top w:val="single" w:color="BFBFBF" w:sz="4"/>
+              <w:left w:val="single" w:color="BFBFBF" w:sz="4"/>
+              <w:bottom w:val="single" w:color="BFBFBF" w:sz="4"/>
+              <w:right w:val="single" w:color="BFBFBF" w:sz="4"/>
+            </w:tcBorders>
+            <w:shd w:fill="F7F9FC" w:val="clear"/>
+            <w:tcMar>
+              <w:top w:type="dxa" w:w="60"/>
+              <w:left w:type="dxa" w:w="100"/>
+              <w:bottom w:type="dxa" w:w="60"/>
+              <w:right w:type="dxa" w:w="100"/>
+            </w:tcMar>
+          </w:tcPr>
+          <w:p>
+            <w:pPr>
+              <w:spacing w:after="0"/>
+            </w:pPr>
+            <w:r>
+              <w:t xml:space="preserve">Högsta faktor en löpande skada kan få. </w:t>
+            </w:r>
+            <w:r>
+              <w:rPr>
+                <w:rFonts w:ascii="Consolas" w:cs="Consolas" w:eastAsia="Consolas" w:hAnsi="Consolas"/>
+                <w:sz w:val="20"/>
+                <w:szCs w:val="20"/>
+                <w:shd w:fill="F2F2F2" w:val="clear"/>
+              </w:rPr>
+              <w:t xml:space="preserve">None</w:t>
+            </w:r>
+            <w:r>
+              <w:t xml:space="preserve"> = inget tak.</w:t>
+            </w:r>
+          </w:p>
+        </w:tc>
+        <w:tc>
+          <w:tcPr>
+            <w:tcW w:type="dxa" w:w="1760"/>
+            <w:tcBorders>
+              <w:top w:val="single" w:color="BFBFBF" w:sz="4"/>
+              <w:left w:val="single" w:color="BFBFBF" w:sz="4"/>
+              <w:bottom w:val="single" w:color="BFBFBF" w:sz="4"/>
+              <w:right w:val="single" w:color="BFBFBF" w:sz="4"/>
+            </w:tcBorders>
+            <w:shd w:fill="F7F9FC" w:val="clear"/>
+            <w:tcMar>
+              <w:top w:type="dxa" w:w="60"/>
+              <w:left w:type="dxa" w:w="100"/>
+              <w:bottom w:type="dxa" w:w="60"/>
+              <w:right w:type="dxa" w:w="100"/>
+            </w:tcMar>
+          </w:tcPr>
+          <w:p>
+            <w:pPr>
+              <w:spacing w:after="0"/>
+            </w:pPr>
+            <w:r>
+              <w:t xml:space="preserve">5</w:t>
             </w:r>
           </w:p>
         </w:tc>

</xml_diff>

<commit_message>
Grad 4 ger klass A bara för rörbrott och deformation (GRAD4_KODER_A)
Ny KONFIG-parameter GRAD4_KODER_A = {"RBR", "DEF"}: bara dessa koder
ger klass A på en enda grad 4-observation. Grad 4 på ytskada, fogfel
m.fl. ger poäng som förut och klass B via grad 3-regeln, men inte
automatiskt A. None återställer tidigare beteende.

DUF 701: 62/36/19/62/6 → 58/40/19/62/6. De fyra sträckor som var A
enbart via en YTS4/FRF4 (nr 41, 44, 118, 123) blir B. Regeln visas i
Excel-fliken Sammanfattning; metodbeskrivning, handledningens
KONFIG-tabell och facit i CLAUDE.md uppdaterade.

Co-Authored-By: Claude Fable 5.1 <noreply@anthropic.com>
Claude-Session: https://claude.ai/code/session_011fdqX3JEZje1LF9LqpaqR8
</commit_message>
<xml_diff>
--- a/Anvandarhandledning tv3_analys.docx
+++ b/Anvandarhandledning tv3_analys.docx
@@ -3510,7 +3510,7 @@
                 <w:szCs w:val="20"/>
                 <w:shd w:fill="F2F2F2" w:val="clear"/>
               </w:rPr>
-              <w:t xml:space="preserve">TROSKEL_A</w:t>
+              <w:t xml:space="preserve">GRAD4_KODER_A</w:t>
             </w:r>
           </w:p>
         </w:tc>
@@ -3536,7 +3536,19 @@
               <w:spacing w:after="0"/>
             </w:pPr>
             <w:r>
-              <w:t xml:space="preserve">Konstruktionsindex (p/100 m) som ger klass A.</w:t>
+              <w:t xml:space="preserve">Skadekoder där en enda grad 4-observation räcker för klass A. </w:t>
+            </w:r>
+            <w:r>
+              <w:rPr>
+                <w:rFonts w:ascii="Consolas" w:cs="Consolas" w:eastAsia="Consolas" w:hAnsi="Consolas"/>
+                <w:sz w:val="20"/>
+                <w:szCs w:val="20"/>
+                <w:shd w:fill="F2F2F2" w:val="clear"/>
+              </w:rPr>
+              <w:t xml:space="preserve">None</w:t>
+            </w:r>
+            <w:r>
+              <w:t xml:space="preserve"> = alla konstruktionskoder.</w:t>
             </w:r>
           </w:p>
         </w:tc>
@@ -3562,7 +3574,7 @@
               <w:spacing w:after="0"/>
             </w:pPr>
             <w:r>
-              <w:t xml:space="preserve">80</w:t>
+              <w:t xml:space="preserve">RBR, DEF</w:t>
             </w:r>
           </w:p>
         </w:tc>
@@ -3595,7 +3607,7 @@
                 <w:szCs w:val="20"/>
                 <w:shd w:fill="F2F2F2" w:val="clear"/>
               </w:rPr>
-              <w:t xml:space="preserve">TROSKEL_B</w:t>
+              <w:t xml:space="preserve">TROSKEL_A</w:t>
             </w:r>
           </w:p>
         </w:tc>
@@ -3620,7 +3632,7 @@
               <w:spacing w:after="0"/>
             </w:pPr>
             <w:r>
-              <w:t xml:space="preserve">Konstruktionsindex (p/100 m) som ger klass B.</w:t>
+              <w:t xml:space="preserve">Konstruktionsindex (p/100 m) som ger klass A.</w:t>
             </w:r>
           </w:p>
         </w:tc>
@@ -3645,7 +3657,7 @@
               <w:spacing w:after="0"/>
             </w:pPr>
             <w:r>
-              <w:t xml:space="preserve">25</w:t>
+              <w:t xml:space="preserve">80</w:t>
             </w:r>
           </w:p>
         </w:tc>
@@ -3679,7 +3691,7 @@
                 <w:szCs w:val="20"/>
                 <w:shd w:fill="F2F2F2" w:val="clear"/>
               </w:rPr>
-              <w:t xml:space="preserve">KODER</w:t>
+              <w:t xml:space="preserve">TROSKEL_B</w:t>
             </w:r>
           </w:p>
         </w:tc>
@@ -3705,7 +3717,7 @@
               <w:spacing w:after="0"/>
             </w:pPr>
             <w:r>
-              <w:t xml:space="preserve">Skadekoder med klartext och typ (K = konstruktion, D = drift, I = information).</w:t>
+              <w:t xml:space="preserve">Konstruktionsindex (p/100 m) som ger klass B.</w:t>
             </w:r>
           </w:p>
         </w:tc>
@@ -3731,7 +3743,7 @@
               <w:spacing w:after="0"/>
             </w:pPr>
             <w:r>
-              <w:t xml:space="preserve">P93</w:t>
+              <w:t xml:space="preserve">25</w:t>
             </w:r>
           </w:p>
         </w:tc>
@@ -3764,6 +3776,90 @@
                 <w:szCs w:val="20"/>
                 <w:shd w:fill="F2F2F2" w:val="clear"/>
               </w:rPr>
+              <w:t xml:space="preserve">KODER</w:t>
+            </w:r>
+          </w:p>
+        </w:tc>
+        <w:tc>
+          <w:tcPr>
+            <w:tcW w:type="dxa" w:w="5000"/>
+            <w:tcBorders>
+              <w:top w:val="single" w:color="BFBFBF" w:sz="4"/>
+              <w:left w:val="single" w:color="BFBFBF" w:sz="4"/>
+              <w:bottom w:val="single" w:color="BFBFBF" w:sz="4"/>
+              <w:right w:val="single" w:color="BFBFBF" w:sz="4"/>
+            </w:tcBorders>
+            <w:tcMar>
+              <w:top w:type="dxa" w:w="60"/>
+              <w:left w:type="dxa" w:w="100"/>
+              <w:bottom w:type="dxa" w:w="60"/>
+              <w:right w:type="dxa" w:w="100"/>
+            </w:tcMar>
+          </w:tcPr>
+          <w:p>
+            <w:pPr>
+              <w:spacing w:after="0"/>
+            </w:pPr>
+            <w:r>
+              <w:t xml:space="preserve">Skadekoder med klartext och typ (K = konstruktion, D = drift, I = information).</w:t>
+            </w:r>
+          </w:p>
+        </w:tc>
+        <w:tc>
+          <w:tcPr>
+            <w:tcW w:type="dxa" w:w="1760"/>
+            <w:tcBorders>
+              <w:top w:val="single" w:color="BFBFBF" w:sz="4"/>
+              <w:left w:val="single" w:color="BFBFBF" w:sz="4"/>
+              <w:bottom w:val="single" w:color="BFBFBF" w:sz="4"/>
+              <w:right w:val="single" w:color="BFBFBF" w:sz="4"/>
+            </w:tcBorders>
+            <w:tcMar>
+              <w:top w:type="dxa" w:w="60"/>
+              <w:left w:type="dxa" w:w="100"/>
+              <w:bottom w:type="dxa" w:w="60"/>
+              <w:right w:type="dxa" w:w="100"/>
+            </w:tcMar>
+          </w:tcPr>
+          <w:p>
+            <w:pPr>
+              <w:spacing w:after="0"/>
+            </w:pPr>
+            <w:r>
+              <w:t xml:space="preserve">P93</w:t>
+            </w:r>
+          </w:p>
+        </w:tc>
+      </w:tr>
+      <w:tr>
+        <w:tc>
+          <w:tcPr>
+            <w:tcW w:type="dxa" w:w="2600"/>
+            <w:tcBorders>
+              <w:top w:val="single" w:color="BFBFBF" w:sz="4"/>
+              <w:left w:val="single" w:color="BFBFBF" w:sz="4"/>
+              <w:bottom w:val="single" w:color="BFBFBF" w:sz="4"/>
+              <w:right w:val="single" w:color="BFBFBF" w:sz="4"/>
+            </w:tcBorders>
+            <w:shd w:fill="F7F9FC" w:val="clear"/>
+            <w:tcMar>
+              <w:top w:type="dxa" w:w="60"/>
+              <w:left w:type="dxa" w:w="100"/>
+              <w:bottom w:type="dxa" w:w="60"/>
+              <w:right w:type="dxa" w:w="100"/>
+            </w:tcMar>
+          </w:tcPr>
+          <w:p>
+            <w:pPr>
+              <w:spacing w:after="0"/>
+            </w:pPr>
+            <w:r>
+              <w:rPr>
+                <w:rFonts w:ascii="Consolas" w:cs="Consolas" w:eastAsia="Consolas" w:hAnsi="Consolas"/>
+                <w:sz w:val="20"/>
+                <w:szCs w:val="20"/>
+                <w:shd w:fill="F2F2F2" w:val="clear"/>
+              </w:rPr>
               <w:t xml:space="preserve">ATTRIBUT</w:t>
             </w:r>
             <w:r>
@@ -3789,6 +3885,7 @@
               <w:bottom w:val="single" w:color="BFBFBF" w:sz="4"/>
               <w:right w:val="single" w:color="BFBFBF" w:sz="4"/>
             </w:tcBorders>
+            <w:shd w:fill="F7F9FC" w:val="clear"/>
             <w:tcMar>
               <w:top w:type="dxa" w:w="60"/>
               <w:left w:type="dxa" w:w="100"/>
@@ -3814,6 +3911,7 @@
               <w:bottom w:val="single" w:color="BFBFBF" w:sz="4"/>
               <w:right w:val="single" w:color="BFBFBF" w:sz="4"/>
             </w:tcBorders>
+            <w:shd w:fill="F7F9FC" w:val="clear"/>
             <w:tcMar>
               <w:top w:type="dxa" w:w="60"/>
               <w:left w:type="dxa" w:w="100"/>

</xml_diff>

<commit_message>
Rangordna efter konstruktionsindex, inte totalindex; KODFAKTOR i KONFIG
Driftskador (rötter, inläckage, sediment, hinder) påverkar nu varken klass
eller rangordning inom klass. Konstruktionsindex visas först i Excel, PDF
och topplistan; drift- och totalindex är kvar som information.

KODFAKTOR (standard None) gör det möjligt att vikta konstruktionskoder
inbördes (t.ex. YTS 0,7). Simulering på DUF 701 dokumenterad i CLAUDE.md.

Co-Authored-By: Claude Fable 5.1 <noreply@anthropic.com>
Claude-Session: https://claude.ai/code/session_011fdqX3JEZje1LF9LqpaqR8
</commit_message>
<xml_diff>
--- a/Anvandarhandledning tv3_analys.docx
+++ b/Anvandarhandledning tv3_analys.docx
@@ -3174,7 +3174,7 @@
               <w:spacing w:after="0"/>
             </w:pPr>
             <w:r>
-              <w:t xml:space="preserve">Faktor för driftskador (rötter, inläckage, sediment m.m.).</w:t>
+              <w:t xml:space="preserve">Faktor för driftskador (rötter, inläckage, sediment m.m.) i driftindex.</w:t>
             </w:r>
           </w:p>
         </w:tc>
@@ -3233,7 +3233,7 @@
                 <w:szCs w:val="20"/>
                 <w:shd w:fill="F2F2F2" w:val="clear"/>
               </w:rPr>
-              <w:t xml:space="preserve">LOPANDE_ENHET_M</w:t>
+              <w:t xml:space="preserve">KODFAKTOR</w:t>
             </w:r>
           </w:p>
         </w:tc>
@@ -3258,7 +3258,7 @@
               <w:spacing w:after="0"/>
             </w:pPr>
             <w:r>
-              <w:t xml:space="preserve">Längd (m) per poängenhet för löpande skador: poäng × längd / enhet, minst 1. </w:t>
+              <w:t xml:space="preserve">Viktning av konstruktionskoder inbördes, t.ex. {"YTS": 0.7}. </w:t>
             </w:r>
             <w:r>
               <w:rPr>
@@ -3270,7 +3270,7 @@
               <w:t xml:space="preserve">None</w:t>
             </w:r>
             <w:r>
-              <w:t xml:space="preserve"> = räkna en gång oavsett längd.</w:t>
+              <w:t xml:space="preserve"> = bara graden avgör.</w:t>
             </w:r>
           </w:p>
         </w:tc>
@@ -3295,7 +3295,7 @@
               <w:spacing w:after="0"/>
             </w:pPr>
             <w:r>
-              <w:t xml:space="preserve">10</w:t>
+              <w:t xml:space="preserve">None</w:t>
             </w:r>
           </w:p>
         </w:tc>
@@ -3329,7 +3329,7 @@
                 <w:szCs w:val="20"/>
                 <w:shd w:fill="F2F2F2" w:val="clear"/>
               </w:rPr>
-              <w:t xml:space="preserve">LOPANDE_TAK</w:t>
+              <w:t xml:space="preserve">LOPANDE_ENHET_M</w:t>
             </w:r>
           </w:p>
         </w:tc>
@@ -3355,7 +3355,7 @@
               <w:spacing w:after="0"/>
             </w:pPr>
             <w:r>
-              <w:t xml:space="preserve">Högsta faktor en löpande skada kan få. </w:t>
+              <w:t xml:space="preserve">Längd (m) per poängenhet för löpande skador: poäng × längd / enhet, minst 1. </w:t>
             </w:r>
             <w:r>
               <w:rPr>
@@ -3367,7 +3367,7 @@
               <w:t xml:space="preserve">None</w:t>
             </w:r>
             <w:r>
-              <w:t xml:space="preserve"> = inget tak.</w:t>
+              <w:t xml:space="preserve"> = räkna en gång oavsett längd.</w:t>
             </w:r>
           </w:p>
         </w:tc>
@@ -3393,7 +3393,7 @@
               <w:spacing w:after="0"/>
             </w:pPr>
             <w:r>
-              <w:t xml:space="preserve">5</w:t>
+              <w:t xml:space="preserve">10</w:t>
             </w:r>
           </w:p>
         </w:tc>
@@ -3426,7 +3426,7 @@
                 <w:szCs w:val="20"/>
                 <w:shd w:fill="F2F2F2" w:val="clear"/>
               </w:rPr>
-              <w:t xml:space="preserve">MINLANGD</w:t>
+              <w:t xml:space="preserve">LOPANDE_TAK</w:t>
             </w:r>
           </w:p>
         </w:tc>
@@ -3451,7 +3451,19 @@
               <w:spacing w:after="0"/>
             </w:pPr>
             <w:r>
-              <w:t xml:space="preserve">Minsta längd (m) som används som nämnare vid normering per 100 m.</w:t>
+              <w:t xml:space="preserve">Högsta faktor en löpande skada kan få. </w:t>
+            </w:r>
+            <w:r>
+              <w:rPr>
+                <w:rFonts w:ascii="Consolas" w:cs="Consolas" w:eastAsia="Consolas" w:hAnsi="Consolas"/>
+                <w:sz w:val="20"/>
+                <w:szCs w:val="20"/>
+                <w:shd w:fill="F2F2F2" w:val="clear"/>
+              </w:rPr>
+              <w:t xml:space="preserve">None</w:t>
+            </w:r>
+            <w:r>
+              <w:t xml:space="preserve"> = inget tak.</w:t>
             </w:r>
           </w:p>
         </w:tc>
@@ -3476,7 +3488,7 @@
               <w:spacing w:after="0"/>
             </w:pPr>
             <w:r>
-              <w:t xml:space="preserve">20</w:t>
+              <w:t xml:space="preserve">5</w:t>
             </w:r>
           </w:p>
         </w:tc>
@@ -3510,7 +3522,7 @@
                 <w:szCs w:val="20"/>
                 <w:shd w:fill="F2F2F2" w:val="clear"/>
               </w:rPr>
-              <w:t xml:space="preserve">GRAD4_KODER_A</w:t>
+              <w:t xml:space="preserve">MINLANGD</w:t>
             </w:r>
           </w:p>
         </w:tc>
@@ -3536,19 +3548,7 @@
               <w:spacing w:after="0"/>
             </w:pPr>
             <w:r>
-              <w:t xml:space="preserve">Skadekoder där en enda grad 4-observation räcker för klass A. </w:t>
-            </w:r>
-            <w:r>
-              <w:rPr>
-                <w:rFonts w:ascii="Consolas" w:cs="Consolas" w:eastAsia="Consolas" w:hAnsi="Consolas"/>
-                <w:sz w:val="20"/>
-                <w:szCs w:val="20"/>
-                <w:shd w:fill="F2F2F2" w:val="clear"/>
-              </w:rPr>
-              <w:t xml:space="preserve">None</w:t>
-            </w:r>
-            <w:r>
-              <w:t xml:space="preserve"> = alla konstruktionskoder.</w:t>
+              <w:t xml:space="preserve">Minsta längd (m) som används som nämnare vid normering per 100 m.</w:t>
             </w:r>
           </w:p>
         </w:tc>
@@ -3574,7 +3574,7 @@
               <w:spacing w:after="0"/>
             </w:pPr>
             <w:r>
-              <w:t xml:space="preserve">RBR, DEF</w:t>
+              <w:t xml:space="preserve">20</w:t>
             </w:r>
           </w:p>
         </w:tc>
@@ -3607,7 +3607,7 @@
                 <w:szCs w:val="20"/>
                 <w:shd w:fill="F2F2F2" w:val="clear"/>
               </w:rPr>
-              <w:t xml:space="preserve">TROSKEL_A</w:t>
+              <w:t xml:space="preserve">GRAD4_KODER_A</w:t>
             </w:r>
           </w:p>
         </w:tc>
@@ -3632,7 +3632,19 @@
               <w:spacing w:after="0"/>
             </w:pPr>
             <w:r>
-              <w:t xml:space="preserve">Konstruktionsindex (p/100 m) som ger klass A.</w:t>
+              <w:t xml:space="preserve">Skadekoder där en enda grad 4-observation räcker för klass A. </w:t>
+            </w:r>
+            <w:r>
+              <w:rPr>
+                <w:rFonts w:ascii="Consolas" w:cs="Consolas" w:eastAsia="Consolas" w:hAnsi="Consolas"/>
+                <w:sz w:val="20"/>
+                <w:szCs w:val="20"/>
+                <w:shd w:fill="F2F2F2" w:val="clear"/>
+              </w:rPr>
+              <w:t xml:space="preserve">None</w:t>
+            </w:r>
+            <w:r>
+              <w:t xml:space="preserve"> = alla konstruktionskoder.</w:t>
             </w:r>
           </w:p>
         </w:tc>
@@ -3657,7 +3669,7 @@
               <w:spacing w:after="0"/>
             </w:pPr>
             <w:r>
-              <w:t xml:space="preserve">80</w:t>
+              <w:t xml:space="preserve">RBR, DEF</w:t>
             </w:r>
           </w:p>
         </w:tc>
@@ -3691,7 +3703,7 @@
                 <w:szCs w:val="20"/>
                 <w:shd w:fill="F2F2F2" w:val="clear"/>
               </w:rPr>
-              <w:t xml:space="preserve">TROSKEL_B</w:t>
+              <w:t xml:space="preserve">TROSKEL_A</w:t>
             </w:r>
           </w:p>
         </w:tc>
@@ -3717,7 +3729,7 @@
               <w:spacing w:after="0"/>
             </w:pPr>
             <w:r>
-              <w:t xml:space="preserve">Konstruktionsindex (p/100 m) som ger klass B.</w:t>
+              <w:t xml:space="preserve">Konstruktionsindex (p/100 m) som ger klass A.</w:t>
             </w:r>
           </w:p>
         </w:tc>
@@ -3743,7 +3755,7 @@
               <w:spacing w:after="0"/>
             </w:pPr>
             <w:r>
-              <w:t xml:space="preserve">25</w:t>
+              <w:t xml:space="preserve">80</w:t>
             </w:r>
           </w:p>
         </w:tc>
@@ -3776,7 +3788,7 @@
                 <w:szCs w:val="20"/>
                 <w:shd w:fill="F2F2F2" w:val="clear"/>
               </w:rPr>
-              <w:t xml:space="preserve">KODER</w:t>
+              <w:t xml:space="preserve">TROSKEL_B</w:t>
             </w:r>
           </w:p>
         </w:tc>
@@ -3801,7 +3813,7 @@
               <w:spacing w:after="0"/>
             </w:pPr>
             <w:r>
-              <w:t xml:space="preserve">Skadekoder med klartext och typ (K = konstruktion, D = drift, I = information).</w:t>
+              <w:t xml:space="preserve">Konstruktionsindex (p/100 m) som ger klass B.</w:t>
             </w:r>
           </w:p>
         </w:tc>
@@ -3826,7 +3838,7 @@
               <w:spacing w:after="0"/>
             </w:pPr>
             <w:r>
-              <w:t xml:space="preserve">P93</w:t>
+              <w:t xml:space="preserve">25</w:t>
             </w:r>
           </w:p>
         </w:tc>
@@ -3860,6 +3872,91 @@
                 <w:szCs w:val="20"/>
                 <w:shd w:fill="F2F2F2" w:val="clear"/>
               </w:rPr>
+              <w:t xml:space="preserve">KODER</w:t>
+            </w:r>
+          </w:p>
+        </w:tc>
+        <w:tc>
+          <w:tcPr>
+            <w:tcW w:type="dxa" w:w="5000"/>
+            <w:tcBorders>
+              <w:top w:val="single" w:color="BFBFBF" w:sz="4"/>
+              <w:left w:val="single" w:color="BFBFBF" w:sz="4"/>
+              <w:bottom w:val="single" w:color="BFBFBF" w:sz="4"/>
+              <w:right w:val="single" w:color="BFBFBF" w:sz="4"/>
+            </w:tcBorders>
+            <w:shd w:fill="F7F9FC" w:val="clear"/>
+            <w:tcMar>
+              <w:top w:type="dxa" w:w="60"/>
+              <w:left w:type="dxa" w:w="100"/>
+              <w:bottom w:type="dxa" w:w="60"/>
+              <w:right w:type="dxa" w:w="100"/>
+            </w:tcMar>
+          </w:tcPr>
+          <w:p>
+            <w:pPr>
+              <w:spacing w:after="0"/>
+            </w:pPr>
+            <w:r>
+              <w:t xml:space="preserve">Skadekoder med klartext och typ (K = konstruktion, D = drift, I = information).</w:t>
+            </w:r>
+          </w:p>
+        </w:tc>
+        <w:tc>
+          <w:tcPr>
+            <w:tcW w:type="dxa" w:w="1760"/>
+            <w:tcBorders>
+              <w:top w:val="single" w:color="BFBFBF" w:sz="4"/>
+              <w:left w:val="single" w:color="BFBFBF" w:sz="4"/>
+              <w:bottom w:val="single" w:color="BFBFBF" w:sz="4"/>
+              <w:right w:val="single" w:color="BFBFBF" w:sz="4"/>
+            </w:tcBorders>
+            <w:shd w:fill="F7F9FC" w:val="clear"/>
+            <w:tcMar>
+              <w:top w:type="dxa" w:w="60"/>
+              <w:left w:type="dxa" w:w="100"/>
+              <w:bottom w:type="dxa" w:w="60"/>
+              <w:right w:type="dxa" w:w="100"/>
+            </w:tcMar>
+          </w:tcPr>
+          <w:p>
+            <w:pPr>
+              <w:spacing w:after="0"/>
+            </w:pPr>
+            <w:r>
+              <w:t xml:space="preserve">P93</w:t>
+            </w:r>
+          </w:p>
+        </w:tc>
+      </w:tr>
+      <w:tr>
+        <w:tc>
+          <w:tcPr>
+            <w:tcW w:type="dxa" w:w="2600"/>
+            <w:tcBorders>
+              <w:top w:val="single" w:color="BFBFBF" w:sz="4"/>
+              <w:left w:val="single" w:color="BFBFBF" w:sz="4"/>
+              <w:bottom w:val="single" w:color="BFBFBF" w:sz="4"/>
+              <w:right w:val="single" w:color="BFBFBF" w:sz="4"/>
+            </w:tcBorders>
+            <w:tcMar>
+              <w:top w:type="dxa" w:w="60"/>
+              <w:left w:type="dxa" w:w="100"/>
+              <w:bottom w:type="dxa" w:w="60"/>
+              <w:right w:type="dxa" w:w="100"/>
+            </w:tcMar>
+          </w:tcPr>
+          <w:p>
+            <w:pPr>
+              <w:spacing w:after="0"/>
+            </w:pPr>
+            <w:r>
+              <w:rPr>
+                <w:rFonts w:ascii="Consolas" w:cs="Consolas" w:eastAsia="Consolas" w:hAnsi="Consolas"/>
+                <w:sz w:val="20"/>
+                <w:szCs w:val="20"/>
+                <w:shd w:fill="F2F2F2" w:val="clear"/>
+              </w:rPr>
               <w:t xml:space="preserve">ATTRIBUT</w:t>
             </w:r>
             <w:r>
@@ -3885,7 +3982,6 @@
               <w:bottom w:val="single" w:color="BFBFBF" w:sz="4"/>
               <w:right w:val="single" w:color="BFBFBF" w:sz="4"/>
             </w:tcBorders>
-            <w:shd w:fill="F7F9FC" w:val="clear"/>
             <w:tcMar>
               <w:top w:type="dxa" w:w="60"/>
               <w:left w:type="dxa" w:w="100"/>
@@ -3911,7 +4007,6 @@
               <w:bottom w:val="single" w:color="BFBFBF" w:sz="4"/>
               <w:right w:val="single" w:color="BFBFBF" w:sz="4"/>
             </w:tcBorders>
-            <w:shd w:fill="F7F9FC" w:val="clear"/>
             <w:tcMar>
               <w:top w:type="dxa" w:w="60"/>
               <w:left w:type="dxa" w:w="100"/>

</xml_diff>

<commit_message>
Kodvikter som standard (YTS 0,7, FOG/FRF 0,6, DEA 0,3) och kolumner för manuell bedömning
KODFAKTOR i KONFIG är nu satt: sprickor, rörbrott och deformation väger
fullt, ytskada 0,7, fogfel 0,6, defekt anslutning 0,3. Syftet är att hitta
ledningar som bör strumpinfodras medan det fortfarande går.

DUF 701: klasser A/B/C/D/E 41/54/22/62/6 (tidigare 58/40/19/62/6), rang 1
637 p/100 m. Excel-fliken Prioritering får tomma kolumner Manuell bedömning
och Kommentar för den egna genomgången. Dokument och CLAUDE.md uppdaterade.

Co-Authored-By: Claude Fable 5.1 <noreply@anthropic.com>
Claude-Session: https://claude.ai/code/session_011fdqX3JEZje1LF9LqpaqR8
</commit_message>
<xml_diff>
--- a/Anvandarhandledning tv3_analys.docx
+++ b/Anvandarhandledning tv3_analys.docx
@@ -2659,7 +2659,7 @@
               <w:spacing w:after="0"/>
             </w:pPr>
             <w:r>
-              <w:t xml:space="preserve">En rad per sträcka, rankad efter prioritetsklass och index. Använd autofiltret för att filtrera på klass, material, ledningstyp, område eller fil. Kolumnen Skador (kod+grad) visar t.ex. 9×YTS4, 1×SPR3. Kolumnerna Avbruten inspektion, Inspekterad flera ggr och Relinad ger extra kontext. Ur inklinometerprofilen beräknas Svackdjup i cm (största stående vattendjup i en svacka), Svackdjup/diameter, Svacklängd, Bakfall längd (meter med lutning mot flödesriktningen) och Lutning; Profil osäker markerar sträckor där inklinometerns fall avviker kraftigt från brunnshöjderna och profilen därför inte bör användas. Antal anslutningar räknar registrerade anslutningar (AS/AG) på sträckan. Kolumnen Rapport öppnar sträckans PDF-rapport (länken är relativ, så Excel-filen och mappen rapporter måste ligga kvar bredvid varandra). Kolumnen Videofil är en klickbar länk som öppnar filmen (se avsnitt 7 om länken inte fungerar).</w:t>
+              <w:t xml:space="preserve">En rad per sträcka, rankad efter prioritetsklass och index. Använd autofiltret för att filtrera på klass, material, ledningstyp, område eller fil. Kolumnen Skador (kod+grad) visar t.ex. 9×YTS4, 1×SPR3. Kolumnerna Avbruten inspektion, Inspekterad flera ggr och Relinad ger extra kontext. Ur inklinometerprofilen beräknas Svackdjup i cm (största stående vattendjup i en svacka), Svackdjup/diameter, Svacklängd, Bakfall längd (meter med lutning mot flödesriktningen) och Lutning; Profil osäker markerar sträckor där inklinometerns fall avviker kraftigt från brunnshöjderna och profilen därför inte bör användas. Antal anslutningar räknar registrerade anslutningar (AS/AG) på sträckan. Kolumnerna Manuell bedömning och Kommentar är tomma och avsedda för den egna genomgången av sträckorna. Kolumnen Rapport öppnar sträckans PDF-rapport (länken är relativ, så Excel-filen och mappen rapporter måste ligga kvar bredvid varandra). Kolumnen Videofil är en klickbar länk som öppnar filmen (se avsnitt 7 om länken inte fungerar).</w:t>
             </w:r>
           </w:p>
         </w:tc>
@@ -3258,7 +3258,7 @@
               <w:spacing w:after="0"/>
             </w:pPr>
             <w:r>
-              <w:t xml:space="preserve">Viktning av konstruktionskoder inbördes, t.ex. {"YTS": 0.7}. </w:t>
+              <w:t xml:space="preserve">Viktning av konstruktionskoder inbördes. </w:t>
             </w:r>
             <w:r>
               <w:rPr>
@@ -3295,7 +3295,7 @@
               <w:spacing w:after="0"/>
             </w:pPr>
             <w:r>
-              <w:t xml:space="preserve">None</w:t>
+              <w:t xml:space="preserve">YTS 0,7; FOG, FRF 0,6; DEA 0,3; övriga 1,0</w:t>
             </w:r>
           </w:p>
         </w:tc>

</xml_diff>

<commit_message>
Cirkulära sprickor viktas 0,7 (ATTRIBUTFAKTOR i KONFIG)
Ny parameter ATTRIBUTFAKTOR viktar per (kod, attribut) utöver KODFAKTOR.
Standard: SPR CIRK 0,7 – sättning vid fog, mindre allvarligt för
bärigheten än komplexa och längsgående sprickor. Sammanfattningen får
raden Attributvikter. DUF 701: 38/57/22/62/6 (tidigare 41/54/22/62/6),
tre sträckor A→B, rang 1 628,6 p/100 m.

Co-Authored-By: Claude Fable 5.1 <noreply@anthropic.com>
Claude-Session: https://claude.ai/code/session_011fdqX3JEZje1LF9LqpaqR8
</commit_message>
<xml_diff>
--- a/Anvandarhandledning tv3_analys.docx
+++ b/Anvandarhandledning tv3_analys.docx
@@ -3329,7 +3329,7 @@
                 <w:szCs w:val="20"/>
                 <w:shd w:fill="F2F2F2" w:val="clear"/>
               </w:rPr>
-              <w:t xml:space="preserve">LOPANDE_ENHET_M</w:t>
+              <w:t xml:space="preserve">ATTRIBUTFAKTOR</w:t>
             </w:r>
           </w:p>
         </w:tc>
@@ -3355,7 +3355,7 @@
               <w:spacing w:after="0"/>
             </w:pPr>
             <w:r>
-              <w:t xml:space="preserve">Längd (m) per poängenhet för löpande skador: poäng × längd / enhet, minst 1. </w:t>
+              <w:t xml:space="preserve">Viktning per attribut, utöver kodvikten. </w:t>
             </w:r>
             <w:r>
               <w:rPr>
@@ -3367,7 +3367,7 @@
               <w:t xml:space="preserve">None</w:t>
             </w:r>
             <w:r>
-              <w:t xml:space="preserve"> = räkna en gång oavsett längd.</w:t>
+              <w:t xml:space="preserve"> = ingen attributviktning.</w:t>
             </w:r>
           </w:p>
         </w:tc>
@@ -3393,7 +3393,7 @@
               <w:spacing w:after="0"/>
             </w:pPr>
             <w:r>
-              <w:t xml:space="preserve">10</w:t>
+              <w:t xml:space="preserve">SPR CIRK 0,7</w:t>
             </w:r>
           </w:p>
         </w:tc>
@@ -3426,7 +3426,7 @@
                 <w:szCs w:val="20"/>
                 <w:shd w:fill="F2F2F2" w:val="clear"/>
               </w:rPr>
-              <w:t xml:space="preserve">LOPANDE_TAK</w:t>
+              <w:t xml:space="preserve">LOPANDE_ENHET_M</w:t>
             </w:r>
           </w:p>
         </w:tc>
@@ -3451,7 +3451,7 @@
               <w:spacing w:after="0"/>
             </w:pPr>
             <w:r>
-              <w:t xml:space="preserve">Högsta faktor en löpande skada kan få. </w:t>
+              <w:t xml:space="preserve">Längd (m) per poängenhet för löpande skador: poäng × längd / enhet, minst 1. </w:t>
             </w:r>
             <w:r>
               <w:rPr>
@@ -3463,7 +3463,7 @@
               <w:t xml:space="preserve">None</w:t>
             </w:r>
             <w:r>
-              <w:t xml:space="preserve"> = inget tak.</w:t>
+              <w:t xml:space="preserve"> = räkna en gång oavsett längd.</w:t>
             </w:r>
           </w:p>
         </w:tc>
@@ -3488,7 +3488,7 @@
               <w:spacing w:after="0"/>
             </w:pPr>
             <w:r>
-              <w:t xml:space="preserve">5</w:t>
+              <w:t xml:space="preserve">10</w:t>
             </w:r>
           </w:p>
         </w:tc>
@@ -3522,7 +3522,7 @@
                 <w:szCs w:val="20"/>
                 <w:shd w:fill="F2F2F2" w:val="clear"/>
               </w:rPr>
-              <w:t xml:space="preserve">MINLANGD</w:t>
+              <w:t xml:space="preserve">LOPANDE_TAK</w:t>
             </w:r>
           </w:p>
         </w:tc>
@@ -3548,7 +3548,19 @@
               <w:spacing w:after="0"/>
             </w:pPr>
             <w:r>
-              <w:t xml:space="preserve">Minsta längd (m) som används som nämnare vid normering per 100 m.</w:t>
+              <w:t xml:space="preserve">Högsta faktor en löpande skada kan få. </w:t>
+            </w:r>
+            <w:r>
+              <w:rPr>
+                <w:rFonts w:ascii="Consolas" w:cs="Consolas" w:eastAsia="Consolas" w:hAnsi="Consolas"/>
+                <w:sz w:val="20"/>
+                <w:szCs w:val="20"/>
+                <w:shd w:fill="F2F2F2" w:val="clear"/>
+              </w:rPr>
+              <w:t xml:space="preserve">None</w:t>
+            </w:r>
+            <w:r>
+              <w:t xml:space="preserve"> = inget tak.</w:t>
             </w:r>
           </w:p>
         </w:tc>
@@ -3574,7 +3586,7 @@
               <w:spacing w:after="0"/>
             </w:pPr>
             <w:r>
-              <w:t xml:space="preserve">20</w:t>
+              <w:t xml:space="preserve">5</w:t>
             </w:r>
           </w:p>
         </w:tc>
@@ -3607,7 +3619,7 @@
                 <w:szCs w:val="20"/>
                 <w:shd w:fill="F2F2F2" w:val="clear"/>
               </w:rPr>
-              <w:t xml:space="preserve">GRAD4_KODER_A</w:t>
+              <w:t xml:space="preserve">MINLANGD</w:t>
             </w:r>
           </w:p>
         </w:tc>
@@ -3632,19 +3644,7 @@
               <w:spacing w:after="0"/>
             </w:pPr>
             <w:r>
-              <w:t xml:space="preserve">Skadekoder där en enda grad 4-observation räcker för klass A. </w:t>
-            </w:r>
-            <w:r>
-              <w:rPr>
-                <w:rFonts w:ascii="Consolas" w:cs="Consolas" w:eastAsia="Consolas" w:hAnsi="Consolas"/>
-                <w:sz w:val="20"/>
-                <w:szCs w:val="20"/>
-                <w:shd w:fill="F2F2F2" w:val="clear"/>
-              </w:rPr>
-              <w:t xml:space="preserve">None</w:t>
-            </w:r>
-            <w:r>
-              <w:t xml:space="preserve"> = alla konstruktionskoder.</w:t>
+              <w:t xml:space="preserve">Minsta längd (m) som används som nämnare vid normering per 100 m.</w:t>
             </w:r>
           </w:p>
         </w:tc>
@@ -3669,7 +3669,7 @@
               <w:spacing w:after="0"/>
             </w:pPr>
             <w:r>
-              <w:t xml:space="preserve">RBR, DEF</w:t>
+              <w:t xml:space="preserve">20</w:t>
             </w:r>
           </w:p>
         </w:tc>
@@ -3703,7 +3703,7 @@
                 <w:szCs w:val="20"/>
                 <w:shd w:fill="F2F2F2" w:val="clear"/>
               </w:rPr>
-              <w:t xml:space="preserve">TROSKEL_A</w:t>
+              <w:t xml:space="preserve">GRAD4_KODER_A</w:t>
             </w:r>
           </w:p>
         </w:tc>
@@ -3729,7 +3729,19 @@
               <w:spacing w:after="0"/>
             </w:pPr>
             <w:r>
-              <w:t xml:space="preserve">Konstruktionsindex (p/100 m) som ger klass A.</w:t>
+              <w:t xml:space="preserve">Skadekoder där en enda grad 4-observation räcker för klass A. </w:t>
+            </w:r>
+            <w:r>
+              <w:rPr>
+                <w:rFonts w:ascii="Consolas" w:cs="Consolas" w:eastAsia="Consolas" w:hAnsi="Consolas"/>
+                <w:sz w:val="20"/>
+                <w:szCs w:val="20"/>
+                <w:shd w:fill="F2F2F2" w:val="clear"/>
+              </w:rPr>
+              <w:t xml:space="preserve">None</w:t>
+            </w:r>
+            <w:r>
+              <w:t xml:space="preserve"> = alla konstruktionskoder.</w:t>
             </w:r>
           </w:p>
         </w:tc>
@@ -3755,7 +3767,7 @@
               <w:spacing w:after="0"/>
             </w:pPr>
             <w:r>
-              <w:t xml:space="preserve">80</w:t>
+              <w:t xml:space="preserve">RBR, DEF</w:t>
             </w:r>
           </w:p>
         </w:tc>
@@ -3788,7 +3800,7 @@
                 <w:szCs w:val="20"/>
                 <w:shd w:fill="F2F2F2" w:val="clear"/>
               </w:rPr>
-              <w:t xml:space="preserve">TROSKEL_B</w:t>
+              <w:t xml:space="preserve">TROSKEL_A</w:t>
             </w:r>
           </w:p>
         </w:tc>
@@ -3813,7 +3825,7 @@
               <w:spacing w:after="0"/>
             </w:pPr>
             <w:r>
-              <w:t xml:space="preserve">Konstruktionsindex (p/100 m) som ger klass B.</w:t>
+              <w:t xml:space="preserve">Konstruktionsindex (p/100 m) som ger klass A.</w:t>
             </w:r>
           </w:p>
         </w:tc>
@@ -3838,7 +3850,7 @@
               <w:spacing w:after="0"/>
             </w:pPr>
             <w:r>
-              <w:t xml:space="preserve">25</w:t>
+              <w:t xml:space="preserve">80</w:t>
             </w:r>
           </w:p>
         </w:tc>
@@ -3872,7 +3884,7 @@
                 <w:szCs w:val="20"/>
                 <w:shd w:fill="F2F2F2" w:val="clear"/>
               </w:rPr>
-              <w:t xml:space="preserve">KODER</w:t>
+              <w:t xml:space="preserve">TROSKEL_B</w:t>
             </w:r>
           </w:p>
         </w:tc>
@@ -3898,7 +3910,7 @@
               <w:spacing w:after="0"/>
             </w:pPr>
             <w:r>
-              <w:t xml:space="preserve">Skadekoder med klartext och typ (K = konstruktion, D = drift, I = information).</w:t>
+              <w:t xml:space="preserve">Konstruktionsindex (p/100 m) som ger klass B.</w:t>
             </w:r>
           </w:p>
         </w:tc>
@@ -3924,7 +3936,7 @@
               <w:spacing w:after="0"/>
             </w:pPr>
             <w:r>
-              <w:t xml:space="preserve">P93</w:t>
+              <w:t xml:space="preserve">25</w:t>
             </w:r>
           </w:p>
         </w:tc>
@@ -3957,6 +3969,90 @@
                 <w:szCs w:val="20"/>
                 <w:shd w:fill="F2F2F2" w:val="clear"/>
               </w:rPr>
+              <w:t xml:space="preserve">KODER</w:t>
+            </w:r>
+          </w:p>
+        </w:tc>
+        <w:tc>
+          <w:tcPr>
+            <w:tcW w:type="dxa" w:w="5000"/>
+            <w:tcBorders>
+              <w:top w:val="single" w:color="BFBFBF" w:sz="4"/>
+              <w:left w:val="single" w:color="BFBFBF" w:sz="4"/>
+              <w:bottom w:val="single" w:color="BFBFBF" w:sz="4"/>
+              <w:right w:val="single" w:color="BFBFBF" w:sz="4"/>
+            </w:tcBorders>
+            <w:tcMar>
+              <w:top w:type="dxa" w:w="60"/>
+              <w:left w:type="dxa" w:w="100"/>
+              <w:bottom w:type="dxa" w:w="60"/>
+              <w:right w:type="dxa" w:w="100"/>
+            </w:tcMar>
+          </w:tcPr>
+          <w:p>
+            <w:pPr>
+              <w:spacing w:after="0"/>
+            </w:pPr>
+            <w:r>
+              <w:t xml:space="preserve">Skadekoder med klartext och typ (K = konstruktion, D = drift, I = information).</w:t>
+            </w:r>
+          </w:p>
+        </w:tc>
+        <w:tc>
+          <w:tcPr>
+            <w:tcW w:type="dxa" w:w="1760"/>
+            <w:tcBorders>
+              <w:top w:val="single" w:color="BFBFBF" w:sz="4"/>
+              <w:left w:val="single" w:color="BFBFBF" w:sz="4"/>
+              <w:bottom w:val="single" w:color="BFBFBF" w:sz="4"/>
+              <w:right w:val="single" w:color="BFBFBF" w:sz="4"/>
+            </w:tcBorders>
+            <w:tcMar>
+              <w:top w:type="dxa" w:w="60"/>
+              <w:left w:type="dxa" w:w="100"/>
+              <w:bottom w:type="dxa" w:w="60"/>
+              <w:right w:type="dxa" w:w="100"/>
+            </w:tcMar>
+          </w:tcPr>
+          <w:p>
+            <w:pPr>
+              <w:spacing w:after="0"/>
+            </w:pPr>
+            <w:r>
+              <w:t xml:space="preserve">P93</w:t>
+            </w:r>
+          </w:p>
+        </w:tc>
+      </w:tr>
+      <w:tr>
+        <w:tc>
+          <w:tcPr>
+            <w:tcW w:type="dxa" w:w="2600"/>
+            <w:tcBorders>
+              <w:top w:val="single" w:color="BFBFBF" w:sz="4"/>
+              <w:left w:val="single" w:color="BFBFBF" w:sz="4"/>
+              <w:bottom w:val="single" w:color="BFBFBF" w:sz="4"/>
+              <w:right w:val="single" w:color="BFBFBF" w:sz="4"/>
+            </w:tcBorders>
+            <w:shd w:fill="F7F9FC" w:val="clear"/>
+            <w:tcMar>
+              <w:top w:type="dxa" w:w="60"/>
+              <w:left w:type="dxa" w:w="100"/>
+              <w:bottom w:type="dxa" w:w="60"/>
+              <w:right w:type="dxa" w:w="100"/>
+            </w:tcMar>
+          </w:tcPr>
+          <w:p>
+            <w:pPr>
+              <w:spacing w:after="0"/>
+            </w:pPr>
+            <w:r>
+              <w:rPr>
+                <w:rFonts w:ascii="Consolas" w:cs="Consolas" w:eastAsia="Consolas" w:hAnsi="Consolas"/>
+                <w:sz w:val="20"/>
+                <w:szCs w:val="20"/>
+                <w:shd w:fill="F2F2F2" w:val="clear"/>
+              </w:rPr>
               <w:t xml:space="preserve">ATTRIBUT</w:t>
             </w:r>
             <w:r>
@@ -3982,6 +4078,7 @@
               <w:bottom w:val="single" w:color="BFBFBF" w:sz="4"/>
               <w:right w:val="single" w:color="BFBFBF" w:sz="4"/>
             </w:tcBorders>
+            <w:shd w:fill="F7F9FC" w:val="clear"/>
             <w:tcMar>
               <w:top w:type="dxa" w:w="60"/>
               <w:left w:type="dxa" w:w="100"/>
@@ -4007,6 +4104,7 @@
               <w:bottom w:val="single" w:color="BFBFBF" w:sz="4"/>
               <w:right w:val="single" w:color="BFBFBF" w:sz="4"/>
             </w:tcBorders>
+            <w:shd w:fill="F7F9FC" w:val="clear"/>
             <w:tcMar>
               <w:top w:type="dxa" w:w="60"/>
               <w:left w:type="dxa" w:w="100"/>

</xml_diff>

<commit_message>
Ytskada grad 4 väger fullt (GRADFAKTOR i KONFIG)
Ny parameter GRADFAKTOR: vikt per (kod, grad) som ersätter KODFAKTOR för
den kombinationen. Standard YTS grad 4 = 1,0, eftersom grad 4 enligt P93
betyder genomfrätt rörvägg, i praktiken ett rörbrott. Ytskada grad 1–3
väger fortfarande 0,7. DUF 701: 40/55/22/62/6 (nr 98 och 124 B→A),
rang 1 859 p/100 m.

Co-Authored-By: Claude Fable 5.1 <noreply@anthropic.com>
Claude-Session: https://claude.ai/code/session_011fdqX3JEZje1LF9LqpaqR8
</commit_message>
<xml_diff>
--- a/Anvandarhandledning tv3_analys.docx
+++ b/Anvandarhandledning tv3_analys.docx
@@ -3329,7 +3329,7 @@
                 <w:szCs w:val="20"/>
                 <w:shd w:fill="F2F2F2" w:val="clear"/>
               </w:rPr>
-              <w:t xml:space="preserve">ATTRIBUTFAKTOR</w:t>
+              <w:t xml:space="preserve">GRADFAKTOR</w:t>
             </w:r>
           </w:p>
         </w:tc>
@@ -3355,19 +3355,7 @@
               <w:spacing w:after="0"/>
             </w:pPr>
             <w:r>
-              <w:t xml:space="preserve">Viktning per attribut, utöver kodvikten. </w:t>
-            </w:r>
-            <w:r>
-              <w:rPr>
-                <w:rFonts w:ascii="Consolas" w:cs="Consolas" w:eastAsia="Consolas" w:hAnsi="Consolas"/>
-                <w:sz w:val="20"/>
-                <w:szCs w:val="20"/>
-                <w:shd w:fill="F2F2F2" w:val="clear"/>
-              </w:rPr>
-              <w:t xml:space="preserve">None</w:t>
-            </w:r>
-            <w:r>
-              <w:t xml:space="preserve"> = ingen attributviktning.</w:t>
+              <w:t xml:space="preserve">Vikt för en kod vid en viss grad, ersätter kodvikten för den kombinationen.</w:t>
             </w:r>
           </w:p>
         </w:tc>
@@ -3393,7 +3381,7 @@
               <w:spacing w:after="0"/>
             </w:pPr>
             <w:r>
-              <w:t xml:space="preserve">SPR CIRK 0,7</w:t>
+              <w:t xml:space="preserve">YTS grad 4: 1,0</w:t>
             </w:r>
           </w:p>
         </w:tc>
@@ -3426,7 +3414,7 @@
                 <w:szCs w:val="20"/>
                 <w:shd w:fill="F2F2F2" w:val="clear"/>
               </w:rPr>
-              <w:t xml:space="preserve">LOPANDE_ENHET_M</w:t>
+              <w:t xml:space="preserve">ATTRIBUTFAKTOR</w:t>
             </w:r>
           </w:p>
         </w:tc>
@@ -3451,7 +3439,7 @@
               <w:spacing w:after="0"/>
             </w:pPr>
             <w:r>
-              <w:t xml:space="preserve">Längd (m) per poängenhet för löpande skador: poäng × längd / enhet, minst 1. </w:t>
+              <w:t xml:space="preserve">Viktning per attribut, utöver kodvikten. </w:t>
             </w:r>
             <w:r>
               <w:rPr>
@@ -3463,7 +3451,7 @@
               <w:t xml:space="preserve">None</w:t>
             </w:r>
             <w:r>
-              <w:t xml:space="preserve"> = räkna en gång oavsett längd.</w:t>
+              <w:t xml:space="preserve"> = ingen attributviktning.</w:t>
             </w:r>
           </w:p>
         </w:tc>
@@ -3488,7 +3476,7 @@
               <w:spacing w:after="0"/>
             </w:pPr>
             <w:r>
-              <w:t xml:space="preserve">10</w:t>
+              <w:t xml:space="preserve">SPR CIRK 0,7</w:t>
             </w:r>
           </w:p>
         </w:tc>
@@ -3522,7 +3510,7 @@
                 <w:szCs w:val="20"/>
                 <w:shd w:fill="F2F2F2" w:val="clear"/>
               </w:rPr>
-              <w:t xml:space="preserve">LOPANDE_TAK</w:t>
+              <w:t xml:space="preserve">LOPANDE_ENHET_M</w:t>
             </w:r>
           </w:p>
         </w:tc>
@@ -3548,7 +3536,7 @@
               <w:spacing w:after="0"/>
             </w:pPr>
             <w:r>
-              <w:t xml:space="preserve">Högsta faktor en löpande skada kan få. </w:t>
+              <w:t xml:space="preserve">Längd (m) per poängenhet för löpande skador: poäng × längd / enhet, minst 1. </w:t>
             </w:r>
             <w:r>
               <w:rPr>
@@ -3560,7 +3548,7 @@
               <w:t xml:space="preserve">None</w:t>
             </w:r>
             <w:r>
-              <w:t xml:space="preserve"> = inget tak.</w:t>
+              <w:t xml:space="preserve"> = räkna en gång oavsett längd.</w:t>
             </w:r>
           </w:p>
         </w:tc>
@@ -3586,7 +3574,7 @@
               <w:spacing w:after="0"/>
             </w:pPr>
             <w:r>
-              <w:t xml:space="preserve">5</w:t>
+              <w:t xml:space="preserve">10</w:t>
             </w:r>
           </w:p>
         </w:tc>
@@ -3619,7 +3607,7 @@
                 <w:szCs w:val="20"/>
                 <w:shd w:fill="F2F2F2" w:val="clear"/>
               </w:rPr>
-              <w:t xml:space="preserve">MINLANGD</w:t>
+              <w:t xml:space="preserve">LOPANDE_TAK</w:t>
             </w:r>
           </w:p>
         </w:tc>
@@ -3644,7 +3632,19 @@
               <w:spacing w:after="0"/>
             </w:pPr>
             <w:r>
-              <w:t xml:space="preserve">Minsta längd (m) som används som nämnare vid normering per 100 m.</w:t>
+              <w:t xml:space="preserve">Högsta faktor en löpande skada kan få. </w:t>
+            </w:r>
+            <w:r>
+              <w:rPr>
+                <w:rFonts w:ascii="Consolas" w:cs="Consolas" w:eastAsia="Consolas" w:hAnsi="Consolas"/>
+                <w:sz w:val="20"/>
+                <w:szCs w:val="20"/>
+                <w:shd w:fill="F2F2F2" w:val="clear"/>
+              </w:rPr>
+              <w:t xml:space="preserve">None</w:t>
+            </w:r>
+            <w:r>
+              <w:t xml:space="preserve"> = inget tak.</w:t>
             </w:r>
           </w:p>
         </w:tc>
@@ -3669,7 +3669,7 @@
               <w:spacing w:after="0"/>
             </w:pPr>
             <w:r>
-              <w:t xml:space="preserve">20</w:t>
+              <w:t xml:space="preserve">5</w:t>
             </w:r>
           </w:p>
         </w:tc>
@@ -3703,7 +3703,7 @@
                 <w:szCs w:val="20"/>
                 <w:shd w:fill="F2F2F2" w:val="clear"/>
               </w:rPr>
-              <w:t xml:space="preserve">GRAD4_KODER_A</w:t>
+              <w:t xml:space="preserve">MINLANGD</w:t>
             </w:r>
           </w:p>
         </w:tc>
@@ -3729,19 +3729,7 @@
               <w:spacing w:after="0"/>
             </w:pPr>
             <w:r>
-              <w:t xml:space="preserve">Skadekoder där en enda grad 4-observation räcker för klass A. </w:t>
-            </w:r>
-            <w:r>
-              <w:rPr>
-                <w:rFonts w:ascii="Consolas" w:cs="Consolas" w:eastAsia="Consolas" w:hAnsi="Consolas"/>
-                <w:sz w:val="20"/>
-                <w:szCs w:val="20"/>
-                <w:shd w:fill="F2F2F2" w:val="clear"/>
-              </w:rPr>
-              <w:t xml:space="preserve">None</w:t>
-            </w:r>
-            <w:r>
-              <w:t xml:space="preserve"> = alla konstruktionskoder.</w:t>
+              <w:t xml:space="preserve">Minsta längd (m) som används som nämnare vid normering per 100 m.</w:t>
             </w:r>
           </w:p>
         </w:tc>
@@ -3767,7 +3755,7 @@
               <w:spacing w:after="0"/>
             </w:pPr>
             <w:r>
-              <w:t xml:space="preserve">RBR, DEF</w:t>
+              <w:t xml:space="preserve">20</w:t>
             </w:r>
           </w:p>
         </w:tc>
@@ -3800,7 +3788,7 @@
                 <w:szCs w:val="20"/>
                 <w:shd w:fill="F2F2F2" w:val="clear"/>
               </w:rPr>
-              <w:t xml:space="preserve">TROSKEL_A</w:t>
+              <w:t xml:space="preserve">GRAD4_KODER_A</w:t>
             </w:r>
           </w:p>
         </w:tc>
@@ -3825,7 +3813,19 @@
               <w:spacing w:after="0"/>
             </w:pPr>
             <w:r>
-              <w:t xml:space="preserve">Konstruktionsindex (p/100 m) som ger klass A.</w:t>
+              <w:t xml:space="preserve">Skadekoder där en enda grad 4-observation räcker för klass A. </w:t>
+            </w:r>
+            <w:r>
+              <w:rPr>
+                <w:rFonts w:ascii="Consolas" w:cs="Consolas" w:eastAsia="Consolas" w:hAnsi="Consolas"/>
+                <w:sz w:val="20"/>
+                <w:szCs w:val="20"/>
+                <w:shd w:fill="F2F2F2" w:val="clear"/>
+              </w:rPr>
+              <w:t xml:space="preserve">None</w:t>
+            </w:r>
+            <w:r>
+              <w:t xml:space="preserve"> = alla konstruktionskoder.</w:t>
             </w:r>
           </w:p>
         </w:tc>
@@ -3850,7 +3850,7 @@
               <w:spacing w:after="0"/>
             </w:pPr>
             <w:r>
-              <w:t xml:space="preserve">80</w:t>
+              <w:t xml:space="preserve">RBR, DEF</w:t>
             </w:r>
           </w:p>
         </w:tc>
@@ -3884,7 +3884,7 @@
                 <w:szCs w:val="20"/>
                 <w:shd w:fill="F2F2F2" w:val="clear"/>
               </w:rPr>
-              <w:t xml:space="preserve">TROSKEL_B</w:t>
+              <w:t xml:space="preserve">TROSKEL_A</w:t>
             </w:r>
           </w:p>
         </w:tc>
@@ -3910,7 +3910,7 @@
               <w:spacing w:after="0"/>
             </w:pPr>
             <w:r>
-              <w:t xml:space="preserve">Konstruktionsindex (p/100 m) som ger klass B.</w:t>
+              <w:t xml:space="preserve">Konstruktionsindex (p/100 m) som ger klass A.</w:t>
             </w:r>
           </w:p>
         </w:tc>
@@ -3936,7 +3936,7 @@
               <w:spacing w:after="0"/>
             </w:pPr>
             <w:r>
-              <w:t xml:space="preserve">25</w:t>
+              <w:t xml:space="preserve">80</w:t>
             </w:r>
           </w:p>
         </w:tc>
@@ -3969,7 +3969,7 @@
                 <w:szCs w:val="20"/>
                 <w:shd w:fill="F2F2F2" w:val="clear"/>
               </w:rPr>
-              <w:t xml:space="preserve">KODER</w:t>
+              <w:t xml:space="preserve">TROSKEL_B</w:t>
             </w:r>
           </w:p>
         </w:tc>
@@ -3994,7 +3994,7 @@
               <w:spacing w:after="0"/>
             </w:pPr>
             <w:r>
-              <w:t xml:space="preserve">Skadekoder med klartext och typ (K = konstruktion, D = drift, I = information).</w:t>
+              <w:t xml:space="preserve">Konstruktionsindex (p/100 m) som ger klass B.</w:t>
             </w:r>
           </w:p>
         </w:tc>
@@ -4019,7 +4019,7 @@
               <w:spacing w:after="0"/>
             </w:pPr>
             <w:r>
-              <w:t xml:space="preserve">P93</w:t>
+              <w:t xml:space="preserve">25</w:t>
             </w:r>
           </w:p>
         </w:tc>
@@ -4053,6 +4053,91 @@
                 <w:szCs w:val="20"/>
                 <w:shd w:fill="F2F2F2" w:val="clear"/>
               </w:rPr>
+              <w:t xml:space="preserve">KODER</w:t>
+            </w:r>
+          </w:p>
+        </w:tc>
+        <w:tc>
+          <w:tcPr>
+            <w:tcW w:type="dxa" w:w="5000"/>
+            <w:tcBorders>
+              <w:top w:val="single" w:color="BFBFBF" w:sz="4"/>
+              <w:left w:val="single" w:color="BFBFBF" w:sz="4"/>
+              <w:bottom w:val="single" w:color="BFBFBF" w:sz="4"/>
+              <w:right w:val="single" w:color="BFBFBF" w:sz="4"/>
+            </w:tcBorders>
+            <w:shd w:fill="F7F9FC" w:val="clear"/>
+            <w:tcMar>
+              <w:top w:type="dxa" w:w="60"/>
+              <w:left w:type="dxa" w:w="100"/>
+              <w:bottom w:type="dxa" w:w="60"/>
+              <w:right w:type="dxa" w:w="100"/>
+            </w:tcMar>
+          </w:tcPr>
+          <w:p>
+            <w:pPr>
+              <w:spacing w:after="0"/>
+            </w:pPr>
+            <w:r>
+              <w:t xml:space="preserve">Skadekoder med klartext och typ (K = konstruktion, D = drift, I = information).</w:t>
+            </w:r>
+          </w:p>
+        </w:tc>
+        <w:tc>
+          <w:tcPr>
+            <w:tcW w:type="dxa" w:w="1760"/>
+            <w:tcBorders>
+              <w:top w:val="single" w:color="BFBFBF" w:sz="4"/>
+              <w:left w:val="single" w:color="BFBFBF" w:sz="4"/>
+              <w:bottom w:val="single" w:color="BFBFBF" w:sz="4"/>
+              <w:right w:val="single" w:color="BFBFBF" w:sz="4"/>
+            </w:tcBorders>
+            <w:shd w:fill="F7F9FC" w:val="clear"/>
+            <w:tcMar>
+              <w:top w:type="dxa" w:w="60"/>
+              <w:left w:type="dxa" w:w="100"/>
+              <w:bottom w:type="dxa" w:w="60"/>
+              <w:right w:type="dxa" w:w="100"/>
+            </w:tcMar>
+          </w:tcPr>
+          <w:p>
+            <w:pPr>
+              <w:spacing w:after="0"/>
+            </w:pPr>
+            <w:r>
+              <w:t xml:space="preserve">P93</w:t>
+            </w:r>
+          </w:p>
+        </w:tc>
+      </w:tr>
+      <w:tr>
+        <w:tc>
+          <w:tcPr>
+            <w:tcW w:type="dxa" w:w="2600"/>
+            <w:tcBorders>
+              <w:top w:val="single" w:color="BFBFBF" w:sz="4"/>
+              <w:left w:val="single" w:color="BFBFBF" w:sz="4"/>
+              <w:bottom w:val="single" w:color="BFBFBF" w:sz="4"/>
+              <w:right w:val="single" w:color="BFBFBF" w:sz="4"/>
+            </w:tcBorders>
+            <w:tcMar>
+              <w:top w:type="dxa" w:w="60"/>
+              <w:left w:type="dxa" w:w="100"/>
+              <w:bottom w:type="dxa" w:w="60"/>
+              <w:right w:type="dxa" w:w="100"/>
+            </w:tcMar>
+          </w:tcPr>
+          <w:p>
+            <w:pPr>
+              <w:spacing w:after="0"/>
+            </w:pPr>
+            <w:r>
+              <w:rPr>
+                <w:rFonts w:ascii="Consolas" w:cs="Consolas" w:eastAsia="Consolas" w:hAnsi="Consolas"/>
+                <w:sz w:val="20"/>
+                <w:szCs w:val="20"/>
+                <w:shd w:fill="F2F2F2" w:val="clear"/>
+              </w:rPr>
               <w:t xml:space="preserve">ATTRIBUT</w:t>
             </w:r>
             <w:r>
@@ -4078,7 +4163,6 @@
               <w:bottom w:val="single" w:color="BFBFBF" w:sz="4"/>
               <w:right w:val="single" w:color="BFBFBF" w:sz="4"/>
             </w:tcBorders>
-            <w:shd w:fill="F7F9FC" w:val="clear"/>
             <w:tcMar>
               <w:top w:type="dxa" w:w="60"/>
               <w:left w:type="dxa" w:w="100"/>
@@ -4104,7 +4188,6 @@
               <w:bottom w:val="single" w:color="BFBFBF" w:sz="4"/>
               <w:right w:val="single" w:color="BFBFBF" w:sz="4"/>
             </w:tcBorders>
-            <w:shd w:fill="F7F9FC" w:val="clear"/>
             <w:tcMar>
               <w:top w:type="dxa" w:w="60"/>
               <w:left w:type="dxa" w:w="100"/>
@@ -5976,8 +6059,8 @@
       </w:r>
     </w:p>
     <w:sectPr>
-      <w:headerReference w:type="default" r:id="rId7"/>
-      <w:footerReference w:type="default" r:id="rId8"/>
+      <w:headerReference w:type="default" r:id="rId6"/>
+      <w:footerReference w:type="default" r:id="rId7"/>
       <w:pgSz w:w="11906" w:h="16838" w:orient="portrait"/>
       <w:pgMar w:top="1440" w:right="1440" w:bottom="1440" w:left="1440" w:header="708" w:footer="708" w:gutter="0"/>
       <w:pgNumType/>
@@ -5985,10 +6068,6 @@
     </w:sectPr>
   </w:body>
 </w:document>
-</file>
-
-<file path=word/comments.xml><?xml version="1.0" encoding="utf-8"?>
-<w:comments xmlns:cx="http://schemas.microsoft.com/office/drawing/2014/chartex" xmlns:cx1="http://schemas.microsoft.com/office/drawing/2015/9/8/chartex" xmlns:cx2="http://schemas.microsoft.com/office/drawing/2015/10/21/chartex" xmlns:cx3="http://schemas.microsoft.com/office/drawing/2016/5/9/chartex" xmlns:cx4="http://schemas.microsoft.com/office/drawing/2016/5/10/chartex" xmlns:cx5="http://schemas.microsoft.com/office/drawing/2016/5/11/chartex" xmlns:cx6="http://schemas.microsoft.com/office/drawing/2016/5/12/chartex" xmlns:cx7="http://schemas.microsoft.com/office/drawing/2016/5/13/chartex" xmlns:cx8="http://schemas.microsoft.com/office/drawing/2016/5/14/chartex" xmlns:mc="http://schemas.openxmlformats.org/markup-compatibility/2006" xmlns:aink="http://schemas.microsoft.com/office/drawing/2016/ink" xmlns:am3d="http://schemas.microsoft.com/office/drawing/2017/model3d" xmlns:o="urn:schemas-microsoft-com:office:office" xmlns:r="http://schemas.openxmlformats.org/officeDocument/2006/relationships" xmlns:m="http://schemas.openxmlformats.org/officeDocument/2006/math" xmlns:v="urn:schemas-microsoft-com:vml" xmlns:wp14="http://schemas.microsoft.com/office/word/2010/wordprocessingDrawing" xmlns:wp="http://schemas.openxmlformats.org/drawingml/2006/wordprocessingDrawing" xmlns:w10="urn:schemas-microsoft-com:office:word" xmlns:w="http://schemas.openxmlformats.org/wordprocessingml/2006/main" xmlns:w14="http://schemas.microsoft.com/office/word/2010/wordml" xmlns:w15="http://schemas.microsoft.com/office/word/2012/wordml" xmlns:w16cex="http://schemas.microsoft.com/office/word/2018/wordml/cex" xmlns:w16cid="http://schemas.microsoft.com/office/word/2016/wordml/cid" xmlns:w16="http://schemas.microsoft.com/office/word/2018/wordml" xmlns:w16sdtdh="http://schemas.microsoft.com/office/word/2020/wordml/sdtdatahash" xmlns:w16se="http://schemas.microsoft.com/office/word/2015/wordml/symex" xmlns:wpg="http://schemas.microsoft.com/office/word/2010/wordprocessingGroup" xmlns:wpi="http://schemas.microsoft.com/office/word/2010/wordprocessingInk" xmlns:wne="http://schemas.microsoft.com/office/word/2006/wordml" xmlns:wps="http://schemas.microsoft.com/office/word/2010/wordprocessingShape"/>
 </file>
 
 <file path=word/endnotes.xml><?xml version="1.0" encoding="utf-8"?>
@@ -6114,7 +6193,7 @@
 <w:numbering xmlns:wpc="http://schemas.microsoft.com/office/word/2010/wordprocessingCanvas" xmlns:mc="http://schemas.openxmlformats.org/markup-compatibility/2006" xmlns:o="urn:schemas-microsoft-com:office:office" xmlns:r="http://schemas.openxmlformats.org/officeDocument/2006/relationships" xmlns:m="http://schemas.openxmlformats.org/officeDocument/2006/math" xmlns:v="urn:schemas-microsoft-com:vml" xmlns:wp14="http://schemas.microsoft.com/office/word/2010/wordprocessingDrawing" xmlns:wp="http://schemas.openxmlformats.org/drawingml/2006/wordprocessingDrawing" xmlns:w10="urn:schemas-microsoft-com:office:word" xmlns:w="http://schemas.openxmlformats.org/wordprocessingml/2006/main" xmlns:w14="http://schemas.microsoft.com/office/word/2010/wordml" xmlns:w15="http://schemas.microsoft.com/office/word/2012/wordml" xmlns:wpg="http://schemas.microsoft.com/office/word/2010/wordprocessingGroup" xmlns:wpi="http://schemas.microsoft.com/office/word/2010/wordprocessingInk" xmlns:wne="http://schemas.microsoft.com/office/word/2006/wordml" xmlns:wps="http://schemas.microsoft.com/office/word/2010/wordprocessingShape" mc:Ignorable="w14 w15 wp14">
   <w:abstractNum w:abstractNumId="1" w15:restartNumberingAfterBreak="0">
     <w:multiLevelType w:val="hybridMultilevel"/>
-    <w:lvl w:ilvl="0" w15:tentative="1">
+    <w:lvl w:ilvl="0" w:tentative="1">
       <w:start w:val="1"/>
       <w:numFmt w:val="bullet"/>
       <w:lvlText w:val="●"/>
@@ -6123,7 +6202,7 @@
         <w:ind w:left="720" w:hanging="360"/>
       </w:pPr>
     </w:lvl>
-    <w:lvl w:ilvl="1" w15:tentative="1">
+    <w:lvl w:ilvl="1" w:tentative="1">
       <w:start w:val="1"/>
       <w:numFmt w:val="bullet"/>
       <w:lvlText w:val="○"/>
@@ -6132,7 +6211,7 @@
         <w:ind w:left="1440" w:hanging="360"/>
       </w:pPr>
     </w:lvl>
-    <w:lvl w:ilvl="2" w15:tentative="1">
+    <w:lvl w:ilvl="2" w:tentative="1">
       <w:start w:val="1"/>
       <w:numFmt w:val="bullet"/>
       <w:lvlText w:val="■"/>
@@ -6141,7 +6220,7 @@
         <w:ind w:left="2160" w:hanging="360"/>
       </w:pPr>
     </w:lvl>
-    <w:lvl w:ilvl="3" w15:tentative="1">
+    <w:lvl w:ilvl="3" w:tentative="1">
       <w:start w:val="1"/>
       <w:numFmt w:val="bullet"/>
       <w:lvlText w:val="●"/>
@@ -6150,7 +6229,7 @@
         <w:ind w:left="2880" w:hanging="360"/>
       </w:pPr>
     </w:lvl>
-    <w:lvl w:ilvl="4" w15:tentative="1">
+    <w:lvl w:ilvl="4" w:tentative="1">
       <w:start w:val="1"/>
       <w:numFmt w:val="bullet"/>
       <w:lvlText w:val="○"/>
@@ -6159,7 +6238,7 @@
         <w:ind w:left="3600" w:hanging="360"/>
       </w:pPr>
     </w:lvl>
-    <w:lvl w:ilvl="5" w15:tentative="1">
+    <w:lvl w:ilvl="5" w:tentative="1">
       <w:start w:val="1"/>
       <w:numFmt w:val="bullet"/>
       <w:lvlText w:val="■"/>
@@ -6168,7 +6247,7 @@
         <w:ind w:left="4320" w:hanging="360"/>
       </w:pPr>
     </w:lvl>
-    <w:lvl w:ilvl="6" w15:tentative="1">
+    <w:lvl w:ilvl="6" w:tentative="1">
       <w:start w:val="1"/>
       <w:numFmt w:val="bullet"/>
       <w:lvlText w:val="●"/>
@@ -6177,7 +6256,7 @@
         <w:ind w:left="5040" w:hanging="360"/>
       </w:pPr>
     </w:lvl>
-    <w:lvl w:ilvl="7" w15:tentative="1">
+    <w:lvl w:ilvl="7" w:tentative="1">
       <w:start w:val="1"/>
       <w:numFmt w:val="bullet"/>
       <w:lvlText w:val="●"/>
@@ -6186,7 +6265,7 @@
         <w:ind w:left="5760" w:hanging="360"/>
       </w:pPr>
     </w:lvl>
-    <w:lvl w:ilvl="8" w15:tentative="1">
+    <w:lvl w:ilvl="8" w:tentative="1">
       <w:start w:val="1"/>
       <w:numFmt w:val="bullet"/>
       <w:lvlText w:val="●"/>
@@ -6198,7 +6277,7 @@
   </w:abstractNum>
   <w:abstractNum w:abstractNumId="2" w15:restartNumberingAfterBreak="0">
     <w:multiLevelType w:val="hybridMultilevel"/>
-    <w:lvl w:ilvl="0" w15:tentative="1">
+    <w:lvl w:ilvl="0" w:tentative="1">
       <w:start w:val="1"/>
       <w:numFmt w:val="bullet"/>
       <w:lvlText w:val="•"/>
@@ -6210,7 +6289,7 @@
   </w:abstractNum>
   <w:abstractNum w:abstractNumId="3" w15:restartNumberingAfterBreak="0">
     <w:multiLevelType w:val="hybridMultilevel"/>
-    <w:lvl w:ilvl="0" w15:tentative="1">
+    <w:lvl w:ilvl="0" w:tentative="1">
       <w:start w:val="1"/>
       <w:numFmt w:val="decimal"/>
       <w:lvlText w:val="%1."/>
@@ -6253,37 +6332,9 @@
     </w:rPrDefault>
     <w:pPrDefault/>
   </w:docDefaults>
-  <w:style w:type="paragraph" w:styleId="Title">
-    <w:name w:val="Title"/>
-    <w:basedOn w:val="Normal"/>
-    <w:next w:val="Normal"/>
+  <w:style w:type="paragraph" w:styleId="Normal" w:default="1">
+    <w:name w:val="Normal"/>
     <w:qFormat/>
-    <w:rPr>
-      <w:sz w:val="56"/>
-      <w:szCs w:val="56"/>
-    </w:rPr>
-  </w:style>
-  <w:style w:type="paragraph" w:styleId="Heading1">
-    <w:name w:val="Heading 1"/>
-    <w:basedOn w:val="Normal"/>
-    <w:next w:val="Normal"/>
-    <w:qFormat/>
-    <w:rPr>
-      <w:color w:val="2E74B5"/>
-      <w:sz w:val="32"/>
-      <w:szCs w:val="32"/>
-    </w:rPr>
-  </w:style>
-  <w:style w:type="paragraph" w:styleId="Heading2">
-    <w:name w:val="Heading 2"/>
-    <w:basedOn w:val="Normal"/>
-    <w:next w:val="Normal"/>
-    <w:qFormat/>
-    <w:rPr>
-      <w:color w:val="2E74B5"/>
-      <w:sz w:val="26"/>
-      <w:szCs w:val="26"/>
-    </w:rPr>
   </w:style>
   <w:style w:type="paragraph" w:styleId="Heading3">
     <w:name w:val="Heading 3"/>
@@ -6477,4 +6528,294 @@
     </w:rPr>
   </w:style>
 </w:styles>
+</file>
+
+<file path=word/theme/theme1.xml><?xml version="1.0" encoding="utf-8"?>
+<a:theme xmlns:a="http://schemas.openxmlformats.org/drawingml/2006/main" name="Office Theme">
+  <a:themeElements>
+    <a:clrScheme name="Office">
+      <a:dk1>
+        <a:sysClr val="windowText" lastClr="000000"/>
+      </a:dk1>
+      <a:lt1>
+        <a:sysClr val="window" lastClr="FFFFFF"/>
+      </a:lt1>
+      <a:dk2>
+        <a:srgbClr val="44546A"/>
+      </a:dk2>
+      <a:lt2>
+        <a:srgbClr val="E7E6E6"/>
+      </a:lt2>
+      <a:accent1>
+        <a:srgbClr val="4472C4"/>
+      </a:accent1>
+      <a:accent2>
+        <a:srgbClr val="ED7D31"/>
+      </a:accent2>
+      <a:accent3>
+        <a:srgbClr val="A5A5A5"/>
+      </a:accent3>
+      <a:accent4>
+        <a:srgbClr val="FFC000"/>
+      </a:accent4>
+      <a:accent5>
+        <a:srgbClr val="5B9BD5"/>
+      </a:accent5>
+      <a:accent6>
+        <a:srgbClr val="70AD47"/>
+      </a:accent6>
+      <a:hlink>
+        <a:srgbClr val="0563C1"/>
+      </a:hlink>
+      <a:folHlink>
+        <a:srgbClr val="954F72"/>
+      </a:folHlink>
+    </a:clrScheme>
+    <a:fontScheme name="Office">
+      <a:majorFont>
+        <a:latin typeface="Calibri Light" panose="020F0302020204030204"/>
+        <a:ea typeface=""/>
+        <a:cs typeface=""/>
+        <a:font script="Jpan" typeface="游ゴシック Light"/>
+        <a:font script="Hang" typeface="맑은 고딕"/>
+        <a:font script="Hans" typeface="等线 Light"/>
+        <a:font script="Hant" typeface="新細明體"/>
+        <a:font script="Arab" typeface="Times New Roman"/>
+        <a:font script="Hebr" typeface="Times New Roman"/>
+        <a:font script="Thai" typeface="Angsana New"/>
+        <a:font script="Ethi" typeface="Nyala"/>
+        <a:font script="Beng" typeface="Vrinda"/>
+        <a:font script="Gujr" typeface="Shruti"/>
+        <a:font script="Khmr" typeface="MoolBoran"/>
+        <a:font script="Knda" typeface="Tunga"/>
+        <a:font script="Guru" typeface="Raavi"/>
+        <a:font script="Cans" typeface="Euphemia"/>
+        <a:font script="Cher" typeface="Plantagenet Cherokee"/>
+        <a:font script="Yiii" typeface="Microsoft Yi Baiti"/>
+        <a:font script="Tibt" typeface="Microsoft Himalaya"/>
+        <a:font script="Thaa" typeface="MV Boli"/>
+        <a:font script="Deva" typeface="Mangal"/>
+        <a:font script="Telu" typeface="Gautami"/>
+        <a:font script="Taml" typeface="Latha"/>
+        <a:font script="Syrc" typeface="Estrangelo Edessa"/>
+        <a:font script="Orya" typeface="Kalinga"/>
+        <a:font script="Mlym" typeface="Kartika"/>
+        <a:font script="Laoo" typeface="DokChampa"/>
+        <a:font script="Sinh" typeface="Iskoola Pota"/>
+        <a:font script="Mong" typeface="Mongolian Baiti"/>
+        <a:font script="Viet" typeface="Times New Roman"/>
+        <a:font script="Uigh" typeface="Microsoft Uighur"/>
+        <a:font script="Geor" typeface="Sylfaen"/>
+        <a:font script="Armn" typeface="Arial"/>
+        <a:font script="Bugi" typeface="Leelawadee UI"/>
+        <a:font script="Bopo" typeface="Microsoft JhengHei"/>
+        <a:font script="Java" typeface="Javanese Text"/>
+        <a:font script="Lisu" typeface="Segoe UI"/>
+        <a:font script="Mymr" typeface="Myanmar Text"/>
+        <a:font script="Nkoo" typeface="Ebrima"/>
+        <a:font script="Olck" typeface="Nirmala UI"/>
+        <a:font script="Osma" typeface="Ebrima"/>
+        <a:font script="Phag" typeface="Phagspa"/>
+        <a:font script="Syrn" typeface="Estrangelo Edessa"/>
+        <a:font script="Syrj" typeface="Estrangelo Edessa"/>
+        <a:font script="Syre" typeface="Estrangelo Edessa"/>
+        <a:font script="Sora" typeface="Nirmala UI"/>
+        <a:font script="Tale" typeface="Microsoft Tai Le"/>
+        <a:font script="Talu" typeface="Microsoft New Tai Lue"/>
+        <a:font script="Tfng" typeface="Ebrima"/>
+      </a:majorFont>
+      <a:minorFont>
+        <a:latin typeface="Calibri" panose="020F0502020204030204"/>
+        <a:ea typeface=""/>
+        <a:cs typeface=""/>
+        <a:font script="Jpan" typeface="游明朝"/>
+        <a:font script="Hang" typeface="맑은 고딕"/>
+        <a:font script="Hans" typeface="等线"/>
+        <a:font script="Hant" typeface="新細明體"/>
+        <a:font script="Arab" typeface="Arial"/>
+        <a:font script="Hebr" typeface="Arial"/>
+        <a:font script="Thai" typeface="Cordia New"/>
+        <a:font script="Ethi" typeface="Nyala"/>
+        <a:font script="Beng" typeface="Vrinda"/>
+        <a:font script="Gujr" typeface="Shruti"/>
+        <a:font script="Khmr" typeface="DaunPenh"/>
+        <a:font script="Knda" typeface="Tunga"/>
+        <a:font script="Guru" typeface="Raavi"/>
+        <a:font script="Cans" typeface="Euphemia"/>
+        <a:font script="Cher" typeface="Plantagenet Cherokee"/>
+        <a:font script="Yiii" typeface="Microsoft Yi Baiti"/>
+        <a:font script="Tibt" typeface="Microsoft Himalaya"/>
+        <a:font script="Thaa" typeface="MV Boli"/>
+        <a:font script="Deva" typeface="Mangal"/>
+        <a:font script="Telu" typeface="Gautami"/>
+        <a:font script="Taml" typeface="Latha"/>
+        <a:font script="Syrc" typeface="Estrangelo Edessa"/>
+        <a:font script="Orya" typeface="Kalinga"/>
+        <a:font script="Mlym" typeface="Kartika"/>
+        <a:font script="Laoo" typeface="DokChampa"/>
+        <a:font script="Sinh" typeface="Iskoola Pota"/>
+        <a:font script="Mong" typeface="Mongolian Baiti"/>
+        <a:font script="Viet" typeface="Arial"/>
+        <a:font script="Uigh" typeface="Microsoft Uighur"/>
+        <a:font script="Geor" typeface="Sylfaen"/>
+        <a:font script="Armn" typeface="Arial"/>
+        <a:font script="Bugi" typeface="Leelawadee UI"/>
+        <a:font script="Bopo" typeface="Microsoft JhengHei"/>
+        <a:font script="Java" typeface="Javanese Text"/>
+        <a:font script="Lisu" typeface="Segoe UI"/>
+        <a:font script="Mymr" typeface="Myanmar Text"/>
+        <a:font script="Nkoo" typeface="Ebrima"/>
+        <a:font script="Olck" typeface="Nirmala UI"/>
+        <a:font script="Osma" typeface="Ebrima"/>
+        <a:font script="Phag" typeface="Phagspa"/>
+        <a:font script="Syrn" typeface="Estrangelo Edessa"/>
+        <a:font script="Syrj" typeface="Estrangelo Edessa"/>
+        <a:font script="Syre" typeface="Estrangelo Edessa"/>
+        <a:font script="Sora" typeface="Nirmala UI"/>
+        <a:font script="Tale" typeface="Microsoft Tai Le"/>
+        <a:font script="Talu" typeface="Microsoft New Tai Lue"/>
+        <a:font script="Tfng" typeface="Ebrima"/>
+      </a:minorFont>
+    </a:fontScheme>
+    <a:fmtScheme name="Office">
+      <a:fillStyleLst>
+        <a:solidFill>
+          <a:schemeClr val="phClr"/>
+        </a:solidFill>
+        <a:gradFill rotWithShape="true">
+          <a:gsLst>
+            <a:gs pos="0">
+              <a:schemeClr val="phClr">
+                <a:lumMod val="110000"/>
+                <a:satMod val="105000"/>
+                <a:tint val="67000"/>
+              </a:schemeClr>
+            </a:gs>
+            <a:gs pos="50000">
+              <a:schemeClr val="phClr">
+                <a:lumMod val="105000"/>
+                <a:satMod val="103000"/>
+                <a:tint val="73000"/>
+              </a:schemeClr>
+            </a:gs>
+            <a:gs pos="100000">
+              <a:schemeClr val="phClr">
+                <a:lumMod val="105000"/>
+                <a:satMod val="109000"/>
+                <a:tint val="81000"/>
+              </a:schemeClr>
+            </a:gs>
+          </a:gsLst>
+          <a:lin ang="5400000" scaled="false"/>
+        </a:gradFill>
+        <a:gradFill rotWithShape="true">
+          <a:gsLst>
+            <a:gs pos="0">
+              <a:schemeClr val="phClr">
+                <a:satMod val="103000"/>
+                <a:lumMod val="102000"/>
+                <a:tint val="94000"/>
+              </a:schemeClr>
+            </a:gs>
+            <a:gs pos="50000">
+              <a:schemeClr val="phClr">
+                <a:satMod val="110000"/>
+                <a:lumMod val="100000"/>
+                <a:shade val="100000"/>
+              </a:schemeClr>
+            </a:gs>
+            <a:gs pos="100000">
+              <a:schemeClr val="phClr">
+                <a:lumMod val="99000"/>
+                <a:satMod val="120000"/>
+                <a:shade val="78000"/>
+              </a:schemeClr>
+            </a:gs>
+          </a:gsLst>
+          <a:lin ang="5400000" scaled="false"/>
+        </a:gradFill>
+      </a:fillStyleLst>
+      <a:lnStyleLst>
+        <a:ln w="6350" cap="flat" cmpd="sng" algn="ctr">
+          <a:solidFill>
+            <a:schemeClr val="phClr"/>
+          </a:solidFill>
+          <a:prstDash val="solid"/>
+          <a:miter lim="800000"/>
+        </a:ln>
+        <a:ln w="12700" cap="flat" cmpd="sng" algn="ctr">
+          <a:solidFill>
+            <a:schemeClr val="phClr"/>
+          </a:solidFill>
+          <a:prstDash val="solid"/>
+          <a:miter lim="800000"/>
+        </a:ln>
+        <a:ln w="19050" cap="flat" cmpd="sng" algn="ctr">
+          <a:solidFill>
+            <a:schemeClr val="phClr"/>
+          </a:solidFill>
+          <a:prstDash val="solid"/>
+          <a:miter lim="800000"/>
+        </a:ln>
+      </a:lnStyleLst>
+      <a:effectStyleLst>
+        <a:effectStyle>
+          <a:effectLst/>
+        </a:effectStyle>
+        <a:effectStyle>
+          <a:effectLst/>
+        </a:effectStyle>
+        <a:effectStyle>
+          <a:effectLst>
+            <a:outerShdw blurRad="57150" dist="19050" dir="5400000" algn="ctr" rotWithShape="false">
+              <a:srgbClr val="000000">
+                <a:alpha val="63000"/>
+              </a:srgbClr>
+            </a:outerShdw>
+          </a:effectLst>
+        </a:effectStyle>
+      </a:effectStyleLst>
+      <a:bgFillStyleLst>
+        <a:solidFill>
+          <a:schemeClr val="phClr"/>
+        </a:solidFill>
+        <a:solidFill>
+          <a:schemeClr val="phClr">
+            <a:tint val="95000"/>
+            <a:satMod val="170000"/>
+          </a:schemeClr>
+        </a:solidFill>
+        <a:gradFill rotWithShape="true">
+          <a:gsLst>
+            <a:gs pos="0">
+              <a:schemeClr val="phClr">
+                <a:tint val="93000"/>
+                <a:satMod val="150000"/>
+                <a:shade val="98000"/>
+                <a:lumMod val="102000"/>
+              </a:schemeClr>
+            </a:gs>
+            <a:gs pos="50000">
+              <a:schemeClr val="phClr">
+                <a:tint val="98000"/>
+                <a:satMod val="130000"/>
+                <a:shade val="90000"/>
+                <a:lumMod val="103000"/>
+              </a:schemeClr>
+            </a:gs>
+            <a:gs pos="100000">
+              <a:schemeClr val="phClr">
+                <a:shade val="63000"/>
+                <a:satMod val="120000"/>
+              </a:schemeClr>
+            </a:gs>
+          </a:gsLst>
+          <a:lin ang="5400000" scaled="false"/>
+        </a:gradFill>
+      </a:bgFillStyleLst>
+    </a:fmtScheme>
+  </a:themeElements>
+  <a:objectDefaults/>
+  <a:extraClrSchemeLst/>
+</a:theme>
 </file>
</xml_diff>

<commit_message>
Egen bildmapp i listfilen (bild:) och --bilder
Filmer och bilder kan nu anges separat: 'bild: KATALOG' i listfilen
(globalt eller efter ';' på en TV3-rad) eller --bilder på kommandoraden.
Anges en bildmapp söks bilderna där (och i TV3-filens egen mapp), annars
som tidigare i filmmapparna. Handledning, filer.txt och CLAUDE.md
uppdaterade.

Co-Authored-By: Claude Fable 5.1 <noreply@anthropic.com>
Claude-Session: https://claude.ai/code/session_011fdqX3JEZje1LF9LqpaqR8
</commit_message>
<xml_diff>
--- a/Anvandarhandledning tv3_analys.docx
+++ b/Anvandarhandledning tv3_analys.docx
@@ -208,7 +208,7 @@
           <w:sz w:val="19"/>
           <w:szCs w:val="19"/>
         </w:rPr>
-        <w:t xml:space="preserve">media: D:\Inspektioner\Filmer            # gäller alla filer i listan</w:t>
+        <w:t xml:space="preserve">media: D:\Inspektioner\Filmer            # filmmapp för alla filer i listan</w:t>
       </w:r>
     </w:p>
     <w:p>
@@ -223,7 +223,7 @@
           <w:sz w:val="19"/>
           <w:szCs w:val="19"/>
         </w:rPr>
-        <w:t xml:space="preserve">littera: brunnslittera.csv                # ersättningslittera, se 3.3</w:t>
+        <w:t xml:space="preserve">bild: D:\Inspektioner\Foton              # bildmapp för alla filer (valfritt)</w:t>
       </w:r>
     </w:p>
     <w:p>
@@ -238,7 +238,7 @@
           <w:sz w:val="19"/>
           <w:szCs w:val="19"/>
         </w:rPr>
-        <w:t xml:space="preserve"/>
+        <w:t xml:space="preserve">littera: brunnslittera.csv                # ersättningslittera, se 3.3</w:t>
       </w:r>
     </w:p>
     <w:p>
@@ -253,7 +253,7 @@
           <w:sz w:val="19"/>
           <w:szCs w:val="19"/>
         </w:rPr>
-        <w:t xml:space="preserve">DUF 701.TV3                                # media söks i TV3-filens egen mapp</w:t>
+        <w:t xml:space="preserve"/>
       </w:r>
     </w:p>
     <w:p>
@@ -268,7 +268,7 @@
           <w:sz w:val="19"/>
           <w:szCs w:val="19"/>
         </w:rPr>
-        <w:t xml:space="preserve">DUF 702.TV3 ; D:\Filmer\DUF702            # egen mediamapp för denna fil</w:t>
+        <w:t xml:space="preserve">DUF 701.TV3                                # media söks i TV3-filens egen mapp</w:t>
       </w:r>
     </w:p>
     <w:p>
@@ -283,7 +283,22 @@
           <w:sz w:val="19"/>
           <w:szCs w:val="19"/>
         </w:rPr>
-        <w:t xml:space="preserve">"C:\Inspektioner\2022\DUF 810.TV3" ; E:\Film ; E:\Bilder</w:t>
+        <w:t xml:space="preserve">DUF 702.TV3 ; D:\Filmer\DUF702            # egen filmmapp för denna fil</w:t>
+      </w:r>
+    </w:p>
+    <w:p>
+      <w:pPr>
+        <w:shd w:fill="F2F2F2" w:val="clear"/>
+        <w:spacing w:after="0"/>
+        <w:ind w:left="280"/>
+      </w:pPr>
+      <w:r>
+        <w:rPr>
+          <w:rFonts w:ascii="Consolas" w:cs="Consolas" w:eastAsia="Consolas" w:hAnsi="Consolas"/>
+          <w:sz w:val="19"/>
+          <w:szCs w:val="19"/>
+        </w:rPr>
+        <w:t xml:space="preserve">"C:\Inspektioner\2022\DUF 810.TV3" ; E:\Film ; bild: E:\Foton</w:t>
       </w:r>
     </w:p>
     <w:p>
@@ -400,7 +415,19 @@
         <w:t xml:space="preserve">film:</w:t>
       </w:r>
       <w:r>
-        <w:t xml:space="preserve">) på en egen rad anger en mapp där filmer och bilder söks för </w:t>
+        <w:t xml:space="preserve">, </w:t>
+      </w:r>
+      <w:r>
+        <w:rPr>
+          <w:rFonts w:ascii="Consolas" w:cs="Consolas" w:eastAsia="Consolas" w:hAnsi="Consolas"/>
+          <w:sz w:val="20"/>
+          <w:szCs w:val="20"/>
+          <w:shd w:fill="F2F2F2" w:val="clear"/>
+        </w:rPr>
+        <w:t xml:space="preserve">video:</w:t>
+      </w:r>
+      <w:r>
+        <w:t xml:space="preserve">) på en egen rad anger en mapp där filmerna söks för </w:t>
       </w:r>
       <w:r>
         <w:rPr>
@@ -423,41 +450,28 @@
         <w:spacing w:after="80"/>
       </w:pPr>
       <w:r>
-        <w:t xml:space="preserve">Allt efter </w:t>
-      </w:r>
-      <w:r>
-        <w:rPr>
-          <w:rFonts w:ascii="Consolas" w:cs="Consolas" w:eastAsia="Consolas" w:hAnsi="Consolas"/>
-          <w:sz w:val="20"/>
-          <w:szCs w:val="20"/>
-          <w:shd w:fill="F2F2F2" w:val="clear"/>
-        </w:rPr>
-        <w:t xml:space="preserve">;</w:t>
-      </w:r>
-      <w:r>
-        <w:t xml:space="preserve"> på en TV3-rad är mediamappar för </w:t>
-      </w:r>
-      <w:r>
-        <w:rPr>
-          <w:b/>
-          <w:bCs/>
-        </w:rPr>
-        <w:t xml:space="preserve">just den filen</w:t>
-      </w:r>
-      <w:r>
-        <w:t xml:space="preserve">. Flera mappar separeras med </w:t>
-      </w:r>
-      <w:r>
-        <w:rPr>
-          <w:rFonts w:ascii="Consolas" w:cs="Consolas" w:eastAsia="Consolas" w:hAnsi="Consolas"/>
-          <w:sz w:val="20"/>
-          <w:szCs w:val="20"/>
-          <w:shd w:fill="F2F2F2" w:val="clear"/>
-        </w:rPr>
-        <w:t xml:space="preserve">;</w:t>
-      </w:r>
-      <w:r>
-        <w:t xml:space="preserve">.</w:t>
+        <w:rPr>
+          <w:rFonts w:ascii="Consolas" w:cs="Consolas" w:eastAsia="Consolas" w:hAnsi="Consolas"/>
+          <w:sz w:val="20"/>
+          <w:szCs w:val="20"/>
+          <w:shd w:fill="F2F2F2" w:val="clear"/>
+        </w:rPr>
+        <w:t xml:space="preserve">bild:</w:t>
+      </w:r>
+      <w:r>
+        <w:t xml:space="preserve"> (eller </w:t>
+      </w:r>
+      <w:r>
+        <w:rPr>
+          <w:rFonts w:ascii="Consolas" w:cs="Consolas" w:eastAsia="Consolas" w:hAnsi="Consolas"/>
+          <w:sz w:val="20"/>
+          <w:szCs w:val="20"/>
+          <w:shd w:fill="F2F2F2" w:val="clear"/>
+        </w:rPr>
+        <w:t xml:space="preserve">foto:</w:t>
+      </w:r>
+      <w:r>
+        <w:t xml:space="preserve">) anger en egen mapp för bilderna. Anges ingen bildmapp söks bilderna i filmmapparna. Kan upprepas.</w:t>
       </w:r>
     </w:p>
     <w:p>
@@ -470,7 +484,66 @@
         <w:spacing w:after="80"/>
       </w:pPr>
       <w:r>
-        <w:t xml:space="preserve">Mediafiler söks alltid rekursivt (inklusive undermappar), i ordningen: TV3-filens egen mapp, filens egna mediamappar, de gemensamma </w:t>
+        <w:t xml:space="preserve">Allt efter </w:t>
+      </w:r>
+      <w:r>
+        <w:rPr>
+          <w:rFonts w:ascii="Consolas" w:cs="Consolas" w:eastAsia="Consolas" w:hAnsi="Consolas"/>
+          <w:sz w:val="20"/>
+          <w:szCs w:val="20"/>
+          <w:shd w:fill="F2F2F2" w:val="clear"/>
+        </w:rPr>
+        <w:t xml:space="preserve">;</w:t>
+      </w:r>
+      <w:r>
+        <w:t xml:space="preserve"> på en TV3-rad är mappar för </w:t>
+      </w:r>
+      <w:r>
+        <w:rPr>
+          <w:b/>
+          <w:bCs/>
+        </w:rPr>
+        <w:t xml:space="preserve">just den filen</w:t>
+      </w:r>
+      <w:r>
+        <w:t xml:space="preserve">: utan prefix filmmappar, med </w:t>
+      </w:r>
+      <w:r>
+        <w:rPr>
+          <w:rFonts w:ascii="Consolas" w:cs="Consolas" w:eastAsia="Consolas" w:hAnsi="Consolas"/>
+          <w:sz w:val="20"/>
+          <w:szCs w:val="20"/>
+          <w:shd w:fill="F2F2F2" w:val="clear"/>
+        </w:rPr>
+        <w:t xml:space="preserve">bild:</w:t>
+      </w:r>
+      <w:r>
+        <w:t xml:space="preserve"> bildmappar. Flera mappar separeras med </w:t>
+      </w:r>
+      <w:r>
+        <w:rPr>
+          <w:rFonts w:ascii="Consolas" w:cs="Consolas" w:eastAsia="Consolas" w:hAnsi="Consolas"/>
+          <w:sz w:val="20"/>
+          <w:szCs w:val="20"/>
+          <w:shd w:fill="F2F2F2" w:val="clear"/>
+        </w:rPr>
+        <w:t xml:space="preserve">;</w:t>
+      </w:r>
+      <w:r>
+        <w:t xml:space="preserve">.</w:t>
+      </w:r>
+    </w:p>
+    <w:p>
+      <w:pPr>
+        <w:pStyle w:val="ListParagraph"/>
+        <w:numPr>
+          <w:ilvl w:val="0"/>
+          <w:numId w:val="3"/>
+        </w:numPr>
+        <w:spacing w:after="80"/>
+      </w:pPr>
+      <w:r>
+        <w:t xml:space="preserve">Filmer söks alltid rekursivt (inklusive undermappar), i ordningen: TV3-filens egen mapp, filens egna filmmappar, de gemensamma </w:t>
       </w:r>
       <w:r>
         <w:rPr>
@@ -494,7 +567,31 @@
         <w:t xml:space="preserve">--media</w:t>
       </w:r>
       <w:r>
-        <w:t xml:space="preserve"> från kommandoraden. Första träffen på filnamnet används.</w:t>
+        <w:t xml:space="preserve"> från kommandoraden. Bilder söks på samma sätt i bildmapparna (filens egna, sedan </w:t>
+      </w:r>
+      <w:r>
+        <w:rPr>
+          <w:rFonts w:ascii="Consolas" w:cs="Consolas" w:eastAsia="Consolas" w:hAnsi="Consolas"/>
+          <w:sz w:val="20"/>
+          <w:szCs w:val="20"/>
+          <w:shd w:fill="F2F2F2" w:val="clear"/>
+        </w:rPr>
+        <w:t xml:space="preserve">bild:</w:t>
+      </w:r>
+      <w:r>
+        <w:t xml:space="preserve">, sedan </w:t>
+      </w:r>
+      <w:r>
+        <w:rPr>
+          <w:rFonts w:ascii="Consolas" w:cs="Consolas" w:eastAsia="Consolas" w:hAnsi="Consolas"/>
+          <w:sz w:val="20"/>
+          <w:szCs w:val="20"/>
+          <w:shd w:fill="F2F2F2" w:val="clear"/>
+        </w:rPr>
+        <w:t xml:space="preserve">--bilder</w:t>
+      </w:r>
+      <w:r>
+        <w:t xml:space="preserve">, sist TV3-filens egen mapp) om några angetts, annars i filmmapparna. Första träffen på filnamnet används.</w:t>
       </w:r>
     </w:p>
     <w:p>
@@ -6016,6 +6113,18 @@
         <w:t xml:space="preserve">media:</w:t>
       </w:r>
       <w:r>
+        <w:t xml:space="preserve">, </w:t>
+      </w:r>
+      <w:r>
+        <w:rPr>
+          <w:rFonts w:ascii="Consolas" w:cs="Consolas" w:eastAsia="Consolas" w:hAnsi="Consolas"/>
+          <w:sz w:val="20"/>
+          <w:szCs w:val="20"/>
+          <w:shd w:fill="F2F2F2" w:val="clear"/>
+        </w:rPr>
+        <w:t xml:space="preserve">bild:</w:t>
+      </w:r>
+      <w:r>
         <w:t xml:space="preserve"> eller </w:t>
       </w:r>
       <w:r>
@@ -6038,6 +6147,18 @@
           <w:shd w:fill="F2F2F2" w:val="clear"/>
         </w:rPr>
         <w:t xml:space="preserve">--media</w:t>
+      </w:r>
+      <w:r>
+        <w:t xml:space="preserve"> och </w:t>
+      </w:r>
+      <w:r>
+        <w:rPr>
+          <w:rFonts w:ascii="Consolas" w:cs="Consolas" w:eastAsia="Consolas" w:hAnsi="Consolas"/>
+          <w:sz w:val="20"/>
+          <w:szCs w:val="20"/>
+          <w:shd w:fill="F2F2F2" w:val="clear"/>
+        </w:rPr>
+        <w:t xml:space="preserve">--bilder</w:t>
       </w:r>
       <w:r>
         <w:t xml:space="preserve">. Terminalen visar hur många filmer och bilder som hittades. Om filmerna ligger på en annan disk eller server: lägg till mappen i listfilen och kör om. Länkarna är absoluta sökvägar, så Excel-filen måste öppnas på en dator som når samma mapp (samma nätverksenhet/enhetsbokstav).</w:t>

</xml_diff>

<commit_message>
Rätta buggar från kodgranskningen
- tabell() kraschade på tom flik (Kodstatistik utan skador)
- diagram 4 delade med noll för material utan inspekterad längd
- Sammanfattning: fetstil och diagramrad räknas fram i stället för hårdkodade radnummer
- fel.txt tas bort vid felfri omkörning
- inaktuella PDF-rapporter (annan klass/littera) rensas före skrivning
- fran_brunn faller tillbaka på Riktning när utgångsbrunnen är felstavad
- litterafil: rubrikrad matchas på nyckelord, varning om fel/ratt saknas
- Per fil/Material visar konstruktionsindex utan drift
- TV3-filer med samma namn i olika mappar skiljs åt med mappnamn
- mediaindex sorterar os.walk för deterministisk första träff
- död kod i rita_profil och las_text borttagen

Co-Authored-By: Claude Fable 5.1 <noreply@anthropic.com>
Claude-Session: https://claude.ai/code/session_011fdqX3JEZje1LF9LqpaqR8
</commit_message>
<xml_diff>
--- a/Anvandarhandledning tv3_analys.docx
+++ b/Anvandarhandledning tv3_analys.docx
@@ -1317,19 +1317,7 @@
               <w:spacing w:after="0"/>
             </w:pPr>
             <w:r>
-              <w:t xml:space="preserve">Hoppar över PDF-rapporter som redan finns i utdatamappen och skriver bara de som saknas. Länkarna i Excel pekar ändå på dem. Använd vid omkörningar när bara Excel eller kartunderlaget ska uppdateras; kör utan flaggan (eller töm mappen </w:t>
-            </w:r>
-            <w:r>
-              <w:rPr>
-                <w:rFonts w:ascii="Consolas" w:cs="Consolas" w:eastAsia="Consolas" w:hAnsi="Consolas"/>
-                <w:sz w:val="20"/>
-                <w:szCs w:val="20"/>
-                <w:shd w:fill="F2F2F2" w:val="clear"/>
-              </w:rPr>
-              <w:t xml:space="preserve">rapporter</w:t>
-            </w:r>
-            <w:r>
-              <w:t xml:space="preserve">) när rapportlayouten ändrats.</w:t>
+              <w:t xml:space="preserve">Hoppar över PDF-rapporter som redan finns i utdatamappen och skriver bara de som saknas. Länkarna i Excel pekar ändå på dem. Använd vid omkörningar när bara Excel eller kartunderlaget ska uppdateras; Rapporter vars sträcka bytt klass eller littera sedan sist tas alltid bort och skrivs om. Kör utan flaggan när rapportlayouten ändrats.</w:t>
             </w:r>
           </w:p>
         </w:tc>
@@ -2914,7 +2902,7 @@
               <w:spacing w:after="0"/>
             </w:pPr>
             <w:r>
-              <w:t xml:space="preserve">Nyckeltal per TV3-fil: projekt, område, period, sträckor, längd, index, klassfördelning och avbrutna inspektioner. Praktiskt när flera uppdrag analyseras samtidigt.</w:t>
+              <w:t xml:space="preserve">Nyckeltal per TV3-fil: projekt, område, period, sträckor, längd, konstruktionsindex, klassfördelning och avbrutna inspektioner. Praktiskt när flera uppdrag analyseras samtidigt.</w:t>
             </w:r>
           </w:p>
         </w:tc>
@@ -2968,7 +2956,7 @@
               <w:spacing w:after="0"/>
             </w:pPr>
             <w:r>
-              <w:t xml:space="preserve">Sträckor, längd, index och andel klass A+B per material och ledningstyp. Relinade (infodrade) sträckor redovisas som ett eget material "Relinad" med ursprungsmaterialet i egen kolumn, så att de inte räknas in i betong- eller plaststatistiken. Samma indelning används i diagrammet Prioritetsklass per material.</w:t>
+              <w:t xml:space="preserve">Sträckor, längd, konstruktionsindex och andel klass A+B per material och ledningstyp. Relinade (infodrade) sträckor redovisas som ett eget material "Relinad" med ursprungsmaterialet i egen kolumn, så att de inte räknas in i betong- eller plaststatistiken. Samma indelning används i diagrammet Prioritetsklass per material.</w:t>
             </w:r>
           </w:p>
         </w:tc>

</xml_diff>

<commit_message>
Markprofil: ArcMap-verktyg, höjdanpassning mot GIS och täckning
Nytt verktyg Markprofil (arcmap/markprofil.py + tv3_verktyg.pyt) tar ut
markhöjden längs varje bedömd sträcka ur ett punktlager och vattengången i
båda brunnarna ur ledningslagret, och skriver markprofil.json. Bedömda-lagret
får fältet NR för kopplingen.

tv3_analys.py läser filen (markprofil: i listfilen eller --markprofil), hänger
upp filmens profil på GIS-vattengången (RH2000 ur filen / förskjuten /
förskjuten och lutningskorrigerad / okänt nollplan), räknar täckning (mark
minus hjässa) med flaggor för liten täckning och ledning över mark, och ritar
markytan i protokollets profildiagram. Nya kolumner i Excel, fält i
kartunderlaget och rad i PDF. KONFIG: HOJD_SAMMA_M, HOJD_FALL_TOL_M,
TACKNING_MIN_M. Beräkningar cachas per sträcka. Utan markprofil oförändrat.

Co-Authored-By: Claude Fable 5.1 <noreply@anthropic.com>
Claude-Session: https://claude.ai/code/session_011fdqX3JEZje1LF9LqpaqR8
</commit_message>
<xml_diff>
--- a/Anvandarhandledning tv3_analys.docx
+++ b/Anvandarhandledning tv3_analys.docx
@@ -318,6 +318,21 @@
     </w:p>
     <w:p>
       <w:pPr>
+        <w:shd w:fill="F2F2F2" w:val="clear"/>
+        <w:spacing w:after="0"/>
+        <w:ind w:left="280"/>
+      </w:pPr>
+      <w:r>
+        <w:rPr>
+          <w:rFonts w:ascii="Consolas" w:cs="Consolas" w:eastAsia="Consolas" w:hAnsi="Consolas"/>
+          <w:sz w:val="19"/>
+          <w:szCs w:val="19"/>
+        </w:rPr>
+        <w:t xml:space="preserve">markprofil: Karta\markprofil.json           # från ArcMap-verktyget Markprofil, se 7.5</w:t>
+      </w:r>
+    </w:p>
+    <w:p>
+      <w:pPr>
         <w:spacing w:after="120"/>
       </w:pPr>
     </w:p>
@@ -438,6 +453,52 @@
       </w:r>
       <w:r>
         <w:t xml:space="preserve"> TV3-filer i listan. Kan upprepas.</w:t>
+      </w:r>
+    </w:p>
+    <w:p>
+      <w:pPr>
+        <w:pStyle w:val="ListParagraph"/>
+        <w:numPr>
+          <w:ilvl w:val="0"/>
+          <w:numId w:val="3"/>
+        </w:numPr>
+        <w:spacing w:after="80"/>
+      </w:pPr>
+      <w:r>
+        <w:rPr>
+          <w:rFonts w:ascii="Consolas" w:cs="Consolas" w:eastAsia="Consolas" w:hAnsi="Consolas"/>
+          <w:sz w:val="20"/>
+          <w:szCs w:val="20"/>
+          <w:shd w:fill="F2F2F2" w:val="clear"/>
+        </w:rPr>
+        <w:t xml:space="preserve">markprofil:</w:t>
+      </w:r>
+      <w:r>
+        <w:t xml:space="preserve"> anger en </w:t>
+      </w:r>
+      <w:r>
+        <w:rPr>
+          <w:rFonts w:ascii="Consolas" w:cs="Consolas" w:eastAsia="Consolas" w:hAnsi="Consolas"/>
+          <w:sz w:val="20"/>
+          <w:szCs w:val="20"/>
+          <w:shd w:fill="F2F2F2" w:val="clear"/>
+        </w:rPr>
+        <w:t xml:space="preserve">markprofil.json</w:t>
+      </w:r>
+      <w:r>
+        <w:t xml:space="preserve"> från ArcMap-verktyget Markprofil (avsnitt 7.5). Samma sak som </w:t>
+      </w:r>
+      <w:r>
+        <w:rPr>
+          <w:rFonts w:ascii="Consolas" w:cs="Consolas" w:eastAsia="Consolas" w:hAnsi="Consolas"/>
+          <w:sz w:val="20"/>
+          <w:szCs w:val="20"/>
+          <w:shd w:fill="F2F2F2" w:val="clear"/>
+        </w:rPr>
+        <w:t xml:space="preserve">--markprofil</w:t>
+      </w:r>
+      <w:r>
+        <w:t xml:space="preserve"> på kommandoraden.</w:t>
       </w:r>
     </w:p>
     <w:p>
@@ -2744,7 +2805,7 @@
               <w:spacing w:after="0"/>
             </w:pPr>
             <w:r>
-              <w:t xml:space="preserve">En rad per sträcka, rankad efter prioritetsklass och index. Använd autofiltret för att filtrera på klass, material, ledningstyp, område eller fil. Kolumnen Skador (kod+grad) visar t.ex. 9×YTS4, 1×SPR3. Kolumnerna Avbruten inspektion, Inspekterad flera ggr och Relinad ger extra kontext. Ur inklinometerprofilen beräknas Svackdjup i cm (största stående vattendjup i en svacka), Svackdjup/diameter, Svacklängd, Bakfall längd (meter med lutning mot flödesriktningen) och Lutning; Profil osäker markerar sträckor där inklinometerns fall avviker kraftigt från brunnshöjderna och profilen därför inte bör användas. Antal anslutningar räknar registrerade anslutningar (AS/AG) på sträckan. Kolumnerna Manuell bedömning och Kommentar är tomma och avsedda för den egna genomgången av sträckorna. Kolumnen Rapport öppnar sträckans PDF-rapport (länken är relativ, så Excel-filen och mappen rapporter måste ligga kvar bredvid varandra). Kolumnen Videofil är en klickbar länk som öppnar filmen (se avsnitt 7 om länken inte fungerar).</w:t>
+              <w:t xml:space="preserve">En rad per sträcka, rankad efter prioritetsklass och index. Använd autofiltret för att filtrera på klass, material, ledningstyp, område eller fil. Kolumnen Skador (kod+grad) visar t.ex. 9×YTS4, 1×SPR3. Kolumnerna Avbruten inspektion, Inspekterad flera ggr och Relinad ger extra kontext. Ur inklinometerprofilen beräknas Svackdjup i cm (största stående vattendjup i en svacka), Svackdjup/diameter, Svacklängd, Bakfall längd (meter med lutning mot flödesriktningen) och Lutning; Profil osäker markerar sträckor där inklinometerns fall avviker kraftigt från brunnshöjderna och profilen därför inte bör användas. Antal anslutningar räknar registrerade anslutningar (AS/AG) på sträckan. Med markprofil från ArcMap (7.5) fylls även Höjdanpassning, Täckning min/max och Höjdflagga i. Kolumnerna Manuell bedömning och Kommentar är tomma och avsedda för den egna genomgången av sträckorna. Kolumnen Rapport öppnar sträckans PDF-rapport (länken är relativ, så Excel-filen och mappen rapporter måste ligga kvar bredvid varandra). Kolumnen Videofil är en klickbar länk som öppnar filmen (se avsnitt 7 om länken inte fungerar).</w:t>
             </w:r>
           </w:p>
         </w:tc>
@@ -4138,7 +4199,7 @@
                 <w:szCs w:val="20"/>
                 <w:shd w:fill="F2F2F2" w:val="clear"/>
               </w:rPr>
-              <w:t xml:space="preserve">KODER</w:t>
+              <w:t xml:space="preserve">HOJD_SAMMA_M</w:t>
             </w:r>
           </w:p>
         </w:tc>
@@ -4164,7 +4225,7 @@
               <w:spacing w:after="0"/>
             </w:pPr>
             <w:r>
-              <w:t xml:space="preserve">Skadekoder med klartext och typ (K = konstruktion, D = drift, I = information).</w:t>
+              <w:t xml:space="preserve">Avviker filens brunnshöjder mindre än så (m) från GIS-vattengången är filen i samma höjdsystem.</w:t>
             </w:r>
           </w:p>
         </w:tc>
@@ -4190,7 +4251,7 @@
               <w:spacing w:after="0"/>
             </w:pPr>
             <w:r>
-              <w:t xml:space="preserve">P93</w:t>
+              <w:t xml:space="preserve">0,3</w:t>
             </w:r>
           </w:p>
         </w:tc>
@@ -4205,6 +4266,259 @@
               <w:bottom w:val="single" w:color="BFBFBF" w:sz="4"/>
               <w:right w:val="single" w:color="BFBFBF" w:sz="4"/>
             </w:tcBorders>
+            <w:tcMar>
+              <w:top w:type="dxa" w:w="60"/>
+              <w:left w:type="dxa" w:w="100"/>
+              <w:bottom w:type="dxa" w:w="60"/>
+              <w:right w:type="dxa" w:w="100"/>
+            </w:tcMar>
+          </w:tcPr>
+          <w:p>
+            <w:pPr>
+              <w:spacing w:after="0"/>
+            </w:pPr>
+            <w:r>
+              <w:rPr>
+                <w:rFonts w:ascii="Consolas" w:cs="Consolas" w:eastAsia="Consolas" w:hAnsi="Consolas"/>
+                <w:sz w:val="20"/>
+                <w:szCs w:val="20"/>
+                <w:shd w:fill="F2F2F2" w:val="clear"/>
+              </w:rPr>
+              <w:t xml:space="preserve">HOJD_FALL_TOL_M</w:t>
+            </w:r>
+          </w:p>
+        </w:tc>
+        <w:tc>
+          <w:tcPr>
+            <w:tcW w:type="dxa" w:w="5000"/>
+            <w:tcBorders>
+              <w:top w:val="single" w:color="BFBFBF" w:sz="4"/>
+              <w:left w:val="single" w:color="BFBFBF" w:sz="4"/>
+              <w:bottom w:val="single" w:color="BFBFBF" w:sz="4"/>
+              <w:right w:val="single" w:color="BFBFBF" w:sz="4"/>
+            </w:tcBorders>
+            <w:tcMar>
+              <w:top w:type="dxa" w:w="60"/>
+              <w:left w:type="dxa" w:w="100"/>
+              <w:bottom w:type="dxa" w:w="60"/>
+              <w:right w:type="dxa" w:w="100"/>
+            </w:tcMar>
+          </w:tcPr>
+          <w:p>
+            <w:pPr>
+              <w:spacing w:after="0"/>
+            </w:pPr>
+            <w:r>
+              <w:t xml:space="preserve">Skiljer sig fallet mellan brunnarna mer än så (m) från GIS korrigeras lutningen, annars bara en förskjutning.</w:t>
+            </w:r>
+          </w:p>
+        </w:tc>
+        <w:tc>
+          <w:tcPr>
+            <w:tcW w:type="dxa" w:w="1760"/>
+            <w:tcBorders>
+              <w:top w:val="single" w:color="BFBFBF" w:sz="4"/>
+              <w:left w:val="single" w:color="BFBFBF" w:sz="4"/>
+              <w:bottom w:val="single" w:color="BFBFBF" w:sz="4"/>
+              <w:right w:val="single" w:color="BFBFBF" w:sz="4"/>
+            </w:tcBorders>
+            <w:tcMar>
+              <w:top w:type="dxa" w:w="60"/>
+              <w:left w:type="dxa" w:w="100"/>
+              <w:bottom w:type="dxa" w:w="60"/>
+              <w:right w:type="dxa" w:w="100"/>
+            </w:tcMar>
+          </w:tcPr>
+          <w:p>
+            <w:pPr>
+              <w:spacing w:after="0"/>
+            </w:pPr>
+            <w:r>
+              <w:t xml:space="preserve">0,3</w:t>
+            </w:r>
+          </w:p>
+        </w:tc>
+      </w:tr>
+      <w:tr>
+        <w:tc>
+          <w:tcPr>
+            <w:tcW w:type="dxa" w:w="2600"/>
+            <w:tcBorders>
+              <w:top w:val="single" w:color="BFBFBF" w:sz="4"/>
+              <w:left w:val="single" w:color="BFBFBF" w:sz="4"/>
+              <w:bottom w:val="single" w:color="BFBFBF" w:sz="4"/>
+              <w:right w:val="single" w:color="BFBFBF" w:sz="4"/>
+            </w:tcBorders>
+            <w:shd w:fill="F7F9FC" w:val="clear"/>
+            <w:tcMar>
+              <w:top w:type="dxa" w:w="60"/>
+              <w:left w:type="dxa" w:w="100"/>
+              <w:bottom w:type="dxa" w:w="60"/>
+              <w:right w:type="dxa" w:w="100"/>
+            </w:tcMar>
+          </w:tcPr>
+          <w:p>
+            <w:pPr>
+              <w:spacing w:after="0"/>
+            </w:pPr>
+            <w:r>
+              <w:rPr>
+                <w:rFonts w:ascii="Consolas" w:cs="Consolas" w:eastAsia="Consolas" w:hAnsi="Consolas"/>
+                <w:sz w:val="20"/>
+                <w:szCs w:val="20"/>
+                <w:shd w:fill="F2F2F2" w:val="clear"/>
+              </w:rPr>
+              <w:t xml:space="preserve">TACKNING_MIN_M</w:t>
+            </w:r>
+          </w:p>
+        </w:tc>
+        <w:tc>
+          <w:tcPr>
+            <w:tcW w:type="dxa" w:w="5000"/>
+            <w:tcBorders>
+              <w:top w:val="single" w:color="BFBFBF" w:sz="4"/>
+              <w:left w:val="single" w:color="BFBFBF" w:sz="4"/>
+              <w:bottom w:val="single" w:color="BFBFBF" w:sz="4"/>
+              <w:right w:val="single" w:color="BFBFBF" w:sz="4"/>
+            </w:tcBorders>
+            <w:shd w:fill="F7F9FC" w:val="clear"/>
+            <w:tcMar>
+              <w:top w:type="dxa" w:w="60"/>
+              <w:left w:type="dxa" w:w="100"/>
+              <w:bottom w:type="dxa" w:w="60"/>
+              <w:right w:type="dxa" w:w="100"/>
+            </w:tcMar>
+          </w:tcPr>
+          <w:p>
+            <w:pPr>
+              <w:spacing w:after="0"/>
+            </w:pPr>
+            <w:r>
+              <w:t xml:space="preserve">Mindre täckning (mark minus hjässa) än så (m) flaggas.</w:t>
+            </w:r>
+          </w:p>
+        </w:tc>
+        <w:tc>
+          <w:tcPr>
+            <w:tcW w:type="dxa" w:w="1760"/>
+            <w:tcBorders>
+              <w:top w:val="single" w:color="BFBFBF" w:sz="4"/>
+              <w:left w:val="single" w:color="BFBFBF" w:sz="4"/>
+              <w:bottom w:val="single" w:color="BFBFBF" w:sz="4"/>
+              <w:right w:val="single" w:color="BFBFBF" w:sz="4"/>
+            </w:tcBorders>
+            <w:shd w:fill="F7F9FC" w:val="clear"/>
+            <w:tcMar>
+              <w:top w:type="dxa" w:w="60"/>
+              <w:left w:type="dxa" w:w="100"/>
+              <w:bottom w:type="dxa" w:w="60"/>
+              <w:right w:type="dxa" w:w="100"/>
+            </w:tcMar>
+          </w:tcPr>
+          <w:p>
+            <w:pPr>
+              <w:spacing w:after="0"/>
+            </w:pPr>
+            <w:r>
+              <w:t xml:space="preserve">1,0</w:t>
+            </w:r>
+          </w:p>
+        </w:tc>
+      </w:tr>
+      <w:tr>
+        <w:tc>
+          <w:tcPr>
+            <w:tcW w:type="dxa" w:w="2600"/>
+            <w:tcBorders>
+              <w:top w:val="single" w:color="BFBFBF" w:sz="4"/>
+              <w:left w:val="single" w:color="BFBFBF" w:sz="4"/>
+              <w:bottom w:val="single" w:color="BFBFBF" w:sz="4"/>
+              <w:right w:val="single" w:color="BFBFBF" w:sz="4"/>
+            </w:tcBorders>
+            <w:tcMar>
+              <w:top w:type="dxa" w:w="60"/>
+              <w:left w:type="dxa" w:w="100"/>
+              <w:bottom w:type="dxa" w:w="60"/>
+              <w:right w:type="dxa" w:w="100"/>
+            </w:tcMar>
+          </w:tcPr>
+          <w:p>
+            <w:pPr>
+              <w:spacing w:after="0"/>
+            </w:pPr>
+            <w:r>
+              <w:rPr>
+                <w:rFonts w:ascii="Consolas" w:cs="Consolas" w:eastAsia="Consolas" w:hAnsi="Consolas"/>
+                <w:sz w:val="20"/>
+                <w:szCs w:val="20"/>
+                <w:shd w:fill="F2F2F2" w:val="clear"/>
+              </w:rPr>
+              <w:t xml:space="preserve">KODER</w:t>
+            </w:r>
+          </w:p>
+        </w:tc>
+        <w:tc>
+          <w:tcPr>
+            <w:tcW w:type="dxa" w:w="5000"/>
+            <w:tcBorders>
+              <w:top w:val="single" w:color="BFBFBF" w:sz="4"/>
+              <w:left w:val="single" w:color="BFBFBF" w:sz="4"/>
+              <w:bottom w:val="single" w:color="BFBFBF" w:sz="4"/>
+              <w:right w:val="single" w:color="BFBFBF" w:sz="4"/>
+            </w:tcBorders>
+            <w:tcMar>
+              <w:top w:type="dxa" w:w="60"/>
+              <w:left w:type="dxa" w:w="100"/>
+              <w:bottom w:type="dxa" w:w="60"/>
+              <w:right w:type="dxa" w:w="100"/>
+            </w:tcMar>
+          </w:tcPr>
+          <w:p>
+            <w:pPr>
+              <w:spacing w:after="0"/>
+            </w:pPr>
+            <w:r>
+              <w:t xml:space="preserve">Skadekoder med klartext och typ (K = konstruktion, D = drift, I = information).</w:t>
+            </w:r>
+          </w:p>
+        </w:tc>
+        <w:tc>
+          <w:tcPr>
+            <w:tcW w:type="dxa" w:w="1760"/>
+            <w:tcBorders>
+              <w:top w:val="single" w:color="BFBFBF" w:sz="4"/>
+              <w:left w:val="single" w:color="BFBFBF" w:sz="4"/>
+              <w:bottom w:val="single" w:color="BFBFBF" w:sz="4"/>
+              <w:right w:val="single" w:color="BFBFBF" w:sz="4"/>
+            </w:tcBorders>
+            <w:tcMar>
+              <w:top w:type="dxa" w:w="60"/>
+              <w:left w:type="dxa" w:w="100"/>
+              <w:bottom w:type="dxa" w:w="60"/>
+              <w:right w:type="dxa" w:w="100"/>
+            </w:tcMar>
+          </w:tcPr>
+          <w:p>
+            <w:pPr>
+              <w:spacing w:after="0"/>
+            </w:pPr>
+            <w:r>
+              <w:t xml:space="preserve">P93</w:t>
+            </w:r>
+          </w:p>
+        </w:tc>
+      </w:tr>
+      <w:tr>
+        <w:tc>
+          <w:tcPr>
+            <w:tcW w:type="dxa" w:w="2600"/>
+            <w:tcBorders>
+              <w:top w:val="single" w:color="BFBFBF" w:sz="4"/>
+              <w:left w:val="single" w:color="BFBFBF" w:sz="4"/>
+              <w:bottom w:val="single" w:color="BFBFBF" w:sz="4"/>
+              <w:right w:val="single" w:color="BFBFBF" w:sz="4"/>
+            </w:tcBorders>
+            <w:shd w:fill="F7F9FC" w:val="clear"/>
             <w:tcMar>
               <w:top w:type="dxa" w:w="60"/>
               <w:left w:type="dxa" w:w="100"/>
@@ -4248,6 +4562,7 @@
               <w:bottom w:val="single" w:color="BFBFBF" w:sz="4"/>
               <w:right w:val="single" w:color="BFBFBF" w:sz="4"/>
             </w:tcBorders>
+            <w:shd w:fill="F7F9FC" w:val="clear"/>
             <w:tcMar>
               <w:top w:type="dxa" w:w="60"/>
               <w:left w:type="dxa" w:w="100"/>
@@ -4273,6 +4588,7 @@
               <w:bottom w:val="single" w:color="BFBFBF" w:sz="4"/>
               <w:right w:val="single" w:color="BFBFBF" w:sz="4"/>
             </w:tcBorders>
+            <w:shd w:fill="F7F9FC" w:val="clear"/>
             <w:tcMar>
               <w:top w:type="dxa" w:w="60"/>
               <w:left w:type="dxa" w:w="100"/>
@@ -5911,7 +6227,254 @@
         <w:pStyle w:val="Heading2"/>
       </w:pPr>
       <w:r>
-        <w:t xml:space="preserve">7.5 Sträckor som inte hittas</w:t>
+        <w:t xml:space="preserve">7.5 Markprofil och täckning</w:t>
+      </w:r>
+    </w:p>
+    <w:p>
+      <w:pPr>
+        <w:spacing w:after="120"/>
+      </w:pPr>
+      <w:r>
+        <w:t xml:space="preserve">Verktyget </w:t>
+      </w:r>
+      <w:r>
+        <w:rPr>
+          <w:b/>
+          <w:bCs/>
+        </w:rPr>
+        <w:t xml:space="preserve">Markprofil</w:t>
+      </w:r>
+      <w:r>
+        <w:t xml:space="preserve"> tar ut markhöjden längs varje sträcka och vattengångsnivåerna i båda brunnarna, så att protokollen kan visa ledningsprofilen mot markytan och täckningen kan beräknas. Kör det efter Skapa ledningslager:</w:t>
+      </w:r>
+    </w:p>
+    <w:p>
+      <w:pPr>
+        <w:pStyle w:val="ListParagraph"/>
+        <w:numPr>
+          <w:ilvl w:val="0"/>
+          <w:numId w:val="3"/>
+        </w:numPr>
+        <w:spacing w:after="80"/>
+      </w:pPr>
+      <w:r>
+        <w:rPr>
+          <w:b/>
+          <w:bCs/>
+        </w:rPr>
+        <w:t xml:space="preserve">Ledningslager från Skapa ledningslager</w:t>
+      </w:r>
+      <w:r>
+        <w:t xml:space="preserve"> – lagret med de bedömda sträckorna (behöver fältet NR, som finns i lager skapade från och med september 2026).</w:t>
+      </w:r>
+    </w:p>
+    <w:p>
+      <w:pPr>
+        <w:pStyle w:val="ListParagraph"/>
+        <w:numPr>
+          <w:ilvl w:val="0"/>
+          <w:numId w:val="3"/>
+        </w:numPr>
+        <w:spacing w:after="80"/>
+      </w:pPr>
+      <w:r>
+        <w:rPr>
+          <w:b/>
+          <w:bCs/>
+        </w:rPr>
+        <w:t xml:space="preserve">Ursprungligt ledningslager</w:t>
+      </w:r>
+      <w:r>
+        <w:t xml:space="preserve"> och de två fälten med </w:t>
+      </w:r>
+      <w:r>
+        <w:rPr>
+          <w:b/>
+          <w:bCs/>
+        </w:rPr>
+        <w:t xml:space="preserve">vattengång vid ledningens start- och slutpunkt</w:t>
+      </w:r>
+      <w:r>
+        <w:t xml:space="preserve">. Fälten föreslås automatiskt om de heter VG_UPP/VG_NED eller liknande.</w:t>
+      </w:r>
+    </w:p>
+    <w:p>
+      <w:pPr>
+        <w:pStyle w:val="ListParagraph"/>
+        <w:numPr>
+          <w:ilvl w:val="0"/>
+          <w:numId w:val="3"/>
+        </w:numPr>
+        <w:spacing w:after="80"/>
+      </w:pPr>
+      <w:r>
+        <w:rPr>
+          <w:b/>
+          <w:bCs/>
+        </w:rPr>
+        <w:t xml:space="preserve">Markhöjder</w:t>
+      </w:r>
+      <w:r>
+        <w:t xml:space="preserve"> – ett punktlager. Höjden tas ur punkternas Z, eller ur ett fält om du anger ett. Markhöjden i varje punkt längs ledningen är ett avståndsviktat medel av de närmaste mätpunkterna inom sökradien (5 m); saknas punkter inom radien finns ingen markhöjd där.</w:t>
+      </w:r>
+    </w:p>
+    <w:p>
+      <w:pPr>
+        <w:pStyle w:val="ListParagraph"/>
+        <w:numPr>
+          <w:ilvl w:val="0"/>
+          <w:numId w:val="3"/>
+        </w:numPr>
+        <w:spacing w:after="80"/>
+      </w:pPr>
+      <w:r>
+        <w:rPr>
+          <w:b/>
+          <w:bCs/>
+        </w:rPr>
+        <w:t xml:space="preserve">Utdata</w:t>
+      </w:r>
+      <w:r>
+        <w:t xml:space="preserve"> – </w:t>
+      </w:r>
+      <w:r>
+        <w:rPr>
+          <w:rFonts w:ascii="Consolas" w:cs="Consolas" w:eastAsia="Consolas" w:hAnsi="Consolas"/>
+          <w:sz w:val="20"/>
+          <w:szCs w:val="20"/>
+          <w:shd w:fill="F2F2F2" w:val="clear"/>
+        </w:rPr>
+        <w:t xml:space="preserve">markprofil.json</w:t>
+      </w:r>
+      <w:r>
+        <w:t xml:space="preserve">, som du anger i listfilen (</w:t>
+      </w:r>
+      <w:r>
+        <w:rPr>
+          <w:rFonts w:ascii="Consolas" w:cs="Consolas" w:eastAsia="Consolas" w:hAnsi="Consolas"/>
+          <w:sz w:val="20"/>
+          <w:szCs w:val="20"/>
+          <w:shd w:fill="F2F2F2" w:val="clear"/>
+        </w:rPr>
+        <w:t xml:space="preserve">markprofil:</w:t>
+      </w:r>
+      <w:r>
+        <w:t xml:space="preserve">) eller med </w:t>
+      </w:r>
+      <w:r>
+        <w:rPr>
+          <w:rFonts w:ascii="Consolas" w:cs="Consolas" w:eastAsia="Consolas" w:hAnsi="Consolas"/>
+          <w:sz w:val="20"/>
+          <w:szCs w:val="20"/>
+          <w:shd w:fill="F2F2F2" w:val="clear"/>
+        </w:rPr>
+        <w:t xml:space="preserve">--markprofil</w:t>
+      </w:r>
+      <w:r>
+        <w:t xml:space="preserve"> nästa gång du kör </w:t>
+      </w:r>
+      <w:r>
+        <w:rPr>
+          <w:rFonts w:ascii="Consolas" w:cs="Consolas" w:eastAsia="Consolas" w:hAnsi="Consolas"/>
+          <w:sz w:val="20"/>
+          <w:szCs w:val="20"/>
+          <w:shd w:fill="F2F2F2" w:val="clear"/>
+        </w:rPr>
+        <w:t xml:space="preserve">tv3_analys.py</w:t>
+      </w:r>
+      <w:r>
+        <w:t xml:space="preserve">.</w:t>
+      </w:r>
+    </w:p>
+    <w:p>
+      <w:pPr>
+        <w:spacing w:after="120"/>
+      </w:pPr>
+    </w:p>
+    <w:p>
+      <w:pPr>
+        <w:spacing w:after="120"/>
+      </w:pPr>
+      <w:r>
+        <w:rPr>
+          <w:b/>
+          <w:bCs/>
+        </w:rPr>
+        <w:t xml:space="preserve">Höjdläge.</w:t>
+      </w:r>
+      <w:r>
+        <w:t xml:space="preserve"> Filmernas höjder ligger inte alltid i RH2000; ofta sätter entreprenören 0 i start- eller mottagningsbrunnen och bara höjdskillnaden mellan brunnarna är pålitlig. Skriptet jämför därför filens brunnshöjder med GIS-vattengången och hänger upp profilen på GIS: avviker de mindre än 0,3 m används filen som den är (</w:t>
+      </w:r>
+      <w:r>
+        <w:rPr>
+          <w:b/>
+          <w:bCs/>
+        </w:rPr>
+        <w:t xml:space="preserve">RH2000 ur filen</w:t>
+      </w:r>
+      <w:r>
+        <w:t xml:space="preserve">); stämmer fallet mellan brunnarna men inte nivån förskjuts hela profilen (</w:t>
+      </w:r>
+      <w:r>
+        <w:rPr>
+          <w:b/>
+          <w:bCs/>
+        </w:rPr>
+        <w:t xml:space="preserve">förskjuten till GIS</w:t>
+      </w:r>
+      <w:r>
+        <w:t xml:space="preserve">); stämmer inte heller fallet korrigeras lutningen linjärt så att båda brunnarna hamnar på GIS-nivån (</w:t>
+      </w:r>
+      <w:r>
+        <w:rPr>
+          <w:b/>
+          <w:bCs/>
+        </w:rPr>
+        <w:t xml:space="preserve">förskjuten och lutningskorrigerad</w:t>
+      </w:r>
+      <w:r>
+        <w:t xml:space="preserve"> – det är också botemedlet mot inklinometerdrift). Saknas vattengång i GIS ritas ledningen med filens höjder och märks </w:t>
+      </w:r>
+      <w:r>
+        <w:rPr>
+          <w:b/>
+          <w:bCs/>
+        </w:rPr>
+        <w:t xml:space="preserve">okänt nollplan</w:t>
+      </w:r>
+      <w:r>
+        <w:t xml:space="preserve">; täckning beräknas inte. Höjdläget står i fliken Prioritering, i protokollets infotabell och i profildiagrammet.</w:t>
+      </w:r>
+    </w:p>
+    <w:p>
+      <w:pPr>
+        <w:spacing w:after="120"/>
+      </w:pPr>
+      <w:r>
+        <w:rPr>
+          <w:b/>
+          <w:bCs/>
+        </w:rPr>
+        <w:t xml:space="preserve">Täckning</w:t>
+      </w:r>
+      <w:r>
+        <w:t xml:space="preserve"> = markhöjd minus hjässa (vattengång + innerdiameter) i varje markpunkt. Minsta och största täckning finns i Prioritering och kartunderlaget. Sträckor med täckning under 1,0 m får flaggan *Liten täckning*, och sträckor där ledningen hamnar över marken flaggan *Ledning över mark – höjdfel*, vilket nästan alltid betyder fel höjd i någon källa. Är inklinometerprofilen osäker räknas täckningen mot rät linje mellan brunnshöjderna i stället för mot profilen.</w:t>
+      </w:r>
+    </w:p>
+    <w:p>
+      <w:pPr>
+        <w:spacing w:after="120"/>
+      </w:pPr>
+      <w:r>
+        <w:t xml:space="preserve">I protokollet ritas markytan brun i samma diagram och skala som ledningsprofilen, med den minsta täckningen utsatt.</w:t>
+      </w:r>
+    </w:p>
+    <w:p>
+      <w:pPr>
+        <w:pStyle w:val="Heading2"/>
+      </w:pPr>
+      <w:r>
+        <w:t xml:space="preserve">7.6 Sträckor som inte hittas</w:t>
       </w:r>
     </w:p>
     <w:p>

</xml_diff>

<commit_message>
Markprofil: hantera avbrutna inspektioner
Vid avbruten inspektion (KAM/HINDE eller filmad längd < 85 % av kartlängden)
är filens sluthöjd bara höjden där kameran stannade. Profilen hängs då upp
enbart i kamerans startbrunn utan lutningskorrigering, positionerna skalas
inte, markytan och täckningen tas bara med för den filmade delen och
profilbilden skriver 'avbrott' i stället för brunnsnamnet. Ny KONFIG-parameter
OFULLSTANDIG_ANDEL. Dokument och CLAUDE.md uppdaterade.

Co-Authored-By: Claude Fable 5.1 <noreply@anthropic.com>
Claude-Session: https://claude.ai/code/session_011fdqX3JEZje1LF9LqpaqR8
</commit_message>
<xml_diff>
--- a/Anvandarhandledning tv3_analys.docx
+++ b/Anvandarhandledning tv3_analys.docx
@@ -4453,7 +4453,7 @@
                 <w:szCs w:val="20"/>
                 <w:shd w:fill="F2F2F2" w:val="clear"/>
               </w:rPr>
-              <w:t xml:space="preserve">KODER</w:t>
+              <w:t xml:space="preserve">OFULLSTANDIG_ANDEL</w:t>
             </w:r>
           </w:p>
         </w:tc>
@@ -4478,7 +4478,7 @@
               <w:spacing w:after="0"/>
             </w:pPr>
             <w:r>
-              <w:t xml:space="preserve">Skadekoder med klartext och typ (K = konstruktion, D = drift, I = information).</w:t>
+              <w:t xml:space="preserve">Är filmad längd kortare än så gånger kartlängden nådde kameran inte fram; profilen hängs då bara upp i startbrunnen.</w:t>
             </w:r>
           </w:p>
         </w:tc>
@@ -4503,7 +4503,7 @@
               <w:spacing w:after="0"/>
             </w:pPr>
             <w:r>
-              <w:t xml:space="preserve">P93</w:t>
+              <w:t xml:space="preserve">0,85</w:t>
             </w:r>
           </w:p>
         </w:tc>
@@ -4519,6 +4519,91 @@
               <w:right w:val="single" w:color="BFBFBF" w:sz="4"/>
             </w:tcBorders>
             <w:shd w:fill="F7F9FC" w:val="clear"/>
+            <w:tcMar>
+              <w:top w:type="dxa" w:w="60"/>
+              <w:left w:type="dxa" w:w="100"/>
+              <w:bottom w:type="dxa" w:w="60"/>
+              <w:right w:type="dxa" w:w="100"/>
+            </w:tcMar>
+          </w:tcPr>
+          <w:p>
+            <w:pPr>
+              <w:spacing w:after="0"/>
+            </w:pPr>
+            <w:r>
+              <w:rPr>
+                <w:rFonts w:ascii="Consolas" w:cs="Consolas" w:eastAsia="Consolas" w:hAnsi="Consolas"/>
+                <w:sz w:val="20"/>
+                <w:szCs w:val="20"/>
+                <w:shd w:fill="F2F2F2" w:val="clear"/>
+              </w:rPr>
+              <w:t xml:space="preserve">KODER</w:t>
+            </w:r>
+          </w:p>
+        </w:tc>
+        <w:tc>
+          <w:tcPr>
+            <w:tcW w:type="dxa" w:w="5000"/>
+            <w:tcBorders>
+              <w:top w:val="single" w:color="BFBFBF" w:sz="4"/>
+              <w:left w:val="single" w:color="BFBFBF" w:sz="4"/>
+              <w:bottom w:val="single" w:color="BFBFBF" w:sz="4"/>
+              <w:right w:val="single" w:color="BFBFBF" w:sz="4"/>
+            </w:tcBorders>
+            <w:shd w:fill="F7F9FC" w:val="clear"/>
+            <w:tcMar>
+              <w:top w:type="dxa" w:w="60"/>
+              <w:left w:type="dxa" w:w="100"/>
+              <w:bottom w:type="dxa" w:w="60"/>
+              <w:right w:type="dxa" w:w="100"/>
+            </w:tcMar>
+          </w:tcPr>
+          <w:p>
+            <w:pPr>
+              <w:spacing w:after="0"/>
+            </w:pPr>
+            <w:r>
+              <w:t xml:space="preserve">Skadekoder med klartext och typ (K = konstruktion, D = drift, I = information).</w:t>
+            </w:r>
+          </w:p>
+        </w:tc>
+        <w:tc>
+          <w:tcPr>
+            <w:tcW w:type="dxa" w:w="1760"/>
+            <w:tcBorders>
+              <w:top w:val="single" w:color="BFBFBF" w:sz="4"/>
+              <w:left w:val="single" w:color="BFBFBF" w:sz="4"/>
+              <w:bottom w:val="single" w:color="BFBFBF" w:sz="4"/>
+              <w:right w:val="single" w:color="BFBFBF" w:sz="4"/>
+            </w:tcBorders>
+            <w:shd w:fill="F7F9FC" w:val="clear"/>
+            <w:tcMar>
+              <w:top w:type="dxa" w:w="60"/>
+              <w:left w:type="dxa" w:w="100"/>
+              <w:bottom w:type="dxa" w:w="60"/>
+              <w:right w:type="dxa" w:w="100"/>
+            </w:tcMar>
+          </w:tcPr>
+          <w:p>
+            <w:pPr>
+              <w:spacing w:after="0"/>
+            </w:pPr>
+            <w:r>
+              <w:t xml:space="preserve">P93</w:t>
+            </w:r>
+          </w:p>
+        </w:tc>
+      </w:tr>
+      <w:tr>
+        <w:tc>
+          <w:tcPr>
+            <w:tcW w:type="dxa" w:w="2600"/>
+            <w:tcBorders>
+              <w:top w:val="single" w:color="BFBFBF" w:sz="4"/>
+              <w:left w:val="single" w:color="BFBFBF" w:sz="4"/>
+              <w:bottom w:val="single" w:color="BFBFBF" w:sz="4"/>
+              <w:right w:val="single" w:color="BFBFBF" w:sz="4"/>
+            </w:tcBorders>
             <w:tcMar>
               <w:top w:type="dxa" w:w="60"/>
               <w:left w:type="dxa" w:w="100"/>
@@ -4562,7 +4647,6 @@
               <w:bottom w:val="single" w:color="BFBFBF" w:sz="4"/>
               <w:right w:val="single" w:color="BFBFBF" w:sz="4"/>
             </w:tcBorders>
-            <w:shd w:fill="F7F9FC" w:val="clear"/>
             <w:tcMar>
               <w:top w:type="dxa" w:w="60"/>
               <w:left w:type="dxa" w:w="100"/>
@@ -4588,7 +4672,6 @@
               <w:bottom w:val="single" w:color="BFBFBF" w:sz="4"/>
               <w:right w:val="single" w:color="BFBFBF" w:sz="4"/>
             </w:tcBorders>
-            <w:shd w:fill="F7F9FC" w:val="clear"/>
             <w:tcMar>
               <w:top w:type="dxa" w:w="60"/>
               <w:left w:type="dxa" w:w="100"/>
@@ -6459,6 +6542,21 @@
       </w:r>
       <w:r>
         <w:t xml:space="preserve"> = markhöjd minus hjässa (vattengång + innerdiameter) i varje markpunkt. Minsta och största täckning finns i Prioritering och kartunderlaget. Sträckor med täckning under 1,0 m får flaggan *Liten täckning*, och sträckor där ledningen hamnar över marken flaggan *Ledning över mark – höjdfel*, vilket nästan alltid betyder fel höjd i någon källa. Är inklinometerprofilen osäker räknas täckningen mot rät linje mellan brunnshöjderna i stället för mot profilen.</w:t>
+      </w:r>
+    </w:p>
+    <w:p>
+      <w:pPr>
+        <w:spacing w:after="120"/>
+      </w:pPr>
+      <w:r>
+        <w:rPr>
+          <w:b/>
+          <w:bCs/>
+        </w:rPr>
+        <w:t xml:space="preserve">Avbrutna inspektioner.</w:t>
+      </w:r>
+      <w:r>
+        <w:t xml:space="preserve"> När kameran inte nådde fram (koden KAM/HINDE, eller filmad längd under 85 % av ledningens längd i kartan) är filens sluthöjd bara höjden där kameran stannade, inte slutbrunnens. Profilen hängs då upp enbart i den brunn kameran startade i (status *förskjuten till GIS vid &lt;brunn&gt; (avbruten inspektion)*), utan lutningskorrigering, och positionerna skalas inte: en meter i filmen är en meter i kartan räknat från startbrunnen. Markytan och täckningen tas bara med för den filmade delen, och i diagrammet står 'avbrott' i stället för brunnsnamnet i den ände som inte nåddes. Är samma sträcka filmad från båda håll efter ett avbrott hängs varje film upp i sin egen startbrunn.</w:t>
       </w:r>
     </w:p>
     <w:p>

</xml_diff>

<commit_message>
Dölj mindre viktiga Excel-kolumner som standard (DOLDA_KOLUMNER)
Kolumner per flik som döljs styrs av DOLDA_KOLUMNER i KONFIG. Dolda
kolumner grupperas (outline) så att de fälls ut med plustecknet ovanför
rubrikraden. Prioritering visar klass, index, brunnar, skador, anslutningar,
avbrott, relinad, svacka, höjdflagga, manuell bedömning och länkarna;
Observationer döljer fil, typ, löpande, klocka till och vattennivå.

Co-Authored-By: Claude Fable 5.1 <noreply@anthropic.com>
Claude-Session: https://claude.ai/code/session_011fdqX3JEZje1LF9LqpaqR8
</commit_message>
<xml_diff>
--- a/Anvandarhandledning tv3_analys.docx
+++ b/Anvandarhandledning tv3_analys.docx
@@ -2805,7 +2805,19 @@
               <w:spacing w:after="0"/>
             </w:pPr>
             <w:r>
-              <w:t xml:space="preserve">En rad per sträcka, rankad efter prioritetsklass och index. Använd autofiltret för att filtrera på klass, material, ledningstyp, område eller fil. Kolumnen Skador (kod+grad) visar t.ex. 9×YTS4, 1×SPR3. Kolumnerna Avbruten inspektion, Inspekterad flera ggr och Relinad ger extra kontext. Ur inklinometerprofilen beräknas Svackdjup i cm (största stående vattendjup i en svacka), Svackdjup/diameter, Svacklängd, Bakfall längd (meter med lutning mot flödesriktningen) och Lutning; Profil osäker markerar sträckor där inklinometerns fall avviker kraftigt från brunnshöjderna och profilen därför inte bör användas. Antal anslutningar räknar registrerade anslutningar (AS/AG) på sträckan. Med markprofil från ArcMap (7.5) fylls även Höjdanpassning, Täckning min/max och Höjdflagga i. Kolumnerna Manuell bedömning och Kommentar är tomma och avsedda för den egna genomgången av sträckorna. Kolumnen Rapport öppnar sträckans PDF-rapport (länken är relativ, så Excel-filen och mappen rapporter måste ligga kvar bredvid varandra). Kolumnen Videofil är en klickbar länk som öppnar filmen (se avsnitt 7 om länken inte fungerar).</w:t>
+              <w:t xml:space="preserve">En rad per sträcka, rankad efter prioritetsklass och index. Använd autofiltret för att filtrera på klass, material, ledningstyp, område eller fil. Kolumnen Skador (kod+grad) visar t.ex. 9×YTS4, 1×SPR3. Kolumnerna Avbruten inspektion, Inspekterad flera ggr och Relinad ger extra kontext. Ur inklinometerprofilen beräknas Svackdjup i cm (största stående vattendjup i en svacka), Svackdjup/diameter, Svacklängd, Bakfall längd (meter med lutning mot flödesriktningen) och Lutning; Profil osäker markerar sträckor där inklinometerns fall avviker kraftigt från brunnshöjderna och profilen därför inte bör användas. Antal anslutningar räknar registrerade anslutningar (AS/AG) på sträckan. Med markprofil från ArcMap (7.5) fylls även Höjdanpassning, Täckning min/max och Höjdflagga i. Bara de viktigaste kolumnerna visas från början; övriga (fil, område, datum, drift- och totalindex, profilmått m.m.) är dolda i grupper och fälls ut med plustecknet ovanför kolumnrubrikerna eller knappen 2 uppe till vänster. Vilka som döljs styrs av </w:t>
+            </w:r>
+            <w:r>
+              <w:rPr>
+                <w:rFonts w:ascii="Consolas" w:cs="Consolas" w:eastAsia="Consolas" w:hAnsi="Consolas"/>
+                <w:sz w:val="20"/>
+                <w:szCs w:val="20"/>
+                <w:shd w:fill="F2F2F2" w:val="clear"/>
+              </w:rPr>
+              <w:t xml:space="preserve">DOLDA_KOLUMNER</w:t>
+            </w:r>
+            <w:r>
+              <w:t xml:space="preserve"> i KONFIG. Kolumnerna Manuell bedömning och Kommentar är tomma och avsedda för den egna genomgången av sträckorna. Kolumnen Rapport öppnar sträckans PDF-rapport (länken är relativ, så Excel-filen och mappen rapporter måste ligga kvar bredvid varandra). Kolumnen Videofil är en klickbar länk som öppnar filmen (se avsnitt 7 om länken inte fungerar).</w:t>
             </w:r>
           </w:p>
         </w:tc>
@@ -4453,7 +4465,7 @@
                 <w:szCs w:val="20"/>
                 <w:shd w:fill="F2F2F2" w:val="clear"/>
               </w:rPr>
-              <w:t xml:space="preserve">OFULLSTANDIG_ANDEL</w:t>
+              <w:t xml:space="preserve">DOLDA_KOLUMNER</w:t>
             </w:r>
           </w:p>
         </w:tc>
@@ -4478,7 +4490,7 @@
               <w:spacing w:after="0"/>
             </w:pPr>
             <w:r>
-              <w:t xml:space="preserve">Är filmad längd kortare än så gånger kartlängden nådde kameran inte fram; profilen hängs då bara upp i startbrunnen.</w:t>
+              <w:t xml:space="preserve">Kolumner per flik som döljs som standard i Excel (grupperade, fälls ut med plustecknet ovanför rubrikraden). Tom lista = visa allt.</w:t>
             </w:r>
           </w:p>
         </w:tc>
@@ -4503,7 +4515,7 @@
               <w:spacing w:after="0"/>
             </w:pPr>
             <w:r>
-              <w:t xml:space="preserve">0,85</w:t>
+              <w:t xml:space="preserve">se skriptet</w:t>
             </w:r>
           </w:p>
         </w:tc>
@@ -4519,6 +4531,91 @@
               <w:right w:val="single" w:color="BFBFBF" w:sz="4"/>
             </w:tcBorders>
             <w:shd w:fill="F7F9FC" w:val="clear"/>
+            <w:tcMar>
+              <w:top w:type="dxa" w:w="60"/>
+              <w:left w:type="dxa" w:w="100"/>
+              <w:bottom w:type="dxa" w:w="60"/>
+              <w:right w:type="dxa" w:w="100"/>
+            </w:tcMar>
+          </w:tcPr>
+          <w:p>
+            <w:pPr>
+              <w:spacing w:after="0"/>
+            </w:pPr>
+            <w:r>
+              <w:rPr>
+                <w:rFonts w:ascii="Consolas" w:cs="Consolas" w:eastAsia="Consolas" w:hAnsi="Consolas"/>
+                <w:sz w:val="20"/>
+                <w:szCs w:val="20"/>
+                <w:shd w:fill="F2F2F2" w:val="clear"/>
+              </w:rPr>
+              <w:t xml:space="preserve">OFULLSTANDIG_ANDEL</w:t>
+            </w:r>
+          </w:p>
+        </w:tc>
+        <w:tc>
+          <w:tcPr>
+            <w:tcW w:type="dxa" w:w="5000"/>
+            <w:tcBorders>
+              <w:top w:val="single" w:color="BFBFBF" w:sz="4"/>
+              <w:left w:val="single" w:color="BFBFBF" w:sz="4"/>
+              <w:bottom w:val="single" w:color="BFBFBF" w:sz="4"/>
+              <w:right w:val="single" w:color="BFBFBF" w:sz="4"/>
+            </w:tcBorders>
+            <w:shd w:fill="F7F9FC" w:val="clear"/>
+            <w:tcMar>
+              <w:top w:type="dxa" w:w="60"/>
+              <w:left w:type="dxa" w:w="100"/>
+              <w:bottom w:type="dxa" w:w="60"/>
+              <w:right w:type="dxa" w:w="100"/>
+            </w:tcMar>
+          </w:tcPr>
+          <w:p>
+            <w:pPr>
+              <w:spacing w:after="0"/>
+            </w:pPr>
+            <w:r>
+              <w:t xml:space="preserve">Är filmad längd kortare än så gånger kartlängden nådde kameran inte fram; profilen hängs då bara upp i startbrunnen.</w:t>
+            </w:r>
+          </w:p>
+        </w:tc>
+        <w:tc>
+          <w:tcPr>
+            <w:tcW w:type="dxa" w:w="1760"/>
+            <w:tcBorders>
+              <w:top w:val="single" w:color="BFBFBF" w:sz="4"/>
+              <w:left w:val="single" w:color="BFBFBF" w:sz="4"/>
+              <w:bottom w:val="single" w:color="BFBFBF" w:sz="4"/>
+              <w:right w:val="single" w:color="BFBFBF" w:sz="4"/>
+            </w:tcBorders>
+            <w:shd w:fill="F7F9FC" w:val="clear"/>
+            <w:tcMar>
+              <w:top w:type="dxa" w:w="60"/>
+              <w:left w:type="dxa" w:w="100"/>
+              <w:bottom w:type="dxa" w:w="60"/>
+              <w:right w:type="dxa" w:w="100"/>
+            </w:tcMar>
+          </w:tcPr>
+          <w:p>
+            <w:pPr>
+              <w:spacing w:after="0"/>
+            </w:pPr>
+            <w:r>
+              <w:t xml:space="preserve">0,85</w:t>
+            </w:r>
+          </w:p>
+        </w:tc>
+      </w:tr>
+      <w:tr>
+        <w:tc>
+          <w:tcPr>
+            <w:tcW w:type="dxa" w:w="2600"/>
+            <w:tcBorders>
+              <w:top w:val="single" w:color="BFBFBF" w:sz="4"/>
+              <w:left w:val="single" w:color="BFBFBF" w:sz="4"/>
+              <w:bottom w:val="single" w:color="BFBFBF" w:sz="4"/>
+              <w:right w:val="single" w:color="BFBFBF" w:sz="4"/>
+            </w:tcBorders>
             <w:tcMar>
               <w:top w:type="dxa" w:w="60"/>
               <w:left w:type="dxa" w:w="100"/>
@@ -4550,7 +4647,6 @@
               <w:bottom w:val="single" w:color="BFBFBF" w:sz="4"/>
               <w:right w:val="single" w:color="BFBFBF" w:sz="4"/>
             </w:tcBorders>
-            <w:shd w:fill="F7F9FC" w:val="clear"/>
             <w:tcMar>
               <w:top w:type="dxa" w:w="60"/>
               <w:left w:type="dxa" w:w="100"/>
@@ -4576,7 +4672,6 @@
               <w:bottom w:val="single" w:color="BFBFBF" w:sz="4"/>
               <w:right w:val="single" w:color="BFBFBF" w:sz="4"/>
             </w:tcBorders>
-            <w:shd w:fill="F7F9FC" w:val="clear"/>
             <w:tcMar>
               <w:top w:type="dxa" w:w="60"/>
               <w:left w:type="dxa" w:w="100"/>
@@ -4604,6 +4699,7 @@
               <w:bottom w:val="single" w:color="BFBFBF" w:sz="4"/>
               <w:right w:val="single" w:color="BFBFBF" w:sz="4"/>
             </w:tcBorders>
+            <w:shd w:fill="F7F9FC" w:val="clear"/>
             <w:tcMar>
               <w:top w:type="dxa" w:w="60"/>
               <w:left w:type="dxa" w:w="100"/>
@@ -4647,6 +4743,7 @@
               <w:bottom w:val="single" w:color="BFBFBF" w:sz="4"/>
               <w:right w:val="single" w:color="BFBFBF" w:sz="4"/>
             </w:tcBorders>
+            <w:shd w:fill="F7F9FC" w:val="clear"/>
             <w:tcMar>
               <w:top w:type="dxa" w:w="60"/>
               <w:left w:type="dxa" w:w="100"/>
@@ -4672,6 +4769,7 @@
               <w:bottom w:val="single" w:color="BFBFBF" w:sz="4"/>
               <w:right w:val="single" w:color="BFBFBF" w:sz="4"/>
             </w:tcBorders>
+            <w:shd w:fill="F7F9FC" w:val="clear"/>
             <w:tcMar>
               <w:top w:type="dxa" w:w="60"/>
               <w:left w:type="dxa" w:w="100"/>

</xml_diff>

<commit_message>
Excel: enhetsrad under rubrikerna, kortare rubriker, fler dolda kolumner
Rubriker med enhet inom parentes delas i rubrikrad och enhetsrad (m, mm,
p/100 m, cm, ‰, %). Data börjar på rad 3, autofilter från rad 2. 'Antal
anslutningar' heter 'Anslutningar'. Nr, Driftåtgärd och Höjdflagga döljs
som standard. Handledning och CLAUDE.md uppdaterade.

Co-Authored-By: Claude Fable 5.1 <noreply@anthropic.com>
Claude-Session: https://claude.ai/code/session_011fdqX3JEZje1LF9LqpaqR8
</commit_message>
<xml_diff>
--- a/Anvandarhandledning tv3_analys.docx
+++ b/Anvandarhandledning tv3_analys.docx
@@ -2805,7 +2805,7 @@
               <w:spacing w:after="0"/>
             </w:pPr>
             <w:r>
-              <w:t xml:space="preserve">En rad per sträcka, rankad efter prioritetsklass och index. Använd autofiltret för att filtrera på klass, material, ledningstyp, område eller fil. Kolumnen Skador (kod+grad) visar t.ex. 9×YTS4, 1×SPR3. Kolumnerna Avbruten inspektion, Inspekterad flera ggr och Relinad ger extra kontext. Ur inklinometerprofilen beräknas Svackdjup i cm (största stående vattendjup i en svacka), Svackdjup/diameter, Svacklängd, Bakfall längd (meter med lutning mot flödesriktningen) och Lutning; Profil osäker markerar sträckor där inklinometerns fall avviker kraftigt från brunnshöjderna och profilen därför inte bör användas. Antal anslutningar räknar registrerade anslutningar (AS/AG) på sträckan. Med markprofil från ArcMap (7.5) fylls även Höjdanpassning, Täckning min/max och Höjdflagga i. Bara de viktigaste kolumnerna visas från början; övriga (fil, område, datum, drift- och totalindex, profilmått m.m.) är dolda i grupper och fälls ut med plustecknet ovanför kolumnrubrikerna eller knappen 2 uppe till vänster. Vilka som döljs styrs av </w:t>
+              <w:t xml:space="preserve">En rad per sträcka, rankad efter prioritetsklass och index. Använd autofiltret för att filtrera på klass, material, ledningstyp, område eller fil. Kolumnen Skador (kod+grad) visar t.ex. 9×YTS4, 1×SPR3. Kolumnerna Avbruten inspektion, Inspekterad flera ggr och Relinad ger extra kontext. Ur inklinometerprofilen beräknas Svackdjup i cm (största stående vattendjup i en svacka), Svackdjup/diameter, Svacklängd, Bakfall längd (meter med lutning mot flödesriktningen) och Lutning; Profil osäker markerar sträckor där inklinometerns fall avviker kraftigt från brunnshöjderna och profilen därför inte bör användas. Anslutningar räknar registrerade anslutningar (AS/AG) på sträckan. Enheten (m, mm, p/100 m …) står på en egen rad under rubrikerna, så rubrikerna är korta. Med markprofil från ArcMap (7.5) fylls även Höjdanpassning, Täckning min/max och Höjdflagga i. Bara de viktigaste kolumnerna visas från början; övriga (fil, nr, område, datum, drift- och totalindex, driftåtgärd, profilmått, höjdflagga m.m.) är dolda i grupper och fälls ut med plustecknet ovanför kolumnrubrikerna eller knappen 2 uppe till vänster. Vilka som döljs styrs av </w:t>
             </w:r>
             <w:r>
               <w:rPr>
@@ -4490,7 +4490,7 @@
               <w:spacing w:after="0"/>
             </w:pPr>
             <w:r>
-              <w:t xml:space="preserve">Kolumner per flik som döljs som standard i Excel (grupperade, fälls ut med plustecknet ovanför rubrikraden). Tom lista = visa allt.</w:t>
+              <w:t xml:space="preserve">Kolumner per flik som döljs som standard i Excel (grupperade, fälls ut med plustecknet ovanför rubrikraden). Rubrik utan enhet. Tom lista = visa allt.</w:t>
             </w:r>
           </w:p>
         </w:tc>

</xml_diff>

<commit_message>
ArcMap: verktyg för projektering av nya VA-stråk med profilritning
Skapa projekteringslager lägger upp ritlager (<prefix>_Ledning med
vattengång uppströms/nedströms, typ, dimension, material; <prefix>_Brunn
med locknivå och bottennivå) i en filgeodatabas. Projekteringsprofil ordnar
de ritade ledningarna till stråk, samplar markhöjd ur punktlager eller
raster och ritar profilen (markyta, vattengång och hjässa per ledning, fall,
brunnar, nivåtabell) i exakt skala till PDF/PNG med matplotlib i ArcMap,
samt CSV och JSON. Alla ledningstyper i samma diagram, inga minimikrav.
Handledning 7.6 och CLAUDE.md.

Co-Authored-By: Claude Fable 5.1 <noreply@anthropic.com>
Claude-Session: https://claude.ai/code/session_011fdqX3JEZje1LF9LqpaqR8
</commit_message>
<xml_diff>
--- a/Anvandarhandledning tv3_analys.docx
+++ b/Anvandarhandledning tv3_analys.docx
@@ -6670,7 +6670,95 @@
         <w:pStyle w:val="Heading2"/>
       </w:pPr>
       <w:r>
-        <w:t xml:space="preserve">7.6 Sträckor som inte hittas</w:t>
+        <w:t xml:space="preserve">7.6 Projektering av nya stråk</w:t>
+      </w:r>
+    </w:p>
+    <w:p>
+      <w:pPr>
+        <w:spacing w:after="120"/>
+      </w:pPr>
+      <w:r>
+        <w:t xml:space="preserve">Två verktyg för att rita ett nytt VA-stråk och få ut profilen. De har inget med TV-inspektionerna att göra men ligger i samma verktygslåda.</w:t>
+      </w:r>
+    </w:p>
+    <w:p>
+      <w:pPr>
+        <w:spacing w:after="120"/>
+      </w:pPr>
+      <w:r>
+        <w:rPr>
+          <w:b/>
+          <w:bCs/>
+        </w:rPr>
+        <w:t xml:space="preserve">Skapa projekteringslager</w:t>
+      </w:r>
+      <w:r>
+        <w:t xml:space="preserve"> lägger upp två tomma lager i en filgeodatabas (skapas om den inte finns) och lägger dem i kartan: </w:t>
+      </w:r>
+      <w:r>
+        <w:rPr>
+          <w:rFonts w:ascii="Consolas" w:cs="Consolas" w:eastAsia="Consolas" w:hAnsi="Consolas"/>
+          <w:sz w:val="20"/>
+          <w:szCs w:val="20"/>
+          <w:shd w:fill="F2F2F2" w:val="clear"/>
+        </w:rPr>
+        <w:t xml:space="preserve">&lt;prefix&gt;_Ledning</w:t>
+      </w:r>
+      <w:r>
+        <w:t xml:space="preserve"> (linje) med fälten Ledningsnr, Typ (S/D/V/K/T), Dimension (mm), Material, Vattengång uppströms, Vattengång nedströms och Kommentar, samt </w:t>
+      </w:r>
+      <w:r>
+        <w:rPr>
+          <w:rFonts w:ascii="Consolas" w:cs="Consolas" w:eastAsia="Consolas" w:hAnsi="Consolas"/>
+          <w:sz w:val="20"/>
+          <w:szCs w:val="20"/>
+          <w:shd w:fill="F2F2F2" w:val="clear"/>
+        </w:rPr>
+        <w:t xml:space="preserve">&lt;prefix&gt;_Brunn</w:t>
+      </w:r>
+      <w:r>
+        <w:t xml:space="preserve"> (punkt) med Brunnsnr, Typ, Locknivå, Bottennivå, Diameter och Kommentar. Rita sedan med ArcMaps vanliga redigering: </w:t>
+      </w:r>
+      <w:r>
+        <w:rPr>
+          <w:b/>
+          <w:bCs/>
+        </w:rPr>
+        <w:t xml:space="preserve">rita varje ledning i flödesriktningen</w:t>
+      </w:r>
+      <w:r>
+        <w:t xml:space="preserve">, från uppströms brunn till nedströms, och fyll i vattengången i start- och slutpunkten. Ledningar i samma schakt (spill, dag, vatten) ritas som separata linjer.</w:t>
+      </w:r>
+    </w:p>
+    <w:p>
+      <w:pPr>
+        <w:spacing w:after="120"/>
+      </w:pPr>
+      <w:r>
+        <w:rPr>
+          <w:b/>
+          <w:bCs/>
+        </w:rPr>
+        <w:t xml:space="preserve">Projekteringsprofil</w:t>
+      </w:r>
+      <w:r>
+        <w:t xml:space="preserve"> ritar profilen längs stråket till PDF och PNG på A3 liggande i exakt skala, och skriver en CSV och en JSON med samma uppgifter. Är några ledningar valda i kartan ritas bara de. I diagrammet: markytan ur markhöjdslagret (punkter med Z eller fält, eller ett raster), vattengång och hjässa per ledning med typ, nummer, dimension, material, längd och fall i promille, brunnarna från botten till lock med locknivå och bottennivå, och en nivåtabell under diagrammet med sektion, vattengång per ledningstyp och markhöjd. Ordningen längs stråket räknas ut av hur ledningarna hänger ihop (ändpunkt mot brunn eller mot annan lednings ände inom toleransen); den längsta kedjan blir referensaxel och övriga ledningstyper projiceras på den. Ledningar som inte följer axeln blir egna stråk med egna filer. Inga minimikrav kontrolleras – bakfall, ledning över mark och saknad vattengång noteras i CSV-kolumnen anmärkning.</w:t>
+      </w:r>
+    </w:p>
+    <w:p>
+      <w:pPr>
+        <w:spacing w:after="120"/>
+      </w:pPr>
+      <w:r>
+        <w:t xml:space="preserve">Verktyget ritar med matplotlib i ArcMaps egen Python. Saknas matplotlib skrivs bara CSV och JSON.</w:t>
+      </w:r>
+    </w:p>
+    <w:p>
+      <w:pPr>
+        <w:pStyle w:val="Heading2"/>
+      </w:pPr>
+      <w:r>
+        <w:t xml:space="preserve">7.7 Sträckor som inte hittas</w:t>
       </w:r>
     </w:p>
     <w:p>

</xml_diff>

<commit_message>
Markprofil: rättningar efter granskning av höjdanpassningen
- Vid avbrott tas filens brunnshöjd ur inklinometerns ändpunkt, inte
  PROFILADM (kopierade/opålitliga värden)
- Klass E (ingen längd) får inget höjdläge
- Bara en GIS-nivå ger förskjutning mot den brunnen
- Profilsidan ritas även utan inklinometer när GIS-vattengång och mark finns
- diameter_m tolkar '225/300' och 'Ø 400'
- Brunnsparsmatchning föredrar samma TV3-fil
- Flagga när filmad längd är > 25 % längre än kartans
- Statustext med kartans höjdsystem ur markprofil.json

Co-Authored-By: Claude Fable 5.1 <noreply@anthropic.com>
Claude-Session: https://claude.ai/code/session_011fdqX3JEZje1LF9LqpaqR8
</commit_message>
<xml_diff>
--- a/Anvandarhandledning tv3_analys.docx
+++ b/Anvandarhandledning tv3_analys.docx
@@ -6614,7 +6614,7 @@
         <w:t xml:space="preserve">förskjuten och lutningskorrigerad</w:t>
       </w:r>
       <w:r>
-        <w:t xml:space="preserve"> – det är också botemedlet mot inklinometerdrift). Saknas vattengång i GIS ritas ledningen med filens höjder och märks </w:t>
+        <w:t xml:space="preserve"> – det är också botemedlet mot inklinometerdrift). Har bara en av brunnarna GIS-nivå förskjuts profilen mot den (*förskjuten till GIS vid &lt;brunn&gt;*). Saknas vattengång i GIS helt ritas ledningen med filens höjder och märks </w:t>
       </w:r>
       <w:r>
         <w:rPr>
@@ -6624,7 +6624,7 @@
         <w:t xml:space="preserve">okänt nollplan</w:t>
       </w:r>
       <w:r>
-        <w:t xml:space="preserve">; täckning beräknas inte. Höjdläget står i fliken Prioritering, i protokollets infotabell och i profildiagrammet.</w:t>
+        <w:t xml:space="preserve">; täckning beräknas inte. Saknar filen inklinometerprofil men GIS har vattengång ritas ledningen som rät linje mellan brunnarna, så att markytan och täckningen ändå kommer med. Är den filmade längden mer än 25 % längre än ledningen i kartan flaggas sträckan som trolig felkoppling. Höjdläget står i fliken Prioritering, i protokollets infotabell och i profildiagrammet.</w:t>
       </w:r>
     </w:p>
     <w:p>

</xml_diff>

<commit_message>
Svackor och bakfall som karta (steg 1)
kartunderlag.json får svackpos_m, svacka_andel och bakfall_segment
(sammanhängande bakfallssträckor ≥ 1 m med lutning). Skapa ledningslager
kan skriva två valfria lager: svackor (punkt) och bakfall (linje), med
positionerna utlagda längs kartlinjen från utgångsbrunnen, skalade med
kartlängd/filmlängd (ingen skalning vid avbruten inspektion). GeoJSON
även för de nya lagren. Handledning 7.8.

Co-Authored-By: Claude Fable 5.1 <noreply@anthropic.com>
Claude-Session: https://claude.ai/code/session_011fdqX3JEZje1LF9LqpaqR8
</commit_message>
<xml_diff>
--- a/Anvandarhandledning tv3_analys.docx
+++ b/Anvandarhandledning tv3_analys.docx
@@ -6791,6 +6791,310 @@
       </w:r>
       <w:r>
         <w:t xml:space="preserve"> tillåter. Beteckningar jämförs utan mellanslag, bindestreck och understreck, och utan hänsyn till versaler.</w:t>
+      </w:r>
+    </w:p>
+    <w:p>
+      <w:pPr>
+        <w:pStyle w:val="Heading2"/>
+      </w:pPr>
+      <w:r>
+        <w:t xml:space="preserve">7.8 Svackor och bakfall i kartan</w:t>
+      </w:r>
+    </w:p>
+    <w:p>
+      <w:pPr>
+        <w:spacing w:after="120"/>
+      </w:pPr>
+      <w:r>
+        <w:t xml:space="preserve">Under </w:t>
+      </w:r>
+      <w:r>
+        <w:rPr>
+          <w:b/>
+          <w:bCs/>
+        </w:rPr>
+        <w:t xml:space="preserve">Svackor och bakfall</w:t>
+      </w:r>
+      <w:r>
+        <w:t xml:space="preserve"> i Skapa ledningslager kan två valfria lager skrivas ur inklinometerprofilerna: </w:t>
+      </w:r>
+      <w:r>
+        <w:rPr>
+          <w:b/>
+          <w:bCs/>
+        </w:rPr>
+        <w:t xml:space="preserve">Svackor</w:t>
+      </w:r>
+      <w:r>
+        <w:t xml:space="preserve"> (punkter där det stående vattnet är djupast, fält </w:t>
+      </w:r>
+      <w:r>
+        <w:rPr>
+          <w:rFonts w:ascii="Consolas" w:cs="Consolas" w:eastAsia="Consolas" w:hAnsi="Consolas"/>
+          <w:sz w:val="20"/>
+          <w:szCs w:val="20"/>
+          <w:shd w:fill="F2F2F2" w:val="clear"/>
+        </w:rPr>
+        <w:t xml:space="preserve">SVACKA_CM</w:t>
+      </w:r>
+      <w:r>
+        <w:t xml:space="preserve">, </w:t>
+      </w:r>
+      <w:r>
+        <w:rPr>
+          <w:rFonts w:ascii="Consolas" w:cs="Consolas" w:eastAsia="Consolas" w:hAnsi="Consolas"/>
+          <w:sz w:val="20"/>
+          <w:szCs w:val="20"/>
+          <w:shd w:fill="F2F2F2" w:val="clear"/>
+        </w:rPr>
+        <w:t xml:space="preserve">SVACKLANGD</w:t>
+      </w:r>
+      <w:r>
+        <w:t xml:space="preserve">, </w:t>
+      </w:r>
+      <w:r>
+        <w:rPr>
+          <w:rFonts w:ascii="Consolas" w:cs="Consolas" w:eastAsia="Consolas" w:hAnsi="Consolas"/>
+          <w:sz w:val="20"/>
+          <w:szCs w:val="20"/>
+          <w:shd w:fill="F2F2F2" w:val="clear"/>
+        </w:rPr>
+        <w:t xml:space="preserve">ANDEL_DIAM</w:t>
+      </w:r>
+      <w:r>
+        <w:t xml:space="preserve"> = svackdjup/diameter, </w:t>
+      </w:r>
+      <w:r>
+        <w:rPr>
+          <w:rFonts w:ascii="Consolas" w:cs="Consolas" w:eastAsia="Consolas" w:hAnsi="Consolas"/>
+          <w:sz w:val="20"/>
+          <w:szCs w:val="20"/>
+          <w:shd w:fill="F2F2F2" w:val="clear"/>
+        </w:rPr>
+        <w:t xml:space="preserve">POS_M</w:t>
+      </w:r>
+      <w:r>
+        <w:t xml:space="preserve">, </w:t>
+      </w:r>
+      <w:r>
+        <w:rPr>
+          <w:rFonts w:ascii="Consolas" w:cs="Consolas" w:eastAsia="Consolas" w:hAnsi="Consolas"/>
+          <w:sz w:val="20"/>
+          <w:szCs w:val="20"/>
+          <w:shd w:fill="F2F2F2" w:val="clear"/>
+        </w:rPr>
+        <w:t xml:space="preserve">OSAKER</w:t>
+      </w:r>
+      <w:r>
+        <w:t xml:space="preserve"> och klass) och </w:t>
+      </w:r>
+      <w:r>
+        <w:rPr>
+          <w:b/>
+          <w:bCs/>
+        </w:rPr>
+        <w:t xml:space="preserve">Bakfall</w:t>
+      </w:r>
+      <w:r>
+        <w:t xml:space="preserve"> (linjer där ledningen lutar mot flödesriktningen, fält </w:t>
+      </w:r>
+      <w:r>
+        <w:rPr>
+          <w:rFonts w:ascii="Consolas" w:cs="Consolas" w:eastAsia="Consolas" w:hAnsi="Consolas"/>
+          <w:sz w:val="20"/>
+          <w:szCs w:val="20"/>
+          <w:shd w:fill="F2F2F2" w:val="clear"/>
+        </w:rPr>
+        <w:t xml:space="preserve">LANGD_M</w:t>
+      </w:r>
+      <w:r>
+        <w:t xml:space="preserve">, </w:t>
+      </w:r>
+      <w:r>
+        <w:rPr>
+          <w:rFonts w:ascii="Consolas" w:cs="Consolas" w:eastAsia="Consolas" w:hAnsi="Consolas"/>
+          <w:sz w:val="20"/>
+          <w:szCs w:val="20"/>
+          <w:shd w:fill="F2F2F2" w:val="clear"/>
+        </w:rPr>
+        <w:t xml:space="preserve">LUTNING</w:t>
+      </w:r>
+      <w:r>
+        <w:t xml:space="preserve"> i ‰, </w:t>
+      </w:r>
+      <w:r>
+        <w:rPr>
+          <w:rFonts w:ascii="Consolas" w:cs="Consolas" w:eastAsia="Consolas" w:hAnsi="Consolas"/>
+          <w:sz w:val="20"/>
+          <w:szCs w:val="20"/>
+          <w:shd w:fill="F2F2F2" w:val="clear"/>
+        </w:rPr>
+        <w:t xml:space="preserve">FRAN_M</w:t>
+      </w:r>
+      <w:r>
+        <w:t xml:space="preserve">/</w:t>
+      </w:r>
+      <w:r>
+        <w:rPr>
+          <w:rFonts w:ascii="Consolas" w:cs="Consolas" w:eastAsia="Consolas" w:hAnsi="Consolas"/>
+          <w:sz w:val="20"/>
+          <w:szCs w:val="20"/>
+          <w:shd w:fill="F2F2F2" w:val="clear"/>
+        </w:rPr>
+        <w:t xml:space="preserve">TILL_M</w:t>
+      </w:r>
+      <w:r>
+        <w:t xml:space="preserve">). Båda har </w:t>
+      </w:r>
+      <w:r>
+        <w:rPr>
+          <w:rFonts w:ascii="Consolas" w:cs="Consolas" w:eastAsia="Consolas" w:hAnsi="Consolas"/>
+          <w:sz w:val="20"/>
+          <w:szCs w:val="20"/>
+          <w:shd w:fill="F2F2F2" w:val="clear"/>
+        </w:rPr>
+        <w:t xml:space="preserve">RAPPORT</w:t>
+      </w:r>
+      <w:r>
+        <w:t xml:space="preserve"> för hyperlänk till protokollet. Svackor grundare än 2 cm (</w:t>
+      </w:r>
+      <w:r>
+        <w:rPr>
+          <w:rFonts w:ascii="Consolas" w:cs="Consolas" w:eastAsia="Consolas" w:hAnsi="Consolas"/>
+          <w:sz w:val="20"/>
+          <w:szCs w:val="20"/>
+          <w:shd w:fill="F2F2F2" w:val="clear"/>
+        </w:rPr>
+        <w:t xml:space="preserve">SVACKA_MIN_CM</w:t>
+      </w:r>
+      <w:r>
+        <w:t xml:space="preserve"> i skriptet) tas inte med, och bakfall redovisas som sammanhängande segment om minst 1 m (</w:t>
+      </w:r>
+      <w:r>
+        <w:rPr>
+          <w:rFonts w:ascii="Consolas" w:cs="Consolas" w:eastAsia="Consolas" w:hAnsi="Consolas"/>
+          <w:sz w:val="20"/>
+          <w:szCs w:val="20"/>
+          <w:shd w:fill="F2F2F2" w:val="clear"/>
+        </w:rPr>
+        <w:t xml:space="preserve">BAKFALL_SEGMENT_MIN_M</w:t>
+      </w:r>
+      <w:r>
+        <w:t xml:space="preserve"> i tv3_analys.py). Positionerna är kamerans och läggs ut längs kartlinjen från utgångsbrunnen, skalade med kartlängd/filmlängd; vid avbruten inspektion skalas inte. Sträckor med </w:t>
+      </w:r>
+      <w:r>
+        <w:rPr>
+          <w:rFonts w:ascii="Consolas" w:cs="Consolas" w:eastAsia="Consolas" w:hAnsi="Consolas"/>
+          <w:sz w:val="20"/>
+          <w:szCs w:val="20"/>
+          <w:shd w:fill="F2F2F2" w:val="clear"/>
+        </w:rPr>
+        <w:t xml:space="preserve">OSAKER = Ja</w:t>
+      </w:r>
+      <w:r>
+        <w:t xml:space="preserve"> (inklinometern avviker från brunnshöjderna) bör granskas mot protokollet innan de används. Är </w:t>
+      </w:r>
+      <w:r>
+        <w:rPr>
+          <w:b/>
+          <w:bCs/>
+        </w:rPr>
+        <w:t xml:space="preserve">GeoJSON för webb-GIS</w:t>
+      </w:r>
+      <w:r>
+        <w:t xml:space="preserve"> ifyllt skrivs lagren också som </w:t>
+      </w:r>
+      <w:r>
+        <w:rPr>
+          <w:rFonts w:ascii="Consolas" w:cs="Consolas" w:eastAsia="Consolas" w:hAnsi="Consolas"/>
+          <w:sz w:val="20"/>
+          <w:szCs w:val="20"/>
+          <w:shd w:fill="F2F2F2" w:val="clear"/>
+        </w:rPr>
+        <w:t xml:space="preserve">&lt;namn&gt;_svackor.geojson</w:t>
+      </w:r>
+      <w:r>
+        <w:t xml:space="preserve"> och </w:t>
+      </w:r>
+      <w:r>
+        <w:rPr>
+          <w:rFonts w:ascii="Consolas" w:cs="Consolas" w:eastAsia="Consolas" w:hAnsi="Consolas"/>
+          <w:sz w:val="20"/>
+          <w:szCs w:val="20"/>
+          <w:shd w:fill="F2F2F2" w:val="clear"/>
+        </w:rPr>
+        <w:t xml:space="preserve">&lt;namn&gt;_bakfall.geojson</w:t>
+      </w:r>
+      <w:r>
+        <w:t xml:space="preserve">.</w:t>
+      </w:r>
+    </w:p>
+    <w:p>
+      <w:pPr>
+        <w:spacing w:after="120"/>
+      </w:pPr>
+      <w:r>
+        <w:t xml:space="preserve">Symbologi sätts en gång i ArcMap och sparas som </w:t>
+      </w:r>
+      <w:r>
+        <w:rPr>
+          <w:rFonts w:ascii="Consolas" w:cs="Consolas" w:eastAsia="Consolas" w:hAnsi="Consolas"/>
+          <w:sz w:val="20"/>
+          <w:szCs w:val="20"/>
+          <w:shd w:fill="F2F2F2" w:val="clear"/>
+        </w:rPr>
+        <w:t xml:space="preserve">arcmap/svackor.lyr</w:t>
+      </w:r>
+      <w:r>
+        <w:t xml:space="preserve"> respektive </w:t>
+      </w:r>
+      <w:r>
+        <w:rPr>
+          <w:rFonts w:ascii="Consolas" w:cs="Consolas" w:eastAsia="Consolas" w:hAnsi="Consolas"/>
+          <w:sz w:val="20"/>
+          <w:szCs w:val="20"/>
+          <w:shd w:fill="F2F2F2" w:val="clear"/>
+        </w:rPr>
+        <w:t xml:space="preserve">arcmap/bakfall.lyr</w:t>
+      </w:r>
+      <w:r>
+        <w:t xml:space="preserve">, så appliceras den automatiskt nästa körning. Förslag: graderade symboler på </w:t>
+      </w:r>
+      <w:r>
+        <w:rPr>
+          <w:rFonts w:ascii="Consolas" w:cs="Consolas" w:eastAsia="Consolas" w:hAnsi="Consolas"/>
+          <w:sz w:val="20"/>
+          <w:szCs w:val="20"/>
+          <w:shd w:fill="F2F2F2" w:val="clear"/>
+        </w:rPr>
+        <w:t xml:space="preserve">SVACKA_CM</w:t>
+      </w:r>
+      <w:r>
+        <w:t xml:space="preserve"> i tre steg (2–5, 5–10, över 10 cm) med röd färg när </w:t>
+      </w:r>
+      <w:r>
+        <w:rPr>
+          <w:rFonts w:ascii="Consolas" w:cs="Consolas" w:eastAsia="Consolas" w:hAnsi="Consolas"/>
+          <w:sz w:val="20"/>
+          <w:szCs w:val="20"/>
+          <w:shd w:fill="F2F2F2" w:val="clear"/>
+        </w:rPr>
+        <w:t xml:space="preserve">ANDEL_DIAM</w:t>
+      </w:r>
+      <w:r>
+        <w:t xml:space="preserve"> överstiger 0,5, och bakfall som bred linje graderad på </w:t>
+      </w:r>
+      <w:r>
+        <w:rPr>
+          <w:rFonts w:ascii="Consolas" w:cs="Consolas" w:eastAsia="Consolas" w:hAnsi="Consolas"/>
+          <w:sz w:val="20"/>
+          <w:szCs w:val="20"/>
+          <w:shd w:fill="F2F2F2" w:val="clear"/>
+        </w:rPr>
+        <w:t xml:space="preserve">LUTNING</w:t>
+      </w:r>
+      <w:r>
+        <w:t xml:space="preserve">. Svackor och bakfall visar var sediment och stopp återkommer; de påverkar inte prioritetsklassen.</w:t>
       </w:r>
     </w:p>
     <w:p>

</xml_diff>

<commit_message>
Uppströmsanalys i nätet (steg 2)
Ny modul arcmap/natverk.py: graf med alla brunnar som noder och flödesriktning
per ledning ur riktningsattribut, vattengång eller ritad riktning. Verktyget
Uppströms i toolboxen ger allt uppströms om en brunn eller markerad ledning
(lager + sammanfattning), med serviser, stoppledningar och stoppbrunnar.
Batchläge per bedömd sträcka skriver ANT_SERV_U/L_UPPSTR och en CSV som
tv3_analys.py läser (uppstroms: i listfilen, --uppstroms) till kolumnerna
Serviser uppströms och Längd uppströms samt kartunderlaget. Bedömda-lagret
får fältet ANT_ANSL. Handledning 7.9.

Co-Authored-By: Claude Fable 5.1 <noreply@anthropic.com>
Claude-Session: https://claude.ai/code/session_011fdqX3JEZje1LF9LqpaqR8
</commit_message>
<xml_diff>
--- a/Anvandarhandledning tv3_analys.docx
+++ b/Anvandarhandledning tv3_analys.docx
@@ -333,6 +333,21 @@
     </w:p>
     <w:p>
       <w:pPr>
+        <w:shd w:fill="F2F2F2" w:val="clear"/>
+        <w:spacing w:after="0"/>
+        <w:ind w:left="280"/>
+      </w:pPr>
+      <w:r>
+        <w:rPr>
+          <w:rFonts w:ascii="Consolas" w:cs="Consolas" w:eastAsia="Consolas" w:hAnsi="Consolas"/>
+          <w:sz w:val="19"/>
+          <w:szCs w:val="19"/>
+        </w:rPr>
+        <w:t xml:space="preserve">uppstroms: Karta\uppstroms.csv              # från ArcMap-verktyget Uppströms, se 7.9</w:t>
+      </w:r>
+    </w:p>
+    <w:p>
+      <w:pPr>
         <w:spacing w:after="120"/>
       </w:pPr>
     </w:p>
@@ -499,6 +514,40 @@
       </w:r>
       <w:r>
         <w:t xml:space="preserve"> på kommandoraden.</w:t>
+      </w:r>
+    </w:p>
+    <w:p>
+      <w:pPr>
+        <w:pStyle w:val="ListParagraph"/>
+        <w:numPr>
+          <w:ilvl w:val="0"/>
+          <w:numId w:val="3"/>
+        </w:numPr>
+        <w:spacing w:after="80"/>
+      </w:pPr>
+      <w:r>
+        <w:rPr>
+          <w:rFonts w:ascii="Consolas" w:cs="Consolas" w:eastAsia="Consolas" w:hAnsi="Consolas"/>
+          <w:sz w:val="20"/>
+          <w:szCs w:val="20"/>
+          <w:shd w:fill="F2F2F2" w:val="clear"/>
+        </w:rPr>
+        <w:t xml:space="preserve">uppstroms:</w:t>
+      </w:r>
+      <w:r>
+        <w:t xml:space="preserve"> anger CSV-filen från ArcMap-verktyget Uppströms i batchläge (avsnitt 7.9): serviser och ledningslängd uppströms per sträcka. Samma sak som </w:t>
+      </w:r>
+      <w:r>
+        <w:rPr>
+          <w:rFonts w:ascii="Consolas" w:cs="Consolas" w:eastAsia="Consolas" w:hAnsi="Consolas"/>
+          <w:sz w:val="20"/>
+          <w:szCs w:val="20"/>
+          <w:shd w:fill="F2F2F2" w:val="clear"/>
+        </w:rPr>
+        <w:t xml:space="preserve">--uppstroms</w:t>
+      </w:r>
+      <w:r>
+        <w:t xml:space="preserve">.</w:t>
       </w:r>
     </w:p>
     <w:p>
@@ -1776,6 +1825,92 @@
           </w:p>
         </w:tc>
       </w:tr>
+      <w:tr>
+        <w:tc>
+          <w:tcPr>
+            <w:tcW w:type="dxa" w:w="2600"/>
+            <w:tcBorders>
+              <w:top w:val="single" w:color="BFBFBF" w:sz="4"/>
+              <w:left w:val="single" w:color="BFBFBF" w:sz="4"/>
+              <w:bottom w:val="single" w:color="BFBFBF" w:sz="4"/>
+              <w:right w:val="single" w:color="BFBFBF" w:sz="4"/>
+            </w:tcBorders>
+            <w:shd w:fill="F7F9FC" w:val="clear"/>
+            <w:tcMar>
+              <w:top w:type="dxa" w:w="60"/>
+              <w:left w:type="dxa" w:w="100"/>
+              <w:bottom w:type="dxa" w:w="60"/>
+              <w:right w:type="dxa" w:w="100"/>
+            </w:tcMar>
+          </w:tcPr>
+          <w:p>
+            <w:pPr>
+              <w:spacing w:after="0"/>
+            </w:pPr>
+            <w:r>
+              <w:rPr>
+                <w:rFonts w:ascii="Consolas" w:cs="Consolas" w:eastAsia="Consolas" w:hAnsi="Consolas"/>
+                <w:sz w:val="20"/>
+                <w:szCs w:val="20"/>
+                <w:shd w:fill="F2F2F2" w:val="clear"/>
+              </w:rPr>
+              <w:t xml:space="preserve">--uppstroms FIL.CSV</w:t>
+            </w:r>
+          </w:p>
+        </w:tc>
+        <w:tc>
+          <w:tcPr>
+            <w:tcW w:type="dxa" w:w="5000"/>
+            <w:tcBorders>
+              <w:top w:val="single" w:color="BFBFBF" w:sz="4"/>
+              <w:left w:val="single" w:color="BFBFBF" w:sz="4"/>
+              <w:bottom w:val="single" w:color="BFBFBF" w:sz="4"/>
+              <w:right w:val="single" w:color="BFBFBF" w:sz="4"/>
+            </w:tcBorders>
+            <w:shd w:fill="F7F9FC" w:val="clear"/>
+            <w:tcMar>
+              <w:top w:type="dxa" w:w="60"/>
+              <w:left w:type="dxa" w:w="100"/>
+              <w:bottom w:type="dxa" w:w="60"/>
+              <w:right w:type="dxa" w:w="100"/>
+            </w:tcMar>
+          </w:tcPr>
+          <w:p>
+            <w:pPr>
+              <w:spacing w:after="0"/>
+            </w:pPr>
+            <w:r>
+              <w:t xml:space="preserve">CSV från ArcMap-verktyget Uppströms (batchläge) med serviser och ledningslängd uppströms per sträcka (se 7.9). Kolumnerna Serviser uppströms och Längd uppströms fylls i (dolda som standard). Kan även anges i listfilen.</w:t>
+            </w:r>
+          </w:p>
+        </w:tc>
+        <w:tc>
+          <w:tcPr>
+            <w:tcW w:type="dxa" w:w="1760"/>
+            <w:tcBorders>
+              <w:top w:val="single" w:color="BFBFBF" w:sz="4"/>
+              <w:left w:val="single" w:color="BFBFBF" w:sz="4"/>
+              <w:bottom w:val="single" w:color="BFBFBF" w:sz="4"/>
+              <w:right w:val="single" w:color="BFBFBF" w:sz="4"/>
+            </w:tcBorders>
+            <w:shd w:fill="F7F9FC" w:val="clear"/>
+            <w:tcMar>
+              <w:top w:type="dxa" w:w="60"/>
+              <w:left w:type="dxa" w:w="100"/>
+              <w:bottom w:type="dxa" w:w="60"/>
+              <w:right w:type="dxa" w:w="100"/>
+            </w:tcMar>
+          </w:tcPr>
+          <w:p>
+            <w:pPr>
+              <w:spacing w:after="0"/>
+            </w:pPr>
+            <w:r>
+              <w:t xml:space="preserve">–</w:t>
+            </w:r>
+          </w:p>
+        </w:tc>
+      </w:tr>
     </w:tbl>
     <w:p>
       <w:pPr>
@@ -5011,6 +5146,26 @@
           <w:b/>
           <w:bCs/>
         </w:rPr>
+        <w:t xml:space="preserve">Uppströms</w:t>
+      </w:r>
+      <w:r>
+        <w:t xml:space="preserve"> – allt som ligger uppströms om en brunn eller markerad ledning, och i batchläge serviser och längd uppströms per bedömd sträcka (avsnitt 7.9).</w:t>
+      </w:r>
+    </w:p>
+    <w:p>
+      <w:pPr>
+        <w:pStyle w:val="ListParagraph"/>
+        <w:numPr>
+          <w:ilvl w:val="0"/>
+          <w:numId w:val="3"/>
+        </w:numPr>
+        <w:spacing w:after="80"/>
+      </w:pPr>
+      <w:r>
+        <w:rPr>
+          <w:b/>
+          <w:bCs/>
+        </w:rPr>
         <w:t xml:space="preserve">Uppdatera bedömning</w:t>
       </w:r>
       <w:r>
@@ -7095,6 +7250,217 @@
       </w:r>
       <w:r>
         <w:t xml:space="preserve">. Svackor och bakfall visar var sediment och stopp återkommer; de påverkar inte prioritetsklassen.</w:t>
+      </w:r>
+    </w:p>
+    <w:p>
+      <w:pPr>
+        <w:pStyle w:val="Heading2"/>
+      </w:pPr>
+      <w:r>
+        <w:t xml:space="preserve">7.9 Uppströmsanalys</w:t>
+      </w:r>
+    </w:p>
+    <w:p>
+      <w:pPr>
+        <w:spacing w:after="120"/>
+      </w:pPr>
+      <w:r>
+        <w:t xml:space="preserve">Verktyget </w:t>
+      </w:r>
+      <w:r>
+        <w:rPr>
+          <w:b/>
+          <w:bCs/>
+        </w:rPr>
+        <w:t xml:space="preserve">Uppströms</w:t>
+      </w:r>
+      <w:r>
+        <w:t xml:space="preserve"> samlar allt som ligger uppströms om en punkt i nätet: ledningar, brunnar, serviser, total längd och längsta gren. Startpunkten är en brunn (littera) eller, om fältet lämnas tomt, den ledning som är markerad i kartan (sökningen börjar i dess nedströmsände). Utdata är ett lager med alla uppströmsledningar (fält </w:t>
+      </w:r>
+      <w:r>
+        <w:rPr>
+          <w:rFonts w:ascii="Consolas" w:cs="Consolas" w:eastAsia="Consolas" w:hAnsi="Consolas"/>
+          <w:sz w:val="20"/>
+          <w:szCs w:val="20"/>
+          <w:shd w:fill="F2F2F2" w:val="clear"/>
+        </w:rPr>
+        <w:t xml:space="preserve">AVSTAND_M</w:t>
+      </w:r>
+      <w:r>
+        <w:t xml:space="preserve"> till startpunkten längs nätet, </w:t>
+      </w:r>
+      <w:r>
+        <w:rPr>
+          <w:rFonts w:ascii="Consolas" w:cs="Consolas" w:eastAsia="Consolas" w:hAnsi="Consolas"/>
+          <w:sz w:val="20"/>
+          <w:szCs w:val="20"/>
+          <w:shd w:fill="F2F2F2" w:val="clear"/>
+        </w:rPr>
+        <w:t xml:space="preserve">NIVA</w:t>
+      </w:r>
+      <w:r>
+        <w:t xml:space="preserve">, </w:t>
+      </w:r>
+      <w:r>
+        <w:rPr>
+          <w:rFonts w:ascii="Consolas" w:cs="Consolas" w:eastAsia="Consolas" w:hAnsi="Consolas"/>
+          <w:sz w:val="20"/>
+          <w:szCs w:val="20"/>
+          <w:shd w:fill="F2F2F2" w:val="clear"/>
+        </w:rPr>
+        <w:t xml:space="preserve">LANGD_M</w:t>
+      </w:r>
+      <w:r>
+        <w:t xml:space="preserve">, </w:t>
+      </w:r>
+      <w:r>
+        <w:rPr>
+          <w:rFonts w:ascii="Consolas" w:cs="Consolas" w:eastAsia="Consolas" w:hAnsi="Consolas"/>
+          <w:sz w:val="20"/>
+          <w:szCs w:val="20"/>
+          <w:shd w:fill="F2F2F2" w:val="clear"/>
+        </w:rPr>
+        <w:t xml:space="preserve">SERVIS</w:t>
+      </w:r>
+      <w:r>
+        <w:t xml:space="preserve">, </w:t>
+      </w:r>
+      <w:r>
+        <w:rPr>
+          <w:rFonts w:ascii="Consolas" w:cs="Consolas" w:eastAsia="Consolas" w:hAnsi="Consolas"/>
+          <w:sz w:val="20"/>
+          <w:szCs w:val="20"/>
+          <w:shd w:fill="F2F2F2" w:val="clear"/>
+        </w:rPr>
+        <w:t xml:space="preserve">RIKTN_UR</w:t>
+      </w:r>
+      <w:r>
+        <w:t xml:space="preserve">) och en sammanfattning i loggen och valfri CSV.</w:t>
+      </w:r>
+    </w:p>
+    <w:p>
+      <w:pPr>
+        <w:spacing w:after="120"/>
+      </w:pPr>
+      <w:r>
+        <w:rPr>
+          <w:b/>
+          <w:bCs/>
+        </w:rPr>
+        <w:t xml:space="preserve">Flödesriktning.</w:t>
+      </w:r>
+      <w:r>
+        <w:t xml:space="preserve"> Under Flödesriktning väljs fältet med riktningsattributet i ledningslagret och vilka värden som betyder *med* respektive *mot* ritad riktning (flera värden separeras med </w:t>
+      </w:r>
+      <w:r>
+        <w:rPr>
+          <w:rFonts w:ascii="Consolas" w:cs="Consolas" w:eastAsia="Consolas" w:hAnsi="Consolas"/>
+          <w:sz w:val="20"/>
+          <w:szCs w:val="20"/>
+          <w:shd w:fill="F2F2F2" w:val="clear"/>
+        </w:rPr>
+        <w:t xml:space="preserve">;</w:t>
+      </w:r>
+      <w:r>
+        <w:t xml:space="preserve">). Saknas värde på en ledning används vattengångsfälten (högre vattengång = uppströms), och sist ritad riktning (startvertex = uppströms). Loggen visar hur många ledningar som fick riktning ur attribut, vattengång respektive ritad riktning – är ritad riktning i majoritet är resultatet osäkert.</w:t>
+      </w:r>
+    </w:p>
+    <w:p>
+      <w:pPr>
+        <w:spacing w:after="120"/>
+      </w:pPr>
+      <w:r>
+        <w:rPr>
+          <w:b/>
+          <w:bCs/>
+        </w:rPr>
+        <w:t xml:space="preserve">Serviser</w:t>
+      </w:r>
+      <w:r>
+        <w:t xml:space="preserve"> anges antingen som ett eget servislager eller som ett fält i ledningslagret med värdet för servis. En servis räknas när någon av dess ändar ligger inom toleransen från en uppströmsledning. </w:t>
+      </w:r>
+      <w:r>
+        <w:rPr>
+          <w:b/>
+          <w:bCs/>
+        </w:rPr>
+        <w:t xml:space="preserve">Stopp</w:t>
+      </w:r>
+      <w:r>
+        <w:t xml:space="preserve">: ledningar med ett visst värde i ett fält (t.ex. tryckledning) passeras inte, och brunnar i stopplistan (t.ex. pumpstationer) stoppar sökningen. Under </w:t>
+      </w:r>
+      <w:r>
+        <w:rPr>
+          <w:b/>
+          <w:bCs/>
+        </w:rPr>
+        <w:t xml:space="preserve">Begränsning</w:t>
+      </w:r>
+      <w:r>
+        <w:t xml:space="preserve"> kan sökningen avgränsas till ett område eller en sökradie kring startbrunnen – hela nätet är stort.</w:t>
+      </w:r>
+    </w:p>
+    <w:p>
+      <w:pPr>
+        <w:spacing w:after="120"/>
+      </w:pPr>
+      <w:r>
+        <w:rPr>
+          <w:b/>
+          <w:bCs/>
+        </w:rPr>
+        <w:t xml:space="preserve">Batchläge.</w:t>
+      </w:r>
+      <w:r>
+        <w:t xml:space="preserve"> Välj lagret från Skapa ledningslager under Batch, så körs analysen för varje sträcka med sträckans slutbrunn som start (sträckan själv ingår). Fälten </w:t>
+      </w:r>
+      <w:r>
+        <w:rPr>
+          <w:rFonts w:ascii="Consolas" w:cs="Consolas" w:eastAsia="Consolas" w:hAnsi="Consolas"/>
+          <w:sz w:val="20"/>
+          <w:szCs w:val="20"/>
+          <w:shd w:fill="F2F2F2" w:val="clear"/>
+        </w:rPr>
+        <w:t xml:space="preserve">ANT_SERV_U</w:t>
+      </w:r>
+      <w:r>
+        <w:t xml:space="preserve"> (serviser uppströms) och </w:t>
+      </w:r>
+      <w:r>
+        <w:rPr>
+          <w:rFonts w:ascii="Consolas" w:cs="Consolas" w:eastAsia="Consolas" w:hAnsi="Consolas"/>
+          <w:sz w:val="20"/>
+          <w:szCs w:val="20"/>
+          <w:shd w:fill="F2F2F2" w:val="clear"/>
+        </w:rPr>
+        <w:t xml:space="preserve">L_UPPSTR</w:t>
+      </w:r>
+      <w:r>
+        <w:t xml:space="preserve"> (längd uppströms) skrivs till lagret, och CSV-filen anges sedan i listfilen (</w:t>
+      </w:r>
+      <w:r>
+        <w:rPr>
+          <w:rFonts w:ascii="Consolas" w:cs="Consolas" w:eastAsia="Consolas" w:hAnsi="Consolas"/>
+          <w:sz w:val="20"/>
+          <w:szCs w:val="20"/>
+          <w:shd w:fill="F2F2F2" w:val="clear"/>
+        </w:rPr>
+        <w:t xml:space="preserve">uppstroms:</w:t>
+      </w:r>
+      <w:r>
+        <w:t xml:space="preserve">) så att kolumnerna Serviser uppströms och Längd uppströms fylls i Excel och kartunderlaget. Utan servisuppgifter summeras i stället antalet anslutningar enligt TV-inspektionen för de inspekterade sträckorna uppströms (kolumnen serviser_kalla säger </w:t>
+      </w:r>
+      <w:r>
+        <w:rPr>
+          <w:rFonts w:ascii="Consolas" w:cs="Consolas" w:eastAsia="Consolas" w:hAnsi="Consolas"/>
+          <w:sz w:val="20"/>
+          <w:szCs w:val="20"/>
+          <w:shd w:fill="F2F2F2" w:val="clear"/>
+        </w:rPr>
+        <w:t xml:space="preserve">skattning</w:t>
+      </w:r>
+      <w:r>
+        <w:t xml:space="preserve">). Uppgifterna påverkar inte prioritetsklassen; de är underlag för konsekvens och etappordning.</w:t>
       </w:r>
     </w:p>
     <w:p>

</xml_diff>

<commit_message>
Åtgärdspaket och kostnad (steg 3)
Sträckor med gällande klass A/B (manuell bedömning före maskinell) får
metoden strumpa; schakt bara manuellt (F3). Sammanhängande sträckor med
samma metod blir etapper, korta C/D-sträckor emellan tas med (F5).
Brunnstyp ur TVDAT-kod eller litteraprefix; framschaktning och ny brunn
räknas per brunn i etappen med girig minsta täckning (F9), valet kan
låsas manuellt. Kostnad ur kostnader.csv (schablon, F4): strumpa kr/m
per dimension, hattar, lagning (manuell kolumn Lagning (m), F2),
framschaktning, ny brunn, etablering; schakt utan kostnad (F8).
Manuella bedömningar läses ur en tidigare prioritering.xlsx (manuell:
i listfilen / --manuell). Ny flik Etapper, nya kolumner i Prioritering,
block i Sammanfattning, JSON-fält och kartfälten ETAPP/METOD/KOSTNAD.
Handledning 6.1, metodbeskrivning avsnitt 8.

Co-Authored-By: Claude Fable 5.1 <noreply@anthropic.com>
Claude-Session: https://claude.ai/code/session_011fdqX3JEZje1LF9LqpaqR8
</commit_message>
<xml_diff>
--- a/Anvandarhandledning tv3_analys.docx
+++ b/Anvandarhandledning tv3_analys.docx
@@ -348,6 +348,36 @@
     </w:p>
     <w:p>
       <w:pPr>
+        <w:shd w:fill="F2F2F2" w:val="clear"/>
+        <w:spacing w:after="0"/>
+        <w:ind w:left="280"/>
+      </w:pPr>
+      <w:r>
+        <w:rPr>
+          <w:rFonts w:ascii="Consolas" w:cs="Consolas" w:eastAsia="Consolas" w:hAnsi="Consolas"/>
+          <w:sz w:val="19"/>
+          <w:szCs w:val="19"/>
+        </w:rPr>
+        <w:t xml:space="preserve">manuell: forra_korningen\prioritering.xlsx   # manuella bedömningar och Lagning (m), se 6.1</w:t>
+      </w:r>
+    </w:p>
+    <w:p>
+      <w:pPr>
+        <w:shd w:fill="F2F2F2" w:val="clear"/>
+        <w:spacing w:after="0"/>
+        <w:ind w:left="280"/>
+      </w:pPr>
+      <w:r>
+        <w:rPr>
+          <w:rFonts w:ascii="Consolas" w:cs="Consolas" w:eastAsia="Consolas" w:hAnsi="Consolas"/>
+          <w:sz w:val="19"/>
+          <w:szCs w:val="19"/>
+        </w:rPr>
+        <w:t xml:space="preserve">kostnader: kostnader.csv                   # kostnadsposter för åtgärdspaketet, se 6.1</w:t>
+      </w:r>
+    </w:p>
+    <w:p>
+      <w:pPr>
         <w:spacing w:after="120"/>
       </w:pPr>
     </w:p>
@@ -548,6 +578,64 @@
       </w:r>
       <w:r>
         <w:t xml:space="preserve">.</w:t>
+      </w:r>
+    </w:p>
+    <w:p>
+      <w:pPr>
+        <w:pStyle w:val="ListParagraph"/>
+        <w:numPr>
+          <w:ilvl w:val="0"/>
+          <w:numId w:val="3"/>
+        </w:numPr>
+        <w:spacing w:after="80"/>
+      </w:pPr>
+      <w:r>
+        <w:rPr>
+          <w:rFonts w:ascii="Consolas" w:cs="Consolas" w:eastAsia="Consolas" w:hAnsi="Consolas"/>
+          <w:sz w:val="20"/>
+          <w:szCs w:val="20"/>
+          <w:shd w:fill="F2F2F2" w:val="clear"/>
+        </w:rPr>
+        <w:t xml:space="preserve">manuell:</w:t>
+      </w:r>
+      <w:r>
+        <w:t xml:space="preserve"> pekar på en tidigare </w:t>
+      </w:r>
+      <w:r>
+        <w:rPr>
+          <w:rFonts w:ascii="Consolas" w:cs="Consolas" w:eastAsia="Consolas" w:hAnsi="Consolas"/>
+          <w:sz w:val="20"/>
+          <w:szCs w:val="20"/>
+          <w:shd w:fill="F2F2F2" w:val="clear"/>
+        </w:rPr>
+        <w:t xml:space="preserve">prioritering.xlsx</w:t>
+      </w:r>
+      <w:r>
+        <w:t xml:space="preserve"> där ni fyllt i Manuell bedömning, Kommentar och Lagning (m) – värdena följer med till nästa körning och styr åtgärdspaketet (avsnitt 6.1). </w:t>
+      </w:r>
+      <w:r>
+        <w:rPr>
+          <w:rFonts w:ascii="Consolas" w:cs="Consolas" w:eastAsia="Consolas" w:hAnsi="Consolas"/>
+          <w:sz w:val="20"/>
+          <w:szCs w:val="20"/>
+          <w:shd w:fill="F2F2F2" w:val="clear"/>
+        </w:rPr>
+        <w:t xml:space="preserve">kostnader:</w:t>
+      </w:r>
+      <w:r>
+        <w:t xml:space="preserve"> pekar på kostnadsfilen; utan den används </w:t>
+      </w:r>
+      <w:r>
+        <w:rPr>
+          <w:rFonts w:ascii="Consolas" w:cs="Consolas" w:eastAsia="Consolas" w:hAnsi="Consolas"/>
+          <w:sz w:val="20"/>
+          <w:szCs w:val="20"/>
+          <w:shd w:fill="F2F2F2" w:val="clear"/>
+        </w:rPr>
+        <w:t xml:space="preserve">kostnader.csv</w:t>
+      </w:r>
+      <w:r>
+        <w:t xml:space="preserve"> bredvid listfilen eller skriptet.</w:t>
       </w:r>
     </w:p>
     <w:p>
@@ -1854,6 +1942,296 @@
                 <w:szCs w:val="20"/>
                 <w:shd w:fill="F2F2F2" w:val="clear"/>
               </w:rPr>
+              <w:t xml:space="preserve">--manuell FIL.XLSX</w:t>
+            </w:r>
+          </w:p>
+        </w:tc>
+        <w:tc>
+          <w:tcPr>
+            <w:tcW w:type="dxa" w:w="5000"/>
+            <w:tcBorders>
+              <w:top w:val="single" w:color="BFBFBF" w:sz="4"/>
+              <w:left w:val="single" w:color="BFBFBF" w:sz="4"/>
+              <w:bottom w:val="single" w:color="BFBFBF" w:sz="4"/>
+              <w:right w:val="single" w:color="BFBFBF" w:sz="4"/>
+            </w:tcBorders>
+            <w:shd w:fill="F7F9FC" w:val="clear"/>
+            <w:tcMar>
+              <w:top w:type="dxa" w:w="60"/>
+              <w:left w:type="dxa" w:w="100"/>
+              <w:bottom w:type="dxa" w:w="60"/>
+              <w:right w:type="dxa" w:w="100"/>
+            </w:tcMar>
+          </w:tcPr>
+          <w:p>
+            <w:pPr>
+              <w:spacing w:after="0"/>
+            </w:pPr>
+            <w:r>
+              <w:t xml:space="preserve">Tidigare </w:t>
+            </w:r>
+            <w:r>
+              <w:rPr>
+                <w:rFonts w:ascii="Consolas" w:cs="Consolas" w:eastAsia="Consolas" w:hAnsi="Consolas"/>
+                <w:sz w:val="20"/>
+                <w:szCs w:val="20"/>
+                <w:shd w:fill="F2F2F2" w:val="clear"/>
+              </w:rPr>
+              <w:t xml:space="preserve">prioritering.xlsx</w:t>
+            </w:r>
+            <w:r>
+              <w:t xml:space="preserve"> med ifyllda manuella bedömningar, kommentarer och Lagning (m) (se 6.1). Kan även anges i listfilen.</w:t>
+            </w:r>
+          </w:p>
+        </w:tc>
+        <w:tc>
+          <w:tcPr>
+            <w:tcW w:type="dxa" w:w="1760"/>
+            <w:tcBorders>
+              <w:top w:val="single" w:color="BFBFBF" w:sz="4"/>
+              <w:left w:val="single" w:color="BFBFBF" w:sz="4"/>
+              <w:bottom w:val="single" w:color="BFBFBF" w:sz="4"/>
+              <w:right w:val="single" w:color="BFBFBF" w:sz="4"/>
+            </w:tcBorders>
+            <w:shd w:fill="F7F9FC" w:val="clear"/>
+            <w:tcMar>
+              <w:top w:type="dxa" w:w="60"/>
+              <w:left w:type="dxa" w:w="100"/>
+              <w:bottom w:type="dxa" w:w="60"/>
+              <w:right w:type="dxa" w:w="100"/>
+            </w:tcMar>
+          </w:tcPr>
+          <w:p>
+            <w:pPr>
+              <w:spacing w:after="0"/>
+            </w:pPr>
+            <w:r>
+              <w:t xml:space="preserve">–</w:t>
+            </w:r>
+          </w:p>
+        </w:tc>
+      </w:tr>
+      <w:tr>
+        <w:tc>
+          <w:tcPr>
+            <w:tcW w:type="dxa" w:w="2600"/>
+            <w:tcBorders>
+              <w:top w:val="single" w:color="BFBFBF" w:sz="4"/>
+              <w:left w:val="single" w:color="BFBFBF" w:sz="4"/>
+              <w:bottom w:val="single" w:color="BFBFBF" w:sz="4"/>
+              <w:right w:val="single" w:color="BFBFBF" w:sz="4"/>
+            </w:tcBorders>
+            <w:tcMar>
+              <w:top w:type="dxa" w:w="60"/>
+              <w:left w:type="dxa" w:w="100"/>
+              <w:bottom w:type="dxa" w:w="60"/>
+              <w:right w:type="dxa" w:w="100"/>
+            </w:tcMar>
+          </w:tcPr>
+          <w:p>
+            <w:pPr>
+              <w:spacing w:after="0"/>
+            </w:pPr>
+            <w:r>
+              <w:rPr>
+                <w:rFonts w:ascii="Consolas" w:cs="Consolas" w:eastAsia="Consolas" w:hAnsi="Consolas"/>
+                <w:sz w:val="20"/>
+                <w:szCs w:val="20"/>
+                <w:shd w:fill="F2F2F2" w:val="clear"/>
+              </w:rPr>
+              <w:t xml:space="preserve">--kostnader FIL.CSV</w:t>
+            </w:r>
+          </w:p>
+        </w:tc>
+        <w:tc>
+          <w:tcPr>
+            <w:tcW w:type="dxa" w:w="5000"/>
+            <w:tcBorders>
+              <w:top w:val="single" w:color="BFBFBF" w:sz="4"/>
+              <w:left w:val="single" w:color="BFBFBF" w:sz="4"/>
+              <w:bottom w:val="single" w:color="BFBFBF" w:sz="4"/>
+              <w:right w:val="single" w:color="BFBFBF" w:sz="4"/>
+            </w:tcBorders>
+            <w:tcMar>
+              <w:top w:type="dxa" w:w="60"/>
+              <w:left w:type="dxa" w:w="100"/>
+              <w:bottom w:type="dxa" w:w="60"/>
+              <w:right w:type="dxa" w:w="100"/>
+            </w:tcMar>
+          </w:tcPr>
+          <w:p>
+            <w:pPr>
+              <w:spacing w:after="0"/>
+            </w:pPr>
+            <w:r>
+              <w:t xml:space="preserve">Kostnadsfil för åtgärdspaketet (se 6.1).</w:t>
+            </w:r>
+          </w:p>
+        </w:tc>
+        <w:tc>
+          <w:tcPr>
+            <w:tcW w:type="dxa" w:w="1760"/>
+            <w:tcBorders>
+              <w:top w:val="single" w:color="BFBFBF" w:sz="4"/>
+              <w:left w:val="single" w:color="BFBFBF" w:sz="4"/>
+              <w:bottom w:val="single" w:color="BFBFBF" w:sz="4"/>
+              <w:right w:val="single" w:color="BFBFBF" w:sz="4"/>
+            </w:tcBorders>
+            <w:tcMar>
+              <w:top w:type="dxa" w:w="60"/>
+              <w:left w:type="dxa" w:w="100"/>
+              <w:bottom w:type="dxa" w:w="60"/>
+              <w:right w:type="dxa" w:w="100"/>
+            </w:tcMar>
+          </w:tcPr>
+          <w:p>
+            <w:pPr>
+              <w:spacing w:after="0"/>
+            </w:pPr>
+            <w:r>
+              <w:rPr>
+                <w:rFonts w:ascii="Consolas" w:cs="Consolas" w:eastAsia="Consolas" w:hAnsi="Consolas"/>
+                <w:sz w:val="20"/>
+                <w:szCs w:val="20"/>
+                <w:shd w:fill="F2F2F2" w:val="clear"/>
+              </w:rPr>
+              <w:t xml:space="preserve">kostnader.csv</w:t>
+            </w:r>
+          </w:p>
+        </w:tc>
+      </w:tr>
+      <w:tr>
+        <w:tc>
+          <w:tcPr>
+            <w:tcW w:type="dxa" w:w="2600"/>
+            <w:tcBorders>
+              <w:top w:val="single" w:color="BFBFBF" w:sz="4"/>
+              <w:left w:val="single" w:color="BFBFBF" w:sz="4"/>
+              <w:bottom w:val="single" w:color="BFBFBF" w:sz="4"/>
+              <w:right w:val="single" w:color="BFBFBF" w:sz="4"/>
+            </w:tcBorders>
+            <w:shd w:fill="F7F9FC" w:val="clear"/>
+            <w:tcMar>
+              <w:top w:type="dxa" w:w="60"/>
+              <w:left w:type="dxa" w:w="100"/>
+              <w:bottom w:type="dxa" w:w="60"/>
+              <w:right w:type="dxa" w:w="100"/>
+            </w:tcMar>
+          </w:tcPr>
+          <w:p>
+            <w:pPr>
+              <w:spacing w:after="0"/>
+            </w:pPr>
+            <w:r>
+              <w:rPr>
+                <w:rFonts w:ascii="Consolas" w:cs="Consolas" w:eastAsia="Consolas" w:hAnsi="Consolas"/>
+                <w:sz w:val="20"/>
+                <w:szCs w:val="20"/>
+                <w:shd w:fill="F2F2F2" w:val="clear"/>
+              </w:rPr>
+              <w:t xml:space="preserve">--etapper ja|nej</w:t>
+            </w:r>
+          </w:p>
+        </w:tc>
+        <w:tc>
+          <w:tcPr>
+            <w:tcW w:type="dxa" w:w="5000"/>
+            <w:tcBorders>
+              <w:top w:val="single" w:color="BFBFBF" w:sz="4"/>
+              <w:left w:val="single" w:color="BFBFBF" w:sz="4"/>
+              <w:bottom w:val="single" w:color="BFBFBF" w:sz="4"/>
+              <w:right w:val="single" w:color="BFBFBF" w:sz="4"/>
+            </w:tcBorders>
+            <w:shd w:fill="F7F9FC" w:val="clear"/>
+            <w:tcMar>
+              <w:top w:type="dxa" w:w="60"/>
+              <w:left w:type="dxa" w:w="100"/>
+              <w:bottom w:type="dxa" w:w="60"/>
+              <w:right w:type="dxa" w:w="100"/>
+            </w:tcMar>
+          </w:tcPr>
+          <w:p>
+            <w:pPr>
+              <w:spacing w:after="0"/>
+            </w:pPr>
+            <w:r>
+              <w:t xml:space="preserve">Åtgärdspaket med etappindelning och kostnad (fliken Etapper). </w:t>
+            </w:r>
+            <w:r>
+              <w:rPr>
+                <w:rFonts w:ascii="Consolas" w:cs="Consolas" w:eastAsia="Consolas" w:hAnsi="Consolas"/>
+                <w:sz w:val="20"/>
+                <w:szCs w:val="20"/>
+                <w:shd w:fill="F2F2F2" w:val="clear"/>
+              </w:rPr>
+              <w:t xml:space="preserve">nej</w:t>
+            </w:r>
+            <w:r>
+              <w:t xml:space="preserve"> hoppar över.</w:t>
+            </w:r>
+          </w:p>
+        </w:tc>
+        <w:tc>
+          <w:tcPr>
+            <w:tcW w:type="dxa" w:w="1760"/>
+            <w:tcBorders>
+              <w:top w:val="single" w:color="BFBFBF" w:sz="4"/>
+              <w:left w:val="single" w:color="BFBFBF" w:sz="4"/>
+              <w:bottom w:val="single" w:color="BFBFBF" w:sz="4"/>
+              <w:right w:val="single" w:color="BFBFBF" w:sz="4"/>
+            </w:tcBorders>
+            <w:shd w:fill="F7F9FC" w:val="clear"/>
+            <w:tcMar>
+              <w:top w:type="dxa" w:w="60"/>
+              <w:left w:type="dxa" w:w="100"/>
+              <w:bottom w:type="dxa" w:w="60"/>
+              <w:right w:type="dxa" w:w="100"/>
+            </w:tcMar>
+          </w:tcPr>
+          <w:p>
+            <w:pPr>
+              <w:spacing w:after="0"/>
+            </w:pPr>
+            <w:r>
+              <w:rPr>
+                <w:rFonts w:ascii="Consolas" w:cs="Consolas" w:eastAsia="Consolas" w:hAnsi="Consolas"/>
+                <w:sz w:val="20"/>
+                <w:szCs w:val="20"/>
+                <w:shd w:fill="F2F2F2" w:val="clear"/>
+              </w:rPr>
+              <w:t xml:space="preserve">ja</w:t>
+            </w:r>
+          </w:p>
+        </w:tc>
+      </w:tr>
+      <w:tr>
+        <w:tc>
+          <w:tcPr>
+            <w:tcW w:type="dxa" w:w="2600"/>
+            <w:tcBorders>
+              <w:top w:val="single" w:color="BFBFBF" w:sz="4"/>
+              <w:left w:val="single" w:color="BFBFBF" w:sz="4"/>
+              <w:bottom w:val="single" w:color="BFBFBF" w:sz="4"/>
+              <w:right w:val="single" w:color="BFBFBF" w:sz="4"/>
+            </w:tcBorders>
+            <w:tcMar>
+              <w:top w:type="dxa" w:w="60"/>
+              <w:left w:type="dxa" w:w="100"/>
+              <w:bottom w:type="dxa" w:w="60"/>
+              <w:right w:type="dxa" w:w="100"/>
+            </w:tcMar>
+          </w:tcPr>
+          <w:p>
+            <w:pPr>
+              <w:spacing w:after="0"/>
+            </w:pPr>
+            <w:r>
+              <w:rPr>
+                <w:rFonts w:ascii="Consolas" w:cs="Consolas" w:eastAsia="Consolas" w:hAnsi="Consolas"/>
+                <w:sz w:val="20"/>
+                <w:szCs w:val="20"/>
+                <w:shd w:fill="F2F2F2" w:val="clear"/>
+              </w:rPr>
               <w:t xml:space="preserve">--uppstroms FIL.CSV</w:t>
             </w:r>
           </w:p>
@@ -1867,7 +2245,6 @@
               <w:bottom w:val="single" w:color="BFBFBF" w:sz="4"/>
               <w:right w:val="single" w:color="BFBFBF" w:sz="4"/>
             </w:tcBorders>
-            <w:shd w:fill="F7F9FC" w:val="clear"/>
             <w:tcMar>
               <w:top w:type="dxa" w:w="60"/>
               <w:left w:type="dxa" w:w="100"/>
@@ -1893,7 +2270,6 @@
               <w:bottom w:val="single" w:color="BFBFBF" w:sz="4"/>
               <w:right w:val="single" w:color="BFBFBF" w:sz="4"/>
             </w:tcBorders>
-            <w:shd w:fill="F7F9FC" w:val="clear"/>
             <w:tcMar>
               <w:top w:type="dxa" w:w="60"/>
               <w:left w:type="dxa" w:w="100"/>
@@ -2441,7 +2817,7 @@
               <w:spacing w:after="0"/>
             </w:pPr>
             <w:r>
-              <w:t xml:space="preserve">Excel-arbetsbok med flikarna Sammanfattning, Prioritering, Observationer, Kodstatistik, Per fil och Material (se avsnitt 5).</w:t>
+              <w:t xml:space="preserve">Excel-arbetsbok med flikarna Sammanfattning, Prioritering, Etapper, Observationer, Kodstatistik, Per fil och Material (se avsnitt 5).</w:t>
             </w:r>
           </w:p>
         </w:tc>
@@ -2979,7 +3355,7 @@
               <w:spacing w:after="0"/>
             </w:pPr>
             <w:r>
-              <w:t xml:space="preserve">Observationer</w:t>
+              <w:t xml:space="preserve">Etapper</w:t>
             </w:r>
           </w:p>
         </w:tc>
@@ -3004,7 +3380,19 @@
               <w:spacing w:after="0"/>
             </w:pPr>
             <w:r>
-              <w:t xml:space="preserve">Varje observation i klartext med läge (m), tid i filmen, kod, grad, poäng, klockposition, vattennivå, bild och kommentar. Bild och Videofil är klickbara länkar när filerna hittats. Sorterad i samma ordning som prioriteringslistan så att man snabbt hittar detaljerna för en kritisk sträcka.</w:t>
+              <w:t xml:space="preserve">Åtgärdspaketet (avsnitt 6.1): en rad per etapp med metod, sträckor, brunnar, längd, dimensioner, anslutningar (hattar), lagning, framschaktade brunnar, kostnad per post och totalt, samt sträckorna i klartext. Kolumnen Schakta fram (manuellt) fylls i om en annan brunn ska schaktas fram än den skriptet valt; den läses tillbaka med </w:t>
+            </w:r>
+            <w:r>
+              <w:rPr>
+                <w:rFonts w:ascii="Consolas" w:cs="Consolas" w:eastAsia="Consolas" w:hAnsi="Consolas"/>
+                <w:sz w:val="20"/>
+                <w:szCs w:val="20"/>
+                <w:shd w:fill="F2F2F2" w:val="clear"/>
+              </w:rPr>
+              <w:t xml:space="preserve">manuell:</w:t>
+            </w:r>
+            <w:r>
+              <w:t xml:space="preserve">.</w:t>
             </w:r>
           </w:p>
         </w:tc>
@@ -3032,7 +3420,7 @@
               <w:spacing w:after="0"/>
             </w:pPr>
             <w:r>
-              <w:t xml:space="preserve">Kodstatistik</w:t>
+              <w:t xml:space="preserve">Observationer</w:t>
             </w:r>
           </w:p>
         </w:tc>
@@ -3058,7 +3446,7 @@
               <w:spacing w:after="0"/>
             </w:pPr>
             <w:r>
-              <w:t xml:space="preserve">Antal observationer per skadekod fördelat på grad 1–4, samt hur många sträckor som berörs.</w:t>
+              <w:t xml:space="preserve">Varje observation i klartext med läge (m), tid i filmen, kod, grad, poäng, klockposition, vattennivå, bild och kommentar. Bild och Videofil är klickbara länkar när filerna hittats. Sorterad i samma ordning som prioriteringslistan så att man snabbt hittar detaljerna för en kritisk sträcka.</w:t>
             </w:r>
           </w:p>
         </w:tc>
@@ -3085,7 +3473,7 @@
               <w:spacing w:after="0"/>
             </w:pPr>
             <w:r>
-              <w:t xml:space="preserve">Per fil</w:t>
+              <w:t xml:space="preserve">Kodstatistik</w:t>
             </w:r>
           </w:p>
         </w:tc>
@@ -3110,7 +3498,7 @@
               <w:spacing w:after="0"/>
             </w:pPr>
             <w:r>
-              <w:t xml:space="preserve">Nyckeltal per TV3-fil: projekt, område, period, sträckor, längd, konstruktionsindex, klassfördelning och avbrutna inspektioner. Praktiskt när flera uppdrag analyseras samtidigt.</w:t>
+              <w:t xml:space="preserve">Antal observationer per skadekod fördelat på grad 1–4, samt hur många sträckor som berörs.</w:t>
             </w:r>
           </w:p>
         </w:tc>
@@ -3138,6 +3526,59 @@
               <w:spacing w:after="0"/>
             </w:pPr>
             <w:r>
+              <w:t xml:space="preserve">Per fil</w:t>
+            </w:r>
+          </w:p>
+        </w:tc>
+        <w:tc>
+          <w:tcPr>
+            <w:tcW w:type="dxa" w:w="6960"/>
+            <w:tcBorders>
+              <w:top w:val="single" w:color="BFBFBF" w:sz="4"/>
+              <w:left w:val="single" w:color="BFBFBF" w:sz="4"/>
+              <w:bottom w:val="single" w:color="BFBFBF" w:sz="4"/>
+              <w:right w:val="single" w:color="BFBFBF" w:sz="4"/>
+            </w:tcBorders>
+            <w:shd w:fill="F7F9FC" w:val="clear"/>
+            <w:tcMar>
+              <w:top w:type="dxa" w:w="60"/>
+              <w:left w:type="dxa" w:w="100"/>
+              <w:bottom w:type="dxa" w:w="60"/>
+              <w:right w:type="dxa" w:w="100"/>
+            </w:tcMar>
+          </w:tcPr>
+          <w:p>
+            <w:pPr>
+              <w:spacing w:after="0"/>
+            </w:pPr>
+            <w:r>
+              <w:t xml:space="preserve">Nyckeltal per TV3-fil: projekt, område, period, sträckor, längd, konstruktionsindex, klassfördelning och avbrutna inspektioner. Praktiskt när flera uppdrag analyseras samtidigt.</w:t>
+            </w:r>
+          </w:p>
+        </w:tc>
+      </w:tr>
+      <w:tr>
+        <w:tc>
+          <w:tcPr>
+            <w:tcW w:type="dxa" w:w="2400"/>
+            <w:tcBorders>
+              <w:top w:val="single" w:color="BFBFBF" w:sz="4"/>
+              <w:left w:val="single" w:color="BFBFBF" w:sz="4"/>
+              <w:bottom w:val="single" w:color="BFBFBF" w:sz="4"/>
+              <w:right w:val="single" w:color="BFBFBF" w:sz="4"/>
+            </w:tcBorders>
+            <w:tcMar>
+              <w:top w:type="dxa" w:w="60"/>
+              <w:left w:type="dxa" w:w="100"/>
+              <w:bottom w:type="dxa" w:w="60"/>
+              <w:right w:type="dxa" w:w="100"/>
+            </w:tcMar>
+          </w:tcPr>
+          <w:p>
+            <w:pPr>
+              <w:spacing w:after="0"/>
+            </w:pPr>
+            <w:r>
               <w:t xml:space="preserve">Material</w:t>
             </w:r>
           </w:p>
@@ -3151,7 +3592,6 @@
               <w:bottom w:val="single" w:color="BFBFBF" w:sz="4"/>
               <w:right w:val="single" w:color="BFBFBF" w:sz="4"/>
             </w:tcBorders>
-            <w:shd w:fill="F7F9FC" w:val="clear"/>
             <w:tcMar>
               <w:top w:type="dxa" w:w="60"/>
               <w:left w:type="dxa" w:w="100"/>
@@ -4948,6 +5388,1139 @@
         <w:t xml:space="preserve">. Om ni använder en annan standard än P93 (t.ex. P111) läggs koderna till i tabellerna.</w:t>
       </w:r>
     </w:p>
+    <w:p>
+      <w:pPr>
+        <w:spacing w:after="120"/>
+      </w:pPr>
+    </w:p>
+    <w:p>
+      <w:pPr>
+        <w:pStyle w:val="Heading2"/>
+      </w:pPr>
+      <w:r>
+        <w:t xml:space="preserve">6.1 Åtgärdspaket och kostnad</w:t>
+      </w:r>
+    </w:p>
+    <w:p>
+      <w:pPr>
+        <w:spacing w:after="120"/>
+      </w:pPr>
+      <w:r>
+        <w:t xml:space="preserve">Fliken </w:t>
+      </w:r>
+      <w:r>
+        <w:rPr>
+          <w:b/>
+          <w:bCs/>
+        </w:rPr>
+        <w:t xml:space="preserve">Etapper</w:t>
+      </w:r>
+      <w:r>
+        <w:t xml:space="preserve"> gör prioriteringslistan till en plan. Sträckor med gällande klass A eller B (manuell bedömning om den är ifylld, annars maskinell) får metoden </w:t>
+      </w:r>
+      <w:r>
+        <w:rPr>
+          <w:b/>
+          <w:bCs/>
+        </w:rPr>
+        <w:t xml:space="preserve">strumpa</w:t>
+      </w:r>
+      <w:r>
+        <w:t xml:space="preserve">; relinade och klass C–E får ingen åtgärd. Metoden byts aldrig automatiskt till schakt – skriv </w:t>
+      </w:r>
+      <w:r>
+        <w:rPr>
+          <w:rFonts w:ascii="Consolas" w:cs="Consolas" w:eastAsia="Consolas" w:hAnsi="Consolas"/>
+          <w:sz w:val="20"/>
+          <w:szCs w:val="20"/>
+          <w:shd w:fill="F2F2F2" w:val="clear"/>
+        </w:rPr>
+        <w:t xml:space="preserve">schakt</w:t>
+      </w:r>
+      <w:r>
+        <w:t xml:space="preserve"> i kolumnen Manuell bedömning för de sträckor som inte går att infodra (kolumnen Åtgärdsflagga pekar ut grad 4-rörbrott/deformation med texten *går strumpa?*). </w:t>
+      </w:r>
+      <w:r>
+        <w:rPr>
+          <w:rFonts w:ascii="Consolas" w:cs="Consolas" w:eastAsia="Consolas" w:hAnsi="Consolas"/>
+          <w:sz w:val="20"/>
+          <w:szCs w:val="20"/>
+          <w:shd w:fill="F2F2F2" w:val="clear"/>
+        </w:rPr>
+        <w:t xml:space="preserve">strumpa</w:t>
+      </w:r>
+      <w:r>
+        <w:t xml:space="preserve"> och </w:t>
+      </w:r>
+      <w:r>
+        <w:rPr>
+          <w:rFonts w:ascii="Consolas" w:cs="Consolas" w:eastAsia="Consolas" w:hAnsi="Consolas"/>
+          <w:sz w:val="20"/>
+          <w:szCs w:val="20"/>
+          <w:shd w:fill="F2F2F2" w:val="clear"/>
+        </w:rPr>
+        <w:t xml:space="preserve">ingen</w:t>
+      </w:r>
+      <w:r>
+        <w:t xml:space="preserve"> i samma kolumn styr på samma sätt; A–E styr klassen. Sammanhängande sträckor med samma metod bildar en etapp, och en C- eller D-sträcka kortare än 60 m mellan två åtgärdssträckor tas med (*medtagen för sammanhang*). Etapperna numreras efter högsta konstruktionsindex, eller efter flest serviser uppströms om </w:t>
+      </w:r>
+      <w:r>
+        <w:rPr>
+          <w:rFonts w:ascii="Consolas" w:cs="Consolas" w:eastAsia="Consolas" w:hAnsi="Consolas"/>
+          <w:sz w:val="20"/>
+          <w:szCs w:val="20"/>
+          <w:shd w:fill="F2F2F2" w:val="clear"/>
+        </w:rPr>
+        <w:t xml:space="preserve">ETAPP_ORDNING = "konsekvens"</w:t>
+      </w:r>
+      <w:r>
+        <w:t xml:space="preserve"> och uppströmsanalysen (7.9) körts.</w:t>
+      </w:r>
+    </w:p>
+    <w:p>
+      <w:pPr>
+        <w:spacing w:after="120"/>
+      </w:pPr>
+      <w:r>
+        <w:rPr>
+          <w:b/>
+          <w:bCs/>
+        </w:rPr>
+        <w:t xml:space="preserve">Brunnstyp.</w:t>
+      </w:r>
+      <w:r>
+        <w:t xml:space="preserve"> Strumpan installeras från en nedstigningsbrunn (NB); från tillsyns- och rensbrunnar (TB, RB) går det inte. Typen tas ur TVDAT-koden vid sträckans ände, annars ur litterats prefix (KNBL → NB, KTB → TB, SRB → RB; okänd typ räknas som NB men flaggas). Har en strumpsträcka bara tillsyns-/rensbrunnar schaktas en brunn fram och en ny nedstigningsbrunn sätts. Det räknas </w:t>
+      </w:r>
+      <w:r>
+        <w:rPr>
+          <w:b/>
+          <w:bCs/>
+        </w:rPr>
+        <w:t xml:space="preserve">per brunn i etappen</w:t>
+      </w:r>
+      <w:r>
+        <w:t xml:space="preserve">: ligger flera sådana sträckor efter varandra räcker den gemensamma mittenbrunnen, och skriptet väljer så få brunnar som möjligt. Valet står i kolumnen Framschaktade brunnar; vill ni schakta fram en annan brunn skriver ni dess littera i Schakta fram (manuellt) och kör om med </w:t>
+      </w:r>
+      <w:r>
+        <w:rPr>
+          <w:rFonts w:ascii="Consolas" w:cs="Consolas" w:eastAsia="Consolas" w:hAnsi="Consolas"/>
+          <w:sz w:val="20"/>
+          <w:szCs w:val="20"/>
+          <w:shd w:fill="F2F2F2" w:val="clear"/>
+        </w:rPr>
+        <w:t xml:space="preserve">manuell:</w:t>
+      </w:r>
+      <w:r>
+        <w:t xml:space="preserve">.</w:t>
+      </w:r>
+    </w:p>
+    <w:p>
+      <w:pPr>
+        <w:spacing w:after="120"/>
+      </w:pPr>
+      <w:r>
+        <w:rPr>
+          <w:b/>
+          <w:bCs/>
+        </w:rPr>
+        <w:t xml:space="preserve">Lagning.</w:t>
+      </w:r>
+      <w:r>
+        <w:t xml:space="preserve"> Skador som brukar kräva punktlagning före strumpning (rörbrott/deformation grad 3–4, fogfel grad 4, ytskada grad 4) listas i Åtgärdsflagga (*lagning? 2×YTS4*). Bedöm i filmen hur många meter som behöver lagas och skriv det i kolumnen </w:t>
+      </w:r>
+      <w:r>
+        <w:rPr>
+          <w:b/>
+          <w:bCs/>
+        </w:rPr>
+        <w:t xml:space="preserve">Lagning (m)</w:t>
+      </w:r>
+      <w:r>
+        <w:t xml:space="preserve">; det prissätts per meter.</w:t>
+      </w:r>
+    </w:p>
+    <w:p>
+      <w:pPr>
+        <w:spacing w:after="120"/>
+      </w:pPr>
+      <w:r>
+        <w:rPr>
+          <w:b/>
+          <w:bCs/>
+        </w:rPr>
+        <w:t xml:space="preserve">Kostnad</w:t>
+      </w:r>
+      <w:r>
+        <w:t xml:space="preserve"> räknas för strumpsträckor ur </w:t>
+      </w:r>
+      <w:r>
+        <w:rPr>
+          <w:rFonts w:ascii="Consolas" w:cs="Consolas" w:eastAsia="Consolas" w:hAnsi="Consolas"/>
+          <w:sz w:val="20"/>
+          <w:szCs w:val="20"/>
+          <w:shd w:fill="F2F2F2" w:val="clear"/>
+        </w:rPr>
+        <w:t xml:space="preserve">kostnader.csv</w:t>
+      </w:r>
+      <w:r>
+        <w:t xml:space="preserve"> (semikolon, decimalkomma; posterna </w:t>
+      </w:r>
+      <w:r>
+        <w:rPr>
+          <w:rFonts w:ascii="Consolas" w:cs="Consolas" w:eastAsia="Consolas" w:hAnsi="Consolas"/>
+          <w:sz w:val="20"/>
+          <w:szCs w:val="20"/>
+          <w:shd w:fill="F2F2F2" w:val="clear"/>
+        </w:rPr>
+        <w:t xml:space="preserve">strumpa</w:t>
+      </w:r>
+      <w:r>
+        <w:t xml:space="preserve"> per dimensionsintervall kr/m, </w:t>
+      </w:r>
+      <w:r>
+        <w:rPr>
+          <w:rFonts w:ascii="Consolas" w:cs="Consolas" w:eastAsia="Consolas" w:hAnsi="Consolas"/>
+          <w:sz w:val="20"/>
+          <w:szCs w:val="20"/>
+          <w:shd w:fill="F2F2F2" w:val="clear"/>
+        </w:rPr>
+        <w:t xml:space="preserve">hatt</w:t>
+      </w:r>
+      <w:r>
+        <w:t xml:space="preserve"> kr/st per anslutning, </w:t>
+      </w:r>
+      <w:r>
+        <w:rPr>
+          <w:rFonts w:ascii="Consolas" w:cs="Consolas" w:eastAsia="Consolas" w:hAnsi="Consolas"/>
+          <w:sz w:val="20"/>
+          <w:szCs w:val="20"/>
+          <w:shd w:fill="F2F2F2" w:val="clear"/>
+        </w:rPr>
+        <w:t xml:space="preserve">lagning</w:t>
+      </w:r>
+      <w:r>
+        <w:t xml:space="preserve"> kr/m, </w:t>
+      </w:r>
+      <w:r>
+        <w:rPr>
+          <w:rFonts w:ascii="Consolas" w:cs="Consolas" w:eastAsia="Consolas" w:hAnsi="Consolas"/>
+          <w:sz w:val="20"/>
+          <w:szCs w:val="20"/>
+          <w:shd w:fill="F2F2F2" w:val="clear"/>
+        </w:rPr>
+        <w:t xml:space="preserve">framschaktning</w:t>
+      </w:r>
+      <w:r>
+        <w:t xml:space="preserve"> och </w:t>
+      </w:r>
+      <w:r>
+        <w:rPr>
+          <w:rFonts w:ascii="Consolas" w:cs="Consolas" w:eastAsia="Consolas" w:hAnsi="Consolas"/>
+          <w:sz w:val="20"/>
+          <w:szCs w:val="20"/>
+          <w:shd w:fill="F2F2F2" w:val="clear"/>
+        </w:rPr>
+        <w:t xml:space="preserve">ny_brunn</w:t>
+      </w:r>
+      <w:r>
+        <w:t xml:space="preserve"> kr/st per framschaktad brunn, </w:t>
+      </w:r>
+      <w:r>
+        <w:rPr>
+          <w:rFonts w:ascii="Consolas" w:cs="Consolas" w:eastAsia="Consolas" w:hAnsi="Consolas"/>
+          <w:sz w:val="20"/>
+          <w:szCs w:val="20"/>
+          <w:shd w:fill="F2F2F2" w:val="clear"/>
+        </w:rPr>
+        <w:t xml:space="preserve">etablering</w:t>
+      </w:r>
+      <w:r>
+        <w:t xml:space="preserve"> kr per etapp). Värdena i repot är </w:t>
+      </w:r>
+      <w:r>
+        <w:rPr>
+          <w:b/>
+          <w:bCs/>
+        </w:rPr>
+        <w:t xml:space="preserve">schabloner</w:t>
+      </w:r>
+      <w:r>
+        <w:t xml:space="preserve"> – byt mot egna erfarenhetsvärden. Saknas pris för en dimension flaggas sträckan. Sträckor med metod schakt får ingen kostnad (den beror på djup och om spont behövs) utan redovisas med längd under *Schakt – kostnad ej beräknad*. Kostnaderna syns per sträcka i Prioritering (utan brunnsposter), per etapp i Etapper och summerade i Sammanfattning, och följer med till kartan som fälten ETAPP, METOD och KOSTNAD.</w:t>
+      </w:r>
+    </w:p>
+    <w:p>
+      <w:pPr>
+        <w:spacing w:after="120"/>
+      </w:pPr>
+      <w:r>
+        <w:rPr>
+          <w:b/>
+          <w:bCs/>
+        </w:rPr>
+        <w:t xml:space="preserve">Arbetsgång.</w:t>
+      </w:r>
+      <w:r>
+        <w:t xml:space="preserve"> Kör analysen, fyll i Manuell bedömning, Kommentar, Lagning (m) och eventuellt Schakta fram (manuellt) i Excel, spara filen under nytt namn och ange den med </w:t>
+      </w:r>
+      <w:r>
+        <w:rPr>
+          <w:rFonts w:ascii="Consolas" w:cs="Consolas" w:eastAsia="Consolas" w:hAnsi="Consolas"/>
+          <w:sz w:val="20"/>
+          <w:szCs w:val="20"/>
+          <w:shd w:fill="F2F2F2" w:val="clear"/>
+        </w:rPr>
+        <w:t xml:space="preserve">manuell:</w:t>
+      </w:r>
+      <w:r>
+        <w:t xml:space="preserve"> i listfilen. Nästa körning läser värdena (matchning på TV3-fil och sträcknummer, annars brunnspar), räknar om etapper och kostnad och skriver dem i den nya Excel-filen igen, så att genomgången kan fortsätta.</w:t>
+      </w:r>
+    </w:p>
+    <w:tbl>
+      <w:tblPr>
+        <w:tblW w:type="dxa" w:w="9360"/>
+        <w:tblBorders>
+          <w:top w:val="single" w:color="auto" w:sz="4"/>
+          <w:left w:val="single" w:color="auto" w:sz="4"/>
+          <w:bottom w:val="single" w:color="auto" w:sz="4"/>
+          <w:right w:val="single" w:color="auto" w:sz="4"/>
+          <w:insideH w:val="single" w:color="auto" w:sz="4"/>
+          <w:insideV w:val="single" w:color="auto" w:sz="4"/>
+        </w:tblBorders>
+      </w:tblPr>
+      <w:tblGrid>
+        <w:gridCol w:w="2600"/>
+        <w:gridCol w:w="5000"/>
+        <w:gridCol w:w="1760"/>
+      </w:tblGrid>
+      <w:tr>
+        <w:trPr>
+          <w:tblHeader/>
+        </w:trPr>
+        <w:tc>
+          <w:tcPr>
+            <w:tcW w:type="dxa" w:w="2600"/>
+            <w:tcBorders>
+              <w:top w:val="single" w:color="BFBFBF" w:sz="4"/>
+              <w:left w:val="single" w:color="BFBFBF" w:sz="4"/>
+              <w:bottom w:val="single" w:color="BFBFBF" w:sz="4"/>
+              <w:right w:val="single" w:color="BFBFBF" w:sz="4"/>
+            </w:tcBorders>
+            <w:shd w:fill="1F3864" w:val="clear"/>
+            <w:tcMar>
+              <w:top w:type="dxa" w:w="60"/>
+              <w:left w:type="dxa" w:w="100"/>
+              <w:bottom w:type="dxa" w:w="60"/>
+              <w:right w:type="dxa" w:w="100"/>
+            </w:tcMar>
+          </w:tcPr>
+          <w:p>
+            <w:pPr>
+              <w:spacing w:after="0"/>
+            </w:pPr>
+            <w:r>
+              <w:rPr>
+                <w:b/>
+                <w:bCs/>
+                <w:color w:val="FFFFFF"/>
+                <w:sz w:val="20"/>
+                <w:szCs w:val="20"/>
+              </w:rPr>
+              <w:t xml:space="preserve">Parameter</w:t>
+            </w:r>
+          </w:p>
+        </w:tc>
+        <w:tc>
+          <w:tcPr>
+            <w:tcW w:type="dxa" w:w="5000"/>
+            <w:tcBorders>
+              <w:top w:val="single" w:color="BFBFBF" w:sz="4"/>
+              <w:left w:val="single" w:color="BFBFBF" w:sz="4"/>
+              <w:bottom w:val="single" w:color="BFBFBF" w:sz="4"/>
+              <w:right w:val="single" w:color="BFBFBF" w:sz="4"/>
+            </w:tcBorders>
+            <w:shd w:fill="1F3864" w:val="clear"/>
+            <w:tcMar>
+              <w:top w:type="dxa" w:w="60"/>
+              <w:left w:type="dxa" w:w="100"/>
+              <w:bottom w:type="dxa" w:w="60"/>
+              <w:right w:type="dxa" w:w="100"/>
+            </w:tcMar>
+          </w:tcPr>
+          <w:p>
+            <w:pPr>
+              <w:spacing w:after="0"/>
+            </w:pPr>
+            <w:r>
+              <w:rPr>
+                <w:b/>
+                <w:bCs/>
+                <w:color w:val="FFFFFF"/>
+                <w:sz w:val="20"/>
+                <w:szCs w:val="20"/>
+              </w:rPr>
+              <w:t xml:space="preserve">Betydelse</w:t>
+            </w:r>
+          </w:p>
+        </w:tc>
+        <w:tc>
+          <w:tcPr>
+            <w:tcW w:type="dxa" w:w="1760"/>
+            <w:tcBorders>
+              <w:top w:val="single" w:color="BFBFBF" w:sz="4"/>
+              <w:left w:val="single" w:color="BFBFBF" w:sz="4"/>
+              <w:bottom w:val="single" w:color="BFBFBF" w:sz="4"/>
+              <w:right w:val="single" w:color="BFBFBF" w:sz="4"/>
+            </w:tcBorders>
+            <w:shd w:fill="1F3864" w:val="clear"/>
+            <w:tcMar>
+              <w:top w:type="dxa" w:w="60"/>
+              <w:left w:type="dxa" w:w="100"/>
+              <w:bottom w:type="dxa" w:w="60"/>
+              <w:right w:type="dxa" w:w="100"/>
+            </w:tcMar>
+          </w:tcPr>
+          <w:p>
+            <w:pPr>
+              <w:spacing w:after="0"/>
+            </w:pPr>
+            <w:r>
+              <w:rPr>
+                <w:b/>
+                <w:bCs/>
+                <w:color w:val="FFFFFF"/>
+                <w:sz w:val="20"/>
+                <w:szCs w:val="20"/>
+              </w:rPr>
+              <w:t xml:space="preserve">Standard</w:t>
+            </w:r>
+          </w:p>
+        </w:tc>
+      </w:tr>
+      <w:tr>
+        <w:tc>
+          <w:tcPr>
+            <w:tcW w:type="dxa" w:w="2600"/>
+            <w:tcBorders>
+              <w:top w:val="single" w:color="BFBFBF" w:sz="4"/>
+              <w:left w:val="single" w:color="BFBFBF" w:sz="4"/>
+              <w:bottom w:val="single" w:color="BFBFBF" w:sz="4"/>
+              <w:right w:val="single" w:color="BFBFBF" w:sz="4"/>
+            </w:tcBorders>
+            <w:tcMar>
+              <w:top w:type="dxa" w:w="60"/>
+              <w:left w:type="dxa" w:w="100"/>
+              <w:bottom w:type="dxa" w:w="60"/>
+              <w:right w:type="dxa" w:w="100"/>
+            </w:tcMar>
+          </w:tcPr>
+          <w:p>
+            <w:pPr>
+              <w:spacing w:after="0"/>
+            </w:pPr>
+            <w:r>
+              <w:rPr>
+                <w:rFonts w:ascii="Consolas" w:cs="Consolas" w:eastAsia="Consolas" w:hAnsi="Consolas"/>
+                <w:sz w:val="20"/>
+                <w:szCs w:val="20"/>
+                <w:shd w:fill="F2F2F2" w:val="clear"/>
+              </w:rPr>
+              <w:t xml:space="preserve">KOSTNADSFIL</w:t>
+            </w:r>
+          </w:p>
+        </w:tc>
+        <w:tc>
+          <w:tcPr>
+            <w:tcW w:type="dxa" w:w="5000"/>
+            <w:tcBorders>
+              <w:top w:val="single" w:color="BFBFBF" w:sz="4"/>
+              <w:left w:val="single" w:color="BFBFBF" w:sz="4"/>
+              <w:bottom w:val="single" w:color="BFBFBF" w:sz="4"/>
+              <w:right w:val="single" w:color="BFBFBF" w:sz="4"/>
+            </w:tcBorders>
+            <w:tcMar>
+              <w:top w:type="dxa" w:w="60"/>
+              <w:left w:type="dxa" w:w="100"/>
+              <w:bottom w:type="dxa" w:w="60"/>
+              <w:right w:type="dxa" w:w="100"/>
+            </w:tcMar>
+          </w:tcPr>
+          <w:p>
+            <w:pPr>
+              <w:spacing w:after="0"/>
+            </w:pPr>
+            <w:r>
+              <w:t xml:space="preserve">Kostnadsfil som söks bredvid listfilen, annars bredvid skriptet.</w:t>
+            </w:r>
+          </w:p>
+        </w:tc>
+        <w:tc>
+          <w:tcPr>
+            <w:tcW w:type="dxa" w:w="1760"/>
+            <w:tcBorders>
+              <w:top w:val="single" w:color="BFBFBF" w:sz="4"/>
+              <w:left w:val="single" w:color="BFBFBF" w:sz="4"/>
+              <w:bottom w:val="single" w:color="BFBFBF" w:sz="4"/>
+              <w:right w:val="single" w:color="BFBFBF" w:sz="4"/>
+            </w:tcBorders>
+            <w:tcMar>
+              <w:top w:type="dxa" w:w="60"/>
+              <w:left w:type="dxa" w:w="100"/>
+              <w:bottom w:type="dxa" w:w="60"/>
+              <w:right w:type="dxa" w:w="100"/>
+            </w:tcMar>
+          </w:tcPr>
+          <w:p>
+            <w:pPr>
+              <w:spacing w:after="0"/>
+            </w:pPr>
+            <w:r>
+              <w:rPr>
+                <w:rFonts w:ascii="Consolas" w:cs="Consolas" w:eastAsia="Consolas" w:hAnsi="Consolas"/>
+                <w:sz w:val="20"/>
+                <w:szCs w:val="20"/>
+                <w:shd w:fill="F2F2F2" w:val="clear"/>
+              </w:rPr>
+              <w:t xml:space="preserve">kostnader.csv</w:t>
+            </w:r>
+          </w:p>
+        </w:tc>
+      </w:tr>
+      <w:tr>
+        <w:tc>
+          <w:tcPr>
+            <w:tcW w:type="dxa" w:w="2600"/>
+            <w:tcBorders>
+              <w:top w:val="single" w:color="BFBFBF" w:sz="4"/>
+              <w:left w:val="single" w:color="BFBFBF" w:sz="4"/>
+              <w:bottom w:val="single" w:color="BFBFBF" w:sz="4"/>
+              <w:right w:val="single" w:color="BFBFBF" w:sz="4"/>
+            </w:tcBorders>
+            <w:shd w:fill="F7F9FC" w:val="clear"/>
+            <w:tcMar>
+              <w:top w:type="dxa" w:w="60"/>
+              <w:left w:type="dxa" w:w="100"/>
+              <w:bottom w:type="dxa" w:w="60"/>
+              <w:right w:type="dxa" w:w="100"/>
+            </w:tcMar>
+          </w:tcPr>
+          <w:p>
+            <w:pPr>
+              <w:spacing w:after="0"/>
+            </w:pPr>
+            <w:r>
+              <w:rPr>
+                <w:rFonts w:ascii="Consolas" w:cs="Consolas" w:eastAsia="Consolas" w:hAnsi="Consolas"/>
+                <w:sz w:val="20"/>
+                <w:szCs w:val="20"/>
+                <w:shd w:fill="F2F2F2" w:val="clear"/>
+              </w:rPr>
+              <w:t xml:space="preserve">ATGARD_KLASSER</w:t>
+            </w:r>
+          </w:p>
+        </w:tc>
+        <w:tc>
+          <w:tcPr>
+            <w:tcW w:type="dxa" w:w="5000"/>
+            <w:tcBorders>
+              <w:top w:val="single" w:color="BFBFBF" w:sz="4"/>
+              <w:left w:val="single" w:color="BFBFBF" w:sz="4"/>
+              <w:bottom w:val="single" w:color="BFBFBF" w:sz="4"/>
+              <w:right w:val="single" w:color="BFBFBF" w:sz="4"/>
+            </w:tcBorders>
+            <w:shd w:fill="F7F9FC" w:val="clear"/>
+            <w:tcMar>
+              <w:top w:type="dxa" w:w="60"/>
+              <w:left w:type="dxa" w:w="100"/>
+              <w:bottom w:type="dxa" w:w="60"/>
+              <w:right w:type="dxa" w:w="100"/>
+            </w:tcMar>
+          </w:tcPr>
+          <w:p>
+            <w:pPr>
+              <w:spacing w:after="0"/>
+            </w:pPr>
+            <w:r>
+              <w:t xml:space="preserve">Gällande klasser som får åtgärd (strumpa).</w:t>
+            </w:r>
+          </w:p>
+        </w:tc>
+        <w:tc>
+          <w:tcPr>
+            <w:tcW w:type="dxa" w:w="1760"/>
+            <w:tcBorders>
+              <w:top w:val="single" w:color="BFBFBF" w:sz="4"/>
+              <w:left w:val="single" w:color="BFBFBF" w:sz="4"/>
+              <w:bottom w:val="single" w:color="BFBFBF" w:sz="4"/>
+              <w:right w:val="single" w:color="BFBFBF" w:sz="4"/>
+            </w:tcBorders>
+            <w:shd w:fill="F7F9FC" w:val="clear"/>
+            <w:tcMar>
+              <w:top w:type="dxa" w:w="60"/>
+              <w:left w:type="dxa" w:w="100"/>
+              <w:bottom w:type="dxa" w:w="60"/>
+              <w:right w:type="dxa" w:w="100"/>
+            </w:tcMar>
+          </w:tcPr>
+          <w:p>
+            <w:pPr>
+              <w:spacing w:after="0"/>
+            </w:pPr>
+            <w:r>
+              <w:t xml:space="preserve">A, B</w:t>
+            </w:r>
+          </w:p>
+        </w:tc>
+      </w:tr>
+      <w:tr>
+        <w:tc>
+          <w:tcPr>
+            <w:tcW w:type="dxa" w:w="2600"/>
+            <w:tcBorders>
+              <w:top w:val="single" w:color="BFBFBF" w:sz="4"/>
+              <w:left w:val="single" w:color="BFBFBF" w:sz="4"/>
+              <w:bottom w:val="single" w:color="BFBFBF" w:sz="4"/>
+              <w:right w:val="single" w:color="BFBFBF" w:sz="4"/>
+            </w:tcBorders>
+            <w:tcMar>
+              <w:top w:type="dxa" w:w="60"/>
+              <w:left w:type="dxa" w:w="100"/>
+              <w:bottom w:type="dxa" w:w="60"/>
+              <w:right w:type="dxa" w:w="100"/>
+            </w:tcMar>
+          </w:tcPr>
+          <w:p>
+            <w:pPr>
+              <w:spacing w:after="0"/>
+            </w:pPr>
+            <w:r>
+              <w:rPr>
+                <w:rFonts w:ascii="Consolas" w:cs="Consolas" w:eastAsia="Consolas" w:hAnsi="Consolas"/>
+                <w:sz w:val="20"/>
+                <w:szCs w:val="20"/>
+                <w:shd w:fill="F2F2F2" w:val="clear"/>
+              </w:rPr>
+              <w:t xml:space="preserve">SCHAKT_AUTOMATISKT</w:t>
+            </w:r>
+          </w:p>
+        </w:tc>
+        <w:tc>
+          <w:tcPr>
+            <w:tcW w:type="dxa" w:w="5000"/>
+            <w:tcBorders>
+              <w:top w:val="single" w:color="BFBFBF" w:sz="4"/>
+              <w:left w:val="single" w:color="BFBFBF" w:sz="4"/>
+              <w:bottom w:val="single" w:color="BFBFBF" w:sz="4"/>
+              <w:right w:val="single" w:color="BFBFBF" w:sz="4"/>
+            </w:tcBorders>
+            <w:tcMar>
+              <w:top w:type="dxa" w:w="60"/>
+              <w:left w:type="dxa" w:w="100"/>
+              <w:bottom w:type="dxa" w:w="60"/>
+              <w:right w:type="dxa" w:w="100"/>
+            </w:tcMar>
+          </w:tcPr>
+          <w:p>
+            <w:pPr>
+              <w:spacing w:after="0"/>
+            </w:pPr>
+            <w:r>
+              <w:rPr>
+                <w:rFonts w:ascii="Consolas" w:cs="Consolas" w:eastAsia="Consolas" w:hAnsi="Consolas"/>
+                <w:sz w:val="20"/>
+                <w:szCs w:val="20"/>
+                <w:shd w:fill="F2F2F2" w:val="clear"/>
+              </w:rPr>
+              <w:t xml:space="preserve">True</w:t>
+            </w:r>
+            <w:r>
+              <w:t xml:space="preserve"> = grad 4 på rörbrott/deformation ger schakt automatiskt. Standard: bara manuell bedömning byter metod.</w:t>
+            </w:r>
+          </w:p>
+        </w:tc>
+        <w:tc>
+          <w:tcPr>
+            <w:tcW w:type="dxa" w:w="1760"/>
+            <w:tcBorders>
+              <w:top w:val="single" w:color="BFBFBF" w:sz="4"/>
+              <w:left w:val="single" w:color="BFBFBF" w:sz="4"/>
+              <w:bottom w:val="single" w:color="BFBFBF" w:sz="4"/>
+              <w:right w:val="single" w:color="BFBFBF" w:sz="4"/>
+            </w:tcBorders>
+            <w:tcMar>
+              <w:top w:type="dxa" w:w="60"/>
+              <w:left w:type="dxa" w:w="100"/>
+              <w:bottom w:type="dxa" w:w="60"/>
+              <w:right w:type="dxa" w:w="100"/>
+            </w:tcMar>
+          </w:tcPr>
+          <w:p>
+            <w:pPr>
+              <w:spacing w:after="0"/>
+            </w:pPr>
+            <w:r>
+              <w:rPr>
+                <w:rFonts w:ascii="Consolas" w:cs="Consolas" w:eastAsia="Consolas" w:hAnsi="Consolas"/>
+                <w:sz w:val="20"/>
+                <w:szCs w:val="20"/>
+                <w:shd w:fill="F2F2F2" w:val="clear"/>
+              </w:rPr>
+              <w:t xml:space="preserve">False</w:t>
+            </w:r>
+          </w:p>
+        </w:tc>
+      </w:tr>
+      <w:tr>
+        <w:tc>
+          <w:tcPr>
+            <w:tcW w:type="dxa" w:w="2600"/>
+            <w:tcBorders>
+              <w:top w:val="single" w:color="BFBFBF" w:sz="4"/>
+              <w:left w:val="single" w:color="BFBFBF" w:sz="4"/>
+              <w:bottom w:val="single" w:color="BFBFBF" w:sz="4"/>
+              <w:right w:val="single" w:color="BFBFBF" w:sz="4"/>
+            </w:tcBorders>
+            <w:shd w:fill="F7F9FC" w:val="clear"/>
+            <w:tcMar>
+              <w:top w:type="dxa" w:w="60"/>
+              <w:left w:type="dxa" w:w="100"/>
+              <w:bottom w:type="dxa" w:w="60"/>
+              <w:right w:type="dxa" w:w="100"/>
+            </w:tcMar>
+          </w:tcPr>
+          <w:p>
+            <w:pPr>
+              <w:spacing w:after="0"/>
+            </w:pPr>
+            <w:r>
+              <w:rPr>
+                <w:rFonts w:ascii="Consolas" w:cs="Consolas" w:eastAsia="Consolas" w:hAnsi="Consolas"/>
+                <w:sz w:val="20"/>
+                <w:szCs w:val="20"/>
+                <w:shd w:fill="F2F2F2" w:val="clear"/>
+              </w:rPr>
+              <w:t xml:space="preserve">ETAPP_OVERBRYGGA_M</w:t>
+            </w:r>
+          </w:p>
+        </w:tc>
+        <w:tc>
+          <w:tcPr>
+            <w:tcW w:type="dxa" w:w="5000"/>
+            <w:tcBorders>
+              <w:top w:val="single" w:color="BFBFBF" w:sz="4"/>
+              <w:left w:val="single" w:color="BFBFBF" w:sz="4"/>
+              <w:bottom w:val="single" w:color="BFBFBF" w:sz="4"/>
+              <w:right w:val="single" w:color="BFBFBF" w:sz="4"/>
+            </w:tcBorders>
+            <w:shd w:fill="F7F9FC" w:val="clear"/>
+            <w:tcMar>
+              <w:top w:type="dxa" w:w="60"/>
+              <w:left w:type="dxa" w:w="100"/>
+              <w:bottom w:type="dxa" w:w="60"/>
+              <w:right w:type="dxa" w:w="100"/>
+            </w:tcMar>
+          </w:tcPr>
+          <w:p>
+            <w:pPr>
+              <w:spacing w:after="0"/>
+            </w:pPr>
+            <w:r>
+              <w:t xml:space="preserve">C/D-sträcka kortare än så (m) mellan två åtgärdssträckor tas med i etappen.</w:t>
+            </w:r>
+          </w:p>
+        </w:tc>
+        <w:tc>
+          <w:tcPr>
+            <w:tcW w:type="dxa" w:w="1760"/>
+            <w:tcBorders>
+              <w:top w:val="single" w:color="BFBFBF" w:sz="4"/>
+              <w:left w:val="single" w:color="BFBFBF" w:sz="4"/>
+              <w:bottom w:val="single" w:color="BFBFBF" w:sz="4"/>
+              <w:right w:val="single" w:color="BFBFBF" w:sz="4"/>
+            </w:tcBorders>
+            <w:shd w:fill="F7F9FC" w:val="clear"/>
+            <w:tcMar>
+              <w:top w:type="dxa" w:w="60"/>
+              <w:left w:type="dxa" w:w="100"/>
+              <w:bottom w:type="dxa" w:w="60"/>
+              <w:right w:type="dxa" w:w="100"/>
+            </w:tcMar>
+          </w:tcPr>
+          <w:p>
+            <w:pPr>
+              <w:spacing w:after="0"/>
+            </w:pPr>
+            <w:r>
+              <w:t xml:space="preserve">60</w:t>
+            </w:r>
+          </w:p>
+        </w:tc>
+      </w:tr>
+      <w:tr>
+        <w:tc>
+          <w:tcPr>
+            <w:tcW w:type="dxa" w:w="2600"/>
+            <w:tcBorders>
+              <w:top w:val="single" w:color="BFBFBF" w:sz="4"/>
+              <w:left w:val="single" w:color="BFBFBF" w:sz="4"/>
+              <w:bottom w:val="single" w:color="BFBFBF" w:sz="4"/>
+              <w:right w:val="single" w:color="BFBFBF" w:sz="4"/>
+            </w:tcBorders>
+            <w:tcMar>
+              <w:top w:type="dxa" w:w="60"/>
+              <w:left w:type="dxa" w:w="100"/>
+              <w:bottom w:type="dxa" w:w="60"/>
+              <w:right w:type="dxa" w:w="100"/>
+            </w:tcMar>
+          </w:tcPr>
+          <w:p>
+            <w:pPr>
+              <w:spacing w:after="0"/>
+            </w:pPr>
+            <w:r>
+              <w:rPr>
+                <w:rFonts w:ascii="Consolas" w:cs="Consolas" w:eastAsia="Consolas" w:hAnsi="Consolas"/>
+                <w:sz w:val="20"/>
+                <w:szCs w:val="20"/>
+                <w:shd w:fill="F2F2F2" w:val="clear"/>
+              </w:rPr>
+              <w:t xml:space="preserve">ETAPP_ORDNING</w:t>
+            </w:r>
+          </w:p>
+        </w:tc>
+        <w:tc>
+          <w:tcPr>
+            <w:tcW w:type="dxa" w:w="5000"/>
+            <w:tcBorders>
+              <w:top w:val="single" w:color="BFBFBF" w:sz="4"/>
+              <w:left w:val="single" w:color="BFBFBF" w:sz="4"/>
+              <w:bottom w:val="single" w:color="BFBFBF" w:sz="4"/>
+              <w:right w:val="single" w:color="BFBFBF" w:sz="4"/>
+            </w:tcBorders>
+            <w:tcMar>
+              <w:top w:type="dxa" w:w="60"/>
+              <w:left w:type="dxa" w:w="100"/>
+              <w:bottom w:type="dxa" w:w="60"/>
+              <w:right w:type="dxa" w:w="100"/>
+            </w:tcMar>
+          </w:tcPr>
+          <w:p>
+            <w:pPr>
+              <w:spacing w:after="0"/>
+            </w:pPr>
+            <w:r>
+              <w:rPr>
+                <w:rFonts w:ascii="Consolas" w:cs="Consolas" w:eastAsia="Consolas" w:hAnsi="Consolas"/>
+                <w:sz w:val="20"/>
+                <w:szCs w:val="20"/>
+                <w:shd w:fill="F2F2F2" w:val="clear"/>
+              </w:rPr>
+              <w:t xml:space="preserve">index</w:t>
+            </w:r>
+            <w:r>
+              <w:t xml:space="preserve"> = högsta konstruktionsindex först; </w:t>
+            </w:r>
+            <w:r>
+              <w:rPr>
+                <w:rFonts w:ascii="Consolas" w:cs="Consolas" w:eastAsia="Consolas" w:hAnsi="Consolas"/>
+                <w:sz w:val="20"/>
+                <w:szCs w:val="20"/>
+                <w:shd w:fill="F2F2F2" w:val="clear"/>
+              </w:rPr>
+              <w:t xml:space="preserve">konsekvens</w:t>
+            </w:r>
+            <w:r>
+              <w:t xml:space="preserve"> = flest serviser uppströms först.</w:t>
+            </w:r>
+          </w:p>
+        </w:tc>
+        <w:tc>
+          <w:tcPr>
+            <w:tcW w:type="dxa" w:w="1760"/>
+            <w:tcBorders>
+              <w:top w:val="single" w:color="BFBFBF" w:sz="4"/>
+              <w:left w:val="single" w:color="BFBFBF" w:sz="4"/>
+              <w:bottom w:val="single" w:color="BFBFBF" w:sz="4"/>
+              <w:right w:val="single" w:color="BFBFBF" w:sz="4"/>
+            </w:tcBorders>
+            <w:tcMar>
+              <w:top w:type="dxa" w:w="60"/>
+              <w:left w:type="dxa" w:w="100"/>
+              <w:bottom w:type="dxa" w:w="60"/>
+              <w:right w:type="dxa" w:w="100"/>
+            </w:tcMar>
+          </w:tcPr>
+          <w:p>
+            <w:pPr>
+              <w:spacing w:after="0"/>
+            </w:pPr>
+            <w:r>
+              <w:rPr>
+                <w:rFonts w:ascii="Consolas" w:cs="Consolas" w:eastAsia="Consolas" w:hAnsi="Consolas"/>
+                <w:sz w:val="20"/>
+                <w:szCs w:val="20"/>
+                <w:shd w:fill="F2F2F2" w:val="clear"/>
+              </w:rPr>
+              <w:t xml:space="preserve">index</w:t>
+            </w:r>
+          </w:p>
+        </w:tc>
+      </w:tr>
+      <w:tr>
+        <w:tc>
+          <w:tcPr>
+            <w:tcW w:type="dxa" w:w="2600"/>
+            <w:tcBorders>
+              <w:top w:val="single" w:color="BFBFBF" w:sz="4"/>
+              <w:left w:val="single" w:color="BFBFBF" w:sz="4"/>
+              <w:bottom w:val="single" w:color="BFBFBF" w:sz="4"/>
+              <w:right w:val="single" w:color="BFBFBF" w:sz="4"/>
+            </w:tcBorders>
+            <w:shd w:fill="F7F9FC" w:val="clear"/>
+            <w:tcMar>
+              <w:top w:type="dxa" w:w="60"/>
+              <w:left w:type="dxa" w:w="100"/>
+              <w:bottom w:type="dxa" w:w="60"/>
+              <w:right w:type="dxa" w:w="100"/>
+            </w:tcMar>
+          </w:tcPr>
+          <w:p>
+            <w:pPr>
+              <w:spacing w:after="0"/>
+            </w:pPr>
+            <w:r>
+              <w:rPr>
+                <w:rFonts w:ascii="Consolas" w:cs="Consolas" w:eastAsia="Consolas" w:hAnsi="Consolas"/>
+                <w:sz w:val="20"/>
+                <w:szCs w:val="20"/>
+                <w:shd w:fill="F2F2F2" w:val="clear"/>
+              </w:rPr>
+              <w:t xml:space="preserve">BRUNNSTYP_ANDE_M</w:t>
+            </w:r>
+          </w:p>
+        </w:tc>
+        <w:tc>
+          <w:tcPr>
+            <w:tcW w:type="dxa" w:w="5000"/>
+            <w:tcBorders>
+              <w:top w:val="single" w:color="BFBFBF" w:sz="4"/>
+              <w:left w:val="single" w:color="BFBFBF" w:sz="4"/>
+              <w:bottom w:val="single" w:color="BFBFBF" w:sz="4"/>
+              <w:right w:val="single" w:color="BFBFBF" w:sz="4"/>
+            </w:tcBorders>
+            <w:shd w:fill="F7F9FC" w:val="clear"/>
+            <w:tcMar>
+              <w:top w:type="dxa" w:w="60"/>
+              <w:left w:type="dxa" w:w="100"/>
+              <w:bottom w:type="dxa" w:w="60"/>
+              <w:right w:type="dxa" w:w="100"/>
+            </w:tcMar>
+          </w:tcPr>
+          <w:p>
+            <w:pPr>
+              <w:spacing w:after="0"/>
+            </w:pPr>
+            <w:r>
+              <w:t xml:space="preserve">TVDAT-kod NB/TB/RB så nära (m) sträckans ände gäller för brunnen där.</w:t>
+            </w:r>
+          </w:p>
+        </w:tc>
+        <w:tc>
+          <w:tcPr>
+            <w:tcW w:type="dxa" w:w="1760"/>
+            <w:tcBorders>
+              <w:top w:val="single" w:color="BFBFBF" w:sz="4"/>
+              <w:left w:val="single" w:color="BFBFBF" w:sz="4"/>
+              <w:bottom w:val="single" w:color="BFBFBF" w:sz="4"/>
+              <w:right w:val="single" w:color="BFBFBF" w:sz="4"/>
+            </w:tcBorders>
+            <w:shd w:fill="F7F9FC" w:val="clear"/>
+            <w:tcMar>
+              <w:top w:type="dxa" w:w="60"/>
+              <w:left w:type="dxa" w:w="100"/>
+              <w:bottom w:type="dxa" w:w="60"/>
+              <w:right w:type="dxa" w:w="100"/>
+            </w:tcMar>
+          </w:tcPr>
+          <w:p>
+            <w:pPr>
+              <w:spacing w:after="0"/>
+            </w:pPr>
+            <w:r>
+              <w:t xml:space="preserve">1,5</w:t>
+            </w:r>
+          </w:p>
+        </w:tc>
+      </w:tr>
+      <w:tr>
+        <w:tc>
+          <w:tcPr>
+            <w:tcW w:type="dxa" w:w="2600"/>
+            <w:tcBorders>
+              <w:top w:val="single" w:color="BFBFBF" w:sz="4"/>
+              <w:left w:val="single" w:color="BFBFBF" w:sz="4"/>
+              <w:bottom w:val="single" w:color="BFBFBF" w:sz="4"/>
+              <w:right w:val="single" w:color="BFBFBF" w:sz="4"/>
+            </w:tcBorders>
+            <w:tcMar>
+              <w:top w:type="dxa" w:w="60"/>
+              <w:left w:type="dxa" w:w="100"/>
+              <w:bottom w:type="dxa" w:w="60"/>
+              <w:right w:type="dxa" w:w="100"/>
+            </w:tcMar>
+          </w:tcPr>
+          <w:p>
+            <w:pPr>
+              <w:spacing w:after="0"/>
+            </w:pPr>
+            <w:r>
+              <w:rPr>
+                <w:rFonts w:ascii="Consolas" w:cs="Consolas" w:eastAsia="Consolas" w:hAnsi="Consolas"/>
+                <w:sz w:val="20"/>
+                <w:szCs w:val="20"/>
+                <w:shd w:fill="F2F2F2" w:val="clear"/>
+              </w:rPr>
+              <w:t xml:space="preserve">LAGNINGSKODER</w:t>
+            </w:r>
+          </w:p>
+        </w:tc>
+        <w:tc>
+          <w:tcPr>
+            <w:tcW w:type="dxa" w:w="5000"/>
+            <w:tcBorders>
+              <w:top w:val="single" w:color="BFBFBF" w:sz="4"/>
+              <w:left w:val="single" w:color="BFBFBF" w:sz="4"/>
+              <w:bottom w:val="single" w:color="BFBFBF" w:sz="4"/>
+              <w:right w:val="single" w:color="BFBFBF" w:sz="4"/>
+            </w:tcBorders>
+            <w:tcMar>
+              <w:top w:type="dxa" w:w="60"/>
+              <w:left w:type="dxa" w:w="100"/>
+              <w:bottom w:type="dxa" w:w="60"/>
+              <w:right w:type="dxa" w:w="100"/>
+            </w:tcMar>
+          </w:tcPr>
+          <w:p>
+            <w:pPr>
+              <w:spacing w:after="0"/>
+            </w:pPr>
+            <w:r>
+              <w:t xml:space="preserve">Kod + grad som listas som lagningsbehov i Åtgärdsflagga.</w:t>
+            </w:r>
+          </w:p>
+        </w:tc>
+        <w:tc>
+          <w:tcPr>
+            <w:tcW w:type="dxa" w:w="1760"/>
+            <w:tcBorders>
+              <w:top w:val="single" w:color="BFBFBF" w:sz="4"/>
+              <w:left w:val="single" w:color="BFBFBF" w:sz="4"/>
+              <w:bottom w:val="single" w:color="BFBFBF" w:sz="4"/>
+              <w:right w:val="single" w:color="BFBFBF" w:sz="4"/>
+            </w:tcBorders>
+            <w:tcMar>
+              <w:top w:type="dxa" w:w="60"/>
+              <w:left w:type="dxa" w:w="100"/>
+              <w:bottom w:type="dxa" w:w="60"/>
+              <w:right w:type="dxa" w:w="100"/>
+            </w:tcMar>
+          </w:tcPr>
+          <w:p>
+            <w:pPr>
+              <w:spacing w:after="0"/>
+            </w:pPr>
+            <w:r>
+              <w:t xml:space="preserve">RBR 3–4, DEF 3–4, FOG 4, YTS 4</w:t>
+            </w:r>
+          </w:p>
+        </w:tc>
+      </w:tr>
+      <w:tr>
+        <w:tc>
+          <w:tcPr>
+            <w:tcW w:type="dxa" w:w="2600"/>
+            <w:tcBorders>
+              <w:top w:val="single" w:color="BFBFBF" w:sz="4"/>
+              <w:left w:val="single" w:color="BFBFBF" w:sz="4"/>
+              <w:bottom w:val="single" w:color="BFBFBF" w:sz="4"/>
+              <w:right w:val="single" w:color="BFBFBF" w:sz="4"/>
+            </w:tcBorders>
+            <w:shd w:fill="F7F9FC" w:val="clear"/>
+            <w:tcMar>
+              <w:top w:type="dxa" w:w="60"/>
+              <w:left w:type="dxa" w:w="100"/>
+              <w:bottom w:type="dxa" w:w="60"/>
+              <w:right w:type="dxa" w:w="100"/>
+            </w:tcMar>
+          </w:tcPr>
+          <w:p>
+            <w:pPr>
+              <w:spacing w:after="0"/>
+            </w:pPr>
+            <w:r>
+              <w:rPr>
+                <w:rFonts w:ascii="Consolas" w:cs="Consolas" w:eastAsia="Consolas" w:hAnsi="Consolas"/>
+                <w:sz w:val="20"/>
+                <w:szCs w:val="20"/>
+                <w:shd w:fill="F2F2F2" w:val="clear"/>
+              </w:rPr>
+              <w:t xml:space="preserve">FRAMSCHAKTA_BRUNNAR</w:t>
+            </w:r>
+          </w:p>
+        </w:tc>
+        <w:tc>
+          <w:tcPr>
+            <w:tcW w:type="dxa" w:w="5000"/>
+            <w:tcBorders>
+              <w:top w:val="single" w:color="BFBFBF" w:sz="4"/>
+              <w:left w:val="single" w:color="BFBFBF" w:sz="4"/>
+              <w:bottom w:val="single" w:color="BFBFBF" w:sz="4"/>
+              <w:right w:val="single" w:color="BFBFBF" w:sz="4"/>
+            </w:tcBorders>
+            <w:shd w:fill="F7F9FC" w:val="clear"/>
+            <w:tcMar>
+              <w:top w:type="dxa" w:w="60"/>
+              <w:left w:type="dxa" w:w="100"/>
+              <w:bottom w:type="dxa" w:w="60"/>
+              <w:right w:type="dxa" w:w="100"/>
+            </w:tcMar>
+          </w:tcPr>
+          <w:p>
+            <w:pPr>
+              <w:spacing w:after="0"/>
+            </w:pPr>
+            <w:r>
+              <w:t xml:space="preserve">Brunnar (littera) som alltid schaktas fram; alternativ till kolumnen Schakta fram (manuellt).</w:t>
+            </w:r>
+          </w:p>
+        </w:tc>
+        <w:tc>
+          <w:tcPr>
+            <w:tcW w:type="dxa" w:w="1760"/>
+            <w:tcBorders>
+              <w:top w:val="single" w:color="BFBFBF" w:sz="4"/>
+              <w:left w:val="single" w:color="BFBFBF" w:sz="4"/>
+              <w:bottom w:val="single" w:color="BFBFBF" w:sz="4"/>
+              <w:right w:val="single" w:color="BFBFBF" w:sz="4"/>
+            </w:tcBorders>
+            <w:shd w:fill="F7F9FC" w:val="clear"/>
+            <w:tcMar>
+              <w:top w:type="dxa" w:w="60"/>
+              <w:left w:type="dxa" w:w="100"/>
+              <w:bottom w:type="dxa" w:w="60"/>
+              <w:right w:type="dxa" w:w="100"/>
+            </w:tcMar>
+          </w:tcPr>
+          <w:p>
+            <w:pPr>
+              <w:spacing w:after="0"/>
+            </w:pPr>
+            <w:r>
+              <w:t xml:space="preserve">–</w:t>
+            </w:r>
+          </w:p>
+        </w:tc>
+      </w:tr>
+    </w:tbl>
     <w:p>
       <w:pPr>
         <w:pStyle w:val="Heading1"/>

</xml_diff>

<commit_message>
PowerPoint ur analysen (steg 4)
Nytt skript tv3_pptx.py (python-pptx) fyller mall.pptx: titel, nyckeltal,
diagram, topplista, etapper och kostnad, en sida per sträcka i toppen med
översikt, foton och nyckeluppgifter, driftåtgärder, svackor, karta, metod
och nästa steg. Startas med --pptx från tv3_analys.py eller fristående ur
en färdig utdatamapp (läser kartunderlag.json, TV3-filerna och manuella
bedömningar ur prioritering.xlsx). kartunderlag.json får mediakataloger.
Nytt ArcMap-verktyg Exportera kartbild (kartbild.png till utdatamappen).
Handledning 6.2.

Co-Authored-By: Claude Fable 5.1 <noreply@anthropic.com>
Claude-Session: https://claude.ai/code/session_011fdqX3JEZje1LF9LqpaqR8
</commit_message>
<xml_diff>
--- a/Anvandarhandledning tv3_analys.docx
+++ b/Anvandarhandledning tv3_analys.docx
@@ -1671,7 +1671,7 @@
                 <w:szCs w:val="20"/>
                 <w:shd w:fill="F2F2F2" w:val="clear"/>
               </w:rPr>
-              <w:t xml:space="preserve">--karta ja|nej</w:t>
+              <w:t xml:space="preserve">--pptx</w:t>
             </w:r>
           </w:p>
         </w:tc>
@@ -1705,10 +1705,34 @@
                 <w:szCs w:val="20"/>
                 <w:shd w:fill="F2F2F2" w:val="clear"/>
               </w:rPr>
-              <w:t xml:space="preserve">kartunderlag.json</w:t>
-            </w:r>
-            <w:r>
-              <w:t xml:space="preserve"> för kartframställning i ArcMap (se avsnitt 7).</w:t>
+              <w:t xml:space="preserve">presentation.pptx</w:t>
+            </w:r>
+            <w:r>
+              <w:t xml:space="preserve"> i utdatamappen ur mallen </w:t>
+            </w:r>
+            <w:r>
+              <w:rPr>
+                <w:rFonts w:ascii="Consolas" w:cs="Consolas" w:eastAsia="Consolas" w:hAnsi="Consolas"/>
+                <w:sz w:val="20"/>
+                <w:szCs w:val="20"/>
+                <w:shd w:fill="F2F2F2" w:val="clear"/>
+              </w:rPr>
+              <w:t xml:space="preserve">mall.pptx</w:t>
+            </w:r>
+            <w:r>
+              <w:t xml:space="preserve"> (se 6.2). Kan också göras efteråt med </w:t>
+            </w:r>
+            <w:r>
+              <w:rPr>
+                <w:rFonts w:ascii="Consolas" w:cs="Consolas" w:eastAsia="Consolas" w:hAnsi="Consolas"/>
+                <w:sz w:val="20"/>
+                <w:szCs w:val="20"/>
+                <w:shd w:fill="F2F2F2" w:val="clear"/>
+              </w:rPr>
+              <w:t xml:space="preserve">python tv3_pptx.py UTDATAMAPP</w:t>
+            </w:r>
+            <w:r>
+              <w:t xml:space="preserve">.</w:t>
             </w:r>
           </w:p>
         </w:tc>
@@ -1733,13 +1757,7 @@
               <w:spacing w:after="0"/>
             </w:pPr>
             <w:r>
-              <w:rPr>
-                <w:rFonts w:ascii="Consolas" w:cs="Consolas" w:eastAsia="Consolas" w:hAnsi="Consolas"/>
-                <w:sz w:val="20"/>
-                <w:szCs w:val="20"/>
-                <w:shd w:fill="F2F2F2" w:val="clear"/>
-              </w:rPr>
-              <w:t xml:space="preserve">ja</w:t>
+              <w:t xml:space="preserve">av</w:t>
             </w:r>
           </w:p>
         </w:tc>
@@ -1773,7 +1791,7 @@
                 <w:szCs w:val="20"/>
                 <w:shd w:fill="F2F2F2" w:val="clear"/>
               </w:rPr>
-              <w:t xml:space="preserve">--media KATALOG</w:t>
+              <w:t xml:space="preserve">--karta ja|nej</w:t>
             </w:r>
           </w:p>
         </w:tc>
@@ -1799,7 +1817,19 @@
               <w:spacing w:after="0"/>
             </w:pPr>
             <w:r>
-              <w:t xml:space="preserve">Extra mapp att söka video- och bildfiler i (kan anges flera gånger). TV3-filens egen mapp söks alltid, inklusive undermappar.</w:t>
+              <w:t xml:space="preserve">Skriver </w:t>
+            </w:r>
+            <w:r>
+              <w:rPr>
+                <w:rFonts w:ascii="Consolas" w:cs="Consolas" w:eastAsia="Consolas" w:hAnsi="Consolas"/>
+                <w:sz w:val="20"/>
+                <w:szCs w:val="20"/>
+                <w:shd w:fill="F2F2F2" w:val="clear"/>
+              </w:rPr>
+              <w:t xml:space="preserve">kartunderlag.json</w:t>
+            </w:r>
+            <w:r>
+              <w:t xml:space="preserve"> för kartframställning i ArcMap (se avsnitt 7).</w:t>
             </w:r>
           </w:p>
         </w:tc>
@@ -1825,7 +1855,13 @@
               <w:spacing w:after="0"/>
             </w:pPr>
             <w:r>
-              <w:t xml:space="preserve">–</w:t>
+              <w:rPr>
+                <w:rFonts w:ascii="Consolas" w:cs="Consolas" w:eastAsia="Consolas" w:hAnsi="Consolas"/>
+                <w:sz w:val="20"/>
+                <w:szCs w:val="20"/>
+                <w:shd w:fill="F2F2F2" w:val="clear"/>
+              </w:rPr>
+              <w:t xml:space="preserve">ja</w:t>
             </w:r>
           </w:p>
         </w:tc>
@@ -1858,7 +1894,7 @@
                 <w:szCs w:val="20"/>
                 <w:shd w:fill="F2F2F2" w:val="clear"/>
               </w:rPr>
-              <w:t xml:space="preserve">--littera FIL.CSV</w:t>
+              <w:t xml:space="preserve">--media KATALOG</w:t>
             </w:r>
           </w:p>
         </w:tc>
@@ -1883,7 +1919,7 @@
               <w:spacing w:after="0"/>
             </w:pPr>
             <w:r>
-              <w:t xml:space="preserve">CSV med ersättningslittera för brunnar som märkts fel vid filmningen (se 3.3). Kan även anges i listfilen.</w:t>
+              <w:t xml:space="preserve">Extra mapp att söka video- och bildfiler i (kan anges flera gånger). TV3-filens egen mapp söks alltid, inklusive undermappar.</w:t>
             </w:r>
           </w:p>
         </w:tc>
@@ -1942,7 +1978,7 @@
                 <w:szCs w:val="20"/>
                 <w:shd w:fill="F2F2F2" w:val="clear"/>
               </w:rPr>
-              <w:t xml:space="preserve">--manuell FIL.XLSX</w:t>
+              <w:t xml:space="preserve">--littera FIL.CSV</w:t>
             </w:r>
           </w:p>
         </w:tc>
@@ -1968,19 +2004,7 @@
               <w:spacing w:after="0"/>
             </w:pPr>
             <w:r>
-              <w:t xml:space="preserve">Tidigare </w:t>
-            </w:r>
-            <w:r>
-              <w:rPr>
-                <w:rFonts w:ascii="Consolas" w:cs="Consolas" w:eastAsia="Consolas" w:hAnsi="Consolas"/>
-                <w:sz w:val="20"/>
-                <w:szCs w:val="20"/>
-                <w:shd w:fill="F2F2F2" w:val="clear"/>
-              </w:rPr>
-              <w:t xml:space="preserve">prioritering.xlsx</w:t>
-            </w:r>
-            <w:r>
-              <w:t xml:space="preserve"> med ifyllda manuella bedömningar, kommentarer och Lagning (m) (se 6.1). Kan även anges i listfilen.</w:t>
+              <w:t xml:space="preserve">CSV med ersättningslittera för brunnar som märkts fel vid filmningen (se 3.3). Kan även anges i listfilen.</w:t>
             </w:r>
           </w:p>
         </w:tc>
@@ -2039,7 +2063,7 @@
                 <w:szCs w:val="20"/>
                 <w:shd w:fill="F2F2F2" w:val="clear"/>
               </w:rPr>
-              <w:t xml:space="preserve">--kostnader FIL.CSV</w:t>
+              <w:t xml:space="preserve">--manuell FIL.XLSX</w:t>
             </w:r>
           </w:p>
         </w:tc>
@@ -2064,7 +2088,19 @@
               <w:spacing w:after="0"/>
             </w:pPr>
             <w:r>
-              <w:t xml:space="preserve">Kostnadsfil för åtgärdspaketet (se 6.1).</w:t>
+              <w:t xml:space="preserve">Tidigare </w:t>
+            </w:r>
+            <w:r>
+              <w:rPr>
+                <w:rFonts w:ascii="Consolas" w:cs="Consolas" w:eastAsia="Consolas" w:hAnsi="Consolas"/>
+                <w:sz w:val="20"/>
+                <w:szCs w:val="20"/>
+                <w:shd w:fill="F2F2F2" w:val="clear"/>
+              </w:rPr>
+              <w:t xml:space="preserve">prioritering.xlsx</w:t>
+            </w:r>
+            <w:r>
+              <w:t xml:space="preserve"> med ifyllda manuella bedömningar, kommentarer och Lagning (m) (se 6.1). Kan även anges i listfilen.</w:t>
             </w:r>
           </w:p>
         </w:tc>
@@ -2089,13 +2125,7 @@
               <w:spacing w:after="0"/>
             </w:pPr>
             <w:r>
-              <w:rPr>
-                <w:rFonts w:ascii="Consolas" w:cs="Consolas" w:eastAsia="Consolas" w:hAnsi="Consolas"/>
-                <w:sz w:val="20"/>
-                <w:szCs w:val="20"/>
-                <w:shd w:fill="F2F2F2" w:val="clear"/>
-              </w:rPr>
-              <w:t xml:space="preserve">kostnader.csv</w:t>
+              <w:t xml:space="preserve">–</w:t>
             </w:r>
           </w:p>
         </w:tc>
@@ -2129,7 +2159,7 @@
                 <w:szCs w:val="20"/>
                 <w:shd w:fill="F2F2F2" w:val="clear"/>
               </w:rPr>
-              <w:t xml:space="preserve">--etapper ja|nej</w:t>
+              <w:t xml:space="preserve">--kostnader FIL.CSV</w:t>
             </w:r>
           </w:p>
         </w:tc>
@@ -2155,8 +2185,31 @@
               <w:spacing w:after="0"/>
             </w:pPr>
             <w:r>
-              <w:t xml:space="preserve">Åtgärdspaket med etappindelning och kostnad (fliken Etapper). </w:t>
-            </w:r>
+              <w:t xml:space="preserve">Kostnadsfil för åtgärdspaketet (se 6.1).</w:t>
+            </w:r>
+          </w:p>
+        </w:tc>
+        <w:tc>
+          <w:tcPr>
+            <w:tcW w:type="dxa" w:w="1760"/>
+            <w:tcBorders>
+              <w:top w:val="single" w:color="BFBFBF" w:sz="4"/>
+              <w:left w:val="single" w:color="BFBFBF" w:sz="4"/>
+              <w:bottom w:val="single" w:color="BFBFBF" w:sz="4"/>
+              <w:right w:val="single" w:color="BFBFBF" w:sz="4"/>
+            </w:tcBorders>
+            <w:shd w:fill="F7F9FC" w:val="clear"/>
+            <w:tcMar>
+              <w:top w:type="dxa" w:w="60"/>
+              <w:left w:type="dxa" w:w="100"/>
+              <w:bottom w:type="dxa" w:w="60"/>
+              <w:right w:type="dxa" w:w="100"/>
+            </w:tcMar>
+          </w:tcPr>
+          <w:p>
+            <w:pPr>
+              <w:spacing w:after="0"/>
+            </w:pPr>
             <w:r>
               <w:rPr>
                 <w:rFonts w:ascii="Consolas" w:cs="Consolas" w:eastAsia="Consolas" w:hAnsi="Consolas"/>
@@ -2164,42 +2217,7 @@
                 <w:szCs w:val="20"/>
                 <w:shd w:fill="F2F2F2" w:val="clear"/>
               </w:rPr>
-              <w:t xml:space="preserve">nej</w:t>
-            </w:r>
-            <w:r>
-              <w:t xml:space="preserve"> hoppar över.</w:t>
-            </w:r>
-          </w:p>
-        </w:tc>
-        <w:tc>
-          <w:tcPr>
-            <w:tcW w:type="dxa" w:w="1760"/>
-            <w:tcBorders>
-              <w:top w:val="single" w:color="BFBFBF" w:sz="4"/>
-              <w:left w:val="single" w:color="BFBFBF" w:sz="4"/>
-              <w:bottom w:val="single" w:color="BFBFBF" w:sz="4"/>
-              <w:right w:val="single" w:color="BFBFBF" w:sz="4"/>
-            </w:tcBorders>
-            <w:shd w:fill="F7F9FC" w:val="clear"/>
-            <w:tcMar>
-              <w:top w:type="dxa" w:w="60"/>
-              <w:left w:type="dxa" w:w="100"/>
-              <w:bottom w:type="dxa" w:w="60"/>
-              <w:right w:type="dxa" w:w="100"/>
-            </w:tcMar>
-          </w:tcPr>
-          <w:p>
-            <w:pPr>
-              <w:spacing w:after="0"/>
-            </w:pPr>
-            <w:r>
-              <w:rPr>
-                <w:rFonts w:ascii="Consolas" w:cs="Consolas" w:eastAsia="Consolas" w:hAnsi="Consolas"/>
-                <w:sz w:val="20"/>
-                <w:szCs w:val="20"/>
-                <w:shd w:fill="F2F2F2" w:val="clear"/>
-              </w:rPr>
-              <w:t xml:space="preserve">ja</w:t>
+              <w:t xml:space="preserve">kostnader.csv</w:t>
             </w:r>
           </w:p>
         </w:tc>
@@ -2232,6 +2250,108 @@
                 <w:szCs w:val="20"/>
                 <w:shd w:fill="F2F2F2" w:val="clear"/>
               </w:rPr>
+              <w:t xml:space="preserve">--etapper ja|nej</w:t>
+            </w:r>
+          </w:p>
+        </w:tc>
+        <w:tc>
+          <w:tcPr>
+            <w:tcW w:type="dxa" w:w="5000"/>
+            <w:tcBorders>
+              <w:top w:val="single" w:color="BFBFBF" w:sz="4"/>
+              <w:left w:val="single" w:color="BFBFBF" w:sz="4"/>
+              <w:bottom w:val="single" w:color="BFBFBF" w:sz="4"/>
+              <w:right w:val="single" w:color="BFBFBF" w:sz="4"/>
+            </w:tcBorders>
+            <w:tcMar>
+              <w:top w:type="dxa" w:w="60"/>
+              <w:left w:type="dxa" w:w="100"/>
+              <w:bottom w:type="dxa" w:w="60"/>
+              <w:right w:type="dxa" w:w="100"/>
+            </w:tcMar>
+          </w:tcPr>
+          <w:p>
+            <w:pPr>
+              <w:spacing w:after="0"/>
+            </w:pPr>
+            <w:r>
+              <w:t xml:space="preserve">Åtgärdspaket med etappindelning och kostnad (fliken Etapper). </w:t>
+            </w:r>
+            <w:r>
+              <w:rPr>
+                <w:rFonts w:ascii="Consolas" w:cs="Consolas" w:eastAsia="Consolas" w:hAnsi="Consolas"/>
+                <w:sz w:val="20"/>
+                <w:szCs w:val="20"/>
+                <w:shd w:fill="F2F2F2" w:val="clear"/>
+              </w:rPr>
+              <w:t xml:space="preserve">nej</w:t>
+            </w:r>
+            <w:r>
+              <w:t xml:space="preserve"> hoppar över.</w:t>
+            </w:r>
+          </w:p>
+        </w:tc>
+        <w:tc>
+          <w:tcPr>
+            <w:tcW w:type="dxa" w:w="1760"/>
+            <w:tcBorders>
+              <w:top w:val="single" w:color="BFBFBF" w:sz="4"/>
+              <w:left w:val="single" w:color="BFBFBF" w:sz="4"/>
+              <w:bottom w:val="single" w:color="BFBFBF" w:sz="4"/>
+              <w:right w:val="single" w:color="BFBFBF" w:sz="4"/>
+            </w:tcBorders>
+            <w:tcMar>
+              <w:top w:type="dxa" w:w="60"/>
+              <w:left w:type="dxa" w:w="100"/>
+              <w:bottom w:type="dxa" w:w="60"/>
+              <w:right w:type="dxa" w:w="100"/>
+            </w:tcMar>
+          </w:tcPr>
+          <w:p>
+            <w:pPr>
+              <w:spacing w:after="0"/>
+            </w:pPr>
+            <w:r>
+              <w:rPr>
+                <w:rFonts w:ascii="Consolas" w:cs="Consolas" w:eastAsia="Consolas" w:hAnsi="Consolas"/>
+                <w:sz w:val="20"/>
+                <w:szCs w:val="20"/>
+                <w:shd w:fill="F2F2F2" w:val="clear"/>
+              </w:rPr>
+              <w:t xml:space="preserve">ja</w:t>
+            </w:r>
+          </w:p>
+        </w:tc>
+      </w:tr>
+      <w:tr>
+        <w:tc>
+          <w:tcPr>
+            <w:tcW w:type="dxa" w:w="2600"/>
+            <w:tcBorders>
+              <w:top w:val="single" w:color="BFBFBF" w:sz="4"/>
+              <w:left w:val="single" w:color="BFBFBF" w:sz="4"/>
+              <w:bottom w:val="single" w:color="BFBFBF" w:sz="4"/>
+              <w:right w:val="single" w:color="BFBFBF" w:sz="4"/>
+            </w:tcBorders>
+            <w:shd w:fill="F7F9FC" w:val="clear"/>
+            <w:tcMar>
+              <w:top w:type="dxa" w:w="60"/>
+              <w:left w:type="dxa" w:w="100"/>
+              <w:bottom w:type="dxa" w:w="60"/>
+              <w:right w:type="dxa" w:w="100"/>
+            </w:tcMar>
+          </w:tcPr>
+          <w:p>
+            <w:pPr>
+              <w:spacing w:after="0"/>
+            </w:pPr>
+            <w:r>
+              <w:rPr>
+                <w:rFonts w:ascii="Consolas" w:cs="Consolas" w:eastAsia="Consolas" w:hAnsi="Consolas"/>
+                <w:sz w:val="20"/>
+                <w:szCs w:val="20"/>
+                <w:shd w:fill="F2F2F2" w:val="clear"/>
+              </w:rPr>
               <w:t xml:space="preserve">--uppstroms FIL.CSV</w:t>
             </w:r>
           </w:p>
@@ -2245,6 +2365,7 @@
               <w:bottom w:val="single" w:color="BFBFBF" w:sz="4"/>
               <w:right w:val="single" w:color="BFBFBF" w:sz="4"/>
             </w:tcBorders>
+            <w:shd w:fill="F7F9FC" w:val="clear"/>
             <w:tcMar>
               <w:top w:type="dxa" w:w="60"/>
               <w:left w:type="dxa" w:w="100"/>
@@ -2270,6 +2391,7 @@
               <w:bottom w:val="single" w:color="BFBFBF" w:sz="4"/>
               <w:right w:val="single" w:color="BFBFBF" w:sz="4"/>
             </w:tcBorders>
+            <w:shd w:fill="F7F9FC" w:val="clear"/>
             <w:tcMar>
               <w:top w:type="dxa" w:w="60"/>
               <w:left w:type="dxa" w:w="100"/>
@@ -3064,6 +3186,101 @@
                 <w:szCs w:val="20"/>
                 <w:shd w:fill="F2F2F2" w:val="clear"/>
               </w:rPr>
+              <w:t xml:space="preserve">presentation.pptx</w:t>
+            </w:r>
+          </w:p>
+        </w:tc>
+        <w:tc>
+          <w:tcPr>
+            <w:tcW w:type="dxa" w:w="5760"/>
+            <w:tcBorders>
+              <w:top w:val="single" w:color="BFBFBF" w:sz="4"/>
+              <w:left w:val="single" w:color="BFBFBF" w:sz="4"/>
+              <w:bottom w:val="single" w:color="BFBFBF" w:sz="4"/>
+              <w:right w:val="single" w:color="BFBFBF" w:sz="4"/>
+            </w:tcBorders>
+            <w:tcMar>
+              <w:top w:type="dxa" w:w="60"/>
+              <w:left w:type="dxa" w:w="100"/>
+              <w:bottom w:type="dxa" w:w="60"/>
+              <w:right w:type="dxa" w:w="100"/>
+            </w:tcMar>
+          </w:tcPr>
+          <w:p>
+            <w:pPr>
+              <w:spacing w:after="0"/>
+            </w:pPr>
+            <w:r>
+              <w:t xml:space="preserve">Skrivs bara med </w:t>
+            </w:r>
+            <w:r>
+              <w:rPr>
+                <w:rFonts w:ascii="Consolas" w:cs="Consolas" w:eastAsia="Consolas" w:hAnsi="Consolas"/>
+                <w:sz w:val="20"/>
+                <w:szCs w:val="20"/>
+                <w:shd w:fill="F2F2F2" w:val="clear"/>
+              </w:rPr>
+              <w:t xml:space="preserve">--pptx</w:t>
+            </w:r>
+            <w:r>
+              <w:t xml:space="preserve"> (eller </w:t>
+            </w:r>
+            <w:r>
+              <w:rPr>
+                <w:rFonts w:ascii="Consolas" w:cs="Consolas" w:eastAsia="Consolas" w:hAnsi="Consolas"/>
+                <w:sz w:val="20"/>
+                <w:szCs w:val="20"/>
+                <w:shd w:fill="F2F2F2" w:val="clear"/>
+              </w:rPr>
+              <w:t xml:space="preserve">tv3_pptx.py</w:t>
+            </w:r>
+            <w:r>
+              <w:t xml:space="preserve">): PowerPoint ur mallen </w:t>
+            </w:r>
+            <w:r>
+              <w:rPr>
+                <w:rFonts w:ascii="Consolas" w:cs="Consolas" w:eastAsia="Consolas" w:hAnsi="Consolas"/>
+                <w:sz w:val="20"/>
+                <w:szCs w:val="20"/>
+                <w:shd w:fill="F2F2F2" w:val="clear"/>
+              </w:rPr>
+              <w:t xml:space="preserve">mall.pptx</w:t>
+            </w:r>
+            <w:r>
+              <w:t xml:space="preserve"> med nyckeltal, diagram, topplista, etapper, en sida per sträcka i toppen, driftåtgärder, svackor, karta och metod (se 6.2).</w:t>
+            </w:r>
+          </w:p>
+        </w:tc>
+      </w:tr>
+      <w:tr>
+        <w:tc>
+          <w:tcPr>
+            <w:tcW w:type="dxa" w:w="3600"/>
+            <w:tcBorders>
+              <w:top w:val="single" w:color="BFBFBF" w:sz="4"/>
+              <w:left w:val="single" w:color="BFBFBF" w:sz="4"/>
+              <w:bottom w:val="single" w:color="BFBFBF" w:sz="4"/>
+              <w:right w:val="single" w:color="BFBFBF" w:sz="4"/>
+            </w:tcBorders>
+            <w:shd w:fill="F7F9FC" w:val="clear"/>
+            <w:tcMar>
+              <w:top w:type="dxa" w:w="60"/>
+              <w:left w:type="dxa" w:w="100"/>
+              <w:bottom w:type="dxa" w:w="60"/>
+              <w:right w:type="dxa" w:w="100"/>
+            </w:tcMar>
+          </w:tcPr>
+          <w:p>
+            <w:pPr>
+              <w:spacing w:after="0"/>
+            </w:pPr>
+            <w:r>
+              <w:rPr>
+                <w:rFonts w:ascii="Consolas" w:cs="Consolas" w:eastAsia="Consolas" w:hAnsi="Consolas"/>
+                <w:sz w:val="20"/>
+                <w:szCs w:val="20"/>
+                <w:shd w:fill="F2F2F2" w:val="clear"/>
+              </w:rPr>
               <w:t xml:space="preserve">fel.txt</w:t>
             </w:r>
           </w:p>
@@ -3077,6 +3294,7 @@
               <w:bottom w:val="single" w:color="BFBFBF" w:sz="4"/>
               <w:right w:val="single" w:color="BFBFBF" w:sz="4"/>
             </w:tcBorders>
+            <w:shd w:fill="F7F9FC" w:val="clear"/>
             <w:tcMar>
               <w:top w:type="dxa" w:w="60"/>
               <w:left w:type="dxa" w:w="100"/>
@@ -6523,6 +6741,163 @@
     </w:tbl>
     <w:p>
       <w:pPr>
+        <w:pStyle w:val="Heading2"/>
+      </w:pPr>
+      <w:r>
+        <w:t xml:space="preserve">6.2 PowerPoint ur analysen</w:t>
+      </w:r>
+    </w:p>
+    <w:p>
+      <w:pPr>
+        <w:spacing w:after="120"/>
+      </w:pPr>
+      <w:r>
+        <w:t xml:space="preserve">Med </w:t>
+      </w:r>
+      <w:r>
+        <w:rPr>
+          <w:rFonts w:ascii="Consolas" w:cs="Consolas" w:eastAsia="Consolas" w:hAnsi="Consolas"/>
+          <w:sz w:val="20"/>
+          <w:szCs w:val="20"/>
+          <w:shd w:fill="F2F2F2" w:val="clear"/>
+        </w:rPr>
+        <w:t xml:space="preserve">--pptx</w:t>
+      </w:r>
+      <w:r>
+        <w:t xml:space="preserve"> (eller efteråt: </w:t>
+      </w:r>
+      <w:r>
+        <w:rPr>
+          <w:rFonts w:ascii="Consolas" w:cs="Consolas" w:eastAsia="Consolas" w:hAnsi="Consolas"/>
+          <w:sz w:val="20"/>
+          <w:szCs w:val="20"/>
+          <w:shd w:fill="F2F2F2" w:val="clear"/>
+        </w:rPr>
+        <w:t xml:space="preserve">python tv3_pptx.py tv3_resultat</w:t>
+      </w:r>
+      <w:r>
+        <w:t xml:space="preserve">) skrivs </w:t>
+      </w:r>
+      <w:r>
+        <w:rPr>
+          <w:rFonts w:ascii="Consolas" w:cs="Consolas" w:eastAsia="Consolas" w:hAnsi="Consolas"/>
+          <w:sz w:val="20"/>
+          <w:szCs w:val="20"/>
+          <w:shd w:fill="F2F2F2" w:val="clear"/>
+        </w:rPr>
+        <w:t xml:space="preserve">presentation.pptx</w:t>
+      </w:r>
+      <w:r>
+        <w:t xml:space="preserve"> i utdatamappen ur mallen </w:t>
+      </w:r>
+      <w:r>
+        <w:rPr>
+          <w:rFonts w:ascii="Consolas" w:cs="Consolas" w:eastAsia="Consolas" w:hAnsi="Consolas"/>
+          <w:sz w:val="20"/>
+          <w:szCs w:val="20"/>
+          <w:shd w:fill="F2F2F2" w:val="clear"/>
+        </w:rPr>
+        <w:t xml:space="preserve">mall.pptx</w:t>
+      </w:r>
+      <w:r>
+        <w:t xml:space="preserve"> i repots rot. Sidorna är: titel, avdelare, nyckeltal, längd per prioritetsklass, de mest kritiska sträckorna (diagram och tabell), observationer per skadekod, klass per material, etapper och kostnad, en sida per sträcka i toppen (översiktsbild, upp till tre foton av de allvarligaste skadorna och nyckeluppgifter), driftåtgärder, svackor och bakfall, karta (om </w:t>
+      </w:r>
+      <w:r>
+        <w:rPr>
+          <w:rFonts w:ascii="Consolas" w:cs="Consolas" w:eastAsia="Consolas" w:hAnsi="Consolas"/>
+          <w:sz w:val="20"/>
+          <w:szCs w:val="20"/>
+          <w:shd w:fill="F2F2F2" w:val="clear"/>
+        </w:rPr>
+        <w:t xml:space="preserve">kartbild.png</w:t>
+      </w:r>
+      <w:r>
+        <w:t xml:space="preserve"> finns i utdatamappen, från ArcMap-verktyget Exportera kartbild), metod och nästa steg. Vilka sidor som tas med, hur många sträckor som får egen sida och punkterna på sista sidan ändras i KONFIG överst i </w:t>
+      </w:r>
+      <w:r>
+        <w:rPr>
+          <w:rFonts w:ascii="Consolas" w:cs="Consolas" w:eastAsia="Consolas" w:hAnsi="Consolas"/>
+          <w:sz w:val="20"/>
+          <w:szCs w:val="20"/>
+          <w:shd w:fill="F2F2F2" w:val="clear"/>
+        </w:rPr>
+        <w:t xml:space="preserve">tv3_pptx.py</w:t>
+      </w:r>
+      <w:r>
+        <w:t xml:space="preserve">.</w:t>
+      </w:r>
+    </w:p>
+    <w:p>
+      <w:pPr>
+        <w:spacing w:after="120"/>
+      </w:pPr>
+      <w:r>
+        <w:t xml:space="preserve">Mallen får anpassas fritt i PowerPoint (färger, typsnitt, logotyp, sidfot) så länge </w:t>
+      </w:r>
+      <w:r>
+        <w:rPr>
+          <w:b/>
+          <w:bCs/>
+        </w:rPr>
+        <w:t xml:space="preserve">layoutnamnen</w:t>
+      </w:r>
+      <w:r>
+        <w:t xml:space="preserve"> (TITEL, AVDELARE, RUBRIK, RUBRIK_TEXT, RUBRIK_BILD, RUBRIK_TABELL, STRACKA, AVSLUT) och </w:t>
+      </w:r>
+      <w:r>
+        <w:rPr>
+          <w:b/>
+          <w:bCs/>
+        </w:rPr>
+        <w:t xml:space="preserve">platshållarnas ordning</w:t>
+      </w:r>
+      <w:r>
+        <w:t xml:space="preserve"> i varje layout behålls – skriptet fyller platshållarna i den ordningen. Exempelsidorna i mallen tas bort när presentationen byggs. Körs </w:t>
+      </w:r>
+      <w:r>
+        <w:rPr>
+          <w:rFonts w:ascii="Consolas" w:cs="Consolas" w:eastAsia="Consolas" w:hAnsi="Consolas"/>
+          <w:sz w:val="20"/>
+          <w:szCs w:val="20"/>
+          <w:shd w:fill="F2F2F2" w:val="clear"/>
+        </w:rPr>
+        <w:t xml:space="preserve">tv3_pptx.py</w:t>
+      </w:r>
+      <w:r>
+        <w:t xml:space="preserve"> fristående läser den </w:t>
+      </w:r>
+      <w:r>
+        <w:rPr>
+          <w:rFonts w:ascii="Consolas" w:cs="Consolas" w:eastAsia="Consolas" w:hAnsi="Consolas"/>
+          <w:sz w:val="20"/>
+          <w:szCs w:val="20"/>
+          <w:shd w:fill="F2F2F2" w:val="clear"/>
+        </w:rPr>
+        <w:t xml:space="preserve">kartunderlag.json</w:t>
+      </w:r>
+      <w:r>
+        <w:t xml:space="preserve"> och TV3-filerna igen (sökvägarna i JSON-filen måste stämma på den datorn), tar manuella bedömningar ur </w:t>
+      </w:r>
+      <w:r>
+        <w:rPr>
+          <w:rFonts w:ascii="Consolas" w:cs="Consolas" w:eastAsia="Consolas" w:hAnsi="Consolas"/>
+          <w:sz w:val="20"/>
+          <w:szCs w:val="20"/>
+          <w:shd w:fill="F2F2F2" w:val="clear"/>
+        </w:rPr>
+        <w:t xml:space="preserve">prioritering.xlsx</w:t>
+      </w:r>
+      <w:r>
+        <w:t xml:space="preserve"> i mappen och räknar om etapper och kostnad; så kan presentationen göras om efter genomgången i Excel utan att köra hela analysen.</w:t>
+      </w:r>
+    </w:p>
+    <w:p>
+      <w:pPr>
+        <w:spacing w:after="120"/>
+      </w:pPr>
+    </w:p>
+    <w:p>
+      <w:pPr>
         <w:pStyle w:val="Heading1"/>
       </w:pPr>
       <w:r>
@@ -6723,6 +7098,38 @@
       </w:r>
       <w:r>
         <w:t xml:space="preserve"> – allt som ligger uppströms om en brunn eller markerad ledning, och i batchläge serviser och längd uppströms per bedömd sträcka (avsnitt 7.9).</w:t>
+      </w:r>
+    </w:p>
+    <w:p>
+      <w:pPr>
+        <w:pStyle w:val="ListParagraph"/>
+        <w:numPr>
+          <w:ilvl w:val="0"/>
+          <w:numId w:val="3"/>
+        </w:numPr>
+        <w:spacing w:after="80"/>
+      </w:pPr>
+      <w:r>
+        <w:rPr>
+          <w:b/>
+          <w:bCs/>
+        </w:rPr>
+        <w:t xml:space="preserve">Exportera kartbild</w:t>
+      </w:r>
+      <w:r>
+        <w:t xml:space="preserve"> – sparar kartans aktuella vy som </w:t>
+      </w:r>
+      <w:r>
+        <w:rPr>
+          <w:rFonts w:ascii="Consolas" w:cs="Consolas" w:eastAsia="Consolas" w:hAnsi="Consolas"/>
+          <w:sz w:val="20"/>
+          <w:szCs w:val="20"/>
+          <w:shd w:fill="F2F2F2" w:val="clear"/>
+        </w:rPr>
+        <w:t xml:space="preserve">kartbild.png</w:t>
+      </w:r>
+      <w:r>
+        <w:t xml:space="preserve"> i utdatamappen, så att presentationen (6.2) får en kartsida. Zooma och tänd rätt lager först.</w:t>
       </w:r>
     </w:p>
     <w:p>

</xml_diff>

<commit_message>
Exportera kartor: PDF per åtgärdssträcka i minsta skala där sträckan ryms
Nytt ArcMap-verktyg (arcmap/kartexport.py): dataramen centreras på varje
sträcka (eller etapp) och skalan sätts till den minsta i serien 1:200,
1:300, 1:400 … där sträckan med marginal ryms; annars största skalan med
logg. Sträckan markeras via markeringslager eller urval, textelementen
TITEL/UNDERTITEL/SKALA fylls, en PDF per sträcka plus samlad PDF, och
sökvägen skrivs till fältet KARTA för hyperlänk. Handledning 7.10.

Co-Authored-By: Claude Fable 5.1 <noreply@anthropic.com>
Claude-Session: https://claude.ai/code/session_011fdqX3JEZje1LF9LqpaqR8
</commit_message>
<xml_diff>
--- a/Anvandarhandledning tv3_analys.docx
+++ b/Anvandarhandledning tv3_analys.docx
@@ -7270,6 +7270,26 @@
           <w:b/>
           <w:bCs/>
         </w:rPr>
+        <w:t xml:space="preserve">Exportera kartor (PDF per sträcka)</w:t>
+      </w:r>
+      <w:r>
+        <w:t xml:space="preserve"> – en PDF-karta per åtgärdssträcka eller etapp ur layouten, i minsta skala där sträckan ryms (1:200, 1:300, 1:400 …), med samlad PDF och hyperlänkfältet KARTA (avsnitt 7.10).</w:t>
+      </w:r>
+    </w:p>
+    <w:p>
+      <w:pPr>
+        <w:pStyle w:val="ListParagraph"/>
+        <w:numPr>
+          <w:ilvl w:val="0"/>
+          <w:numId w:val="3"/>
+        </w:numPr>
+        <w:spacing w:after="80"/>
+      </w:pPr>
+      <w:r>
+        <w:rPr>
+          <w:b/>
+          <w:bCs/>
+        </w:rPr>
         <w:t xml:space="preserve">Exportera kartbild</w:t>
       </w:r>
       <w:r>
@@ -9597,6 +9617,222 @@
       </w:r>
       <w:r>
         <w:t xml:space="preserve">). Uppgifterna påverkar inte prioritetsklassen; de är underlag för konsekvens och etappordning.</w:t>
+      </w:r>
+    </w:p>
+    <w:p>
+      <w:pPr>
+        <w:pStyle w:val="Heading2"/>
+      </w:pPr>
+      <w:r>
+        <w:t xml:space="preserve">7.10 Kartor per sträcka (PDF)</w:t>
+      </w:r>
+    </w:p>
+    <w:p>
+      <w:pPr>
+        <w:spacing w:after="120"/>
+      </w:pPr>
+      <w:r>
+        <w:t xml:space="preserve">Verktyget </w:t>
+      </w:r>
+      <w:r>
+        <w:rPr>
+          <w:b/>
+          <w:bCs/>
+        </w:rPr>
+        <w:t xml:space="preserve">Exportera kartor</w:t>
+      </w:r>
+      <w:r>
+        <w:t xml:space="preserve"> skriver en PDF per åtgärdssträcka ur den layout som är öppen. Förbered layouten en gång: välj sidstorlek, lägg in dataramen med de lager som ska synas, skala­stock, norrpil och tre textelement med </w:t>
+      </w:r>
+      <w:r>
+        <w:rPr>
+          <w:b/>
+          <w:bCs/>
+        </w:rPr>
+        <w:t xml:space="preserve">Element Name</w:t>
+      </w:r>
+      <w:r>
+        <w:t xml:space="preserve"> </w:t>
+      </w:r>
+      <w:r>
+        <w:rPr>
+          <w:rFonts w:ascii="Consolas" w:cs="Consolas" w:eastAsia="Consolas" w:hAnsi="Consolas"/>
+          <w:sz w:val="20"/>
+          <w:szCs w:val="20"/>
+          <w:shd w:fill="F2F2F2" w:val="clear"/>
+        </w:rPr>
+        <w:t xml:space="preserve">TITEL</w:t>
+      </w:r>
+      <w:r>
+        <w:t xml:space="preserve">, </w:t>
+      </w:r>
+      <w:r>
+        <w:rPr>
+          <w:rFonts w:ascii="Consolas" w:cs="Consolas" w:eastAsia="Consolas" w:hAnsi="Consolas"/>
+          <w:sz w:val="20"/>
+          <w:szCs w:val="20"/>
+          <w:shd w:fill="F2F2F2" w:val="clear"/>
+        </w:rPr>
+        <w:t xml:space="preserve">UNDERTITEL</w:t>
+      </w:r>
+      <w:r>
+        <w:t xml:space="preserve"> och </w:t>
+      </w:r>
+      <w:r>
+        <w:rPr>
+          <w:rFonts w:ascii="Consolas" w:cs="Consolas" w:eastAsia="Consolas" w:hAnsi="Consolas"/>
+          <w:sz w:val="20"/>
+          <w:szCs w:val="20"/>
+          <w:shd w:fill="F2F2F2" w:val="clear"/>
+        </w:rPr>
+        <w:t xml:space="preserve">SKALA</w:t>
+      </w:r>
+      <w:r>
+        <w:t xml:space="preserve"> (Properties &gt; Size and Position). Finns elementen fylls de i per karta (sträcka och brunnar; klass, etapp, metod, längd, material och skala). Kör verktyget från layoutvyn.</w:t>
+      </w:r>
+    </w:p>
+    <w:p>
+      <w:pPr>
+        <w:spacing w:after="120"/>
+      </w:pPr>
+      <w:r>
+        <w:t xml:space="preserve">För varje sträcka centreras dataramen på sträckan och skalan sätts till den </w:t>
+      </w:r>
+      <w:r>
+        <w:rPr>
+          <w:b/>
+          <w:bCs/>
+        </w:rPr>
+        <w:t xml:space="preserve">minsta i skalserien där sträckan ryms</w:t>
+      </w:r>
+      <w:r>
+        <w:t xml:space="preserve"> med marginalen (standard 10 m runt om): först 1:200, sedan 1:300, 1:400, 1:500, 1:750, 1:1000 … Serien och marginalen ändras i dialogen. Ryms sträckan inte i den största skalan används den ändå och loggen säger vilka kartor det gäller. Beräkningen utgår från dataramens storlek på sidan, så en större sida eller liggande format ger fler sträckor i 1:200.</w:t>
+      </w:r>
+    </w:p>
+    <w:p>
+      <w:pPr>
+        <w:pStyle w:val="ListParagraph"/>
+        <w:numPr>
+          <w:ilvl w:val="0"/>
+          <w:numId w:val="3"/>
+        </w:numPr>
+        <w:spacing w:after="80"/>
+      </w:pPr>
+      <w:r>
+        <w:rPr>
+          <w:b/>
+          <w:bCs/>
+        </w:rPr>
+        <w:t xml:space="preserve">Vilka sträckor</w:t>
+      </w:r>
+      <w:r>
+        <w:t xml:space="preserve">: sträckor med åtgärd (fältet METOD ifyllt av åtgärdspaketet), klass A och B, markerade i kartan, eller alla. </w:t>
+      </w:r>
+      <w:r>
+        <w:rPr>
+          <w:b/>
+          <w:bCs/>
+        </w:rPr>
+        <w:t xml:space="preserve">En karta per etapp</w:t>
+      </w:r>
+      <w:r>
+        <w:t xml:space="preserve"> gör i stället en karta per etapp med alla etappens sträckor.</w:t>
+      </w:r>
+    </w:p>
+    <w:p>
+      <w:pPr>
+        <w:pStyle w:val="ListParagraph"/>
+        <w:numPr>
+          <w:ilvl w:val="0"/>
+          <w:numId w:val="3"/>
+        </w:numPr>
+        <w:spacing w:after="80"/>
+      </w:pPr>
+      <w:r>
+        <w:rPr>
+          <w:b/>
+          <w:bCs/>
+        </w:rPr>
+        <w:t xml:space="preserve">Markering</w:t>
+      </w:r>
+      <w:r>
+        <w:t xml:space="preserve">: sträckan markeras i kartan under exporten. Standard är ArcMaps urvalsfärg; tydligare blir det med ett </w:t>
+      </w:r>
+      <w:r>
+        <w:rPr>
+          <w:b/>
+          <w:bCs/>
+        </w:rPr>
+        <w:t xml:space="preserve">markeringslager</w:t>
+      </w:r>
+      <w:r>
+        <w:t xml:space="preserve"> – lägg in lagret från Skapa ledningslager en gång till, ge det en bred färgad linje och ange det i dialogen, så sätts dess definitionsfråga till den aktuella sträckan och återställs efteråt.</w:t>
+      </w:r>
+    </w:p>
+    <w:p>
+      <w:pPr>
+        <w:pStyle w:val="ListParagraph"/>
+        <w:numPr>
+          <w:ilvl w:val="0"/>
+          <w:numId w:val="3"/>
+        </w:numPr>
+        <w:spacing w:after="80"/>
+      </w:pPr>
+      <w:r>
+        <w:rPr>
+          <w:b/>
+          <w:bCs/>
+        </w:rPr>
+        <w:t xml:space="preserve">Utdata</w:t>
+      </w:r>
+      <w:r>
+        <w:t xml:space="preserve">: </w:t>
+      </w:r>
+      <w:r>
+        <w:rPr>
+          <w:rFonts w:ascii="Consolas" w:cs="Consolas" w:eastAsia="Consolas" w:hAnsi="Consolas"/>
+          <w:sz w:val="20"/>
+          <w:szCs w:val="20"/>
+          <w:shd w:fill="F2F2F2" w:val="clear"/>
+        </w:rPr>
+        <w:t xml:space="preserve">&lt;klass&gt;_&lt;fil&gt;_&lt;nr&gt;_&lt;från&gt;-&lt;till&gt;.pdf</w:t>
+      </w:r>
+      <w:r>
+        <w:t xml:space="preserve"> (eller </w:t>
+      </w:r>
+      <w:r>
+        <w:rPr>
+          <w:rFonts w:ascii="Consolas" w:cs="Consolas" w:eastAsia="Consolas" w:hAnsi="Consolas"/>
+          <w:sz w:val="20"/>
+          <w:szCs w:val="20"/>
+          <w:shd w:fill="F2F2F2" w:val="clear"/>
+        </w:rPr>
+        <w:t xml:space="preserve">etapp_NN.pdf</w:t>
+      </w:r>
+      <w:r>
+        <w:t xml:space="preserve">) i utdatamappen, en samlad </w:t>
+      </w:r>
+      <w:r>
+        <w:rPr>
+          <w:rFonts w:ascii="Consolas" w:cs="Consolas" w:eastAsia="Consolas" w:hAnsi="Consolas"/>
+          <w:sz w:val="20"/>
+          <w:szCs w:val="20"/>
+          <w:shd w:fill="F2F2F2" w:val="clear"/>
+        </w:rPr>
+        <w:t xml:space="preserve">kartor_strackor.pdf</w:t>
+      </w:r>
+      <w:r>
+        <w:t xml:space="preserve"> med alla sidor, och sökvägen i fältet </w:t>
+      </w:r>
+      <w:r>
+        <w:rPr>
+          <w:b/>
+          <w:bCs/>
+        </w:rPr>
+        <w:t xml:space="preserve">KARTA</w:t>
+      </w:r>
+      <w:r>
+        <w:t xml:space="preserve"> i lagret för hyperlänk (Display &gt; Support Hyperlinks using field), som för RAPPORT. Under Hyperlänkar kan en annan mapp anges om ArcMap körs i Citrix.</w:t>
       </w:r>
     </w:p>
     <w:p>

</xml_diff>

<commit_message>
Exportera kartor: automatiskt val mellan liggande och stående mall
Två mxd-mallar kan anges; per sträcka räknas skalan för båda och den
mall som ger minsta skala används, vid lika skala den där sträckan
fyller sidan bäst. Klassen Layout håller dokument, dataram, lager och
markering per mall; mallarna sparas inte. Utan mallar används den öppna
kartans layout som förut.

Co-Authored-By: Claude Fable 5.1 <noreply@anthropic.com>
Claude-Session: https://claude.ai/code/session_011fdqX3JEZje1LF9LqpaqR8
</commit_message>
<xml_diff>
--- a/Anvandarhandledning tv3_analys.docx
+++ b/Anvandarhandledning tv3_analys.docx
@@ -7273,7 +7273,7 @@
         <w:t xml:space="preserve">Exportera kartor (PDF per sträcka)</w:t>
       </w:r>
       <w:r>
-        <w:t xml:space="preserve"> – en PDF-karta per åtgärdssträcka eller etapp ur layouten, i minsta skala där sträckan ryms (1:200, 1:300, 1:400 …), med samlad PDF och hyperlänkfältet KARTA (avsnitt 7.10).</w:t>
+        <w:t xml:space="preserve"> – en PDF-karta per åtgärdssträcka eller etapp ur layouten, i minsta skala där sträckan ryms (1:200, 1:300, 1:400 …), med automatiskt val mellan liggande och stående mall, samlad PDF och hyperlänkfältet KARTA (avsnitt 7.10).</w:t>
       </w:r>
     </w:p>
     <w:p>
@@ -9767,6 +9767,36 @@
       </w:r>
       <w:r>
         <w:t xml:space="preserve"> – lägg in lagret från Skapa ledningslager en gång till, ge det en bred färgad linje och ange det i dialogen, så sätts dess definitionsfråga till den aktuella sträckan och återställs efteråt.</w:t>
+      </w:r>
+    </w:p>
+    <w:p>
+      <w:pPr>
+        <w:pStyle w:val="ListParagraph"/>
+        <w:numPr>
+          <w:ilvl w:val="0"/>
+          <w:numId w:val="3"/>
+        </w:numPr>
+        <w:spacing w:after="80"/>
+      </w:pPr>
+      <w:r>
+        <w:rPr>
+          <w:b/>
+          <w:bCs/>
+        </w:rPr>
+        <w:t xml:space="preserve">Liggande eller stående</w:t>
+      </w:r>
+      <w:r>
+        <w:t xml:space="preserve">: spara två kopior av kartdokumentet med liggande respektive stående layout (samma lager och textelement) och ange dem under </w:t>
+      </w:r>
+      <w:r>
+        <w:rPr>
+          <w:b/>
+          <w:bCs/>
+        </w:rPr>
+        <w:t xml:space="preserve">Mallar</w:t>
+      </w:r>
+      <w:r>
+        <w:t xml:space="preserve">. För varje sträcka räknas skalan för båda och den mall som ger minsta skala används; vid lika skala den där sträckan fyller sidan bäst. En lång sträcka i nord–sydlig riktning får då stående sida i 1:200 i stället för liggande i 1:300. Utan mallar används den öppna kartans layout.</w:t>
       </w:r>
     </w:p>
     <w:p>

</xml_diff>

<commit_message>
Snabbare PDF-rapporter: binär bilddata, förminskade foton, parallella processer
Profilering visade att 90 % av tiden gick till reportlabs ASCII85-kodning
av fotona i ren Python och att fotona bäddades in i full upplösning.
Nu: rl_config.useA85 = 0, fotona förminskas till FOTO_MAX_PX (960 px)
med snabb nedskalad JPEG-avkodning och cache, och rapporterna skrivs
parallellt i RAPPORT_PROCESSER processer (--processer, standard kärnor
minus en, seriell reserv). DUF 701 med 488 full-HD-foton: 3 min 35 s →
35 s och rapportmappen 778 MB → 125 MB. Handledning och KONFIG-tabell.

Co-Authored-By: Claude Fable 5.1 <noreply@anthropic.com>
Claude-Session: https://claude.ai/code/session_011fdqX3JEZje1LF9LqpaqR8
</commit_message>
<xml_diff>
--- a/Anvandarhandledning tv3_analys.docx
+++ b/Anvandarhandledning tv3_analys.docx
@@ -1490,7 +1490,7 @@
                 <w:szCs w:val="20"/>
                 <w:shd w:fill="F2F2F2" w:val="clear"/>
               </w:rPr>
-              <w:t xml:space="preserve">--behall-rapporter</w:t>
+              <w:t xml:space="preserve">--processer N</w:t>
             </w:r>
           </w:p>
         </w:tc>
@@ -1515,7 +1515,19 @@
               <w:spacing w:after="0"/>
             </w:pPr>
             <w:r>
-              <w:t xml:space="preserve">Hoppar över PDF-rapporter som redan finns i utdatamappen och skriver bara de som saknas. Länkarna i Excel pekar ändå på dem. Använd vid omkörningar när bara Excel eller kartunderlaget ska uppdateras; Rapporter vars sträcka bytt klass eller littera sedan sist tas alltid bort och skrivs om. Kör utan flaggan när rapportlayouten ändrats.</w:t>
+              <w:t xml:space="preserve">Antal parallella processer för PDF-rapporterna. Standard är antal kärnor minus en; </w:t>
+            </w:r>
+            <w:r>
+              <w:rPr>
+                <w:rFonts w:ascii="Consolas" w:cs="Consolas" w:eastAsia="Consolas" w:hAnsi="Consolas"/>
+                <w:sz w:val="20"/>
+                <w:szCs w:val="20"/>
+                <w:shd w:fill="F2F2F2" w:val="clear"/>
+              </w:rPr>
+              <w:t xml:space="preserve">1</w:t>
+            </w:r>
+            <w:r>
+              <w:t xml:space="preserve"> skriver dem en i taget (t.ex. vid felsökning).</w:t>
             </w:r>
           </w:p>
         </w:tc>
@@ -1540,7 +1552,7 @@
               <w:spacing w:after="0"/>
             </w:pPr>
             <w:r>
-              <w:t xml:space="preserve">av</w:t>
+              <w:t xml:space="preserve">kärnor − 1</w:t>
             </w:r>
           </w:p>
         </w:tc>
@@ -1574,7 +1586,7 @@
                 <w:szCs w:val="20"/>
                 <w:shd w:fill="F2F2F2" w:val="clear"/>
               </w:rPr>
-              <w:t xml:space="preserve">--diagram</w:t>
+              <w:t xml:space="preserve">--behall-rapporter</w:t>
             </w:r>
           </w:p>
         </w:tc>
@@ -1600,19 +1612,7 @@
               <w:spacing w:after="0"/>
             </w:pPr>
             <w:r>
-              <w:t xml:space="preserve">Sparar diagrammen som PNG-filer i </w:t>
-            </w:r>
-            <w:r>
-              <w:rPr>
-                <w:rFonts w:ascii="Consolas" w:cs="Consolas" w:eastAsia="Consolas" w:hAnsi="Consolas"/>
-                <w:sz w:val="20"/>
-                <w:szCs w:val="20"/>
-                <w:shd w:fill="F2F2F2" w:val="clear"/>
-              </w:rPr>
-              <w:t xml:space="preserve">diagram</w:t>
-            </w:r>
-            <w:r>
-              <w:t xml:space="preserve">-mappen, t.ex. för PowerPoint. Utan flaggan bäddas de bara in i Excel-filen.</w:t>
+              <w:t xml:space="preserve">Hoppar över PDF-rapporter som redan finns i utdatamappen och skriver bara de som saknas. Länkarna i Excel pekar ändå på dem. Använd vid omkörningar när bara Excel eller kartunderlaget ska uppdateras; Rapporter vars sträcka bytt klass eller littera sedan sist tas alltid bort och skrivs om. Kör utan flaggan när rapportlayouten ändrats.</w:t>
             </w:r>
           </w:p>
         </w:tc>
@@ -1671,7 +1671,7 @@
                 <w:szCs w:val="20"/>
                 <w:shd w:fill="F2F2F2" w:val="clear"/>
               </w:rPr>
-              <w:t xml:space="preserve">--pptx</w:t>
+              <w:t xml:space="preserve">--diagram</w:t>
             </w:r>
           </w:p>
         </w:tc>
@@ -1696,7 +1696,7 @@
               <w:spacing w:after="0"/>
             </w:pPr>
             <w:r>
-              <w:t xml:space="preserve">Skriver </w:t>
+              <w:t xml:space="preserve">Sparar diagrammen som PNG-filer i </w:t>
             </w:r>
             <w:r>
               <w:rPr>
@@ -1705,34 +1705,10 @@
                 <w:szCs w:val="20"/>
                 <w:shd w:fill="F2F2F2" w:val="clear"/>
               </w:rPr>
-              <w:t xml:space="preserve">presentation.pptx</w:t>
-            </w:r>
-            <w:r>
-              <w:t xml:space="preserve"> i utdatamappen ur mallen </w:t>
-            </w:r>
-            <w:r>
-              <w:rPr>
-                <w:rFonts w:ascii="Consolas" w:cs="Consolas" w:eastAsia="Consolas" w:hAnsi="Consolas"/>
-                <w:sz w:val="20"/>
-                <w:szCs w:val="20"/>
-                <w:shd w:fill="F2F2F2" w:val="clear"/>
-              </w:rPr>
-              <w:t xml:space="preserve">mall.pptx</w:t>
-            </w:r>
-            <w:r>
-              <w:t xml:space="preserve"> (se 6.2). Kan också göras efteråt med </w:t>
-            </w:r>
-            <w:r>
-              <w:rPr>
-                <w:rFonts w:ascii="Consolas" w:cs="Consolas" w:eastAsia="Consolas" w:hAnsi="Consolas"/>
-                <w:sz w:val="20"/>
-                <w:szCs w:val="20"/>
-                <w:shd w:fill="F2F2F2" w:val="clear"/>
-              </w:rPr>
-              <w:t xml:space="preserve">python tv3_pptx.py UTDATAMAPP</w:t>
-            </w:r>
-            <w:r>
-              <w:t xml:space="preserve">.</w:t>
+              <w:t xml:space="preserve">diagram</w:t>
+            </w:r>
+            <w:r>
+              <w:t xml:space="preserve">-mappen, t.ex. för PowerPoint. Utan flaggan bäddas de bara in i Excel-filen.</w:t>
             </w:r>
           </w:p>
         </w:tc>
@@ -1791,7 +1767,7 @@
                 <w:szCs w:val="20"/>
                 <w:shd w:fill="F2F2F2" w:val="clear"/>
               </w:rPr>
-              <w:t xml:space="preserve">--karta ja|nej</w:t>
+              <w:t xml:space="preserve">--pptx</w:t>
             </w:r>
           </w:p>
         </w:tc>
@@ -1826,10 +1802,34 @@
                 <w:szCs w:val="20"/>
                 <w:shd w:fill="F2F2F2" w:val="clear"/>
               </w:rPr>
-              <w:t xml:space="preserve">kartunderlag.json</w:t>
-            </w:r>
-            <w:r>
-              <w:t xml:space="preserve"> för kartframställning i ArcMap (se avsnitt 7).</w:t>
+              <w:t xml:space="preserve">presentation.pptx</w:t>
+            </w:r>
+            <w:r>
+              <w:t xml:space="preserve"> i utdatamappen ur mallen </w:t>
+            </w:r>
+            <w:r>
+              <w:rPr>
+                <w:rFonts w:ascii="Consolas" w:cs="Consolas" w:eastAsia="Consolas" w:hAnsi="Consolas"/>
+                <w:sz w:val="20"/>
+                <w:szCs w:val="20"/>
+                <w:shd w:fill="F2F2F2" w:val="clear"/>
+              </w:rPr>
+              <w:t xml:space="preserve">mall.pptx</w:t>
+            </w:r>
+            <w:r>
+              <w:t xml:space="preserve"> (se 6.2). Kan också göras efteråt med </w:t>
+            </w:r>
+            <w:r>
+              <w:rPr>
+                <w:rFonts w:ascii="Consolas" w:cs="Consolas" w:eastAsia="Consolas" w:hAnsi="Consolas"/>
+                <w:sz w:val="20"/>
+                <w:szCs w:val="20"/>
+                <w:shd w:fill="F2F2F2" w:val="clear"/>
+              </w:rPr>
+              <w:t xml:space="preserve">python tv3_pptx.py UTDATAMAPP</w:t>
+            </w:r>
+            <w:r>
+              <w:t xml:space="preserve">.</w:t>
             </w:r>
           </w:p>
         </w:tc>
@@ -1855,13 +1855,7 @@
               <w:spacing w:after="0"/>
             </w:pPr>
             <w:r>
-              <w:rPr>
-                <w:rFonts w:ascii="Consolas" w:cs="Consolas" w:eastAsia="Consolas" w:hAnsi="Consolas"/>
-                <w:sz w:val="20"/>
-                <w:szCs w:val="20"/>
-                <w:shd w:fill="F2F2F2" w:val="clear"/>
-              </w:rPr>
-              <w:t xml:space="preserve">ja</w:t>
+              <w:t xml:space="preserve">av</w:t>
             </w:r>
           </w:p>
         </w:tc>
@@ -1894,7 +1888,7 @@
                 <w:szCs w:val="20"/>
                 <w:shd w:fill="F2F2F2" w:val="clear"/>
               </w:rPr>
-              <w:t xml:space="preserve">--media KATALOG</w:t>
+              <w:t xml:space="preserve">--karta ja|nej</w:t>
             </w:r>
           </w:p>
         </w:tc>
@@ -1919,7 +1913,19 @@
               <w:spacing w:after="0"/>
             </w:pPr>
             <w:r>
-              <w:t xml:space="preserve">Extra mapp att söka video- och bildfiler i (kan anges flera gånger). TV3-filens egen mapp söks alltid, inklusive undermappar.</w:t>
+              <w:t xml:space="preserve">Skriver </w:t>
+            </w:r>
+            <w:r>
+              <w:rPr>
+                <w:rFonts w:ascii="Consolas" w:cs="Consolas" w:eastAsia="Consolas" w:hAnsi="Consolas"/>
+                <w:sz w:val="20"/>
+                <w:szCs w:val="20"/>
+                <w:shd w:fill="F2F2F2" w:val="clear"/>
+              </w:rPr>
+              <w:t xml:space="preserve">kartunderlag.json</w:t>
+            </w:r>
+            <w:r>
+              <w:t xml:space="preserve"> för kartframställning i ArcMap (se avsnitt 7).</w:t>
             </w:r>
           </w:p>
         </w:tc>
@@ -1944,7 +1950,13 @@
               <w:spacing w:after="0"/>
             </w:pPr>
             <w:r>
-              <w:t xml:space="preserve">–</w:t>
+              <w:rPr>
+                <w:rFonts w:ascii="Consolas" w:cs="Consolas" w:eastAsia="Consolas" w:hAnsi="Consolas"/>
+                <w:sz w:val="20"/>
+                <w:szCs w:val="20"/>
+                <w:shd w:fill="F2F2F2" w:val="clear"/>
+              </w:rPr>
+              <w:t xml:space="preserve">ja</w:t>
             </w:r>
           </w:p>
         </w:tc>
@@ -1978,7 +1990,7 @@
                 <w:szCs w:val="20"/>
                 <w:shd w:fill="F2F2F2" w:val="clear"/>
               </w:rPr>
-              <w:t xml:space="preserve">--littera FIL.CSV</w:t>
+              <w:t xml:space="preserve">--media KATALOG</w:t>
             </w:r>
           </w:p>
         </w:tc>
@@ -2004,7 +2016,7 @@
               <w:spacing w:after="0"/>
             </w:pPr>
             <w:r>
-              <w:t xml:space="preserve">CSV med ersättningslittera för brunnar som märkts fel vid filmningen (se 3.3). Kan även anges i listfilen.</w:t>
+              <w:t xml:space="preserve">Extra mapp att söka video- och bildfiler i (kan anges flera gånger). TV3-filens egen mapp söks alltid, inklusive undermappar.</w:t>
             </w:r>
           </w:p>
         </w:tc>
@@ -2063,7 +2075,7 @@
                 <w:szCs w:val="20"/>
                 <w:shd w:fill="F2F2F2" w:val="clear"/>
               </w:rPr>
-              <w:t xml:space="preserve">--manuell FIL.XLSX</w:t>
+              <w:t xml:space="preserve">--littera FIL.CSV</w:t>
             </w:r>
           </w:p>
         </w:tc>
@@ -2088,19 +2100,7 @@
               <w:spacing w:after="0"/>
             </w:pPr>
             <w:r>
-              <w:t xml:space="preserve">Tidigare </w:t>
-            </w:r>
-            <w:r>
-              <w:rPr>
-                <w:rFonts w:ascii="Consolas" w:cs="Consolas" w:eastAsia="Consolas" w:hAnsi="Consolas"/>
-                <w:sz w:val="20"/>
-                <w:szCs w:val="20"/>
-                <w:shd w:fill="F2F2F2" w:val="clear"/>
-              </w:rPr>
-              <w:t xml:space="preserve">prioritering.xlsx</w:t>
-            </w:r>
-            <w:r>
-              <w:t xml:space="preserve"> med ifyllda manuella bedömningar, kommentarer och Lagning (m) (se 6.1). Kan även anges i listfilen.</w:t>
+              <w:t xml:space="preserve">CSV med ersättningslittera för brunnar som märkts fel vid filmningen (se 3.3). Kan även anges i listfilen.</w:t>
             </w:r>
           </w:p>
         </w:tc>
@@ -2159,7 +2159,7 @@
                 <w:szCs w:val="20"/>
                 <w:shd w:fill="F2F2F2" w:val="clear"/>
               </w:rPr>
-              <w:t xml:space="preserve">--kostnader FIL.CSV</w:t>
+              <w:t xml:space="preserve">--manuell FIL.XLSX</w:t>
             </w:r>
           </w:p>
         </w:tc>
@@ -2185,7 +2185,19 @@
               <w:spacing w:after="0"/>
             </w:pPr>
             <w:r>
-              <w:t xml:space="preserve">Kostnadsfil för åtgärdspaketet (se 6.1).</w:t>
+              <w:t xml:space="preserve">Tidigare </w:t>
+            </w:r>
+            <w:r>
+              <w:rPr>
+                <w:rFonts w:ascii="Consolas" w:cs="Consolas" w:eastAsia="Consolas" w:hAnsi="Consolas"/>
+                <w:sz w:val="20"/>
+                <w:szCs w:val="20"/>
+                <w:shd w:fill="F2F2F2" w:val="clear"/>
+              </w:rPr>
+              <w:t xml:space="preserve">prioritering.xlsx</w:t>
+            </w:r>
+            <w:r>
+              <w:t xml:space="preserve"> med ifyllda manuella bedömningar, kommentarer och Lagning (m) (se 6.1). Kan även anges i listfilen.</w:t>
             </w:r>
           </w:p>
         </w:tc>
@@ -2211,13 +2223,7 @@
               <w:spacing w:after="0"/>
             </w:pPr>
             <w:r>
-              <w:rPr>
-                <w:rFonts w:ascii="Consolas" w:cs="Consolas" w:eastAsia="Consolas" w:hAnsi="Consolas"/>
-                <w:sz w:val="20"/>
-                <w:szCs w:val="20"/>
-                <w:shd w:fill="F2F2F2" w:val="clear"/>
-              </w:rPr>
-              <w:t xml:space="preserve">kostnader.csv</w:t>
+              <w:t xml:space="preserve">–</w:t>
             </w:r>
           </w:p>
         </w:tc>
@@ -2250,7 +2256,7 @@
                 <w:szCs w:val="20"/>
                 <w:shd w:fill="F2F2F2" w:val="clear"/>
               </w:rPr>
-              <w:t xml:space="preserve">--etapper ja|nej</w:t>
+              <w:t xml:space="preserve">--kostnader FIL.CSV</w:t>
             </w:r>
           </w:p>
         </w:tc>
@@ -2275,8 +2281,30 @@
               <w:spacing w:after="0"/>
             </w:pPr>
             <w:r>
-              <w:t xml:space="preserve">Åtgärdspaket med etappindelning och kostnad (fliken Etapper). </w:t>
-            </w:r>
+              <w:t xml:space="preserve">Kostnadsfil för åtgärdspaketet (se 6.1).</w:t>
+            </w:r>
+          </w:p>
+        </w:tc>
+        <w:tc>
+          <w:tcPr>
+            <w:tcW w:type="dxa" w:w="1760"/>
+            <w:tcBorders>
+              <w:top w:val="single" w:color="BFBFBF" w:sz="4"/>
+              <w:left w:val="single" w:color="BFBFBF" w:sz="4"/>
+              <w:bottom w:val="single" w:color="BFBFBF" w:sz="4"/>
+              <w:right w:val="single" w:color="BFBFBF" w:sz="4"/>
+            </w:tcBorders>
+            <w:tcMar>
+              <w:top w:type="dxa" w:w="60"/>
+              <w:left w:type="dxa" w:w="100"/>
+              <w:bottom w:type="dxa" w:w="60"/>
+              <w:right w:type="dxa" w:w="100"/>
+            </w:tcMar>
+          </w:tcPr>
+          <w:p>
+            <w:pPr>
+              <w:spacing w:after="0"/>
+            </w:pPr>
             <w:r>
               <w:rPr>
                 <w:rFonts w:ascii="Consolas" w:cs="Consolas" w:eastAsia="Consolas" w:hAnsi="Consolas"/>
@@ -2284,41 +2312,7 @@
                 <w:szCs w:val="20"/>
                 <w:shd w:fill="F2F2F2" w:val="clear"/>
               </w:rPr>
-              <w:t xml:space="preserve">nej</w:t>
-            </w:r>
-            <w:r>
-              <w:t xml:space="preserve"> hoppar över.</w:t>
-            </w:r>
-          </w:p>
-        </w:tc>
-        <w:tc>
-          <w:tcPr>
-            <w:tcW w:type="dxa" w:w="1760"/>
-            <w:tcBorders>
-              <w:top w:val="single" w:color="BFBFBF" w:sz="4"/>
-              <w:left w:val="single" w:color="BFBFBF" w:sz="4"/>
-              <w:bottom w:val="single" w:color="BFBFBF" w:sz="4"/>
-              <w:right w:val="single" w:color="BFBFBF" w:sz="4"/>
-            </w:tcBorders>
-            <w:tcMar>
-              <w:top w:type="dxa" w:w="60"/>
-              <w:left w:type="dxa" w:w="100"/>
-              <w:bottom w:type="dxa" w:w="60"/>
-              <w:right w:type="dxa" w:w="100"/>
-            </w:tcMar>
-          </w:tcPr>
-          <w:p>
-            <w:pPr>
-              <w:spacing w:after="0"/>
-            </w:pPr>
-            <w:r>
-              <w:rPr>
-                <w:rFonts w:ascii="Consolas" w:cs="Consolas" w:eastAsia="Consolas" w:hAnsi="Consolas"/>
-                <w:sz w:val="20"/>
-                <w:szCs w:val="20"/>
-                <w:shd w:fill="F2F2F2" w:val="clear"/>
-              </w:rPr>
-              <w:t xml:space="preserve">ja</w:t>
+              <w:t xml:space="preserve">kostnader.csv</w:t>
             </w:r>
           </w:p>
         </w:tc>
@@ -2352,6 +2346,109 @@
                 <w:szCs w:val="20"/>
                 <w:shd w:fill="F2F2F2" w:val="clear"/>
               </w:rPr>
+              <w:t xml:space="preserve">--etapper ja|nej</w:t>
+            </w:r>
+          </w:p>
+        </w:tc>
+        <w:tc>
+          <w:tcPr>
+            <w:tcW w:type="dxa" w:w="5000"/>
+            <w:tcBorders>
+              <w:top w:val="single" w:color="BFBFBF" w:sz="4"/>
+              <w:left w:val="single" w:color="BFBFBF" w:sz="4"/>
+              <w:bottom w:val="single" w:color="BFBFBF" w:sz="4"/>
+              <w:right w:val="single" w:color="BFBFBF" w:sz="4"/>
+            </w:tcBorders>
+            <w:shd w:fill="F7F9FC" w:val="clear"/>
+            <w:tcMar>
+              <w:top w:type="dxa" w:w="60"/>
+              <w:left w:type="dxa" w:w="100"/>
+              <w:bottom w:type="dxa" w:w="60"/>
+              <w:right w:type="dxa" w:w="100"/>
+            </w:tcMar>
+          </w:tcPr>
+          <w:p>
+            <w:pPr>
+              <w:spacing w:after="0"/>
+            </w:pPr>
+            <w:r>
+              <w:t xml:space="preserve">Åtgärdspaket med etappindelning och kostnad (fliken Etapper). </w:t>
+            </w:r>
+            <w:r>
+              <w:rPr>
+                <w:rFonts w:ascii="Consolas" w:cs="Consolas" w:eastAsia="Consolas" w:hAnsi="Consolas"/>
+                <w:sz w:val="20"/>
+                <w:szCs w:val="20"/>
+                <w:shd w:fill="F2F2F2" w:val="clear"/>
+              </w:rPr>
+              <w:t xml:space="preserve">nej</w:t>
+            </w:r>
+            <w:r>
+              <w:t xml:space="preserve"> hoppar över.</w:t>
+            </w:r>
+          </w:p>
+        </w:tc>
+        <w:tc>
+          <w:tcPr>
+            <w:tcW w:type="dxa" w:w="1760"/>
+            <w:tcBorders>
+              <w:top w:val="single" w:color="BFBFBF" w:sz="4"/>
+              <w:left w:val="single" w:color="BFBFBF" w:sz="4"/>
+              <w:bottom w:val="single" w:color="BFBFBF" w:sz="4"/>
+              <w:right w:val="single" w:color="BFBFBF" w:sz="4"/>
+            </w:tcBorders>
+            <w:shd w:fill="F7F9FC" w:val="clear"/>
+            <w:tcMar>
+              <w:top w:type="dxa" w:w="60"/>
+              <w:left w:type="dxa" w:w="100"/>
+              <w:bottom w:type="dxa" w:w="60"/>
+              <w:right w:type="dxa" w:w="100"/>
+            </w:tcMar>
+          </w:tcPr>
+          <w:p>
+            <w:pPr>
+              <w:spacing w:after="0"/>
+            </w:pPr>
+            <w:r>
+              <w:rPr>
+                <w:rFonts w:ascii="Consolas" w:cs="Consolas" w:eastAsia="Consolas" w:hAnsi="Consolas"/>
+                <w:sz w:val="20"/>
+                <w:szCs w:val="20"/>
+                <w:shd w:fill="F2F2F2" w:val="clear"/>
+              </w:rPr>
+              <w:t xml:space="preserve">ja</w:t>
+            </w:r>
+          </w:p>
+        </w:tc>
+      </w:tr>
+      <w:tr>
+        <w:tc>
+          <w:tcPr>
+            <w:tcW w:type="dxa" w:w="2600"/>
+            <w:tcBorders>
+              <w:top w:val="single" w:color="BFBFBF" w:sz="4"/>
+              <w:left w:val="single" w:color="BFBFBF" w:sz="4"/>
+              <w:bottom w:val="single" w:color="BFBFBF" w:sz="4"/>
+              <w:right w:val="single" w:color="BFBFBF" w:sz="4"/>
+            </w:tcBorders>
+            <w:tcMar>
+              <w:top w:type="dxa" w:w="60"/>
+              <w:left w:type="dxa" w:w="100"/>
+              <w:bottom w:type="dxa" w:w="60"/>
+              <w:right w:type="dxa" w:w="100"/>
+            </w:tcMar>
+          </w:tcPr>
+          <w:p>
+            <w:pPr>
+              <w:spacing w:after="0"/>
+            </w:pPr>
+            <w:r>
+              <w:rPr>
+                <w:rFonts w:ascii="Consolas" w:cs="Consolas" w:eastAsia="Consolas" w:hAnsi="Consolas"/>
+                <w:sz w:val="20"/>
+                <w:szCs w:val="20"/>
+                <w:shd w:fill="F2F2F2" w:val="clear"/>
+              </w:rPr>
               <w:t xml:space="preserve">--uppstroms FIL.CSV</w:t>
             </w:r>
           </w:p>
@@ -2365,7 +2462,6 @@
               <w:bottom w:val="single" w:color="BFBFBF" w:sz="4"/>
               <w:right w:val="single" w:color="BFBFBF" w:sz="4"/>
             </w:tcBorders>
-            <w:shd w:fill="F7F9FC" w:val="clear"/>
             <w:tcMar>
               <w:top w:type="dxa" w:w="60"/>
               <w:left w:type="dxa" w:w="100"/>
@@ -2391,7 +2487,6 @@
               <w:bottom w:val="single" w:color="BFBFBF" w:sz="4"/>
               <w:right w:val="single" w:color="BFBFBF" w:sz="4"/>
             </w:tcBorders>
-            <w:shd w:fill="F7F9FC" w:val="clear"/>
             <w:tcMar>
               <w:top w:type="dxa" w:w="60"/>
               <w:left w:type="dxa" w:w="100"/>
@@ -5258,6 +5353,229 @@
                 <w:szCs w:val="20"/>
                 <w:shd w:fill="F2F2F2" w:val="clear"/>
               </w:rPr>
+              <w:t xml:space="preserve">FOTO_MAX_PX</w:t>
+            </w:r>
+            <w:r>
+              <w:t xml:space="preserve">, </w:t>
+            </w:r>
+            <w:r>
+              <w:rPr>
+                <w:rFonts w:ascii="Consolas" w:cs="Consolas" w:eastAsia="Consolas" w:hAnsi="Consolas"/>
+                <w:sz w:val="20"/>
+                <w:szCs w:val="20"/>
+                <w:shd w:fill="F2F2F2" w:val="clear"/>
+              </w:rPr>
+              <w:t xml:space="preserve">FOTO_JPEG_KVALITET</w:t>
+            </w:r>
+          </w:p>
+        </w:tc>
+        <w:tc>
+          <w:tcPr>
+            <w:tcW w:type="dxa" w:w="5000"/>
+            <w:tcBorders>
+              <w:top w:val="single" w:color="BFBFBF" w:sz="4"/>
+              <w:left w:val="single" w:color="BFBFBF" w:sz="4"/>
+              <w:bottom w:val="single" w:color="BFBFBF" w:sz="4"/>
+              <w:right w:val="single" w:color="BFBFBF" w:sz="4"/>
+            </w:tcBorders>
+            <w:tcMar>
+              <w:top w:type="dxa" w:w="60"/>
+              <w:left w:type="dxa" w:w="100"/>
+              <w:bottom w:type="dxa" w:w="60"/>
+              <w:right w:type="dxa" w:w="100"/>
+            </w:tcMar>
+          </w:tcPr>
+          <w:p>
+            <w:pPr>
+              <w:spacing w:after="0"/>
+            </w:pPr>
+            <w:r>
+              <w:t xml:space="preserve">Fotona i PDF-rapporterna förminskas till högst så många pixlar på längsta sidan (JPEG-kvalitet enligt den andra). </w:t>
+            </w:r>
+            <w:r>
+              <w:rPr>
+                <w:rFonts w:ascii="Consolas" w:cs="Consolas" w:eastAsia="Consolas" w:hAnsi="Consolas"/>
+                <w:sz w:val="20"/>
+                <w:szCs w:val="20"/>
+                <w:shd w:fill="F2F2F2" w:val="clear"/>
+              </w:rPr>
+              <w:t xml:space="preserve">None</w:t>
+            </w:r>
+            <w:r>
+              <w:t xml:space="preserve"> = originalstorlek.</w:t>
+            </w:r>
+          </w:p>
+        </w:tc>
+        <w:tc>
+          <w:tcPr>
+            <w:tcW w:type="dxa" w:w="1760"/>
+            <w:tcBorders>
+              <w:top w:val="single" w:color="BFBFBF" w:sz="4"/>
+              <w:left w:val="single" w:color="BFBFBF" w:sz="4"/>
+              <w:bottom w:val="single" w:color="BFBFBF" w:sz="4"/>
+              <w:right w:val="single" w:color="BFBFBF" w:sz="4"/>
+            </w:tcBorders>
+            <w:tcMar>
+              <w:top w:type="dxa" w:w="60"/>
+              <w:left w:type="dxa" w:w="100"/>
+              <w:bottom w:type="dxa" w:w="60"/>
+              <w:right w:type="dxa" w:w="100"/>
+            </w:tcMar>
+          </w:tcPr>
+          <w:p>
+            <w:pPr>
+              <w:spacing w:after="0"/>
+            </w:pPr>
+            <w:r>
+              <w:t xml:space="preserve">960, 82</w:t>
+            </w:r>
+          </w:p>
+        </w:tc>
+      </w:tr>
+      <w:tr>
+        <w:tc>
+          <w:tcPr>
+            <w:tcW w:type="dxa" w:w="2600"/>
+            <w:tcBorders>
+              <w:top w:val="single" w:color="BFBFBF" w:sz="4"/>
+              <w:left w:val="single" w:color="BFBFBF" w:sz="4"/>
+              <w:bottom w:val="single" w:color="BFBFBF" w:sz="4"/>
+              <w:right w:val="single" w:color="BFBFBF" w:sz="4"/>
+            </w:tcBorders>
+            <w:shd w:fill="F7F9FC" w:val="clear"/>
+            <w:tcMar>
+              <w:top w:type="dxa" w:w="60"/>
+              <w:left w:type="dxa" w:w="100"/>
+              <w:bottom w:type="dxa" w:w="60"/>
+              <w:right w:type="dxa" w:w="100"/>
+            </w:tcMar>
+          </w:tcPr>
+          <w:p>
+            <w:pPr>
+              <w:spacing w:after="0"/>
+            </w:pPr>
+            <w:r>
+              <w:rPr>
+                <w:rFonts w:ascii="Consolas" w:cs="Consolas" w:eastAsia="Consolas" w:hAnsi="Consolas"/>
+                <w:sz w:val="20"/>
+                <w:szCs w:val="20"/>
+                <w:shd w:fill="F2F2F2" w:val="clear"/>
+              </w:rPr>
+              <w:t xml:space="preserve">RAPPORT_PROCESSER</w:t>
+            </w:r>
+          </w:p>
+        </w:tc>
+        <w:tc>
+          <w:tcPr>
+            <w:tcW w:type="dxa" w:w="5000"/>
+            <w:tcBorders>
+              <w:top w:val="single" w:color="BFBFBF" w:sz="4"/>
+              <w:left w:val="single" w:color="BFBFBF" w:sz="4"/>
+              <w:bottom w:val="single" w:color="BFBFBF" w:sz="4"/>
+              <w:right w:val="single" w:color="BFBFBF" w:sz="4"/>
+            </w:tcBorders>
+            <w:shd w:fill="F7F9FC" w:val="clear"/>
+            <w:tcMar>
+              <w:top w:type="dxa" w:w="60"/>
+              <w:left w:type="dxa" w:w="100"/>
+              <w:bottom w:type="dxa" w:w="60"/>
+              <w:right w:type="dxa" w:w="100"/>
+            </w:tcMar>
+          </w:tcPr>
+          <w:p>
+            <w:pPr>
+              <w:spacing w:after="0"/>
+            </w:pPr>
+            <w:r>
+              <w:t xml:space="preserve">Antal parallella processer för PDF-rapporterna. </w:t>
+            </w:r>
+            <w:r>
+              <w:rPr>
+                <w:rFonts w:ascii="Consolas" w:cs="Consolas" w:eastAsia="Consolas" w:hAnsi="Consolas"/>
+                <w:sz w:val="20"/>
+                <w:szCs w:val="20"/>
+                <w:shd w:fill="F2F2F2" w:val="clear"/>
+              </w:rPr>
+              <w:t xml:space="preserve">None</w:t>
+            </w:r>
+            <w:r>
+              <w:t xml:space="preserve"> = antal kärnor − 1, </w:t>
+            </w:r>
+            <w:r>
+              <w:rPr>
+                <w:rFonts w:ascii="Consolas" w:cs="Consolas" w:eastAsia="Consolas" w:hAnsi="Consolas"/>
+                <w:sz w:val="20"/>
+                <w:szCs w:val="20"/>
+                <w:shd w:fill="F2F2F2" w:val="clear"/>
+              </w:rPr>
+              <w:t xml:space="preserve">1</w:t>
+            </w:r>
+            <w:r>
+              <w:t xml:space="preserve"> = en i taget.</w:t>
+            </w:r>
+          </w:p>
+        </w:tc>
+        <w:tc>
+          <w:tcPr>
+            <w:tcW w:type="dxa" w:w="1760"/>
+            <w:tcBorders>
+              <w:top w:val="single" w:color="BFBFBF" w:sz="4"/>
+              <w:left w:val="single" w:color="BFBFBF" w:sz="4"/>
+              <w:bottom w:val="single" w:color="BFBFBF" w:sz="4"/>
+              <w:right w:val="single" w:color="BFBFBF" w:sz="4"/>
+            </w:tcBorders>
+            <w:shd w:fill="F7F9FC" w:val="clear"/>
+            <w:tcMar>
+              <w:top w:type="dxa" w:w="60"/>
+              <w:left w:type="dxa" w:w="100"/>
+              <w:bottom w:type="dxa" w:w="60"/>
+              <w:right w:type="dxa" w:w="100"/>
+            </w:tcMar>
+          </w:tcPr>
+          <w:p>
+            <w:pPr>
+              <w:spacing w:after="0"/>
+            </w:pPr>
+            <w:r>
+              <w:rPr>
+                <w:rFonts w:ascii="Consolas" w:cs="Consolas" w:eastAsia="Consolas" w:hAnsi="Consolas"/>
+                <w:sz w:val="20"/>
+                <w:szCs w:val="20"/>
+                <w:shd w:fill="F2F2F2" w:val="clear"/>
+              </w:rPr>
+              <w:t xml:space="preserve">None</w:t>
+            </w:r>
+          </w:p>
+        </w:tc>
+      </w:tr>
+      <w:tr>
+        <w:tc>
+          <w:tcPr>
+            <w:tcW w:type="dxa" w:w="2600"/>
+            <w:tcBorders>
+              <w:top w:val="single" w:color="BFBFBF" w:sz="4"/>
+              <w:left w:val="single" w:color="BFBFBF" w:sz="4"/>
+              <w:bottom w:val="single" w:color="BFBFBF" w:sz="4"/>
+              <w:right w:val="single" w:color="BFBFBF" w:sz="4"/>
+            </w:tcBorders>
+            <w:tcMar>
+              <w:top w:type="dxa" w:w="60"/>
+              <w:left w:type="dxa" w:w="100"/>
+              <w:bottom w:type="dxa" w:w="60"/>
+              <w:right w:type="dxa" w:w="100"/>
+            </w:tcMar>
+          </w:tcPr>
+          <w:p>
+            <w:pPr>
+              <w:spacing w:after="0"/>
+            </w:pPr>
+            <w:r>
+              <w:rPr>
+                <w:rFonts w:ascii="Consolas" w:cs="Consolas" w:eastAsia="Consolas" w:hAnsi="Consolas"/>
+                <w:sz w:val="20"/>
+                <w:szCs w:val="20"/>
+                <w:shd w:fill="F2F2F2" w:val="clear"/>
+              </w:rPr>
               <w:t xml:space="preserve">DOLDA_KOLUMNER</w:t>
             </w:r>
           </w:p>
@@ -9920,7 +10238,31 @@
         <w:t xml:space="preserve">Körningen tar lång tid.</w:t>
       </w:r>
       <w:r>
-        <w:t xml:space="preserve"> PDF-rapporterna tar ungefär en halv sekund per sträcka. Använd </w:t>
+        <w:t xml:space="preserve"> PDF-rapporterna skrivs parallellt i flera processer (</w:t>
+      </w:r>
+      <w:r>
+        <w:rPr>
+          <w:rFonts w:ascii="Consolas" w:cs="Consolas" w:eastAsia="Consolas" w:hAnsi="Consolas"/>
+          <w:sz w:val="20"/>
+          <w:szCs w:val="20"/>
+          <w:shd w:fill="F2F2F2" w:val="clear"/>
+        </w:rPr>
+        <w:t xml:space="preserve">--processer</w:t>
+      </w:r>
+      <w:r>
+        <w:t xml:space="preserve">), fotona förminskas till rapportstorlek innan de bäddas in (</w:t>
+      </w:r>
+      <w:r>
+        <w:rPr>
+          <w:rFonts w:ascii="Consolas" w:cs="Consolas" w:eastAsia="Consolas" w:hAnsi="Consolas"/>
+          <w:sz w:val="20"/>
+          <w:szCs w:val="20"/>
+          <w:shd w:fill="F2F2F2" w:val="clear"/>
+        </w:rPr>
+        <w:t xml:space="preserve">FOTO_MAX_PX</w:t>
+      </w:r>
+      <w:r>
+        <w:t xml:space="preserve">, standard 960 px på längsta sidan – 290 dpi i A4) och bilddata lagras binärt i stället för textkodat. DUF 701 med 488 foton i full HD tar ungefär en halv minut på en dator med fyra kärnor, mot tre och en halv minut tidigare, och rapportmappen blir en fjärdedel så stor. Använd dessutom </w:t>
       </w:r>
       <w:r>
         <w:rPr>
@@ -9956,7 +10298,19 @@
         <w:t xml:space="preserve">--rapporter inga</w:t>
       </w:r>
       <w:r>
-        <w:t xml:space="preserve"> när du bara vill uppdatera Excel-filen.</w:t>
+        <w:t xml:space="preserve"> när du bara vill uppdatera Excel-filen. Sätt </w:t>
+      </w:r>
+      <w:r>
+        <w:rPr>
+          <w:rFonts w:ascii="Consolas" w:cs="Consolas" w:eastAsia="Consolas" w:hAnsi="Consolas"/>
+          <w:sz w:val="20"/>
+          <w:szCs w:val="20"/>
+          <w:shd w:fill="F2F2F2" w:val="clear"/>
+        </w:rPr>
+        <w:t xml:space="preserve">FOTO_MAX_PX = None</w:t>
+      </w:r>
+      <w:r>
+        <w:t xml:space="preserve"> i KONFIG om fotona ska bäddas in i originalstorlek.</w:t>
       </w:r>
     </w:p>
     <w:p>

</xml_diff>

<commit_message>
Mindre och snabbare PDF-rapporter: O(n)-utjämning, 150 dpi, palett-PNG, JPEG 76
Utjämningen av profilen var O(n²) och tog en tredjedel av rittiden;
nu glidande fönster. Diagrambilderna sparas i 150 dpi som palett-PNG
(ca 65 % mindre) och fotona med JPEG-kvalitet 76 och optimerad kodning.
25 figurpar 13,4 → 5,6 s; rapportmappen för DUF 701 125 → 102 MB med
brusfoton. KONFIG: RAPPORT_BILD_DPI, RAPPORT_BILD_PALETT,
FOTO_JPEG_KVALITET. Handledning uppdaterad.

Co-Authored-By: Claude Fable 5.1 <noreply@anthropic.com>
Claude-Session: https://claude.ai/code/session_011fdqX3JEZje1LF9LqpaqR8
</commit_message>
<xml_diff>
--- a/Anvandarhandledning tv3_analys.docx
+++ b/Anvandarhandledning tv3_analys.docx
@@ -5390,7 +5390,7 @@
               <w:spacing w:after="0"/>
             </w:pPr>
             <w:r>
-              <w:t xml:space="preserve">Fotona i PDF-rapporterna förminskas till högst så många pixlar på längsta sidan (JPEG-kvalitet enligt den andra). </w:t>
+              <w:t xml:space="preserve">Fotona i PDF-rapporterna förminskas till högst så många pixlar på längsta sidan (JPEG-kvalitet enligt den andra; 76 ger ~30 % mindre filer än 82 utan synlig skillnad i A4). </w:t>
             </w:r>
             <w:r>
               <w:rPr>
@@ -5427,7 +5427,7 @@
               <w:spacing w:after="0"/>
             </w:pPr>
             <w:r>
-              <w:t xml:space="preserve">960, 82</w:t>
+              <w:t xml:space="preserve">960, 76</w:t>
             </w:r>
           </w:p>
         </w:tc>
@@ -5461,7 +5461,19 @@
                 <w:szCs w:val="20"/>
                 <w:shd w:fill="F2F2F2" w:val="clear"/>
               </w:rPr>
-              <w:t xml:space="preserve">RAPPORT_PROCESSER</w:t>
+              <w:t xml:space="preserve">RAPPORT_BILD_DPI</w:t>
+            </w:r>
+            <w:r>
+              <w:t xml:space="preserve">, </w:t>
+            </w:r>
+            <w:r>
+              <w:rPr>
+                <w:rFonts w:ascii="Consolas" w:cs="Consolas" w:eastAsia="Consolas" w:hAnsi="Consolas"/>
+                <w:sz w:val="20"/>
+                <w:szCs w:val="20"/>
+                <w:shd w:fill="F2F2F2" w:val="clear"/>
+              </w:rPr>
+              <w:t xml:space="preserve">RAPPORT_BILD_PALETT</w:t>
             </w:r>
           </w:p>
         </w:tc>
@@ -5487,7 +5499,33 @@
               <w:spacing w:after="0"/>
             </w:pPr>
             <w:r>
-              <w:t xml:space="preserve">Antal parallella processer för PDF-rapporterna. </w:t>
+              <w:t xml:space="preserve">Upplösning på översikts- och profilbilden i rapporten, och om de sparas som palett-PNG (256 färger, ca 65 % mindre).</w:t>
+            </w:r>
+          </w:p>
+        </w:tc>
+        <w:tc>
+          <w:tcPr>
+            <w:tcW w:type="dxa" w:w="1760"/>
+            <w:tcBorders>
+              <w:top w:val="single" w:color="BFBFBF" w:sz="4"/>
+              <w:left w:val="single" w:color="BFBFBF" w:sz="4"/>
+              <w:bottom w:val="single" w:color="BFBFBF" w:sz="4"/>
+              <w:right w:val="single" w:color="BFBFBF" w:sz="4"/>
+            </w:tcBorders>
+            <w:shd w:fill="F7F9FC" w:val="clear"/>
+            <w:tcMar>
+              <w:top w:type="dxa" w:w="60"/>
+              <w:left w:type="dxa" w:w="100"/>
+              <w:bottom w:type="dxa" w:w="60"/>
+              <w:right w:type="dxa" w:w="100"/>
+            </w:tcMar>
+          </w:tcPr>
+          <w:p>
+            <w:pPr>
+              <w:spacing w:after="0"/>
+            </w:pPr>
+            <w:r>
+              <w:t xml:space="preserve">150, </w:t>
             </w:r>
             <w:r>
               <w:rPr>
@@ -5496,54 +5534,7 @@
                 <w:szCs w:val="20"/>
                 <w:shd w:fill="F2F2F2" w:val="clear"/>
               </w:rPr>
-              <w:t xml:space="preserve">None</w:t>
-            </w:r>
-            <w:r>
-              <w:t xml:space="preserve"> = antal kärnor − 1, </w:t>
-            </w:r>
-            <w:r>
-              <w:rPr>
-                <w:rFonts w:ascii="Consolas" w:cs="Consolas" w:eastAsia="Consolas" w:hAnsi="Consolas"/>
-                <w:sz w:val="20"/>
-                <w:szCs w:val="20"/>
-                <w:shd w:fill="F2F2F2" w:val="clear"/>
-              </w:rPr>
-              <w:t xml:space="preserve">1</w:t>
-            </w:r>
-            <w:r>
-              <w:t xml:space="preserve"> = en i taget.</w:t>
-            </w:r>
-          </w:p>
-        </w:tc>
-        <w:tc>
-          <w:tcPr>
-            <w:tcW w:type="dxa" w:w="1760"/>
-            <w:tcBorders>
-              <w:top w:val="single" w:color="BFBFBF" w:sz="4"/>
-              <w:left w:val="single" w:color="BFBFBF" w:sz="4"/>
-              <w:bottom w:val="single" w:color="BFBFBF" w:sz="4"/>
-              <w:right w:val="single" w:color="BFBFBF" w:sz="4"/>
-            </w:tcBorders>
-            <w:shd w:fill="F7F9FC" w:val="clear"/>
-            <w:tcMar>
-              <w:top w:type="dxa" w:w="60"/>
-              <w:left w:type="dxa" w:w="100"/>
-              <w:bottom w:type="dxa" w:w="60"/>
-              <w:right w:type="dxa" w:w="100"/>
-            </w:tcMar>
-          </w:tcPr>
-          <w:p>
-            <w:pPr>
-              <w:spacing w:after="0"/>
-            </w:pPr>
-            <w:r>
-              <w:rPr>
-                <w:rFonts w:ascii="Consolas" w:cs="Consolas" w:eastAsia="Consolas" w:hAnsi="Consolas"/>
-                <w:sz w:val="20"/>
-                <w:szCs w:val="20"/>
-                <w:shd w:fill="F2F2F2" w:val="clear"/>
-              </w:rPr>
-              <w:t xml:space="preserve">None</w:t>
+              <w:t xml:space="preserve">True</w:t>
             </w:r>
           </w:p>
         </w:tc>
@@ -5576,7 +5567,7 @@
                 <w:szCs w:val="20"/>
                 <w:shd w:fill="F2F2F2" w:val="clear"/>
               </w:rPr>
-              <w:t xml:space="preserve">DOLDA_KOLUMNER</w:t>
+              <w:t xml:space="preserve">RAPPORT_PROCESSER</w:t>
             </w:r>
           </w:p>
         </w:tc>
@@ -5601,7 +5592,31 @@
               <w:spacing w:after="0"/>
             </w:pPr>
             <w:r>
-              <w:t xml:space="preserve">Kolumner per flik som döljs som standard i Excel (grupperade, fälls ut med plustecknet ovanför rubrikraden). Rubrik utan enhet. Tom lista = visa allt.</w:t>
+              <w:t xml:space="preserve">Antal parallella processer för PDF-rapporterna. </w:t>
+            </w:r>
+            <w:r>
+              <w:rPr>
+                <w:rFonts w:ascii="Consolas" w:cs="Consolas" w:eastAsia="Consolas" w:hAnsi="Consolas"/>
+                <w:sz w:val="20"/>
+                <w:szCs w:val="20"/>
+                <w:shd w:fill="F2F2F2" w:val="clear"/>
+              </w:rPr>
+              <w:t xml:space="preserve">None</w:t>
+            </w:r>
+            <w:r>
+              <w:t xml:space="preserve"> = antal kärnor − 1, </w:t>
+            </w:r>
+            <w:r>
+              <w:rPr>
+                <w:rFonts w:ascii="Consolas" w:cs="Consolas" w:eastAsia="Consolas" w:hAnsi="Consolas"/>
+                <w:sz w:val="20"/>
+                <w:szCs w:val="20"/>
+                <w:shd w:fill="F2F2F2" w:val="clear"/>
+              </w:rPr>
+              <w:t xml:space="preserve">1</w:t>
+            </w:r>
+            <w:r>
+              <w:t xml:space="preserve"> = en i taget.</w:t>
             </w:r>
           </w:p>
         </w:tc>
@@ -5626,7 +5641,13 @@
               <w:spacing w:after="0"/>
             </w:pPr>
             <w:r>
-              <w:t xml:space="preserve">se skriptet</w:t>
+              <w:rPr>
+                <w:rFonts w:ascii="Consolas" w:cs="Consolas" w:eastAsia="Consolas" w:hAnsi="Consolas"/>
+                <w:sz w:val="20"/>
+                <w:szCs w:val="20"/>
+                <w:shd w:fill="F2F2F2" w:val="clear"/>
+              </w:rPr>
+              <w:t xml:space="preserve">None</w:t>
             </w:r>
           </w:p>
         </w:tc>
@@ -5660,7 +5681,7 @@
                 <w:szCs w:val="20"/>
                 <w:shd w:fill="F2F2F2" w:val="clear"/>
               </w:rPr>
-              <w:t xml:space="preserve">OFULLSTANDIG_ANDEL</w:t>
+              <w:t xml:space="preserve">DOLDA_KOLUMNER</w:t>
             </w:r>
           </w:p>
         </w:tc>
@@ -5686,7 +5707,7 @@
               <w:spacing w:after="0"/>
             </w:pPr>
             <w:r>
-              <w:t xml:space="preserve">Är filmad längd kortare än så gånger kartlängden nådde kameran inte fram; profilen hängs då bara upp i startbrunnen.</w:t>
+              <w:t xml:space="preserve">Kolumner per flik som döljs som standard i Excel (grupperade, fälls ut med plustecknet ovanför rubrikraden). Rubrik utan enhet. Tom lista = visa allt.</w:t>
             </w:r>
           </w:p>
         </w:tc>
@@ -5712,7 +5733,7 @@
               <w:spacing w:after="0"/>
             </w:pPr>
             <w:r>
-              <w:t xml:space="preserve">0,85</w:t>
+              <w:t xml:space="preserve">se skriptet</w:t>
             </w:r>
           </w:p>
         </w:tc>
@@ -5745,7 +5766,7 @@
                 <w:szCs w:val="20"/>
                 <w:shd w:fill="F2F2F2" w:val="clear"/>
               </w:rPr>
-              <w:t xml:space="preserve">KODER</w:t>
+              <w:t xml:space="preserve">OFULLSTANDIG_ANDEL</w:t>
             </w:r>
           </w:p>
         </w:tc>
@@ -5770,7 +5791,7 @@
               <w:spacing w:after="0"/>
             </w:pPr>
             <w:r>
-              <w:t xml:space="preserve">Skadekoder med klartext och typ (K = konstruktion, D = drift, I = information).</w:t>
+              <w:t xml:space="preserve">Är filmad längd kortare än så gånger kartlängden nådde kameran inte fram; profilen hängs då bara upp i startbrunnen.</w:t>
             </w:r>
           </w:p>
         </w:tc>
@@ -5795,7 +5816,7 @@
               <w:spacing w:after="0"/>
             </w:pPr>
             <w:r>
-              <w:t xml:space="preserve">P93</w:t>
+              <w:t xml:space="preserve">0,85</w:t>
             </w:r>
           </w:p>
         </w:tc>
@@ -5829,6 +5850,91 @@
                 <w:szCs w:val="20"/>
                 <w:shd w:fill="F2F2F2" w:val="clear"/>
               </w:rPr>
+              <w:t xml:space="preserve">KODER</w:t>
+            </w:r>
+          </w:p>
+        </w:tc>
+        <w:tc>
+          <w:tcPr>
+            <w:tcW w:type="dxa" w:w="5000"/>
+            <w:tcBorders>
+              <w:top w:val="single" w:color="BFBFBF" w:sz="4"/>
+              <w:left w:val="single" w:color="BFBFBF" w:sz="4"/>
+              <w:bottom w:val="single" w:color="BFBFBF" w:sz="4"/>
+              <w:right w:val="single" w:color="BFBFBF" w:sz="4"/>
+            </w:tcBorders>
+            <w:shd w:fill="F7F9FC" w:val="clear"/>
+            <w:tcMar>
+              <w:top w:type="dxa" w:w="60"/>
+              <w:left w:type="dxa" w:w="100"/>
+              <w:bottom w:type="dxa" w:w="60"/>
+              <w:right w:type="dxa" w:w="100"/>
+            </w:tcMar>
+          </w:tcPr>
+          <w:p>
+            <w:pPr>
+              <w:spacing w:after="0"/>
+            </w:pPr>
+            <w:r>
+              <w:t xml:space="preserve">Skadekoder med klartext och typ (K = konstruktion, D = drift, I = information).</w:t>
+            </w:r>
+          </w:p>
+        </w:tc>
+        <w:tc>
+          <w:tcPr>
+            <w:tcW w:type="dxa" w:w="1760"/>
+            <w:tcBorders>
+              <w:top w:val="single" w:color="BFBFBF" w:sz="4"/>
+              <w:left w:val="single" w:color="BFBFBF" w:sz="4"/>
+              <w:bottom w:val="single" w:color="BFBFBF" w:sz="4"/>
+              <w:right w:val="single" w:color="BFBFBF" w:sz="4"/>
+            </w:tcBorders>
+            <w:shd w:fill="F7F9FC" w:val="clear"/>
+            <w:tcMar>
+              <w:top w:type="dxa" w:w="60"/>
+              <w:left w:type="dxa" w:w="100"/>
+              <w:bottom w:type="dxa" w:w="60"/>
+              <w:right w:type="dxa" w:w="100"/>
+            </w:tcMar>
+          </w:tcPr>
+          <w:p>
+            <w:pPr>
+              <w:spacing w:after="0"/>
+            </w:pPr>
+            <w:r>
+              <w:t xml:space="preserve">P93</w:t>
+            </w:r>
+          </w:p>
+        </w:tc>
+      </w:tr>
+      <w:tr>
+        <w:tc>
+          <w:tcPr>
+            <w:tcW w:type="dxa" w:w="2600"/>
+            <w:tcBorders>
+              <w:top w:val="single" w:color="BFBFBF" w:sz="4"/>
+              <w:left w:val="single" w:color="BFBFBF" w:sz="4"/>
+              <w:bottom w:val="single" w:color="BFBFBF" w:sz="4"/>
+              <w:right w:val="single" w:color="BFBFBF" w:sz="4"/>
+            </w:tcBorders>
+            <w:tcMar>
+              <w:top w:type="dxa" w:w="60"/>
+              <w:left w:type="dxa" w:w="100"/>
+              <w:bottom w:type="dxa" w:w="60"/>
+              <w:right w:type="dxa" w:w="100"/>
+            </w:tcMar>
+          </w:tcPr>
+          <w:p>
+            <w:pPr>
+              <w:spacing w:after="0"/>
+            </w:pPr>
+            <w:r>
+              <w:rPr>
+                <w:rFonts w:ascii="Consolas" w:cs="Consolas" w:eastAsia="Consolas" w:hAnsi="Consolas"/>
+                <w:sz w:val="20"/>
+                <w:szCs w:val="20"/>
+                <w:shd w:fill="F2F2F2" w:val="clear"/>
+              </w:rPr>
               <w:t xml:space="preserve">ATTRIBUT</w:t>
             </w:r>
             <w:r>
@@ -5854,7 +5960,6 @@
               <w:bottom w:val="single" w:color="BFBFBF" w:sz="4"/>
               <w:right w:val="single" w:color="BFBFBF" w:sz="4"/>
             </w:tcBorders>
-            <w:shd w:fill="F7F9FC" w:val="clear"/>
             <w:tcMar>
               <w:top w:type="dxa" w:w="60"/>
               <w:left w:type="dxa" w:w="100"/>
@@ -5880,7 +5985,6 @@
               <w:bottom w:val="single" w:color="BFBFBF" w:sz="4"/>
               <w:right w:val="single" w:color="BFBFBF" w:sz="4"/>
             </w:tcBorders>
-            <w:shd w:fill="F7F9FC" w:val="clear"/>
             <w:tcMar>
               <w:top w:type="dxa" w:w="60"/>
               <w:left w:type="dxa" w:w="100"/>
@@ -10262,7 +10366,31 @@
         <w:t xml:space="preserve">FOTO_MAX_PX</w:t>
       </w:r>
       <w:r>
-        <w:t xml:space="preserve">, standard 960 px på längsta sidan – 290 dpi i A4) och bilddata lagras binärt i stället för textkodat. DUF 701 med 488 foton i full HD tar ungefär en halv minut på en dator med fyra kärnor, mot tre och en halv minut tidigare, och rapportmappen blir en fjärdedel så stor. Använd dessutom </w:t>
+        <w:t xml:space="preserve">, standard 960 px på längsta sidan – 290 dpi i A4) och bilddata lagras binärt i stället för textkodat. DUF 701 med 488 foton i full HD tar ungefär en halv minut på en dator med fyra kärnor, mot tre och en halv minut tidigare, och rapportmappen blir mindre än en sjundedel så stor. Vill ni ha ännu mindre filer: sänk </w:t>
+      </w:r>
+      <w:r>
+        <w:rPr>
+          <w:rFonts w:ascii="Consolas" w:cs="Consolas" w:eastAsia="Consolas" w:hAnsi="Consolas"/>
+          <w:sz w:val="20"/>
+          <w:szCs w:val="20"/>
+          <w:shd w:fill="F2F2F2" w:val="clear"/>
+        </w:rPr>
+        <w:t xml:space="preserve">FOTO_MAX_PX</w:t>
+      </w:r>
+      <w:r>
+        <w:t xml:space="preserve"> till 800 eller </w:t>
+      </w:r>
+      <w:r>
+        <w:rPr>
+          <w:rFonts w:ascii="Consolas" w:cs="Consolas" w:eastAsia="Consolas" w:hAnsi="Consolas"/>
+          <w:sz w:val="20"/>
+          <w:szCs w:val="20"/>
+          <w:shd w:fill="F2F2F2" w:val="clear"/>
+        </w:rPr>
+        <w:t xml:space="preserve">FOTO_JPEG_KVALITET</w:t>
+      </w:r>
+      <w:r>
+        <w:t xml:space="preserve"> till 70 i KONFIG – fotona är det som tar plats, diagrambilderna är små. Använd dessutom </w:t>
       </w:r>
       <w:r>
         <w:rPr>

</xml_diff>

<commit_message>
Exportera GIS-data: brunnar och ledningssträckor ur ArcMap, kontroll av filmerna mot kartan
Nytt verktyg Exportera GIS-data (arcmap/gisexport.py + .pyt): brunnar med
locknivå och typ, ledningssträckor mellan brunnar med längd, vattengång
i båda ändar (interpolerad vid brunnar mitt på en ledning), dimension,
material, ledningstyp och anläggningsår till gisdata.json + CSV.

tv3_analys: gis:/--gis läser filen, kopplar på brunnspar och sätter
GIS-flagga per sträcka (brunn saknas, ingen ledning, vattengång,
riktning, material, dimension), Lutning GIS, Djup start/slut
(locknivå − lägsta vattengång) och Anläggningsår i Excel/JSON. Okända
brunnar får förslag på littera i littera_forslag.csv. Utan markprofil
används GIS-vattengång och kartlängd till höjdanpassningen.

Co-Authored-By: Claude Fable 5.1 <noreply@anthropic.com>
Claude-Session: https://claude.ai/code/session_011fdqX3JEZje1LF9LqpaqR8
</commit_message>
<xml_diff>
--- a/Anvandarhandledning tv3_analys.docx
+++ b/Anvandarhandledning tv3_analys.docx
@@ -358,6 +358,21 @@
           <w:sz w:val="19"/>
           <w:szCs w:val="19"/>
         </w:rPr>
+        <w:t xml:space="preserve">gis: Karta\gisdata.json                    # från ArcMap-verktyget Exportera GIS-data, se 7.11</w:t>
+      </w:r>
+    </w:p>
+    <w:p>
+      <w:pPr>
+        <w:shd w:fill="F2F2F2" w:val="clear"/>
+        <w:spacing w:after="0"/>
+        <w:ind w:left="280"/>
+      </w:pPr>
+      <w:r>
+        <w:rPr>
+          <w:rFonts w:ascii="Consolas" w:cs="Consolas" w:eastAsia="Consolas" w:hAnsi="Consolas"/>
+          <w:sz w:val="19"/>
+          <w:szCs w:val="19"/>
+        </w:rPr>
         <w:t xml:space="preserve">manuell: forra_korningen\prioritering.xlsx   # manuella bedömningar och Lagning (m), se 6.1</w:t>
       </w:r>
     </w:p>
@@ -575,6 +590,52 @@
           <w:shd w:fill="F2F2F2" w:val="clear"/>
         </w:rPr>
         <w:t xml:space="preserve">--uppstroms</w:t>
+      </w:r>
+      <w:r>
+        <w:t xml:space="preserve">.</w:t>
+      </w:r>
+    </w:p>
+    <w:p>
+      <w:pPr>
+        <w:pStyle w:val="ListParagraph"/>
+        <w:numPr>
+          <w:ilvl w:val="0"/>
+          <w:numId w:val="3"/>
+        </w:numPr>
+        <w:spacing w:after="80"/>
+      </w:pPr>
+      <w:r>
+        <w:rPr>
+          <w:rFonts w:ascii="Consolas" w:cs="Consolas" w:eastAsia="Consolas" w:hAnsi="Consolas"/>
+          <w:sz w:val="20"/>
+          <w:szCs w:val="20"/>
+          <w:shd w:fill="F2F2F2" w:val="clear"/>
+        </w:rPr>
+        <w:t xml:space="preserve">gis:</w:t>
+      </w:r>
+      <w:r>
+        <w:t xml:space="preserve"> anger </w:t>
+      </w:r>
+      <w:r>
+        <w:rPr>
+          <w:rFonts w:ascii="Consolas" w:cs="Consolas" w:eastAsia="Consolas" w:hAnsi="Consolas"/>
+          <w:sz w:val="20"/>
+          <w:szCs w:val="20"/>
+          <w:shd w:fill="F2F2F2" w:val="clear"/>
+        </w:rPr>
+        <w:t xml:space="preserve">gisdata.json</w:t>
+      </w:r>
+      <w:r>
+        <w:t xml:space="preserve"> från ArcMap-verktyget Exportera GIS-data (avsnitt 7.11): brunnar och ledningssträckor ur kartan, som filmerna kontrolleras mot. Samma sak som </w:t>
+      </w:r>
+      <w:r>
+        <w:rPr>
+          <w:rFonts w:ascii="Consolas" w:cs="Consolas" w:eastAsia="Consolas" w:hAnsi="Consolas"/>
+          <w:sz w:val="20"/>
+          <w:szCs w:val="20"/>
+          <w:shd w:fill="F2F2F2" w:val="clear"/>
+        </w:rPr>
+        <w:t xml:space="preserve">--gis</w:t>
       </w:r>
       <w:r>
         <w:t xml:space="preserve">.</w:t>
@@ -2504,6 +2565,92 @@
           </w:p>
         </w:tc>
       </w:tr>
+      <w:tr>
+        <w:tc>
+          <w:tcPr>
+            <w:tcW w:type="dxa" w:w="2600"/>
+            <w:tcBorders>
+              <w:top w:val="single" w:color="BFBFBF" w:sz="4"/>
+              <w:left w:val="single" w:color="BFBFBF" w:sz="4"/>
+              <w:bottom w:val="single" w:color="BFBFBF" w:sz="4"/>
+              <w:right w:val="single" w:color="BFBFBF" w:sz="4"/>
+            </w:tcBorders>
+            <w:shd w:fill="F7F9FC" w:val="clear"/>
+            <w:tcMar>
+              <w:top w:type="dxa" w:w="60"/>
+              <w:left w:type="dxa" w:w="100"/>
+              <w:bottom w:type="dxa" w:w="60"/>
+              <w:right w:type="dxa" w:w="100"/>
+            </w:tcMar>
+          </w:tcPr>
+          <w:p>
+            <w:pPr>
+              <w:spacing w:after="0"/>
+            </w:pPr>
+            <w:r>
+              <w:rPr>
+                <w:rFonts w:ascii="Consolas" w:cs="Consolas" w:eastAsia="Consolas" w:hAnsi="Consolas"/>
+                <w:sz w:val="20"/>
+                <w:szCs w:val="20"/>
+                <w:shd w:fill="F2F2F2" w:val="clear"/>
+              </w:rPr>
+              <w:t xml:space="preserve">--gis FIL.JSON</w:t>
+            </w:r>
+          </w:p>
+        </w:tc>
+        <w:tc>
+          <w:tcPr>
+            <w:tcW w:type="dxa" w:w="5000"/>
+            <w:tcBorders>
+              <w:top w:val="single" w:color="BFBFBF" w:sz="4"/>
+              <w:left w:val="single" w:color="BFBFBF" w:sz="4"/>
+              <w:bottom w:val="single" w:color="BFBFBF" w:sz="4"/>
+              <w:right w:val="single" w:color="BFBFBF" w:sz="4"/>
+            </w:tcBorders>
+            <w:shd w:fill="F7F9FC" w:val="clear"/>
+            <w:tcMar>
+              <w:top w:type="dxa" w:w="60"/>
+              <w:left w:type="dxa" w:w="100"/>
+              <w:bottom w:type="dxa" w:w="60"/>
+              <w:right w:type="dxa" w:w="100"/>
+            </w:tcMar>
+          </w:tcPr>
+          <w:p>
+            <w:pPr>
+              <w:spacing w:after="0"/>
+            </w:pPr>
+            <w:r>
+              <w:t xml:space="preserve">gisdata.json från ArcMap-verktyget Exportera GIS-data (se 7.11). Filmerna kontrolleras mot GIS (kolumnen GIS-flagga), djup vid brunnarna och anläggningsår fylls i, och okända brunnar får förslag på rätt littera i littera_forslag.csv. Kan även anges i listfilen.</w:t>
+            </w:r>
+          </w:p>
+        </w:tc>
+        <w:tc>
+          <w:tcPr>
+            <w:tcW w:type="dxa" w:w="1760"/>
+            <w:tcBorders>
+              <w:top w:val="single" w:color="BFBFBF" w:sz="4"/>
+              <w:left w:val="single" w:color="BFBFBF" w:sz="4"/>
+              <w:bottom w:val="single" w:color="BFBFBF" w:sz="4"/>
+              <w:right w:val="single" w:color="BFBFBF" w:sz="4"/>
+            </w:tcBorders>
+            <w:shd w:fill="F7F9FC" w:val="clear"/>
+            <w:tcMar>
+              <w:top w:type="dxa" w:w="60"/>
+              <w:left w:type="dxa" w:w="100"/>
+              <w:bottom w:type="dxa" w:w="60"/>
+              <w:right w:type="dxa" w:w="100"/>
+            </w:tcMar>
+          </w:tcPr>
+          <w:p>
+            <w:pPr>
+              <w:spacing w:after="0"/>
+            </w:pPr>
+            <w:r>
+              <w:t xml:space="preserve">–</w:t>
+            </w:r>
+          </w:p>
+        </w:tc>
+      </w:tr>
     </w:tbl>
     <w:p>
       <w:pPr>
@@ -3629,7 +3776,7 @@
               <w:spacing w:after="0"/>
             </w:pPr>
             <w:r>
-              <w:t xml:space="preserve">En rad per sträcka, rankad efter prioritetsklass och index. Använd autofiltret för att filtrera på klass, material, ledningstyp, område eller fil. Kolumnen Skador (kod+grad) visar t.ex. 9×YTS4, 1×SPR3. Kolumnerna Avbruten inspektion, Inspekterad flera ggr och Relinad ger extra kontext. Ur inklinometerprofilen beräknas Svackdjup i cm (största stående vattendjup i en svacka), Svackdjup/diameter, Svacklängd, Bakfall längd (meter med lutning mot flödesriktningen) och Lutning; Profil osäker markerar sträckor där inklinometerns fall avviker kraftigt från brunnshöjderna och profilen därför inte bör användas. Anslutningar räknar registrerade anslutningar (AS/AG) på sträckan. Enheten (m, mm, p/100 m …) står på en egen rad under rubrikerna, så rubrikerna är korta. Med markprofil från ArcMap (7.5) fylls även Höjdanpassning, Täckning min/max och Höjdflagga i. Bara de viktigaste kolumnerna visas från början; övriga (fil, nr, område, datum, drift- och totalindex, driftåtgärd, profilmått, höjdflagga m.m.) är dolda i grupper och fälls ut med plustecknet ovanför kolumnrubrikerna eller knappen 2 uppe till vänster. Vilka som döljs styrs av </w:t>
+              <w:t xml:space="preserve">En rad per sträcka, rankad efter prioritetsklass och index. Använd autofiltret för att filtrera på klass, material, ledningstyp, område eller fil. Kolumnen Skador (kod+grad) visar t.ex. 9×YTS4, 1×SPR3. Kolumnerna Avbruten inspektion, Inspekterad flera ggr och Relinad ger extra kontext. Ur inklinometerprofilen beräknas Svackdjup i cm (största stående vattendjup i en svacka), Svackdjup/diameter, Svacklängd, Bakfall längd (meter med lutning mot flödesriktningen) och Lutning; Profil osäker markerar sträckor där inklinometerns fall avviker kraftigt från brunnshöjderna och profilen därför inte bör användas. Anslutningar räknar registrerade anslutningar (AS/AG) på sträckan. Enheten (m, mm, p/100 m …) står på en egen rad under rubrikerna, så rubrikerna är korta. Med markprofil från ArcMap (7.5) fylls även Höjdanpassning, Täckning min/max och Höjdflagga i, och med GIS-data (7.11) kolumnen GIS-flagga (avvikelser mellan film och karta) samt de dolda Lutning GIS, Djup start/slut och Anläggningsår. Bara de viktigaste kolumnerna visas från början; övriga (fil, nr, område, datum, drift- och totalindex, driftåtgärd, profilmått, höjdflagga m.m.) är dolda i grupper och fälls ut med plustecknet ovanför kolumnrubrikerna eller knappen 2 uppe till vänster. Vilka som döljs styrs av </w:t>
             </w:r>
             <w:r>
               <w:rPr>
@@ -5353,7 +5500,7 @@
                 <w:szCs w:val="20"/>
                 <w:shd w:fill="F2F2F2" w:val="clear"/>
               </w:rPr>
-              <w:t xml:space="preserve">FOTO_MAX_PX</w:t>
+              <w:t xml:space="preserve">GIS_FALL_TOL_M</w:t>
             </w:r>
             <w:r>
               <w:t xml:space="preserve">, </w:t>
@@ -5365,7 +5512,7 @@
                 <w:szCs w:val="20"/>
                 <w:shd w:fill="F2F2F2" w:val="clear"/>
               </w:rPr>
-              <w:t xml:space="preserve">FOTO_JPEG_KVALITET</w:t>
+              <w:t xml:space="preserve">GIS_FALL_TOL_ANDEL</w:t>
             </w:r>
           </w:p>
         </w:tc>
@@ -5390,19 +5537,7 @@
               <w:spacing w:after="0"/>
             </w:pPr>
             <w:r>
-              <w:t xml:space="preserve">Fotona i PDF-rapporterna förminskas till högst så många pixlar på längsta sidan (JPEG-kvalitet enligt den andra; 76 ger ~30 % mindre filer än 82 utan synlig skillnad i A4). </w:t>
-            </w:r>
-            <w:r>
-              <w:rPr>
-                <w:rFonts w:ascii="Consolas" w:cs="Consolas" w:eastAsia="Consolas" w:hAnsi="Consolas"/>
-                <w:sz w:val="20"/>
-                <w:szCs w:val="20"/>
-                <w:shd w:fill="F2F2F2" w:val="clear"/>
-              </w:rPr>
-              <w:t xml:space="preserve">None</w:t>
-            </w:r>
-            <w:r>
-              <w:t xml:space="preserve"> = originalstorlek.</w:t>
+              <w:t xml:space="preserve">Fallet mellan brunnarna i filmen får avvika så mycket (m) eller så stor andel av GIS-fallet från GIS innan GIS-flaggan vattengång sätts (det största gäller).</w:t>
             </w:r>
           </w:p>
         </w:tc>
@@ -5427,7 +5562,7 @@
               <w:spacing w:after="0"/>
             </w:pPr>
             <w:r>
-              <w:t xml:space="preserve">960, 76</w:t>
+              <w:t xml:space="preserve">0,3, 0,5</w:t>
             </w:r>
           </w:p>
         </w:tc>
@@ -5461,19 +5596,7 @@
                 <w:szCs w:val="20"/>
                 <w:shd w:fill="F2F2F2" w:val="clear"/>
               </w:rPr>
-              <w:t xml:space="preserve">RAPPORT_BILD_DPI</w:t>
-            </w:r>
-            <w:r>
-              <w:t xml:space="preserve">, </w:t>
-            </w:r>
-            <w:r>
-              <w:rPr>
-                <w:rFonts w:ascii="Consolas" w:cs="Consolas" w:eastAsia="Consolas" w:hAnsi="Consolas"/>
-                <w:sz w:val="20"/>
-                <w:szCs w:val="20"/>
-                <w:shd w:fill="F2F2F2" w:val="clear"/>
-              </w:rPr>
-              <w:t xml:space="preserve">RAPPORT_BILD_PALETT</w:t>
+              <w:t xml:space="preserve">GIS_RIKTNING_MIN_M</w:t>
             </w:r>
           </w:p>
         </w:tc>
@@ -5499,7 +5622,7 @@
               <w:spacing w:after="0"/>
             </w:pPr>
             <w:r>
-              <w:t xml:space="preserve">Upplösning på översikts- och profilbilden i rapporten, och om de sparas som palett-PNG (256 färger, ca 65 % mindre).</w:t>
+              <w:t xml:space="preserve">Stiger GIS-vattengången mer än så (m) från start- till slutbrunn flaggas riktningen.</w:t>
             </w:r>
           </w:p>
         </w:tc>
@@ -5525,16 +5648,7 @@
               <w:spacing w:after="0"/>
             </w:pPr>
             <w:r>
-              <w:t xml:space="preserve">150, </w:t>
-            </w:r>
-            <w:r>
-              <w:rPr>
-                <w:rFonts w:ascii="Consolas" w:cs="Consolas" w:eastAsia="Consolas" w:hAnsi="Consolas"/>
-                <w:sz w:val="20"/>
-                <w:szCs w:val="20"/>
-                <w:shd w:fill="F2F2F2" w:val="clear"/>
-              </w:rPr>
-              <w:t xml:space="preserve">True</w:t>
+              <w:t xml:space="preserve">0,05</w:t>
             </w:r>
           </w:p>
         </w:tc>
@@ -5567,7 +5681,7 @@
                 <w:szCs w:val="20"/>
                 <w:shd w:fill="F2F2F2" w:val="clear"/>
               </w:rPr>
-              <w:t xml:space="preserve">RAPPORT_PROCESSER</w:t>
+              <w:t xml:space="preserve">GIS_MATERIAL</w:t>
             </w:r>
           </w:p>
         </w:tc>
@@ -5592,31 +5706,7 @@
               <w:spacing w:after="0"/>
             </w:pPr>
             <w:r>
-              <w:t xml:space="preserve">Antal parallella processer för PDF-rapporterna. </w:t>
-            </w:r>
-            <w:r>
-              <w:rPr>
-                <w:rFonts w:ascii="Consolas" w:cs="Consolas" w:eastAsia="Consolas" w:hAnsi="Consolas"/>
-                <w:sz w:val="20"/>
-                <w:szCs w:val="20"/>
-                <w:shd w:fill="F2F2F2" w:val="clear"/>
-              </w:rPr>
-              <w:t xml:space="preserve">None</w:t>
-            </w:r>
-            <w:r>
-              <w:t xml:space="preserve"> = antal kärnor − 1, </w:t>
-            </w:r>
-            <w:r>
-              <w:rPr>
-                <w:rFonts w:ascii="Consolas" w:cs="Consolas" w:eastAsia="Consolas" w:hAnsi="Consolas"/>
-                <w:sz w:val="20"/>
-                <w:szCs w:val="20"/>
-                <w:shd w:fill="F2F2F2" w:val="clear"/>
-              </w:rPr>
-              <w:t xml:space="preserve">1</w:t>
-            </w:r>
-            <w:r>
-              <w:t xml:space="preserve"> = en i taget.</w:t>
+              <w:t xml:space="preserve">Materialnamn i film och GIS som räknas som samma (BTG = Betong, PVC/PE/PP = Plast …).</w:t>
             </w:r>
           </w:p>
         </w:tc>
@@ -5641,13 +5731,7 @@
               <w:spacing w:after="0"/>
             </w:pPr>
             <w:r>
-              <w:rPr>
-                <w:rFonts w:ascii="Consolas" w:cs="Consolas" w:eastAsia="Consolas" w:hAnsi="Consolas"/>
-                <w:sz w:val="20"/>
-                <w:szCs w:val="20"/>
-                <w:shd w:fill="F2F2F2" w:val="clear"/>
-              </w:rPr>
-              <w:t xml:space="preserve">None</w:t>
+              <w:t xml:space="preserve">se skriptet</w:t>
             </w:r>
           </w:p>
         </w:tc>
@@ -5681,7 +5765,19 @@
                 <w:szCs w:val="20"/>
                 <w:shd w:fill="F2F2F2" w:val="clear"/>
               </w:rPr>
-              <w:t xml:space="preserve">DOLDA_KOLUMNER</w:t>
+              <w:t xml:space="preserve">FOTO_MAX_PX</w:t>
+            </w:r>
+            <w:r>
+              <w:t xml:space="preserve">, </w:t>
+            </w:r>
+            <w:r>
+              <w:rPr>
+                <w:rFonts w:ascii="Consolas" w:cs="Consolas" w:eastAsia="Consolas" w:hAnsi="Consolas"/>
+                <w:sz w:val="20"/>
+                <w:szCs w:val="20"/>
+                <w:shd w:fill="F2F2F2" w:val="clear"/>
+              </w:rPr>
+              <w:t xml:space="preserve">FOTO_JPEG_KVALITET</w:t>
             </w:r>
           </w:p>
         </w:tc>
@@ -5707,7 +5803,19 @@
               <w:spacing w:after="0"/>
             </w:pPr>
             <w:r>
-              <w:t xml:space="preserve">Kolumner per flik som döljs som standard i Excel (grupperade, fälls ut med plustecknet ovanför rubrikraden). Rubrik utan enhet. Tom lista = visa allt.</w:t>
+              <w:t xml:space="preserve">Fotona i PDF-rapporterna förminskas till högst så många pixlar på längsta sidan (JPEG-kvalitet enligt den andra; 76 ger ~30 % mindre filer än 82 utan synlig skillnad i A4). </w:t>
+            </w:r>
+            <w:r>
+              <w:rPr>
+                <w:rFonts w:ascii="Consolas" w:cs="Consolas" w:eastAsia="Consolas" w:hAnsi="Consolas"/>
+                <w:sz w:val="20"/>
+                <w:szCs w:val="20"/>
+                <w:shd w:fill="F2F2F2" w:val="clear"/>
+              </w:rPr>
+              <w:t xml:space="preserve">None</w:t>
+            </w:r>
+            <w:r>
+              <w:t xml:space="preserve"> = originalstorlek.</w:t>
             </w:r>
           </w:p>
         </w:tc>
@@ -5733,7 +5841,7 @@
               <w:spacing w:after="0"/>
             </w:pPr>
             <w:r>
-              <w:t xml:space="preserve">se skriptet</w:t>
+              <w:t xml:space="preserve">960, 76</w:t>
             </w:r>
           </w:p>
         </w:tc>
@@ -5766,7 +5874,19 @@
                 <w:szCs w:val="20"/>
                 <w:shd w:fill="F2F2F2" w:val="clear"/>
               </w:rPr>
-              <w:t xml:space="preserve">OFULLSTANDIG_ANDEL</w:t>
+              <w:t xml:space="preserve">RAPPORT_BILD_DPI</w:t>
+            </w:r>
+            <w:r>
+              <w:t xml:space="preserve">, </w:t>
+            </w:r>
+            <w:r>
+              <w:rPr>
+                <w:rFonts w:ascii="Consolas" w:cs="Consolas" w:eastAsia="Consolas" w:hAnsi="Consolas"/>
+                <w:sz w:val="20"/>
+                <w:szCs w:val="20"/>
+                <w:shd w:fill="F2F2F2" w:val="clear"/>
+              </w:rPr>
+              <w:t xml:space="preserve">RAPPORT_BILD_PALETT</w:t>
             </w:r>
           </w:p>
         </w:tc>
@@ -5791,7 +5911,7 @@
               <w:spacing w:after="0"/>
             </w:pPr>
             <w:r>
-              <w:t xml:space="preserve">Är filmad längd kortare än så gånger kartlängden nådde kameran inte fram; profilen hängs då bara upp i startbrunnen.</w:t>
+              <w:t xml:space="preserve">Upplösning på översikts- och profilbilden i rapporten, och om de sparas som palett-PNG (256 färger, ca 65 % mindre).</w:t>
             </w:r>
           </w:p>
         </w:tc>
@@ -5816,7 +5936,16 @@
               <w:spacing w:after="0"/>
             </w:pPr>
             <w:r>
-              <w:t xml:space="preserve">0,85</w:t>
+              <w:t xml:space="preserve">150, </w:t>
+            </w:r>
+            <w:r>
+              <w:rPr>
+                <w:rFonts w:ascii="Consolas" w:cs="Consolas" w:eastAsia="Consolas" w:hAnsi="Consolas"/>
+                <w:sz w:val="20"/>
+                <w:szCs w:val="20"/>
+                <w:shd w:fill="F2F2F2" w:val="clear"/>
+              </w:rPr>
+              <w:t xml:space="preserve">True</w:t>
             </w:r>
           </w:p>
         </w:tc>
@@ -5850,7 +5979,7 @@
                 <w:szCs w:val="20"/>
                 <w:shd w:fill="F2F2F2" w:val="clear"/>
               </w:rPr>
-              <w:t xml:space="preserve">KODER</w:t>
+              <w:t xml:space="preserve">RAPPORT_PROCESSER</w:t>
             </w:r>
           </w:p>
         </w:tc>
@@ -5876,7 +6005,31 @@
               <w:spacing w:after="0"/>
             </w:pPr>
             <w:r>
-              <w:t xml:space="preserve">Skadekoder med klartext och typ (K = konstruktion, D = drift, I = information).</w:t>
+              <w:t xml:space="preserve">Antal parallella processer för PDF-rapporterna. </w:t>
+            </w:r>
+            <w:r>
+              <w:rPr>
+                <w:rFonts w:ascii="Consolas" w:cs="Consolas" w:eastAsia="Consolas" w:hAnsi="Consolas"/>
+                <w:sz w:val="20"/>
+                <w:szCs w:val="20"/>
+                <w:shd w:fill="F2F2F2" w:val="clear"/>
+              </w:rPr>
+              <w:t xml:space="preserve">None</w:t>
+            </w:r>
+            <w:r>
+              <w:t xml:space="preserve"> = antal kärnor − 1, </w:t>
+            </w:r>
+            <w:r>
+              <w:rPr>
+                <w:rFonts w:ascii="Consolas" w:cs="Consolas" w:eastAsia="Consolas" w:hAnsi="Consolas"/>
+                <w:sz w:val="20"/>
+                <w:szCs w:val="20"/>
+                <w:shd w:fill="F2F2F2" w:val="clear"/>
+              </w:rPr>
+              <w:t xml:space="preserve">1</w:t>
+            </w:r>
+            <w:r>
+              <w:t xml:space="preserve"> = en i taget.</w:t>
             </w:r>
           </w:p>
         </w:tc>
@@ -5902,7 +6055,13 @@
               <w:spacing w:after="0"/>
             </w:pPr>
             <w:r>
-              <w:t xml:space="preserve">P93</w:t>
+              <w:rPr>
+                <w:rFonts w:ascii="Consolas" w:cs="Consolas" w:eastAsia="Consolas" w:hAnsi="Consolas"/>
+                <w:sz w:val="20"/>
+                <w:szCs w:val="20"/>
+                <w:shd w:fill="F2F2F2" w:val="clear"/>
+              </w:rPr>
+              <w:t xml:space="preserve">None</w:t>
             </w:r>
           </w:p>
         </w:tc>
@@ -5935,6 +6094,259 @@
                 <w:szCs w:val="20"/>
                 <w:shd w:fill="F2F2F2" w:val="clear"/>
               </w:rPr>
+              <w:t xml:space="preserve">DOLDA_KOLUMNER</w:t>
+            </w:r>
+          </w:p>
+        </w:tc>
+        <w:tc>
+          <w:tcPr>
+            <w:tcW w:type="dxa" w:w="5000"/>
+            <w:tcBorders>
+              <w:top w:val="single" w:color="BFBFBF" w:sz="4"/>
+              <w:left w:val="single" w:color="BFBFBF" w:sz="4"/>
+              <w:bottom w:val="single" w:color="BFBFBF" w:sz="4"/>
+              <w:right w:val="single" w:color="BFBFBF" w:sz="4"/>
+            </w:tcBorders>
+            <w:tcMar>
+              <w:top w:type="dxa" w:w="60"/>
+              <w:left w:type="dxa" w:w="100"/>
+              <w:bottom w:type="dxa" w:w="60"/>
+              <w:right w:type="dxa" w:w="100"/>
+            </w:tcMar>
+          </w:tcPr>
+          <w:p>
+            <w:pPr>
+              <w:spacing w:after="0"/>
+            </w:pPr>
+            <w:r>
+              <w:t xml:space="preserve">Kolumner per flik som döljs som standard i Excel (grupperade, fälls ut med plustecknet ovanför rubrikraden). Rubrik utan enhet. Tom lista = visa allt.</w:t>
+            </w:r>
+          </w:p>
+        </w:tc>
+        <w:tc>
+          <w:tcPr>
+            <w:tcW w:type="dxa" w:w="1760"/>
+            <w:tcBorders>
+              <w:top w:val="single" w:color="BFBFBF" w:sz="4"/>
+              <w:left w:val="single" w:color="BFBFBF" w:sz="4"/>
+              <w:bottom w:val="single" w:color="BFBFBF" w:sz="4"/>
+              <w:right w:val="single" w:color="BFBFBF" w:sz="4"/>
+            </w:tcBorders>
+            <w:tcMar>
+              <w:top w:type="dxa" w:w="60"/>
+              <w:left w:type="dxa" w:w="100"/>
+              <w:bottom w:type="dxa" w:w="60"/>
+              <w:right w:type="dxa" w:w="100"/>
+            </w:tcMar>
+          </w:tcPr>
+          <w:p>
+            <w:pPr>
+              <w:spacing w:after="0"/>
+            </w:pPr>
+            <w:r>
+              <w:t xml:space="preserve">se skriptet</w:t>
+            </w:r>
+          </w:p>
+        </w:tc>
+      </w:tr>
+      <w:tr>
+        <w:tc>
+          <w:tcPr>
+            <w:tcW w:type="dxa" w:w="2600"/>
+            <w:tcBorders>
+              <w:top w:val="single" w:color="BFBFBF" w:sz="4"/>
+              <w:left w:val="single" w:color="BFBFBF" w:sz="4"/>
+              <w:bottom w:val="single" w:color="BFBFBF" w:sz="4"/>
+              <w:right w:val="single" w:color="BFBFBF" w:sz="4"/>
+            </w:tcBorders>
+            <w:shd w:fill="F7F9FC" w:val="clear"/>
+            <w:tcMar>
+              <w:top w:type="dxa" w:w="60"/>
+              <w:left w:type="dxa" w:w="100"/>
+              <w:bottom w:type="dxa" w:w="60"/>
+              <w:right w:type="dxa" w:w="100"/>
+            </w:tcMar>
+          </w:tcPr>
+          <w:p>
+            <w:pPr>
+              <w:spacing w:after="0"/>
+            </w:pPr>
+            <w:r>
+              <w:rPr>
+                <w:rFonts w:ascii="Consolas" w:cs="Consolas" w:eastAsia="Consolas" w:hAnsi="Consolas"/>
+                <w:sz w:val="20"/>
+                <w:szCs w:val="20"/>
+                <w:shd w:fill="F2F2F2" w:val="clear"/>
+              </w:rPr>
+              <w:t xml:space="preserve">OFULLSTANDIG_ANDEL</w:t>
+            </w:r>
+          </w:p>
+        </w:tc>
+        <w:tc>
+          <w:tcPr>
+            <w:tcW w:type="dxa" w:w="5000"/>
+            <w:tcBorders>
+              <w:top w:val="single" w:color="BFBFBF" w:sz="4"/>
+              <w:left w:val="single" w:color="BFBFBF" w:sz="4"/>
+              <w:bottom w:val="single" w:color="BFBFBF" w:sz="4"/>
+              <w:right w:val="single" w:color="BFBFBF" w:sz="4"/>
+            </w:tcBorders>
+            <w:shd w:fill="F7F9FC" w:val="clear"/>
+            <w:tcMar>
+              <w:top w:type="dxa" w:w="60"/>
+              <w:left w:type="dxa" w:w="100"/>
+              <w:bottom w:type="dxa" w:w="60"/>
+              <w:right w:type="dxa" w:w="100"/>
+            </w:tcMar>
+          </w:tcPr>
+          <w:p>
+            <w:pPr>
+              <w:spacing w:after="0"/>
+            </w:pPr>
+            <w:r>
+              <w:t xml:space="preserve">Är filmad längd kortare än så gånger kartlängden nådde kameran inte fram; profilen hängs då bara upp i startbrunnen.</w:t>
+            </w:r>
+          </w:p>
+        </w:tc>
+        <w:tc>
+          <w:tcPr>
+            <w:tcW w:type="dxa" w:w="1760"/>
+            <w:tcBorders>
+              <w:top w:val="single" w:color="BFBFBF" w:sz="4"/>
+              <w:left w:val="single" w:color="BFBFBF" w:sz="4"/>
+              <w:bottom w:val="single" w:color="BFBFBF" w:sz="4"/>
+              <w:right w:val="single" w:color="BFBFBF" w:sz="4"/>
+            </w:tcBorders>
+            <w:shd w:fill="F7F9FC" w:val="clear"/>
+            <w:tcMar>
+              <w:top w:type="dxa" w:w="60"/>
+              <w:left w:type="dxa" w:w="100"/>
+              <w:bottom w:type="dxa" w:w="60"/>
+              <w:right w:type="dxa" w:w="100"/>
+            </w:tcMar>
+          </w:tcPr>
+          <w:p>
+            <w:pPr>
+              <w:spacing w:after="0"/>
+            </w:pPr>
+            <w:r>
+              <w:t xml:space="preserve">0,85</w:t>
+            </w:r>
+          </w:p>
+        </w:tc>
+      </w:tr>
+      <w:tr>
+        <w:tc>
+          <w:tcPr>
+            <w:tcW w:type="dxa" w:w="2600"/>
+            <w:tcBorders>
+              <w:top w:val="single" w:color="BFBFBF" w:sz="4"/>
+              <w:left w:val="single" w:color="BFBFBF" w:sz="4"/>
+              <w:bottom w:val="single" w:color="BFBFBF" w:sz="4"/>
+              <w:right w:val="single" w:color="BFBFBF" w:sz="4"/>
+            </w:tcBorders>
+            <w:tcMar>
+              <w:top w:type="dxa" w:w="60"/>
+              <w:left w:type="dxa" w:w="100"/>
+              <w:bottom w:type="dxa" w:w="60"/>
+              <w:right w:type="dxa" w:w="100"/>
+            </w:tcMar>
+          </w:tcPr>
+          <w:p>
+            <w:pPr>
+              <w:spacing w:after="0"/>
+            </w:pPr>
+            <w:r>
+              <w:rPr>
+                <w:rFonts w:ascii="Consolas" w:cs="Consolas" w:eastAsia="Consolas" w:hAnsi="Consolas"/>
+                <w:sz w:val="20"/>
+                <w:szCs w:val="20"/>
+                <w:shd w:fill="F2F2F2" w:val="clear"/>
+              </w:rPr>
+              <w:t xml:space="preserve">KODER</w:t>
+            </w:r>
+          </w:p>
+        </w:tc>
+        <w:tc>
+          <w:tcPr>
+            <w:tcW w:type="dxa" w:w="5000"/>
+            <w:tcBorders>
+              <w:top w:val="single" w:color="BFBFBF" w:sz="4"/>
+              <w:left w:val="single" w:color="BFBFBF" w:sz="4"/>
+              <w:bottom w:val="single" w:color="BFBFBF" w:sz="4"/>
+              <w:right w:val="single" w:color="BFBFBF" w:sz="4"/>
+            </w:tcBorders>
+            <w:tcMar>
+              <w:top w:type="dxa" w:w="60"/>
+              <w:left w:type="dxa" w:w="100"/>
+              <w:bottom w:type="dxa" w:w="60"/>
+              <w:right w:type="dxa" w:w="100"/>
+            </w:tcMar>
+          </w:tcPr>
+          <w:p>
+            <w:pPr>
+              <w:spacing w:after="0"/>
+            </w:pPr>
+            <w:r>
+              <w:t xml:space="preserve">Skadekoder med klartext och typ (K = konstruktion, D = drift, I = information).</w:t>
+            </w:r>
+          </w:p>
+        </w:tc>
+        <w:tc>
+          <w:tcPr>
+            <w:tcW w:type="dxa" w:w="1760"/>
+            <w:tcBorders>
+              <w:top w:val="single" w:color="BFBFBF" w:sz="4"/>
+              <w:left w:val="single" w:color="BFBFBF" w:sz="4"/>
+              <w:bottom w:val="single" w:color="BFBFBF" w:sz="4"/>
+              <w:right w:val="single" w:color="BFBFBF" w:sz="4"/>
+            </w:tcBorders>
+            <w:tcMar>
+              <w:top w:type="dxa" w:w="60"/>
+              <w:left w:type="dxa" w:w="100"/>
+              <w:bottom w:type="dxa" w:w="60"/>
+              <w:right w:type="dxa" w:w="100"/>
+            </w:tcMar>
+          </w:tcPr>
+          <w:p>
+            <w:pPr>
+              <w:spacing w:after="0"/>
+            </w:pPr>
+            <w:r>
+              <w:t xml:space="preserve">P93</w:t>
+            </w:r>
+          </w:p>
+        </w:tc>
+      </w:tr>
+      <w:tr>
+        <w:tc>
+          <w:tcPr>
+            <w:tcW w:type="dxa" w:w="2600"/>
+            <w:tcBorders>
+              <w:top w:val="single" w:color="BFBFBF" w:sz="4"/>
+              <w:left w:val="single" w:color="BFBFBF" w:sz="4"/>
+              <w:bottom w:val="single" w:color="BFBFBF" w:sz="4"/>
+              <w:right w:val="single" w:color="BFBFBF" w:sz="4"/>
+            </w:tcBorders>
+            <w:shd w:fill="F7F9FC" w:val="clear"/>
+            <w:tcMar>
+              <w:top w:type="dxa" w:w="60"/>
+              <w:left w:type="dxa" w:w="100"/>
+              <w:bottom w:type="dxa" w:w="60"/>
+              <w:right w:type="dxa" w:w="100"/>
+            </w:tcMar>
+          </w:tcPr>
+          <w:p>
+            <w:pPr>
+              <w:spacing w:after="0"/>
+            </w:pPr>
+            <w:r>
+              <w:rPr>
+                <w:rFonts w:ascii="Consolas" w:cs="Consolas" w:eastAsia="Consolas" w:hAnsi="Consolas"/>
+                <w:sz w:val="20"/>
+                <w:szCs w:val="20"/>
+                <w:shd w:fill="F2F2F2" w:val="clear"/>
+              </w:rPr>
               <w:t xml:space="preserve">ATTRIBUT</w:t>
             </w:r>
             <w:r>
@@ -5960,6 +6372,7 @@
               <w:bottom w:val="single" w:color="BFBFBF" w:sz="4"/>
               <w:right w:val="single" w:color="BFBFBF" w:sz="4"/>
             </w:tcBorders>
+            <w:shd w:fill="F7F9FC" w:val="clear"/>
             <w:tcMar>
               <w:top w:type="dxa" w:w="60"/>
               <w:left w:type="dxa" w:w="100"/>
@@ -5985,6 +6398,7 @@
               <w:bottom w:val="single" w:color="BFBFBF" w:sz="4"/>
               <w:right w:val="single" w:color="BFBFBF" w:sz="4"/>
             </w:tcBorders>
+            <w:shd w:fill="F7F9FC" w:val="clear"/>
             <w:tcMar>
               <w:top w:type="dxa" w:w="60"/>
               <w:left w:type="dxa" w:w="100"/>
@@ -10305,6 +10719,316 @@
       </w:r>
       <w:r>
         <w:t xml:space="preserve"> i lagret för hyperlänk (Display &gt; Support Hyperlinks using field), som för RAPPORT. Under Hyperlänkar kan en annan mapp anges om ArcMap körs i Citrix.</w:t>
+      </w:r>
+    </w:p>
+    <w:p>
+      <w:pPr>
+        <w:pStyle w:val="Heading2"/>
+      </w:pPr>
+      <w:r>
+        <w:t xml:space="preserve">7.11 Exportera GIS-data och kontrollera filmerna mot kartan</w:t>
+      </w:r>
+    </w:p>
+    <w:p>
+      <w:pPr>
+        <w:spacing w:after="120"/>
+      </w:pPr>
+      <w:r>
+        <w:t xml:space="preserve">Verktyget </w:t>
+      </w:r>
+      <w:r>
+        <w:rPr>
+          <w:b/>
+          <w:bCs/>
+        </w:rPr>
+        <w:t xml:space="preserve">Exportera GIS-data</w:t>
+      </w:r>
+      <w:r>
+        <w:t xml:space="preserve"> skriver brunnarna och ledningssträckorna mellan brunnar ur kartan till </w:t>
+      </w:r>
+      <w:r>
+        <w:rPr>
+          <w:rFonts w:ascii="Consolas" w:cs="Consolas" w:eastAsia="Consolas" w:hAnsi="Consolas"/>
+          <w:sz w:val="20"/>
+          <w:szCs w:val="20"/>
+          <w:shd w:fill="F2F2F2" w:val="clear"/>
+        </w:rPr>
+        <w:t xml:space="preserve">gisdata.json</w:t>
+      </w:r>
+      <w:r>
+        <w:t xml:space="preserve">, oberoende av TV3-filerna, så att analysen kan stämma av filmerna mot GIS utan att kartan behöver vara öppen vid varje körning. Välj ledningslager och brunnslager (samma som i Skapa ledningslager), fältet med brunnsbeteckning och, under </w:t>
+      </w:r>
+      <w:r>
+        <w:rPr>
+          <w:b/>
+          <w:bCs/>
+        </w:rPr>
+        <w:t xml:space="preserve">Fält</w:t>
+      </w:r>
+      <w:r>
+        <w:t xml:space="preserve">, locknivå och brunnstyp i brunnslagret samt vattengång uppströms/nedströms, dimension, material, ledningstyp och anläggningsår i ledningslagret. Fälten gissas när lagret valts; vattengångarna ligger på ledningarna (vid start- och slutpunkten), inte på brunnarna. En ledning i kartan som passerar flera brunnar delas per brunnspar, och vattengången i delningspunkterna interpoleras längs ledningen. Bredvid JSON-filen skrivs </w:t>
+      </w:r>
+      <w:r>
+        <w:rPr>
+          <w:rFonts w:ascii="Consolas" w:cs="Consolas" w:eastAsia="Consolas" w:hAnsi="Consolas"/>
+          <w:sz w:val="20"/>
+          <w:szCs w:val="20"/>
+          <w:shd w:fill="F2F2F2" w:val="clear"/>
+        </w:rPr>
+        <w:t xml:space="preserve">gisdata_brunnar.csv</w:t>
+      </w:r>
+      <w:r>
+        <w:t xml:space="preserve"> och </w:t>
+      </w:r>
+      <w:r>
+        <w:rPr>
+          <w:rFonts w:ascii="Consolas" w:cs="Consolas" w:eastAsia="Consolas" w:hAnsi="Consolas"/>
+          <w:sz w:val="20"/>
+          <w:szCs w:val="20"/>
+          <w:shd w:fill="F2F2F2" w:val="clear"/>
+        </w:rPr>
+        <w:t xml:space="preserve">gisdata_ledningar.csv</w:t>
+      </w:r>
+      <w:r>
+        <w:t xml:space="preserve"> för granskning i Excel.</w:t>
+      </w:r>
+    </w:p>
+    <w:p>
+      <w:pPr>
+        <w:spacing w:after="120"/>
+      </w:pPr>
+      <w:r>
+        <w:t xml:space="preserve">Ange filen i listfilen (</w:t>
+      </w:r>
+      <w:r>
+        <w:rPr>
+          <w:rFonts w:ascii="Consolas" w:cs="Consolas" w:eastAsia="Consolas" w:hAnsi="Consolas"/>
+          <w:sz w:val="20"/>
+          <w:szCs w:val="20"/>
+          <w:shd w:fill="F2F2F2" w:val="clear"/>
+        </w:rPr>
+        <w:t xml:space="preserve">gis:</w:t>
+      </w:r>
+      <w:r>
+        <w:t xml:space="preserve">) eller med </w:t>
+      </w:r>
+      <w:r>
+        <w:rPr>
+          <w:rFonts w:ascii="Consolas" w:cs="Consolas" w:eastAsia="Consolas" w:hAnsi="Consolas"/>
+          <w:sz w:val="20"/>
+          <w:szCs w:val="20"/>
+          <w:shd w:fill="F2F2F2" w:val="clear"/>
+        </w:rPr>
+        <w:t xml:space="preserve">--gis</w:t>
+      </w:r>
+      <w:r>
+        <w:t xml:space="preserve">. Analysen letar upp varje sträckas brunnspar bland GIS-ledningarna (oavsett riktning; finns flera tas den vars längd ligger närmast filmens) och sätter kolumnen </w:t>
+      </w:r>
+      <w:r>
+        <w:rPr>
+          <w:b/>
+          <w:bCs/>
+        </w:rPr>
+        <w:t xml:space="preserve">GIS-flagga</w:t>
+      </w:r>
+      <w:r>
+        <w:t xml:space="preserve"> i Prioritering när något avviker:</w:t>
+      </w:r>
+    </w:p>
+    <w:p>
+      <w:pPr>
+        <w:pStyle w:val="ListParagraph"/>
+        <w:numPr>
+          <w:ilvl w:val="0"/>
+          <w:numId w:val="3"/>
+        </w:numPr>
+        <w:spacing w:after="80"/>
+      </w:pPr>
+      <w:r>
+        <w:rPr>
+          <w:b/>
+          <w:bCs/>
+        </w:rPr>
+        <w:t xml:space="preserve">brunn saknas i GIS</w:t>
+      </w:r>
+      <w:r>
+        <w:t xml:space="preserve"> – litterat i filmen finns inte i kartan. Alla sådana brunnar skrivs till </w:t>
+      </w:r>
+      <w:r>
+        <w:rPr>
+          <w:rFonts w:ascii="Consolas" w:cs="Consolas" w:eastAsia="Consolas" w:hAnsi="Consolas"/>
+          <w:sz w:val="20"/>
+          <w:szCs w:val="20"/>
+          <w:shd w:fill="F2F2F2" w:val="clear"/>
+        </w:rPr>
+        <w:t xml:space="preserve">littera_forslag.csv</w:t>
+      </w:r>
+      <w:r>
+        <w:t xml:space="preserve"> i utdatamappen med de GIS-littera som liknar mest (t.ex. två omkastade siffror). Filen har samma kolumner som </w:t>
+      </w:r>
+      <w:r>
+        <w:rPr>
+          <w:rFonts w:ascii="Consolas" w:cs="Consolas" w:eastAsia="Consolas" w:hAnsi="Consolas"/>
+          <w:sz w:val="20"/>
+          <w:szCs w:val="20"/>
+          <w:shd w:fill="F2F2F2" w:val="clear"/>
+        </w:rPr>
+        <w:t xml:space="preserve">brunnslittera.csv</w:t>
+      </w:r>
+      <w:r>
+        <w:t xml:space="preserve">: rätta förslagen och ange den med </w:t>
+      </w:r>
+      <w:r>
+        <w:rPr>
+          <w:rFonts w:ascii="Consolas" w:cs="Consolas" w:eastAsia="Consolas" w:hAnsi="Consolas"/>
+          <w:sz w:val="20"/>
+          <w:szCs w:val="20"/>
+          <w:shd w:fill="F2F2F2" w:val="clear"/>
+        </w:rPr>
+        <w:t xml:space="preserve">littera:</w:t>
+      </w:r>
+      <w:r>
+        <w:t xml:space="preserve"> nästa körning.</w:t>
+      </w:r>
+    </w:p>
+    <w:p>
+      <w:pPr>
+        <w:pStyle w:val="ListParagraph"/>
+        <w:numPr>
+          <w:ilvl w:val="0"/>
+          <w:numId w:val="3"/>
+        </w:numPr>
+        <w:spacing w:after="80"/>
+      </w:pPr>
+      <w:r>
+        <w:rPr>
+          <w:b/>
+          <w:bCs/>
+        </w:rPr>
+        <w:t xml:space="preserve">ingen ledning i GIS mellan brunnarna</w:t>
+      </w:r>
+      <w:r>
+        <w:t xml:space="preserve"> – båda brunnarna finns men ingen ledning förbinder dem (fel sträcka i filmen, eller ledningen saknas i kartan).</w:t>
+      </w:r>
+    </w:p>
+    <w:p>
+      <w:pPr>
+        <w:pStyle w:val="ListParagraph"/>
+        <w:numPr>
+          <w:ilvl w:val="0"/>
+          <w:numId w:val="3"/>
+        </w:numPr>
+        <w:spacing w:after="80"/>
+      </w:pPr>
+      <w:r>
+        <w:rPr>
+          <w:b/>
+          <w:bCs/>
+        </w:rPr>
+        <w:t xml:space="preserve">vattengång</w:t>
+      </w:r>
+      <w:r>
+        <w:t xml:space="preserve"> – fallet mellan brunnarna enligt filmens höjder avviker mer än 0,3 m eller 50 % från GIS-fallet. Säger om det är inklinometern eller kartan som bör ifrågasättas; nollplanet spelar ingen roll, bara skillnaden mellan brunnarna.</w:t>
+      </w:r>
+    </w:p>
+    <w:p>
+      <w:pPr>
+        <w:pStyle w:val="ListParagraph"/>
+        <w:numPr>
+          <w:ilvl w:val="0"/>
+          <w:numId w:val="3"/>
+        </w:numPr>
+        <w:spacing w:after="80"/>
+      </w:pPr>
+      <w:r>
+        <w:rPr>
+          <w:b/>
+          <w:bCs/>
+        </w:rPr>
+        <w:t xml:space="preserve">riktning</w:t>
+      </w:r>
+      <w:r>
+        <w:t xml:space="preserve"> – GIS-vattengången stiger från filmens startbrunn till slutbrunn, dvs. kartan anser att flödet går åt andra hållet.</w:t>
+      </w:r>
+    </w:p>
+    <w:p>
+      <w:pPr>
+        <w:pStyle w:val="ListParagraph"/>
+        <w:numPr>
+          <w:ilvl w:val="0"/>
+          <w:numId w:val="3"/>
+        </w:numPr>
+        <w:spacing w:after="80"/>
+      </w:pPr>
+      <w:r>
+        <w:rPr>
+          <w:b/>
+          <w:bCs/>
+        </w:rPr>
+        <w:t xml:space="preserve">material</w:t>
+      </w:r>
+      <w:r>
+        <w:t xml:space="preserve"> och </w:t>
+      </w:r>
+      <w:r>
+        <w:rPr>
+          <w:b/>
+          <w:bCs/>
+        </w:rPr>
+        <w:t xml:space="preserve">dimension</w:t>
+      </w:r>
+      <w:r>
+        <w:t xml:space="preserve"> – filmen och kartan anger olika (BTG och Betong räknas som samma, liksom PVC, PE och PP som Plast; </w:t>
+      </w:r>
+      <w:r>
+        <w:rPr>
+          <w:rFonts w:ascii="Consolas" w:cs="Consolas" w:eastAsia="Consolas" w:hAnsi="Consolas"/>
+          <w:sz w:val="20"/>
+          <w:szCs w:val="20"/>
+          <w:shd w:fill="F2F2F2" w:val="clear"/>
+        </w:rPr>
+        <w:t xml:space="preserve">GIS_MATERIAL</w:t>
+      </w:r>
+      <w:r>
+        <w:t xml:space="preserve"> i KONFIG).</w:t>
+      </w:r>
+    </w:p>
+    <w:p>
+      <w:pPr>
+        <w:spacing w:after="120"/>
+      </w:pPr>
+      <w:r>
+        <w:t xml:space="preserve">Dessutom fylls de dolda kolumnerna </w:t>
+      </w:r>
+      <w:r>
+        <w:rPr>
+          <w:b/>
+          <w:bCs/>
+        </w:rPr>
+        <w:t xml:space="preserve">Lutning GIS</w:t>
+      </w:r>
+      <w:r>
+        <w:t xml:space="preserve"> (‰ enligt kartans vattengångar), </w:t>
+      </w:r>
+      <w:r>
+        <w:rPr>
+          <w:b/>
+          <w:bCs/>
+        </w:rPr>
+        <w:t xml:space="preserve">Djup start/slut</w:t>
+      </w:r>
+      <w:r>
+        <w:t xml:space="preserve"> (locknivå minus lägsta vattengång i brunnen – schaktdjupet för schaktsträckor) och </w:t>
+      </w:r>
+      <w:r>
+        <w:rPr>
+          <w:b/>
+          <w:bCs/>
+        </w:rPr>
+        <w:t xml:space="preserve">Anläggningsår</w:t>
+      </w:r>
+      <w:r>
+        <w:t xml:space="preserve"> i, och saknas markprofil används GIS-vattengång och kartlängd till höjdanpassningen, längdkontrollen och avbrottsbedömningen på samma sätt som markprofilen (7.5). Flaggorna påverkar inte prioritetsklassen.</w:t>
       </w:r>
     </w:p>
     <w:p>

</xml_diff>

<commit_message>
GIS-data: litteraförslag via ledningslängd från den kända brunnen
Är bara en brunn i paret okänd prövas den kända brunnens grannar i GIS,
och grannen vars ledning har ungefär filmens längd (GIS_LANGD_TOL 15 %)
föreslås som rätt brunn även när namnet inte liknar. Förslagen skrivs
per sträcka med motbrunn ifylld i littera_forslag.csv; annars liknande
namn som tidigare.

Co-Authored-By: Claude Fable 5.1 <noreply@anthropic.com>
Claude-Session: https://claude.ai/code/session_011fdqX3JEZje1LF9LqpaqR8
</commit_message>
<xml_diff>
--- a/Anvandarhandledning tv3_analys.docx
+++ b/Anvandarhandledning tv3_analys.docx
@@ -5681,7 +5681,19 @@
                 <w:szCs w:val="20"/>
                 <w:shd w:fill="F2F2F2" w:val="clear"/>
               </w:rPr>
-              <w:t xml:space="preserve">GIS_MATERIAL</w:t>
+              <w:t xml:space="preserve">GIS_LANGD_TOL</w:t>
+            </w:r>
+            <w:r>
+              <w:t xml:space="preserve">, </w:t>
+            </w:r>
+            <w:r>
+              <w:rPr>
+                <w:rFonts w:ascii="Consolas" w:cs="Consolas" w:eastAsia="Consolas" w:hAnsi="Consolas"/>
+                <w:sz w:val="20"/>
+                <w:szCs w:val="20"/>
+                <w:shd w:fill="F2F2F2" w:val="clear"/>
+              </w:rPr>
+              <w:t xml:space="preserve">GIS_LITTERA_LIKHET</w:t>
             </w:r>
           </w:p>
         </w:tc>
@@ -5706,7 +5718,7 @@
               <w:spacing w:after="0"/>
             </w:pPr>
             <w:r>
-              <w:t xml:space="preserve">Materialnamn i film och GIS som räknas som samma (BTG = Betong, PVC/PE/PP = Plast …).</w:t>
+              <w:t xml:space="preserve">Förslag på rätt littera för okända brunnar: en GIS-ledning från den kända brunnen med längd inom så stor andel av filmens föreslås; annars littera med minst så stor namnlikhet (0–1).</w:t>
             </w:r>
           </w:p>
         </w:tc>
@@ -5731,7 +5743,7 @@
               <w:spacing w:after="0"/>
             </w:pPr>
             <w:r>
-              <w:t xml:space="preserve">se skriptet</w:t>
+              <w:t xml:space="preserve">0,15, 0,75</w:t>
             </w:r>
           </w:p>
         </w:tc>
@@ -5765,19 +5777,7 @@
                 <w:szCs w:val="20"/>
                 <w:shd w:fill="F2F2F2" w:val="clear"/>
               </w:rPr>
-              <w:t xml:space="preserve">FOTO_MAX_PX</w:t>
-            </w:r>
-            <w:r>
-              <w:t xml:space="preserve">, </w:t>
-            </w:r>
-            <w:r>
-              <w:rPr>
-                <w:rFonts w:ascii="Consolas" w:cs="Consolas" w:eastAsia="Consolas" w:hAnsi="Consolas"/>
-                <w:sz w:val="20"/>
-                <w:szCs w:val="20"/>
-                <w:shd w:fill="F2F2F2" w:val="clear"/>
-              </w:rPr>
-              <w:t xml:space="preserve">FOTO_JPEG_KVALITET</w:t>
+              <w:t xml:space="preserve">GIS_MATERIAL</w:t>
             </w:r>
           </w:p>
         </w:tc>
@@ -5803,19 +5803,7 @@
               <w:spacing w:after="0"/>
             </w:pPr>
             <w:r>
-              <w:t xml:space="preserve">Fotona i PDF-rapporterna förminskas till högst så många pixlar på längsta sidan (JPEG-kvalitet enligt den andra; 76 ger ~30 % mindre filer än 82 utan synlig skillnad i A4). </w:t>
-            </w:r>
-            <w:r>
-              <w:rPr>
-                <w:rFonts w:ascii="Consolas" w:cs="Consolas" w:eastAsia="Consolas" w:hAnsi="Consolas"/>
-                <w:sz w:val="20"/>
-                <w:szCs w:val="20"/>
-                <w:shd w:fill="F2F2F2" w:val="clear"/>
-              </w:rPr>
-              <w:t xml:space="preserve">None</w:t>
-            </w:r>
-            <w:r>
-              <w:t xml:space="preserve"> = originalstorlek.</w:t>
+              <w:t xml:space="preserve">Materialnamn i film och GIS som räknas som samma (BTG = Betong, PVC/PE/PP = Plast …).</w:t>
             </w:r>
           </w:p>
         </w:tc>
@@ -5841,7 +5829,7 @@
               <w:spacing w:after="0"/>
             </w:pPr>
             <w:r>
-              <w:t xml:space="preserve">960, 76</w:t>
+              <w:t xml:space="preserve">se skriptet</w:t>
             </w:r>
           </w:p>
         </w:tc>
@@ -5874,7 +5862,7 @@
                 <w:szCs w:val="20"/>
                 <w:shd w:fill="F2F2F2" w:val="clear"/>
               </w:rPr>
-              <w:t xml:space="preserve">RAPPORT_BILD_DPI</w:t>
+              <w:t xml:space="preserve">FOTO_MAX_PX</w:t>
             </w:r>
             <w:r>
               <w:t xml:space="preserve">, </w:t>
@@ -5886,7 +5874,7 @@
                 <w:szCs w:val="20"/>
                 <w:shd w:fill="F2F2F2" w:val="clear"/>
               </w:rPr>
-              <w:t xml:space="preserve">RAPPORT_BILD_PALETT</w:t>
+              <w:t xml:space="preserve">FOTO_JPEG_KVALITET</w:t>
             </w:r>
           </w:p>
         </w:tc>
@@ -5911,7 +5899,19 @@
               <w:spacing w:after="0"/>
             </w:pPr>
             <w:r>
-              <w:t xml:space="preserve">Upplösning på översikts- och profilbilden i rapporten, och om de sparas som palett-PNG (256 färger, ca 65 % mindre).</w:t>
+              <w:t xml:space="preserve">Fotona i PDF-rapporterna förminskas till högst så många pixlar på längsta sidan (JPEG-kvalitet enligt den andra; 76 ger ~30 % mindre filer än 82 utan synlig skillnad i A4). </w:t>
+            </w:r>
+            <w:r>
+              <w:rPr>
+                <w:rFonts w:ascii="Consolas" w:cs="Consolas" w:eastAsia="Consolas" w:hAnsi="Consolas"/>
+                <w:sz w:val="20"/>
+                <w:szCs w:val="20"/>
+                <w:shd w:fill="F2F2F2" w:val="clear"/>
+              </w:rPr>
+              <w:t xml:space="preserve">None</w:t>
+            </w:r>
+            <w:r>
+              <w:t xml:space="preserve"> = originalstorlek.</w:t>
             </w:r>
           </w:p>
         </w:tc>
@@ -5936,16 +5936,7 @@
               <w:spacing w:after="0"/>
             </w:pPr>
             <w:r>
-              <w:t xml:space="preserve">150, </w:t>
-            </w:r>
-            <w:r>
-              <w:rPr>
-                <w:rFonts w:ascii="Consolas" w:cs="Consolas" w:eastAsia="Consolas" w:hAnsi="Consolas"/>
-                <w:sz w:val="20"/>
-                <w:szCs w:val="20"/>
-                <w:shd w:fill="F2F2F2" w:val="clear"/>
-              </w:rPr>
-              <w:t xml:space="preserve">True</w:t>
+              <w:t xml:space="preserve">960, 76</w:t>
             </w:r>
           </w:p>
         </w:tc>
@@ -5979,7 +5970,19 @@
                 <w:szCs w:val="20"/>
                 <w:shd w:fill="F2F2F2" w:val="clear"/>
               </w:rPr>
-              <w:t xml:space="preserve">RAPPORT_PROCESSER</w:t>
+              <w:t xml:space="preserve">RAPPORT_BILD_DPI</w:t>
+            </w:r>
+            <w:r>
+              <w:t xml:space="preserve">, </w:t>
+            </w:r>
+            <w:r>
+              <w:rPr>
+                <w:rFonts w:ascii="Consolas" w:cs="Consolas" w:eastAsia="Consolas" w:hAnsi="Consolas"/>
+                <w:sz w:val="20"/>
+                <w:szCs w:val="20"/>
+                <w:shd w:fill="F2F2F2" w:val="clear"/>
+              </w:rPr>
+              <w:t xml:space="preserve">RAPPORT_BILD_PALETT</w:t>
             </w:r>
           </w:p>
         </w:tc>
@@ -6005,7 +6008,33 @@
               <w:spacing w:after="0"/>
             </w:pPr>
             <w:r>
-              <w:t xml:space="preserve">Antal parallella processer för PDF-rapporterna. </w:t>
+              <w:t xml:space="preserve">Upplösning på översikts- och profilbilden i rapporten, och om de sparas som palett-PNG (256 färger, ca 65 % mindre).</w:t>
+            </w:r>
+          </w:p>
+        </w:tc>
+        <w:tc>
+          <w:tcPr>
+            <w:tcW w:type="dxa" w:w="1760"/>
+            <w:tcBorders>
+              <w:top w:val="single" w:color="BFBFBF" w:sz="4"/>
+              <w:left w:val="single" w:color="BFBFBF" w:sz="4"/>
+              <w:bottom w:val="single" w:color="BFBFBF" w:sz="4"/>
+              <w:right w:val="single" w:color="BFBFBF" w:sz="4"/>
+            </w:tcBorders>
+            <w:shd w:fill="F7F9FC" w:val="clear"/>
+            <w:tcMar>
+              <w:top w:type="dxa" w:w="60"/>
+              <w:left w:type="dxa" w:w="100"/>
+              <w:bottom w:type="dxa" w:w="60"/>
+              <w:right w:type="dxa" w:w="100"/>
+            </w:tcMar>
+          </w:tcPr>
+          <w:p>
+            <w:pPr>
+              <w:spacing w:after="0"/>
+            </w:pPr>
+            <w:r>
+              <w:t xml:space="preserve">150, </w:t>
             </w:r>
             <w:r>
               <w:rPr>
@@ -6014,54 +6043,7 @@
                 <w:szCs w:val="20"/>
                 <w:shd w:fill="F2F2F2" w:val="clear"/>
               </w:rPr>
-              <w:t xml:space="preserve">None</w:t>
-            </w:r>
-            <w:r>
-              <w:t xml:space="preserve"> = antal kärnor − 1, </w:t>
-            </w:r>
-            <w:r>
-              <w:rPr>
-                <w:rFonts w:ascii="Consolas" w:cs="Consolas" w:eastAsia="Consolas" w:hAnsi="Consolas"/>
-                <w:sz w:val="20"/>
-                <w:szCs w:val="20"/>
-                <w:shd w:fill="F2F2F2" w:val="clear"/>
-              </w:rPr>
-              <w:t xml:space="preserve">1</w:t>
-            </w:r>
-            <w:r>
-              <w:t xml:space="preserve"> = en i taget.</w:t>
-            </w:r>
-          </w:p>
-        </w:tc>
-        <w:tc>
-          <w:tcPr>
-            <w:tcW w:type="dxa" w:w="1760"/>
-            <w:tcBorders>
-              <w:top w:val="single" w:color="BFBFBF" w:sz="4"/>
-              <w:left w:val="single" w:color="BFBFBF" w:sz="4"/>
-              <w:bottom w:val="single" w:color="BFBFBF" w:sz="4"/>
-              <w:right w:val="single" w:color="BFBFBF" w:sz="4"/>
-            </w:tcBorders>
-            <w:shd w:fill="F7F9FC" w:val="clear"/>
-            <w:tcMar>
-              <w:top w:type="dxa" w:w="60"/>
-              <w:left w:type="dxa" w:w="100"/>
-              <w:bottom w:type="dxa" w:w="60"/>
-              <w:right w:type="dxa" w:w="100"/>
-            </w:tcMar>
-          </w:tcPr>
-          <w:p>
-            <w:pPr>
-              <w:spacing w:after="0"/>
-            </w:pPr>
-            <w:r>
-              <w:rPr>
-                <w:rFonts w:ascii="Consolas" w:cs="Consolas" w:eastAsia="Consolas" w:hAnsi="Consolas"/>
-                <w:sz w:val="20"/>
-                <w:szCs w:val="20"/>
-                <w:shd w:fill="F2F2F2" w:val="clear"/>
-              </w:rPr>
-              <w:t xml:space="preserve">None</w:t>
+              <w:t xml:space="preserve">True</w:t>
             </w:r>
           </w:p>
         </w:tc>
@@ -6094,7 +6076,7 @@
                 <w:szCs w:val="20"/>
                 <w:shd w:fill="F2F2F2" w:val="clear"/>
               </w:rPr>
-              <w:t xml:space="preserve">DOLDA_KOLUMNER</w:t>
+              <w:t xml:space="preserve">RAPPORT_PROCESSER</w:t>
             </w:r>
           </w:p>
         </w:tc>
@@ -6119,7 +6101,31 @@
               <w:spacing w:after="0"/>
             </w:pPr>
             <w:r>
-              <w:t xml:space="preserve">Kolumner per flik som döljs som standard i Excel (grupperade, fälls ut med plustecknet ovanför rubrikraden). Rubrik utan enhet. Tom lista = visa allt.</w:t>
+              <w:t xml:space="preserve">Antal parallella processer för PDF-rapporterna. </w:t>
+            </w:r>
+            <w:r>
+              <w:rPr>
+                <w:rFonts w:ascii="Consolas" w:cs="Consolas" w:eastAsia="Consolas" w:hAnsi="Consolas"/>
+                <w:sz w:val="20"/>
+                <w:szCs w:val="20"/>
+                <w:shd w:fill="F2F2F2" w:val="clear"/>
+              </w:rPr>
+              <w:t xml:space="preserve">None</w:t>
+            </w:r>
+            <w:r>
+              <w:t xml:space="preserve"> = antal kärnor − 1, </w:t>
+            </w:r>
+            <w:r>
+              <w:rPr>
+                <w:rFonts w:ascii="Consolas" w:cs="Consolas" w:eastAsia="Consolas" w:hAnsi="Consolas"/>
+                <w:sz w:val="20"/>
+                <w:szCs w:val="20"/>
+                <w:shd w:fill="F2F2F2" w:val="clear"/>
+              </w:rPr>
+              <w:t xml:space="preserve">1</w:t>
+            </w:r>
+            <w:r>
+              <w:t xml:space="preserve"> = en i taget.</w:t>
             </w:r>
           </w:p>
         </w:tc>
@@ -6144,7 +6150,13 @@
               <w:spacing w:after="0"/>
             </w:pPr>
             <w:r>
-              <w:t xml:space="preserve">se skriptet</w:t>
+              <w:rPr>
+                <w:rFonts w:ascii="Consolas" w:cs="Consolas" w:eastAsia="Consolas" w:hAnsi="Consolas"/>
+                <w:sz w:val="20"/>
+                <w:szCs w:val="20"/>
+                <w:shd w:fill="F2F2F2" w:val="clear"/>
+              </w:rPr>
+              <w:t xml:space="preserve">None</w:t>
             </w:r>
           </w:p>
         </w:tc>
@@ -6178,7 +6190,7 @@
                 <w:szCs w:val="20"/>
                 <w:shd w:fill="F2F2F2" w:val="clear"/>
               </w:rPr>
-              <w:t xml:space="preserve">OFULLSTANDIG_ANDEL</w:t>
+              <w:t xml:space="preserve">DOLDA_KOLUMNER</w:t>
             </w:r>
           </w:p>
         </w:tc>
@@ -6204,7 +6216,7 @@
               <w:spacing w:after="0"/>
             </w:pPr>
             <w:r>
-              <w:t xml:space="preserve">Är filmad längd kortare än så gånger kartlängden nådde kameran inte fram; profilen hängs då bara upp i startbrunnen.</w:t>
+              <w:t xml:space="preserve">Kolumner per flik som döljs som standard i Excel (grupperade, fälls ut med plustecknet ovanför rubrikraden). Rubrik utan enhet. Tom lista = visa allt.</w:t>
             </w:r>
           </w:p>
         </w:tc>
@@ -6230,7 +6242,7 @@
               <w:spacing w:after="0"/>
             </w:pPr>
             <w:r>
-              <w:t xml:space="preserve">0,85</w:t>
+              <w:t xml:space="preserve">se skriptet</w:t>
             </w:r>
           </w:p>
         </w:tc>
@@ -6263,7 +6275,7 @@
                 <w:szCs w:val="20"/>
                 <w:shd w:fill="F2F2F2" w:val="clear"/>
               </w:rPr>
-              <w:t xml:space="preserve">KODER</w:t>
+              <w:t xml:space="preserve">OFULLSTANDIG_ANDEL</w:t>
             </w:r>
           </w:p>
         </w:tc>
@@ -6288,7 +6300,7 @@
               <w:spacing w:after="0"/>
             </w:pPr>
             <w:r>
-              <w:t xml:space="preserve">Skadekoder med klartext och typ (K = konstruktion, D = drift, I = information).</w:t>
+              <w:t xml:space="preserve">Är filmad längd kortare än så gånger kartlängden nådde kameran inte fram; profilen hängs då bara upp i startbrunnen.</w:t>
             </w:r>
           </w:p>
         </w:tc>
@@ -6313,7 +6325,7 @@
               <w:spacing w:after="0"/>
             </w:pPr>
             <w:r>
-              <w:t xml:space="preserve">P93</w:t>
+              <w:t xml:space="preserve">0,85</w:t>
             </w:r>
           </w:p>
         </w:tc>
@@ -6347,6 +6359,91 @@
                 <w:szCs w:val="20"/>
                 <w:shd w:fill="F2F2F2" w:val="clear"/>
               </w:rPr>
+              <w:t xml:space="preserve">KODER</w:t>
+            </w:r>
+          </w:p>
+        </w:tc>
+        <w:tc>
+          <w:tcPr>
+            <w:tcW w:type="dxa" w:w="5000"/>
+            <w:tcBorders>
+              <w:top w:val="single" w:color="BFBFBF" w:sz="4"/>
+              <w:left w:val="single" w:color="BFBFBF" w:sz="4"/>
+              <w:bottom w:val="single" w:color="BFBFBF" w:sz="4"/>
+              <w:right w:val="single" w:color="BFBFBF" w:sz="4"/>
+            </w:tcBorders>
+            <w:shd w:fill="F7F9FC" w:val="clear"/>
+            <w:tcMar>
+              <w:top w:type="dxa" w:w="60"/>
+              <w:left w:type="dxa" w:w="100"/>
+              <w:bottom w:type="dxa" w:w="60"/>
+              <w:right w:type="dxa" w:w="100"/>
+            </w:tcMar>
+          </w:tcPr>
+          <w:p>
+            <w:pPr>
+              <w:spacing w:after="0"/>
+            </w:pPr>
+            <w:r>
+              <w:t xml:space="preserve">Skadekoder med klartext och typ (K = konstruktion, D = drift, I = information).</w:t>
+            </w:r>
+          </w:p>
+        </w:tc>
+        <w:tc>
+          <w:tcPr>
+            <w:tcW w:type="dxa" w:w="1760"/>
+            <w:tcBorders>
+              <w:top w:val="single" w:color="BFBFBF" w:sz="4"/>
+              <w:left w:val="single" w:color="BFBFBF" w:sz="4"/>
+              <w:bottom w:val="single" w:color="BFBFBF" w:sz="4"/>
+              <w:right w:val="single" w:color="BFBFBF" w:sz="4"/>
+            </w:tcBorders>
+            <w:shd w:fill="F7F9FC" w:val="clear"/>
+            <w:tcMar>
+              <w:top w:type="dxa" w:w="60"/>
+              <w:left w:type="dxa" w:w="100"/>
+              <w:bottom w:type="dxa" w:w="60"/>
+              <w:right w:type="dxa" w:w="100"/>
+            </w:tcMar>
+          </w:tcPr>
+          <w:p>
+            <w:pPr>
+              <w:spacing w:after="0"/>
+            </w:pPr>
+            <w:r>
+              <w:t xml:space="preserve">P93</w:t>
+            </w:r>
+          </w:p>
+        </w:tc>
+      </w:tr>
+      <w:tr>
+        <w:tc>
+          <w:tcPr>
+            <w:tcW w:type="dxa" w:w="2600"/>
+            <w:tcBorders>
+              <w:top w:val="single" w:color="BFBFBF" w:sz="4"/>
+              <w:left w:val="single" w:color="BFBFBF" w:sz="4"/>
+              <w:bottom w:val="single" w:color="BFBFBF" w:sz="4"/>
+              <w:right w:val="single" w:color="BFBFBF" w:sz="4"/>
+            </w:tcBorders>
+            <w:tcMar>
+              <w:top w:type="dxa" w:w="60"/>
+              <w:left w:type="dxa" w:w="100"/>
+              <w:bottom w:type="dxa" w:w="60"/>
+              <w:right w:type="dxa" w:w="100"/>
+            </w:tcMar>
+          </w:tcPr>
+          <w:p>
+            <w:pPr>
+              <w:spacing w:after="0"/>
+            </w:pPr>
+            <w:r>
+              <w:rPr>
+                <w:rFonts w:ascii="Consolas" w:cs="Consolas" w:eastAsia="Consolas" w:hAnsi="Consolas"/>
+                <w:sz w:val="20"/>
+                <w:szCs w:val="20"/>
+                <w:shd w:fill="F2F2F2" w:val="clear"/>
+              </w:rPr>
               <w:t xml:space="preserve">ATTRIBUT</w:t>
             </w:r>
             <w:r>
@@ -6372,7 +6469,6 @@
               <w:bottom w:val="single" w:color="BFBFBF" w:sz="4"/>
               <w:right w:val="single" w:color="BFBFBF" w:sz="4"/>
             </w:tcBorders>
-            <w:shd w:fill="F7F9FC" w:val="clear"/>
             <w:tcMar>
               <w:top w:type="dxa" w:w="60"/>
               <w:left w:type="dxa" w:w="100"/>
@@ -6398,7 +6494,6 @@
               <w:bottom w:val="single" w:color="BFBFBF" w:sz="4"/>
               <w:right w:val="single" w:color="BFBFBF" w:sz="4"/>
             </w:tcBorders>
-            <w:shd w:fill="F7F9FC" w:val="clear"/>
             <w:tcMar>
               <w:top w:type="dxa" w:w="60"/>
               <w:left w:type="dxa" w:w="100"/>
@@ -10864,7 +10959,19 @@
         <w:t xml:space="preserve">littera_forslag.csv</w:t>
       </w:r>
       <w:r>
-        <w:t xml:space="preserve"> i utdatamappen med de GIS-littera som liknar mest (t.ex. två omkastade siffror). Filen har samma kolumner som </w:t>
+        <w:t xml:space="preserve"> i utdatamappen, en rad per sträcka. Är den andra brunnen känd prövas dess grannar i GIS: den granne vars ledning har ungefär filmens längd (inom 15 %, </w:t>
+      </w:r>
+      <w:r>
+        <w:rPr>
+          <w:rFonts w:ascii="Consolas" w:cs="Consolas" w:eastAsia="Consolas" w:hAnsi="Consolas"/>
+          <w:sz w:val="20"/>
+          <w:szCs w:val="20"/>
+          <w:shd w:fill="F2F2F2" w:val="clear"/>
+        </w:rPr>
+        <w:t xml:space="preserve">GIS_LANGD_TOL</w:t>
+      </w:r>
+      <w:r>
+        <w:t xml:space="preserve">) föreslås som rätt brunn, även när namnet inte liknar, och kommentaren anger längderna. Är båda okända, eller finns ingen ledning med passande längd, föreslås de GIS-littera som liknar mest (t.ex. två omkastade siffror). Filen har samma kolumner som </w:t>
       </w:r>
       <w:r>
         <w:rPr>
@@ -10876,7 +10983,7 @@
         <w:t xml:space="preserve">brunnslittera.csv</w:t>
       </w:r>
       <w:r>
-        <w:t xml:space="preserve">: rätta förslagen och ange den med </w:t>
+        <w:t xml:space="preserve"> med motbrunnen ifylld, så rättningen bara gäller det brunnsparet: granska förslagen och ange filen med </w:t>
       </w:r>
       <w:r>
         <w:rPr>

</xml_diff>

<commit_message>
Inspektionsgrad per driftområde: DUF-områden i GIS-exporten, flikar Inspektionsgrad och Ej inspekterat
Exportera GIS-data tar ett polygonlager med driftområden (t.ex. DUF-
områden) och namnfält; varje ledning (mittpunkt) och brunn får sitt
område (punkt-i-polygon i ren Python, hål hanteras).

Analysen räknar per område och ledningstyp hur mycket ledningsnät som
finns i GIS och hur mycket av det som är filmat (flik Inspektionsgrad,
rad i Sammanfattning, kartunderlag), listar ledningar utan film äldst
först (flik Ej inspekterat) och fyller dold kolumn Driftområde.

Co-Authored-By: Claude Fable 5.1 <noreply@anthropic.com>
Claude-Session: https://claude.ai/code/session_011fdqX3JEZje1LF9LqpaqR8
</commit_message>
<xml_diff>
--- a/Anvandarhandledning tv3_analys.docx
+++ b/Anvandarhandledning tv3_analys.docx
@@ -4069,6 +4069,112 @@
           </w:p>
         </w:tc>
       </w:tr>
+      <w:tr>
+        <w:tc>
+          <w:tcPr>
+            <w:tcW w:type="dxa" w:w="2400"/>
+            <w:tcBorders>
+              <w:top w:val="single" w:color="BFBFBF" w:sz="4"/>
+              <w:left w:val="single" w:color="BFBFBF" w:sz="4"/>
+              <w:bottom w:val="single" w:color="BFBFBF" w:sz="4"/>
+              <w:right w:val="single" w:color="BFBFBF" w:sz="4"/>
+            </w:tcBorders>
+            <w:shd w:fill="F7F9FC" w:val="clear"/>
+            <w:tcMar>
+              <w:top w:type="dxa" w:w="60"/>
+              <w:left w:type="dxa" w:w="100"/>
+              <w:bottom w:type="dxa" w:w="60"/>
+              <w:right w:type="dxa" w:w="100"/>
+            </w:tcMar>
+          </w:tcPr>
+          <w:p>
+            <w:pPr>
+              <w:spacing w:after="0"/>
+            </w:pPr>
+            <w:r>
+              <w:t xml:space="preserve">Inspektionsgrad</w:t>
+            </w:r>
+          </w:p>
+        </w:tc>
+        <w:tc>
+          <w:tcPr>
+            <w:tcW w:type="dxa" w:w="6960"/>
+            <w:tcBorders>
+              <w:top w:val="single" w:color="BFBFBF" w:sz="4"/>
+              <w:left w:val="single" w:color="BFBFBF" w:sz="4"/>
+              <w:bottom w:val="single" w:color="BFBFBF" w:sz="4"/>
+              <w:right w:val="single" w:color="BFBFBF" w:sz="4"/>
+            </w:tcBorders>
+            <w:shd w:fill="F7F9FC" w:val="clear"/>
+            <w:tcMar>
+              <w:top w:type="dxa" w:w="60"/>
+              <w:left w:type="dxa" w:w="100"/>
+              <w:bottom w:type="dxa" w:w="60"/>
+              <w:right w:type="dxa" w:w="100"/>
+            </w:tcMar>
+          </w:tcPr>
+          <w:p>
+            <w:pPr>
+              <w:spacing w:after="0"/>
+            </w:pPr>
+            <w:r>
+              <w:t xml:space="preserve">Bara med GIS-data (7.11). Hur stor del av ledningsnätet i GIS som är filmat, per driftområde (t.ex. DUF-område) och ledningstyp: antal ledningar och längd i GIS, filmade ledningar och filmad längd, andel. Raderna 'alla' är summor per område och totalt. Filmade sträckor som inte hittats i GIS redovisas på en egen rad.</w:t>
+            </w:r>
+          </w:p>
+        </w:tc>
+      </w:tr>
+      <w:tr>
+        <w:tc>
+          <w:tcPr>
+            <w:tcW w:type="dxa" w:w="2400"/>
+            <w:tcBorders>
+              <w:top w:val="single" w:color="BFBFBF" w:sz="4"/>
+              <w:left w:val="single" w:color="BFBFBF" w:sz="4"/>
+              <w:bottom w:val="single" w:color="BFBFBF" w:sz="4"/>
+              <w:right w:val="single" w:color="BFBFBF" w:sz="4"/>
+            </w:tcBorders>
+            <w:tcMar>
+              <w:top w:type="dxa" w:w="60"/>
+              <w:left w:type="dxa" w:w="100"/>
+              <w:bottom w:type="dxa" w:w="60"/>
+              <w:right w:type="dxa" w:w="100"/>
+            </w:tcMar>
+          </w:tcPr>
+          <w:p>
+            <w:pPr>
+              <w:spacing w:after="0"/>
+            </w:pPr>
+            <w:r>
+              <w:t xml:space="preserve">Ej inspekterat</w:t>
+            </w:r>
+          </w:p>
+        </w:tc>
+        <w:tc>
+          <w:tcPr>
+            <w:tcW w:type="dxa" w:w="6960"/>
+            <w:tcBorders>
+              <w:top w:val="single" w:color="BFBFBF" w:sz="4"/>
+              <w:left w:val="single" w:color="BFBFBF" w:sz="4"/>
+              <w:bottom w:val="single" w:color="BFBFBF" w:sz="4"/>
+              <w:right w:val="single" w:color="BFBFBF" w:sz="4"/>
+            </w:tcBorders>
+            <w:tcMar>
+              <w:top w:type="dxa" w:w="60"/>
+              <w:left w:type="dxa" w:w="100"/>
+              <w:bottom w:type="dxa" w:w="60"/>
+              <w:right w:type="dxa" w:w="100"/>
+            </w:tcMar>
+          </w:tcPr>
+          <w:p>
+            <w:pPr>
+              <w:spacing w:after="0"/>
+            </w:pPr>
+            <w:r>
+              <w:t xml:space="preserve">Bara med GIS-data. En rad per ledningssträcka i GIS som inte finns i någon TV3-fil, med driftområde, brunnar, längd, dimension, material, ledningstyp och anläggningsår – äldst först inom varje område. Underlag för nästa filmningsomgång.</w:t>
+            </w:r>
+          </w:p>
+        </w:tc>
+      </w:tr>
     </w:tbl>
     <w:p>
       <w:pPr>
@@ -11125,7 +11231,7 @@
         <w:t xml:space="preserve">Djup start/slut</w:t>
       </w:r>
       <w:r>
-        <w:t xml:space="preserve"> (locknivå minus lägsta vattengång i brunnen – schaktdjupet för schaktsträckor) och </w:t>
+        <w:t xml:space="preserve"> (locknivå minus lägsta vattengång i brunnen – schaktdjupet för schaktsträckor), </w:t>
       </w:r>
       <w:r>
         <w:rPr>
@@ -11135,7 +11241,86 @@
         <w:t xml:space="preserve">Anläggningsår</w:t>
       </w:r>
       <w:r>
+        <w:t xml:space="preserve"> och </w:t>
+      </w:r>
+      <w:r>
+        <w:rPr>
+          <w:b/>
+          <w:bCs/>
+        </w:rPr>
+        <w:t xml:space="preserve">Driftområde</w:t>
+      </w:r>
+      <w:r>
         <w:t xml:space="preserve"> i, och saknas markprofil används GIS-vattengång och kartlängd till höjdanpassningen, längdkontrollen och avbrottsbedömningen på samma sätt som markprofilen (7.5). Flaggorna påverkar inte prioritetsklassen.</w:t>
+      </w:r>
+    </w:p>
+    <w:p>
+      <w:pPr>
+        <w:spacing w:after="120"/>
+      </w:pPr>
+      <w:r>
+        <w:rPr>
+          <w:b/>
+          <w:bCs/>
+        </w:rPr>
+        <w:t xml:space="preserve">Inspektionsgrad per driftområde.</w:t>
+      </w:r>
+      <w:r>
+        <w:t xml:space="preserve"> Ange under </w:t>
+      </w:r>
+      <w:r>
+        <w:rPr>
+          <w:b/>
+          <w:bCs/>
+        </w:rPr>
+        <w:t xml:space="preserve">Driftområden</w:t>
+      </w:r>
+      <w:r>
+        <w:t xml:space="preserve"> i dialogen ett polygonlager (t.ex. DUF-områdena) och fältet med områdets namn eller nummer, så får varje ledning och brunn i exporten sitt område (ledningens mittpunkt avgör). Analysen skriver då fliken </w:t>
+      </w:r>
+      <w:r>
+        <w:rPr>
+          <w:b/>
+          <w:bCs/>
+        </w:rPr>
+        <w:t xml:space="preserve">Inspektionsgrad</w:t>
+      </w:r>
+      <w:r>
+        <w:t xml:space="preserve"> – ledningsnätets längd i GIS per område och ledningstyp, hur mycket av det som är filmat och andelen – och fliken </w:t>
+      </w:r>
+      <w:r>
+        <w:rPr>
+          <w:b/>
+          <w:bCs/>
+        </w:rPr>
+        <w:t xml:space="preserve">Ej inspekterat</w:t>
+      </w:r>
+      <w:r>
+        <w:t xml:space="preserve"> med de ledningar som saknar film, äldst först. Filmad längd räknas med kartans längd så att andelen blir jämförbar. Samma uppgifter ligger i kartunderlaget (</w:t>
+      </w:r>
+      <w:r>
+        <w:rPr>
+          <w:rFonts w:ascii="Consolas" w:cs="Consolas" w:eastAsia="Consolas" w:hAnsi="Consolas"/>
+          <w:sz w:val="20"/>
+          <w:szCs w:val="20"/>
+          <w:shd w:fill="F2F2F2" w:val="clear"/>
+        </w:rPr>
+        <w:t xml:space="preserve">inspektionsgrad</w:t>
+      </w:r>
+      <w:r>
+        <w:t xml:space="preserve">, </w:t>
+      </w:r>
+      <w:r>
+        <w:rPr>
+          <w:rFonts w:ascii="Consolas" w:cs="Consolas" w:eastAsia="Consolas" w:hAnsi="Consolas"/>
+          <w:sz w:val="20"/>
+          <w:szCs w:val="20"/>
+          <w:shd w:fill="F2F2F2" w:val="clear"/>
+        </w:rPr>
+        <w:t xml:space="preserve">ej_inspekterat</w:t>
+      </w:r>
+      <w:r>
+        <w:t xml:space="preserve">) och i Sammanfattning. Exporten tar med alla ledningar i de valda lagren (eller inom Begränsa till område), så dagvattenledningar räknas som egen ledningstyp om de ligger i samma lager.</w:t>
       </w:r>
     </w:p>
     <w:p>

</xml_diff>

<commit_message>
Inspektionsgrad: andel klass A och B av det filmade per driftområde
Fliken Inspektionsgrad får Klass A (st), Klass B (st), Längd A+B (m)
och Andel A+B av filmat, med sämsta gällande klass per GIS-ledning.
Sammanfattningsraden visar andelen per område.

Co-Authored-By: Claude Fable 5.1 <noreply@anthropic.com>
Claude-Session: https://claude.ai/code/session_011fdqX3JEZje1LF9LqpaqR8
</commit_message>
<xml_diff>
--- a/Anvandarhandledning tv3_analys.docx
+++ b/Anvandarhandledning tv3_analys.docx
@@ -4118,7 +4118,7 @@
               <w:spacing w:after="0"/>
             </w:pPr>
             <w:r>
-              <w:t xml:space="preserve">Bara med GIS-data (7.11). Hur stor del av ledningsnätet i GIS som är filmat, per driftområde (t.ex. DUF-område) och ledningstyp: antal ledningar och längd i GIS, filmade ledningar och filmad längd, andel. Raderna 'alla' är summor per område och totalt. Filmade sträckor som inte hittats i GIS redovisas på en egen rad.</w:t>
+              <w:t xml:space="preserve">Bara med GIS-data (7.11). Hur stor del av ledningsnätet i GIS som är filmat, per driftområde (t.ex. DUF-område) och ledningstyp: antal ledningar och längd i GIS, filmade ledningar och filmad längd, andel, samt av de filmade hur många som är klass A respektive B, deras längd och andelen A+B av den filmade längden (gällande klass, dvs. manuell bedömning före maskinell; är samma ledning filmad från båda håll räknas den sämsta klassen). Raderna 'alla' är summor per område och totalt. Filmade sträckor som inte hittats i GIS redovisas på en egen rad.</w:t>
             </w:r>
           </w:p>
         </w:tc>
@@ -11286,7 +11286,7 @@
         <w:t xml:space="preserve">Inspektionsgrad</w:t>
       </w:r>
       <w:r>
-        <w:t xml:space="preserve"> – ledningsnätets längd i GIS per område och ledningstyp, hur mycket av det som är filmat och andelen – och fliken </w:t>
+        <w:t xml:space="preserve"> – ledningsnätets längd i GIS per område och ledningstyp, hur mycket av det som är filmat och andelen, samt hur stor del av det filmade som är klass A och B – och fliken </w:t>
       </w:r>
       <w:r>
         <w:rPr>

</xml_diff>

<commit_message>
Omfilmning och sammanslagning: hel film ersätter delfilmer, två delfilmer slås ihop
hantera_omfilmningar grupperar filmer per brunnspar: en hel film ersätter
ofullständiga och äldre hela filmer (filmstatus 'ersatt av nr X', med OBS
när den ersatta hade sämre klass), och två ofullständiga filmer från var
sin brunn slås ihop till en extra sträcka med observationerna på en
gemensam axel från startbrunnen (kartlängd ger överlapp, annars antas
filmerna mötas). Ersatta filmer och delfilmer listas i Prioritering utan
rang och får protokoll, men räknas inte i statistik, karta, åtgärdspaket,
PowerPoint eller inspektionsgrad. Ny kolumn Filmstatus, rad i
Sammanfattning, JSON-fält filmstatus/sammanslagen_av, PDF-rad.
KONFIG: OMFILMNING, OMFILMNING_MIN_ANDEL, SAMMANSLAGNING.

Co-Authored-By: Claude Fable 5.1 <noreply@anthropic.com>
Claude-Session: https://claude.ai/code/session_011fdqX3JEZje1LF9LqpaqR8
</commit_message>
<xml_diff>
--- a/Anvandarhandledning tv3_analys.docx
+++ b/Anvandarhandledning tv3_analys.docx
@@ -3776,7 +3776,7 @@
               <w:spacing w:after="0"/>
             </w:pPr>
             <w:r>
-              <w:t xml:space="preserve">En rad per sträcka, rankad efter prioritetsklass och index. Använd autofiltret för att filtrera på klass, material, ledningstyp, område eller fil. Kolumnen Skador (kod+grad) visar t.ex. 9×YTS4, 1×SPR3. Kolumnerna Avbruten inspektion, Inspekterad flera ggr och Relinad ger extra kontext. Ur inklinometerprofilen beräknas Svackdjup i cm (största stående vattendjup i en svacka), Svackdjup/diameter, Svacklängd, Bakfall längd (meter med lutning mot flödesriktningen) och Lutning; Profil osäker markerar sträckor där inklinometerns fall avviker kraftigt från brunnshöjderna och profilen därför inte bör användas. Anslutningar räknar registrerade anslutningar (AS/AG) på sträckan. Enheten (m, mm, p/100 m …) står på en egen rad under rubrikerna, så rubrikerna är korta. Med markprofil från ArcMap (7.5) fylls även Höjdanpassning, Täckning min/max och Höjdflagga i, och med GIS-data (7.11) kolumnen GIS-flagga (avvikelser mellan film och karta) samt de dolda Lutning GIS, Djup start/slut och Anläggningsår. Bara de viktigaste kolumnerna visas från början; övriga (fil, nr, område, datum, drift- och totalindex, driftåtgärd, profilmått, höjdflagga m.m.) är dolda i grupper och fälls ut med plustecknet ovanför kolumnrubrikerna eller knappen 2 uppe till vänster. Vilka som döljs styrs av </w:t>
+              <w:t xml:space="preserve">En rad per sträcka, rankad efter prioritetsklass och index. Använd autofiltret för att filtrera på klass, material, ledningstyp, område eller fil. Kolumnen Skador (kod+grad) visar t.ex. 9×YTS4, 1×SPR3. Kolumnerna Avbruten inspektion, Inspekterad flera ggr, Filmstatus (ersatt av nyare film, sammanslagen av två delfilmer – se avsnitt 8) och Relinad ger extra kontext. Ur inklinometerprofilen beräknas Svackdjup i cm (största stående vattendjup i en svacka), Svackdjup/diameter, Svacklängd, Bakfall längd (meter med lutning mot flödesriktningen) och Lutning; Profil osäker markerar sträckor där inklinometerns fall avviker kraftigt från brunnshöjderna och profilen därför inte bör användas. Anslutningar räknar registrerade anslutningar (AS/AG) på sträckan. Enheten (m, mm, p/100 m …) står på en egen rad under rubrikerna, så rubrikerna är korta. Med markprofil från ArcMap (7.5) fylls även Höjdanpassning, Täckning min/max och Höjdflagga i, och med GIS-data (7.11) kolumnen GIS-flagga (avvikelser mellan film och karta) samt de dolda Lutning GIS, Djup start/slut och Anläggningsår. Bara de viktigaste kolumnerna visas från början; övriga (fil, nr, område, datum, drift- och totalindex, driftåtgärd, profilmått, höjdflagga m.m.) är dolda i grupper och fälls ut med plustecknet ovanför kolumnrubrikerna eller knappen 2 uppe till vänster. Vilka som döljs styrs av </w:t>
             </w:r>
             <w:r>
               <w:rPr>
@@ -5787,7 +5787,7 @@
                 <w:szCs w:val="20"/>
                 <w:shd w:fill="F2F2F2" w:val="clear"/>
               </w:rPr>
-              <w:t xml:space="preserve">GIS_LANGD_TOL</w:t>
+              <w:t xml:space="preserve">OMFILMNING</w:t>
             </w:r>
             <w:r>
               <w:t xml:space="preserve">, </w:t>
@@ -5799,7 +5799,19 @@
                 <w:szCs w:val="20"/>
                 <w:shd w:fill="F2F2F2" w:val="clear"/>
               </w:rPr>
-              <w:t xml:space="preserve">GIS_LITTERA_LIKHET</w:t>
+              <w:t xml:space="preserve">OMFILMNING_MIN_ANDEL</w:t>
+            </w:r>
+            <w:r>
+              <w:t xml:space="preserve">, </w:t>
+            </w:r>
+            <w:r>
+              <w:rPr>
+                <w:rFonts w:ascii="Consolas" w:cs="Consolas" w:eastAsia="Consolas" w:hAnsi="Consolas"/>
+                <w:sz w:val="20"/>
+                <w:szCs w:val="20"/>
+                <w:shd w:fill="F2F2F2" w:val="clear"/>
+              </w:rPr>
+              <w:t xml:space="preserve">SAMMANSLAGNING</w:t>
             </w:r>
           </w:p>
         </w:tc>
@@ -5824,7 +5836,7 @@
               <w:spacing w:after="0"/>
             </w:pPr>
             <w:r>
-              <w:t xml:space="preserve">Förslag på rätt littera för okända brunnar: en GIS-ledning från den kända brunnen med längd inom så stor andel av filmens föreslås; annars littera med minst så stor namnlikhet (0–1).</w:t>
+              <w:t xml:space="preserve">Hantering av flera filmer av samma brunnspar (se avsnitt 8): hel film ersätter ofullständiga och äldre hela (om den nyare är minst så stor andel av den äldres längd), och två ofullständiga filmer från var sin brunn slås ihop.</w:t>
             </w:r>
           </w:p>
         </w:tc>
@@ -5849,7 +5861,25 @@
               <w:spacing w:after="0"/>
             </w:pPr>
             <w:r>
-              <w:t xml:space="preserve">0,15, 0,75</w:t>
+              <w:rPr>
+                <w:rFonts w:ascii="Consolas" w:cs="Consolas" w:eastAsia="Consolas" w:hAnsi="Consolas"/>
+                <w:sz w:val="20"/>
+                <w:szCs w:val="20"/>
+                <w:shd w:fill="F2F2F2" w:val="clear"/>
+              </w:rPr>
+              <w:t xml:space="preserve">True</w:t>
+            </w:r>
+            <w:r>
+              <w:t xml:space="preserve">, 0,85, </w:t>
+            </w:r>
+            <w:r>
+              <w:rPr>
+                <w:rFonts w:ascii="Consolas" w:cs="Consolas" w:eastAsia="Consolas" w:hAnsi="Consolas"/>
+                <w:sz w:val="20"/>
+                <w:szCs w:val="20"/>
+                <w:shd w:fill="F2F2F2" w:val="clear"/>
+              </w:rPr>
+              <w:t xml:space="preserve">True</w:t>
             </w:r>
           </w:p>
         </w:tc>
@@ -5883,7 +5913,19 @@
                 <w:szCs w:val="20"/>
                 <w:shd w:fill="F2F2F2" w:val="clear"/>
               </w:rPr>
-              <w:t xml:space="preserve">GIS_MATERIAL</w:t>
+              <w:t xml:space="preserve">GIS_LANGD_TOL</w:t>
+            </w:r>
+            <w:r>
+              <w:t xml:space="preserve">, </w:t>
+            </w:r>
+            <w:r>
+              <w:rPr>
+                <w:rFonts w:ascii="Consolas" w:cs="Consolas" w:eastAsia="Consolas" w:hAnsi="Consolas"/>
+                <w:sz w:val="20"/>
+                <w:szCs w:val="20"/>
+                <w:shd w:fill="F2F2F2" w:val="clear"/>
+              </w:rPr>
+              <w:t xml:space="preserve">GIS_LITTERA_LIKHET</w:t>
             </w:r>
           </w:p>
         </w:tc>
@@ -5909,7 +5951,7 @@
               <w:spacing w:after="0"/>
             </w:pPr>
             <w:r>
-              <w:t xml:space="preserve">Materialnamn i film och GIS som räknas som samma (BTG = Betong, PVC/PE/PP = Plast …).</w:t>
+              <w:t xml:space="preserve">Förslag på rätt littera för okända brunnar: en GIS-ledning från den kända brunnen med längd inom så stor andel av filmens föreslås; annars littera med minst så stor namnlikhet (0–1).</w:t>
             </w:r>
           </w:p>
         </w:tc>
@@ -5935,7 +5977,7 @@
               <w:spacing w:after="0"/>
             </w:pPr>
             <w:r>
-              <w:t xml:space="preserve">se skriptet</w:t>
+              <w:t xml:space="preserve">0,15, 0,75</w:t>
             </w:r>
           </w:p>
         </w:tc>
@@ -5968,19 +6010,7 @@
                 <w:szCs w:val="20"/>
                 <w:shd w:fill="F2F2F2" w:val="clear"/>
               </w:rPr>
-              <w:t xml:space="preserve">FOTO_MAX_PX</w:t>
-            </w:r>
-            <w:r>
-              <w:t xml:space="preserve">, </w:t>
-            </w:r>
-            <w:r>
-              <w:rPr>
-                <w:rFonts w:ascii="Consolas" w:cs="Consolas" w:eastAsia="Consolas" w:hAnsi="Consolas"/>
-                <w:sz w:val="20"/>
-                <w:szCs w:val="20"/>
-                <w:shd w:fill="F2F2F2" w:val="clear"/>
-              </w:rPr>
-              <w:t xml:space="preserve">FOTO_JPEG_KVALITET</w:t>
+              <w:t xml:space="preserve">GIS_MATERIAL</w:t>
             </w:r>
           </w:p>
         </w:tc>
@@ -6005,19 +6035,7 @@
               <w:spacing w:after="0"/>
             </w:pPr>
             <w:r>
-              <w:t xml:space="preserve">Fotona i PDF-rapporterna förminskas till högst så många pixlar på längsta sidan (JPEG-kvalitet enligt den andra; 76 ger ~30 % mindre filer än 82 utan synlig skillnad i A4). </w:t>
-            </w:r>
-            <w:r>
-              <w:rPr>
-                <w:rFonts w:ascii="Consolas" w:cs="Consolas" w:eastAsia="Consolas" w:hAnsi="Consolas"/>
-                <w:sz w:val="20"/>
-                <w:szCs w:val="20"/>
-                <w:shd w:fill="F2F2F2" w:val="clear"/>
-              </w:rPr>
-              <w:t xml:space="preserve">None</w:t>
-            </w:r>
-            <w:r>
-              <w:t xml:space="preserve"> = originalstorlek.</w:t>
+              <w:t xml:space="preserve">Materialnamn i film och GIS som räknas som samma (BTG = Betong, PVC/PE/PP = Plast …).</w:t>
             </w:r>
           </w:p>
         </w:tc>
@@ -6042,7 +6060,7 @@
               <w:spacing w:after="0"/>
             </w:pPr>
             <w:r>
-              <w:t xml:space="preserve">960, 76</w:t>
+              <w:t xml:space="preserve">se skriptet</w:t>
             </w:r>
           </w:p>
         </w:tc>
@@ -6076,7 +6094,7 @@
                 <w:szCs w:val="20"/>
                 <w:shd w:fill="F2F2F2" w:val="clear"/>
               </w:rPr>
-              <w:t xml:space="preserve">RAPPORT_BILD_DPI</w:t>
+              <w:t xml:space="preserve">FOTO_MAX_PX</w:t>
             </w:r>
             <w:r>
               <w:t xml:space="preserve">, </w:t>
@@ -6088,7 +6106,7 @@
                 <w:szCs w:val="20"/>
                 <w:shd w:fill="F2F2F2" w:val="clear"/>
               </w:rPr>
-              <w:t xml:space="preserve">RAPPORT_BILD_PALETT</w:t>
+              <w:t xml:space="preserve">FOTO_JPEG_KVALITET</w:t>
             </w:r>
           </w:p>
         </w:tc>
@@ -6114,7 +6132,19 @@
               <w:spacing w:after="0"/>
             </w:pPr>
             <w:r>
-              <w:t xml:space="preserve">Upplösning på översikts- och profilbilden i rapporten, och om de sparas som palett-PNG (256 färger, ca 65 % mindre).</w:t>
+              <w:t xml:space="preserve">Fotona i PDF-rapporterna förminskas till högst så många pixlar på längsta sidan (JPEG-kvalitet enligt den andra; 76 ger ~30 % mindre filer än 82 utan synlig skillnad i A4). </w:t>
+            </w:r>
+            <w:r>
+              <w:rPr>
+                <w:rFonts w:ascii="Consolas" w:cs="Consolas" w:eastAsia="Consolas" w:hAnsi="Consolas"/>
+                <w:sz w:val="20"/>
+                <w:szCs w:val="20"/>
+                <w:shd w:fill="F2F2F2" w:val="clear"/>
+              </w:rPr>
+              <w:t xml:space="preserve">None</w:t>
+            </w:r>
+            <w:r>
+              <w:t xml:space="preserve"> = originalstorlek.</w:t>
             </w:r>
           </w:p>
         </w:tc>
@@ -6140,16 +6170,7 @@
               <w:spacing w:after="0"/>
             </w:pPr>
             <w:r>
-              <w:t xml:space="preserve">150, </w:t>
-            </w:r>
-            <w:r>
-              <w:rPr>
-                <w:rFonts w:ascii="Consolas" w:cs="Consolas" w:eastAsia="Consolas" w:hAnsi="Consolas"/>
-                <w:sz w:val="20"/>
-                <w:szCs w:val="20"/>
-                <w:shd w:fill="F2F2F2" w:val="clear"/>
-              </w:rPr>
-              <w:t xml:space="preserve">True</w:t>
+              <w:t xml:space="preserve">960, 76</w:t>
             </w:r>
           </w:p>
         </w:tc>
@@ -6182,7 +6203,19 @@
                 <w:szCs w:val="20"/>
                 <w:shd w:fill="F2F2F2" w:val="clear"/>
               </w:rPr>
-              <w:t xml:space="preserve">RAPPORT_PROCESSER</w:t>
+              <w:t xml:space="preserve">RAPPORT_BILD_DPI</w:t>
+            </w:r>
+            <w:r>
+              <w:t xml:space="preserve">, </w:t>
+            </w:r>
+            <w:r>
+              <w:rPr>
+                <w:rFonts w:ascii="Consolas" w:cs="Consolas" w:eastAsia="Consolas" w:hAnsi="Consolas"/>
+                <w:sz w:val="20"/>
+                <w:szCs w:val="20"/>
+                <w:shd w:fill="F2F2F2" w:val="clear"/>
+              </w:rPr>
+              <w:t xml:space="preserve">RAPPORT_BILD_PALETT</w:t>
             </w:r>
           </w:p>
         </w:tc>
@@ -6207,7 +6240,32 @@
               <w:spacing w:after="0"/>
             </w:pPr>
             <w:r>
-              <w:t xml:space="preserve">Antal parallella processer för PDF-rapporterna. </w:t>
+              <w:t xml:space="preserve">Upplösning på översikts- och profilbilden i rapporten, och om de sparas som palett-PNG (256 färger, ca 65 % mindre).</w:t>
+            </w:r>
+          </w:p>
+        </w:tc>
+        <w:tc>
+          <w:tcPr>
+            <w:tcW w:type="dxa" w:w="1760"/>
+            <w:tcBorders>
+              <w:top w:val="single" w:color="BFBFBF" w:sz="4"/>
+              <w:left w:val="single" w:color="BFBFBF" w:sz="4"/>
+              <w:bottom w:val="single" w:color="BFBFBF" w:sz="4"/>
+              <w:right w:val="single" w:color="BFBFBF" w:sz="4"/>
+            </w:tcBorders>
+            <w:tcMar>
+              <w:top w:type="dxa" w:w="60"/>
+              <w:left w:type="dxa" w:w="100"/>
+              <w:bottom w:type="dxa" w:w="60"/>
+              <w:right w:type="dxa" w:w="100"/>
+            </w:tcMar>
+          </w:tcPr>
+          <w:p>
+            <w:pPr>
+              <w:spacing w:after="0"/>
+            </w:pPr>
+            <w:r>
+              <w:t xml:space="preserve">150, </w:t>
             </w:r>
             <w:r>
               <w:rPr>
@@ -6216,53 +6274,7 @@
                 <w:szCs w:val="20"/>
                 <w:shd w:fill="F2F2F2" w:val="clear"/>
               </w:rPr>
-              <w:t xml:space="preserve">None</w:t>
-            </w:r>
-            <w:r>
-              <w:t xml:space="preserve"> = antal kärnor − 1, </w:t>
-            </w:r>
-            <w:r>
-              <w:rPr>
-                <w:rFonts w:ascii="Consolas" w:cs="Consolas" w:eastAsia="Consolas" w:hAnsi="Consolas"/>
-                <w:sz w:val="20"/>
-                <w:szCs w:val="20"/>
-                <w:shd w:fill="F2F2F2" w:val="clear"/>
-              </w:rPr>
-              <w:t xml:space="preserve">1</w:t>
-            </w:r>
-            <w:r>
-              <w:t xml:space="preserve"> = en i taget.</w:t>
-            </w:r>
-          </w:p>
-        </w:tc>
-        <w:tc>
-          <w:tcPr>
-            <w:tcW w:type="dxa" w:w="1760"/>
-            <w:tcBorders>
-              <w:top w:val="single" w:color="BFBFBF" w:sz="4"/>
-              <w:left w:val="single" w:color="BFBFBF" w:sz="4"/>
-              <w:bottom w:val="single" w:color="BFBFBF" w:sz="4"/>
-              <w:right w:val="single" w:color="BFBFBF" w:sz="4"/>
-            </w:tcBorders>
-            <w:tcMar>
-              <w:top w:type="dxa" w:w="60"/>
-              <w:left w:type="dxa" w:w="100"/>
-              <w:bottom w:type="dxa" w:w="60"/>
-              <w:right w:type="dxa" w:w="100"/>
-            </w:tcMar>
-          </w:tcPr>
-          <w:p>
-            <w:pPr>
-              <w:spacing w:after="0"/>
-            </w:pPr>
-            <w:r>
-              <w:rPr>
-                <w:rFonts w:ascii="Consolas" w:cs="Consolas" w:eastAsia="Consolas" w:hAnsi="Consolas"/>
-                <w:sz w:val="20"/>
-                <w:szCs w:val="20"/>
-                <w:shd w:fill="F2F2F2" w:val="clear"/>
-              </w:rPr>
-              <w:t xml:space="preserve">None</w:t>
+              <w:t xml:space="preserve">True</w:t>
             </w:r>
           </w:p>
         </w:tc>
@@ -6296,7 +6308,7 @@
                 <w:szCs w:val="20"/>
                 <w:shd w:fill="F2F2F2" w:val="clear"/>
               </w:rPr>
-              <w:t xml:space="preserve">DOLDA_KOLUMNER</w:t>
+              <w:t xml:space="preserve">RAPPORT_PROCESSER</w:t>
             </w:r>
           </w:p>
         </w:tc>
@@ -6322,7 +6334,31 @@
               <w:spacing w:after="0"/>
             </w:pPr>
             <w:r>
-              <w:t xml:space="preserve">Kolumner per flik som döljs som standard i Excel (grupperade, fälls ut med plustecknet ovanför rubrikraden). Rubrik utan enhet. Tom lista = visa allt.</w:t>
+              <w:t xml:space="preserve">Antal parallella processer för PDF-rapporterna. </w:t>
+            </w:r>
+            <w:r>
+              <w:rPr>
+                <w:rFonts w:ascii="Consolas" w:cs="Consolas" w:eastAsia="Consolas" w:hAnsi="Consolas"/>
+                <w:sz w:val="20"/>
+                <w:szCs w:val="20"/>
+                <w:shd w:fill="F2F2F2" w:val="clear"/>
+              </w:rPr>
+              <w:t xml:space="preserve">None</w:t>
+            </w:r>
+            <w:r>
+              <w:t xml:space="preserve"> = antal kärnor − 1, </w:t>
+            </w:r>
+            <w:r>
+              <w:rPr>
+                <w:rFonts w:ascii="Consolas" w:cs="Consolas" w:eastAsia="Consolas" w:hAnsi="Consolas"/>
+                <w:sz w:val="20"/>
+                <w:szCs w:val="20"/>
+                <w:shd w:fill="F2F2F2" w:val="clear"/>
+              </w:rPr>
+              <w:t xml:space="preserve">1</w:t>
+            </w:r>
+            <w:r>
+              <w:t xml:space="preserve"> = en i taget.</w:t>
             </w:r>
           </w:p>
         </w:tc>
@@ -6348,7 +6384,13 @@
               <w:spacing w:after="0"/>
             </w:pPr>
             <w:r>
-              <w:t xml:space="preserve">se skriptet</w:t>
+              <w:rPr>
+                <w:rFonts w:ascii="Consolas" w:cs="Consolas" w:eastAsia="Consolas" w:hAnsi="Consolas"/>
+                <w:sz w:val="20"/>
+                <w:szCs w:val="20"/>
+                <w:shd w:fill="F2F2F2" w:val="clear"/>
+              </w:rPr>
+              <w:t xml:space="preserve">None</w:t>
             </w:r>
           </w:p>
         </w:tc>
@@ -6381,7 +6423,7 @@
                 <w:szCs w:val="20"/>
                 <w:shd w:fill="F2F2F2" w:val="clear"/>
               </w:rPr>
-              <w:t xml:space="preserve">OFULLSTANDIG_ANDEL</w:t>
+              <w:t xml:space="preserve">DOLDA_KOLUMNER</w:t>
             </w:r>
           </w:p>
         </w:tc>
@@ -6406,7 +6448,7 @@
               <w:spacing w:after="0"/>
             </w:pPr>
             <w:r>
-              <w:t xml:space="preserve">Är filmad längd kortare än så gånger kartlängden nådde kameran inte fram; profilen hängs då bara upp i startbrunnen.</w:t>
+              <w:t xml:space="preserve">Kolumner per flik som döljs som standard i Excel (grupperade, fälls ut med plustecknet ovanför rubrikraden). Rubrik utan enhet. Tom lista = visa allt.</w:t>
             </w:r>
           </w:p>
         </w:tc>
@@ -6431,7 +6473,7 @@
               <w:spacing w:after="0"/>
             </w:pPr>
             <w:r>
-              <w:t xml:space="preserve">0,85</w:t>
+              <w:t xml:space="preserve">se skriptet</w:t>
             </w:r>
           </w:p>
         </w:tc>
@@ -6465,7 +6507,7 @@
                 <w:szCs w:val="20"/>
                 <w:shd w:fill="F2F2F2" w:val="clear"/>
               </w:rPr>
-              <w:t xml:space="preserve">KODER</w:t>
+              <w:t xml:space="preserve">OFULLSTANDIG_ANDEL</w:t>
             </w:r>
           </w:p>
         </w:tc>
@@ -6491,7 +6533,7 @@
               <w:spacing w:after="0"/>
             </w:pPr>
             <w:r>
-              <w:t xml:space="preserve">Skadekoder med klartext och typ (K = konstruktion, D = drift, I = information).</w:t>
+              <w:t xml:space="preserve">Är filmad längd kortare än så gånger kartlängden nådde kameran inte fram; profilen hängs då bara upp i startbrunnen.</w:t>
             </w:r>
           </w:p>
         </w:tc>
@@ -6517,7 +6559,7 @@
               <w:spacing w:after="0"/>
             </w:pPr>
             <w:r>
-              <w:t xml:space="preserve">P93</w:t>
+              <w:t xml:space="preserve">0,85</w:t>
             </w:r>
           </w:p>
         </w:tc>
@@ -6550,6 +6592,90 @@
                 <w:szCs w:val="20"/>
                 <w:shd w:fill="F2F2F2" w:val="clear"/>
               </w:rPr>
+              <w:t xml:space="preserve">KODER</w:t>
+            </w:r>
+          </w:p>
+        </w:tc>
+        <w:tc>
+          <w:tcPr>
+            <w:tcW w:type="dxa" w:w="5000"/>
+            <w:tcBorders>
+              <w:top w:val="single" w:color="BFBFBF" w:sz="4"/>
+              <w:left w:val="single" w:color="BFBFBF" w:sz="4"/>
+              <w:bottom w:val="single" w:color="BFBFBF" w:sz="4"/>
+              <w:right w:val="single" w:color="BFBFBF" w:sz="4"/>
+            </w:tcBorders>
+            <w:tcMar>
+              <w:top w:type="dxa" w:w="60"/>
+              <w:left w:type="dxa" w:w="100"/>
+              <w:bottom w:type="dxa" w:w="60"/>
+              <w:right w:type="dxa" w:w="100"/>
+            </w:tcMar>
+          </w:tcPr>
+          <w:p>
+            <w:pPr>
+              <w:spacing w:after="0"/>
+            </w:pPr>
+            <w:r>
+              <w:t xml:space="preserve">Skadekoder med klartext och typ (K = konstruktion, D = drift, I = information).</w:t>
+            </w:r>
+          </w:p>
+        </w:tc>
+        <w:tc>
+          <w:tcPr>
+            <w:tcW w:type="dxa" w:w="1760"/>
+            <w:tcBorders>
+              <w:top w:val="single" w:color="BFBFBF" w:sz="4"/>
+              <w:left w:val="single" w:color="BFBFBF" w:sz="4"/>
+              <w:bottom w:val="single" w:color="BFBFBF" w:sz="4"/>
+              <w:right w:val="single" w:color="BFBFBF" w:sz="4"/>
+            </w:tcBorders>
+            <w:tcMar>
+              <w:top w:type="dxa" w:w="60"/>
+              <w:left w:type="dxa" w:w="100"/>
+              <w:bottom w:type="dxa" w:w="60"/>
+              <w:right w:type="dxa" w:w="100"/>
+            </w:tcMar>
+          </w:tcPr>
+          <w:p>
+            <w:pPr>
+              <w:spacing w:after="0"/>
+            </w:pPr>
+            <w:r>
+              <w:t xml:space="preserve">P93</w:t>
+            </w:r>
+          </w:p>
+        </w:tc>
+      </w:tr>
+      <w:tr>
+        <w:tc>
+          <w:tcPr>
+            <w:tcW w:type="dxa" w:w="2600"/>
+            <w:tcBorders>
+              <w:top w:val="single" w:color="BFBFBF" w:sz="4"/>
+              <w:left w:val="single" w:color="BFBFBF" w:sz="4"/>
+              <w:bottom w:val="single" w:color="BFBFBF" w:sz="4"/>
+              <w:right w:val="single" w:color="BFBFBF" w:sz="4"/>
+            </w:tcBorders>
+            <w:shd w:fill="F7F9FC" w:val="clear"/>
+            <w:tcMar>
+              <w:top w:type="dxa" w:w="60"/>
+              <w:left w:type="dxa" w:w="100"/>
+              <w:bottom w:type="dxa" w:w="60"/>
+              <w:right w:type="dxa" w:w="100"/>
+            </w:tcMar>
+          </w:tcPr>
+          <w:p>
+            <w:pPr>
+              <w:spacing w:after="0"/>
+            </w:pPr>
+            <w:r>
+              <w:rPr>
+                <w:rFonts w:ascii="Consolas" w:cs="Consolas" w:eastAsia="Consolas" w:hAnsi="Consolas"/>
+                <w:sz w:val="20"/>
+                <w:szCs w:val="20"/>
+                <w:shd w:fill="F2F2F2" w:val="clear"/>
+              </w:rPr>
               <w:t xml:space="preserve">ATTRIBUT</w:t>
             </w:r>
             <w:r>
@@ -6575,6 +6701,7 @@
               <w:bottom w:val="single" w:color="BFBFBF" w:sz="4"/>
               <w:right w:val="single" w:color="BFBFBF" w:sz="4"/>
             </w:tcBorders>
+            <w:shd w:fill="F7F9FC" w:val="clear"/>
             <w:tcMar>
               <w:top w:type="dxa" w:w="60"/>
               <w:left w:type="dxa" w:w="100"/>
@@ -6600,6 +6727,7 @@
               <w:bottom w:val="single" w:color="BFBFBF" w:sz="4"/>
               <w:right w:val="single" w:color="BFBFBF" w:sz="4"/>
             </w:tcBorders>
+            <w:shd w:fill="F7F9FC" w:val="clear"/>
             <w:tcMar>
               <w:top w:type="dxa" w:w="60"/>
               <w:left w:type="dxa" w:w="100"/>
@@ -11481,10 +11609,56 @@
           <w:b/>
           <w:bCs/>
         </w:rPr>
-        <w:t xml:space="preserve">Samma sträcka finns två gånger i listan.</w:t>
-      </w:r>
-      <w:r>
-        <w:t xml:space="preserve"> Det händer när entreprenören filmat från båda hållen, ofta efter ett avbrott. Kolumnen Inspekterad flera ggr markerar dessa; bedöm dem tillsammans.</w:t>
+        <w:t xml:space="preserve">Samma sträcka finns flera gånger i listan.</w:t>
+      </w:r>
+      <w:r>
+        <w:t xml:space="preserve"> Det händer när entreprenören filmat om efter spolning eller från andra hållet efter ett avbrott. Kolumnen Inspekterad flera ggr markerar dessa och kolumnen </w:t>
+      </w:r>
+      <w:r>
+        <w:rPr>
+          <w:b/>
+          <w:bCs/>
+        </w:rPr>
+        <w:t xml:space="preserve">Filmstatus</w:t>
+      </w:r>
+      <w:r>
+        <w:t xml:space="preserve"> säger hur de hanterats: en hel film ersätter ofullständiga filmer och äldre hela filmer av samma brunnspar (*ersatt av nr X*), och två ofullständiga filmer från var sin brunn slås ihop till en extra sträcka (*sammanslagen av nr 72 + 73*) med alla observationer på en gemensam axel från startbrunnen – delfilmerna markeras *ingår i sammanslagen nr Y*. Finns kartlängd (markprofil eller GIS-data) används den för totallängd och överlapp, och i överlappet gäller den nyare filmens observationer; annars antas filmerna mötas utan överlapp, vilket står i statusen. Ersatta filmer och delfilmer ligger kvar i Prioritering utan rang och får egna protokoll, men räknas inte i statistik, karta, åtgärdspaket eller inspektionsgrad. En nyare hel film ersätter en äldre bara om den är minst 85 % av den äldres längd (</w:t>
+      </w:r>
+      <w:r>
+        <w:rPr>
+          <w:rFonts w:ascii="Consolas" w:cs="Consolas" w:eastAsia="Consolas" w:hAnsi="Consolas"/>
+          <w:sz w:val="20"/>
+          <w:szCs w:val="20"/>
+          <w:shd w:fill="F2F2F2" w:val="clear"/>
+        </w:rPr>
+        <w:t xml:space="preserve">OMFILMNING_MIN_ANDEL</w:t>
+      </w:r>
+      <w:r>
+        <w:t xml:space="preserve">); stäng av med </w:t>
+      </w:r>
+      <w:r>
+        <w:rPr>
+          <w:rFonts w:ascii="Consolas" w:cs="Consolas" w:eastAsia="Consolas" w:hAnsi="Consolas"/>
+          <w:sz w:val="20"/>
+          <w:szCs w:val="20"/>
+          <w:shd w:fill="F2F2F2" w:val="clear"/>
+        </w:rPr>
+        <w:t xml:space="preserve">OMFILMNING = False</w:t>
+      </w:r>
+      <w:r>
+        <w:t xml:space="preserve"> respektive </w:t>
+      </w:r>
+      <w:r>
+        <w:rPr>
+          <w:rFonts w:ascii="Consolas" w:cs="Consolas" w:eastAsia="Consolas" w:hAnsi="Consolas"/>
+          <w:sz w:val="20"/>
+          <w:szCs w:val="20"/>
+          <w:shd w:fill="F2F2F2" w:val="clear"/>
+        </w:rPr>
+        <w:t xml:space="preserve">SAMMANSLAGNING = False</w:t>
+      </w:r>
+      <w:r>
+        <w:t xml:space="preserve"> i KONFIG.</w:t>
       </w:r>
     </w:p>
     <w:p>

</xml_diff>

<commit_message>
Ny inspektion gäller över filgränser: äldre film ersätts och får referens "Tidigare inspektion"
Samma brunnspar i olika TV3-filer: den nyaste filmen gäller (OMFILMNING_OVER_FILER),
äldre markeras "ersatt av ny inspektion nr X i FIL datum" och räknas inte i statistiken.
Den gällande sträckan får kolumnen Tidigare inspektion (klass och konstruktionsindex
då → nu, förvärrad/förbättrad/oförändrad) i Prioritering, protokollet, kartunderlaget
och PowerPoint; Sammanfattning summerar utvecklingen. Samma datum i olika filer räknas
som dubblett, ofullständig ny film ger OBS med längderna. Textrader i protokollets
infotabell spänner hela radbredden. Handledning och CLAUDE.md uppdaterade.

Co-Authored-By: Claude Fable 5.1 <noreply@anthropic.com>
Claude-Session: https://claude.ai/code/session_011fdqX3JEZje1LF9LqpaqR8
</commit_message>
<xml_diff>
--- a/Anvandarhandledning tv3_analys.docx
+++ b/Anvandarhandledning tv3_analys.docx
@@ -5913,7 +5913,7 @@
                 <w:szCs w:val="20"/>
                 <w:shd w:fill="F2F2F2" w:val="clear"/>
               </w:rPr>
-              <w:t xml:space="preserve">GIS_LANGD_TOL</w:t>
+              <w:t xml:space="preserve">OMFILMNING_OVER_FILER</w:t>
             </w:r>
             <w:r>
               <w:t xml:space="preserve">, </w:t>
@@ -5925,7 +5925,7 @@
                 <w:szCs w:val="20"/>
                 <w:shd w:fill="F2F2F2" w:val="clear"/>
               </w:rPr>
-              <w:t xml:space="preserve">GIS_LITTERA_LIKHET</w:t>
+              <w:t xml:space="preserve">TIDIGARE_INDEX_ANDEL</w:t>
             </w:r>
           </w:p>
         </w:tc>
@@ -5951,7 +5951,7 @@
               <w:spacing w:after="0"/>
             </w:pPr>
             <w:r>
-              <w:t xml:space="preserve">Förslag på rätt littera för okända brunnar: en GIS-ledning från den kända brunnen med längd inom så stor andel av filmens föreslås; annars littera med minst så stor namnlikhet (0–1).</w:t>
+              <w:t xml:space="preserve">Samma brunnspar i olika TV3-filer (olika inspektionsomgångar): den nyaste filmen gäller, äldre markeras *ersatt av ny inspektion* och den gällande får kolumnen Tidigare inspektion (klass och konstruktionsindex då → nu). Inom samma klass räknas sträckan som förvärrad/förbättrad när indexet ändrats mer än andelen (och minst 5 p/100 m).</w:t>
             </w:r>
           </w:p>
         </w:tc>
@@ -5977,7 +5977,16 @@
               <w:spacing w:after="0"/>
             </w:pPr>
             <w:r>
-              <w:t xml:space="preserve">0,15, 0,75</w:t>
+              <w:rPr>
+                <w:rFonts w:ascii="Consolas" w:cs="Consolas" w:eastAsia="Consolas" w:hAnsi="Consolas"/>
+                <w:sz w:val="20"/>
+                <w:szCs w:val="20"/>
+                <w:shd w:fill="F2F2F2" w:val="clear"/>
+              </w:rPr>
+              <w:t xml:space="preserve">True</w:t>
+            </w:r>
+            <w:r>
+              <w:t xml:space="preserve">, 0,2</w:t>
             </w:r>
           </w:p>
         </w:tc>
@@ -6010,7 +6019,19 @@
                 <w:szCs w:val="20"/>
                 <w:shd w:fill="F2F2F2" w:val="clear"/>
               </w:rPr>
-              <w:t xml:space="preserve">GIS_MATERIAL</w:t>
+              <w:t xml:space="preserve">GIS_LANGD_TOL</w:t>
+            </w:r>
+            <w:r>
+              <w:t xml:space="preserve">, </w:t>
+            </w:r>
+            <w:r>
+              <w:rPr>
+                <w:rFonts w:ascii="Consolas" w:cs="Consolas" w:eastAsia="Consolas" w:hAnsi="Consolas"/>
+                <w:sz w:val="20"/>
+                <w:szCs w:val="20"/>
+                <w:shd w:fill="F2F2F2" w:val="clear"/>
+              </w:rPr>
+              <w:t xml:space="preserve">GIS_LITTERA_LIKHET</w:t>
             </w:r>
           </w:p>
         </w:tc>
@@ -6035,7 +6056,7 @@
               <w:spacing w:after="0"/>
             </w:pPr>
             <w:r>
-              <w:t xml:space="preserve">Materialnamn i film och GIS som räknas som samma (BTG = Betong, PVC/PE/PP = Plast …).</w:t>
+              <w:t xml:space="preserve">Förslag på rätt littera för okända brunnar: en GIS-ledning från den kända brunnen med längd inom så stor andel av filmens föreslås; annars littera med minst så stor namnlikhet (0–1).</w:t>
             </w:r>
           </w:p>
         </w:tc>
@@ -6060,7 +6081,7 @@
               <w:spacing w:after="0"/>
             </w:pPr>
             <w:r>
-              <w:t xml:space="preserve">se skriptet</w:t>
+              <w:t xml:space="preserve">0,15, 0,75</w:t>
             </w:r>
           </w:p>
         </w:tc>
@@ -6094,19 +6115,7 @@
                 <w:szCs w:val="20"/>
                 <w:shd w:fill="F2F2F2" w:val="clear"/>
               </w:rPr>
-              <w:t xml:space="preserve">FOTO_MAX_PX</w:t>
-            </w:r>
-            <w:r>
-              <w:t xml:space="preserve">, </w:t>
-            </w:r>
-            <w:r>
-              <w:rPr>
-                <w:rFonts w:ascii="Consolas" w:cs="Consolas" w:eastAsia="Consolas" w:hAnsi="Consolas"/>
-                <w:sz w:val="20"/>
-                <w:szCs w:val="20"/>
-                <w:shd w:fill="F2F2F2" w:val="clear"/>
-              </w:rPr>
-              <w:t xml:space="preserve">FOTO_JPEG_KVALITET</w:t>
+              <w:t xml:space="preserve">GIS_MATERIAL</w:t>
             </w:r>
           </w:p>
         </w:tc>
@@ -6132,19 +6141,7 @@
               <w:spacing w:after="0"/>
             </w:pPr>
             <w:r>
-              <w:t xml:space="preserve">Fotona i PDF-rapporterna förminskas till högst så många pixlar på längsta sidan (JPEG-kvalitet enligt den andra; 76 ger ~30 % mindre filer än 82 utan synlig skillnad i A4). </w:t>
-            </w:r>
-            <w:r>
-              <w:rPr>
-                <w:rFonts w:ascii="Consolas" w:cs="Consolas" w:eastAsia="Consolas" w:hAnsi="Consolas"/>
-                <w:sz w:val="20"/>
-                <w:szCs w:val="20"/>
-                <w:shd w:fill="F2F2F2" w:val="clear"/>
-              </w:rPr>
-              <w:t xml:space="preserve">None</w:t>
-            </w:r>
-            <w:r>
-              <w:t xml:space="preserve"> = originalstorlek.</w:t>
+              <w:t xml:space="preserve">Materialnamn i film och GIS som räknas som samma (BTG = Betong, PVC/PE/PP = Plast …).</w:t>
             </w:r>
           </w:p>
         </w:tc>
@@ -6170,7 +6167,7 @@
               <w:spacing w:after="0"/>
             </w:pPr>
             <w:r>
-              <w:t xml:space="preserve">960, 76</w:t>
+              <w:t xml:space="preserve">se skriptet</w:t>
             </w:r>
           </w:p>
         </w:tc>
@@ -6203,7 +6200,7 @@
                 <w:szCs w:val="20"/>
                 <w:shd w:fill="F2F2F2" w:val="clear"/>
               </w:rPr>
-              <w:t xml:space="preserve">RAPPORT_BILD_DPI</w:t>
+              <w:t xml:space="preserve">FOTO_MAX_PX</w:t>
             </w:r>
             <w:r>
               <w:t xml:space="preserve">, </w:t>
@@ -6215,7 +6212,7 @@
                 <w:szCs w:val="20"/>
                 <w:shd w:fill="F2F2F2" w:val="clear"/>
               </w:rPr>
-              <w:t xml:space="preserve">RAPPORT_BILD_PALETT</w:t>
+              <w:t xml:space="preserve">FOTO_JPEG_KVALITET</w:t>
             </w:r>
           </w:p>
         </w:tc>
@@ -6240,7 +6237,19 @@
               <w:spacing w:after="0"/>
             </w:pPr>
             <w:r>
-              <w:t xml:space="preserve">Upplösning på översikts- och profilbilden i rapporten, och om de sparas som palett-PNG (256 färger, ca 65 % mindre).</w:t>
+              <w:t xml:space="preserve">Fotona i PDF-rapporterna förminskas till högst så många pixlar på längsta sidan (JPEG-kvalitet enligt den andra; 76 ger ~30 % mindre filer än 82 utan synlig skillnad i A4). </w:t>
+            </w:r>
+            <w:r>
+              <w:rPr>
+                <w:rFonts w:ascii="Consolas" w:cs="Consolas" w:eastAsia="Consolas" w:hAnsi="Consolas"/>
+                <w:sz w:val="20"/>
+                <w:szCs w:val="20"/>
+                <w:shd w:fill="F2F2F2" w:val="clear"/>
+              </w:rPr>
+              <w:t xml:space="preserve">None</w:t>
+            </w:r>
+            <w:r>
+              <w:t xml:space="preserve"> = originalstorlek.</w:t>
             </w:r>
           </w:p>
         </w:tc>
@@ -6265,16 +6274,7 @@
               <w:spacing w:after="0"/>
             </w:pPr>
             <w:r>
-              <w:t xml:space="preserve">150, </w:t>
-            </w:r>
-            <w:r>
-              <w:rPr>
-                <w:rFonts w:ascii="Consolas" w:cs="Consolas" w:eastAsia="Consolas" w:hAnsi="Consolas"/>
-                <w:sz w:val="20"/>
-                <w:szCs w:val="20"/>
-                <w:shd w:fill="F2F2F2" w:val="clear"/>
-              </w:rPr>
-              <w:t xml:space="preserve">True</w:t>
+              <w:t xml:space="preserve">960, 76</w:t>
             </w:r>
           </w:p>
         </w:tc>
@@ -6308,7 +6308,19 @@
                 <w:szCs w:val="20"/>
                 <w:shd w:fill="F2F2F2" w:val="clear"/>
               </w:rPr>
-              <w:t xml:space="preserve">RAPPORT_PROCESSER</w:t>
+              <w:t xml:space="preserve">RAPPORT_BILD_DPI</w:t>
+            </w:r>
+            <w:r>
+              <w:t xml:space="preserve">, </w:t>
+            </w:r>
+            <w:r>
+              <w:rPr>
+                <w:rFonts w:ascii="Consolas" w:cs="Consolas" w:eastAsia="Consolas" w:hAnsi="Consolas"/>
+                <w:sz w:val="20"/>
+                <w:szCs w:val="20"/>
+                <w:shd w:fill="F2F2F2" w:val="clear"/>
+              </w:rPr>
+              <w:t xml:space="preserve">RAPPORT_BILD_PALETT</w:t>
             </w:r>
           </w:p>
         </w:tc>
@@ -6334,7 +6346,33 @@
               <w:spacing w:after="0"/>
             </w:pPr>
             <w:r>
-              <w:t xml:space="preserve">Antal parallella processer för PDF-rapporterna. </w:t>
+              <w:t xml:space="preserve">Upplösning på översikts- och profilbilden i rapporten, och om de sparas som palett-PNG (256 färger, ca 65 % mindre).</w:t>
+            </w:r>
+          </w:p>
+        </w:tc>
+        <w:tc>
+          <w:tcPr>
+            <w:tcW w:type="dxa" w:w="1760"/>
+            <w:tcBorders>
+              <w:top w:val="single" w:color="BFBFBF" w:sz="4"/>
+              <w:left w:val="single" w:color="BFBFBF" w:sz="4"/>
+              <w:bottom w:val="single" w:color="BFBFBF" w:sz="4"/>
+              <w:right w:val="single" w:color="BFBFBF" w:sz="4"/>
+            </w:tcBorders>
+            <w:shd w:fill="F7F9FC" w:val="clear"/>
+            <w:tcMar>
+              <w:top w:type="dxa" w:w="60"/>
+              <w:left w:type="dxa" w:w="100"/>
+              <w:bottom w:type="dxa" w:w="60"/>
+              <w:right w:type="dxa" w:w="100"/>
+            </w:tcMar>
+          </w:tcPr>
+          <w:p>
+            <w:pPr>
+              <w:spacing w:after="0"/>
+            </w:pPr>
+            <w:r>
+              <w:t xml:space="preserve">150, </w:t>
             </w:r>
             <w:r>
               <w:rPr>
@@ -6343,54 +6381,7 @@
                 <w:szCs w:val="20"/>
                 <w:shd w:fill="F2F2F2" w:val="clear"/>
               </w:rPr>
-              <w:t xml:space="preserve">None</w:t>
-            </w:r>
-            <w:r>
-              <w:t xml:space="preserve"> = antal kärnor − 1, </w:t>
-            </w:r>
-            <w:r>
-              <w:rPr>
-                <w:rFonts w:ascii="Consolas" w:cs="Consolas" w:eastAsia="Consolas" w:hAnsi="Consolas"/>
-                <w:sz w:val="20"/>
-                <w:szCs w:val="20"/>
-                <w:shd w:fill="F2F2F2" w:val="clear"/>
-              </w:rPr>
-              <w:t xml:space="preserve">1</w:t>
-            </w:r>
-            <w:r>
-              <w:t xml:space="preserve"> = en i taget.</w:t>
-            </w:r>
-          </w:p>
-        </w:tc>
-        <w:tc>
-          <w:tcPr>
-            <w:tcW w:type="dxa" w:w="1760"/>
-            <w:tcBorders>
-              <w:top w:val="single" w:color="BFBFBF" w:sz="4"/>
-              <w:left w:val="single" w:color="BFBFBF" w:sz="4"/>
-              <w:bottom w:val="single" w:color="BFBFBF" w:sz="4"/>
-              <w:right w:val="single" w:color="BFBFBF" w:sz="4"/>
-            </w:tcBorders>
-            <w:shd w:fill="F7F9FC" w:val="clear"/>
-            <w:tcMar>
-              <w:top w:type="dxa" w:w="60"/>
-              <w:left w:type="dxa" w:w="100"/>
-              <w:bottom w:type="dxa" w:w="60"/>
-              <w:right w:type="dxa" w:w="100"/>
-            </w:tcMar>
-          </w:tcPr>
-          <w:p>
-            <w:pPr>
-              <w:spacing w:after="0"/>
-            </w:pPr>
-            <w:r>
-              <w:rPr>
-                <w:rFonts w:ascii="Consolas" w:cs="Consolas" w:eastAsia="Consolas" w:hAnsi="Consolas"/>
-                <w:sz w:val="20"/>
-                <w:szCs w:val="20"/>
-                <w:shd w:fill="F2F2F2" w:val="clear"/>
-              </w:rPr>
-              <w:t xml:space="preserve">None</w:t>
+              <w:t xml:space="preserve">True</w:t>
             </w:r>
           </w:p>
         </w:tc>
@@ -6423,7 +6414,7 @@
                 <w:szCs w:val="20"/>
                 <w:shd w:fill="F2F2F2" w:val="clear"/>
               </w:rPr>
-              <w:t xml:space="preserve">DOLDA_KOLUMNER</w:t>
+              <w:t xml:space="preserve">RAPPORT_PROCESSER</w:t>
             </w:r>
           </w:p>
         </w:tc>
@@ -6448,7 +6439,31 @@
               <w:spacing w:after="0"/>
             </w:pPr>
             <w:r>
-              <w:t xml:space="preserve">Kolumner per flik som döljs som standard i Excel (grupperade, fälls ut med plustecknet ovanför rubrikraden). Rubrik utan enhet. Tom lista = visa allt.</w:t>
+              <w:t xml:space="preserve">Antal parallella processer för PDF-rapporterna. </w:t>
+            </w:r>
+            <w:r>
+              <w:rPr>
+                <w:rFonts w:ascii="Consolas" w:cs="Consolas" w:eastAsia="Consolas" w:hAnsi="Consolas"/>
+                <w:sz w:val="20"/>
+                <w:szCs w:val="20"/>
+                <w:shd w:fill="F2F2F2" w:val="clear"/>
+              </w:rPr>
+              <w:t xml:space="preserve">None</w:t>
+            </w:r>
+            <w:r>
+              <w:t xml:space="preserve"> = antal kärnor − 1, </w:t>
+            </w:r>
+            <w:r>
+              <w:rPr>
+                <w:rFonts w:ascii="Consolas" w:cs="Consolas" w:eastAsia="Consolas" w:hAnsi="Consolas"/>
+                <w:sz w:val="20"/>
+                <w:szCs w:val="20"/>
+                <w:shd w:fill="F2F2F2" w:val="clear"/>
+              </w:rPr>
+              <w:t xml:space="preserve">1</w:t>
+            </w:r>
+            <w:r>
+              <w:t xml:space="preserve"> = en i taget.</w:t>
             </w:r>
           </w:p>
         </w:tc>
@@ -6473,7 +6488,13 @@
               <w:spacing w:after="0"/>
             </w:pPr>
             <w:r>
-              <w:t xml:space="preserve">se skriptet</w:t>
+              <w:rPr>
+                <w:rFonts w:ascii="Consolas" w:cs="Consolas" w:eastAsia="Consolas" w:hAnsi="Consolas"/>
+                <w:sz w:val="20"/>
+                <w:szCs w:val="20"/>
+                <w:shd w:fill="F2F2F2" w:val="clear"/>
+              </w:rPr>
+              <w:t xml:space="preserve">None</w:t>
             </w:r>
           </w:p>
         </w:tc>
@@ -6507,7 +6528,7 @@
                 <w:szCs w:val="20"/>
                 <w:shd w:fill="F2F2F2" w:val="clear"/>
               </w:rPr>
-              <w:t xml:space="preserve">OFULLSTANDIG_ANDEL</w:t>
+              <w:t xml:space="preserve">DOLDA_KOLUMNER</w:t>
             </w:r>
           </w:p>
         </w:tc>
@@ -6533,7 +6554,7 @@
               <w:spacing w:after="0"/>
             </w:pPr>
             <w:r>
-              <w:t xml:space="preserve">Är filmad längd kortare än så gånger kartlängden nådde kameran inte fram; profilen hängs då bara upp i startbrunnen.</w:t>
+              <w:t xml:space="preserve">Kolumner per flik som döljs som standard i Excel (grupperade, fälls ut med plustecknet ovanför rubrikraden). Rubrik utan enhet. Tom lista = visa allt.</w:t>
             </w:r>
           </w:p>
         </w:tc>
@@ -6559,7 +6580,7 @@
               <w:spacing w:after="0"/>
             </w:pPr>
             <w:r>
-              <w:t xml:space="preserve">0,85</w:t>
+              <w:t xml:space="preserve">se skriptet</w:t>
             </w:r>
           </w:p>
         </w:tc>
@@ -6592,7 +6613,7 @@
                 <w:szCs w:val="20"/>
                 <w:shd w:fill="F2F2F2" w:val="clear"/>
               </w:rPr>
-              <w:t xml:space="preserve">KODER</w:t>
+              <w:t xml:space="preserve">OFULLSTANDIG_ANDEL</w:t>
             </w:r>
           </w:p>
         </w:tc>
@@ -6617,7 +6638,7 @@
               <w:spacing w:after="0"/>
             </w:pPr>
             <w:r>
-              <w:t xml:space="preserve">Skadekoder med klartext och typ (K = konstruktion, D = drift, I = information).</w:t>
+              <w:t xml:space="preserve">Är filmad längd kortare än så gånger kartlängden nådde kameran inte fram; profilen hängs då bara upp i startbrunnen.</w:t>
             </w:r>
           </w:p>
         </w:tc>
@@ -6642,7 +6663,7 @@
               <w:spacing w:after="0"/>
             </w:pPr>
             <w:r>
-              <w:t xml:space="preserve">P93</w:t>
+              <w:t xml:space="preserve">0,85</w:t>
             </w:r>
           </w:p>
         </w:tc>
@@ -6676,6 +6697,91 @@
                 <w:szCs w:val="20"/>
                 <w:shd w:fill="F2F2F2" w:val="clear"/>
               </w:rPr>
+              <w:t xml:space="preserve">KODER</w:t>
+            </w:r>
+          </w:p>
+        </w:tc>
+        <w:tc>
+          <w:tcPr>
+            <w:tcW w:type="dxa" w:w="5000"/>
+            <w:tcBorders>
+              <w:top w:val="single" w:color="BFBFBF" w:sz="4"/>
+              <w:left w:val="single" w:color="BFBFBF" w:sz="4"/>
+              <w:bottom w:val="single" w:color="BFBFBF" w:sz="4"/>
+              <w:right w:val="single" w:color="BFBFBF" w:sz="4"/>
+            </w:tcBorders>
+            <w:shd w:fill="F7F9FC" w:val="clear"/>
+            <w:tcMar>
+              <w:top w:type="dxa" w:w="60"/>
+              <w:left w:type="dxa" w:w="100"/>
+              <w:bottom w:type="dxa" w:w="60"/>
+              <w:right w:type="dxa" w:w="100"/>
+            </w:tcMar>
+          </w:tcPr>
+          <w:p>
+            <w:pPr>
+              <w:spacing w:after="0"/>
+            </w:pPr>
+            <w:r>
+              <w:t xml:space="preserve">Skadekoder med klartext och typ (K = konstruktion, D = drift, I = information).</w:t>
+            </w:r>
+          </w:p>
+        </w:tc>
+        <w:tc>
+          <w:tcPr>
+            <w:tcW w:type="dxa" w:w="1760"/>
+            <w:tcBorders>
+              <w:top w:val="single" w:color="BFBFBF" w:sz="4"/>
+              <w:left w:val="single" w:color="BFBFBF" w:sz="4"/>
+              <w:bottom w:val="single" w:color="BFBFBF" w:sz="4"/>
+              <w:right w:val="single" w:color="BFBFBF" w:sz="4"/>
+            </w:tcBorders>
+            <w:shd w:fill="F7F9FC" w:val="clear"/>
+            <w:tcMar>
+              <w:top w:type="dxa" w:w="60"/>
+              <w:left w:type="dxa" w:w="100"/>
+              <w:bottom w:type="dxa" w:w="60"/>
+              <w:right w:type="dxa" w:w="100"/>
+            </w:tcMar>
+          </w:tcPr>
+          <w:p>
+            <w:pPr>
+              <w:spacing w:after="0"/>
+            </w:pPr>
+            <w:r>
+              <w:t xml:space="preserve">P93</w:t>
+            </w:r>
+          </w:p>
+        </w:tc>
+      </w:tr>
+      <w:tr>
+        <w:tc>
+          <w:tcPr>
+            <w:tcW w:type="dxa" w:w="2600"/>
+            <w:tcBorders>
+              <w:top w:val="single" w:color="BFBFBF" w:sz="4"/>
+              <w:left w:val="single" w:color="BFBFBF" w:sz="4"/>
+              <w:bottom w:val="single" w:color="BFBFBF" w:sz="4"/>
+              <w:right w:val="single" w:color="BFBFBF" w:sz="4"/>
+            </w:tcBorders>
+            <w:tcMar>
+              <w:top w:type="dxa" w:w="60"/>
+              <w:left w:type="dxa" w:w="100"/>
+              <w:bottom w:type="dxa" w:w="60"/>
+              <w:right w:type="dxa" w:w="100"/>
+            </w:tcMar>
+          </w:tcPr>
+          <w:p>
+            <w:pPr>
+              <w:spacing w:after="0"/>
+            </w:pPr>
+            <w:r>
+              <w:rPr>
+                <w:rFonts w:ascii="Consolas" w:cs="Consolas" w:eastAsia="Consolas" w:hAnsi="Consolas"/>
+                <w:sz w:val="20"/>
+                <w:szCs w:val="20"/>
+                <w:shd w:fill="F2F2F2" w:val="clear"/>
+              </w:rPr>
               <w:t xml:space="preserve">ATTRIBUT</w:t>
             </w:r>
             <w:r>
@@ -6701,7 +6807,6 @@
               <w:bottom w:val="single" w:color="BFBFBF" w:sz="4"/>
               <w:right w:val="single" w:color="BFBFBF" w:sz="4"/>
             </w:tcBorders>
-            <w:shd w:fill="F7F9FC" w:val="clear"/>
             <w:tcMar>
               <w:top w:type="dxa" w:w="60"/>
               <w:left w:type="dxa" w:w="100"/>
@@ -6727,7 +6832,6 @@
               <w:bottom w:val="single" w:color="BFBFBF" w:sz="4"/>
               <w:right w:val="single" w:color="BFBFBF" w:sz="4"/>
             </w:tcBorders>
-            <w:shd w:fill="F7F9FC" w:val="clear"/>
             <w:tcMar>
               <w:top w:type="dxa" w:w="60"/>
               <w:left w:type="dxa" w:w="100"/>
@@ -11671,6 +11775,55 @@
       </w:r>
       <w:r>
         <w:t xml:space="preserve"> i KONFIG.</w:t>
+      </w:r>
+    </w:p>
+    <w:p>
+      <w:pPr>
+        <w:spacing w:after="120"/>
+      </w:pPr>
+      <w:r>
+        <w:rPr>
+          <w:b/>
+          <w:bCs/>
+        </w:rPr>
+        <w:t xml:space="preserve">Samma sträcka finns i flera TV3-filer (ny inspektion ett senare år).</w:t>
+      </w:r>
+      <w:r>
+        <w:t xml:space="preserve"> Analyserar du flera filer tillsammans gäller den nyaste filmen av brunnsparet oavsett fil (</w:t>
+      </w:r>
+      <w:r>
+        <w:rPr>
+          <w:rFonts w:ascii="Consolas" w:cs="Consolas" w:eastAsia="Consolas" w:hAnsi="Consolas"/>
+          <w:sz w:val="20"/>
+          <w:szCs w:val="20"/>
+          <w:shd w:fill="F2F2F2" w:val="clear"/>
+        </w:rPr>
+        <w:t xml:space="preserve">OMFILMNING_OVER_FILER</w:t>
+      </w:r>
+      <w:r>
+        <w:t xml:space="preserve">). Den äldre raden ligger kvar i Prioritering utan rang med Filmstatus *ersatt av ny inspektion nr X i FIL datum* och räknas inte i statistik, karta, åtgärdspaket eller inspektionsgrad, men behåller sitt protokoll. Den gällande sträckan får kolumnen </w:t>
+      </w:r>
+      <w:r>
+        <w:rPr>
+          <w:b/>
+          <w:bCs/>
+        </w:rPr>
+        <w:t xml:space="preserve">Tidigare inspektion</w:t>
+      </w:r>
+      <w:r>
+        <w:t xml:space="preserve"> – t.ex. *2021-05-27 (DUF 701.TV3 nr 12): C 21 → B 45 p/100 m – förvärrad* – som visar hur sträckan utvecklats; samma uppgift finns i protokollets infotabell, i kartunderlaget (</w:t>
+      </w:r>
+      <w:r>
+        <w:rPr>
+          <w:rFonts w:ascii="Consolas" w:cs="Consolas" w:eastAsia="Consolas" w:hAnsi="Consolas"/>
+          <w:sz w:val="20"/>
+          <w:szCs w:val="20"/>
+          <w:shd w:fill="F2F2F2" w:val="clear"/>
+        </w:rPr>
+        <w:t xml:space="preserve">tidigare_inspektion</w:t>
+      </w:r>
+      <w:r>
+        <w:t xml:space="preserve">) och i sträcksidorna i PowerPoint, och fliken Sammanfattning summerar hur många som förvärrats, förbättrats eller är oförändrade. Är den nya filmen ofullständig (avbruten) gäller den ändå, men den ersatta raden får en OBS med båda längderna. Två filmer med samma datum i olika filer antas vara samma film i två exporter: en räknas, den andra markeras *samma datum – dubblett?*. Saknar filmerna tolkbart datum kan de inte ordnas – båda räknas och en OBS skrivs i konsolen.</w:t>
       </w:r>
     </w:p>
     <w:p>

</xml_diff>

<commit_message>
Rimlighetskontroll av höjderna i TV3-filen: orimliga brunnshöjder/profil ger "höjdfel" i stället för −26 000 ‰
Höjder under HOJD_SAKNAS_UNDER (−999) räknas som saknade; skiljer brunnshöjderna i
PROFILADM mer än HOJD_ORIMLIG_M (50 m) eller spänner inklinometerprofilen över mer
än så används de inte (kontrollera_hojder vid inläsning). Sträckan får Höjdflagga
"Höjdfel i filen: …", lutning "okänd (höjdfel i filen)", profilen ritas inte,
rad i Sammanfattning, fält hojdfel i JSON och OBS i konsolen. Lutningen faller
tillbaka på inklinometerns ändpunkter när PROFILADM saknas ("ur inklinometern").
Handledning och CLAUDE.md uppdaterade.

Co-Authored-By: Claude Fable 5.1 <noreply@anthropic.com>
Claude-Session: https://claude.ai/code/session_011fdqX3JEZje1LF9LqpaqR8
</commit_message>
<xml_diff>
--- a/Anvandarhandledning tv3_analys.docx
+++ b/Anvandarhandledning tv3_analys.docx
@@ -5913,7 +5913,7 @@
                 <w:szCs w:val="20"/>
                 <w:shd w:fill="F2F2F2" w:val="clear"/>
               </w:rPr>
-              <w:t xml:space="preserve">OMFILMNING_OVER_FILER</w:t>
+              <w:t xml:space="preserve">HOJD_SAKNAS_UNDER</w:t>
             </w:r>
             <w:r>
               <w:t xml:space="preserve">, </w:t>
@@ -5925,7 +5925,7 @@
                 <w:szCs w:val="20"/>
                 <w:shd w:fill="F2F2F2" w:val="clear"/>
               </w:rPr>
-              <w:t xml:space="preserve">TIDIGARE_INDEX_ANDEL</w:t>
+              <w:t xml:space="preserve">HOJD_ORIMLIG_M</w:t>
             </w:r>
           </w:p>
         </w:tc>
@@ -5951,7 +5951,7 @@
               <w:spacing w:after="0"/>
             </w:pPr>
             <w:r>
-              <w:t xml:space="preserve">Samma brunnspar i olika TV3-filer (olika inspektionsomgångar): den nyaste filmen gäller, äldre markeras *ersatt av ny inspektion* och den gällande får kolumnen Tidigare inspektion (klass och konstruktionsindex då → nu). Inom samma klass räknas sträckan som förvärrad/förbättrad när indexet ändrats mer än andelen (och minst 5 p/100 m).</w:t>
+              <w:t xml:space="preserve">Rimlighet hos höjderna i TV3-filen: värden under det första (SVOA skriver −9999 för saknad) räknas som saknade; skiljer brunnshöjderna i PROFILADM mer än det andra, eller spänner inklinometerprofilen över mer än så, är höjderna fel i filen och används inte (Höjdflagga *Höjdfel i filen*, lutning *okänd*, profilen ritas inte).</w:t>
             </w:r>
           </w:p>
         </w:tc>
@@ -5977,16 +5977,7 @@
               <w:spacing w:after="0"/>
             </w:pPr>
             <w:r>
-              <w:rPr>
-                <w:rFonts w:ascii="Consolas" w:cs="Consolas" w:eastAsia="Consolas" w:hAnsi="Consolas"/>
-                <w:sz w:val="20"/>
-                <w:szCs w:val="20"/>
-                <w:shd w:fill="F2F2F2" w:val="clear"/>
-              </w:rPr>
-              <w:t xml:space="preserve">True</w:t>
-            </w:r>
-            <w:r>
-              <w:t xml:space="preserve">, 0,2</w:t>
+              <w:t xml:space="preserve">−999, 50</w:t>
             </w:r>
           </w:p>
         </w:tc>
@@ -6019,7 +6010,7 @@
                 <w:szCs w:val="20"/>
                 <w:shd w:fill="F2F2F2" w:val="clear"/>
               </w:rPr>
-              <w:t xml:space="preserve">GIS_LANGD_TOL</w:t>
+              <w:t xml:space="preserve">OMFILMNING_OVER_FILER</w:t>
             </w:r>
             <w:r>
               <w:t xml:space="preserve">, </w:t>
@@ -6031,7 +6022,7 @@
                 <w:szCs w:val="20"/>
                 <w:shd w:fill="F2F2F2" w:val="clear"/>
               </w:rPr>
-              <w:t xml:space="preserve">GIS_LITTERA_LIKHET</w:t>
+              <w:t xml:space="preserve">TIDIGARE_INDEX_ANDEL</w:t>
             </w:r>
           </w:p>
         </w:tc>
@@ -6056,7 +6047,7 @@
               <w:spacing w:after="0"/>
             </w:pPr>
             <w:r>
-              <w:t xml:space="preserve">Förslag på rätt littera för okända brunnar: en GIS-ledning från den kända brunnen med längd inom så stor andel av filmens föreslås; annars littera med minst så stor namnlikhet (0–1).</w:t>
+              <w:t xml:space="preserve">Samma brunnspar i olika TV3-filer (olika inspektionsomgångar): den nyaste filmen gäller, äldre markeras *ersatt av ny inspektion* och den gällande får kolumnen Tidigare inspektion (klass och konstruktionsindex då → nu). Inom samma klass räknas sträckan som förvärrad/förbättrad när indexet ändrats mer än andelen (och minst 5 p/100 m).</w:t>
             </w:r>
           </w:p>
         </w:tc>
@@ -6081,7 +6072,16 @@
               <w:spacing w:after="0"/>
             </w:pPr>
             <w:r>
-              <w:t xml:space="preserve">0,15, 0,75</w:t>
+              <w:rPr>
+                <w:rFonts w:ascii="Consolas" w:cs="Consolas" w:eastAsia="Consolas" w:hAnsi="Consolas"/>
+                <w:sz w:val="20"/>
+                <w:szCs w:val="20"/>
+                <w:shd w:fill="F2F2F2" w:val="clear"/>
+              </w:rPr>
+              <w:t xml:space="preserve">True</w:t>
+            </w:r>
+            <w:r>
+              <w:t xml:space="preserve">, 0,2</w:t>
             </w:r>
           </w:p>
         </w:tc>
@@ -6115,7 +6115,19 @@
                 <w:szCs w:val="20"/>
                 <w:shd w:fill="F2F2F2" w:val="clear"/>
               </w:rPr>
-              <w:t xml:space="preserve">GIS_MATERIAL</w:t>
+              <w:t xml:space="preserve">GIS_LANGD_TOL</w:t>
+            </w:r>
+            <w:r>
+              <w:t xml:space="preserve">, </w:t>
+            </w:r>
+            <w:r>
+              <w:rPr>
+                <w:rFonts w:ascii="Consolas" w:cs="Consolas" w:eastAsia="Consolas" w:hAnsi="Consolas"/>
+                <w:sz w:val="20"/>
+                <w:szCs w:val="20"/>
+                <w:shd w:fill="F2F2F2" w:val="clear"/>
+              </w:rPr>
+              <w:t xml:space="preserve">GIS_LITTERA_LIKHET</w:t>
             </w:r>
           </w:p>
         </w:tc>
@@ -6141,7 +6153,7 @@
               <w:spacing w:after="0"/>
             </w:pPr>
             <w:r>
-              <w:t xml:space="preserve">Materialnamn i film och GIS som räknas som samma (BTG = Betong, PVC/PE/PP = Plast …).</w:t>
+              <w:t xml:space="preserve">Förslag på rätt littera för okända brunnar: en GIS-ledning från den kända brunnen med längd inom så stor andel av filmens föreslås; annars littera med minst så stor namnlikhet (0–1).</w:t>
             </w:r>
           </w:p>
         </w:tc>
@@ -6167,7 +6179,7 @@
               <w:spacing w:after="0"/>
             </w:pPr>
             <w:r>
-              <w:t xml:space="preserve">se skriptet</w:t>
+              <w:t xml:space="preserve">0,15, 0,75</w:t>
             </w:r>
           </w:p>
         </w:tc>
@@ -6200,19 +6212,7 @@
                 <w:szCs w:val="20"/>
                 <w:shd w:fill="F2F2F2" w:val="clear"/>
               </w:rPr>
-              <w:t xml:space="preserve">FOTO_MAX_PX</w:t>
-            </w:r>
-            <w:r>
-              <w:t xml:space="preserve">, </w:t>
-            </w:r>
-            <w:r>
-              <w:rPr>
-                <w:rFonts w:ascii="Consolas" w:cs="Consolas" w:eastAsia="Consolas" w:hAnsi="Consolas"/>
-                <w:sz w:val="20"/>
-                <w:szCs w:val="20"/>
-                <w:shd w:fill="F2F2F2" w:val="clear"/>
-              </w:rPr>
-              <w:t xml:space="preserve">FOTO_JPEG_KVALITET</w:t>
+              <w:t xml:space="preserve">GIS_MATERIAL</w:t>
             </w:r>
           </w:p>
         </w:tc>
@@ -6237,19 +6237,7 @@
               <w:spacing w:after="0"/>
             </w:pPr>
             <w:r>
-              <w:t xml:space="preserve">Fotona i PDF-rapporterna förminskas till högst så många pixlar på längsta sidan (JPEG-kvalitet enligt den andra; 76 ger ~30 % mindre filer än 82 utan synlig skillnad i A4). </w:t>
-            </w:r>
-            <w:r>
-              <w:rPr>
-                <w:rFonts w:ascii="Consolas" w:cs="Consolas" w:eastAsia="Consolas" w:hAnsi="Consolas"/>
-                <w:sz w:val="20"/>
-                <w:szCs w:val="20"/>
-                <w:shd w:fill="F2F2F2" w:val="clear"/>
-              </w:rPr>
-              <w:t xml:space="preserve">None</w:t>
-            </w:r>
-            <w:r>
-              <w:t xml:space="preserve"> = originalstorlek.</w:t>
+              <w:t xml:space="preserve">Materialnamn i film och GIS som räknas som samma (BTG = Betong, PVC/PE/PP = Plast …).</w:t>
             </w:r>
           </w:p>
         </w:tc>
@@ -6274,7 +6262,7 @@
               <w:spacing w:after="0"/>
             </w:pPr>
             <w:r>
-              <w:t xml:space="preserve">960, 76</w:t>
+              <w:t xml:space="preserve">se skriptet</w:t>
             </w:r>
           </w:p>
         </w:tc>
@@ -6308,7 +6296,7 @@
                 <w:szCs w:val="20"/>
                 <w:shd w:fill="F2F2F2" w:val="clear"/>
               </w:rPr>
-              <w:t xml:space="preserve">RAPPORT_BILD_DPI</w:t>
+              <w:t xml:space="preserve">FOTO_MAX_PX</w:t>
             </w:r>
             <w:r>
               <w:t xml:space="preserve">, </w:t>
@@ -6320,7 +6308,7 @@
                 <w:szCs w:val="20"/>
                 <w:shd w:fill="F2F2F2" w:val="clear"/>
               </w:rPr>
-              <w:t xml:space="preserve">RAPPORT_BILD_PALETT</w:t>
+              <w:t xml:space="preserve">FOTO_JPEG_KVALITET</w:t>
             </w:r>
           </w:p>
         </w:tc>
@@ -6346,7 +6334,19 @@
               <w:spacing w:after="0"/>
             </w:pPr>
             <w:r>
-              <w:t xml:space="preserve">Upplösning på översikts- och profilbilden i rapporten, och om de sparas som palett-PNG (256 färger, ca 65 % mindre).</w:t>
+              <w:t xml:space="preserve">Fotona i PDF-rapporterna förminskas till högst så många pixlar på längsta sidan (JPEG-kvalitet enligt den andra; 76 ger ~30 % mindre filer än 82 utan synlig skillnad i A4). </w:t>
+            </w:r>
+            <w:r>
+              <w:rPr>
+                <w:rFonts w:ascii="Consolas" w:cs="Consolas" w:eastAsia="Consolas" w:hAnsi="Consolas"/>
+                <w:sz w:val="20"/>
+                <w:szCs w:val="20"/>
+                <w:shd w:fill="F2F2F2" w:val="clear"/>
+              </w:rPr>
+              <w:t xml:space="preserve">None</w:t>
+            </w:r>
+            <w:r>
+              <w:t xml:space="preserve"> = originalstorlek.</w:t>
             </w:r>
           </w:p>
         </w:tc>
@@ -6372,16 +6372,7 @@
               <w:spacing w:after="0"/>
             </w:pPr>
             <w:r>
-              <w:t xml:space="preserve">150, </w:t>
-            </w:r>
-            <w:r>
-              <w:rPr>
-                <w:rFonts w:ascii="Consolas" w:cs="Consolas" w:eastAsia="Consolas" w:hAnsi="Consolas"/>
-                <w:sz w:val="20"/>
-                <w:szCs w:val="20"/>
-                <w:shd w:fill="F2F2F2" w:val="clear"/>
-              </w:rPr>
-              <w:t xml:space="preserve">True</w:t>
+              <w:t xml:space="preserve">960, 76</w:t>
             </w:r>
           </w:p>
         </w:tc>
@@ -6414,7 +6405,19 @@
                 <w:szCs w:val="20"/>
                 <w:shd w:fill="F2F2F2" w:val="clear"/>
               </w:rPr>
-              <w:t xml:space="preserve">RAPPORT_PROCESSER</w:t>
+              <w:t xml:space="preserve">RAPPORT_BILD_DPI</w:t>
+            </w:r>
+            <w:r>
+              <w:t xml:space="preserve">, </w:t>
+            </w:r>
+            <w:r>
+              <w:rPr>
+                <w:rFonts w:ascii="Consolas" w:cs="Consolas" w:eastAsia="Consolas" w:hAnsi="Consolas"/>
+                <w:sz w:val="20"/>
+                <w:szCs w:val="20"/>
+                <w:shd w:fill="F2F2F2" w:val="clear"/>
+              </w:rPr>
+              <w:t xml:space="preserve">RAPPORT_BILD_PALETT</w:t>
             </w:r>
           </w:p>
         </w:tc>
@@ -6439,7 +6442,32 @@
               <w:spacing w:after="0"/>
             </w:pPr>
             <w:r>
-              <w:t xml:space="preserve">Antal parallella processer för PDF-rapporterna. </w:t>
+              <w:t xml:space="preserve">Upplösning på översikts- och profilbilden i rapporten, och om de sparas som palett-PNG (256 färger, ca 65 % mindre).</w:t>
+            </w:r>
+          </w:p>
+        </w:tc>
+        <w:tc>
+          <w:tcPr>
+            <w:tcW w:type="dxa" w:w="1760"/>
+            <w:tcBorders>
+              <w:top w:val="single" w:color="BFBFBF" w:sz="4"/>
+              <w:left w:val="single" w:color="BFBFBF" w:sz="4"/>
+              <w:bottom w:val="single" w:color="BFBFBF" w:sz="4"/>
+              <w:right w:val="single" w:color="BFBFBF" w:sz="4"/>
+            </w:tcBorders>
+            <w:tcMar>
+              <w:top w:type="dxa" w:w="60"/>
+              <w:left w:type="dxa" w:w="100"/>
+              <w:bottom w:type="dxa" w:w="60"/>
+              <w:right w:type="dxa" w:w="100"/>
+            </w:tcMar>
+          </w:tcPr>
+          <w:p>
+            <w:pPr>
+              <w:spacing w:after="0"/>
+            </w:pPr>
+            <w:r>
+              <w:t xml:space="preserve">150, </w:t>
             </w:r>
             <w:r>
               <w:rPr>
@@ -6448,53 +6476,7 @@
                 <w:szCs w:val="20"/>
                 <w:shd w:fill="F2F2F2" w:val="clear"/>
               </w:rPr>
-              <w:t xml:space="preserve">None</w:t>
-            </w:r>
-            <w:r>
-              <w:t xml:space="preserve"> = antal kärnor − 1, </w:t>
-            </w:r>
-            <w:r>
-              <w:rPr>
-                <w:rFonts w:ascii="Consolas" w:cs="Consolas" w:eastAsia="Consolas" w:hAnsi="Consolas"/>
-                <w:sz w:val="20"/>
-                <w:szCs w:val="20"/>
-                <w:shd w:fill="F2F2F2" w:val="clear"/>
-              </w:rPr>
-              <w:t xml:space="preserve">1</w:t>
-            </w:r>
-            <w:r>
-              <w:t xml:space="preserve"> = en i taget.</w:t>
-            </w:r>
-          </w:p>
-        </w:tc>
-        <w:tc>
-          <w:tcPr>
-            <w:tcW w:type="dxa" w:w="1760"/>
-            <w:tcBorders>
-              <w:top w:val="single" w:color="BFBFBF" w:sz="4"/>
-              <w:left w:val="single" w:color="BFBFBF" w:sz="4"/>
-              <w:bottom w:val="single" w:color="BFBFBF" w:sz="4"/>
-              <w:right w:val="single" w:color="BFBFBF" w:sz="4"/>
-            </w:tcBorders>
-            <w:tcMar>
-              <w:top w:type="dxa" w:w="60"/>
-              <w:left w:type="dxa" w:w="100"/>
-              <w:bottom w:type="dxa" w:w="60"/>
-              <w:right w:type="dxa" w:w="100"/>
-            </w:tcMar>
-          </w:tcPr>
-          <w:p>
-            <w:pPr>
-              <w:spacing w:after="0"/>
-            </w:pPr>
-            <w:r>
-              <w:rPr>
-                <w:rFonts w:ascii="Consolas" w:cs="Consolas" w:eastAsia="Consolas" w:hAnsi="Consolas"/>
-                <w:sz w:val="20"/>
-                <w:szCs w:val="20"/>
-                <w:shd w:fill="F2F2F2" w:val="clear"/>
-              </w:rPr>
-              <w:t xml:space="preserve">None</w:t>
+              <w:t xml:space="preserve">True</w:t>
             </w:r>
           </w:p>
         </w:tc>
@@ -6528,7 +6510,7 @@
                 <w:szCs w:val="20"/>
                 <w:shd w:fill="F2F2F2" w:val="clear"/>
               </w:rPr>
-              <w:t xml:space="preserve">DOLDA_KOLUMNER</w:t>
+              <w:t xml:space="preserve">RAPPORT_PROCESSER</w:t>
             </w:r>
           </w:p>
         </w:tc>
@@ -6554,7 +6536,31 @@
               <w:spacing w:after="0"/>
             </w:pPr>
             <w:r>
-              <w:t xml:space="preserve">Kolumner per flik som döljs som standard i Excel (grupperade, fälls ut med plustecknet ovanför rubrikraden). Rubrik utan enhet. Tom lista = visa allt.</w:t>
+              <w:t xml:space="preserve">Antal parallella processer för PDF-rapporterna. </w:t>
+            </w:r>
+            <w:r>
+              <w:rPr>
+                <w:rFonts w:ascii="Consolas" w:cs="Consolas" w:eastAsia="Consolas" w:hAnsi="Consolas"/>
+                <w:sz w:val="20"/>
+                <w:szCs w:val="20"/>
+                <w:shd w:fill="F2F2F2" w:val="clear"/>
+              </w:rPr>
+              <w:t xml:space="preserve">None</w:t>
+            </w:r>
+            <w:r>
+              <w:t xml:space="preserve"> = antal kärnor − 1, </w:t>
+            </w:r>
+            <w:r>
+              <w:rPr>
+                <w:rFonts w:ascii="Consolas" w:cs="Consolas" w:eastAsia="Consolas" w:hAnsi="Consolas"/>
+                <w:sz w:val="20"/>
+                <w:szCs w:val="20"/>
+                <w:shd w:fill="F2F2F2" w:val="clear"/>
+              </w:rPr>
+              <w:t xml:space="preserve">1</w:t>
+            </w:r>
+            <w:r>
+              <w:t xml:space="preserve"> = en i taget.</w:t>
             </w:r>
           </w:p>
         </w:tc>
@@ -6580,7 +6586,13 @@
               <w:spacing w:after="0"/>
             </w:pPr>
             <w:r>
-              <w:t xml:space="preserve">se skriptet</w:t>
+              <w:rPr>
+                <w:rFonts w:ascii="Consolas" w:cs="Consolas" w:eastAsia="Consolas" w:hAnsi="Consolas"/>
+                <w:sz w:val="20"/>
+                <w:szCs w:val="20"/>
+                <w:shd w:fill="F2F2F2" w:val="clear"/>
+              </w:rPr>
+              <w:t xml:space="preserve">None</w:t>
             </w:r>
           </w:p>
         </w:tc>
@@ -6613,7 +6625,7 @@
                 <w:szCs w:val="20"/>
                 <w:shd w:fill="F2F2F2" w:val="clear"/>
               </w:rPr>
-              <w:t xml:space="preserve">OFULLSTANDIG_ANDEL</w:t>
+              <w:t xml:space="preserve">DOLDA_KOLUMNER</w:t>
             </w:r>
           </w:p>
         </w:tc>
@@ -6638,7 +6650,7 @@
               <w:spacing w:after="0"/>
             </w:pPr>
             <w:r>
-              <w:t xml:space="preserve">Är filmad längd kortare än så gånger kartlängden nådde kameran inte fram; profilen hängs då bara upp i startbrunnen.</w:t>
+              <w:t xml:space="preserve">Kolumner per flik som döljs som standard i Excel (grupperade, fälls ut med plustecknet ovanför rubrikraden). Rubrik utan enhet. Tom lista = visa allt.</w:t>
             </w:r>
           </w:p>
         </w:tc>
@@ -6663,7 +6675,7 @@
               <w:spacing w:after="0"/>
             </w:pPr>
             <w:r>
-              <w:t xml:space="preserve">0,85</w:t>
+              <w:t xml:space="preserve">se skriptet</w:t>
             </w:r>
           </w:p>
         </w:tc>
@@ -6697,7 +6709,7 @@
                 <w:szCs w:val="20"/>
                 <w:shd w:fill="F2F2F2" w:val="clear"/>
               </w:rPr>
-              <w:t xml:space="preserve">KODER</w:t>
+              <w:t xml:space="preserve">OFULLSTANDIG_ANDEL</w:t>
             </w:r>
           </w:p>
         </w:tc>
@@ -6723,7 +6735,7 @@
               <w:spacing w:after="0"/>
             </w:pPr>
             <w:r>
-              <w:t xml:space="preserve">Skadekoder med klartext och typ (K = konstruktion, D = drift, I = information).</w:t>
+              <w:t xml:space="preserve">Är filmad längd kortare än så gånger kartlängden nådde kameran inte fram; profilen hängs då bara upp i startbrunnen.</w:t>
             </w:r>
           </w:p>
         </w:tc>
@@ -6749,7 +6761,7 @@
               <w:spacing w:after="0"/>
             </w:pPr>
             <w:r>
-              <w:t xml:space="preserve">P93</w:t>
+              <w:t xml:space="preserve">0,85</w:t>
             </w:r>
           </w:p>
         </w:tc>
@@ -6782,6 +6794,90 @@
                 <w:szCs w:val="20"/>
                 <w:shd w:fill="F2F2F2" w:val="clear"/>
               </w:rPr>
+              <w:t xml:space="preserve">KODER</w:t>
+            </w:r>
+          </w:p>
+        </w:tc>
+        <w:tc>
+          <w:tcPr>
+            <w:tcW w:type="dxa" w:w="5000"/>
+            <w:tcBorders>
+              <w:top w:val="single" w:color="BFBFBF" w:sz="4"/>
+              <w:left w:val="single" w:color="BFBFBF" w:sz="4"/>
+              <w:bottom w:val="single" w:color="BFBFBF" w:sz="4"/>
+              <w:right w:val="single" w:color="BFBFBF" w:sz="4"/>
+            </w:tcBorders>
+            <w:tcMar>
+              <w:top w:type="dxa" w:w="60"/>
+              <w:left w:type="dxa" w:w="100"/>
+              <w:bottom w:type="dxa" w:w="60"/>
+              <w:right w:type="dxa" w:w="100"/>
+            </w:tcMar>
+          </w:tcPr>
+          <w:p>
+            <w:pPr>
+              <w:spacing w:after="0"/>
+            </w:pPr>
+            <w:r>
+              <w:t xml:space="preserve">Skadekoder med klartext och typ (K = konstruktion, D = drift, I = information).</w:t>
+            </w:r>
+          </w:p>
+        </w:tc>
+        <w:tc>
+          <w:tcPr>
+            <w:tcW w:type="dxa" w:w="1760"/>
+            <w:tcBorders>
+              <w:top w:val="single" w:color="BFBFBF" w:sz="4"/>
+              <w:left w:val="single" w:color="BFBFBF" w:sz="4"/>
+              <w:bottom w:val="single" w:color="BFBFBF" w:sz="4"/>
+              <w:right w:val="single" w:color="BFBFBF" w:sz="4"/>
+            </w:tcBorders>
+            <w:tcMar>
+              <w:top w:type="dxa" w:w="60"/>
+              <w:left w:type="dxa" w:w="100"/>
+              <w:bottom w:type="dxa" w:w="60"/>
+              <w:right w:type="dxa" w:w="100"/>
+            </w:tcMar>
+          </w:tcPr>
+          <w:p>
+            <w:pPr>
+              <w:spacing w:after="0"/>
+            </w:pPr>
+            <w:r>
+              <w:t xml:space="preserve">P93</w:t>
+            </w:r>
+          </w:p>
+        </w:tc>
+      </w:tr>
+      <w:tr>
+        <w:tc>
+          <w:tcPr>
+            <w:tcW w:type="dxa" w:w="2600"/>
+            <w:tcBorders>
+              <w:top w:val="single" w:color="BFBFBF" w:sz="4"/>
+              <w:left w:val="single" w:color="BFBFBF" w:sz="4"/>
+              <w:bottom w:val="single" w:color="BFBFBF" w:sz="4"/>
+              <w:right w:val="single" w:color="BFBFBF" w:sz="4"/>
+            </w:tcBorders>
+            <w:shd w:fill="F7F9FC" w:val="clear"/>
+            <w:tcMar>
+              <w:top w:type="dxa" w:w="60"/>
+              <w:left w:type="dxa" w:w="100"/>
+              <w:bottom w:type="dxa" w:w="60"/>
+              <w:right w:type="dxa" w:w="100"/>
+            </w:tcMar>
+          </w:tcPr>
+          <w:p>
+            <w:pPr>
+              <w:spacing w:after="0"/>
+            </w:pPr>
+            <w:r>
+              <w:rPr>
+                <w:rFonts w:ascii="Consolas" w:cs="Consolas" w:eastAsia="Consolas" w:hAnsi="Consolas"/>
+                <w:sz w:val="20"/>
+                <w:szCs w:val="20"/>
+                <w:shd w:fill="F2F2F2" w:val="clear"/>
+              </w:rPr>
               <w:t xml:space="preserve">ATTRIBUT</w:t>
             </w:r>
             <w:r>
@@ -6807,6 +6903,7 @@
               <w:bottom w:val="single" w:color="BFBFBF" w:sz="4"/>
               <w:right w:val="single" w:color="BFBFBF" w:sz="4"/>
             </w:tcBorders>
+            <w:shd w:fill="F7F9FC" w:val="clear"/>
             <w:tcMar>
               <w:top w:type="dxa" w:w="60"/>
               <w:left w:type="dxa" w:w="100"/>
@@ -6832,6 +6929,7 @@
               <w:bottom w:val="single" w:color="BFBFBF" w:sz="4"/>
               <w:right w:val="single" w:color="BFBFBF" w:sz="4"/>
             </w:tcBorders>
+            <w:shd w:fill="F7F9FC" w:val="clear"/>
             <w:tcMar>
               <w:top w:type="dxa" w:w="60"/>
               <w:left w:type="dxa" w:w="100"/>
@@ -11775,6 +11873,57 @@
       </w:r>
       <w:r>
         <w:t xml:space="preserve"> i KONFIG.</w:t>
+      </w:r>
+    </w:p>
+    <w:p>
+      <w:pPr>
+        <w:spacing w:after="120"/>
+      </w:pPr>
+      <w:r>
+        <w:rPr>
+          <w:b/>
+          <w:bCs/>
+        </w:rPr>
+        <w:t xml:space="preserve">Lutningen är tusentals promille och profilen ser orimlig ut.</w:t>
+      </w:r>
+      <w:r>
+        <w:t xml:space="preserve"> Då är höjderna fel i TV3-filen – brunnshöjderna i PROFILADM eller inklinometerns absoluta höjder ligger i fel storleksordning (t.ex. 29,30 och 2 444,33 m) eller är ett saknat-värde som −9999. Analysen kontrollerar detta vid inläsningen: höjder under </w:t>
+      </w:r>
+      <w:r>
+        <w:rPr>
+          <w:rFonts w:ascii="Consolas" w:cs="Consolas" w:eastAsia="Consolas" w:hAnsi="Consolas"/>
+          <w:sz w:val="20"/>
+          <w:szCs w:val="20"/>
+          <w:shd w:fill="F2F2F2" w:val="clear"/>
+        </w:rPr>
+        <w:t xml:space="preserve">HOJD_SAKNAS_UNDER</w:t>
+      </w:r>
+      <w:r>
+        <w:t xml:space="preserve"> räknas som saknade, och skiljer brunnshöjderna mer än </w:t>
+      </w:r>
+      <w:r>
+        <w:rPr>
+          <w:rFonts w:ascii="Consolas" w:cs="Consolas" w:eastAsia="Consolas" w:hAnsi="Consolas"/>
+          <w:sz w:val="20"/>
+          <w:szCs w:val="20"/>
+          <w:shd w:fill="F2F2F2" w:val="clear"/>
+        </w:rPr>
+        <w:t xml:space="preserve">HOJD_ORIMLIG_M</w:t>
+      </w:r>
+      <w:r>
+        <w:t xml:space="preserve"> (50 m) eller spänner profilen över mer än så används de inte. Sträckan får Höjdflagga *Höjdfel i filen: …* (kolumnen i Prioritering, fältet </w:t>
+      </w:r>
+      <w:r>
+        <w:rPr>
+          <w:rFonts w:ascii="Consolas" w:cs="Consolas" w:eastAsia="Consolas" w:hAnsi="Consolas"/>
+          <w:sz w:val="20"/>
+          <w:szCs w:val="20"/>
+          <w:shd w:fill="F2F2F2" w:val="clear"/>
+        </w:rPr>
+        <w:t xml:space="preserve">hojdfel</w:t>
+      </w:r>
+      <w:r>
+        <w:t xml:space="preserve"> i kartunderlaget, raden Höjdfel i protokollet och raden Höjdfel i TV3-filen i Sammanfattning), lutningen blir *okänd (höjdfel i filen)* och profilen ritas inte. Är bara brunnshöjderna fel men inklinometern hel räknas lutningen på inklinometerns ändpunkter (*ur inklinometern* i protokollet) och profilen ritas med en OBS om att den inte kunnat kontrolleras mot brunnshöjderna. Konsolen listar sträckorna med OBS per fil. Rätta gärna höjderna i filen eller hämta vattengången från GIS (Exportera GIS-data) så att höjdanpassningen tar över.</w:t>
       </w:r>
     </w:p>
     <w:p>

</xml_diff>

<commit_message>
Kartlängd ur GIS även utan direkt ledning: väg via andra brunnar, annars fågelvägen
Saknas direkt GIS-ledning mellan brunnarna söks kortaste vägen via andra brunnar
(GIS_VAG_MAX_HOPP, GIS_VAG_MAX_ANDEL) och dess längd/vattengång används; hittas
ingen väg används brunnarnas avstånd fågelvägen som kartlängd. Sammanslagning av
två avbrutna filmer får därmed kartlängd och överlapp. GIS-flaggan anger vilket.
Inspektionsgrad räknar vägens delar som filmade. Handledning och CLAUDE.md.

Co-Authored-By: Claude Fable 5.1 <noreply@anthropic.com>
Claude-Session: https://claude.ai/code/session_011fdqX3JEZje1LF9LqpaqR8
</commit_message>
<xml_diff>
--- a/Anvandarhandledning tv3_analys.docx
+++ b/Anvandarhandledning tv3_analys.docx
@@ -5913,7 +5913,7 @@
                 <w:szCs w:val="20"/>
                 <w:shd w:fill="F2F2F2" w:val="clear"/>
               </w:rPr>
-              <w:t xml:space="preserve">HOJD_SAKNAS_UNDER</w:t>
+              <w:t xml:space="preserve">GIS_VAG_MAX_HOPP</w:t>
             </w:r>
             <w:r>
               <w:t xml:space="preserve">, </w:t>
@@ -5925,7 +5925,7 @@
                 <w:szCs w:val="20"/>
                 <w:shd w:fill="F2F2F2" w:val="clear"/>
               </w:rPr>
-              <w:t xml:space="preserve">HOJD_ORIMLIG_M</w:t>
+              <w:t xml:space="preserve">GIS_VAG_MAX_ANDEL</w:t>
             </w:r>
           </w:p>
         </w:tc>
@@ -5951,7 +5951,7 @@
               <w:spacing w:after="0"/>
             </w:pPr>
             <w:r>
-              <w:t xml:space="preserve">Rimlighet hos höjderna i TV3-filen: värden under det första (SVOA skriver −9999 för saknad) räknas som saknade; skiljer brunnshöjderna i PROFILADM mer än det andra, eller spänner inklinometerprofilen över mer än så, är höjderna fel i filen och används inte (Höjdflagga *Höjdfel i filen*, lutning *okänd*, profilen ritas inte).</w:t>
+              <w:t xml:space="preserve">Saknas direkt ledning i GIS mellan brunnarna söks en väg via andra brunnar: högst så många ledningar och högst andelen × filmens längd + 20 m. Hittas ingen väg används brunnarnas avstånd fågelvägen som kartlängd.</w:t>
             </w:r>
           </w:p>
         </w:tc>
@@ -5977,7 +5977,7 @@
               <w:spacing w:after="0"/>
             </w:pPr>
             <w:r>
-              <w:t xml:space="preserve">−999, 50</w:t>
+              <w:t xml:space="preserve">4, 2,0</w:t>
             </w:r>
           </w:p>
         </w:tc>
@@ -6010,7 +6010,7 @@
                 <w:szCs w:val="20"/>
                 <w:shd w:fill="F2F2F2" w:val="clear"/>
               </w:rPr>
-              <w:t xml:space="preserve">OMFILMNING_OVER_FILER</w:t>
+              <w:t xml:space="preserve">HOJD_SAKNAS_UNDER</w:t>
             </w:r>
             <w:r>
               <w:t xml:space="preserve">, </w:t>
@@ -6022,7 +6022,7 @@
                 <w:szCs w:val="20"/>
                 <w:shd w:fill="F2F2F2" w:val="clear"/>
               </w:rPr>
-              <w:t xml:space="preserve">TIDIGARE_INDEX_ANDEL</w:t>
+              <w:t xml:space="preserve">HOJD_ORIMLIG_M</w:t>
             </w:r>
           </w:p>
         </w:tc>
@@ -6047,7 +6047,7 @@
               <w:spacing w:after="0"/>
             </w:pPr>
             <w:r>
-              <w:t xml:space="preserve">Samma brunnspar i olika TV3-filer (olika inspektionsomgångar): den nyaste filmen gäller, äldre markeras *ersatt av ny inspektion* och den gällande får kolumnen Tidigare inspektion (klass och konstruktionsindex då → nu). Inom samma klass räknas sträckan som förvärrad/förbättrad när indexet ändrats mer än andelen (och minst 5 p/100 m).</w:t>
+              <w:t xml:space="preserve">Rimlighet hos höjderna i TV3-filen: värden under det första (SVOA skriver −9999 för saknad) räknas som saknade; skiljer brunnshöjderna i PROFILADM mer än det andra, eller spänner inklinometerprofilen över mer än så, är höjderna fel i filen och används inte (Höjdflagga *Höjdfel i filen*, lutning *okänd*, profilen ritas inte).</w:t>
             </w:r>
           </w:p>
         </w:tc>
@@ -6072,16 +6072,7 @@
               <w:spacing w:after="0"/>
             </w:pPr>
             <w:r>
-              <w:rPr>
-                <w:rFonts w:ascii="Consolas" w:cs="Consolas" w:eastAsia="Consolas" w:hAnsi="Consolas"/>
-                <w:sz w:val="20"/>
-                <w:szCs w:val="20"/>
-                <w:shd w:fill="F2F2F2" w:val="clear"/>
-              </w:rPr>
-              <w:t xml:space="preserve">True</w:t>
-            </w:r>
-            <w:r>
-              <w:t xml:space="preserve">, 0,2</w:t>
+              <w:t xml:space="preserve">−999, 50</w:t>
             </w:r>
           </w:p>
         </w:tc>
@@ -6115,7 +6106,7 @@
                 <w:szCs w:val="20"/>
                 <w:shd w:fill="F2F2F2" w:val="clear"/>
               </w:rPr>
-              <w:t xml:space="preserve">GIS_LANGD_TOL</w:t>
+              <w:t xml:space="preserve">OMFILMNING_OVER_FILER</w:t>
             </w:r>
             <w:r>
               <w:t xml:space="preserve">, </w:t>
@@ -6127,7 +6118,7 @@
                 <w:szCs w:val="20"/>
                 <w:shd w:fill="F2F2F2" w:val="clear"/>
               </w:rPr>
-              <w:t xml:space="preserve">GIS_LITTERA_LIKHET</w:t>
+              <w:t xml:space="preserve">TIDIGARE_INDEX_ANDEL</w:t>
             </w:r>
           </w:p>
         </w:tc>
@@ -6153,7 +6144,7 @@
               <w:spacing w:after="0"/>
             </w:pPr>
             <w:r>
-              <w:t xml:space="preserve">Förslag på rätt littera för okända brunnar: en GIS-ledning från den kända brunnen med längd inom så stor andel av filmens föreslås; annars littera med minst så stor namnlikhet (0–1).</w:t>
+              <w:t xml:space="preserve">Samma brunnspar i olika TV3-filer (olika inspektionsomgångar): den nyaste filmen gäller, äldre markeras *ersatt av ny inspektion* och den gällande får kolumnen Tidigare inspektion (klass och konstruktionsindex då → nu). Inom samma klass räknas sträckan som förvärrad/förbättrad när indexet ändrats mer än andelen (och minst 5 p/100 m).</w:t>
             </w:r>
           </w:p>
         </w:tc>
@@ -6179,7 +6170,16 @@
               <w:spacing w:after="0"/>
             </w:pPr>
             <w:r>
-              <w:t xml:space="preserve">0,15, 0,75</w:t>
+              <w:rPr>
+                <w:rFonts w:ascii="Consolas" w:cs="Consolas" w:eastAsia="Consolas" w:hAnsi="Consolas"/>
+                <w:sz w:val="20"/>
+                <w:szCs w:val="20"/>
+                <w:shd w:fill="F2F2F2" w:val="clear"/>
+              </w:rPr>
+              <w:t xml:space="preserve">True</w:t>
+            </w:r>
+            <w:r>
+              <w:t xml:space="preserve">, 0,2</w:t>
             </w:r>
           </w:p>
         </w:tc>
@@ -6212,7 +6212,19 @@
                 <w:szCs w:val="20"/>
                 <w:shd w:fill="F2F2F2" w:val="clear"/>
               </w:rPr>
-              <w:t xml:space="preserve">GIS_MATERIAL</w:t>
+              <w:t xml:space="preserve">GIS_LANGD_TOL</w:t>
+            </w:r>
+            <w:r>
+              <w:t xml:space="preserve">, </w:t>
+            </w:r>
+            <w:r>
+              <w:rPr>
+                <w:rFonts w:ascii="Consolas" w:cs="Consolas" w:eastAsia="Consolas" w:hAnsi="Consolas"/>
+                <w:sz w:val="20"/>
+                <w:szCs w:val="20"/>
+                <w:shd w:fill="F2F2F2" w:val="clear"/>
+              </w:rPr>
+              <w:t xml:space="preserve">GIS_LITTERA_LIKHET</w:t>
             </w:r>
           </w:p>
         </w:tc>
@@ -6237,7 +6249,7 @@
               <w:spacing w:after="0"/>
             </w:pPr>
             <w:r>
-              <w:t xml:space="preserve">Materialnamn i film och GIS som räknas som samma (BTG = Betong, PVC/PE/PP = Plast …).</w:t>
+              <w:t xml:space="preserve">Förslag på rätt littera för okända brunnar: en GIS-ledning från den kända brunnen med längd inom så stor andel av filmens föreslås; annars littera med minst så stor namnlikhet (0–1).</w:t>
             </w:r>
           </w:p>
         </w:tc>
@@ -6262,7 +6274,7 @@
               <w:spacing w:after="0"/>
             </w:pPr>
             <w:r>
-              <w:t xml:space="preserve">se skriptet</w:t>
+              <w:t xml:space="preserve">0,15, 0,75</w:t>
             </w:r>
           </w:p>
         </w:tc>
@@ -6296,19 +6308,7 @@
                 <w:szCs w:val="20"/>
                 <w:shd w:fill="F2F2F2" w:val="clear"/>
               </w:rPr>
-              <w:t xml:space="preserve">FOTO_MAX_PX</w:t>
-            </w:r>
-            <w:r>
-              <w:t xml:space="preserve">, </w:t>
-            </w:r>
-            <w:r>
-              <w:rPr>
-                <w:rFonts w:ascii="Consolas" w:cs="Consolas" w:eastAsia="Consolas" w:hAnsi="Consolas"/>
-                <w:sz w:val="20"/>
-                <w:szCs w:val="20"/>
-                <w:shd w:fill="F2F2F2" w:val="clear"/>
-              </w:rPr>
-              <w:t xml:space="preserve">FOTO_JPEG_KVALITET</w:t>
+              <w:t xml:space="preserve">GIS_MATERIAL</w:t>
             </w:r>
           </w:p>
         </w:tc>
@@ -6334,19 +6334,7 @@
               <w:spacing w:after="0"/>
             </w:pPr>
             <w:r>
-              <w:t xml:space="preserve">Fotona i PDF-rapporterna förminskas till högst så många pixlar på längsta sidan (JPEG-kvalitet enligt den andra; 76 ger ~30 % mindre filer än 82 utan synlig skillnad i A4). </w:t>
-            </w:r>
-            <w:r>
-              <w:rPr>
-                <w:rFonts w:ascii="Consolas" w:cs="Consolas" w:eastAsia="Consolas" w:hAnsi="Consolas"/>
-                <w:sz w:val="20"/>
-                <w:szCs w:val="20"/>
-                <w:shd w:fill="F2F2F2" w:val="clear"/>
-              </w:rPr>
-              <w:t xml:space="preserve">None</w:t>
-            </w:r>
-            <w:r>
-              <w:t xml:space="preserve"> = originalstorlek.</w:t>
+              <w:t xml:space="preserve">Materialnamn i film och GIS som räknas som samma (BTG = Betong, PVC/PE/PP = Plast …).</w:t>
             </w:r>
           </w:p>
         </w:tc>
@@ -6372,7 +6360,7 @@
               <w:spacing w:after="0"/>
             </w:pPr>
             <w:r>
-              <w:t xml:space="preserve">960, 76</w:t>
+              <w:t xml:space="preserve">se skriptet</w:t>
             </w:r>
           </w:p>
         </w:tc>
@@ -6405,7 +6393,7 @@
                 <w:szCs w:val="20"/>
                 <w:shd w:fill="F2F2F2" w:val="clear"/>
               </w:rPr>
-              <w:t xml:space="preserve">RAPPORT_BILD_DPI</w:t>
+              <w:t xml:space="preserve">FOTO_MAX_PX</w:t>
             </w:r>
             <w:r>
               <w:t xml:space="preserve">, </w:t>
@@ -6417,7 +6405,7 @@
                 <w:szCs w:val="20"/>
                 <w:shd w:fill="F2F2F2" w:val="clear"/>
               </w:rPr>
-              <w:t xml:space="preserve">RAPPORT_BILD_PALETT</w:t>
+              <w:t xml:space="preserve">FOTO_JPEG_KVALITET</w:t>
             </w:r>
           </w:p>
         </w:tc>
@@ -6442,7 +6430,19 @@
               <w:spacing w:after="0"/>
             </w:pPr>
             <w:r>
-              <w:t xml:space="preserve">Upplösning på översikts- och profilbilden i rapporten, och om de sparas som palett-PNG (256 färger, ca 65 % mindre).</w:t>
+              <w:t xml:space="preserve">Fotona i PDF-rapporterna förminskas till högst så många pixlar på längsta sidan (JPEG-kvalitet enligt den andra; 76 ger ~30 % mindre filer än 82 utan synlig skillnad i A4). </w:t>
+            </w:r>
+            <w:r>
+              <w:rPr>
+                <w:rFonts w:ascii="Consolas" w:cs="Consolas" w:eastAsia="Consolas" w:hAnsi="Consolas"/>
+                <w:sz w:val="20"/>
+                <w:szCs w:val="20"/>
+                <w:shd w:fill="F2F2F2" w:val="clear"/>
+              </w:rPr>
+              <w:t xml:space="preserve">None</w:t>
+            </w:r>
+            <w:r>
+              <w:t xml:space="preserve"> = originalstorlek.</w:t>
             </w:r>
           </w:p>
         </w:tc>
@@ -6467,16 +6467,7 @@
               <w:spacing w:after="0"/>
             </w:pPr>
             <w:r>
-              <w:t xml:space="preserve">150, </w:t>
-            </w:r>
-            <w:r>
-              <w:rPr>
-                <w:rFonts w:ascii="Consolas" w:cs="Consolas" w:eastAsia="Consolas" w:hAnsi="Consolas"/>
-                <w:sz w:val="20"/>
-                <w:szCs w:val="20"/>
-                <w:shd w:fill="F2F2F2" w:val="clear"/>
-              </w:rPr>
-              <w:t xml:space="preserve">True</w:t>
+              <w:t xml:space="preserve">960, 76</w:t>
             </w:r>
           </w:p>
         </w:tc>
@@ -6510,7 +6501,19 @@
                 <w:szCs w:val="20"/>
                 <w:shd w:fill="F2F2F2" w:val="clear"/>
               </w:rPr>
-              <w:t xml:space="preserve">RAPPORT_PROCESSER</w:t>
+              <w:t xml:space="preserve">RAPPORT_BILD_DPI</w:t>
+            </w:r>
+            <w:r>
+              <w:t xml:space="preserve">, </w:t>
+            </w:r>
+            <w:r>
+              <w:rPr>
+                <w:rFonts w:ascii="Consolas" w:cs="Consolas" w:eastAsia="Consolas" w:hAnsi="Consolas"/>
+                <w:sz w:val="20"/>
+                <w:szCs w:val="20"/>
+                <w:shd w:fill="F2F2F2" w:val="clear"/>
+              </w:rPr>
+              <w:t xml:space="preserve">RAPPORT_BILD_PALETT</w:t>
             </w:r>
           </w:p>
         </w:tc>
@@ -6536,7 +6539,33 @@
               <w:spacing w:after="0"/>
             </w:pPr>
             <w:r>
-              <w:t xml:space="preserve">Antal parallella processer för PDF-rapporterna. </w:t>
+              <w:t xml:space="preserve">Upplösning på översikts- och profilbilden i rapporten, och om de sparas som palett-PNG (256 färger, ca 65 % mindre).</w:t>
+            </w:r>
+          </w:p>
+        </w:tc>
+        <w:tc>
+          <w:tcPr>
+            <w:tcW w:type="dxa" w:w="1760"/>
+            <w:tcBorders>
+              <w:top w:val="single" w:color="BFBFBF" w:sz="4"/>
+              <w:left w:val="single" w:color="BFBFBF" w:sz="4"/>
+              <w:bottom w:val="single" w:color="BFBFBF" w:sz="4"/>
+              <w:right w:val="single" w:color="BFBFBF" w:sz="4"/>
+            </w:tcBorders>
+            <w:shd w:fill="F7F9FC" w:val="clear"/>
+            <w:tcMar>
+              <w:top w:type="dxa" w:w="60"/>
+              <w:left w:type="dxa" w:w="100"/>
+              <w:bottom w:type="dxa" w:w="60"/>
+              <w:right w:type="dxa" w:w="100"/>
+            </w:tcMar>
+          </w:tcPr>
+          <w:p>
+            <w:pPr>
+              <w:spacing w:after="0"/>
+            </w:pPr>
+            <w:r>
+              <w:t xml:space="preserve">150, </w:t>
             </w:r>
             <w:r>
               <w:rPr>
@@ -6545,54 +6574,7 @@
                 <w:szCs w:val="20"/>
                 <w:shd w:fill="F2F2F2" w:val="clear"/>
               </w:rPr>
-              <w:t xml:space="preserve">None</w:t>
-            </w:r>
-            <w:r>
-              <w:t xml:space="preserve"> = antal kärnor − 1, </w:t>
-            </w:r>
-            <w:r>
-              <w:rPr>
-                <w:rFonts w:ascii="Consolas" w:cs="Consolas" w:eastAsia="Consolas" w:hAnsi="Consolas"/>
-                <w:sz w:val="20"/>
-                <w:szCs w:val="20"/>
-                <w:shd w:fill="F2F2F2" w:val="clear"/>
-              </w:rPr>
-              <w:t xml:space="preserve">1</w:t>
-            </w:r>
-            <w:r>
-              <w:t xml:space="preserve"> = en i taget.</w:t>
-            </w:r>
-          </w:p>
-        </w:tc>
-        <w:tc>
-          <w:tcPr>
-            <w:tcW w:type="dxa" w:w="1760"/>
-            <w:tcBorders>
-              <w:top w:val="single" w:color="BFBFBF" w:sz="4"/>
-              <w:left w:val="single" w:color="BFBFBF" w:sz="4"/>
-              <w:bottom w:val="single" w:color="BFBFBF" w:sz="4"/>
-              <w:right w:val="single" w:color="BFBFBF" w:sz="4"/>
-            </w:tcBorders>
-            <w:shd w:fill="F7F9FC" w:val="clear"/>
-            <w:tcMar>
-              <w:top w:type="dxa" w:w="60"/>
-              <w:left w:type="dxa" w:w="100"/>
-              <w:bottom w:type="dxa" w:w="60"/>
-              <w:right w:type="dxa" w:w="100"/>
-            </w:tcMar>
-          </w:tcPr>
-          <w:p>
-            <w:pPr>
-              <w:spacing w:after="0"/>
-            </w:pPr>
-            <w:r>
-              <w:rPr>
-                <w:rFonts w:ascii="Consolas" w:cs="Consolas" w:eastAsia="Consolas" w:hAnsi="Consolas"/>
-                <w:sz w:val="20"/>
-                <w:szCs w:val="20"/>
-                <w:shd w:fill="F2F2F2" w:val="clear"/>
-              </w:rPr>
-              <w:t xml:space="preserve">None</w:t>
+              <w:t xml:space="preserve">True</w:t>
             </w:r>
           </w:p>
         </w:tc>
@@ -6625,7 +6607,7 @@
                 <w:szCs w:val="20"/>
                 <w:shd w:fill="F2F2F2" w:val="clear"/>
               </w:rPr>
-              <w:t xml:space="preserve">DOLDA_KOLUMNER</w:t>
+              <w:t xml:space="preserve">RAPPORT_PROCESSER</w:t>
             </w:r>
           </w:p>
         </w:tc>
@@ -6650,7 +6632,31 @@
               <w:spacing w:after="0"/>
             </w:pPr>
             <w:r>
-              <w:t xml:space="preserve">Kolumner per flik som döljs som standard i Excel (grupperade, fälls ut med plustecknet ovanför rubrikraden). Rubrik utan enhet. Tom lista = visa allt.</w:t>
+              <w:t xml:space="preserve">Antal parallella processer för PDF-rapporterna. </w:t>
+            </w:r>
+            <w:r>
+              <w:rPr>
+                <w:rFonts w:ascii="Consolas" w:cs="Consolas" w:eastAsia="Consolas" w:hAnsi="Consolas"/>
+                <w:sz w:val="20"/>
+                <w:szCs w:val="20"/>
+                <w:shd w:fill="F2F2F2" w:val="clear"/>
+              </w:rPr>
+              <w:t xml:space="preserve">None</w:t>
+            </w:r>
+            <w:r>
+              <w:t xml:space="preserve"> = antal kärnor − 1, </w:t>
+            </w:r>
+            <w:r>
+              <w:rPr>
+                <w:rFonts w:ascii="Consolas" w:cs="Consolas" w:eastAsia="Consolas" w:hAnsi="Consolas"/>
+                <w:sz w:val="20"/>
+                <w:szCs w:val="20"/>
+                <w:shd w:fill="F2F2F2" w:val="clear"/>
+              </w:rPr>
+              <w:t xml:space="preserve">1</w:t>
+            </w:r>
+            <w:r>
+              <w:t xml:space="preserve"> = en i taget.</w:t>
             </w:r>
           </w:p>
         </w:tc>
@@ -6675,7 +6681,13 @@
               <w:spacing w:after="0"/>
             </w:pPr>
             <w:r>
-              <w:t xml:space="preserve">se skriptet</w:t>
+              <w:rPr>
+                <w:rFonts w:ascii="Consolas" w:cs="Consolas" w:eastAsia="Consolas" w:hAnsi="Consolas"/>
+                <w:sz w:val="20"/>
+                <w:szCs w:val="20"/>
+                <w:shd w:fill="F2F2F2" w:val="clear"/>
+              </w:rPr>
+              <w:t xml:space="preserve">None</w:t>
             </w:r>
           </w:p>
         </w:tc>
@@ -6709,7 +6721,7 @@
                 <w:szCs w:val="20"/>
                 <w:shd w:fill="F2F2F2" w:val="clear"/>
               </w:rPr>
-              <w:t xml:space="preserve">OFULLSTANDIG_ANDEL</w:t>
+              <w:t xml:space="preserve">DOLDA_KOLUMNER</w:t>
             </w:r>
           </w:p>
         </w:tc>
@@ -6735,7 +6747,7 @@
               <w:spacing w:after="0"/>
             </w:pPr>
             <w:r>
-              <w:t xml:space="preserve">Är filmad längd kortare än så gånger kartlängden nådde kameran inte fram; profilen hängs då bara upp i startbrunnen.</w:t>
+              <w:t xml:space="preserve">Kolumner per flik som döljs som standard i Excel (grupperade, fälls ut med plustecknet ovanför rubrikraden). Rubrik utan enhet. Tom lista = visa allt.</w:t>
             </w:r>
           </w:p>
         </w:tc>
@@ -6761,7 +6773,7 @@
               <w:spacing w:after="0"/>
             </w:pPr>
             <w:r>
-              <w:t xml:space="preserve">0,85</w:t>
+              <w:t xml:space="preserve">se skriptet</w:t>
             </w:r>
           </w:p>
         </w:tc>
@@ -6794,7 +6806,7 @@
                 <w:szCs w:val="20"/>
                 <w:shd w:fill="F2F2F2" w:val="clear"/>
               </w:rPr>
-              <w:t xml:space="preserve">KODER</w:t>
+              <w:t xml:space="preserve">OFULLSTANDIG_ANDEL</w:t>
             </w:r>
           </w:p>
         </w:tc>
@@ -6819,7 +6831,7 @@
               <w:spacing w:after="0"/>
             </w:pPr>
             <w:r>
-              <w:t xml:space="preserve">Skadekoder med klartext och typ (K = konstruktion, D = drift, I = information).</w:t>
+              <w:t xml:space="preserve">Är filmad längd kortare än så gånger kartlängden nådde kameran inte fram; profilen hängs då bara upp i startbrunnen.</w:t>
             </w:r>
           </w:p>
         </w:tc>
@@ -6844,7 +6856,7 @@
               <w:spacing w:after="0"/>
             </w:pPr>
             <w:r>
-              <w:t xml:space="preserve">P93</w:t>
+              <w:t xml:space="preserve">0,85</w:t>
             </w:r>
           </w:p>
         </w:tc>
@@ -6878,6 +6890,91 @@
                 <w:szCs w:val="20"/>
                 <w:shd w:fill="F2F2F2" w:val="clear"/>
               </w:rPr>
+              <w:t xml:space="preserve">KODER</w:t>
+            </w:r>
+          </w:p>
+        </w:tc>
+        <w:tc>
+          <w:tcPr>
+            <w:tcW w:type="dxa" w:w="5000"/>
+            <w:tcBorders>
+              <w:top w:val="single" w:color="BFBFBF" w:sz="4"/>
+              <w:left w:val="single" w:color="BFBFBF" w:sz="4"/>
+              <w:bottom w:val="single" w:color="BFBFBF" w:sz="4"/>
+              <w:right w:val="single" w:color="BFBFBF" w:sz="4"/>
+            </w:tcBorders>
+            <w:shd w:fill="F7F9FC" w:val="clear"/>
+            <w:tcMar>
+              <w:top w:type="dxa" w:w="60"/>
+              <w:left w:type="dxa" w:w="100"/>
+              <w:bottom w:type="dxa" w:w="60"/>
+              <w:right w:type="dxa" w:w="100"/>
+            </w:tcMar>
+          </w:tcPr>
+          <w:p>
+            <w:pPr>
+              <w:spacing w:after="0"/>
+            </w:pPr>
+            <w:r>
+              <w:t xml:space="preserve">Skadekoder med klartext och typ (K = konstruktion, D = drift, I = information).</w:t>
+            </w:r>
+          </w:p>
+        </w:tc>
+        <w:tc>
+          <w:tcPr>
+            <w:tcW w:type="dxa" w:w="1760"/>
+            <w:tcBorders>
+              <w:top w:val="single" w:color="BFBFBF" w:sz="4"/>
+              <w:left w:val="single" w:color="BFBFBF" w:sz="4"/>
+              <w:bottom w:val="single" w:color="BFBFBF" w:sz="4"/>
+              <w:right w:val="single" w:color="BFBFBF" w:sz="4"/>
+            </w:tcBorders>
+            <w:shd w:fill="F7F9FC" w:val="clear"/>
+            <w:tcMar>
+              <w:top w:type="dxa" w:w="60"/>
+              <w:left w:type="dxa" w:w="100"/>
+              <w:bottom w:type="dxa" w:w="60"/>
+              <w:right w:type="dxa" w:w="100"/>
+            </w:tcMar>
+          </w:tcPr>
+          <w:p>
+            <w:pPr>
+              <w:spacing w:after="0"/>
+            </w:pPr>
+            <w:r>
+              <w:t xml:space="preserve">P93</w:t>
+            </w:r>
+          </w:p>
+        </w:tc>
+      </w:tr>
+      <w:tr>
+        <w:tc>
+          <w:tcPr>
+            <w:tcW w:type="dxa" w:w="2600"/>
+            <w:tcBorders>
+              <w:top w:val="single" w:color="BFBFBF" w:sz="4"/>
+              <w:left w:val="single" w:color="BFBFBF" w:sz="4"/>
+              <w:bottom w:val="single" w:color="BFBFBF" w:sz="4"/>
+              <w:right w:val="single" w:color="BFBFBF" w:sz="4"/>
+            </w:tcBorders>
+            <w:tcMar>
+              <w:top w:type="dxa" w:w="60"/>
+              <w:left w:type="dxa" w:w="100"/>
+              <w:bottom w:type="dxa" w:w="60"/>
+              <w:right w:type="dxa" w:w="100"/>
+            </w:tcMar>
+          </w:tcPr>
+          <w:p>
+            <w:pPr>
+              <w:spacing w:after="0"/>
+            </w:pPr>
+            <w:r>
+              <w:rPr>
+                <w:rFonts w:ascii="Consolas" w:cs="Consolas" w:eastAsia="Consolas" w:hAnsi="Consolas"/>
+                <w:sz w:val="20"/>
+                <w:szCs w:val="20"/>
+                <w:shd w:fill="F2F2F2" w:val="clear"/>
+              </w:rPr>
               <w:t xml:space="preserve">ATTRIBUT</w:t>
             </w:r>
             <w:r>
@@ -6903,7 +7000,6 @@
               <w:bottom w:val="single" w:color="BFBFBF" w:sz="4"/>
               <w:right w:val="single" w:color="BFBFBF" w:sz="4"/>
             </w:tcBorders>
-            <w:shd w:fill="F7F9FC" w:val="clear"/>
             <w:tcMar>
               <w:top w:type="dxa" w:w="60"/>
               <w:left w:type="dxa" w:w="100"/>
@@ -6929,7 +7025,6 @@
               <w:bottom w:val="single" w:color="BFBFBF" w:sz="4"/>
               <w:right w:val="single" w:color="BFBFBF" w:sz="4"/>
             </w:tcBorders>
-            <w:shd w:fill="F7F9FC" w:val="clear"/>
             <w:tcMar>
               <w:top w:type="dxa" w:w="60"/>
               <w:left w:type="dxa" w:w="100"/>
@@ -11460,10 +11555,74 @@
           <w:b/>
           <w:bCs/>
         </w:rPr>
+        <w:t xml:space="preserve">ingen direkt ledning i GIS – kartlängd X m via BRUNN (N ledningar)</w:t>
+      </w:r>
+      <w:r>
+        <w:t xml:space="preserve"> – ledningen mellan brunnarna är uppdelad i GIS med en eller flera brunnar emellan (filmen hoppade över en brunn, eller kartan har en extra). Analysen tar kortaste vägen via andra brunnar (högst </w:t>
+      </w:r>
+      <w:r>
+        <w:rPr>
+          <w:rFonts w:ascii="Consolas" w:cs="Consolas" w:eastAsia="Consolas" w:hAnsi="Consolas"/>
+          <w:sz w:val="20"/>
+          <w:szCs w:val="20"/>
+          <w:shd w:fill="F2F2F2" w:val="clear"/>
+        </w:rPr>
+        <w:t xml:space="preserve">GIS_VAG_MAX_HOPP</w:t>
+      </w:r>
+      <w:r>
+        <w:t xml:space="preserve"> ledningar och högst </w:t>
+      </w:r>
+      <w:r>
+        <w:rPr>
+          <w:rFonts w:ascii="Consolas" w:cs="Consolas" w:eastAsia="Consolas" w:hAnsi="Consolas"/>
+          <w:sz w:val="20"/>
+          <w:szCs w:val="20"/>
+          <w:shd w:fill="F2F2F2" w:val="clear"/>
+        </w:rPr>
+        <w:t xml:space="preserve">GIS_VAG_MAX_ANDEL</w:t>
+      </w:r>
+      <w:r>
+        <w:t xml:space="preserve"> × filmens längd + 20 m) och använder dess längd och vattengång i ändarna som kartlängd och GIS-nivåer.</w:t>
+      </w:r>
+    </w:p>
+    <w:p>
+      <w:pPr>
+        <w:pStyle w:val="ListParagraph"/>
+        <w:numPr>
+          <w:ilvl w:val="0"/>
+          <w:numId w:val="3"/>
+        </w:numPr>
+        <w:spacing w:after="80"/>
+      </w:pPr>
+      <w:r>
+        <w:rPr>
+          <w:b/>
+          <w:bCs/>
+        </w:rPr>
+        <w:t xml:space="preserve">ingen ledning i GIS mellan brunnarna – kartlängd fågelvägen X m</w:t>
+      </w:r>
+      <w:r>
+        <w:t xml:space="preserve"> – båda brunnarna finns men ingen ledning förbinder dem, inte heller via andra brunnar (fel sträcka i filmen, eller ledningen saknas i kartan). Avståndet mellan brunnarna används som kartlängd, t.ex. för att slå ihop två avbrutna filmer; vattengång och inspektionsgrad får ingen GIS-ledning.</w:t>
+      </w:r>
+    </w:p>
+    <w:p>
+      <w:pPr>
+        <w:pStyle w:val="ListParagraph"/>
+        <w:numPr>
+          <w:ilvl w:val="0"/>
+          <w:numId w:val="3"/>
+        </w:numPr>
+        <w:spacing w:after="80"/>
+      </w:pPr>
+      <w:r>
+        <w:rPr>
+          <w:b/>
+          <w:bCs/>
+        </w:rPr>
         <w:t xml:space="preserve">ingen ledning i GIS mellan brunnarna</w:t>
       </w:r>
       <w:r>
-        <w:t xml:space="preserve"> – båda brunnarna finns men ingen ledning förbinder dem (fel sträcka i filmen, eller ledningen saknas i kartan).</w:t>
+        <w:t xml:space="preserve"> – som ovan, men brunnarna saknar koordinater så inte ens fågelvägen går att räkna.</w:t>
       </w:r>
     </w:p>
     <w:p>

</xml_diff>

<commit_message>
GIS: ledningsdelar som möts i en skarv utan brunn fogas ihop vid inläsningen
Delar med fria ändar inom exportens tolerans (GIS_SKARV_TOL_M) kedjas ihop från
brunn till brunn, oavsett antal delar och ritriktning: längd summeras, vattengång
tas i brunnarna, material/dimension bara om lika, delarna listas. GIS-flagga
"ledningen består av BTG … + PVC … (skarv utan brunn)" när delarna skiljer sig.
Inspektionsgrad räknar den hopfogade ledningen. Handledning och CLAUDE.md.

Co-Authored-By: Claude Fable 5.1 <noreply@anthropic.com>
Claude-Session: https://claude.ai/code/session_011fdqX3JEZje1LF9LqpaqR8
</commit_message>
<xml_diff>
--- a/Anvandarhandledning tv3_analys.docx
+++ b/Anvandarhandledning tv3_analys.docx
@@ -5913,10 +5913,33 @@
                 <w:szCs w:val="20"/>
                 <w:shd w:fill="F2F2F2" w:val="clear"/>
               </w:rPr>
-              <w:t xml:space="preserve">GIS_VAG_MAX_HOPP</w:t>
-            </w:r>
-            <w:r>
-              <w:t xml:space="preserve">, </w:t>
+              <w:t xml:space="preserve">GIS_SKARV_TOL_M</w:t>
+            </w:r>
+          </w:p>
+        </w:tc>
+        <w:tc>
+          <w:tcPr>
+            <w:tcW w:type="dxa" w:w="5000"/>
+            <w:tcBorders>
+              <w:top w:val="single" w:color="BFBFBF" w:sz="4"/>
+              <w:left w:val="single" w:color="BFBFBF" w:sz="4"/>
+              <w:bottom w:val="single" w:color="BFBFBF" w:sz="4"/>
+              <w:right w:val="single" w:color="BFBFBF" w:sz="4"/>
+            </w:tcBorders>
+            <w:shd w:fill="F7F9FC" w:val="clear"/>
+            <w:tcMar>
+              <w:top w:type="dxa" w:w="60"/>
+              <w:left w:type="dxa" w:w="100"/>
+              <w:bottom w:type="dxa" w:w="60"/>
+              <w:right w:type="dxa" w:w="100"/>
+            </w:tcMar>
+          </w:tcPr>
+          <w:p>
+            <w:pPr>
+              <w:spacing w:after="0"/>
+            </w:pPr>
+            <w:r>
+              <w:t xml:space="preserve">Ledningsdelar vars fria ändar (utan brunn) ligger närmare varandra än så fogas ihop till en ledning mellan brunnarna vid inläsningen av gisdata.json. </w:t>
             </w:r>
             <w:r>
               <w:rPr>
@@ -5925,13 +5948,16 @@
                 <w:szCs w:val="20"/>
                 <w:shd w:fill="F2F2F2" w:val="clear"/>
               </w:rPr>
-              <w:t xml:space="preserve">GIS_VAG_MAX_ANDEL</w:t>
-            </w:r>
-          </w:p>
-        </w:tc>
-        <w:tc>
-          <w:tcPr>
-            <w:tcW w:type="dxa" w:w="5000"/>
+              <w:t xml:space="preserve">None</w:t>
+            </w:r>
+            <w:r>
+              <w:t xml:space="preserve"> = exportens tolerans (tolerans_m i filen).</w:t>
+            </w:r>
+          </w:p>
+        </w:tc>
+        <w:tc>
+          <w:tcPr>
+            <w:tcW w:type="dxa" w:w="1760"/>
             <w:tcBorders>
               <w:top w:val="single" w:color="BFBFBF" w:sz="4"/>
               <w:left w:val="single" w:color="BFBFBF" w:sz="4"/>
@@ -5951,33 +5977,13 @@
               <w:spacing w:after="0"/>
             </w:pPr>
             <w:r>
-              <w:t xml:space="preserve">Saknas direkt ledning i GIS mellan brunnarna söks en väg via andra brunnar: högst så många ledningar och högst andelen × filmens längd + 20 m. Hittas ingen väg används brunnarnas avstånd fågelvägen som kartlängd.</w:t>
-            </w:r>
-          </w:p>
-        </w:tc>
-        <w:tc>
-          <w:tcPr>
-            <w:tcW w:type="dxa" w:w="1760"/>
-            <w:tcBorders>
-              <w:top w:val="single" w:color="BFBFBF" w:sz="4"/>
-              <w:left w:val="single" w:color="BFBFBF" w:sz="4"/>
-              <w:bottom w:val="single" w:color="BFBFBF" w:sz="4"/>
-              <w:right w:val="single" w:color="BFBFBF" w:sz="4"/>
-            </w:tcBorders>
-            <w:shd w:fill="F7F9FC" w:val="clear"/>
-            <w:tcMar>
-              <w:top w:type="dxa" w:w="60"/>
-              <w:left w:type="dxa" w:w="100"/>
-              <w:bottom w:type="dxa" w:w="60"/>
-              <w:right w:type="dxa" w:w="100"/>
-            </w:tcMar>
-          </w:tcPr>
-          <w:p>
-            <w:pPr>
-              <w:spacing w:after="0"/>
-            </w:pPr>
-            <w:r>
-              <w:t xml:space="preserve">4, 2,0</w:t>
+              <w:rPr>
+                <w:rFonts w:ascii="Consolas" w:cs="Consolas" w:eastAsia="Consolas" w:hAnsi="Consolas"/>
+                <w:sz w:val="20"/>
+                <w:szCs w:val="20"/>
+                <w:shd w:fill="F2F2F2" w:val="clear"/>
+              </w:rPr>
+              <w:t xml:space="preserve">None</w:t>
             </w:r>
           </w:p>
         </w:tc>
@@ -6010,7 +6016,7 @@
                 <w:szCs w:val="20"/>
                 <w:shd w:fill="F2F2F2" w:val="clear"/>
               </w:rPr>
-              <w:t xml:space="preserve">HOJD_SAKNAS_UNDER</w:t>
+              <w:t xml:space="preserve">GIS_VAG_MAX_HOPP</w:t>
             </w:r>
             <w:r>
               <w:t xml:space="preserve">, </w:t>
@@ -6022,7 +6028,7 @@
                 <w:szCs w:val="20"/>
                 <w:shd w:fill="F2F2F2" w:val="clear"/>
               </w:rPr>
-              <w:t xml:space="preserve">HOJD_ORIMLIG_M</w:t>
+              <w:t xml:space="preserve">GIS_VAG_MAX_ANDEL</w:t>
             </w:r>
           </w:p>
         </w:tc>
@@ -6047,7 +6053,7 @@
               <w:spacing w:after="0"/>
             </w:pPr>
             <w:r>
-              <w:t xml:space="preserve">Rimlighet hos höjderna i TV3-filen: värden under det första (SVOA skriver −9999 för saknad) räknas som saknade; skiljer brunnshöjderna i PROFILADM mer än det andra, eller spänner inklinometerprofilen över mer än så, är höjderna fel i filen och används inte (Höjdflagga *Höjdfel i filen*, lutning *okänd*, profilen ritas inte).</w:t>
+              <w:t xml:space="preserve">Saknas direkt ledning i GIS mellan brunnarna söks en väg via andra brunnar: högst så många ledningar och högst andelen × filmens längd + 20 m. Hittas ingen väg används brunnarnas avstånd fågelvägen som kartlängd.</w:t>
             </w:r>
           </w:p>
         </w:tc>
@@ -6072,7 +6078,7 @@
               <w:spacing w:after="0"/>
             </w:pPr>
             <w:r>
-              <w:t xml:space="preserve">−999, 50</w:t>
+              <w:t xml:space="preserve">4, 2,0</w:t>
             </w:r>
           </w:p>
         </w:tc>
@@ -6106,7 +6112,7 @@
                 <w:szCs w:val="20"/>
                 <w:shd w:fill="F2F2F2" w:val="clear"/>
               </w:rPr>
-              <w:t xml:space="preserve">OMFILMNING_OVER_FILER</w:t>
+              <w:t xml:space="preserve">HOJD_SAKNAS_UNDER</w:t>
             </w:r>
             <w:r>
               <w:t xml:space="preserve">, </w:t>
@@ -6118,7 +6124,7 @@
                 <w:szCs w:val="20"/>
                 <w:shd w:fill="F2F2F2" w:val="clear"/>
               </w:rPr>
-              <w:t xml:space="preserve">TIDIGARE_INDEX_ANDEL</w:t>
+              <w:t xml:space="preserve">HOJD_ORIMLIG_M</w:t>
             </w:r>
           </w:p>
         </w:tc>
@@ -6144,7 +6150,7 @@
               <w:spacing w:after="0"/>
             </w:pPr>
             <w:r>
-              <w:t xml:space="preserve">Samma brunnspar i olika TV3-filer (olika inspektionsomgångar): den nyaste filmen gäller, äldre markeras *ersatt av ny inspektion* och den gällande får kolumnen Tidigare inspektion (klass och konstruktionsindex då → nu). Inom samma klass räknas sträckan som förvärrad/förbättrad när indexet ändrats mer än andelen (och minst 5 p/100 m).</w:t>
+              <w:t xml:space="preserve">Rimlighet hos höjderna i TV3-filen: värden under det första (SVOA skriver −9999 för saknad) räknas som saknade; skiljer brunnshöjderna i PROFILADM mer än det andra, eller spänner inklinometerprofilen över mer än så, är höjderna fel i filen och används inte (Höjdflagga *Höjdfel i filen*, lutning *okänd*, profilen ritas inte).</w:t>
             </w:r>
           </w:p>
         </w:tc>
@@ -6170,16 +6176,7 @@
               <w:spacing w:after="0"/>
             </w:pPr>
             <w:r>
-              <w:rPr>
-                <w:rFonts w:ascii="Consolas" w:cs="Consolas" w:eastAsia="Consolas" w:hAnsi="Consolas"/>
-                <w:sz w:val="20"/>
-                <w:szCs w:val="20"/>
-                <w:shd w:fill="F2F2F2" w:val="clear"/>
-              </w:rPr>
-              <w:t xml:space="preserve">True</w:t>
-            </w:r>
-            <w:r>
-              <w:t xml:space="preserve">, 0,2</w:t>
+              <w:t xml:space="preserve">−999, 50</w:t>
             </w:r>
           </w:p>
         </w:tc>
@@ -6212,7 +6209,7 @@
                 <w:szCs w:val="20"/>
                 <w:shd w:fill="F2F2F2" w:val="clear"/>
               </w:rPr>
-              <w:t xml:space="preserve">GIS_LANGD_TOL</w:t>
+              <w:t xml:space="preserve">OMFILMNING_OVER_FILER</w:t>
             </w:r>
             <w:r>
               <w:t xml:space="preserve">, </w:t>
@@ -6224,7 +6221,7 @@
                 <w:szCs w:val="20"/>
                 <w:shd w:fill="F2F2F2" w:val="clear"/>
               </w:rPr>
-              <w:t xml:space="preserve">GIS_LITTERA_LIKHET</w:t>
+              <w:t xml:space="preserve">TIDIGARE_INDEX_ANDEL</w:t>
             </w:r>
           </w:p>
         </w:tc>
@@ -6249,7 +6246,7 @@
               <w:spacing w:after="0"/>
             </w:pPr>
             <w:r>
-              <w:t xml:space="preserve">Förslag på rätt littera för okända brunnar: en GIS-ledning från den kända brunnen med längd inom så stor andel av filmens föreslås; annars littera med minst så stor namnlikhet (0–1).</w:t>
+              <w:t xml:space="preserve">Samma brunnspar i olika TV3-filer (olika inspektionsomgångar): den nyaste filmen gäller, äldre markeras *ersatt av ny inspektion* och den gällande får kolumnen Tidigare inspektion (klass och konstruktionsindex då → nu). Inom samma klass räknas sträckan som förvärrad/förbättrad när indexet ändrats mer än andelen (och minst 5 p/100 m).</w:t>
             </w:r>
           </w:p>
         </w:tc>
@@ -6274,7 +6271,16 @@
               <w:spacing w:after="0"/>
             </w:pPr>
             <w:r>
-              <w:t xml:space="preserve">0,15, 0,75</w:t>
+              <w:rPr>
+                <w:rFonts w:ascii="Consolas" w:cs="Consolas" w:eastAsia="Consolas" w:hAnsi="Consolas"/>
+                <w:sz w:val="20"/>
+                <w:szCs w:val="20"/>
+                <w:shd w:fill="F2F2F2" w:val="clear"/>
+              </w:rPr>
+              <w:t xml:space="preserve">True</w:t>
+            </w:r>
+            <w:r>
+              <w:t xml:space="preserve">, 0,2</w:t>
             </w:r>
           </w:p>
         </w:tc>
@@ -6308,7 +6314,19 @@
                 <w:szCs w:val="20"/>
                 <w:shd w:fill="F2F2F2" w:val="clear"/>
               </w:rPr>
-              <w:t xml:space="preserve">GIS_MATERIAL</w:t>
+              <w:t xml:space="preserve">GIS_LANGD_TOL</w:t>
+            </w:r>
+            <w:r>
+              <w:t xml:space="preserve">, </w:t>
+            </w:r>
+            <w:r>
+              <w:rPr>
+                <w:rFonts w:ascii="Consolas" w:cs="Consolas" w:eastAsia="Consolas" w:hAnsi="Consolas"/>
+                <w:sz w:val="20"/>
+                <w:szCs w:val="20"/>
+                <w:shd w:fill="F2F2F2" w:val="clear"/>
+              </w:rPr>
+              <w:t xml:space="preserve">GIS_LITTERA_LIKHET</w:t>
             </w:r>
           </w:p>
         </w:tc>
@@ -6334,7 +6352,7 @@
               <w:spacing w:after="0"/>
             </w:pPr>
             <w:r>
-              <w:t xml:space="preserve">Materialnamn i film och GIS som räknas som samma (BTG = Betong, PVC/PE/PP = Plast …).</w:t>
+              <w:t xml:space="preserve">Förslag på rätt littera för okända brunnar: en GIS-ledning från den kända brunnen med längd inom så stor andel av filmens föreslås; annars littera med minst så stor namnlikhet (0–1).</w:t>
             </w:r>
           </w:p>
         </w:tc>
@@ -6360,7 +6378,7 @@
               <w:spacing w:after="0"/>
             </w:pPr>
             <w:r>
-              <w:t xml:space="preserve">se skriptet</w:t>
+              <w:t xml:space="preserve">0,15, 0,75</w:t>
             </w:r>
           </w:p>
         </w:tc>
@@ -6393,19 +6411,7 @@
                 <w:szCs w:val="20"/>
                 <w:shd w:fill="F2F2F2" w:val="clear"/>
               </w:rPr>
-              <w:t xml:space="preserve">FOTO_MAX_PX</w:t>
-            </w:r>
-            <w:r>
-              <w:t xml:space="preserve">, </w:t>
-            </w:r>
-            <w:r>
-              <w:rPr>
-                <w:rFonts w:ascii="Consolas" w:cs="Consolas" w:eastAsia="Consolas" w:hAnsi="Consolas"/>
-                <w:sz w:val="20"/>
-                <w:szCs w:val="20"/>
-                <w:shd w:fill="F2F2F2" w:val="clear"/>
-              </w:rPr>
-              <w:t xml:space="preserve">FOTO_JPEG_KVALITET</w:t>
+              <w:t xml:space="preserve">GIS_MATERIAL</w:t>
             </w:r>
           </w:p>
         </w:tc>
@@ -6430,19 +6436,7 @@
               <w:spacing w:after="0"/>
             </w:pPr>
             <w:r>
-              <w:t xml:space="preserve">Fotona i PDF-rapporterna förminskas till högst så många pixlar på längsta sidan (JPEG-kvalitet enligt den andra; 76 ger ~30 % mindre filer än 82 utan synlig skillnad i A4). </w:t>
-            </w:r>
-            <w:r>
-              <w:rPr>
-                <w:rFonts w:ascii="Consolas" w:cs="Consolas" w:eastAsia="Consolas" w:hAnsi="Consolas"/>
-                <w:sz w:val="20"/>
-                <w:szCs w:val="20"/>
-                <w:shd w:fill="F2F2F2" w:val="clear"/>
-              </w:rPr>
-              <w:t xml:space="preserve">None</w:t>
-            </w:r>
-            <w:r>
-              <w:t xml:space="preserve"> = originalstorlek.</w:t>
+              <w:t xml:space="preserve">Materialnamn i film och GIS som räknas som samma (BTG = Betong, PVC/PE/PP = Plast …).</w:t>
             </w:r>
           </w:p>
         </w:tc>
@@ -6467,7 +6461,7 @@
               <w:spacing w:after="0"/>
             </w:pPr>
             <w:r>
-              <w:t xml:space="preserve">960, 76</w:t>
+              <w:t xml:space="preserve">se skriptet</w:t>
             </w:r>
           </w:p>
         </w:tc>
@@ -6501,7 +6495,7 @@
                 <w:szCs w:val="20"/>
                 <w:shd w:fill="F2F2F2" w:val="clear"/>
               </w:rPr>
-              <w:t xml:space="preserve">RAPPORT_BILD_DPI</w:t>
+              <w:t xml:space="preserve">FOTO_MAX_PX</w:t>
             </w:r>
             <w:r>
               <w:t xml:space="preserve">, </w:t>
@@ -6513,7 +6507,7 @@
                 <w:szCs w:val="20"/>
                 <w:shd w:fill="F2F2F2" w:val="clear"/>
               </w:rPr>
-              <w:t xml:space="preserve">RAPPORT_BILD_PALETT</w:t>
+              <w:t xml:space="preserve">FOTO_JPEG_KVALITET</w:t>
             </w:r>
           </w:p>
         </w:tc>
@@ -6539,7 +6533,19 @@
               <w:spacing w:after="0"/>
             </w:pPr>
             <w:r>
-              <w:t xml:space="preserve">Upplösning på översikts- och profilbilden i rapporten, och om de sparas som palett-PNG (256 färger, ca 65 % mindre).</w:t>
+              <w:t xml:space="preserve">Fotona i PDF-rapporterna förminskas till högst så många pixlar på längsta sidan (JPEG-kvalitet enligt den andra; 76 ger ~30 % mindre filer än 82 utan synlig skillnad i A4). </w:t>
+            </w:r>
+            <w:r>
+              <w:rPr>
+                <w:rFonts w:ascii="Consolas" w:cs="Consolas" w:eastAsia="Consolas" w:hAnsi="Consolas"/>
+                <w:sz w:val="20"/>
+                <w:szCs w:val="20"/>
+                <w:shd w:fill="F2F2F2" w:val="clear"/>
+              </w:rPr>
+              <w:t xml:space="preserve">None</w:t>
+            </w:r>
+            <w:r>
+              <w:t xml:space="preserve"> = originalstorlek.</w:t>
             </w:r>
           </w:p>
         </w:tc>
@@ -6565,16 +6571,7 @@
               <w:spacing w:after="0"/>
             </w:pPr>
             <w:r>
-              <w:t xml:space="preserve">150, </w:t>
-            </w:r>
-            <w:r>
-              <w:rPr>
-                <w:rFonts w:ascii="Consolas" w:cs="Consolas" w:eastAsia="Consolas" w:hAnsi="Consolas"/>
-                <w:sz w:val="20"/>
-                <w:szCs w:val="20"/>
-                <w:shd w:fill="F2F2F2" w:val="clear"/>
-              </w:rPr>
-              <w:t xml:space="preserve">True</w:t>
+              <w:t xml:space="preserve">960, 76</w:t>
             </w:r>
           </w:p>
         </w:tc>
@@ -6607,7 +6604,19 @@
                 <w:szCs w:val="20"/>
                 <w:shd w:fill="F2F2F2" w:val="clear"/>
               </w:rPr>
-              <w:t xml:space="preserve">RAPPORT_PROCESSER</w:t>
+              <w:t xml:space="preserve">RAPPORT_BILD_DPI</w:t>
+            </w:r>
+            <w:r>
+              <w:t xml:space="preserve">, </w:t>
+            </w:r>
+            <w:r>
+              <w:rPr>
+                <w:rFonts w:ascii="Consolas" w:cs="Consolas" w:eastAsia="Consolas" w:hAnsi="Consolas"/>
+                <w:sz w:val="20"/>
+                <w:szCs w:val="20"/>
+                <w:shd w:fill="F2F2F2" w:val="clear"/>
+              </w:rPr>
+              <w:t xml:space="preserve">RAPPORT_BILD_PALETT</w:t>
             </w:r>
           </w:p>
         </w:tc>
@@ -6632,7 +6641,32 @@
               <w:spacing w:after="0"/>
             </w:pPr>
             <w:r>
-              <w:t xml:space="preserve">Antal parallella processer för PDF-rapporterna. </w:t>
+              <w:t xml:space="preserve">Upplösning på översikts- och profilbilden i rapporten, och om de sparas som palett-PNG (256 färger, ca 65 % mindre).</w:t>
+            </w:r>
+          </w:p>
+        </w:tc>
+        <w:tc>
+          <w:tcPr>
+            <w:tcW w:type="dxa" w:w="1760"/>
+            <w:tcBorders>
+              <w:top w:val="single" w:color="BFBFBF" w:sz="4"/>
+              <w:left w:val="single" w:color="BFBFBF" w:sz="4"/>
+              <w:bottom w:val="single" w:color="BFBFBF" w:sz="4"/>
+              <w:right w:val="single" w:color="BFBFBF" w:sz="4"/>
+            </w:tcBorders>
+            <w:tcMar>
+              <w:top w:type="dxa" w:w="60"/>
+              <w:left w:type="dxa" w:w="100"/>
+              <w:bottom w:type="dxa" w:w="60"/>
+              <w:right w:type="dxa" w:w="100"/>
+            </w:tcMar>
+          </w:tcPr>
+          <w:p>
+            <w:pPr>
+              <w:spacing w:after="0"/>
+            </w:pPr>
+            <w:r>
+              <w:t xml:space="preserve">150, </w:t>
             </w:r>
             <w:r>
               <w:rPr>
@@ -6641,53 +6675,7 @@
                 <w:szCs w:val="20"/>
                 <w:shd w:fill="F2F2F2" w:val="clear"/>
               </w:rPr>
-              <w:t xml:space="preserve">None</w:t>
-            </w:r>
-            <w:r>
-              <w:t xml:space="preserve"> = antal kärnor − 1, </w:t>
-            </w:r>
-            <w:r>
-              <w:rPr>
-                <w:rFonts w:ascii="Consolas" w:cs="Consolas" w:eastAsia="Consolas" w:hAnsi="Consolas"/>
-                <w:sz w:val="20"/>
-                <w:szCs w:val="20"/>
-                <w:shd w:fill="F2F2F2" w:val="clear"/>
-              </w:rPr>
-              <w:t xml:space="preserve">1</w:t>
-            </w:r>
-            <w:r>
-              <w:t xml:space="preserve"> = en i taget.</w:t>
-            </w:r>
-          </w:p>
-        </w:tc>
-        <w:tc>
-          <w:tcPr>
-            <w:tcW w:type="dxa" w:w="1760"/>
-            <w:tcBorders>
-              <w:top w:val="single" w:color="BFBFBF" w:sz="4"/>
-              <w:left w:val="single" w:color="BFBFBF" w:sz="4"/>
-              <w:bottom w:val="single" w:color="BFBFBF" w:sz="4"/>
-              <w:right w:val="single" w:color="BFBFBF" w:sz="4"/>
-            </w:tcBorders>
-            <w:tcMar>
-              <w:top w:type="dxa" w:w="60"/>
-              <w:left w:type="dxa" w:w="100"/>
-              <w:bottom w:type="dxa" w:w="60"/>
-              <w:right w:type="dxa" w:w="100"/>
-            </w:tcMar>
-          </w:tcPr>
-          <w:p>
-            <w:pPr>
-              <w:spacing w:after="0"/>
-            </w:pPr>
-            <w:r>
-              <w:rPr>
-                <w:rFonts w:ascii="Consolas" w:cs="Consolas" w:eastAsia="Consolas" w:hAnsi="Consolas"/>
-                <w:sz w:val="20"/>
-                <w:szCs w:val="20"/>
-                <w:shd w:fill="F2F2F2" w:val="clear"/>
-              </w:rPr>
-              <w:t xml:space="preserve">None</w:t>
+              <w:t xml:space="preserve">True</w:t>
             </w:r>
           </w:p>
         </w:tc>
@@ -6721,7 +6709,7 @@
                 <w:szCs w:val="20"/>
                 <w:shd w:fill="F2F2F2" w:val="clear"/>
               </w:rPr>
-              <w:t xml:space="preserve">DOLDA_KOLUMNER</w:t>
+              <w:t xml:space="preserve">RAPPORT_PROCESSER</w:t>
             </w:r>
           </w:p>
         </w:tc>
@@ -6747,7 +6735,31 @@
               <w:spacing w:after="0"/>
             </w:pPr>
             <w:r>
-              <w:t xml:space="preserve">Kolumner per flik som döljs som standard i Excel (grupperade, fälls ut med plustecknet ovanför rubrikraden). Rubrik utan enhet. Tom lista = visa allt.</w:t>
+              <w:t xml:space="preserve">Antal parallella processer för PDF-rapporterna. </w:t>
+            </w:r>
+            <w:r>
+              <w:rPr>
+                <w:rFonts w:ascii="Consolas" w:cs="Consolas" w:eastAsia="Consolas" w:hAnsi="Consolas"/>
+                <w:sz w:val="20"/>
+                <w:szCs w:val="20"/>
+                <w:shd w:fill="F2F2F2" w:val="clear"/>
+              </w:rPr>
+              <w:t xml:space="preserve">None</w:t>
+            </w:r>
+            <w:r>
+              <w:t xml:space="preserve"> = antal kärnor − 1, </w:t>
+            </w:r>
+            <w:r>
+              <w:rPr>
+                <w:rFonts w:ascii="Consolas" w:cs="Consolas" w:eastAsia="Consolas" w:hAnsi="Consolas"/>
+                <w:sz w:val="20"/>
+                <w:szCs w:val="20"/>
+                <w:shd w:fill="F2F2F2" w:val="clear"/>
+              </w:rPr>
+              <w:t xml:space="preserve">1</w:t>
+            </w:r>
+            <w:r>
+              <w:t xml:space="preserve"> = en i taget.</w:t>
             </w:r>
           </w:p>
         </w:tc>
@@ -6773,7 +6785,13 @@
               <w:spacing w:after="0"/>
             </w:pPr>
             <w:r>
-              <w:t xml:space="preserve">se skriptet</w:t>
+              <w:rPr>
+                <w:rFonts w:ascii="Consolas" w:cs="Consolas" w:eastAsia="Consolas" w:hAnsi="Consolas"/>
+                <w:sz w:val="20"/>
+                <w:szCs w:val="20"/>
+                <w:shd w:fill="F2F2F2" w:val="clear"/>
+              </w:rPr>
+              <w:t xml:space="preserve">None</w:t>
             </w:r>
           </w:p>
         </w:tc>
@@ -6806,7 +6824,7 @@
                 <w:szCs w:val="20"/>
                 <w:shd w:fill="F2F2F2" w:val="clear"/>
               </w:rPr>
-              <w:t xml:space="preserve">OFULLSTANDIG_ANDEL</w:t>
+              <w:t xml:space="preserve">DOLDA_KOLUMNER</w:t>
             </w:r>
           </w:p>
         </w:tc>
@@ -6831,7 +6849,7 @@
               <w:spacing w:after="0"/>
             </w:pPr>
             <w:r>
-              <w:t xml:space="preserve">Är filmad längd kortare än så gånger kartlängden nådde kameran inte fram; profilen hängs då bara upp i startbrunnen.</w:t>
+              <w:t xml:space="preserve">Kolumner per flik som döljs som standard i Excel (grupperade, fälls ut med plustecknet ovanför rubrikraden). Rubrik utan enhet. Tom lista = visa allt.</w:t>
             </w:r>
           </w:p>
         </w:tc>
@@ -6856,7 +6874,7 @@
               <w:spacing w:after="0"/>
             </w:pPr>
             <w:r>
-              <w:t xml:space="preserve">0,85</w:t>
+              <w:t xml:space="preserve">se skriptet</w:t>
             </w:r>
           </w:p>
         </w:tc>
@@ -6890,7 +6908,7 @@
                 <w:szCs w:val="20"/>
                 <w:shd w:fill="F2F2F2" w:val="clear"/>
               </w:rPr>
-              <w:t xml:space="preserve">KODER</w:t>
+              <w:t xml:space="preserve">OFULLSTANDIG_ANDEL</w:t>
             </w:r>
           </w:p>
         </w:tc>
@@ -6916,7 +6934,7 @@
               <w:spacing w:after="0"/>
             </w:pPr>
             <w:r>
-              <w:t xml:space="preserve">Skadekoder med klartext och typ (K = konstruktion, D = drift, I = information).</w:t>
+              <w:t xml:space="preserve">Är filmad längd kortare än så gånger kartlängden nådde kameran inte fram; profilen hängs då bara upp i startbrunnen.</w:t>
             </w:r>
           </w:p>
         </w:tc>
@@ -6942,7 +6960,7 @@
               <w:spacing w:after="0"/>
             </w:pPr>
             <w:r>
-              <w:t xml:space="preserve">P93</w:t>
+              <w:t xml:space="preserve">0,85</w:t>
             </w:r>
           </w:p>
         </w:tc>
@@ -6975,6 +6993,90 @@
                 <w:szCs w:val="20"/>
                 <w:shd w:fill="F2F2F2" w:val="clear"/>
               </w:rPr>
+              <w:t xml:space="preserve">KODER</w:t>
+            </w:r>
+          </w:p>
+        </w:tc>
+        <w:tc>
+          <w:tcPr>
+            <w:tcW w:type="dxa" w:w="5000"/>
+            <w:tcBorders>
+              <w:top w:val="single" w:color="BFBFBF" w:sz="4"/>
+              <w:left w:val="single" w:color="BFBFBF" w:sz="4"/>
+              <w:bottom w:val="single" w:color="BFBFBF" w:sz="4"/>
+              <w:right w:val="single" w:color="BFBFBF" w:sz="4"/>
+            </w:tcBorders>
+            <w:tcMar>
+              <w:top w:type="dxa" w:w="60"/>
+              <w:left w:type="dxa" w:w="100"/>
+              <w:bottom w:type="dxa" w:w="60"/>
+              <w:right w:type="dxa" w:w="100"/>
+            </w:tcMar>
+          </w:tcPr>
+          <w:p>
+            <w:pPr>
+              <w:spacing w:after="0"/>
+            </w:pPr>
+            <w:r>
+              <w:t xml:space="preserve">Skadekoder med klartext och typ (K = konstruktion, D = drift, I = information).</w:t>
+            </w:r>
+          </w:p>
+        </w:tc>
+        <w:tc>
+          <w:tcPr>
+            <w:tcW w:type="dxa" w:w="1760"/>
+            <w:tcBorders>
+              <w:top w:val="single" w:color="BFBFBF" w:sz="4"/>
+              <w:left w:val="single" w:color="BFBFBF" w:sz="4"/>
+              <w:bottom w:val="single" w:color="BFBFBF" w:sz="4"/>
+              <w:right w:val="single" w:color="BFBFBF" w:sz="4"/>
+            </w:tcBorders>
+            <w:tcMar>
+              <w:top w:type="dxa" w:w="60"/>
+              <w:left w:type="dxa" w:w="100"/>
+              <w:bottom w:type="dxa" w:w="60"/>
+              <w:right w:type="dxa" w:w="100"/>
+            </w:tcMar>
+          </w:tcPr>
+          <w:p>
+            <w:pPr>
+              <w:spacing w:after="0"/>
+            </w:pPr>
+            <w:r>
+              <w:t xml:space="preserve">P93</w:t>
+            </w:r>
+          </w:p>
+        </w:tc>
+      </w:tr>
+      <w:tr>
+        <w:tc>
+          <w:tcPr>
+            <w:tcW w:type="dxa" w:w="2600"/>
+            <w:tcBorders>
+              <w:top w:val="single" w:color="BFBFBF" w:sz="4"/>
+              <w:left w:val="single" w:color="BFBFBF" w:sz="4"/>
+              <w:bottom w:val="single" w:color="BFBFBF" w:sz="4"/>
+              <w:right w:val="single" w:color="BFBFBF" w:sz="4"/>
+            </w:tcBorders>
+            <w:shd w:fill="F7F9FC" w:val="clear"/>
+            <w:tcMar>
+              <w:top w:type="dxa" w:w="60"/>
+              <w:left w:type="dxa" w:w="100"/>
+              <w:bottom w:type="dxa" w:w="60"/>
+              <w:right w:type="dxa" w:w="100"/>
+            </w:tcMar>
+          </w:tcPr>
+          <w:p>
+            <w:pPr>
+              <w:spacing w:after="0"/>
+            </w:pPr>
+            <w:r>
+              <w:rPr>
+                <w:rFonts w:ascii="Consolas" w:cs="Consolas" w:eastAsia="Consolas" w:hAnsi="Consolas"/>
+                <w:sz w:val="20"/>
+                <w:szCs w:val="20"/>
+                <w:shd w:fill="F2F2F2" w:val="clear"/>
+              </w:rPr>
               <w:t xml:space="preserve">ATTRIBUT</w:t>
             </w:r>
             <w:r>
@@ -7000,6 +7102,7 @@
               <w:bottom w:val="single" w:color="BFBFBF" w:sz="4"/>
               <w:right w:val="single" w:color="BFBFBF" w:sz="4"/>
             </w:tcBorders>
+            <w:shd w:fill="F7F9FC" w:val="clear"/>
             <w:tcMar>
               <w:top w:type="dxa" w:w="60"/>
               <w:left w:type="dxa" w:w="100"/>
@@ -7025,6 +7128,7 @@
               <w:bottom w:val="single" w:color="BFBFBF" w:sz="4"/>
               <w:right w:val="single" w:color="BFBFBF" w:sz="4"/>
             </w:tcBorders>
+            <w:shd w:fill="F7F9FC" w:val="clear"/>
             <w:tcMar>
               <w:top w:type="dxa" w:w="60"/>
               <w:left w:type="dxa" w:w="100"/>
@@ -11539,6 +11643,50 @@
       </w:r>
       <w:r>
         <w:t xml:space="preserve"> i KONFIG) kontrolleras inte.</w:t>
+      </w:r>
+    </w:p>
+    <w:p>
+      <w:pPr>
+        <w:pStyle w:val="ListParagraph"/>
+        <w:numPr>
+          <w:ilvl w:val="0"/>
+          <w:numId w:val="3"/>
+        </w:numPr>
+        <w:spacing w:after="80"/>
+      </w:pPr>
+      <w:r>
+        <w:rPr>
+          <w:b/>
+          <w:bCs/>
+        </w:rPr>
+        <w:t xml:space="preserve">GIS: ledningen består av BTG 225 10,0 m + PVC 225 8,9 m (skarv utan brunn)</w:t>
+      </w:r>
+      <w:r>
+        <w:t xml:space="preserve"> – ledningen är uppdelad i flera objekt i kartan utan brunn i skarven (materialbyte, dimensionsbyte). Delarna fogas ihop vid inläsningen av </w:t>
+      </w:r>
+      <w:r>
+        <w:rPr>
+          <w:rFonts w:ascii="Consolas" w:cs="Consolas" w:eastAsia="Consolas" w:hAnsi="Consolas"/>
+          <w:sz w:val="20"/>
+          <w:szCs w:val="20"/>
+          <w:shd w:fill="F2F2F2" w:val="clear"/>
+        </w:rPr>
+        <w:t xml:space="preserve">gisdata.json</w:t>
+      </w:r>
+      <w:r>
+        <w:t xml:space="preserve"> när deras fria ändar ligger inom exportens tolerans från varandra (</w:t>
+      </w:r>
+      <w:r>
+        <w:rPr>
+          <w:rFonts w:ascii="Consolas" w:cs="Consolas" w:eastAsia="Consolas" w:hAnsi="Consolas"/>
+          <w:sz w:val="20"/>
+          <w:szCs w:val="20"/>
+          <w:shd w:fill="F2F2F2" w:val="clear"/>
+        </w:rPr>
+        <w:t xml:space="preserve">GIS_SKARV_TOL_M</w:t>
+      </w:r>
+      <w:r>
+        <w:t xml:space="preserve">), oavsett antal delar och ritriktning; längden summeras och vattengången tas i brunnarna. Flaggan visas bara när delarna skiljer sig i material eller dimension. Tre ändar på samma ställe är en förgrening och fogas inte.</w:t>
       </w:r>
     </w:p>
     <w:p>

</xml_diff>

<commit_message>
Delfilmer i en sammanslagning redovisas bara genom den sammanslagna sträckan
KONFIG DELFILMER_SEPARAT (False): delfilmerna listas inte längre separat i
Prioritering, Observationer tar den sammanslagna sträckans observationer, inga
egna protokoll skrivs och gamla delfilmsprotokoll tas bort. Ersatta filmer
ligger kvar som förut. Handledning och CLAUDE.md uppdaterade.

Co-Authored-By: Claude Fable 5.1 <noreply@anthropic.com>
Claude-Session: https://claude.ai/code/session_011fdqX3JEZje1LF9LqpaqR8
</commit_message>
<xml_diff>
--- a/Anvandarhandledning tv3_analys.docx
+++ b/Anvandarhandledning tv3_analys.docx
@@ -6209,11 +6209,30 @@
                 <w:szCs w:val="20"/>
                 <w:shd w:fill="F2F2F2" w:val="clear"/>
               </w:rPr>
-              <w:t xml:space="preserve">OMFILMNING_OVER_FILER</w:t>
-            </w:r>
-            <w:r>
-              <w:t xml:space="preserve">, </w:t>
-            </w:r>
+              <w:t xml:space="preserve">DELFILMER_SEPARAT</w:t>
+            </w:r>
+          </w:p>
+        </w:tc>
+        <w:tc>
+          <w:tcPr>
+            <w:tcW w:type="dxa" w:w="5000"/>
+            <w:tcBorders>
+              <w:top w:val="single" w:color="BFBFBF" w:sz="4"/>
+              <w:left w:val="single" w:color="BFBFBF" w:sz="4"/>
+              <w:bottom w:val="single" w:color="BFBFBF" w:sz="4"/>
+              <w:right w:val="single" w:color="BFBFBF" w:sz="4"/>
+            </w:tcBorders>
+            <w:tcMar>
+              <w:top w:type="dxa" w:w="60"/>
+              <w:left w:type="dxa" w:w="100"/>
+              <w:bottom w:type="dxa" w:w="60"/>
+              <w:right w:type="dxa" w:w="100"/>
+            </w:tcMar>
+          </w:tcPr>
+          <w:p>
+            <w:pPr>
+              <w:spacing w:after="0"/>
+            </w:pPr>
             <w:r>
               <w:rPr>
                 <w:rFonts w:ascii="Consolas" w:cs="Consolas" w:eastAsia="Consolas" w:hAnsi="Consolas"/>
@@ -6221,32 +6240,10 @@
                 <w:szCs w:val="20"/>
                 <w:shd w:fill="F2F2F2" w:val="clear"/>
               </w:rPr>
-              <w:t xml:space="preserve">TIDIGARE_INDEX_ANDEL</w:t>
-            </w:r>
-          </w:p>
-        </w:tc>
-        <w:tc>
-          <w:tcPr>
-            <w:tcW w:type="dxa" w:w="5000"/>
-            <w:tcBorders>
-              <w:top w:val="single" w:color="BFBFBF" w:sz="4"/>
-              <w:left w:val="single" w:color="BFBFBF" w:sz="4"/>
-              <w:bottom w:val="single" w:color="BFBFBF" w:sz="4"/>
-              <w:right w:val="single" w:color="BFBFBF" w:sz="4"/>
-            </w:tcBorders>
-            <w:tcMar>
-              <w:top w:type="dxa" w:w="60"/>
-              <w:left w:type="dxa" w:w="100"/>
-              <w:bottom w:type="dxa" w:w="60"/>
-              <w:right w:type="dxa" w:w="100"/>
-            </w:tcMar>
-          </w:tcPr>
-          <w:p>
-            <w:pPr>
-              <w:spacing w:after="0"/>
-            </w:pPr>
-            <w:r>
-              <w:t xml:space="preserve">Samma brunnspar i olika TV3-filer (olika inspektionsomgångar): den nyaste filmen gäller, äldre markeras *ersatt av ny inspektion* och den gällande får kolumnen Tidigare inspektion (klass och konstruktionsindex då → nu). Inom samma klass räknas sträckan som förvärrad/förbättrad när indexet ändrats mer än andelen (och minst 5 p/100 m).</w:t>
+              <w:t xml:space="preserve">True</w:t>
+            </w:r>
+            <w:r>
+              <w:t xml:space="preserve"> listar delfilmerna i en sammanslagning även var för sig i Prioritering och Observationer och ger dem egna protokoll.</w:t>
             </w:r>
           </w:p>
         </w:tc>
@@ -6277,10 +6274,7 @@
                 <w:szCs w:val="20"/>
                 <w:shd w:fill="F2F2F2" w:val="clear"/>
               </w:rPr>
-              <w:t xml:space="preserve">True</w:t>
-            </w:r>
-            <w:r>
-              <w:t xml:space="preserve">, 0,2</w:t>
+              <w:t xml:space="preserve">False</w:t>
             </w:r>
           </w:p>
         </w:tc>
@@ -6314,7 +6308,7 @@
                 <w:szCs w:val="20"/>
                 <w:shd w:fill="F2F2F2" w:val="clear"/>
               </w:rPr>
-              <w:t xml:space="preserve">GIS_LANGD_TOL</w:t>
+              <w:t xml:space="preserve">OMFILMNING_OVER_FILER</w:t>
             </w:r>
             <w:r>
               <w:t xml:space="preserve">, </w:t>
@@ -6326,7 +6320,7 @@
                 <w:szCs w:val="20"/>
                 <w:shd w:fill="F2F2F2" w:val="clear"/>
               </w:rPr>
-              <w:t xml:space="preserve">GIS_LITTERA_LIKHET</w:t>
+              <w:t xml:space="preserve">TIDIGARE_INDEX_ANDEL</w:t>
             </w:r>
           </w:p>
         </w:tc>
@@ -6352,7 +6346,7 @@
               <w:spacing w:after="0"/>
             </w:pPr>
             <w:r>
-              <w:t xml:space="preserve">Förslag på rätt littera för okända brunnar: en GIS-ledning från den kända brunnen med längd inom så stor andel av filmens föreslås; annars littera med minst så stor namnlikhet (0–1).</w:t>
+              <w:t xml:space="preserve">Samma brunnspar i olika TV3-filer (olika inspektionsomgångar): den nyaste filmen gäller, äldre markeras *ersatt av ny inspektion* och den gällande får kolumnen Tidigare inspektion (klass och konstruktionsindex då → nu). Inom samma klass räknas sträckan som förvärrad/förbättrad när indexet ändrats mer än andelen (och minst 5 p/100 m).</w:t>
             </w:r>
           </w:p>
         </w:tc>
@@ -6378,7 +6372,16 @@
               <w:spacing w:after="0"/>
             </w:pPr>
             <w:r>
-              <w:t xml:space="preserve">0,15, 0,75</w:t>
+              <w:rPr>
+                <w:rFonts w:ascii="Consolas" w:cs="Consolas" w:eastAsia="Consolas" w:hAnsi="Consolas"/>
+                <w:sz w:val="20"/>
+                <w:szCs w:val="20"/>
+                <w:shd w:fill="F2F2F2" w:val="clear"/>
+              </w:rPr>
+              <w:t xml:space="preserve">True</w:t>
+            </w:r>
+            <w:r>
+              <w:t xml:space="preserve">, 0,2</w:t>
             </w:r>
           </w:p>
         </w:tc>
@@ -6411,7 +6414,19 @@
                 <w:szCs w:val="20"/>
                 <w:shd w:fill="F2F2F2" w:val="clear"/>
               </w:rPr>
-              <w:t xml:space="preserve">GIS_MATERIAL</w:t>
+              <w:t xml:space="preserve">GIS_LANGD_TOL</w:t>
+            </w:r>
+            <w:r>
+              <w:t xml:space="preserve">, </w:t>
+            </w:r>
+            <w:r>
+              <w:rPr>
+                <w:rFonts w:ascii="Consolas" w:cs="Consolas" w:eastAsia="Consolas" w:hAnsi="Consolas"/>
+                <w:sz w:val="20"/>
+                <w:szCs w:val="20"/>
+                <w:shd w:fill="F2F2F2" w:val="clear"/>
+              </w:rPr>
+              <w:t xml:space="preserve">GIS_LITTERA_LIKHET</w:t>
             </w:r>
           </w:p>
         </w:tc>
@@ -6436,7 +6451,7 @@
               <w:spacing w:after="0"/>
             </w:pPr>
             <w:r>
-              <w:t xml:space="preserve">Materialnamn i film och GIS som räknas som samma (BTG = Betong, PVC/PE/PP = Plast …).</w:t>
+              <w:t xml:space="preserve">Förslag på rätt littera för okända brunnar: en GIS-ledning från den kända brunnen med längd inom så stor andel av filmens föreslås; annars littera med minst så stor namnlikhet (0–1).</w:t>
             </w:r>
           </w:p>
         </w:tc>
@@ -6461,7 +6476,7 @@
               <w:spacing w:after="0"/>
             </w:pPr>
             <w:r>
-              <w:t xml:space="preserve">se skriptet</w:t>
+              <w:t xml:space="preserve">0,15, 0,75</w:t>
             </w:r>
           </w:p>
         </w:tc>
@@ -6495,19 +6510,7 @@
                 <w:szCs w:val="20"/>
                 <w:shd w:fill="F2F2F2" w:val="clear"/>
               </w:rPr>
-              <w:t xml:space="preserve">FOTO_MAX_PX</w:t>
-            </w:r>
-            <w:r>
-              <w:t xml:space="preserve">, </w:t>
-            </w:r>
-            <w:r>
-              <w:rPr>
-                <w:rFonts w:ascii="Consolas" w:cs="Consolas" w:eastAsia="Consolas" w:hAnsi="Consolas"/>
-                <w:sz w:val="20"/>
-                <w:szCs w:val="20"/>
-                <w:shd w:fill="F2F2F2" w:val="clear"/>
-              </w:rPr>
-              <w:t xml:space="preserve">FOTO_JPEG_KVALITET</w:t>
+              <w:t xml:space="preserve">GIS_MATERIAL</w:t>
             </w:r>
           </w:p>
         </w:tc>
@@ -6533,19 +6536,7 @@
               <w:spacing w:after="0"/>
             </w:pPr>
             <w:r>
-              <w:t xml:space="preserve">Fotona i PDF-rapporterna förminskas till högst så många pixlar på längsta sidan (JPEG-kvalitet enligt den andra; 76 ger ~30 % mindre filer än 82 utan synlig skillnad i A4). </w:t>
-            </w:r>
-            <w:r>
-              <w:rPr>
-                <w:rFonts w:ascii="Consolas" w:cs="Consolas" w:eastAsia="Consolas" w:hAnsi="Consolas"/>
-                <w:sz w:val="20"/>
-                <w:szCs w:val="20"/>
-                <w:shd w:fill="F2F2F2" w:val="clear"/>
-              </w:rPr>
-              <w:t xml:space="preserve">None</w:t>
-            </w:r>
-            <w:r>
-              <w:t xml:space="preserve"> = originalstorlek.</w:t>
+              <w:t xml:space="preserve">Materialnamn i film och GIS som räknas som samma (BTG = Betong, PVC/PE/PP = Plast …).</w:t>
             </w:r>
           </w:p>
         </w:tc>
@@ -6571,7 +6562,7 @@
               <w:spacing w:after="0"/>
             </w:pPr>
             <w:r>
-              <w:t xml:space="preserve">960, 76</w:t>
+              <w:t xml:space="preserve">se skriptet</w:t>
             </w:r>
           </w:p>
         </w:tc>
@@ -6604,7 +6595,7 @@
                 <w:szCs w:val="20"/>
                 <w:shd w:fill="F2F2F2" w:val="clear"/>
               </w:rPr>
-              <w:t xml:space="preserve">RAPPORT_BILD_DPI</w:t>
+              <w:t xml:space="preserve">FOTO_MAX_PX</w:t>
             </w:r>
             <w:r>
               <w:t xml:space="preserve">, </w:t>
@@ -6616,7 +6607,7 @@
                 <w:szCs w:val="20"/>
                 <w:shd w:fill="F2F2F2" w:val="clear"/>
               </w:rPr>
-              <w:t xml:space="preserve">RAPPORT_BILD_PALETT</w:t>
+              <w:t xml:space="preserve">FOTO_JPEG_KVALITET</w:t>
             </w:r>
           </w:p>
         </w:tc>
@@ -6641,7 +6632,19 @@
               <w:spacing w:after="0"/>
             </w:pPr>
             <w:r>
-              <w:t xml:space="preserve">Upplösning på översikts- och profilbilden i rapporten, och om de sparas som palett-PNG (256 färger, ca 65 % mindre).</w:t>
+              <w:t xml:space="preserve">Fotona i PDF-rapporterna förminskas till högst så många pixlar på längsta sidan (JPEG-kvalitet enligt den andra; 76 ger ~30 % mindre filer än 82 utan synlig skillnad i A4). </w:t>
+            </w:r>
+            <w:r>
+              <w:rPr>
+                <w:rFonts w:ascii="Consolas" w:cs="Consolas" w:eastAsia="Consolas" w:hAnsi="Consolas"/>
+                <w:sz w:val="20"/>
+                <w:szCs w:val="20"/>
+                <w:shd w:fill="F2F2F2" w:val="clear"/>
+              </w:rPr>
+              <w:t xml:space="preserve">None</w:t>
+            </w:r>
+            <w:r>
+              <w:t xml:space="preserve"> = originalstorlek.</w:t>
             </w:r>
           </w:p>
         </w:tc>
@@ -6666,16 +6669,7 @@
               <w:spacing w:after="0"/>
             </w:pPr>
             <w:r>
-              <w:t xml:space="preserve">150, </w:t>
-            </w:r>
-            <w:r>
-              <w:rPr>
-                <w:rFonts w:ascii="Consolas" w:cs="Consolas" w:eastAsia="Consolas" w:hAnsi="Consolas"/>
-                <w:sz w:val="20"/>
-                <w:szCs w:val="20"/>
-                <w:shd w:fill="F2F2F2" w:val="clear"/>
-              </w:rPr>
-              <w:t xml:space="preserve">True</w:t>
+              <w:t xml:space="preserve">960, 76</w:t>
             </w:r>
           </w:p>
         </w:tc>
@@ -6709,7 +6703,19 @@
                 <w:szCs w:val="20"/>
                 <w:shd w:fill="F2F2F2" w:val="clear"/>
               </w:rPr>
-              <w:t xml:space="preserve">RAPPORT_PROCESSER</w:t>
+              <w:t xml:space="preserve">RAPPORT_BILD_DPI</w:t>
+            </w:r>
+            <w:r>
+              <w:t xml:space="preserve">, </w:t>
+            </w:r>
+            <w:r>
+              <w:rPr>
+                <w:rFonts w:ascii="Consolas" w:cs="Consolas" w:eastAsia="Consolas" w:hAnsi="Consolas"/>
+                <w:sz w:val="20"/>
+                <w:szCs w:val="20"/>
+                <w:shd w:fill="F2F2F2" w:val="clear"/>
+              </w:rPr>
+              <w:t xml:space="preserve">RAPPORT_BILD_PALETT</w:t>
             </w:r>
           </w:p>
         </w:tc>
@@ -6735,7 +6741,33 @@
               <w:spacing w:after="0"/>
             </w:pPr>
             <w:r>
-              <w:t xml:space="preserve">Antal parallella processer för PDF-rapporterna. </w:t>
+              <w:t xml:space="preserve">Upplösning på översikts- och profilbilden i rapporten, och om de sparas som palett-PNG (256 färger, ca 65 % mindre).</w:t>
+            </w:r>
+          </w:p>
+        </w:tc>
+        <w:tc>
+          <w:tcPr>
+            <w:tcW w:type="dxa" w:w="1760"/>
+            <w:tcBorders>
+              <w:top w:val="single" w:color="BFBFBF" w:sz="4"/>
+              <w:left w:val="single" w:color="BFBFBF" w:sz="4"/>
+              <w:bottom w:val="single" w:color="BFBFBF" w:sz="4"/>
+              <w:right w:val="single" w:color="BFBFBF" w:sz="4"/>
+            </w:tcBorders>
+            <w:shd w:fill="F7F9FC" w:val="clear"/>
+            <w:tcMar>
+              <w:top w:type="dxa" w:w="60"/>
+              <w:left w:type="dxa" w:w="100"/>
+              <w:bottom w:type="dxa" w:w="60"/>
+              <w:right w:type="dxa" w:w="100"/>
+            </w:tcMar>
+          </w:tcPr>
+          <w:p>
+            <w:pPr>
+              <w:spacing w:after="0"/>
+            </w:pPr>
+            <w:r>
+              <w:t xml:space="preserve">150, </w:t>
             </w:r>
             <w:r>
               <w:rPr>
@@ -6744,54 +6776,7 @@
                 <w:szCs w:val="20"/>
                 <w:shd w:fill="F2F2F2" w:val="clear"/>
               </w:rPr>
-              <w:t xml:space="preserve">None</w:t>
-            </w:r>
-            <w:r>
-              <w:t xml:space="preserve"> = antal kärnor − 1, </w:t>
-            </w:r>
-            <w:r>
-              <w:rPr>
-                <w:rFonts w:ascii="Consolas" w:cs="Consolas" w:eastAsia="Consolas" w:hAnsi="Consolas"/>
-                <w:sz w:val="20"/>
-                <w:szCs w:val="20"/>
-                <w:shd w:fill="F2F2F2" w:val="clear"/>
-              </w:rPr>
-              <w:t xml:space="preserve">1</w:t>
-            </w:r>
-            <w:r>
-              <w:t xml:space="preserve"> = en i taget.</w:t>
-            </w:r>
-          </w:p>
-        </w:tc>
-        <w:tc>
-          <w:tcPr>
-            <w:tcW w:type="dxa" w:w="1760"/>
-            <w:tcBorders>
-              <w:top w:val="single" w:color="BFBFBF" w:sz="4"/>
-              <w:left w:val="single" w:color="BFBFBF" w:sz="4"/>
-              <w:bottom w:val="single" w:color="BFBFBF" w:sz="4"/>
-              <w:right w:val="single" w:color="BFBFBF" w:sz="4"/>
-            </w:tcBorders>
-            <w:shd w:fill="F7F9FC" w:val="clear"/>
-            <w:tcMar>
-              <w:top w:type="dxa" w:w="60"/>
-              <w:left w:type="dxa" w:w="100"/>
-              <w:bottom w:type="dxa" w:w="60"/>
-              <w:right w:type="dxa" w:w="100"/>
-            </w:tcMar>
-          </w:tcPr>
-          <w:p>
-            <w:pPr>
-              <w:spacing w:after="0"/>
-            </w:pPr>
-            <w:r>
-              <w:rPr>
-                <w:rFonts w:ascii="Consolas" w:cs="Consolas" w:eastAsia="Consolas" w:hAnsi="Consolas"/>
-                <w:sz w:val="20"/>
-                <w:szCs w:val="20"/>
-                <w:shd w:fill="F2F2F2" w:val="clear"/>
-              </w:rPr>
-              <w:t xml:space="preserve">None</w:t>
+              <w:t xml:space="preserve">True</w:t>
             </w:r>
           </w:p>
         </w:tc>
@@ -6824,7 +6809,7 @@
                 <w:szCs w:val="20"/>
                 <w:shd w:fill="F2F2F2" w:val="clear"/>
               </w:rPr>
-              <w:t xml:space="preserve">DOLDA_KOLUMNER</w:t>
+              <w:t xml:space="preserve">RAPPORT_PROCESSER</w:t>
             </w:r>
           </w:p>
         </w:tc>
@@ -6849,7 +6834,31 @@
               <w:spacing w:after="0"/>
             </w:pPr>
             <w:r>
-              <w:t xml:space="preserve">Kolumner per flik som döljs som standard i Excel (grupperade, fälls ut med plustecknet ovanför rubrikraden). Rubrik utan enhet. Tom lista = visa allt.</w:t>
+              <w:t xml:space="preserve">Antal parallella processer för PDF-rapporterna. </w:t>
+            </w:r>
+            <w:r>
+              <w:rPr>
+                <w:rFonts w:ascii="Consolas" w:cs="Consolas" w:eastAsia="Consolas" w:hAnsi="Consolas"/>
+                <w:sz w:val="20"/>
+                <w:szCs w:val="20"/>
+                <w:shd w:fill="F2F2F2" w:val="clear"/>
+              </w:rPr>
+              <w:t xml:space="preserve">None</w:t>
+            </w:r>
+            <w:r>
+              <w:t xml:space="preserve"> = antal kärnor − 1, </w:t>
+            </w:r>
+            <w:r>
+              <w:rPr>
+                <w:rFonts w:ascii="Consolas" w:cs="Consolas" w:eastAsia="Consolas" w:hAnsi="Consolas"/>
+                <w:sz w:val="20"/>
+                <w:szCs w:val="20"/>
+                <w:shd w:fill="F2F2F2" w:val="clear"/>
+              </w:rPr>
+              <w:t xml:space="preserve">1</w:t>
+            </w:r>
+            <w:r>
+              <w:t xml:space="preserve"> = en i taget.</w:t>
             </w:r>
           </w:p>
         </w:tc>
@@ -6874,7 +6883,13 @@
               <w:spacing w:after="0"/>
             </w:pPr>
             <w:r>
-              <w:t xml:space="preserve">se skriptet</w:t>
+              <w:rPr>
+                <w:rFonts w:ascii="Consolas" w:cs="Consolas" w:eastAsia="Consolas" w:hAnsi="Consolas"/>
+                <w:sz w:val="20"/>
+                <w:szCs w:val="20"/>
+                <w:shd w:fill="F2F2F2" w:val="clear"/>
+              </w:rPr>
+              <w:t xml:space="preserve">None</w:t>
             </w:r>
           </w:p>
         </w:tc>
@@ -6908,7 +6923,7 @@
                 <w:szCs w:val="20"/>
                 <w:shd w:fill="F2F2F2" w:val="clear"/>
               </w:rPr>
-              <w:t xml:space="preserve">OFULLSTANDIG_ANDEL</w:t>
+              <w:t xml:space="preserve">DOLDA_KOLUMNER</w:t>
             </w:r>
           </w:p>
         </w:tc>
@@ -6934,7 +6949,7 @@
               <w:spacing w:after="0"/>
             </w:pPr>
             <w:r>
-              <w:t xml:space="preserve">Är filmad längd kortare än så gånger kartlängden nådde kameran inte fram; profilen hängs då bara upp i startbrunnen.</w:t>
+              <w:t xml:space="preserve">Kolumner per flik som döljs som standard i Excel (grupperade, fälls ut med plustecknet ovanför rubrikraden). Rubrik utan enhet. Tom lista = visa allt.</w:t>
             </w:r>
           </w:p>
         </w:tc>
@@ -6960,7 +6975,7 @@
               <w:spacing w:after="0"/>
             </w:pPr>
             <w:r>
-              <w:t xml:space="preserve">0,85</w:t>
+              <w:t xml:space="preserve">se skriptet</w:t>
             </w:r>
           </w:p>
         </w:tc>
@@ -6993,7 +7008,7 @@
                 <w:szCs w:val="20"/>
                 <w:shd w:fill="F2F2F2" w:val="clear"/>
               </w:rPr>
-              <w:t xml:space="preserve">KODER</w:t>
+              <w:t xml:space="preserve">OFULLSTANDIG_ANDEL</w:t>
             </w:r>
           </w:p>
         </w:tc>
@@ -7018,7 +7033,7 @@
               <w:spacing w:after="0"/>
             </w:pPr>
             <w:r>
-              <w:t xml:space="preserve">Skadekoder med klartext och typ (K = konstruktion, D = drift, I = information).</w:t>
+              <w:t xml:space="preserve">Är filmad längd kortare än så gånger kartlängden nådde kameran inte fram; profilen hängs då bara upp i startbrunnen.</w:t>
             </w:r>
           </w:p>
         </w:tc>
@@ -7043,7 +7058,7 @@
               <w:spacing w:after="0"/>
             </w:pPr>
             <w:r>
-              <w:t xml:space="preserve">P93</w:t>
+              <w:t xml:space="preserve">0,85</w:t>
             </w:r>
           </w:p>
         </w:tc>
@@ -7077,6 +7092,91 @@
                 <w:szCs w:val="20"/>
                 <w:shd w:fill="F2F2F2" w:val="clear"/>
               </w:rPr>
+              <w:t xml:space="preserve">KODER</w:t>
+            </w:r>
+          </w:p>
+        </w:tc>
+        <w:tc>
+          <w:tcPr>
+            <w:tcW w:type="dxa" w:w="5000"/>
+            <w:tcBorders>
+              <w:top w:val="single" w:color="BFBFBF" w:sz="4"/>
+              <w:left w:val="single" w:color="BFBFBF" w:sz="4"/>
+              <w:bottom w:val="single" w:color="BFBFBF" w:sz="4"/>
+              <w:right w:val="single" w:color="BFBFBF" w:sz="4"/>
+            </w:tcBorders>
+            <w:shd w:fill="F7F9FC" w:val="clear"/>
+            <w:tcMar>
+              <w:top w:type="dxa" w:w="60"/>
+              <w:left w:type="dxa" w:w="100"/>
+              <w:bottom w:type="dxa" w:w="60"/>
+              <w:right w:type="dxa" w:w="100"/>
+            </w:tcMar>
+          </w:tcPr>
+          <w:p>
+            <w:pPr>
+              <w:spacing w:after="0"/>
+            </w:pPr>
+            <w:r>
+              <w:t xml:space="preserve">Skadekoder med klartext och typ (K = konstruktion, D = drift, I = information).</w:t>
+            </w:r>
+          </w:p>
+        </w:tc>
+        <w:tc>
+          <w:tcPr>
+            <w:tcW w:type="dxa" w:w="1760"/>
+            <w:tcBorders>
+              <w:top w:val="single" w:color="BFBFBF" w:sz="4"/>
+              <w:left w:val="single" w:color="BFBFBF" w:sz="4"/>
+              <w:bottom w:val="single" w:color="BFBFBF" w:sz="4"/>
+              <w:right w:val="single" w:color="BFBFBF" w:sz="4"/>
+            </w:tcBorders>
+            <w:shd w:fill="F7F9FC" w:val="clear"/>
+            <w:tcMar>
+              <w:top w:type="dxa" w:w="60"/>
+              <w:left w:type="dxa" w:w="100"/>
+              <w:bottom w:type="dxa" w:w="60"/>
+              <w:right w:type="dxa" w:w="100"/>
+            </w:tcMar>
+          </w:tcPr>
+          <w:p>
+            <w:pPr>
+              <w:spacing w:after="0"/>
+            </w:pPr>
+            <w:r>
+              <w:t xml:space="preserve">P93</w:t>
+            </w:r>
+          </w:p>
+        </w:tc>
+      </w:tr>
+      <w:tr>
+        <w:tc>
+          <w:tcPr>
+            <w:tcW w:type="dxa" w:w="2600"/>
+            <w:tcBorders>
+              <w:top w:val="single" w:color="BFBFBF" w:sz="4"/>
+              <w:left w:val="single" w:color="BFBFBF" w:sz="4"/>
+              <w:bottom w:val="single" w:color="BFBFBF" w:sz="4"/>
+              <w:right w:val="single" w:color="BFBFBF" w:sz="4"/>
+            </w:tcBorders>
+            <w:tcMar>
+              <w:top w:type="dxa" w:w="60"/>
+              <w:left w:type="dxa" w:w="100"/>
+              <w:bottom w:type="dxa" w:w="60"/>
+              <w:right w:type="dxa" w:w="100"/>
+            </w:tcMar>
+          </w:tcPr>
+          <w:p>
+            <w:pPr>
+              <w:spacing w:after="0"/>
+            </w:pPr>
+            <w:r>
+              <w:rPr>
+                <w:rFonts w:ascii="Consolas" w:cs="Consolas" w:eastAsia="Consolas" w:hAnsi="Consolas"/>
+                <w:sz w:val="20"/>
+                <w:szCs w:val="20"/>
+                <w:shd w:fill="F2F2F2" w:val="clear"/>
+              </w:rPr>
               <w:t xml:space="preserve">ATTRIBUT</w:t>
             </w:r>
             <w:r>
@@ -7102,7 +7202,6 @@
               <w:bottom w:val="single" w:color="BFBFBF" w:sz="4"/>
               <w:right w:val="single" w:color="BFBFBF" w:sz="4"/>
             </w:tcBorders>
-            <w:shd w:fill="F7F9FC" w:val="clear"/>
             <w:tcMar>
               <w:top w:type="dxa" w:w="60"/>
               <w:left w:type="dxa" w:w="100"/>
@@ -7128,7 +7227,6 @@
               <w:bottom w:val="single" w:color="BFBFBF" w:sz="4"/>
               <w:right w:val="single" w:color="BFBFBF" w:sz="4"/>
             </w:tcBorders>
-            <w:shd w:fill="F7F9FC" w:val="clear"/>
             <w:tcMar>
               <w:top w:type="dxa" w:w="60"/>
               <w:left w:type="dxa" w:w="100"/>
@@ -12143,7 +12241,19 @@
         <w:t xml:space="preserve">Filmstatus</w:t>
       </w:r>
       <w:r>
-        <w:t xml:space="preserve"> säger hur de hanterats: en hel film ersätter ofullständiga filmer och äldre hela filmer av samma brunnspar (*ersatt av nr X*), och två ofullständiga filmer från var sin brunn slås ihop till en extra sträcka (*sammanslagen av nr 72 + 73*) med alla observationer på en gemensam axel från startbrunnen – delfilmerna markeras *ingår i sammanslagen nr Y*. Finns kartlängd (markprofil eller GIS-data) används den för totallängd och överlapp: i överlappet gäller den nyare filmens observationer och den äldre filmens löpande skador kapas vid snittet. Annars antas filmerna mötas utan överlapp, och ett hinder som båda kamerorna stannade vid räknas en gång. Varje rad i den sammanslagna sträckans observationstabell anger vilken film den kommer från, och översikten i protokollet ritar de två filmernas täckning i olika ton med en streckad skarvlinje där de möts (överlapp skrafferat, ofilmad lucka vit) samt en pil per film med brunn och täckt del. Datum och klockslag tas från den nyare filmen. Ersatta filmer och delfilmer ligger kvar i Prioritering utan rang och får egna protokoll, men räknas inte i statistik, karta, åtgärdspaket eller inspektionsgrad. En nyare hel film ersätter en äldre bara om den är minst 85 % av den äldres längd (</w:t>
+        <w:t xml:space="preserve"> säger hur de hanterats: en hel film ersätter ofullständiga filmer och äldre hela filmer av samma brunnspar (*ersatt av nr X*), och två ofullständiga filmer från var sin brunn slås ihop till en extra sträcka (*sammanslagen av nr 72 + 73*) med alla observationer på en gemensam axel från startbrunnen – delfilmerna markeras *ingår i sammanslagen nr Y*. Finns kartlängd (markprofil eller GIS-data) används den för totallängd och överlapp: i överlappet gäller den nyare filmens observationer och den äldre filmens löpande skador kapas vid snittet. Annars antas filmerna mötas utan överlapp, och ett hinder som båda kamerorna stannade vid räknas en gång. Varje rad i den sammanslagna sträckans observationstabell anger vilken film den kommer från, och översikten i protokollet ritar de två filmernas täckning i olika ton med en streckad skarvlinje där de möts (överlapp skrafferat, ofilmad lucka vit) samt en pil per film med brunn och täckt del. Datum och klockslag tas från den nyare filmen. Ersatta filmer ligger kvar i Prioritering utan rang och får egna protokoll, men räknas inte i statistik, karta, åtgärdspaket eller inspektionsgrad. Delfilmerna i en sammanslagning redovisas bara genom den sammanslagna sträckan (en rad, ett protokoll, observationerna med *film nr X* i kommentaren); vill du ha dem var för sig också sätter du </w:t>
+      </w:r>
+      <w:r>
+        <w:rPr>
+          <w:rFonts w:ascii="Consolas" w:cs="Consolas" w:eastAsia="Consolas" w:hAnsi="Consolas"/>
+          <w:sz w:val="20"/>
+          <w:szCs w:val="20"/>
+          <w:shd w:fill="F2F2F2" w:val="clear"/>
+        </w:rPr>
+        <w:t xml:space="preserve">DELFILMER_SEPARAT = True</w:t>
+      </w:r>
+      <w:r>
+        <w:t xml:space="preserve"> i KONFIG. En nyare hel film ersätter en äldre bara om den är minst 85 % av den äldres längd (</w:t>
       </w:r>
       <w:r>
         <w:rPr>

</xml_diff>

<commit_message>
ArcMap-verktyget Lista fält: dumpar alla lagers fält med exempelvärden till textfil
arcmap/lista_falt.py (körbart med execfile i Python-fönstret) och verktyget
Lista fält i tv3_verktyg.pyt. Används för att hitta rätt fältnamn till
Exportera GIS-data, Markprofil och Uppströms. Handledning 7.11 och CLAUDE.md.

Co-Authored-By: Claude Fable 5.1 <noreply@anthropic.com>
Claude-Session: https://claude.ai/code/session_011fdqX3JEZje1LF9LqpaqR8
</commit_message>
<xml_diff>
--- a/Anvandarhandledning tv3_analys.docx
+++ b/Anvandarhandledning tv3_analys.docx
@@ -11619,6 +11619,48 @@
       </w:r>
       <w:r>
         <w:t xml:space="preserve"> för granskning i Excel.</w:t>
+      </w:r>
+    </w:p>
+    <w:p>
+      <w:pPr>
+        <w:spacing w:after="120"/>
+      </w:pPr>
+      <w:r>
+        <w:t xml:space="preserve">Gissningen träffar bara vanliga fältnamn (VG_UPP, DIMENSION, MATERIAL, LOCKNIVA …). Vet du inte vad fälten heter i din karta kör du verktyget </w:t>
+      </w:r>
+      <w:r>
+        <w:rPr>
+          <w:b/>
+          <w:bCs/>
+        </w:rPr>
+        <w:t xml:space="preserve">Lista fält</w:t>
+      </w:r>
+      <w:r>
+        <w:t xml:space="preserve"> först: det skriver en textfil med alla lager, deras fält (namn, alias, typ) och några exempelvärden per fält, så att det syns vilket fält som faktiskt bär vattengång, dimension, material, anläggningsår, locknivå, brunnstyp och DUF-nummer. Samma lista går att skapa i Python-fönstret med </w:t>
+      </w:r>
+      <w:r>
+        <w:rPr>
+          <w:rFonts w:ascii="Consolas" w:cs="Consolas" w:eastAsia="Consolas" w:hAnsi="Consolas"/>
+          <w:sz w:val="20"/>
+          <w:szCs w:val="20"/>
+          <w:shd w:fill="F2F2F2" w:val="clear"/>
+        </w:rPr>
+        <w:t xml:space="preserve">UTFIL = r'C:\Temp\falt.txt'</w:t>
+      </w:r>
+      <w:r>
+        <w:t xml:space="preserve"> följt av </w:t>
+      </w:r>
+      <w:r>
+        <w:rPr>
+          <w:rFonts w:ascii="Consolas" w:cs="Consolas" w:eastAsia="Consolas" w:hAnsi="Consolas"/>
+          <w:sz w:val="20"/>
+          <w:szCs w:val="20"/>
+          <w:shd w:fill="F2F2F2" w:val="clear"/>
+        </w:rPr>
+        <w:t xml:space="preserve">execfile(r'...\arcmap\lista_falt.py')</w:t>
+      </w:r>
+      <w:r>
+        <w:t xml:space="preserve">. Lämnas ett fält tomt i dialogen exporteras värdet inte, och analysen rapporterar *vattengång saknas i GIS* för alla sträckor.</w:t>
       </w:r>
     </w:p>
     <w:p>

</xml_diff>

<commit_message>
SVOA:s fältnamn som förval i verktygen, renoveringsår ur GIS, Lista fält läser via datakällan
- STANDARD_*: CoverLevel, WellFunction, LevelFrom/LevelTo, PipeDimension, PipeMaterial,
  PipeType, ConstructionYear, RestorationYear, servislager A Servis.
- Exportera GIS-data: nytt fält renoveringsår → gisdata.json/CSV; analysen flaggar
  "renoverad ÅÅÅÅ enligt GIS men inte relinad enligt filmen" och tvärtom, dold
  kolumn Renoveringsår GIS, JSON renoveringsar_gis. GIS_MATERIAL: Bt, Seg, Gj, odef.
- Lista fält: ListFields/SearchCursor på datakällan med lagrets definitionsfråga
  (lagernamn med "/" gav "does not exist").
- Handledning 7.11 och CLAUDE.md.

Co-Authored-By: Claude Fable 5.1 <noreply@anthropic.com>
Claude-Session: https://claude.ai/code/session_011fdqX3JEZje1LF9LqpaqR8
</commit_message>
<xml_diff>
--- a/Anvandarhandledning tv3_analys.docx
+++ b/Anvandarhandledning tv3_analys.docx
@@ -11619,6 +11619,14 @@
       </w:r>
       <w:r>
         <w:t xml:space="preserve"> för granskning i Excel.</w:t>
+      </w:r>
+    </w:p>
+    <w:p>
+      <w:pPr>
+        <w:spacing w:after="120"/>
+      </w:pPr>
+      <w:r>
+        <w:t xml:space="preserve">Förvalen är SVOA:s fältnamn i geopipe-databasen: brunnar EntityID (littera), CoverLevel (locknivå), WellFunction (brunnstyp); ledningar LevelFrom/LevelTo (vattengång), PipeDimension, PipeMaterial, PipeType (DSL/SSL/KSL), ConstructionYear (anläggningsår) och RestorationYear (renoveringsår); DUF-områden fältet DUF. Renoveringsåret ger GIS-flaggan *renoverad 2015 enligt GIS men inte relinad enligt filmen* respektive *relinad enligt filmen men inget renoveringsår i GIS*, samt den dolda kolumnen Renoveringsår GIS – ett enkelt sätt att hitta ledningar där kartan behöver uppdateras.</w:t>
       </w:r>
     </w:p>
     <w:p>

</xml_diff>

<commit_message>
ArcMap-verktyget Etapplager: en linje per etapp med nummer, metod, längd, kostnad och etikett
- kartunderlag.json får toppfältet "etapper" (etapper_for_karta) med allt ur
  fliken Etapper.
- arcmap/etapplager.py + verktyget Etapplager (åtgärdspaket) i tv3_verktyg.pyt:
  slår ihop sträckorna i det bedömda lagret per ETAPP till flerdelade linjer med
  fälten ETAPP, METOD, HOGSTA_KL, MAX_IDX, ANT_STR, LANGD_M, SCHAKT_M, KOSTNAD,
  DIMENSION, BRUNNAR, FRAMSCHAKT, ANT_FRAM, SERV_UPP, FLAGGOR, STRACKOR, ETIKETT;
  valfritt punktlager med brunnar att schakta fram; symbologi ur etapper.lyr /
  framschaktning.lyr om de finns.
- Handledning 7.12 och CLAUDE.md. Test med låtsas-arcpy.

Co-Authored-By: Claude Fable 5.1 <noreply@anthropic.com>
Claude-Session: https://claude.ai/code/session_011fdqX3JEZje1LF9LqpaqR8
</commit_message>
<xml_diff>
--- a/Anvandarhandledning tv3_analys.docx
+++ b/Anvandarhandledning tv3_analys.docx
@@ -12118,6 +12118,68 @@
       </w:r>
       <w:r>
         <w:t xml:space="preserve">) och i Sammanfattning. Exporten tar med alla ledningar i de valda lagren (eller inom Begränsa till område), så dagvattenledningar räknas som egen ledningstyp om de ligger i samma lager.</w:t>
+      </w:r>
+    </w:p>
+    <w:p>
+      <w:pPr>
+        <w:pStyle w:val="Heading2"/>
+      </w:pPr>
+      <w:r>
+        <w:t xml:space="preserve">7.12 Etapplager – åtgärdspaketen i kartan</w:t>
+      </w:r>
+    </w:p>
+    <w:p>
+      <w:pPr>
+        <w:spacing w:after="120"/>
+      </w:pPr>
+      <w:r>
+        <w:t xml:space="preserve">Verktyget </w:t>
+      </w:r>
+      <w:r>
+        <w:rPr>
+          <w:b/>
+          <w:bCs/>
+        </w:rPr>
+        <w:t xml:space="preserve">Etapplager (åtgärdspaket)</w:t>
+      </w:r>
+      <w:r>
+        <w:t xml:space="preserve"> slår ihop sträckorna i det bedömda ledningslagret (från Skapa ledningslager) per etapp till ett linjelager med en linje per etapp, så att de sammanhängande etapperna och deras nummer syns i kartan. Välj ledningslagret, peka ut </w:t>
+      </w:r>
+      <w:r>
+        <w:rPr>
+          <w:rFonts w:ascii="Consolas" w:cs="Consolas" w:eastAsia="Consolas" w:hAnsi="Consolas"/>
+          <w:sz w:val="20"/>
+          <w:szCs w:val="20"/>
+          <w:shd w:fill="F2F2F2" w:val="clear"/>
+        </w:rPr>
+        <w:t xml:space="preserve">kartunderlag.json</w:t>
+      </w:r>
+      <w:r>
+        <w:t xml:space="preserve"> från samma analys (ger kostnad, brunnar att schakta fram, flaggor och sträcklista per etapp – utan filen räknas uppgifterna ur lagrets fält) och ange utdata. Fälten: ETAPP, METOD, HOGSTA_KL (högsta gällande klass), MAX_IDX, ANT_STR, LANGD_M, SCHAKT_M, KOSTNAD, DIMENSION, BRUNNAR, FRAMSCHAKT, ANT_FRAM, SERV_UPP, FLAGGOR, STRACKOR samt ETIKETT (*Etapp 3 – strumpa, 312 m, 1,2 Mkr, 2 brunnar att schakta fram*) som passar som etikett i kartan. Valfritt skrivs även ett punktlager med brunnarna som ska schaktas fram (BRUNN, ETAPP, MANUELL, ETIKETT); läget tas ur sträckornas ändpunkter. Symbologi: sätt t.ex. Unique values på ETAPP eller en färg per METOD, slå på etiketter från ETIKETT och spara som </w:t>
+      </w:r>
+      <w:r>
+        <w:rPr>
+          <w:rFonts w:ascii="Consolas" w:cs="Consolas" w:eastAsia="Consolas" w:hAnsi="Consolas"/>
+          <w:sz w:val="20"/>
+          <w:szCs w:val="20"/>
+          <w:shd w:fill="F2F2F2" w:val="clear"/>
+        </w:rPr>
+        <w:t xml:space="preserve">arcmap/etapper.lyr</w:t>
+      </w:r>
+      <w:r>
+        <w:t xml:space="preserve"> (brunnarna som </w:t>
+      </w:r>
+      <w:r>
+        <w:rPr>
+          <w:rFonts w:ascii="Consolas" w:cs="Consolas" w:eastAsia="Consolas" w:hAnsi="Consolas"/>
+          <w:sz w:val="20"/>
+          <w:szCs w:val="20"/>
+          <w:shd w:fill="F2F2F2" w:val="clear"/>
+        </w:rPr>
+        <w:t xml:space="preserve">framschaktning.lyr</w:t>
+      </w:r>
+      <w:r>
+        <w:t xml:space="preserve">) – då används de automatiskt nästa gång. Etappnumreringen följer fliken Etapper i Excel.</w:t>
       </w:r>
     </w:p>
     <w:p>

</xml_diff>

<commit_message>
Åtgärdspaket: bara klass A får strumpa direkt; en eller två B-sträckor mellan två A tas med som överbryggning
KONFIG ATGARD_KLASSER = ("A",), OVERBRYGGA_KLASSER = ("B",), OVERBRYGGA_MAX_STRACKOR = 2.
Kedjesökning i planera_atgarder: B-sträckor (oavsett längd) och korta C/D som
förbinder två åtgärdssträckor tas med i etappen, flaggade "medtagen för
sammanhang (klass B mellan två åtgärdssträckor)". DUF 701: 15 etapper,
40 A + 9 B, 9,5 Mkr. Handledning, metodbeskrivning och CLAUDE.md uppdaterade.

Co-Authored-By: Claude Fable 5.1 <noreply@anthropic.com>
Claude-Session: https://claude.ai/code/session_011fdqX3JEZje1LF9LqpaqR8
</commit_message>
<xml_diff>
--- a/Anvandarhandledning tv3_analys.docx
+++ b/Anvandarhandledning tv3_analys.docx
@@ -7298,7 +7298,7 @@
         <w:t xml:space="preserve">Etapper</w:t>
       </w:r>
       <w:r>
-        <w:t xml:space="preserve"> gör prioriteringslistan till en plan. Sträckor med gällande klass A eller B (manuell bedömning om den är ifylld, annars maskinell) får metoden </w:t>
+        <w:t xml:space="preserve"> gör prioriteringslistan till en plan. Sträckor med gällande klass A (manuell bedömning om den är ifylld, annars maskinell) får metoden </w:t>
       </w:r>
       <w:r>
         <w:rPr>
@@ -7308,7 +7308,19 @@
         <w:t xml:space="preserve">strumpa</w:t>
       </w:r>
       <w:r>
-        <w:t xml:space="preserve">; relinade och klass C–E får ingen åtgärd. Metoden byts aldrig automatiskt till schakt – skriv </w:t>
+        <w:t xml:space="preserve">; relinade och klass B–E får ingen egen åtgärd (</w:t>
+      </w:r>
+      <w:r>
+        <w:rPr>
+          <w:rFonts w:ascii="Consolas" w:cs="Consolas" w:eastAsia="Consolas" w:hAnsi="Consolas"/>
+          <w:sz w:val="20"/>
+          <w:szCs w:val="20"/>
+          <w:shd w:fill="F2F2F2" w:val="clear"/>
+        </w:rPr>
+        <w:t xml:space="preserve">ATGARD_KLASSER</w:t>
+      </w:r>
+      <w:r>
+        <w:t xml:space="preserve">). Metoden byts aldrig automatiskt till schakt – skriv </w:t>
       </w:r>
       <w:r>
         <w:rPr>
@@ -7416,7 +7428,31 @@
         <w:t xml:space="preserve">B – fogfel</w:t>
       </w:r>
       <w:r>
-        <w:t xml:space="preserve">); fri text som *Bevaka* tolkas inte som klass. Vid flerinspekterade brunnspar gäller den sträcka som har manuell bedömning för hela paret. Sammanhängande sträckor med samma metod bildar en etapp, och en C- eller D-sträcka kortare än 60 m mellan två åtgärdssträckor tas med (*medtagen för sammanhang*). Etapperna numreras efter högsta konstruktionsindex, eller efter flest serviser uppströms om </w:t>
+        <w:t xml:space="preserve">); fri text som *Bevaka* tolkas inte som klass. Vid flerinspekterade brunnspar gäller den sträcka som har manuell bedömning för hela paret. Sammanhängande sträckor med samma metod bildar en etapp. Ligger en eller två B-sträckor i rad mellan två åtgärdssträckor tas de med i etappen (*medtagen för sammanhang (klass B mellan två åtgärdssträckor)*; </w:t>
+      </w:r>
+      <w:r>
+        <w:rPr>
+          <w:rFonts w:ascii="Consolas" w:cs="Consolas" w:eastAsia="Consolas" w:hAnsi="Consolas"/>
+          <w:sz w:val="20"/>
+          <w:szCs w:val="20"/>
+          <w:shd w:fill="F2F2F2" w:val="clear"/>
+        </w:rPr>
+        <w:t xml:space="preserve">OVERBRYGGA_KLASSER</w:t>
+      </w:r>
+      <w:r>
+        <w:t xml:space="preserve">, </w:t>
+      </w:r>
+      <w:r>
+        <w:rPr>
+          <w:rFonts w:ascii="Consolas" w:cs="Consolas" w:eastAsia="Consolas" w:hAnsi="Consolas"/>
+          <w:sz w:val="20"/>
+          <w:szCs w:val="20"/>
+          <w:shd w:fill="F2F2F2" w:val="clear"/>
+        </w:rPr>
+        <w:t xml:space="preserve">OVERBRYGGA_MAX_STRACKOR</w:t>
+      </w:r>
+      <w:r>
+        <w:t xml:space="preserve">), liksom en C- eller D-sträcka kortare än 60 m – en B-sträcka strumpas alltså inte bara för att entreprenören ändå är på plats, bara när den binder ihop två A-sträckor. Etapperna numreras efter högsta konstruktionsindex, eller efter flest serviser uppströms om </w:t>
       </w:r>
       <w:r>
         <w:rPr>
@@ -7978,7 +8014,7 @@
               <w:spacing w:after="0"/>
             </w:pPr>
             <w:r>
-              <w:t xml:space="preserve">Gällande klasser som får åtgärd (strumpa).</w:t>
+              <w:t xml:space="preserve">Gällande klasser som får åtgärd (strumpa) direkt.</w:t>
             </w:r>
           </w:p>
         </w:tc>
@@ -8004,7 +8040,7 @@
               <w:spacing w:after="0"/>
             </w:pPr>
             <w:r>
-              <w:t xml:space="preserve">A, B</w:t>
+              <w:t xml:space="preserve">A</w:t>
             </w:r>
           </w:p>
         </w:tc>
@@ -8037,7 +8073,19 @@
                 <w:szCs w:val="20"/>
                 <w:shd w:fill="F2F2F2" w:val="clear"/>
               </w:rPr>
-              <w:t xml:space="preserve">SCHAKT_AUTOMATISKT</w:t>
+              <w:t xml:space="preserve">OVERBRYGGA_KLASSER</w:t>
+            </w:r>
+            <w:r>
+              <w:t xml:space="preserve">, </w:t>
+            </w:r>
+            <w:r>
+              <w:rPr>
+                <w:rFonts w:ascii="Consolas" w:cs="Consolas" w:eastAsia="Consolas" w:hAnsi="Consolas"/>
+                <w:sz w:val="20"/>
+                <w:szCs w:val="20"/>
+                <w:shd w:fill="F2F2F2" w:val="clear"/>
+              </w:rPr>
+              <w:t xml:space="preserve">OVERBRYGGA_MAX_STRACKOR</w:t>
             </w:r>
           </w:p>
         </w:tc>
@@ -8062,16 +8110,7 @@
               <w:spacing w:after="0"/>
             </w:pPr>
             <w:r>
-              <w:rPr>
-                <w:rFonts w:ascii="Consolas" w:cs="Consolas" w:eastAsia="Consolas" w:hAnsi="Consolas"/>
-                <w:sz w:val="20"/>
-                <w:szCs w:val="20"/>
-                <w:shd w:fill="F2F2F2" w:val="clear"/>
-              </w:rPr>
-              <w:t xml:space="preserve">True</w:t>
-            </w:r>
-            <w:r>
-              <w:t xml:space="preserve"> = grad 4 på rörbrott/deformation ger schakt automatiskt. Standard: bara manuell bedömning byter metod.</w:t>
+              <w:t xml:space="preserve">Klasser som bara tas med när de ligger mellan två åtgärdssträckor, och högst så många sådana sträckor i rad.</w:t>
             </w:r>
           </w:p>
         </w:tc>
@@ -8096,13 +8135,7 @@
               <w:spacing w:after="0"/>
             </w:pPr>
             <w:r>
-              <w:rPr>
-                <w:rFonts w:ascii="Consolas" w:cs="Consolas" w:eastAsia="Consolas" w:hAnsi="Consolas"/>
-                <w:sz w:val="20"/>
-                <w:szCs w:val="20"/>
-                <w:shd w:fill="F2F2F2" w:val="clear"/>
-              </w:rPr>
-              <w:t xml:space="preserve">False</w:t>
+              <w:t xml:space="preserve">B; 2</w:t>
             </w:r>
           </w:p>
         </w:tc>
@@ -8136,7 +8169,7 @@
                 <w:szCs w:val="20"/>
                 <w:shd w:fill="F2F2F2" w:val="clear"/>
               </w:rPr>
-              <w:t xml:space="preserve">ETAPP_OVERBRYGGA_M</w:t>
+              <w:t xml:space="preserve">SCHAKT_AUTOMATISKT</w:t>
             </w:r>
           </w:p>
         </w:tc>
@@ -8162,7 +8195,16 @@
               <w:spacing w:after="0"/>
             </w:pPr>
             <w:r>
-              <w:t xml:space="preserve">C/D-sträcka kortare än så (m) mellan två åtgärdssträckor tas med i etappen.</w:t>
+              <w:rPr>
+                <w:rFonts w:ascii="Consolas" w:cs="Consolas" w:eastAsia="Consolas" w:hAnsi="Consolas"/>
+                <w:sz w:val="20"/>
+                <w:szCs w:val="20"/>
+                <w:shd w:fill="F2F2F2" w:val="clear"/>
+              </w:rPr>
+              <w:t xml:space="preserve">True</w:t>
+            </w:r>
+            <w:r>
+              <w:t xml:space="preserve"> = grad 4 på rörbrott/deformation ger schakt automatiskt. Standard: bara manuell bedömning byter metod.</w:t>
             </w:r>
           </w:p>
         </w:tc>
@@ -8188,7 +8230,13 @@
               <w:spacing w:after="0"/>
             </w:pPr>
             <w:r>
-              <w:t xml:space="preserve">60</w:t>
+              <w:rPr>
+                <w:rFonts w:ascii="Consolas" w:cs="Consolas" w:eastAsia="Consolas" w:hAnsi="Consolas"/>
+                <w:sz w:val="20"/>
+                <w:szCs w:val="20"/>
+                <w:shd w:fill="F2F2F2" w:val="clear"/>
+              </w:rPr>
+              <w:t xml:space="preserve">False</w:t>
             </w:r>
           </w:p>
         </w:tc>
@@ -8221,7 +8269,7 @@
                 <w:szCs w:val="20"/>
                 <w:shd w:fill="F2F2F2" w:val="clear"/>
               </w:rPr>
-              <w:t xml:space="preserve">ETAPP_ORDNING</w:t>
+              <w:t xml:space="preserve">ETAPP_OVERBRYGGA_M</w:t>
             </w:r>
           </w:p>
         </w:tc>
@@ -8246,28 +8294,7 @@
               <w:spacing w:after="0"/>
             </w:pPr>
             <w:r>
-              <w:rPr>
-                <w:rFonts w:ascii="Consolas" w:cs="Consolas" w:eastAsia="Consolas" w:hAnsi="Consolas"/>
-                <w:sz w:val="20"/>
-                <w:szCs w:val="20"/>
-                <w:shd w:fill="F2F2F2" w:val="clear"/>
-              </w:rPr>
-              <w:t xml:space="preserve">index</w:t>
-            </w:r>
-            <w:r>
-              <w:t xml:space="preserve"> = högsta konstruktionsindex först; </w:t>
-            </w:r>
-            <w:r>
-              <w:rPr>
-                <w:rFonts w:ascii="Consolas" w:cs="Consolas" w:eastAsia="Consolas" w:hAnsi="Consolas"/>
-                <w:sz w:val="20"/>
-                <w:szCs w:val="20"/>
-                <w:shd w:fill="F2F2F2" w:val="clear"/>
-              </w:rPr>
-              <w:t xml:space="preserve">konsekvens</w:t>
-            </w:r>
-            <w:r>
-              <w:t xml:space="preserve"> = flest serviser uppströms först.</w:t>
+              <w:t xml:space="preserve">C/D-sträcka kortare än så (m) mellan två åtgärdssträckor tas med i etappen.</w:t>
             </w:r>
           </w:p>
         </w:tc>
@@ -8292,13 +8319,7 @@
               <w:spacing w:after="0"/>
             </w:pPr>
             <w:r>
-              <w:rPr>
-                <w:rFonts w:ascii="Consolas" w:cs="Consolas" w:eastAsia="Consolas" w:hAnsi="Consolas"/>
-                <w:sz w:val="20"/>
-                <w:szCs w:val="20"/>
-                <w:shd w:fill="F2F2F2" w:val="clear"/>
-              </w:rPr>
-              <w:t xml:space="preserve">index</w:t>
+              <w:t xml:space="preserve">60</w:t>
             </w:r>
           </w:p>
         </w:tc>
@@ -8332,7 +8353,7 @@
                 <w:szCs w:val="20"/>
                 <w:shd w:fill="F2F2F2" w:val="clear"/>
               </w:rPr>
-              <w:t xml:space="preserve">BRUNNSTYP_ANDE_M</w:t>
+              <w:t xml:space="preserve">ETAPP_ORDNING</w:t>
             </w:r>
           </w:p>
         </w:tc>
@@ -8358,7 +8379,28 @@
               <w:spacing w:after="0"/>
             </w:pPr>
             <w:r>
-              <w:t xml:space="preserve">TVDAT-kod NB/TB/RB så nära (m) sträckans ände gäller för brunnen där.</w:t>
+              <w:rPr>
+                <w:rFonts w:ascii="Consolas" w:cs="Consolas" w:eastAsia="Consolas" w:hAnsi="Consolas"/>
+                <w:sz w:val="20"/>
+                <w:szCs w:val="20"/>
+                <w:shd w:fill="F2F2F2" w:val="clear"/>
+              </w:rPr>
+              <w:t xml:space="preserve">index</w:t>
+            </w:r>
+            <w:r>
+              <w:t xml:space="preserve"> = högsta konstruktionsindex först; </w:t>
+            </w:r>
+            <w:r>
+              <w:rPr>
+                <w:rFonts w:ascii="Consolas" w:cs="Consolas" w:eastAsia="Consolas" w:hAnsi="Consolas"/>
+                <w:sz w:val="20"/>
+                <w:szCs w:val="20"/>
+                <w:shd w:fill="F2F2F2" w:val="clear"/>
+              </w:rPr>
+              <w:t xml:space="preserve">konsekvens</w:t>
+            </w:r>
+            <w:r>
+              <w:t xml:space="preserve"> = flest serviser uppströms först.</w:t>
             </w:r>
           </w:p>
         </w:tc>
@@ -8384,7 +8426,13 @@
               <w:spacing w:after="0"/>
             </w:pPr>
             <w:r>
-              <w:t xml:space="preserve">1,5</w:t>
+              <w:rPr>
+                <w:rFonts w:ascii="Consolas" w:cs="Consolas" w:eastAsia="Consolas" w:hAnsi="Consolas"/>
+                <w:sz w:val="20"/>
+                <w:szCs w:val="20"/>
+                <w:shd w:fill="F2F2F2" w:val="clear"/>
+              </w:rPr>
+              <w:t xml:space="preserve">index</w:t>
             </w:r>
           </w:p>
         </w:tc>
@@ -8417,7 +8465,7 @@
                 <w:szCs w:val="20"/>
                 <w:shd w:fill="F2F2F2" w:val="clear"/>
               </w:rPr>
-              <w:t xml:space="preserve">LAGNINGSKODER</w:t>
+              <w:t xml:space="preserve">BRUNNSTYP_ANDE_M</w:t>
             </w:r>
           </w:p>
         </w:tc>
@@ -8442,7 +8490,7 @@
               <w:spacing w:after="0"/>
             </w:pPr>
             <w:r>
-              <w:t xml:space="preserve">Kod + grad som listas som lagningsbehov i Åtgärdsflagga.</w:t>
+              <w:t xml:space="preserve">TVDAT-kod NB/TB/RB så nära (m) sträckans ände gäller för brunnen där.</w:t>
             </w:r>
           </w:p>
         </w:tc>
@@ -8467,7 +8515,7 @@
               <w:spacing w:after="0"/>
             </w:pPr>
             <w:r>
-              <w:t xml:space="preserve">RBR 3–4, DEF 3–4, FOG 4, YTS 4</w:t>
+              <w:t xml:space="preserve">1,5</w:t>
             </w:r>
           </w:p>
         </w:tc>
@@ -8501,6 +8549,91 @@
                 <w:szCs w:val="20"/>
                 <w:shd w:fill="F2F2F2" w:val="clear"/>
               </w:rPr>
+              <w:t xml:space="preserve">LAGNINGSKODER</w:t>
+            </w:r>
+          </w:p>
+        </w:tc>
+        <w:tc>
+          <w:tcPr>
+            <w:tcW w:type="dxa" w:w="5000"/>
+            <w:tcBorders>
+              <w:top w:val="single" w:color="BFBFBF" w:sz="4"/>
+              <w:left w:val="single" w:color="BFBFBF" w:sz="4"/>
+              <w:bottom w:val="single" w:color="BFBFBF" w:sz="4"/>
+              <w:right w:val="single" w:color="BFBFBF" w:sz="4"/>
+            </w:tcBorders>
+            <w:shd w:fill="F7F9FC" w:val="clear"/>
+            <w:tcMar>
+              <w:top w:type="dxa" w:w="60"/>
+              <w:left w:type="dxa" w:w="100"/>
+              <w:bottom w:type="dxa" w:w="60"/>
+              <w:right w:type="dxa" w:w="100"/>
+            </w:tcMar>
+          </w:tcPr>
+          <w:p>
+            <w:pPr>
+              <w:spacing w:after="0"/>
+            </w:pPr>
+            <w:r>
+              <w:t xml:space="preserve">Kod + grad som listas som lagningsbehov i Åtgärdsflagga.</w:t>
+            </w:r>
+          </w:p>
+        </w:tc>
+        <w:tc>
+          <w:tcPr>
+            <w:tcW w:type="dxa" w:w="1760"/>
+            <w:tcBorders>
+              <w:top w:val="single" w:color="BFBFBF" w:sz="4"/>
+              <w:left w:val="single" w:color="BFBFBF" w:sz="4"/>
+              <w:bottom w:val="single" w:color="BFBFBF" w:sz="4"/>
+              <w:right w:val="single" w:color="BFBFBF" w:sz="4"/>
+            </w:tcBorders>
+            <w:shd w:fill="F7F9FC" w:val="clear"/>
+            <w:tcMar>
+              <w:top w:type="dxa" w:w="60"/>
+              <w:left w:type="dxa" w:w="100"/>
+              <w:bottom w:type="dxa" w:w="60"/>
+              <w:right w:type="dxa" w:w="100"/>
+            </w:tcMar>
+          </w:tcPr>
+          <w:p>
+            <w:pPr>
+              <w:spacing w:after="0"/>
+            </w:pPr>
+            <w:r>
+              <w:t xml:space="preserve">RBR 3–4, DEF 3–4, FOG 4, YTS 4</w:t>
+            </w:r>
+          </w:p>
+        </w:tc>
+      </w:tr>
+      <w:tr>
+        <w:tc>
+          <w:tcPr>
+            <w:tcW w:type="dxa" w:w="2600"/>
+            <w:tcBorders>
+              <w:top w:val="single" w:color="BFBFBF" w:sz="4"/>
+              <w:left w:val="single" w:color="BFBFBF" w:sz="4"/>
+              <w:bottom w:val="single" w:color="BFBFBF" w:sz="4"/>
+              <w:right w:val="single" w:color="BFBFBF" w:sz="4"/>
+            </w:tcBorders>
+            <w:tcMar>
+              <w:top w:type="dxa" w:w="60"/>
+              <w:left w:type="dxa" w:w="100"/>
+              <w:bottom w:type="dxa" w:w="60"/>
+              <w:right w:type="dxa" w:w="100"/>
+            </w:tcMar>
+          </w:tcPr>
+          <w:p>
+            <w:pPr>
+              <w:spacing w:after="0"/>
+            </w:pPr>
+            <w:r>
+              <w:rPr>
+                <w:rFonts w:ascii="Consolas" w:cs="Consolas" w:eastAsia="Consolas" w:hAnsi="Consolas"/>
+                <w:sz w:val="20"/>
+                <w:szCs w:val="20"/>
+                <w:shd w:fill="F2F2F2" w:val="clear"/>
+              </w:rPr>
               <w:t xml:space="preserve">FRAMSCHAKTA_BRUNNAR</w:t>
             </w:r>
           </w:p>
@@ -8514,7 +8647,6 @@
               <w:bottom w:val="single" w:color="BFBFBF" w:sz="4"/>
               <w:right w:val="single" w:color="BFBFBF" w:sz="4"/>
             </w:tcBorders>
-            <w:shd w:fill="F7F9FC" w:val="clear"/>
             <w:tcMar>
               <w:top w:type="dxa" w:w="60"/>
               <w:left w:type="dxa" w:w="100"/>
@@ -8540,7 +8672,6 @@
               <w:bottom w:val="single" w:color="BFBFBF" w:sz="4"/>
               <w:right w:val="single" w:color="BFBFBF" w:sz="4"/>
             </w:tcBorders>
-            <w:shd w:fill="F7F9FC" w:val="clear"/>
             <w:tcMar>
               <w:top w:type="dxa" w:w="60"/>
               <w:left w:type="dxa" w:w="100"/>

</xml_diff>

<commit_message>
Exportera kartor: lagret kopieras in i mallen från den öppna kartan när mallen saknar det
Layout tar kopiera_fran=(lager, markeringslager); saknas de i mallens dataram
läggs de in med AddLayer (mallen sparas inte). Handledning 7.10 och CLAUDE.md.

Co-Authored-By: Claude Fable 5.1 <noreply@anthropic.com>
Claude-Session: https://claude.ai/code/session_011fdqX3JEZje1LF9LqpaqR8
</commit_message>
<xml_diff>
--- a/Anvandarhandledning tv3_analys.docx
+++ b/Anvandarhandledning tv3_analys.docx
@@ -11601,7 +11601,7 @@
         <w:t xml:space="preserve">Liggande eller stående</w:t>
       </w:r>
       <w:r>
-        <w:t xml:space="preserve">: spara två kopior av kartdokumentet med liggande respektive stående layout (samma lager och textelement) och ange dem under </w:t>
+        <w:t xml:space="preserve">: ange två kartdokument med liggande respektive stående layout under </w:t>
       </w:r>
       <w:r>
         <w:rPr>
@@ -11611,7 +11611,7 @@
         <w:t xml:space="preserve">Mallar</w:t>
       </w:r>
       <w:r>
-        <w:t xml:space="preserve">. För varje sträcka räknas skalan för båda och den mall som ger minsta skala används; vid lika skala den där sträckan fyller sidan bäst. En lång sträcka i nord–sydlig riktning får då stående sida i 1:200 i stället för liggande i 1:300. Utan mallar används den öppna kartans layout.</w:t>
+        <w:t xml:space="preserve">, t.ex. SVOA:s utskriftsmallar UtskriftA4_Liggande.mxd och UtskriftA4_Stående.mxd. Saknar mallen lagret med sträckorna (eller markeringslagret) kopieras det in från den öppna kartan under körningen, med samma symbologi; mallen sparas inte och påverkas alltså inte. För varje sträcka räknas skalan för båda och den mall som ger minsta skala används; vid lika skala den där sträckan fyller sidan bäst. En lång sträcka i nord–sydlig riktning får då stående sida i 1:200 i stället för liggande i 1:300. Utan mallar används den öppna kartans layout.</w:t>
       </w:r>
     </w:p>
     <w:p>

</xml_diff>

<commit_message>
Exportera kartor: släck sträcklagret och visa bara aktuell sträcka
Ny kryssruta "Släck lagret med alla sträckor" (dolj_strackor) i verktyget
Exportera kartor. Sträcklagret släcks under exporten; utan markeringslager
läggs en tillfällig kopia "Aktuell stracka (export)" överst med definitions-
fråga på den aktuella sträckan och tas bort efteråt. Görs automatiskt när
lagret redan är släckt i kartan. Lagrets synlighet återställs.

Handledning 7.10 och CLAUDE.md uppdaterade; låtsastest OK4/OK5.

Co-Authored-By: Claude Fable 5.1 <noreply@anthropic.com>
Claude-Session: https://claude.ai/code/session_011fdqX3JEZje1LF9LqpaqR8
</commit_message>
<xml_diff>
--- a/Anvandarhandledning tv3_analys.docx
+++ b/Anvandarhandledning tv3_analys.docx
@@ -11562,6 +11562,26 @@
       </w:r>
       <w:r>
         <w:t xml:space="preserve"> – lägg in lagret från Skapa ledningslager en gång till, ge det en bred färgad linje och ange det i dialogen, så sätts dess definitionsfråga till den aktuella sträckan och återställs efteråt.</w:t>
+      </w:r>
+    </w:p>
+    <w:p>
+      <w:pPr>
+        <w:pStyle w:val="ListParagraph"/>
+        <w:numPr>
+          <w:ilvl w:val="0"/>
+          <w:numId w:val="3"/>
+        </w:numPr>
+        <w:spacing w:after="80"/>
+      </w:pPr>
+      <w:r>
+        <w:rPr>
+          <w:b/>
+          <w:bCs/>
+        </w:rPr>
+        <w:t xml:space="preserve">Släck lagret med alla sträckor</w:t>
+      </w:r>
+      <w:r>
+        <w:t xml:space="preserve">: kryssrutan *Släck lagret med alla sträckor – visa bara den aktuella sträckan* släcker sträcklagret under exporten så att bara den aktuella sträckan syns ovanpå de övriga lagren (ledningsnätet, brunnar, bakgrund). Har du angett ett markeringslager visas sträckan med det; annars läggs en tillfällig kopia av sträcklagret överst i dataramen (namnet *Aktuell sträcka (export)*) med en definitionsfråga på den aktuella sträckan, och kopian tas bort när exporten är klar. Är sträcklagret redan släckt i kartan när du kör görs samma sak automatiskt. Lagret tänds igen efteråt (eller förblir släckt om det var det).</w:t>
       </w:r>
     </w:p>
     <w:p>

</xml_diff>

<commit_message>
Exportera kartor: gul genomskinlig markering av aktuell sträcka via .lyr
Ny kategori "Markering av den aktuella sträckan" med Markeringssymbol
(.lyr, förval arcmap/markering.lyr när den finns) och genomskinlighet (%).
Med symbolen skapas det tillfälliga lagret från sträcklagrets datakälla
med ApplySymbologyFromLayer, även när sträcklagret är tänt, så klass-
färgerna inte används för markeringen. Utan .lyr loggas hur filen skapas.

Handledning 7.10 och CLAUDE.md uppdaterade; låtsastest OK6/OK7.

Co-Authored-By: Claude Fable 5.1 <noreply@anthropic.com>
Claude-Session: https://claude.ai/code/session_011fdqX3JEZje1LF9LqpaqR8
</commit_message>
<xml_diff>
--- a/Anvandarhandledning tv3_analys.docx
+++ b/Anvandarhandledning tv3_analys.docx
@@ -11551,17 +11551,51 @@
         <w:t xml:space="preserve">Markering</w:t>
       </w:r>
       <w:r>
-        <w:t xml:space="preserve">: sträckan markeras i kartan under exporten. Standard är ArcMaps urvalsfärg (ert eget urval återställs efteråt); tydligare blir det med ett </w:t>
+        <w:t xml:space="preserve">: den aktuella sträckan ritas ovanpå kartan som en bred, halvgenomskinlig linje. Symbolen tas ur en .lyr-fil som anges under </w:t>
       </w:r>
       <w:r>
         <w:rPr>
           <w:b/>
           <w:bCs/>
         </w:rPr>
+        <w:t xml:space="preserve">Markering av den aktuella sträckan</w:t>
+      </w:r>
+      <w:r>
+        <w:t xml:space="preserve"> (förval </w:t>
+      </w:r>
+      <w:r>
+        <w:rPr>
+          <w:rFonts w:ascii="Consolas" w:cs="Consolas" w:eastAsia="Consolas" w:hAnsi="Consolas"/>
+          <w:sz w:val="20"/>
+          <w:szCs w:val="20"/>
+          <w:shd w:fill="F2F2F2" w:val="clear"/>
+        </w:rPr>
+        <w:t xml:space="preserve">arcmap/markering.lyr</w:t>
+      </w:r>
+      <w:r>
+        <w:t xml:space="preserve"> när filen finns) och genomskinligheten sätts i procent (standard 50). Skapa filen en gång i ArcMap: högerklicka sträcklagret &gt; Properties &gt; Symbology &gt; Features &gt; Single symbol, välj en gul linje med bredd ca 8 pt &gt; OK; högerklicka lagret igen &gt; Save As Layer File… och spara som </w:t>
+      </w:r>
+      <w:r>
+        <w:rPr>
+          <w:rFonts w:ascii="Consolas" w:cs="Consolas" w:eastAsia="Consolas" w:hAnsi="Consolas"/>
+          <w:sz w:val="20"/>
+          <w:szCs w:val="20"/>
+          <w:shd w:fill="F2F2F2" w:val="clear"/>
+        </w:rPr>
+        <w:t xml:space="preserve">arcmap\markering.lyr</w:t>
+      </w:r>
+      <w:r>
+        <w:t xml:space="preserve">. Verktyget lägger under exporten ett tillfälligt lager *Aktuell sträcka (export)* överst i dataramen med den symbolen och en definitionsfråga på den aktuella sträckan, och tar bort det efteråt. Utan .lyr-fil används sträcklagrets egen symbologi (klassfärgerna) i det tillfälliga lagret när lagret släcks, annars ArcMaps urvalsfärg; loggen talar om hur filen skapas. Alternativt anges ett eget </w:t>
+      </w:r>
+      <w:r>
+        <w:rPr>
+          <w:b/>
+          <w:bCs/>
+        </w:rPr>
         <w:t xml:space="preserve">markeringslager</w:t>
       </w:r>
       <w:r>
-        <w:t xml:space="preserve"> – lägg in lagret från Skapa ledningslager en gång till, ge det en bred färgad linje och ange det i dialogen, så sätts dess definitionsfråga till den aktuella sträckan och återställs efteråt.</w:t>
+        <w:t xml:space="preserve"> (lagret från Skapa ledningslager inlagt en gång till med egen symbologi) – då används det i stället.</w:t>
       </w:r>
     </w:p>
     <w:p>
@@ -11581,7 +11615,7 @@
         <w:t xml:space="preserve">Släck lagret med alla sträckor</w:t>
       </w:r>
       <w:r>
-        <w:t xml:space="preserve">: kryssrutan *Släck lagret med alla sträckor – visa bara den aktuella sträckan* släcker sträcklagret under exporten så att bara den aktuella sträckan syns ovanpå de övriga lagren (ledningsnätet, brunnar, bakgrund). Har du angett ett markeringslager visas sträckan med det; annars läggs en tillfällig kopia av sträcklagret överst i dataramen (namnet *Aktuell sträcka (export)*) med en definitionsfråga på den aktuella sträckan, och kopian tas bort när exporten är klar. Är sträcklagret redan släckt i kartan när du kör görs samma sak automatiskt. Lagret tänds igen efteråt (eller förblir släckt om det var det).</w:t>
+        <w:t xml:space="preserve">: kryssrutan *Släck lagret med alla sträckor – visa bara den aktuella sträckan* släcker sträcklagret under exporten så att bara den aktuella sträckan syns ovanpå de övriga lagren (ledningsnätet, brunnar, bakgrund). Är sträcklagret redan släckt i kartan när du kör görs samma sak automatiskt. Lagret tänds igen efteråt (eller förblir släckt om det var det).</w:t>
       </w:r>
     </w:p>
     <w:p>

</xml_diff>

<commit_message>
Videofil 2: egen kolumn och länk för andra filmen i sammanslagna sträckor
Sammanslagna sträckor hade "a + b" i fältet Videofil men länken gick bara
till film a (och i ArcMap med filmmapp blev sökvägen trasig). Nu:
Videofil = film a, ny kolumn Videofil 2 med egen länk i Prioritering,
Observationer länkar varje observation till den film den kommer från,
JSON videofil_b/video_sokvag_b, PDF-raden visar båda, kartfältet VIDEO2.

Handledning (avsnitt 5, 7.1, FAQ) och CLAUDE.md uppdaterade.

Co-Authored-By: Claude Fable 5.1 <noreply@anthropic.com>
Claude-Session: https://claude.ai/code/session_011fdqX3JEZje1LF9LqpaqR8
</commit_message>
<xml_diff>
--- a/Anvandarhandledning tv3_analys.docx
+++ b/Anvandarhandledning tv3_analys.docx
@@ -4111,7 +4111,17 @@
               <w:t xml:space="preserve">DOLDA_KOLUMNER</w:t>
             </w:r>
             <w:r>
-              <w:t xml:space="preserve"> i KONFIG. Kolumnerna Manuell bedömning och Kommentar är tomma och avsedda för den egna genomgången av sträckorna. Kolumnen Rapport öppnar sträckans PDF-rapport (länken är relativ, så Excel-filen och mappen rapporter måste ligga kvar bredvid varandra). Kolumnen Videofil är en klickbar länk som öppnar filmen (se avsnitt 7 om länken inte fungerar).</w:t>
+              <w:t xml:space="preserve"> i KONFIG. Kolumnerna Manuell bedömning och Kommentar är tomma och avsedda för den egna genomgången av sträckorna. Kolumnen Rapport öppnar sträckans PDF-rapport (länken är relativ, så Excel-filen och mappen rapporter måste ligga kvar bredvid varandra). Kolumnen Videofil är en klickbar länk som öppnar filmen (se avsnitt 8 om länken inte fungerar). En sträcka som slagits ihop av två delfilmer har den andra filmen i kolumnen </w:t>
+            </w:r>
+            <w:r>
+              <w:rPr>
+                <w:b/>
+                <w:bCs/>
+              </w:rPr>
+              <w:t xml:space="preserve">Videofil 2</w:t>
+            </w:r>
+            <w:r>
+              <w:t xml:space="preserve">, med egen länk; i fliken Observationer länkar varje observation till den film den kommer från.</w:t>
             </w:r>
           </w:p>
         </w:tc>
@@ -11031,6 +11041,92 @@
           </w:p>
         </w:tc>
       </w:tr>
+      <w:tr>
+        <w:tc>
+          <w:tcPr>
+            <w:tcW w:type="dxa" w:w="1800"/>
+            <w:tcBorders>
+              <w:top w:val="single" w:color="BFBFBF" w:sz="4"/>
+              <w:left w:val="single" w:color="BFBFBF" w:sz="4"/>
+              <w:bottom w:val="single" w:color="BFBFBF" w:sz="4"/>
+              <w:right w:val="single" w:color="BFBFBF" w:sz="4"/>
+            </w:tcBorders>
+            <w:shd w:fill="F7F9FC" w:val="clear"/>
+            <w:tcMar>
+              <w:top w:type="dxa" w:w="60"/>
+              <w:left w:type="dxa" w:w="100"/>
+              <w:bottom w:type="dxa" w:w="60"/>
+              <w:right w:type="dxa" w:w="100"/>
+            </w:tcMar>
+          </w:tcPr>
+          <w:p>
+            <w:pPr>
+              <w:spacing w:after="0"/>
+            </w:pPr>
+            <w:r>
+              <w:rPr>
+                <w:rFonts w:ascii="Consolas" w:cs="Consolas" w:eastAsia="Consolas" w:hAnsi="Consolas"/>
+                <w:sz w:val="20"/>
+                <w:szCs w:val="20"/>
+                <w:shd w:fill="F2F2F2" w:val="clear"/>
+              </w:rPr>
+              <w:t xml:space="preserve">VIDEO2</w:t>
+            </w:r>
+          </w:p>
+        </w:tc>
+        <w:tc>
+          <w:tcPr>
+            <w:tcW w:type="dxa" w:w="2600"/>
+            <w:tcBorders>
+              <w:top w:val="single" w:color="BFBFBF" w:sz="4"/>
+              <w:left w:val="single" w:color="BFBFBF" w:sz="4"/>
+              <w:bottom w:val="single" w:color="BFBFBF" w:sz="4"/>
+              <w:right w:val="single" w:color="BFBFBF" w:sz="4"/>
+            </w:tcBorders>
+            <w:shd w:fill="F7F9FC" w:val="clear"/>
+            <w:tcMar>
+              <w:top w:type="dxa" w:w="60"/>
+              <w:left w:type="dxa" w:w="100"/>
+              <w:bottom w:type="dxa" w:w="60"/>
+              <w:right w:type="dxa" w:w="100"/>
+            </w:tcMar>
+          </w:tcPr>
+          <w:p>
+            <w:pPr>
+              <w:spacing w:after="0"/>
+            </w:pPr>
+            <w:r>
+              <w:t xml:space="preserve">Videofil 2</w:t>
+            </w:r>
+          </w:p>
+        </w:tc>
+        <w:tc>
+          <w:tcPr>
+            <w:tcW w:type="dxa" w:w="4960"/>
+            <w:tcBorders>
+              <w:top w:val="single" w:color="BFBFBF" w:sz="4"/>
+              <w:left w:val="single" w:color="BFBFBF" w:sz="4"/>
+              <w:bottom w:val="single" w:color="BFBFBF" w:sz="4"/>
+              <w:right w:val="single" w:color="BFBFBF" w:sz="4"/>
+            </w:tcBorders>
+            <w:shd w:fill="F7F9FC" w:val="clear"/>
+            <w:tcMar>
+              <w:top w:type="dxa" w:w="60"/>
+              <w:left w:type="dxa" w:w="100"/>
+              <w:bottom w:type="dxa" w:w="60"/>
+              <w:right w:type="dxa" w:w="100"/>
+            </w:tcMar>
+          </w:tcPr>
+          <w:p>
+            <w:pPr>
+              <w:spacing w:after="0"/>
+            </w:pPr>
+            <w:r>
+              <w:t xml:space="preserve">Den andra filmen när sträckan är sammanslagen av två delfilmer; annars tomt.</w:t>
+            </w:r>
+          </w:p>
+        </w:tc>
+      </w:tr>
     </w:tbl>
     <w:p>
       <w:pPr>
@@ -13634,7 +13730,7 @@
         <w:t xml:space="preserve">Filmstatus</w:t>
       </w:r>
       <w:r>
-        <w:t xml:space="preserve"> säger hur de hanterats: en hel film ersätter ofullständiga filmer och äldre hela filmer av samma brunnspar (*ersatt av nr X*), och två ofullständiga filmer från var sin brunn slås ihop till en extra sträcka (*sammanslagen av nr 72 + 73*) med alla observationer på en gemensam axel från startbrunnen – delfilmerna markeras *ingår i sammanslagen nr Y*. Finns kartlängd (markprofil eller GIS-data) används den för totallängd och överlapp: i överlappet gäller den nyare filmens observationer och den äldre filmens löpande skador kapas vid snittet. Annars antas filmerna mötas utan överlapp, och ett hinder som båda kamerorna stannade vid räknas en gång. Varje rad i den sammanslagna sträckans observationstabell anger vilken film den kommer från, och översikten i protokollet ritar de två filmernas täckning i olika ton med en streckad skarvlinje där de möts (överlapp skrafferat, ofilmad lucka vit) samt en pil per film med brunn och täckt del. Datum och klockslag tas från den nyare filmen. Ersatta filmer ligger kvar i Prioritering utan rang och får egna protokoll, men räknas inte i statistik, karta, åtgärdspaket eller inspektionsgrad. Delfilmerna i en sammanslagning redovisas bara genom den sammanslagna sträckan (en rad, ett protokoll, observationerna med *film nr X* i kommentaren); vill du ha dem var för sig också sätter du </w:t>
+        <w:t xml:space="preserve"> säger hur de hanterats: en hel film ersätter ofullständiga filmer och äldre hela filmer av samma brunnspar (*ersatt av nr X*), och två ofullständiga filmer från var sin brunn slås ihop till en extra sträcka (*sammanslagen av nr 72 + 73*) med alla observationer på en gemensam axel från startbrunnen – delfilmerna markeras *ingår i sammanslagen nr Y*. Finns kartlängd (markprofil eller GIS-data) används den för totallängd och överlapp: i överlappet gäller den nyare filmens observationer och den äldre filmens löpande skador kapas vid snittet. Annars antas filmerna mötas utan överlapp, och ett hinder som båda kamerorna stannade vid räknas en gång. Varje rad i den sammanslagna sträckans observationstabell anger vilken film den kommer från (och länkar till just den filmen i fliken Observationer), kolumnen Videofil 2 i Prioritering länkar till den andra filmen, och översikten i protokollet ritar de två filmernas täckning i olika ton med en streckad skarvlinje där de möts (överlapp skrafferat, ofilmad lucka vit) samt en pil per film med brunn och täckt del. Datum och klockslag tas från den nyare filmen. Ersatta filmer ligger kvar i Prioritering utan rang och får egna protokoll, men räknas inte i statistik, karta, åtgärdspaket eller inspektionsgrad. Delfilmerna i en sammanslagning redovisas bara genom den sammanslagna sträckan (en rad, ett protokoll, observationerna med *film nr X* i kommentaren); vill du ha dem var för sig också sätter du </w:t>
       </w:r>
       <w:r>
         <w:rPr>

</xml_diff>

<commit_message>
Grenrör utan brunn: koppla till GIS-ledningen med fri ände och klipp ut i kartan
Sträckor som slutar i ett påstick på en annan ledning (littera AG, AAG1 …
eller markerade med ratt = grenrör i litterafilen) har ingen slutbrunn.
Analysen tar nu GIS-ledningen från den kända brunnen som slutar i en fri
ände (längd närmast filmens; enda kandidaten med anmärkning), flaggar
"grenrör: …", hoppar dem i littera_forslag.csv och skriver den fria
ändens koordinat och GIS-ledningen till kartunderlaget. Skapa
ledningslager söker vägen från brunnen till den fria änden
(Natverk.vag_till_punkt) och räknar inte grenrörslittera som saknade
brunnar; omatchade får egen diagnos.

Handledning 3.4, 7.11 och KONFIG; CLAUDE.md. Test: scratchpad/gren
(DUF 701 syntetiskt) och test_grenror.py (låtsas-arcpy); facit oförändrat.

Co-Authored-By: Claude Fable 5.1 <noreply@anthropic.com>
Claude-Session: https://claude.ai/code/session_011fdqX3JEZje1LF9LqpaqR8
</commit_message>
<xml_diff>
--- a/Anvandarhandledning tv3_analys.docx
+++ b/Anvandarhandledning tv3_analys.docx
@@ -3172,6 +3172,74 @@
         <w:spacing w:after="80"/>
       </w:pPr>
       <w:r>
+        <w:rPr>
+          <w:b/>
+          <w:bCs/>
+        </w:rPr>
+        <w:t xml:space="preserve">Grenrör i stället för brunn.</w:t>
+      </w:r>
+      <w:r>
+        <w:t xml:space="preserve"> Slutar filmen i ett påstick på en annan ledning finns ingen brunn att matcha. Littera som AG, AAG1, AAG2 … (mönstret </w:t>
+      </w:r>
+      <w:r>
+        <w:rPr>
+          <w:rFonts w:ascii="Consolas" w:cs="Consolas" w:eastAsia="Consolas" w:hAnsi="Consolas"/>
+          <w:sz w:val="20"/>
+          <w:szCs w:val="20"/>
+          <w:shd w:fill="F2F2F2" w:val="clear"/>
+        </w:rPr>
+        <w:t xml:space="preserve">GRENROR_LITTERA</w:t>
+      </w:r>
+      <w:r>
+        <w:t xml:space="preserve"> i KONFIG) tolkas automatiskt så; andra littera markerar du med </w:t>
+      </w:r>
+      <w:r>
+        <w:rPr>
+          <w:rFonts w:ascii="Consolas" w:cs="Consolas" w:eastAsia="Consolas" w:hAnsi="Consolas"/>
+          <w:sz w:val="20"/>
+          <w:szCs w:val="20"/>
+          <w:shd w:fill="F2F2F2" w:val="clear"/>
+        </w:rPr>
+        <w:t xml:space="preserve">grenrör</w:t>
+      </w:r>
+      <w:r>
+        <w:t xml:space="preserve"> i kolumnen </w:t>
+      </w:r>
+      <w:r>
+        <w:rPr>
+          <w:rFonts w:ascii="Consolas" w:cs="Consolas" w:eastAsia="Consolas" w:hAnsi="Consolas"/>
+          <w:sz w:val="20"/>
+          <w:szCs w:val="20"/>
+          <w:shd w:fill="F2F2F2" w:val="clear"/>
+        </w:rPr>
+        <w:t xml:space="preserve">ratt</w:t>
+      </w:r>
+      <w:r>
+        <w:t xml:space="preserve">, t.ex. </w:t>
+      </w:r>
+      <w:r>
+        <w:rPr>
+          <w:rFonts w:ascii="Consolas" w:cs="Consolas" w:eastAsia="Consolas" w:hAnsi="Consolas"/>
+          <w:sz w:val="20"/>
+          <w:szCs w:val="20"/>
+          <w:shd w:fill="F2F2F2" w:val="clear"/>
+        </w:rPr>
+        <w:t xml:space="preserve">KRB62323;grenrör;;55;;påstick</w:t>
+      </w:r>
+      <w:r>
+        <w:t xml:space="preserve"> – litterat behålls men änden behandlas som grenrör. Med GIS-data (7.11) kopplas sträckan då till den ledning i kartan som går från den kända brunnen och slutar i en fri ände, och kartverktyget klipper ut den ledningen fram till påsticket.</w:t>
+      </w:r>
+    </w:p>
+    <w:p>
+      <w:pPr>
+        <w:pStyle w:val="ListParagraph"/>
+        <w:numPr>
+          <w:ilvl w:val="0"/>
+          <w:numId w:val="3"/>
+        </w:numPr>
+        <w:spacing w:after="80"/>
+      </w:pPr>
+      <w:r>
         <w:t xml:space="preserve">Jämförelsen tar inte hänsyn till versaler, mellanslag eller bindestreck.</w:t>
       </w:r>
     </w:p>
@@ -7787,7 +7855,19 @@
                 <w:szCs w:val="20"/>
                 <w:shd w:fill="F2F2F2" w:val="clear"/>
               </w:rPr>
-              <w:t xml:space="preserve">RELINAD_SOM_MATERIAL</w:t>
+              <w:t xml:space="preserve">GRENROR_LITTERA</w:t>
+            </w:r>
+            <w:r>
+              <w:t xml:space="preserve">, </w:t>
+            </w:r>
+            <w:r>
+              <w:rPr>
+                <w:rFonts w:ascii="Consolas" w:cs="Consolas" w:eastAsia="Consolas" w:hAnsi="Consolas"/>
+                <w:sz w:val="20"/>
+                <w:szCs w:val="20"/>
+                <w:shd w:fill="F2F2F2" w:val="clear"/>
+              </w:rPr>
+              <w:t xml:space="preserve">GIS_GRENROR_LANGD_TOL</w:t>
             </w:r>
           </w:p>
         </w:tc>
@@ -7813,7 +7893,7 @@
               <w:spacing w:after="0"/>
             </w:pPr>
             <w:r>
-              <w:t xml:space="preserve">Relinade sträckor redovisas som eget material i fliken Material och diagram 4.</w:t>
+              <w:t xml:space="preserve">Reguljärt uttryck för littera som betyder anslutning till grenrör (ingen brunn), och hur mycket GIS-ledningen med fri ände får avvika från filmens längd (andel, + 3 m) för att väljas utan anmärkning.</w:t>
             </w:r>
           </w:p>
         </w:tc>
@@ -7845,7 +7925,10 @@
                 <w:szCs w:val="20"/>
                 <w:shd w:fill="F2F2F2" w:val="clear"/>
               </w:rPr>
-              <w:t xml:space="preserve">True</w:t>
+              <w:t xml:space="preserve">^A{1,2}G\d*$</w:t>
+            </w:r>
+            <w:r>
+              <w:t xml:space="preserve">, 0,3</w:t>
             </w:r>
           </w:p>
         </w:tc>
@@ -7878,31 +7961,7 @@
                 <w:szCs w:val="20"/>
                 <w:shd w:fill="F2F2F2" w:val="clear"/>
               </w:rPr>
-              <w:t xml:space="preserve">BEHALL_RAPPORTER</w:t>
-            </w:r>
-            <w:r>
-              <w:t xml:space="preserve">, </w:t>
-            </w:r>
-            <w:r>
-              <w:rPr>
-                <w:rFonts w:ascii="Consolas" w:cs="Consolas" w:eastAsia="Consolas" w:hAnsi="Consolas"/>
-                <w:sz w:val="20"/>
-                <w:szCs w:val="20"/>
-                <w:shd w:fill="F2F2F2" w:val="clear"/>
-              </w:rPr>
-              <w:t xml:space="preserve">SPARA_DIAGRAM</w:t>
-            </w:r>
-            <w:r>
-              <w:t xml:space="preserve">, </w:t>
-            </w:r>
-            <w:r>
-              <w:rPr>
-                <w:rFonts w:ascii="Consolas" w:cs="Consolas" w:eastAsia="Consolas" w:hAnsi="Consolas"/>
-                <w:sz w:val="20"/>
-                <w:szCs w:val="20"/>
-                <w:shd w:fill="F2F2F2" w:val="clear"/>
-              </w:rPr>
-              <w:t xml:space="preserve">SKRIV_KARTUNDERLAG</w:t>
+              <w:t xml:space="preserve">RELINAD_SOM_MATERIAL</w:t>
             </w:r>
           </w:p>
         </w:tc>
@@ -7927,43 +7986,7 @@
               <w:spacing w:after="0"/>
             </w:pPr>
             <w:r>
-              <w:t xml:space="preserve">Standardvärden för </w:t>
-            </w:r>
-            <w:r>
-              <w:rPr>
-                <w:rFonts w:ascii="Consolas" w:cs="Consolas" w:eastAsia="Consolas" w:hAnsi="Consolas"/>
-                <w:sz w:val="20"/>
-                <w:szCs w:val="20"/>
-                <w:shd w:fill="F2F2F2" w:val="clear"/>
-              </w:rPr>
-              <w:t xml:space="preserve">--behall-rapporter</w:t>
-            </w:r>
-            <w:r>
-              <w:t xml:space="preserve">, </w:t>
-            </w:r>
-            <w:r>
-              <w:rPr>
-                <w:rFonts w:ascii="Consolas" w:cs="Consolas" w:eastAsia="Consolas" w:hAnsi="Consolas"/>
-                <w:sz w:val="20"/>
-                <w:szCs w:val="20"/>
-                <w:shd w:fill="F2F2F2" w:val="clear"/>
-              </w:rPr>
-              <w:t xml:space="preserve">--diagram</w:t>
-            </w:r>
-            <w:r>
-              <w:t xml:space="preserve"> och </w:t>
-            </w:r>
-            <w:r>
-              <w:rPr>
-                <w:rFonts w:ascii="Consolas" w:cs="Consolas" w:eastAsia="Consolas" w:hAnsi="Consolas"/>
-                <w:sz w:val="20"/>
-                <w:szCs w:val="20"/>
-                <w:shd w:fill="F2F2F2" w:val="clear"/>
-              </w:rPr>
-              <w:t xml:space="preserve">--karta</w:t>
-            </w:r>
-            <w:r>
-              <w:t xml:space="preserve">.</w:t>
+              <w:t xml:space="preserve">Relinade sträckor redovisas som eget material i fliken Material och diagram 4.</w:t>
             </w:r>
           </w:p>
         </w:tc>
@@ -7987,30 +8010,6 @@
             <w:pPr>
               <w:spacing w:after="0"/>
             </w:pPr>
-            <w:r>
-              <w:rPr>
-                <w:rFonts w:ascii="Consolas" w:cs="Consolas" w:eastAsia="Consolas" w:hAnsi="Consolas"/>
-                <w:sz w:val="20"/>
-                <w:szCs w:val="20"/>
-                <w:shd w:fill="F2F2F2" w:val="clear"/>
-              </w:rPr>
-              <w:t xml:space="preserve">False</w:t>
-            </w:r>
-            <w:r>
-              <w:t xml:space="preserve">, </w:t>
-            </w:r>
-            <w:r>
-              <w:rPr>
-                <w:rFonts w:ascii="Consolas" w:cs="Consolas" w:eastAsia="Consolas" w:hAnsi="Consolas"/>
-                <w:sz w:val="20"/>
-                <w:szCs w:val="20"/>
-                <w:shd w:fill="F2F2F2" w:val="clear"/>
-              </w:rPr>
-              <w:t xml:space="preserve">False</w:t>
-            </w:r>
-            <w:r>
-              <w:t xml:space="preserve">, </w:t>
-            </w:r>
             <w:r>
               <w:rPr>
                 <w:rFonts w:ascii="Consolas" w:cs="Consolas" w:eastAsia="Consolas" w:hAnsi="Consolas"/>
@@ -8052,7 +8051,31 @@
                 <w:szCs w:val="20"/>
                 <w:shd w:fill="F2F2F2" w:val="clear"/>
               </w:rPr>
-              <w:t xml:space="preserve">KODER</w:t>
+              <w:t xml:space="preserve">BEHALL_RAPPORTER</w:t>
+            </w:r>
+            <w:r>
+              <w:t xml:space="preserve">, </w:t>
+            </w:r>
+            <w:r>
+              <w:rPr>
+                <w:rFonts w:ascii="Consolas" w:cs="Consolas" w:eastAsia="Consolas" w:hAnsi="Consolas"/>
+                <w:sz w:val="20"/>
+                <w:szCs w:val="20"/>
+                <w:shd w:fill="F2F2F2" w:val="clear"/>
+              </w:rPr>
+              <w:t xml:space="preserve">SPARA_DIAGRAM</w:t>
+            </w:r>
+            <w:r>
+              <w:t xml:space="preserve">, </w:t>
+            </w:r>
+            <w:r>
+              <w:rPr>
+                <w:rFonts w:ascii="Consolas" w:cs="Consolas" w:eastAsia="Consolas" w:hAnsi="Consolas"/>
+                <w:sz w:val="20"/>
+                <w:szCs w:val="20"/>
+                <w:shd w:fill="F2F2F2" w:val="clear"/>
+              </w:rPr>
+              <w:t xml:space="preserve">SKRIV_KARTUNDERLAG</w:t>
             </w:r>
           </w:p>
         </w:tc>
@@ -8078,7 +8101,43 @@
               <w:spacing w:after="0"/>
             </w:pPr>
             <w:r>
-              <w:t xml:space="preserve">Skadekoder med klartext och typ (K = konstruktion, D = drift, I = information).</w:t>
+              <w:t xml:space="preserve">Standardvärden för </w:t>
+            </w:r>
+            <w:r>
+              <w:rPr>
+                <w:rFonts w:ascii="Consolas" w:cs="Consolas" w:eastAsia="Consolas" w:hAnsi="Consolas"/>
+                <w:sz w:val="20"/>
+                <w:szCs w:val="20"/>
+                <w:shd w:fill="F2F2F2" w:val="clear"/>
+              </w:rPr>
+              <w:t xml:space="preserve">--behall-rapporter</w:t>
+            </w:r>
+            <w:r>
+              <w:t xml:space="preserve">, </w:t>
+            </w:r>
+            <w:r>
+              <w:rPr>
+                <w:rFonts w:ascii="Consolas" w:cs="Consolas" w:eastAsia="Consolas" w:hAnsi="Consolas"/>
+                <w:sz w:val="20"/>
+                <w:szCs w:val="20"/>
+                <w:shd w:fill="F2F2F2" w:val="clear"/>
+              </w:rPr>
+              <w:t xml:space="preserve">--diagram</w:t>
+            </w:r>
+            <w:r>
+              <w:t xml:space="preserve"> och </w:t>
+            </w:r>
+            <w:r>
+              <w:rPr>
+                <w:rFonts w:ascii="Consolas" w:cs="Consolas" w:eastAsia="Consolas" w:hAnsi="Consolas"/>
+                <w:sz w:val="20"/>
+                <w:szCs w:val="20"/>
+                <w:shd w:fill="F2F2F2" w:val="clear"/>
+              </w:rPr>
+              <w:t xml:space="preserve">--karta</w:t>
+            </w:r>
+            <w:r>
+              <w:t xml:space="preserve">.</w:t>
             </w:r>
           </w:p>
         </w:tc>
@@ -8104,7 +8163,37 @@
               <w:spacing w:after="0"/>
             </w:pPr>
             <w:r>
-              <w:t xml:space="preserve">P93</w:t>
+              <w:rPr>
+                <w:rFonts w:ascii="Consolas" w:cs="Consolas" w:eastAsia="Consolas" w:hAnsi="Consolas"/>
+                <w:sz w:val="20"/>
+                <w:szCs w:val="20"/>
+                <w:shd w:fill="F2F2F2" w:val="clear"/>
+              </w:rPr>
+              <w:t xml:space="preserve">False</w:t>
+            </w:r>
+            <w:r>
+              <w:t xml:space="preserve">, </w:t>
+            </w:r>
+            <w:r>
+              <w:rPr>
+                <w:rFonts w:ascii="Consolas" w:cs="Consolas" w:eastAsia="Consolas" w:hAnsi="Consolas"/>
+                <w:sz w:val="20"/>
+                <w:szCs w:val="20"/>
+                <w:shd w:fill="F2F2F2" w:val="clear"/>
+              </w:rPr>
+              <w:t xml:space="preserve">False</w:t>
+            </w:r>
+            <w:r>
+              <w:t xml:space="preserve">, </w:t>
+            </w:r>
+            <w:r>
+              <w:rPr>
+                <w:rFonts w:ascii="Consolas" w:cs="Consolas" w:eastAsia="Consolas" w:hAnsi="Consolas"/>
+                <w:sz w:val="20"/>
+                <w:szCs w:val="20"/>
+                <w:shd w:fill="F2F2F2" w:val="clear"/>
+              </w:rPr>
+              <w:t xml:space="preserve">True</w:t>
             </w:r>
           </w:p>
         </w:tc>
@@ -8137,6 +8226,90 @@
                 <w:szCs w:val="20"/>
                 <w:shd w:fill="F2F2F2" w:val="clear"/>
               </w:rPr>
+              <w:t xml:space="preserve">KODER</w:t>
+            </w:r>
+          </w:p>
+        </w:tc>
+        <w:tc>
+          <w:tcPr>
+            <w:tcW w:type="dxa" w:w="5000"/>
+            <w:tcBorders>
+              <w:top w:val="single" w:color="BFBFBF" w:sz="4"/>
+              <w:left w:val="single" w:color="BFBFBF" w:sz="4"/>
+              <w:bottom w:val="single" w:color="BFBFBF" w:sz="4"/>
+              <w:right w:val="single" w:color="BFBFBF" w:sz="4"/>
+            </w:tcBorders>
+            <w:tcMar>
+              <w:top w:type="dxa" w:w="60"/>
+              <w:left w:type="dxa" w:w="100"/>
+              <w:bottom w:type="dxa" w:w="60"/>
+              <w:right w:type="dxa" w:w="100"/>
+            </w:tcMar>
+          </w:tcPr>
+          <w:p>
+            <w:pPr>
+              <w:spacing w:after="0"/>
+            </w:pPr>
+            <w:r>
+              <w:t xml:space="preserve">Skadekoder med klartext och typ (K = konstruktion, D = drift, I = information).</w:t>
+            </w:r>
+          </w:p>
+        </w:tc>
+        <w:tc>
+          <w:tcPr>
+            <w:tcW w:type="dxa" w:w="1760"/>
+            <w:tcBorders>
+              <w:top w:val="single" w:color="BFBFBF" w:sz="4"/>
+              <w:left w:val="single" w:color="BFBFBF" w:sz="4"/>
+              <w:bottom w:val="single" w:color="BFBFBF" w:sz="4"/>
+              <w:right w:val="single" w:color="BFBFBF" w:sz="4"/>
+            </w:tcBorders>
+            <w:tcMar>
+              <w:top w:type="dxa" w:w="60"/>
+              <w:left w:type="dxa" w:w="100"/>
+              <w:bottom w:type="dxa" w:w="60"/>
+              <w:right w:type="dxa" w:w="100"/>
+            </w:tcMar>
+          </w:tcPr>
+          <w:p>
+            <w:pPr>
+              <w:spacing w:after="0"/>
+            </w:pPr>
+            <w:r>
+              <w:t xml:space="preserve">P93</w:t>
+            </w:r>
+          </w:p>
+        </w:tc>
+      </w:tr>
+      <w:tr>
+        <w:tc>
+          <w:tcPr>
+            <w:tcW w:type="dxa" w:w="2600"/>
+            <w:tcBorders>
+              <w:top w:val="single" w:color="BFBFBF" w:sz="4"/>
+              <w:left w:val="single" w:color="BFBFBF" w:sz="4"/>
+              <w:bottom w:val="single" w:color="BFBFBF" w:sz="4"/>
+              <w:right w:val="single" w:color="BFBFBF" w:sz="4"/>
+            </w:tcBorders>
+            <w:shd w:fill="F7F9FC" w:val="clear"/>
+            <w:tcMar>
+              <w:top w:type="dxa" w:w="60"/>
+              <w:left w:type="dxa" w:w="100"/>
+              <w:bottom w:type="dxa" w:w="60"/>
+              <w:right w:type="dxa" w:w="100"/>
+            </w:tcMar>
+          </w:tcPr>
+          <w:p>
+            <w:pPr>
+              <w:spacing w:after="0"/>
+            </w:pPr>
+            <w:r>
+              <w:rPr>
+                <w:rFonts w:ascii="Consolas" w:cs="Consolas" w:eastAsia="Consolas" w:hAnsi="Consolas"/>
+                <w:sz w:val="20"/>
+                <w:szCs w:val="20"/>
+                <w:shd w:fill="F2F2F2" w:val="clear"/>
+              </w:rPr>
               <w:t xml:space="preserve">ATTRIBUT</w:t>
             </w:r>
             <w:r>
@@ -8162,6 +8335,7 @@
               <w:bottom w:val="single" w:color="BFBFBF" w:sz="4"/>
               <w:right w:val="single" w:color="BFBFBF" w:sz="4"/>
             </w:tcBorders>
+            <w:shd w:fill="F7F9FC" w:val="clear"/>
             <w:tcMar>
               <w:top w:type="dxa" w:w="60"/>
               <w:left w:type="dxa" w:w="100"/>
@@ -8187,6 +8361,7 @@
               <w:bottom w:val="single" w:color="BFBFBF" w:sz="4"/>
               <w:right w:val="single" w:color="BFBFBF" w:sz="4"/>
             </w:tcBorders>
+            <w:shd w:fill="F7F9FC" w:val="clear"/>
             <w:tcMar>
               <w:top w:type="dxa" w:w="60"/>
               <w:left w:type="dxa" w:w="100"/>
@@ -13168,6 +13343,50 @@
       </w:r>
       <w:r>
         <w:t xml:space="preserve"> i KONFIG) kontrolleras inte.</w:t>
+      </w:r>
+    </w:p>
+    <w:p>
+      <w:pPr>
+        <w:pStyle w:val="ListParagraph"/>
+        <w:numPr>
+          <w:ilvl w:val="0"/>
+          <w:numId w:val="3"/>
+        </w:numPr>
+        <w:spacing w:after="80"/>
+      </w:pPr>
+      <w:r>
+        <w:rPr>
+          <w:b/>
+          <w:bCs/>
+        </w:rPr>
+        <w:t xml:space="preserve">grenrör: GIS-ledningen från KTB1000824 med fri ände (23,4 m) antagen</w:t>
+      </w:r>
+      <w:r>
+        <w:t xml:space="preserve"> – sträckan slutar (eller börjar) i ett påstick på en annan ledning (littera AG/AAG…, eller markerat med </w:t>
+      </w:r>
+      <w:r>
+        <w:rPr>
+          <w:rFonts w:ascii="Consolas" w:cs="Consolas" w:eastAsia="Consolas" w:hAnsi="Consolas"/>
+          <w:sz w:val="20"/>
+          <w:szCs w:val="20"/>
+          <w:shd w:fill="F2F2F2" w:val="clear"/>
+        </w:rPr>
+        <w:t xml:space="preserve">grenrör</w:t>
+      </w:r>
+      <w:r>
+        <w:t xml:space="preserve"> i litterafilen, se 3.4). Analysen tar den ledning i GIS som utgår från den kända brunnen och slutar i en fri ände, i första hand den vars längd ligger inom 30 % (</w:t>
+      </w:r>
+      <w:r>
+        <w:rPr>
+          <w:rFonts w:ascii="Consolas" w:cs="Consolas" w:eastAsia="Consolas" w:hAnsi="Consolas"/>
+          <w:sz w:val="20"/>
+          <w:szCs w:val="20"/>
+          <w:shd w:fill="F2F2F2" w:val="clear"/>
+        </w:rPr>
+        <w:t xml:space="preserve">GIS_GRENROR_LANGD_TOL</w:t>
+      </w:r>
+      <w:r>
+        <w:t xml:space="preserve">) av filmens; finns bara en sådan ledning tas den även om längden avviker, med tillägget *längden avviker*. Den räknas som filmad i inspektionsgraden, ger kartlängd och vattengång i brunnsänden, och kartunderlaget får den fria ändens koordinat så att Skapa ledningslager kan klippa ut ledningen från brunnen till påsticket (loggen anger antal grenrörsanslutningar; omatchade får diagnosen *grenror: …*). Finns ingen sådan ledning: *grenrör: ingen ledning med fri ände från KTB1000824 i GIS*. Grenrörslittera hamnar inte i littera_forslag.csv.</w:t>
       </w:r>
     </w:p>
     <w:p>

</xml_diff>

<commit_message>
Ände utan brunn: servis och propp hanteras som grenrör, med typ i flaggan
ratt-kolumnen i brunnslittera.csv godtar grenrör/påstick, servis och
ände/fri ände/propp; typen sparas per ände och inleder GIS-flaggan
("servis: GIS-ledningen från X med fri ände …"). Samma koppling till
GIS-ledningen med fri ände och samma utklippning i kartan som för grenrör.

Handledning 3.4 och 7.11, CLAUDE.md.

Co-Authored-By: Claude Fable 5.1 <noreply@anthropic.com>
Claude-Session: https://claude.ai/code/session_011fdqX3JEZje1LF9LqpaqR8
</commit_message>
<xml_diff>
--- a/Anvandarhandledning tv3_analys.docx
+++ b/Anvandarhandledning tv3_analys.docx
@@ -3176,10 +3176,10 @@
           <w:b/>
           <w:bCs/>
         </w:rPr>
-        <w:t xml:space="preserve">Grenrör i stället för brunn.</w:t>
-      </w:r>
-      <w:r>
-        <w:t xml:space="preserve"> Slutar filmen i ett påstick på en annan ledning finns ingen brunn att matcha. Littera som AG, AAG1, AAG2 … (mönstret </w:t>
+        <w:t xml:space="preserve">Ände utan brunn: grenrör, servis eller propp.</w:t>
+      </w:r>
+      <w:r>
+        <w:t xml:space="preserve"> Slutar filmen i ett påstick på en annan ledning, i en servisanslutning eller i en ledningsände utan brunn finns ingen brunn att matcha. Littera som AG, AAG1, AAG2 … (mönstret </w:t>
       </w:r>
       <w:r>
         <w:rPr>
@@ -3191,7 +3191,19 @@
         <w:t xml:space="preserve">GRENROR_LITTERA</w:t>
       </w:r>
       <w:r>
-        <w:t xml:space="preserve"> i KONFIG) tolkas automatiskt så; andra littera markerar du med </w:t>
+        <w:t xml:space="preserve"> i KONFIG) tolkas automatiskt som grenrör; andra littera markerar du i kolumnen </w:t>
+      </w:r>
+      <w:r>
+        <w:rPr>
+          <w:rFonts w:ascii="Consolas" w:cs="Consolas" w:eastAsia="Consolas" w:hAnsi="Consolas"/>
+          <w:sz w:val="20"/>
+          <w:szCs w:val="20"/>
+          <w:shd w:fill="F2F2F2" w:val="clear"/>
+        </w:rPr>
+        <w:t xml:space="preserve">ratt</w:t>
+      </w:r>
+      <w:r>
+        <w:t xml:space="preserve"> med </w:t>
       </w:r>
       <w:r>
         <w:rPr>
@@ -3203,31 +3215,79 @@
         <w:t xml:space="preserve">grenrör</w:t>
       </w:r>
       <w:r>
-        <w:t xml:space="preserve"> i kolumnen </w:t>
-      </w:r>
-      <w:r>
-        <w:rPr>
-          <w:rFonts w:ascii="Consolas" w:cs="Consolas" w:eastAsia="Consolas" w:hAnsi="Consolas"/>
-          <w:sz w:val="20"/>
-          <w:szCs w:val="20"/>
-          <w:shd w:fill="F2F2F2" w:val="clear"/>
-        </w:rPr>
-        <w:t xml:space="preserve">ratt</w:t>
-      </w:r>
-      <w:r>
-        <w:t xml:space="preserve">, t.ex. </w:t>
-      </w:r>
-      <w:r>
-        <w:rPr>
-          <w:rFonts w:ascii="Consolas" w:cs="Consolas" w:eastAsia="Consolas" w:hAnsi="Consolas"/>
-          <w:sz w:val="20"/>
-          <w:szCs w:val="20"/>
-          <w:shd w:fill="F2F2F2" w:val="clear"/>
-        </w:rPr>
-        <w:t xml:space="preserve">KRB62323;grenrör;;55;;påstick</w:t>
-      </w:r>
-      <w:r>
-        <w:t xml:space="preserve"> – litterat behålls men änden behandlas som grenrör. Med GIS-data (7.11) kopplas sträckan då till den ledning i kartan som går från den kända brunnen och slutar i en fri ände, och kartverktyget klipper ut den ledningen fram till påsticket.</w:t>
+        <w:t xml:space="preserve">, </w:t>
+      </w:r>
+      <w:r>
+        <w:rPr>
+          <w:rFonts w:ascii="Consolas" w:cs="Consolas" w:eastAsia="Consolas" w:hAnsi="Consolas"/>
+          <w:sz w:val="20"/>
+          <w:szCs w:val="20"/>
+          <w:shd w:fill="F2F2F2" w:val="clear"/>
+        </w:rPr>
+        <w:t xml:space="preserve">servis</w:t>
+      </w:r>
+      <w:r>
+        <w:t xml:space="preserve"> eller </w:t>
+      </w:r>
+      <w:r>
+        <w:rPr>
+          <w:rFonts w:ascii="Consolas" w:cs="Consolas" w:eastAsia="Consolas" w:hAnsi="Consolas"/>
+          <w:sz w:val="20"/>
+          <w:szCs w:val="20"/>
+          <w:shd w:fill="F2F2F2" w:val="clear"/>
+        </w:rPr>
+        <w:t xml:space="preserve">ände</w:t>
+      </w:r>
+      <w:r>
+        <w:t xml:space="preserve"> (även </w:t>
+      </w:r>
+      <w:r>
+        <w:rPr>
+          <w:rFonts w:ascii="Consolas" w:cs="Consolas" w:eastAsia="Consolas" w:hAnsi="Consolas"/>
+          <w:sz w:val="20"/>
+          <w:szCs w:val="20"/>
+          <w:shd w:fill="F2F2F2" w:val="clear"/>
+        </w:rPr>
+        <w:t xml:space="preserve">påstick</w:t>
+      </w:r>
+      <w:r>
+        <w:t xml:space="preserve">, </w:t>
+      </w:r>
+      <w:r>
+        <w:rPr>
+          <w:rFonts w:ascii="Consolas" w:cs="Consolas" w:eastAsia="Consolas" w:hAnsi="Consolas"/>
+          <w:sz w:val="20"/>
+          <w:szCs w:val="20"/>
+          <w:shd w:fill="F2F2F2" w:val="clear"/>
+        </w:rPr>
+        <w:t xml:space="preserve">propp</w:t>
+      </w:r>
+      <w:r>
+        <w:t xml:space="preserve">, </w:t>
+      </w:r>
+      <w:r>
+        <w:rPr>
+          <w:rFonts w:ascii="Consolas" w:cs="Consolas" w:eastAsia="Consolas" w:hAnsi="Consolas"/>
+          <w:sz w:val="20"/>
+          <w:szCs w:val="20"/>
+          <w:shd w:fill="F2F2F2" w:val="clear"/>
+        </w:rPr>
+        <w:t xml:space="preserve">fri ände</w:t>
+      </w:r>
+      <w:r>
+        <w:t xml:space="preserve">), t.ex. </w:t>
+      </w:r>
+      <w:r>
+        <w:rPr>
+          <w:rFonts w:ascii="Consolas" w:cs="Consolas" w:eastAsia="Consolas" w:hAnsi="Consolas"/>
+          <w:sz w:val="20"/>
+          <w:szCs w:val="20"/>
+          <w:shd w:fill="F2F2F2" w:val="clear"/>
+        </w:rPr>
+        <w:t xml:space="preserve">KRB62323;servis;;55;;</w:t>
+      </w:r>
+      <w:r>
+        <w:t xml:space="preserve"> – litterat behålls men änden behandlas som en ände utan brunn, och ordet visas i GIS-flaggan. Hanteringen är densamma för alla tre: med GIS-data (7.11) kopplas sträckan till den ledning i kartan som går från den kända brunnen och slutar i en fri ände, och kartverktyget klipper ut den ledningen fram till änden. Det förutsätter att ledningen i kartan slutar utan brunn i den änden (serviskopplingspunkter och ledningsändar ligger i egna lager och räknas inte som brunnar).</w:t>
       </w:r>
     </w:p>
     <w:p>
@@ -13362,7 +13422,7 @@
         <w:t xml:space="preserve">grenrör: GIS-ledningen från KTB1000824 med fri ände (23,4 m) antagen</w:t>
       </w:r>
       <w:r>
-        <w:t xml:space="preserve"> – sträckan slutar (eller börjar) i ett påstick på en annan ledning (littera AG/AAG…, eller markerat med </w:t>
+        <w:t xml:space="preserve"> (eller *servis:* / *ände utan brunn:*) – sträckan slutar (eller börjar) i ett påstick på en annan ledning, en servisanslutning eller en propp (littera AG/AAG…, eller markerat med </w:t>
       </w:r>
       <w:r>
         <w:rPr>
@@ -13372,6 +13432,30 @@
           <w:shd w:fill="F2F2F2" w:val="clear"/>
         </w:rPr>
         <w:t xml:space="preserve">grenrör</w:t>
+      </w:r>
+      <w:r>
+        <w:t xml:space="preserve">/</w:t>
+      </w:r>
+      <w:r>
+        <w:rPr>
+          <w:rFonts w:ascii="Consolas" w:cs="Consolas" w:eastAsia="Consolas" w:hAnsi="Consolas"/>
+          <w:sz w:val="20"/>
+          <w:szCs w:val="20"/>
+          <w:shd w:fill="F2F2F2" w:val="clear"/>
+        </w:rPr>
+        <w:t xml:space="preserve">servis</w:t>
+      </w:r>
+      <w:r>
+        <w:t xml:space="preserve">/</w:t>
+      </w:r>
+      <w:r>
+        <w:rPr>
+          <w:rFonts w:ascii="Consolas" w:cs="Consolas" w:eastAsia="Consolas" w:hAnsi="Consolas"/>
+          <w:sz w:val="20"/>
+          <w:szCs w:val="20"/>
+          <w:shd w:fill="F2F2F2" w:val="clear"/>
+        </w:rPr>
+        <w:t xml:space="preserve">ände</w:t>
       </w:r>
       <w:r>
         <w:t xml:space="preserve"> i litterafilen, se 3.4). Analysen tar den ledning i GIS som utgår från den kända brunnen och slutar i en fri ände, i första hand den vars längd ligger inom 30 % (</w:t>

</xml_diff>

<commit_message>
Avbruten inspektion vid alla KAM-attribut; ÄND-littera som ände utan brunn
"Avbruten inspektion" krävde KAM med attributet HINDE; KAM med ANNAN
(annan orsak) eller utan attribut visades inte som avbrott (3 i DUF 701,
användarens sträcka ÄND 35 → KNBL1016114, 2,7 m). Nu räknas varje KAM.
Effekt i DUF 701: nr 184 (KAM/ANNAN i slutet) är ofullständig och slås
ihop med 179 till nr 188 i stället för att ersätta den; klasser oförändrade.
Excel/PDF visar "Ja (kortare än kartan)" när filmen är under 85 % av
kartlängden utan KAM. Nytt mönster ANDE_LITTERA (ÄND 35, ÄNDE1) tolkas
som ände utan brunn, som AG/AAG för grenrör.

Handledning (3.4, 7.5, KONFIG, Excel-fliken), metodbeskrivning (7) och
CLAUDE.md uppdaterade.

Co-Authored-By: Claude Fable 5.1 <noreply@anthropic.com>
Claude-Session: https://claude.ai/code/session_011fdqX3JEZje1LF9LqpaqR8
</commit_message>
<xml_diff>
--- a/Anvandarhandledning tv3_analys.docx
+++ b/Anvandarhandledning tv3_analys.docx
@@ -3191,7 +3191,19 @@
         <w:t xml:space="preserve">GRENROR_LITTERA</w:t>
       </w:r>
       <w:r>
-        <w:t xml:space="preserve"> i KONFIG) tolkas automatiskt som grenrör; andra littera markerar du i kolumnen </w:t>
+        <w:t xml:space="preserve"> i KONFIG) tolkas automatiskt som grenrör och ÄND 35, ÄNDE1 … (</w:t>
+      </w:r>
+      <w:r>
+        <w:rPr>
+          <w:rFonts w:ascii="Consolas" w:cs="Consolas" w:eastAsia="Consolas" w:hAnsi="Consolas"/>
+          <w:sz w:val="20"/>
+          <w:szCs w:val="20"/>
+          <w:shd w:fill="F2F2F2" w:val="clear"/>
+        </w:rPr>
+        <w:t xml:space="preserve">ANDE_LITTERA</w:t>
+      </w:r>
+      <w:r>
+        <w:t xml:space="preserve">) som ände utan brunn; andra littera markerar du i kolumnen </w:t>
       </w:r>
       <w:r>
         <w:rPr>
@@ -4227,7 +4239,7 @@
               <w:spacing w:after="0"/>
             </w:pPr>
             <w:r>
-              <w:t xml:space="preserve">En rad per sträcka, rankad efter prioritetsklass och index. Använd autofiltret för att filtrera på klass, material, ledningstyp, område eller fil. Kolumnen Skador (kod+grad) visar t.ex. 9×YTS4, 1×SPR3. Kolumnerna Avbruten inspektion, Inspekterad flera ggr, Filmstatus (ersatt av nyare film, sammanslagen av två delfilmer – se avsnitt 8), Tidigare inspektion (klass och index vid förra inspektionen när samma sträcka finns i en äldre TV3-fil) och Relinad ger extra kontext. Ur inklinometerprofilen beräknas Svackdjup i cm (största stående vattendjup i en svacka), Svackdjup/diameter, Svacklängd, Bakfall längd (meter med lutning mot flödesriktningen) och Lutning; Profil osäker markerar sträckor där inklinometerns fall avviker kraftigt från brunnshöjderna och profilen därför inte bör användas. Anslutningar räknar registrerade anslutningar (AS/AG) på sträckan. Enheten (m, mm, p/100 m …) står på en egen rad under rubrikerna, så rubrikerna är korta. Med markprofil från ArcMap (7.5) fylls även Höjdanpassning, Täckning min/max och Höjdflagga i, och med GIS-data (7.11) kolumnen GIS-flagga (avvikelser mellan film och karta) samt de dolda Lutning GIS, Djup start/slut, Anläggningsår, Renoveringsår GIS och Driftområde. Bara de viktigaste kolumnerna visas från början; övriga (fil, nr, område, datum, drift- och totalindex, driftåtgärd, profilmått, höjdflagga m.m.) är dolda i grupper och fälls ut med plustecknet ovanför kolumnrubrikerna eller knappen 2 uppe till vänster. Vilka som döljs styrs av </w:t>
+              <w:t xml:space="preserve">En rad per sträcka, rankad efter prioritetsklass och index. Använd autofiltret för att filtrera på klass, material, ledningstyp, område eller fil. Kolumnen Skador (kod+grad) visar t.ex. 9×YTS4, 1×SPR3. Kolumnerna Avbruten inspektion (*Ja* vid koden KAM, *Ja (kortare än kartan)* när filmen är under 85 % av kartlängden utan KAM), Inspekterad flera ggr, Filmstatus (ersatt av nyare film, sammanslagen av två delfilmer – se avsnitt 8), Tidigare inspektion (klass och index vid förra inspektionen när samma sträcka finns i en äldre TV3-fil) och Relinad ger extra kontext. Ur inklinometerprofilen beräknas Svackdjup i cm (största stående vattendjup i en svacka), Svackdjup/diameter, Svacklängd, Bakfall längd (meter med lutning mot flödesriktningen) och Lutning; Profil osäker markerar sträckor där inklinometerns fall avviker kraftigt från brunnshöjderna och profilen därför inte bör användas. Anslutningar räknar registrerade anslutningar (AS/AG) på sträckan. Enheten (m, mm, p/100 m …) står på en egen rad under rubrikerna, så rubrikerna är korta. Med markprofil från ArcMap (7.5) fylls även Höjdanpassning, Täckning min/max och Höjdflagga i, och med GIS-data (7.11) kolumnen GIS-flagga (avvikelser mellan film och karta) samt de dolda Lutning GIS, Djup start/slut, Anläggningsår, Renoveringsår GIS och Driftområde. Bara de viktigaste kolumnerna visas från början; övriga (fil, nr, område, datum, drift- och totalindex, driftåtgärd, profilmått, höjdflagga m.m.) är dolda i grupper och fälls ut med plustecknet ovanför kolumnrubrikerna eller knappen 2 uppe till vänster. Vilka som döljs styrs av </w:t>
             </w:r>
             <w:r>
               <w:rPr>
@@ -7927,6 +7939,18 @@
                 <w:szCs w:val="20"/>
                 <w:shd w:fill="F2F2F2" w:val="clear"/>
               </w:rPr>
+              <w:t xml:space="preserve">ANDE_LITTERA</w:t>
+            </w:r>
+            <w:r>
+              <w:t xml:space="preserve">, </w:t>
+            </w:r>
+            <w:r>
+              <w:rPr>
+                <w:rFonts w:ascii="Consolas" w:cs="Consolas" w:eastAsia="Consolas" w:hAnsi="Consolas"/>
+                <w:sz w:val="20"/>
+                <w:szCs w:val="20"/>
+                <w:shd w:fill="F2F2F2" w:val="clear"/>
+              </w:rPr>
               <w:t xml:space="preserve">GIS_GRENROR_LANGD_TOL</w:t>
             </w:r>
           </w:p>
@@ -7953,7 +7977,7 @@
               <w:spacing w:after="0"/>
             </w:pPr>
             <w:r>
-              <w:t xml:space="preserve">Reguljärt uttryck för littera som betyder anslutning till grenrör (ingen brunn), och hur mycket GIS-ledningen med fri ände får avvika från filmens längd (andel, + 3 m) för att väljas utan anmärkning.</w:t>
+              <w:t xml:space="preserve">Reguljära uttryck för littera som betyder anslutning till grenrör respektive ledningsände utan brunn, och hur mycket GIS-ledningen med fri ände får avvika från filmens längd (andel, + 3 m) för att kopplas.</w:t>
             </w:r>
           </w:p>
         </w:tc>
@@ -7986,6 +8010,18 @@
                 <w:shd w:fill="F2F2F2" w:val="clear"/>
               </w:rPr>
               <w:t xml:space="preserve">^A{1,2}G\d*$</w:t>
+            </w:r>
+            <w:r>
+              <w:t xml:space="preserve">, </w:t>
+            </w:r>
+            <w:r>
+              <w:rPr>
+                <w:rFonts w:ascii="Consolas" w:cs="Consolas" w:eastAsia="Consolas" w:hAnsi="Consolas"/>
+                <w:sz w:val="20"/>
+                <w:szCs w:val="20"/>
+                <w:shd w:fill="F2F2F2" w:val="clear"/>
+              </w:rPr>
+              <w:t xml:space="preserve">^[ÄA]NDE?\d*$</w:t>
             </w:r>
             <w:r>
               <w:t xml:space="preserve">, 0,3</w:t>
@@ -12187,7 +12223,7 @@
         <w:t xml:space="preserve">Avbrutna inspektioner.</w:t>
       </w:r>
       <w:r>
-        <w:t xml:space="preserve"> När kameran inte nådde fram (koden KAM/HINDE, eller filmad längd under 85 % av ledningens längd i kartan) är filens sluthöjd bara höjden där kameran stannade, inte slutbrunnens. Profilen hängs då upp enbart i den brunn kameran startade i (status *förskjuten till GIS vid &lt;brunn&gt; (avbruten inspektion)*), utan lutningskorrigering, och positionerna skalas inte: en meter i filmen är en meter i kartan räknat från startbrunnen. Markytan och täckningen tas bara med för den filmade delen, och i diagrammet står 'avbrott' i stället för brunnsnamnet i den ände som inte nåddes. Är samma sträcka filmad från båda håll efter ett avbrott hängs varje film upp i sin egen startbrunn.</w:t>
+        <w:t xml:space="preserve"> När kameran inte nådde fram (koden KAM oavsett orsak – hinder, annan orsak eller utan attribut – eller filmad längd under 85 % av ledningens längd i kartan) är filens sluthöjd bara höjden där kameran stannade, inte slutbrunnens. Profilen hängs då upp enbart i den brunn kameran startade i (status *förskjuten till GIS vid &lt;brunn&gt; (avbruten inspektion)*), utan lutningskorrigering, och positionerna skalas inte: en meter i filmen är en meter i kartan räknat från startbrunnen. Markytan och täckningen tas bara med för den filmade delen, och i diagrammet står 'avbrott' i stället för brunnsnamnet i den ände som inte nåddes. Är samma sträcka filmad från båda håll efter ett avbrott hängs varje film upp i sin egen startbrunn.</w:t>
       </w:r>
     </w:p>
     <w:p>

</xml_diff>

<commit_message>
Parallella ledningar efter typ/dimension; avbruten film förbi flera brunnar
Skapa ledningslager väljer den parallella ledning (spill/dag i samma schakt,
bräddbrunnar) som har filmens ledningstyp och dimension, med nya fältval i
verktyget och fältet GIS_AVVIK när ingen bättre finns. Avbrutna filmer ritas
bara så långt kameran kom (KLIPPT). Analysen söker GIS-vägen via upp till åtta
ledningar, föredrar filmens ledningstyp, räknar taket för avbrutna filmer från
brunnarnas avstånd och skriver mellanbrunnarna (gis_via) i kartunderlaget så
att kartverktyget släpper igenom dem.

Co-Authored-By: Claude Opus 5.5 <noreply@anthropic.com>
Claude-Session: https://claude.ai/code/session_011fdqX3JEZje1LF9LqpaqR8
</commit_message>
<xml_diff>
--- a/Anvandarhandledning tv3_analys.docx
+++ b/Anvandarhandledning tv3_analys.docx
@@ -6526,7 +6526,7 @@
               <w:spacing w:after="0"/>
             </w:pPr>
             <w:r>
-              <w:t xml:space="preserve">Saknas direkt ledning i GIS mellan brunnarna söks en väg via andra brunnar: högst så många ledningar och högst andelen × filmens längd + 20 m. Hittas ingen väg används brunnarnas avstånd fågelvägen som kartlängd.</w:t>
+              <w:t xml:space="preserve">Saknas direkt ledning i GIS mellan brunnarna söks en väg via andra brunnar: högst så många ledningar och högst andelen × filmens längd + 20 m (vid avbruten film räknas taket från brunnarnas avstånd, eftersom filmen är kortare än ledningen). Hittas ingen väg används brunnarnas avstånd fågelvägen som kartlängd.</w:t>
             </w:r>
           </w:p>
         </w:tc>
@@ -6551,7 +6551,7 @@
               <w:spacing w:after="0"/>
             </w:pPr>
             <w:r>
-              <w:t xml:space="preserve">4, 2,0</w:t>
+              <w:t xml:space="preserve">8, 2,0</w:t>
             </w:r>
           </w:p>
         </w:tc>
@@ -6585,19 +6585,7 @@
                 <w:szCs w:val="20"/>
                 <w:shd w:fill="F2F2F2" w:val="clear"/>
               </w:rPr>
-              <w:t xml:space="preserve">HOJD_SAKNAS_UNDER</w:t>
-            </w:r>
-            <w:r>
-              <w:t xml:space="preserve">, </w:t>
-            </w:r>
-            <w:r>
-              <w:rPr>
-                <w:rFonts w:ascii="Consolas" w:cs="Consolas" w:eastAsia="Consolas" w:hAnsi="Consolas"/>
-                <w:sz w:val="20"/>
-                <w:szCs w:val="20"/>
-                <w:shd w:fill="F2F2F2" w:val="clear"/>
-              </w:rPr>
-              <w:t xml:space="preserve">HOJD_ORIMLIG_M</w:t>
+              <w:t xml:space="preserve">GIS_DIM_TOL</w:t>
             </w:r>
           </w:p>
         </w:tc>
@@ -6623,7 +6611,7 @@
               <w:spacing w:after="0"/>
             </w:pPr>
             <w:r>
-              <w:t xml:space="preserve">Rimlighet hos höjderna i TV3-filen: värden under det första (SVOA skriver −9999 för saknad) räknas som saknade; skiljer brunnshöjderna i PROFILADM mer än det andra, eller spänner inklinometerprofilen över mer än så, är höjderna fel i filen och används inte (Höjdflagga *Höjdfel i filen*, lutning *okänd*, profilen ritas inte).</w:t>
+              <w:t xml:space="preserve">Finns flera ledningar mellan samma brunnar i GIS (spill och dag parallellt, bräddbrunnar) väljs den med filmens ledningstyp, sedan den vars dimension ligger inom denna andel av filmens, sist den med längd närmast filmens.</w:t>
             </w:r>
           </w:p>
         </w:tc>
@@ -6649,7 +6637,7 @@
               <w:spacing w:after="0"/>
             </w:pPr>
             <w:r>
-              <w:t xml:space="preserve">−999, 50</w:t>
+              <w:t xml:space="preserve">0,1</w:t>
             </w:r>
           </w:p>
         </w:tc>
@@ -6682,7 +6670,19 @@
                 <w:szCs w:val="20"/>
                 <w:shd w:fill="F2F2F2" w:val="clear"/>
               </w:rPr>
-              <w:t xml:space="preserve">DELFILMER_SEPARAT</w:t>
+              <w:t xml:space="preserve">HOJD_SAKNAS_UNDER</w:t>
+            </w:r>
+            <w:r>
+              <w:t xml:space="preserve">, </w:t>
+            </w:r>
+            <w:r>
+              <w:rPr>
+                <w:rFonts w:ascii="Consolas" w:cs="Consolas" w:eastAsia="Consolas" w:hAnsi="Consolas"/>
+                <w:sz w:val="20"/>
+                <w:szCs w:val="20"/>
+                <w:shd w:fill="F2F2F2" w:val="clear"/>
+              </w:rPr>
+              <w:t xml:space="preserve">HOJD_ORIMLIG_M</w:t>
             </w:r>
           </w:p>
         </w:tc>
@@ -6707,16 +6707,7 @@
               <w:spacing w:after="0"/>
             </w:pPr>
             <w:r>
-              <w:rPr>
-                <w:rFonts w:ascii="Consolas" w:cs="Consolas" w:eastAsia="Consolas" w:hAnsi="Consolas"/>
-                <w:sz w:val="20"/>
-                <w:szCs w:val="20"/>
-                <w:shd w:fill="F2F2F2" w:val="clear"/>
-              </w:rPr>
-              <w:t xml:space="preserve">True</w:t>
-            </w:r>
-            <w:r>
-              <w:t xml:space="preserve"> listar delfilmerna i en sammanslagning även var för sig i Prioritering och Observationer och ger dem egna protokoll.</w:t>
+              <w:t xml:space="preserve">Rimlighet hos höjderna i TV3-filen: värden under det första (SVOA skriver −9999 för saknad) räknas som saknade; skiljer brunnshöjderna i PROFILADM mer än det andra, eller spänner inklinometerprofilen över mer än så, är höjderna fel i filen och används inte (Höjdflagga *Höjdfel i filen*, lutning *okänd*, profilen ritas inte).</w:t>
             </w:r>
           </w:p>
         </w:tc>
@@ -6741,13 +6732,7 @@
               <w:spacing w:after="0"/>
             </w:pPr>
             <w:r>
-              <w:rPr>
-                <w:rFonts w:ascii="Consolas" w:cs="Consolas" w:eastAsia="Consolas" w:hAnsi="Consolas"/>
-                <w:sz w:val="20"/>
-                <w:szCs w:val="20"/>
-                <w:shd w:fill="F2F2F2" w:val="clear"/>
-              </w:rPr>
-              <w:t xml:space="preserve">False</w:t>
+              <w:t xml:space="preserve">−999, 50</w:t>
             </w:r>
           </w:p>
         </w:tc>
@@ -6781,19 +6766,7 @@
                 <w:szCs w:val="20"/>
                 <w:shd w:fill="F2F2F2" w:val="clear"/>
               </w:rPr>
-              <w:t xml:space="preserve">OMFILMNING_OVER_FILER</w:t>
-            </w:r>
-            <w:r>
-              <w:t xml:space="preserve">, </w:t>
-            </w:r>
-            <w:r>
-              <w:rPr>
-                <w:rFonts w:ascii="Consolas" w:cs="Consolas" w:eastAsia="Consolas" w:hAnsi="Consolas"/>
-                <w:sz w:val="20"/>
-                <w:szCs w:val="20"/>
-                <w:shd w:fill="F2F2F2" w:val="clear"/>
-              </w:rPr>
-              <w:t xml:space="preserve">TIDIGARE_INDEX_ANDEL</w:t>
+              <w:t xml:space="preserve">DELFILMER_SEPARAT</w:t>
             </w:r>
           </w:p>
         </w:tc>
@@ -6819,7 +6792,16 @@
               <w:spacing w:after="0"/>
             </w:pPr>
             <w:r>
-              <w:t xml:space="preserve">Samma brunnspar i olika TV3-filer (olika inspektionsomgångar): den nyaste filmen gäller, äldre markeras *ersatt av ny inspektion* och den gällande får kolumnen Tidigare inspektion (klass och konstruktionsindex då → nu). Inom samma klass räknas sträckan som förvärrad/förbättrad när indexet ändrats mer än andelen (och minst 5 p/100 m).</w:t>
+              <w:rPr>
+                <w:rFonts w:ascii="Consolas" w:cs="Consolas" w:eastAsia="Consolas" w:hAnsi="Consolas"/>
+                <w:sz w:val="20"/>
+                <w:szCs w:val="20"/>
+                <w:shd w:fill="F2F2F2" w:val="clear"/>
+              </w:rPr>
+              <w:t xml:space="preserve">True</w:t>
+            </w:r>
+            <w:r>
+              <w:t xml:space="preserve"> listar delfilmerna i en sammanslagning även var för sig i Prioritering och Observationer och ger dem egna protokoll.</w:t>
             </w:r>
           </w:p>
         </w:tc>
@@ -6851,10 +6833,7 @@
                 <w:szCs w:val="20"/>
                 <w:shd w:fill="F2F2F2" w:val="clear"/>
               </w:rPr>
-              <w:t xml:space="preserve">True</w:t>
-            </w:r>
-            <w:r>
-              <w:t xml:space="preserve">, 0,2</w:t>
+              <w:t xml:space="preserve">False</w:t>
             </w:r>
           </w:p>
         </w:tc>
@@ -6887,7 +6866,7 @@
                 <w:szCs w:val="20"/>
                 <w:shd w:fill="F2F2F2" w:val="clear"/>
               </w:rPr>
-              <w:t xml:space="preserve">GIS_LANGD_TOL</w:t>
+              <w:t xml:space="preserve">OMFILMNING_OVER_FILER</w:t>
             </w:r>
             <w:r>
               <w:t xml:space="preserve">, </w:t>
@@ -6899,7 +6878,7 @@
                 <w:szCs w:val="20"/>
                 <w:shd w:fill="F2F2F2" w:val="clear"/>
               </w:rPr>
-              <w:t xml:space="preserve">GIS_LITTERA_LIKHET</w:t>
+              <w:t xml:space="preserve">TIDIGARE_INDEX_ANDEL</w:t>
             </w:r>
           </w:p>
         </w:tc>
@@ -6924,7 +6903,7 @@
               <w:spacing w:after="0"/>
             </w:pPr>
             <w:r>
-              <w:t xml:space="preserve">Förslag på rätt littera för okända brunnar: en GIS-ledning från den kända brunnen med längd inom så stor andel av filmens föreslås; annars littera med minst så stor namnlikhet (0–1).</w:t>
+              <w:t xml:space="preserve">Samma brunnspar i olika TV3-filer (olika inspektionsomgångar): den nyaste filmen gäller, äldre markeras *ersatt av ny inspektion* och den gällande får kolumnen Tidigare inspektion (klass och konstruktionsindex då → nu). Inom samma klass räknas sträckan som förvärrad/förbättrad när indexet ändrats mer än andelen (och minst 5 p/100 m).</w:t>
             </w:r>
           </w:p>
         </w:tc>
@@ -6949,7 +6928,16 @@
               <w:spacing w:after="0"/>
             </w:pPr>
             <w:r>
-              <w:t xml:space="preserve">0,15, 0,75</w:t>
+              <w:rPr>
+                <w:rFonts w:ascii="Consolas" w:cs="Consolas" w:eastAsia="Consolas" w:hAnsi="Consolas"/>
+                <w:sz w:val="20"/>
+                <w:szCs w:val="20"/>
+                <w:shd w:fill="F2F2F2" w:val="clear"/>
+              </w:rPr>
+              <w:t xml:space="preserve">True</w:t>
+            </w:r>
+            <w:r>
+              <w:t xml:space="preserve">, 0,2</w:t>
             </w:r>
           </w:p>
         </w:tc>
@@ -6983,7 +6971,19 @@
                 <w:szCs w:val="20"/>
                 <w:shd w:fill="F2F2F2" w:val="clear"/>
               </w:rPr>
-              <w:t xml:space="preserve">GIS_MATERIAL</w:t>
+              <w:t xml:space="preserve">GIS_LANGD_TOL</w:t>
+            </w:r>
+            <w:r>
+              <w:t xml:space="preserve">, </w:t>
+            </w:r>
+            <w:r>
+              <w:rPr>
+                <w:rFonts w:ascii="Consolas" w:cs="Consolas" w:eastAsia="Consolas" w:hAnsi="Consolas"/>
+                <w:sz w:val="20"/>
+                <w:szCs w:val="20"/>
+                <w:shd w:fill="F2F2F2" w:val="clear"/>
+              </w:rPr>
+              <w:t xml:space="preserve">GIS_LITTERA_LIKHET</w:t>
             </w:r>
           </w:p>
         </w:tc>
@@ -7009,7 +7009,7 @@
               <w:spacing w:after="0"/>
             </w:pPr>
             <w:r>
-              <w:t xml:space="preserve">Materialnamn i film och GIS som räknas som samma (BTG = Betong, PVC/PE/PP = Plast …).</w:t>
+              <w:t xml:space="preserve">Förslag på rätt littera för okända brunnar: en GIS-ledning från den kända brunnen med längd inom så stor andel av filmens föreslås; annars littera med minst så stor namnlikhet (0–1).</w:t>
             </w:r>
           </w:p>
         </w:tc>
@@ -7035,7 +7035,7 @@
               <w:spacing w:after="0"/>
             </w:pPr>
             <w:r>
-              <w:t xml:space="preserve">se skriptet</w:t>
+              <w:t xml:space="preserve">0,15, 0,75</w:t>
             </w:r>
           </w:p>
         </w:tc>
@@ -7068,19 +7068,7 @@
                 <w:szCs w:val="20"/>
                 <w:shd w:fill="F2F2F2" w:val="clear"/>
               </w:rPr>
-              <w:t xml:space="preserve">FOTO_MAX_PX</w:t>
-            </w:r>
-            <w:r>
-              <w:t xml:space="preserve">, </w:t>
-            </w:r>
-            <w:r>
-              <w:rPr>
-                <w:rFonts w:ascii="Consolas" w:cs="Consolas" w:eastAsia="Consolas" w:hAnsi="Consolas"/>
-                <w:sz w:val="20"/>
-                <w:szCs w:val="20"/>
-                <w:shd w:fill="F2F2F2" w:val="clear"/>
-              </w:rPr>
-              <w:t xml:space="preserve">FOTO_JPEG_KVALITET</w:t>
+              <w:t xml:space="preserve">GIS_MATERIAL</w:t>
             </w:r>
           </w:p>
         </w:tc>
@@ -7105,19 +7093,7 @@
               <w:spacing w:after="0"/>
             </w:pPr>
             <w:r>
-              <w:t xml:space="preserve">Fotona i PDF-rapporterna förminskas till högst så många pixlar på längsta sidan (JPEG-kvalitet enligt den andra; 76 ger ~30 % mindre filer än 82 utan synlig skillnad i A4). </w:t>
-            </w:r>
-            <w:r>
-              <w:rPr>
-                <w:rFonts w:ascii="Consolas" w:cs="Consolas" w:eastAsia="Consolas" w:hAnsi="Consolas"/>
-                <w:sz w:val="20"/>
-                <w:szCs w:val="20"/>
-                <w:shd w:fill="F2F2F2" w:val="clear"/>
-              </w:rPr>
-              <w:t xml:space="preserve">None</w:t>
-            </w:r>
-            <w:r>
-              <w:t xml:space="preserve"> = originalstorlek.</w:t>
+              <w:t xml:space="preserve">Materialnamn i film och GIS som räknas som samma (BTG = Betong, PVC/PE/PP = Plast …).</w:t>
             </w:r>
           </w:p>
         </w:tc>
@@ -7142,7 +7118,7 @@
               <w:spacing w:after="0"/>
             </w:pPr>
             <w:r>
-              <w:t xml:space="preserve">960, 76</w:t>
+              <w:t xml:space="preserve">se skriptet</w:t>
             </w:r>
           </w:p>
         </w:tc>
@@ -7176,7 +7152,7 @@
                 <w:szCs w:val="20"/>
                 <w:shd w:fill="F2F2F2" w:val="clear"/>
               </w:rPr>
-              <w:t xml:space="preserve">RAPPORT_BILD_DPI</w:t>
+              <w:t xml:space="preserve">FOTO_MAX_PX</w:t>
             </w:r>
             <w:r>
               <w:t xml:space="preserve">, </w:t>
@@ -7188,7 +7164,7 @@
                 <w:szCs w:val="20"/>
                 <w:shd w:fill="F2F2F2" w:val="clear"/>
               </w:rPr>
-              <w:t xml:space="preserve">RAPPORT_BILD_PALETT</w:t>
+              <w:t xml:space="preserve">FOTO_JPEG_KVALITET</w:t>
             </w:r>
           </w:p>
         </w:tc>
@@ -7214,7 +7190,19 @@
               <w:spacing w:after="0"/>
             </w:pPr>
             <w:r>
-              <w:t xml:space="preserve">Upplösning på översikts- och profilbilden i rapporten, och om de sparas som palett-PNG (256 färger, ca 65 % mindre).</w:t>
+              <w:t xml:space="preserve">Fotona i PDF-rapporterna förminskas till högst så många pixlar på längsta sidan (JPEG-kvalitet enligt den andra; 76 ger ~30 % mindre filer än 82 utan synlig skillnad i A4). </w:t>
+            </w:r>
+            <w:r>
+              <w:rPr>
+                <w:rFonts w:ascii="Consolas" w:cs="Consolas" w:eastAsia="Consolas" w:hAnsi="Consolas"/>
+                <w:sz w:val="20"/>
+                <w:szCs w:val="20"/>
+                <w:shd w:fill="F2F2F2" w:val="clear"/>
+              </w:rPr>
+              <w:t xml:space="preserve">None</w:t>
+            </w:r>
+            <w:r>
+              <w:t xml:space="preserve"> = originalstorlek.</w:t>
             </w:r>
           </w:p>
         </w:tc>
@@ -7240,16 +7228,7 @@
               <w:spacing w:after="0"/>
             </w:pPr>
             <w:r>
-              <w:t xml:space="preserve">150, </w:t>
-            </w:r>
-            <w:r>
-              <w:rPr>
-                <w:rFonts w:ascii="Consolas" w:cs="Consolas" w:eastAsia="Consolas" w:hAnsi="Consolas"/>
-                <w:sz w:val="20"/>
-                <w:szCs w:val="20"/>
-                <w:shd w:fill="F2F2F2" w:val="clear"/>
-              </w:rPr>
-              <w:t xml:space="preserve">True</w:t>
+              <w:t xml:space="preserve">960, 76</w:t>
             </w:r>
           </w:p>
         </w:tc>
@@ -7282,7 +7261,19 @@
                 <w:szCs w:val="20"/>
                 <w:shd w:fill="F2F2F2" w:val="clear"/>
               </w:rPr>
-              <w:t xml:space="preserve">RAPPORT_PROCESSER</w:t>
+              <w:t xml:space="preserve">RAPPORT_BILD_DPI</w:t>
+            </w:r>
+            <w:r>
+              <w:t xml:space="preserve">, </w:t>
+            </w:r>
+            <w:r>
+              <w:rPr>
+                <w:rFonts w:ascii="Consolas" w:cs="Consolas" w:eastAsia="Consolas" w:hAnsi="Consolas"/>
+                <w:sz w:val="20"/>
+                <w:szCs w:val="20"/>
+                <w:shd w:fill="F2F2F2" w:val="clear"/>
+              </w:rPr>
+              <w:t xml:space="preserve">RAPPORT_BILD_PALETT</w:t>
             </w:r>
           </w:p>
         </w:tc>
@@ -7307,31 +7298,7 @@
               <w:spacing w:after="0"/>
             </w:pPr>
             <w:r>
-              <w:t xml:space="preserve">Antal parallella processer för PDF-rapporterna. </w:t>
-            </w:r>
-            <w:r>
-              <w:rPr>
-                <w:rFonts w:ascii="Consolas" w:cs="Consolas" w:eastAsia="Consolas" w:hAnsi="Consolas"/>
-                <w:sz w:val="20"/>
-                <w:szCs w:val="20"/>
-                <w:shd w:fill="F2F2F2" w:val="clear"/>
-              </w:rPr>
-              <w:t xml:space="preserve">None</w:t>
-            </w:r>
-            <w:r>
-              <w:t xml:space="preserve"> = antal kärnor − 1, </w:t>
-            </w:r>
-            <w:r>
-              <w:rPr>
-                <w:rFonts w:ascii="Consolas" w:cs="Consolas" w:eastAsia="Consolas" w:hAnsi="Consolas"/>
-                <w:sz w:val="20"/>
-                <w:szCs w:val="20"/>
-                <w:shd w:fill="F2F2F2" w:val="clear"/>
-              </w:rPr>
-              <w:t xml:space="preserve">1</w:t>
-            </w:r>
-            <w:r>
-              <w:t xml:space="preserve"> = en i taget.</w:t>
+              <w:t xml:space="preserve">Upplösning på översikts- och profilbilden i rapporten, och om de sparas som palett-PNG (256 färger, ca 65 % mindre).</w:t>
             </w:r>
           </w:p>
         </w:tc>
@@ -7356,13 +7323,16 @@
               <w:spacing w:after="0"/>
             </w:pPr>
             <w:r>
-              <w:rPr>
-                <w:rFonts w:ascii="Consolas" w:cs="Consolas" w:eastAsia="Consolas" w:hAnsi="Consolas"/>
-                <w:sz w:val="20"/>
-                <w:szCs w:val="20"/>
-                <w:shd w:fill="F2F2F2" w:val="clear"/>
-              </w:rPr>
-              <w:t xml:space="preserve">None</w:t>
+              <w:t xml:space="preserve">150, </w:t>
+            </w:r>
+            <w:r>
+              <w:rPr>
+                <w:rFonts w:ascii="Consolas" w:cs="Consolas" w:eastAsia="Consolas" w:hAnsi="Consolas"/>
+                <w:sz w:val="20"/>
+                <w:szCs w:val="20"/>
+                <w:shd w:fill="F2F2F2" w:val="clear"/>
+              </w:rPr>
+              <w:t xml:space="preserve">True</w:t>
             </w:r>
           </w:p>
         </w:tc>
@@ -7396,7 +7366,7 @@
                 <w:szCs w:val="20"/>
                 <w:shd w:fill="F2F2F2" w:val="clear"/>
               </w:rPr>
-              <w:t xml:space="preserve">DOLDA_KOLUMNER</w:t>
+              <w:t xml:space="preserve">RAPPORT_PROCESSER</w:t>
             </w:r>
           </w:p>
         </w:tc>
@@ -7422,7 +7392,31 @@
               <w:spacing w:after="0"/>
             </w:pPr>
             <w:r>
-              <w:t xml:space="preserve">Kolumner per flik som döljs som standard i Excel (grupperade, fälls ut med plustecknet ovanför rubrikraden). Rubrik utan enhet. Tom lista = visa allt.</w:t>
+              <w:t xml:space="preserve">Antal parallella processer för PDF-rapporterna. </w:t>
+            </w:r>
+            <w:r>
+              <w:rPr>
+                <w:rFonts w:ascii="Consolas" w:cs="Consolas" w:eastAsia="Consolas" w:hAnsi="Consolas"/>
+                <w:sz w:val="20"/>
+                <w:szCs w:val="20"/>
+                <w:shd w:fill="F2F2F2" w:val="clear"/>
+              </w:rPr>
+              <w:t xml:space="preserve">None</w:t>
+            </w:r>
+            <w:r>
+              <w:t xml:space="preserve"> = antal kärnor − 1, </w:t>
+            </w:r>
+            <w:r>
+              <w:rPr>
+                <w:rFonts w:ascii="Consolas" w:cs="Consolas" w:eastAsia="Consolas" w:hAnsi="Consolas"/>
+                <w:sz w:val="20"/>
+                <w:szCs w:val="20"/>
+                <w:shd w:fill="F2F2F2" w:val="clear"/>
+              </w:rPr>
+              <w:t xml:space="preserve">1</w:t>
+            </w:r>
+            <w:r>
+              <w:t xml:space="preserve"> = en i taget.</w:t>
             </w:r>
           </w:p>
         </w:tc>
@@ -7448,7 +7442,13 @@
               <w:spacing w:after="0"/>
             </w:pPr>
             <w:r>
-              <w:t xml:space="preserve">se skriptet</w:t>
+              <w:rPr>
+                <w:rFonts w:ascii="Consolas" w:cs="Consolas" w:eastAsia="Consolas" w:hAnsi="Consolas"/>
+                <w:sz w:val="20"/>
+                <w:szCs w:val="20"/>
+                <w:shd w:fill="F2F2F2" w:val="clear"/>
+              </w:rPr>
+              <w:t xml:space="preserve">None</w:t>
             </w:r>
           </w:p>
         </w:tc>
@@ -7481,7 +7481,7 @@
                 <w:szCs w:val="20"/>
                 <w:shd w:fill="F2F2F2" w:val="clear"/>
               </w:rPr>
-              <w:t xml:space="preserve">OFULLSTANDIG_ANDEL</w:t>
+              <w:t xml:space="preserve">DOLDA_KOLUMNER</w:t>
             </w:r>
           </w:p>
         </w:tc>
@@ -7506,7 +7506,7 @@
               <w:spacing w:after="0"/>
             </w:pPr>
             <w:r>
-              <w:t xml:space="preserve">Är filmad längd kortare än så gånger kartlängden nådde kameran inte fram; profilen hängs då bara upp i startbrunnen.</w:t>
+              <w:t xml:space="preserve">Kolumner per flik som döljs som standard i Excel (grupperade, fälls ut med plustecknet ovanför rubrikraden). Rubrik utan enhet. Tom lista = visa allt.</w:t>
             </w:r>
           </w:p>
         </w:tc>
@@ -7531,7 +7531,7 @@
               <w:spacing w:after="0"/>
             </w:pPr>
             <w:r>
-              <w:t xml:space="preserve">0,85</w:t>
+              <w:t xml:space="preserve">se skriptet</w:t>
             </w:r>
           </w:p>
         </w:tc>
@@ -7565,7 +7565,7 @@
                 <w:szCs w:val="20"/>
                 <w:shd w:fill="F2F2F2" w:val="clear"/>
               </w:rPr>
-              <w:t xml:space="preserve">SVACKA_MAX_M</w:t>
+              <w:t xml:space="preserve">OFULLSTANDIG_ANDEL</w:t>
             </w:r>
           </w:p>
         </w:tc>
@@ -7591,7 +7591,7 @@
               <w:spacing w:after="0"/>
             </w:pPr>
             <w:r>
-              <w:t xml:space="preserve">Större beräknat svackdjup (m) än så är en inklinometerartefakt: svackan sätts till okänd och profilen markeras osäker.</w:t>
+              <w:t xml:space="preserve">Är filmad längd kortare än så gånger kartlängden nådde kameran inte fram; profilen hängs då bara upp i startbrunnen.</w:t>
             </w:r>
           </w:p>
         </w:tc>
@@ -7617,7 +7617,7 @@
               <w:spacing w:after="0"/>
             </w:pPr>
             <w:r>
-              <w:t xml:space="preserve">1,0</w:t>
+              <w:t xml:space="preserve">0,85</w:t>
             </w:r>
           </w:p>
         </w:tc>
@@ -7650,19 +7650,7 @@
                 <w:szCs w:val="20"/>
                 <w:shd w:fill="F2F2F2" w:val="clear"/>
               </w:rPr>
-              <w:t xml:space="preserve">BAKFALL_MIN_PROMILLE</w:t>
-            </w:r>
-            <w:r>
-              <w:t xml:space="preserve">, </w:t>
-            </w:r>
-            <w:r>
-              <w:rPr>
-                <w:rFonts w:ascii="Consolas" w:cs="Consolas" w:eastAsia="Consolas" w:hAnsi="Consolas"/>
-                <w:sz w:val="20"/>
-                <w:szCs w:val="20"/>
-                <w:shd w:fill="F2F2F2" w:val="clear"/>
-              </w:rPr>
-              <w:t xml:space="preserve">BAKFALL_SEGMENT_MIN_M</w:t>
+              <w:t xml:space="preserve">SVACKA_MAX_M</w:t>
             </w:r>
           </w:p>
         </w:tc>
@@ -7687,7 +7675,7 @@
               <w:spacing w:after="0"/>
             </w:pPr>
             <w:r>
-              <w:t xml:space="preserve">Lutning mot flödet (‰) som räknas som bakfall, och kortaste bakfallssegment (m) som redovisas i kartan.</w:t>
+              <w:t xml:space="preserve">Större beräknat svackdjup (m) än så är en inklinometerartefakt: svackan sätts till okänd och profilen markeras osäker.</w:t>
             </w:r>
           </w:p>
         </w:tc>
@@ -7712,7 +7700,7 @@
               <w:spacing w:after="0"/>
             </w:pPr>
             <w:r>
-              <w:t xml:space="preserve">5; 1</w:t>
+              <w:t xml:space="preserve">1,0</w:t>
             </w:r>
           </w:p>
         </w:tc>
@@ -7746,7 +7734,7 @@
                 <w:szCs w:val="20"/>
                 <w:shd w:fill="F2F2F2" w:val="clear"/>
               </w:rPr>
-              <w:t xml:space="preserve">GIS_SAKNAS_UNDER</w:t>
+              <w:t xml:space="preserve">BAKFALL_MIN_PROMILLE</w:t>
             </w:r>
             <w:r>
               <w:t xml:space="preserve">, </w:t>
@@ -7758,7 +7746,7 @@
                 <w:szCs w:val="20"/>
                 <w:shd w:fill="F2F2F2" w:val="clear"/>
               </w:rPr>
-              <w:t xml:space="preserve">GIS_FALL_ORIMLIGT_M</w:t>
+              <w:t xml:space="preserve">BAKFALL_SEGMENT_MIN_M</w:t>
             </w:r>
           </w:p>
         </w:tc>
@@ -7784,7 +7772,7 @@
               <w:spacing w:after="0"/>
             </w:pPr>
             <w:r>
-              <w:t xml:space="preserve">Vattengång/locknivå i GIS under det första räknas som saknad (SVOA skriver −9999); större fall mellan brunnarna i GIS än det andra (m) flaggas som orimligt i stället för att jämföras med filmen.</w:t>
+              <w:t xml:space="preserve">Lutning mot flödet (‰) som räknas som bakfall, och kortaste bakfallssegment (m) som redovisas i kartan.</w:t>
             </w:r>
           </w:p>
         </w:tc>
@@ -7810,7 +7798,7 @@
               <w:spacing w:after="0"/>
             </w:pPr>
             <w:r>
-              <w:t xml:space="preserve">−999, 50</w:t>
+              <w:t xml:space="preserve">5; 1</w:t>
             </w:r>
           </w:p>
         </w:tc>
@@ -7843,7 +7831,19 @@
                 <w:szCs w:val="20"/>
                 <w:shd w:fill="F2F2F2" w:val="clear"/>
               </w:rPr>
-              <w:t xml:space="preserve">GIS_PLATSHALLARE</w:t>
+              <w:t xml:space="preserve">GIS_SAKNAS_UNDER</w:t>
+            </w:r>
+            <w:r>
+              <w:t xml:space="preserve">, </w:t>
+            </w:r>
+            <w:r>
+              <w:rPr>
+                <w:rFonts w:ascii="Consolas" w:cs="Consolas" w:eastAsia="Consolas" w:hAnsi="Consolas"/>
+                <w:sz w:val="20"/>
+                <w:szCs w:val="20"/>
+                <w:shd w:fill="F2F2F2" w:val="clear"/>
+              </w:rPr>
+              <w:t xml:space="preserve">GIS_FALL_ORIMLIGT_M</w:t>
             </w:r>
           </w:p>
         </w:tc>
@@ -7868,7 +7868,7 @@
               <w:spacing w:after="0"/>
             </w:pPr>
             <w:r>
-              <w:t xml:space="preserve">Littera i TV3-filen som inte är riktiga brunnar och därför inte kontrolleras mot GIS.</w:t>
+              <w:t xml:space="preserve">Vattengång/locknivå i GIS under det första räknas som saknad (SVOA skriver −9999); större fall mellan brunnarna i GIS än det andra (m) flaggas som orimligt i stället för att jämföras med filmen.</w:t>
             </w:r>
           </w:p>
         </w:tc>
@@ -7893,7 +7893,7 @@
               <w:spacing w:after="0"/>
             </w:pPr>
             <w:r>
-              <w:t xml:space="preserve">AG, STBEXTRA</w:t>
+              <w:t xml:space="preserve">−999, 50</w:t>
             </w:r>
           </w:p>
         </w:tc>
@@ -7927,31 +7927,7 @@
                 <w:szCs w:val="20"/>
                 <w:shd w:fill="F2F2F2" w:val="clear"/>
               </w:rPr>
-              <w:t xml:space="preserve">GRENROR_LITTERA</w:t>
-            </w:r>
-            <w:r>
-              <w:t xml:space="preserve">, </w:t>
-            </w:r>
-            <w:r>
-              <w:rPr>
-                <w:rFonts w:ascii="Consolas" w:cs="Consolas" w:eastAsia="Consolas" w:hAnsi="Consolas"/>
-                <w:sz w:val="20"/>
-                <w:szCs w:val="20"/>
-                <w:shd w:fill="F2F2F2" w:val="clear"/>
-              </w:rPr>
-              <w:t xml:space="preserve">ANDE_LITTERA</w:t>
-            </w:r>
-            <w:r>
-              <w:t xml:space="preserve">, </w:t>
-            </w:r>
-            <w:r>
-              <w:rPr>
-                <w:rFonts w:ascii="Consolas" w:cs="Consolas" w:eastAsia="Consolas" w:hAnsi="Consolas"/>
-                <w:sz w:val="20"/>
-                <w:szCs w:val="20"/>
-                <w:shd w:fill="F2F2F2" w:val="clear"/>
-              </w:rPr>
-              <w:t xml:space="preserve">GIS_GRENROR_LANGD_TOL</w:t>
+              <w:t xml:space="preserve">GIS_PLATSHALLARE</w:t>
             </w:r>
           </w:p>
         </w:tc>
@@ -7977,7 +7953,7 @@
               <w:spacing w:after="0"/>
             </w:pPr>
             <w:r>
-              <w:t xml:space="preserve">Reguljära uttryck för littera som betyder anslutning till grenrör respektive ledningsände utan brunn, och hur mycket GIS-ledningen med fri ände får avvika från filmens längd (andel, + 3 m) för att kopplas.</w:t>
+              <w:t xml:space="preserve">Littera i TV3-filen som inte är riktiga brunnar och därför inte kontrolleras mot GIS.</w:t>
             </w:r>
           </w:p>
         </w:tc>
@@ -8003,28 +7979,7 @@
               <w:spacing w:after="0"/>
             </w:pPr>
             <w:r>
-              <w:rPr>
-                <w:rFonts w:ascii="Consolas" w:cs="Consolas" w:eastAsia="Consolas" w:hAnsi="Consolas"/>
-                <w:sz w:val="20"/>
-                <w:szCs w:val="20"/>
-                <w:shd w:fill="F2F2F2" w:val="clear"/>
-              </w:rPr>
-              <w:t xml:space="preserve">^A{1,2}G\d*$</w:t>
-            </w:r>
-            <w:r>
-              <w:t xml:space="preserve">, </w:t>
-            </w:r>
-            <w:r>
-              <w:rPr>
-                <w:rFonts w:ascii="Consolas" w:cs="Consolas" w:eastAsia="Consolas" w:hAnsi="Consolas"/>
-                <w:sz w:val="20"/>
-                <w:szCs w:val="20"/>
-                <w:shd w:fill="F2F2F2" w:val="clear"/>
-              </w:rPr>
-              <w:t xml:space="preserve">^[ÄA]NDE?\d*$</w:t>
-            </w:r>
-            <w:r>
-              <w:t xml:space="preserve">, 0,3</w:t>
+              <w:t xml:space="preserve">AG, STBEXTRA</w:t>
             </w:r>
           </w:p>
         </w:tc>
@@ -8057,7 +8012,31 @@
                 <w:szCs w:val="20"/>
                 <w:shd w:fill="F2F2F2" w:val="clear"/>
               </w:rPr>
-              <w:t xml:space="preserve">RELINAD_SOM_MATERIAL</w:t>
+              <w:t xml:space="preserve">GRENROR_LITTERA</w:t>
+            </w:r>
+            <w:r>
+              <w:t xml:space="preserve">, </w:t>
+            </w:r>
+            <w:r>
+              <w:rPr>
+                <w:rFonts w:ascii="Consolas" w:cs="Consolas" w:eastAsia="Consolas" w:hAnsi="Consolas"/>
+                <w:sz w:val="20"/>
+                <w:szCs w:val="20"/>
+                <w:shd w:fill="F2F2F2" w:val="clear"/>
+              </w:rPr>
+              <w:t xml:space="preserve">ANDE_LITTERA</w:t>
+            </w:r>
+            <w:r>
+              <w:t xml:space="preserve">, </w:t>
+            </w:r>
+            <w:r>
+              <w:rPr>
+                <w:rFonts w:ascii="Consolas" w:cs="Consolas" w:eastAsia="Consolas" w:hAnsi="Consolas"/>
+                <w:sz w:val="20"/>
+                <w:szCs w:val="20"/>
+                <w:shd w:fill="F2F2F2" w:val="clear"/>
+              </w:rPr>
+              <w:t xml:space="preserve">GIS_GRENROR_LANGD_TOL</w:t>
             </w:r>
           </w:p>
         </w:tc>
@@ -8082,7 +8061,7 @@
               <w:spacing w:after="0"/>
             </w:pPr>
             <w:r>
-              <w:t xml:space="preserve">Relinade sträckor redovisas som eget material i fliken Material och diagram 4.</w:t>
+              <w:t xml:space="preserve">Reguljära uttryck för littera som betyder anslutning till grenrör respektive ledningsände utan brunn, och hur mycket GIS-ledningen med fri ände får avvika från filmens längd (andel, + 3 m) för att kopplas.</w:t>
             </w:r>
           </w:p>
         </w:tc>
@@ -8113,7 +8092,22 @@
                 <w:szCs w:val="20"/>
                 <w:shd w:fill="F2F2F2" w:val="clear"/>
               </w:rPr>
-              <w:t xml:space="preserve">True</w:t>
+              <w:t xml:space="preserve">^A{1,2}G\d*$</w:t>
+            </w:r>
+            <w:r>
+              <w:t xml:space="preserve">, </w:t>
+            </w:r>
+            <w:r>
+              <w:rPr>
+                <w:rFonts w:ascii="Consolas" w:cs="Consolas" w:eastAsia="Consolas" w:hAnsi="Consolas"/>
+                <w:sz w:val="20"/>
+                <w:szCs w:val="20"/>
+                <w:shd w:fill="F2F2F2" w:val="clear"/>
+              </w:rPr>
+              <w:t xml:space="preserve">^[ÄA]NDE?\d*$</w:t>
+            </w:r>
+            <w:r>
+              <w:t xml:space="preserve">, 0,3</w:t>
             </w:r>
           </w:p>
         </w:tc>
@@ -8147,31 +8141,7 @@
                 <w:szCs w:val="20"/>
                 <w:shd w:fill="F2F2F2" w:val="clear"/>
               </w:rPr>
-              <w:t xml:space="preserve">BEHALL_RAPPORTER</w:t>
-            </w:r>
-            <w:r>
-              <w:t xml:space="preserve">, </w:t>
-            </w:r>
-            <w:r>
-              <w:rPr>
-                <w:rFonts w:ascii="Consolas" w:cs="Consolas" w:eastAsia="Consolas" w:hAnsi="Consolas"/>
-                <w:sz w:val="20"/>
-                <w:szCs w:val="20"/>
-                <w:shd w:fill="F2F2F2" w:val="clear"/>
-              </w:rPr>
-              <w:t xml:space="preserve">SPARA_DIAGRAM</w:t>
-            </w:r>
-            <w:r>
-              <w:t xml:space="preserve">, </w:t>
-            </w:r>
-            <w:r>
-              <w:rPr>
-                <w:rFonts w:ascii="Consolas" w:cs="Consolas" w:eastAsia="Consolas" w:hAnsi="Consolas"/>
-                <w:sz w:val="20"/>
-                <w:szCs w:val="20"/>
-                <w:shd w:fill="F2F2F2" w:val="clear"/>
-              </w:rPr>
-              <w:t xml:space="preserve">SKRIV_KARTUNDERLAG</w:t>
+              <w:t xml:space="preserve">RELINAD_SOM_MATERIAL</w:t>
             </w:r>
           </w:p>
         </w:tc>
@@ -8197,43 +8167,7 @@
               <w:spacing w:after="0"/>
             </w:pPr>
             <w:r>
-              <w:t xml:space="preserve">Standardvärden för </w:t>
-            </w:r>
-            <w:r>
-              <w:rPr>
-                <w:rFonts w:ascii="Consolas" w:cs="Consolas" w:eastAsia="Consolas" w:hAnsi="Consolas"/>
-                <w:sz w:val="20"/>
-                <w:szCs w:val="20"/>
-                <w:shd w:fill="F2F2F2" w:val="clear"/>
-              </w:rPr>
-              <w:t xml:space="preserve">--behall-rapporter</w:t>
-            </w:r>
-            <w:r>
-              <w:t xml:space="preserve">, </w:t>
-            </w:r>
-            <w:r>
-              <w:rPr>
-                <w:rFonts w:ascii="Consolas" w:cs="Consolas" w:eastAsia="Consolas" w:hAnsi="Consolas"/>
-                <w:sz w:val="20"/>
-                <w:szCs w:val="20"/>
-                <w:shd w:fill="F2F2F2" w:val="clear"/>
-              </w:rPr>
-              <w:t xml:space="preserve">--diagram</w:t>
-            </w:r>
-            <w:r>
-              <w:t xml:space="preserve"> och </w:t>
-            </w:r>
-            <w:r>
-              <w:rPr>
-                <w:rFonts w:ascii="Consolas" w:cs="Consolas" w:eastAsia="Consolas" w:hAnsi="Consolas"/>
-                <w:sz w:val="20"/>
-                <w:szCs w:val="20"/>
-                <w:shd w:fill="F2F2F2" w:val="clear"/>
-              </w:rPr>
-              <w:t xml:space="preserve">--karta</w:t>
-            </w:r>
-            <w:r>
-              <w:t xml:space="preserve">.</w:t>
+              <w:t xml:space="preserve">Relinade sträckor redovisas som eget material i fliken Material och diagram 4.</w:t>
             </w:r>
           </w:p>
         </w:tc>
@@ -8258,30 +8192,6 @@
             <w:pPr>
               <w:spacing w:after="0"/>
             </w:pPr>
-            <w:r>
-              <w:rPr>
-                <w:rFonts w:ascii="Consolas" w:cs="Consolas" w:eastAsia="Consolas" w:hAnsi="Consolas"/>
-                <w:sz w:val="20"/>
-                <w:szCs w:val="20"/>
-                <w:shd w:fill="F2F2F2" w:val="clear"/>
-              </w:rPr>
-              <w:t xml:space="preserve">False</w:t>
-            </w:r>
-            <w:r>
-              <w:t xml:space="preserve">, </w:t>
-            </w:r>
-            <w:r>
-              <w:rPr>
-                <w:rFonts w:ascii="Consolas" w:cs="Consolas" w:eastAsia="Consolas" w:hAnsi="Consolas"/>
-                <w:sz w:val="20"/>
-                <w:szCs w:val="20"/>
-                <w:shd w:fill="F2F2F2" w:val="clear"/>
-              </w:rPr>
-              <w:t xml:space="preserve">False</w:t>
-            </w:r>
-            <w:r>
-              <w:t xml:space="preserve">, </w:t>
-            </w:r>
             <w:r>
               <w:rPr>
                 <w:rFonts w:ascii="Consolas" w:cs="Consolas" w:eastAsia="Consolas" w:hAnsi="Consolas"/>
@@ -8322,7 +8232,31 @@
                 <w:szCs w:val="20"/>
                 <w:shd w:fill="F2F2F2" w:val="clear"/>
               </w:rPr>
-              <w:t xml:space="preserve">KODER</w:t>
+              <w:t xml:space="preserve">BEHALL_RAPPORTER</w:t>
+            </w:r>
+            <w:r>
+              <w:t xml:space="preserve">, </w:t>
+            </w:r>
+            <w:r>
+              <w:rPr>
+                <w:rFonts w:ascii="Consolas" w:cs="Consolas" w:eastAsia="Consolas" w:hAnsi="Consolas"/>
+                <w:sz w:val="20"/>
+                <w:szCs w:val="20"/>
+                <w:shd w:fill="F2F2F2" w:val="clear"/>
+              </w:rPr>
+              <w:t xml:space="preserve">SPARA_DIAGRAM</w:t>
+            </w:r>
+            <w:r>
+              <w:t xml:space="preserve">, </w:t>
+            </w:r>
+            <w:r>
+              <w:rPr>
+                <w:rFonts w:ascii="Consolas" w:cs="Consolas" w:eastAsia="Consolas" w:hAnsi="Consolas"/>
+                <w:sz w:val="20"/>
+                <w:szCs w:val="20"/>
+                <w:shd w:fill="F2F2F2" w:val="clear"/>
+              </w:rPr>
+              <w:t xml:space="preserve">SKRIV_KARTUNDERLAG</w:t>
             </w:r>
           </w:p>
         </w:tc>
@@ -8347,7 +8281,43 @@
               <w:spacing w:after="0"/>
             </w:pPr>
             <w:r>
-              <w:t xml:space="preserve">Skadekoder med klartext och typ (K = konstruktion, D = drift, I = information).</w:t>
+              <w:t xml:space="preserve">Standardvärden för </w:t>
+            </w:r>
+            <w:r>
+              <w:rPr>
+                <w:rFonts w:ascii="Consolas" w:cs="Consolas" w:eastAsia="Consolas" w:hAnsi="Consolas"/>
+                <w:sz w:val="20"/>
+                <w:szCs w:val="20"/>
+                <w:shd w:fill="F2F2F2" w:val="clear"/>
+              </w:rPr>
+              <w:t xml:space="preserve">--behall-rapporter</w:t>
+            </w:r>
+            <w:r>
+              <w:t xml:space="preserve">, </w:t>
+            </w:r>
+            <w:r>
+              <w:rPr>
+                <w:rFonts w:ascii="Consolas" w:cs="Consolas" w:eastAsia="Consolas" w:hAnsi="Consolas"/>
+                <w:sz w:val="20"/>
+                <w:szCs w:val="20"/>
+                <w:shd w:fill="F2F2F2" w:val="clear"/>
+              </w:rPr>
+              <w:t xml:space="preserve">--diagram</w:t>
+            </w:r>
+            <w:r>
+              <w:t xml:space="preserve"> och </w:t>
+            </w:r>
+            <w:r>
+              <w:rPr>
+                <w:rFonts w:ascii="Consolas" w:cs="Consolas" w:eastAsia="Consolas" w:hAnsi="Consolas"/>
+                <w:sz w:val="20"/>
+                <w:szCs w:val="20"/>
+                <w:shd w:fill="F2F2F2" w:val="clear"/>
+              </w:rPr>
+              <w:t xml:space="preserve">--karta</w:t>
+            </w:r>
+            <w:r>
+              <w:t xml:space="preserve">.</w:t>
             </w:r>
           </w:p>
         </w:tc>
@@ -8372,7 +8342,37 @@
               <w:spacing w:after="0"/>
             </w:pPr>
             <w:r>
-              <w:t xml:space="preserve">P93</w:t>
+              <w:rPr>
+                <w:rFonts w:ascii="Consolas" w:cs="Consolas" w:eastAsia="Consolas" w:hAnsi="Consolas"/>
+                <w:sz w:val="20"/>
+                <w:szCs w:val="20"/>
+                <w:shd w:fill="F2F2F2" w:val="clear"/>
+              </w:rPr>
+              <w:t xml:space="preserve">False</w:t>
+            </w:r>
+            <w:r>
+              <w:t xml:space="preserve">, </w:t>
+            </w:r>
+            <w:r>
+              <w:rPr>
+                <w:rFonts w:ascii="Consolas" w:cs="Consolas" w:eastAsia="Consolas" w:hAnsi="Consolas"/>
+                <w:sz w:val="20"/>
+                <w:szCs w:val="20"/>
+                <w:shd w:fill="F2F2F2" w:val="clear"/>
+              </w:rPr>
+              <w:t xml:space="preserve">False</w:t>
+            </w:r>
+            <w:r>
+              <w:t xml:space="preserve">, </w:t>
+            </w:r>
+            <w:r>
+              <w:rPr>
+                <w:rFonts w:ascii="Consolas" w:cs="Consolas" w:eastAsia="Consolas" w:hAnsi="Consolas"/>
+                <w:sz w:val="20"/>
+                <w:szCs w:val="20"/>
+                <w:shd w:fill="F2F2F2" w:val="clear"/>
+              </w:rPr>
+              <w:t xml:space="preserve">True</w:t>
             </w:r>
           </w:p>
         </w:tc>
@@ -8406,6 +8406,91 @@
                 <w:szCs w:val="20"/>
                 <w:shd w:fill="F2F2F2" w:val="clear"/>
               </w:rPr>
+              <w:t xml:space="preserve">KODER</w:t>
+            </w:r>
+          </w:p>
+        </w:tc>
+        <w:tc>
+          <w:tcPr>
+            <w:tcW w:type="dxa" w:w="5000"/>
+            <w:tcBorders>
+              <w:top w:val="single" w:color="BFBFBF" w:sz="4"/>
+              <w:left w:val="single" w:color="BFBFBF" w:sz="4"/>
+              <w:bottom w:val="single" w:color="BFBFBF" w:sz="4"/>
+              <w:right w:val="single" w:color="BFBFBF" w:sz="4"/>
+            </w:tcBorders>
+            <w:shd w:fill="F7F9FC" w:val="clear"/>
+            <w:tcMar>
+              <w:top w:type="dxa" w:w="60"/>
+              <w:left w:type="dxa" w:w="100"/>
+              <w:bottom w:type="dxa" w:w="60"/>
+              <w:right w:type="dxa" w:w="100"/>
+            </w:tcMar>
+          </w:tcPr>
+          <w:p>
+            <w:pPr>
+              <w:spacing w:after="0"/>
+            </w:pPr>
+            <w:r>
+              <w:t xml:space="preserve">Skadekoder med klartext och typ (K = konstruktion, D = drift, I = information).</w:t>
+            </w:r>
+          </w:p>
+        </w:tc>
+        <w:tc>
+          <w:tcPr>
+            <w:tcW w:type="dxa" w:w="1760"/>
+            <w:tcBorders>
+              <w:top w:val="single" w:color="BFBFBF" w:sz="4"/>
+              <w:left w:val="single" w:color="BFBFBF" w:sz="4"/>
+              <w:bottom w:val="single" w:color="BFBFBF" w:sz="4"/>
+              <w:right w:val="single" w:color="BFBFBF" w:sz="4"/>
+            </w:tcBorders>
+            <w:shd w:fill="F7F9FC" w:val="clear"/>
+            <w:tcMar>
+              <w:top w:type="dxa" w:w="60"/>
+              <w:left w:type="dxa" w:w="100"/>
+              <w:bottom w:type="dxa" w:w="60"/>
+              <w:right w:type="dxa" w:w="100"/>
+            </w:tcMar>
+          </w:tcPr>
+          <w:p>
+            <w:pPr>
+              <w:spacing w:after="0"/>
+            </w:pPr>
+            <w:r>
+              <w:t xml:space="preserve">P93</w:t>
+            </w:r>
+          </w:p>
+        </w:tc>
+      </w:tr>
+      <w:tr>
+        <w:tc>
+          <w:tcPr>
+            <w:tcW w:type="dxa" w:w="2600"/>
+            <w:tcBorders>
+              <w:top w:val="single" w:color="BFBFBF" w:sz="4"/>
+              <w:left w:val="single" w:color="BFBFBF" w:sz="4"/>
+              <w:bottom w:val="single" w:color="BFBFBF" w:sz="4"/>
+              <w:right w:val="single" w:color="BFBFBF" w:sz="4"/>
+            </w:tcBorders>
+            <w:tcMar>
+              <w:top w:type="dxa" w:w="60"/>
+              <w:left w:type="dxa" w:w="100"/>
+              <w:bottom w:type="dxa" w:w="60"/>
+              <w:right w:type="dxa" w:w="100"/>
+            </w:tcMar>
+          </w:tcPr>
+          <w:p>
+            <w:pPr>
+              <w:spacing w:after="0"/>
+            </w:pPr>
+            <w:r>
+              <w:rPr>
+                <w:rFonts w:ascii="Consolas" w:cs="Consolas" w:eastAsia="Consolas" w:hAnsi="Consolas"/>
+                <w:sz w:val="20"/>
+                <w:szCs w:val="20"/>
+                <w:shd w:fill="F2F2F2" w:val="clear"/>
+              </w:rPr>
               <w:t xml:space="preserve">ATTRIBUT</w:t>
             </w:r>
             <w:r>
@@ -8431,7 +8516,6 @@
               <w:bottom w:val="single" w:color="BFBFBF" w:sz="4"/>
               <w:right w:val="single" w:color="BFBFBF" w:sz="4"/>
             </w:tcBorders>
-            <w:shd w:fill="F7F9FC" w:val="clear"/>
             <w:tcMar>
               <w:top w:type="dxa" w:w="60"/>
               <w:left w:type="dxa" w:w="100"/>
@@ -8457,7 +8541,6 @@
               <w:bottom w:val="single" w:color="BFBFBF" w:sz="4"/>
               <w:right w:val="single" w:color="BFBFBF" w:sz="4"/>
             </w:tcBorders>
-            <w:shd w:fill="F7F9FC" w:val="clear"/>
             <w:tcMar>
               <w:top w:type="dxa" w:w="60"/>
               <w:left w:type="dxa" w:w="100"/>
@@ -10291,7 +10374,51 @@
         <w:t xml:space="preserve">Matchning</w:t>
       </w:r>
       <w:r>
-        <w:t xml:space="preserve"> finns tolerans (2 m), max antal brunnar en sträcka får passera (2) och fält från ledningslagret som ska följa med.</w:t>
+        <w:t xml:space="preserve"> finns tolerans (2 m), max antal brunnar en sträcka får passera (2) och fält från ledningslagret som ska följa med. Under </w:t>
+      </w:r>
+      <w:r>
+        <w:rPr>
+          <w:b/>
+          <w:bCs/>
+        </w:rPr>
+        <w:t xml:space="preserve">Parallella ledningar</w:t>
+      </w:r>
+      <w:r>
+        <w:t xml:space="preserve"> anges fälten med ledningstyp och dimension i ledningslagret (gissas: </w:t>
+      </w:r>
+      <w:r>
+        <w:rPr>
+          <w:rFonts w:ascii="Consolas" w:cs="Consolas" w:eastAsia="Consolas" w:hAnsi="Consolas"/>
+          <w:sz w:val="20"/>
+          <w:szCs w:val="20"/>
+          <w:shd w:fill="F2F2F2" w:val="clear"/>
+        </w:rPr>
+        <w:t xml:space="preserve">PipeType</w:t>
+      </w:r>
+      <w:r>
+        <w:t xml:space="preserve">, </w:t>
+      </w:r>
+      <w:r>
+        <w:rPr>
+          <w:rFonts w:ascii="Consolas" w:cs="Consolas" w:eastAsia="Consolas" w:hAnsi="Consolas"/>
+          <w:sz w:val="20"/>
+          <w:szCs w:val="20"/>
+          <w:shd w:fill="F2F2F2" w:val="clear"/>
+        </w:rPr>
+        <w:t xml:space="preserve">PipeDimension</w:t>
+      </w:r>
+      <w:r>
+        <w:t xml:space="preserve">), se nedan. Under </w:t>
+      </w:r>
+      <w:r>
+        <w:rPr>
+          <w:b/>
+          <w:bCs/>
+        </w:rPr>
+        <w:t xml:space="preserve">Avbrutna inspektioner</w:t>
+      </w:r>
+      <w:r>
+        <w:t xml:space="preserve"> styrs om avbrutna filmer ritas bara så långt kameran kom (förval ja).</w:t>
       </w:r>
     </w:p>
     <w:p>
@@ -10518,6 +10645,96 @@
       </w:r>
       <w:r>
         <w:t xml:space="preserve">, letar upp varje brunnspar i brunnslagren och klipper ut ledningen mellan brunnarna som ett eget objekt. Matchningen bygger ett nätverk av kartans ledningar: varje ledning delas där en av inspektionens brunnar ligger inom toleransen från linjen (även mitt på ett segment, utan egen brytpunkt), fria ledningsändar inom toleransen kopplas ihop, och vägen brunn till brunn söks genom nätet. Så hittas också sträckor som i kartan består av flera ledningsobjekt eller passerar brunnar utan att vara uppdelade; max-hopp styr hur många andra brunnar en sträcka får passera. Utdata i en filgeodatabas rekommenderas; en shapefil fungerar men visar inte fältalias.</w:t>
+      </w:r>
+    </w:p>
+    <w:p>
+      <w:pPr>
+        <w:spacing w:after="120"/>
+      </w:pPr>
+      <w:r>
+        <w:rPr>
+          <w:b/>
+          <w:bCs/>
+        </w:rPr>
+        <w:t xml:space="preserve">Parallella ledningar.</w:t>
+      </w:r>
+      <w:r>
+        <w:t xml:space="preserve"> Vid bräddbrunnar och i gemensamma schakt går spill- och dagvattenledningen ofta mellan samma brunnar (i var sin kammare), och utan mer information väljer verktyget den ledning som råkar komma först. När fälten för ledningstyp och dimension är ifyllda jämförs varje möjlig väg med filmens ledningstyp (första bokstaven: S spillvatten, D dagvatten, K kombinerat; </w:t>
+      </w:r>
+      <w:r>
+        <w:rPr>
+          <w:rFonts w:ascii="Consolas" w:cs="Consolas" w:eastAsia="Consolas" w:hAnsi="Consolas"/>
+          <w:sz w:val="20"/>
+          <w:szCs w:val="20"/>
+          <w:shd w:fill="F2F2F2" w:val="clear"/>
+        </w:rPr>
+        <w:t xml:space="preserve">SSL</w:t>
+      </w:r>
+      <w:r>
+        <w:t xml:space="preserve">/</w:t>
+      </w:r>
+      <w:r>
+        <w:rPr>
+          <w:rFonts w:ascii="Consolas" w:cs="Consolas" w:eastAsia="Consolas" w:hAnsi="Consolas"/>
+          <w:sz w:val="20"/>
+          <w:szCs w:val="20"/>
+          <w:shd w:fill="F2F2F2" w:val="clear"/>
+        </w:rPr>
+        <w:t xml:space="preserve">DSL</w:t>
+      </w:r>
+      <w:r>
+        <w:t xml:space="preserve">/</w:t>
+      </w:r>
+      <w:r>
+        <w:rPr>
+          <w:rFonts w:ascii="Consolas" w:cs="Consolas" w:eastAsia="Consolas" w:hAnsi="Consolas"/>
+          <w:sz w:val="20"/>
+          <w:szCs w:val="20"/>
+          <w:shd w:fill="F2F2F2" w:val="clear"/>
+        </w:rPr>
+        <w:t xml:space="preserve">KSL</w:t>
+      </w:r>
+      <w:r>
+        <w:t xml:space="preserve"> i SVOA:s karta) och dimension (inom 10 %), och vägen med minst avvikelse tas – annan typ väger tyngre än annan dimension. Ligger sträckan ändå på en ledning med annan typ eller dimension (ingen bättre finns) skrivs avvikelsen i fältet </w:t>
+      </w:r>
+      <w:r>
+        <w:rPr>
+          <w:rFonts w:ascii="Consolas" w:cs="Consolas" w:eastAsia="Consolas" w:hAnsi="Consolas"/>
+          <w:sz w:val="20"/>
+          <w:szCs w:val="20"/>
+          <w:shd w:fill="F2F2F2" w:val="clear"/>
+        </w:rPr>
+        <w:t xml:space="preserve">GIS_AVVIK</w:t>
+      </w:r>
+      <w:r>
+        <w:t xml:space="preserve">, och loggen listar sträckorna – oftast fel littera i filmen eller fel attribut i kartan.</w:t>
+      </w:r>
+    </w:p>
+    <w:p>
+      <w:pPr>
+        <w:spacing w:after="120"/>
+      </w:pPr>
+      <w:r>
+        <w:rPr>
+          <w:b/>
+          <w:bCs/>
+        </w:rPr>
+        <w:t xml:space="preserve">Avbrutna inspektioner.</w:t>
+      </w:r>
+      <w:r>
+        <w:t xml:space="preserve"> En avbruten film (eller en film klart kortare än kartans ledning) ritas bara så långt kameran kom: från kamerans brunn och den filmade längden längs kartlinjen. Fältet </w:t>
+      </w:r>
+      <w:r>
+        <w:rPr>
+          <w:rFonts w:ascii="Consolas" w:cs="Consolas" w:eastAsia="Consolas" w:hAnsi="Consolas"/>
+          <w:sz w:val="20"/>
+          <w:szCs w:val="20"/>
+          <w:shd w:fill="F2F2F2" w:val="clear"/>
+        </w:rPr>
+        <w:t xml:space="preserve">KLIPPT</w:t>
+      </w:r>
+      <w:r>
+        <w:t xml:space="preserve"> säger t.ex. *94,6 av 127,2 m från BdNB1015633*; svackor och bakfall läggs ut längs den filmade delen. Har analysen hittat GIS-vägen via andra brunnar (filmen gick förbi brunnar utan att stanna, se 7.11) får sträckan passera just de brunnarna även om max hopp är lägre, och loggen räknar dem.</w:t>
       </w:r>
     </w:p>
     <w:p>
@@ -11398,6 +11615,175 @@
           </w:p>
         </w:tc>
       </w:tr>
+      <w:tr>
+        <w:tc>
+          <w:tcPr>
+            <w:tcW w:type="dxa" w:w="1800"/>
+            <w:tcBorders>
+              <w:top w:val="single" w:color="BFBFBF" w:sz="4"/>
+              <w:left w:val="single" w:color="BFBFBF" w:sz="4"/>
+              <w:bottom w:val="single" w:color="BFBFBF" w:sz="4"/>
+              <w:right w:val="single" w:color="BFBFBF" w:sz="4"/>
+            </w:tcBorders>
+            <w:tcMar>
+              <w:top w:type="dxa" w:w="60"/>
+              <w:left w:type="dxa" w:w="100"/>
+              <w:bottom w:type="dxa" w:w="60"/>
+              <w:right w:type="dxa" w:w="100"/>
+            </w:tcMar>
+          </w:tcPr>
+          <w:p>
+            <w:pPr>
+              <w:spacing w:after="0"/>
+            </w:pPr>
+            <w:r>
+              <w:rPr>
+                <w:rFonts w:ascii="Consolas" w:cs="Consolas" w:eastAsia="Consolas" w:hAnsi="Consolas"/>
+                <w:sz w:val="20"/>
+                <w:szCs w:val="20"/>
+                <w:shd w:fill="F2F2F2" w:val="clear"/>
+              </w:rPr>
+              <w:t xml:space="preserve">GIS_AVVIK</w:t>
+            </w:r>
+          </w:p>
+        </w:tc>
+        <w:tc>
+          <w:tcPr>
+            <w:tcW w:type="dxa" w:w="2600"/>
+            <w:tcBorders>
+              <w:top w:val="single" w:color="BFBFBF" w:sz="4"/>
+              <w:left w:val="single" w:color="BFBFBF" w:sz="4"/>
+              <w:bottom w:val="single" w:color="BFBFBF" w:sz="4"/>
+              <w:right w:val="single" w:color="BFBFBF" w:sz="4"/>
+            </w:tcBorders>
+            <w:tcMar>
+              <w:top w:type="dxa" w:w="60"/>
+              <w:left w:type="dxa" w:w="100"/>
+              <w:bottom w:type="dxa" w:w="60"/>
+              <w:right w:type="dxa" w:w="100"/>
+            </w:tcMar>
+          </w:tcPr>
+          <w:p>
+            <w:pPr>
+              <w:spacing w:after="0"/>
+            </w:pPr>
+            <w:r>
+              <w:t xml:space="preserve">Avvikelse mot GIS-ledningen</w:t>
+            </w:r>
+          </w:p>
+        </w:tc>
+        <w:tc>
+          <w:tcPr>
+            <w:tcW w:type="dxa" w:w="4960"/>
+            <w:tcBorders>
+              <w:top w:val="single" w:color="BFBFBF" w:sz="4"/>
+              <w:left w:val="single" w:color="BFBFBF" w:sz="4"/>
+              <w:bottom w:val="single" w:color="BFBFBF" w:sz="4"/>
+              <w:right w:val="single" w:color="BFBFBF" w:sz="4"/>
+            </w:tcBorders>
+            <w:tcMar>
+              <w:top w:type="dxa" w:w="60"/>
+              <w:left w:type="dxa" w:w="100"/>
+              <w:bottom w:type="dxa" w:w="60"/>
+              <w:right w:type="dxa" w:w="100"/>
+            </w:tcMar>
+          </w:tcPr>
+          <w:p>
+            <w:pPr>
+              <w:spacing w:after="0"/>
+            </w:pPr>
+            <w:r>
+              <w:t xml:space="preserve">Annan ledningstyp eller dimension i kartan än i filmen, t.ex. *typ S i filmen, DSL i GIS*. Fylls bara när fälten för ledningstyp/dimension angetts.</w:t>
+            </w:r>
+          </w:p>
+        </w:tc>
+      </w:tr>
+      <w:tr>
+        <w:tc>
+          <w:tcPr>
+            <w:tcW w:type="dxa" w:w="1800"/>
+            <w:tcBorders>
+              <w:top w:val="single" w:color="BFBFBF" w:sz="4"/>
+              <w:left w:val="single" w:color="BFBFBF" w:sz="4"/>
+              <w:bottom w:val="single" w:color="BFBFBF" w:sz="4"/>
+              <w:right w:val="single" w:color="BFBFBF" w:sz="4"/>
+            </w:tcBorders>
+            <w:shd w:fill="F7F9FC" w:val="clear"/>
+            <w:tcMar>
+              <w:top w:type="dxa" w:w="60"/>
+              <w:left w:type="dxa" w:w="100"/>
+              <w:bottom w:type="dxa" w:w="60"/>
+              <w:right w:type="dxa" w:w="100"/>
+            </w:tcMar>
+          </w:tcPr>
+          <w:p>
+            <w:pPr>
+              <w:spacing w:after="0"/>
+            </w:pPr>
+            <w:r>
+              <w:rPr>
+                <w:rFonts w:ascii="Consolas" w:cs="Consolas" w:eastAsia="Consolas" w:hAnsi="Consolas"/>
+                <w:sz w:val="20"/>
+                <w:szCs w:val="20"/>
+                <w:shd w:fill="F2F2F2" w:val="clear"/>
+              </w:rPr>
+              <w:t xml:space="preserve">KLIPPT</w:t>
+            </w:r>
+          </w:p>
+        </w:tc>
+        <w:tc>
+          <w:tcPr>
+            <w:tcW w:type="dxa" w:w="2600"/>
+            <w:tcBorders>
+              <w:top w:val="single" w:color="BFBFBF" w:sz="4"/>
+              <w:left w:val="single" w:color="BFBFBF" w:sz="4"/>
+              <w:bottom w:val="single" w:color="BFBFBF" w:sz="4"/>
+              <w:right w:val="single" w:color="BFBFBF" w:sz="4"/>
+            </w:tcBorders>
+            <w:shd w:fill="F7F9FC" w:val="clear"/>
+            <w:tcMar>
+              <w:top w:type="dxa" w:w="60"/>
+              <w:left w:type="dxa" w:w="100"/>
+              <w:bottom w:type="dxa" w:w="60"/>
+              <w:right w:type="dxa" w:w="100"/>
+            </w:tcMar>
+          </w:tcPr>
+          <w:p>
+            <w:pPr>
+              <w:spacing w:after="0"/>
+            </w:pPr>
+            <w:r>
+              <w:t xml:space="preserve">Avbruten film: ritad del</w:t>
+            </w:r>
+          </w:p>
+        </w:tc>
+        <w:tc>
+          <w:tcPr>
+            <w:tcW w:type="dxa" w:w="4960"/>
+            <w:tcBorders>
+              <w:top w:val="single" w:color="BFBFBF" w:sz="4"/>
+              <w:left w:val="single" w:color="BFBFBF" w:sz="4"/>
+              <w:bottom w:val="single" w:color="BFBFBF" w:sz="4"/>
+              <w:right w:val="single" w:color="BFBFBF" w:sz="4"/>
+            </w:tcBorders>
+            <w:shd w:fill="F7F9FC" w:val="clear"/>
+            <w:tcMar>
+              <w:top w:type="dxa" w:w="60"/>
+              <w:left w:type="dxa" w:w="100"/>
+              <w:bottom w:type="dxa" w:w="60"/>
+              <w:right w:type="dxa" w:w="100"/>
+            </w:tcMar>
+          </w:tcPr>
+          <w:p>
+            <w:pPr>
+              <w:spacing w:after="0"/>
+            </w:pPr>
+            <w:r>
+              <w:t xml:space="preserve">Avbruten/ofullständig film ritad bara så långt kameran kom, t.ex. *94,6 av 127,2 m från BdNB1015633*; annars tomt.</w:t>
+            </w:r>
+          </w:p>
+        </w:tc>
+      </w:tr>
     </w:tbl>
     <w:p>
       <w:pPr>
@@ -13594,7 +13980,19 @@
         <w:t xml:space="preserve">GIS_VAG_MAX_ANDEL</w:t>
       </w:r>
       <w:r>
-        <w:t xml:space="preserve"> × filmens längd + 20 m) och använder dess längd och vattengång i ändarna som kartlängd och GIS-nivåer.</w:t>
+        <w:t xml:space="preserve"> × filmens längd + 20 m; för en avbruten film räknas taket från brunnarnas avstånd) och använder dess längd och vattengång i ändarna som kartlängd och GIS-nivåer. Vägen går i första hand över ledningar med filmens ledningstyp. Mellanbrunnarna skrivs i kartunderlaget (</w:t>
+      </w:r>
+      <w:r>
+        <w:rPr>
+          <w:rFonts w:ascii="Consolas" w:cs="Consolas" w:eastAsia="Consolas" w:hAnsi="Consolas"/>
+          <w:sz w:val="20"/>
+          <w:szCs w:val="20"/>
+          <w:shd w:fill="F2F2F2" w:val="clear"/>
+        </w:rPr>
+        <w:t xml:space="preserve">gis_via</w:t>
+      </w:r>
+      <w:r>
+        <w:t xml:space="preserve">), så att Skapa ledningslager kan klippa ut sträckan även när den passerar fler brunnar än max hopp – typiskt en avbruten film som gått förbi flera brunnar utan att stanna.</w:t>
       </w:r>
     </w:p>
     <w:p>

</xml_diff>

<commit_message>
Inläsning utan tyst bortfall; samma film i två TV3-filer räknas en gång
Radbrytning inne i ett kommentarsfält delade raden, och började resten med #
tolkades den som en ny sektion så att alla följande sträckor föll bort.
Sträcknummer som inte är heltal föll bort tyst och dubbla nummer skrev över
varandra. Nu läses filen på CRLF, sådana sträckor får nya nummer (nr_fil =
originalet) och det som inte kan läsas hamnar i fel.txt. Identiska filmer i
två filer (delexport och hel export i samma mapp) räknas en gång, och en fil
som helt ingår i en annan pekas ut i konsolen.

Co-Authored-By: Claude Opus 5.5 <noreply@anthropic.com>
Claude-Session: https://claude.ai/code/session_011fdqX3JEZje1LF9LqpaqR8
</commit_message>
<xml_diff>
--- a/Anvandarhandledning tv3_analys.docx
+++ b/Anvandarhandledning tv3_analys.docx
@@ -14616,6 +14616,60 @@
       </w:r>
       <w:r>
         <w:t xml:space="preserve">) och i sträcksidorna i PowerPoint, och fliken Sammanfattning summerar hur många som förvärrats, förbättrats eller är oförändrade. Är den nya filmen ofullständig (avbruten) gäller den ändå, men den ersatta raden får en OBS med båda längderna. Två filmer med samma datum i olika filer antas vara samma film i två exporter: en räknas, den andra markeras *samma datum – dubblett?*. Saknar filmerna tolkbart datum kan de inte ordnas – båda räknas och en OBS skrivs i konsolen.</w:t>
+      </w:r>
+    </w:p>
+    <w:p>
+      <w:pPr>
+        <w:spacing w:after="120"/>
+      </w:pPr>
+      <w:r>
+        <w:rPr>
+          <w:b/>
+          <w:bCs/>
+        </w:rPr>
+        <w:t xml:space="preserve">Samma film i två filer i samma mapp (delexport och hel export).</w:t>
+      </w:r>
+      <w:r>
+        <w:t xml:space="preserve"> Entreprenören levererar ibland en delexport och sedan hela uppdraget i en större fil, t.ex. </w:t>
+      </w:r>
+      <w:r>
+        <w:rPr>
+          <w:rFonts w:ascii="Consolas" w:cs="Consolas" w:eastAsia="Consolas" w:hAnsi="Consolas"/>
+          <w:sz w:val="20"/>
+          <w:szCs w:val="20"/>
+          <w:shd w:fill="F2F2F2" w:val="clear"/>
+        </w:rPr>
+        <w:t xml:space="preserve">DUF 701.TV3</w:t>
+      </w:r>
+      <w:r>
+        <w:t xml:space="preserve"> med 185 sträckor och en fil med 264 sträckor där de 185 ingår. Filmer som är identiska (brunnspar, datum, klockslag, längd, videofil och antal observationer) räknas en gång, i filen med flest sträckor; kopian får Filmstatus *ersatt av samma film nr X i FIL (dubblett)*. Ingår hela filen i den andra säger konsolen *filen är en delmängd och räknas inte* – ta då bort den mindre filen ur listfilen. Analyserar du bara den mindre filen saknas de sträckor som bara finns i den större.</w:t>
+      </w:r>
+    </w:p>
+    <w:p>
+      <w:pPr>
+        <w:spacing w:after="120"/>
+      </w:pPr>
+      <w:r>
+        <w:rPr>
+          <w:b/>
+          <w:bCs/>
+        </w:rPr>
+        <w:t xml:space="preserve">En sträcka i TV3-filen saknas i Excel.</w:t>
+      </w:r>
+      <w:r>
+        <w:t xml:space="preserve"> Inläsningen tappar inga rader: sträcknummer som inte är heltal (t.ex. *12A*) eller som förekommer två gånger i filen får ett nytt nummer efter filens största, och konsolen och </w:t>
+      </w:r>
+      <w:r>
+        <w:rPr>
+          <w:rFonts w:ascii="Consolas" w:cs="Consolas" w:eastAsia="Consolas" w:hAnsi="Consolas"/>
+          <w:sz w:val="20"/>
+          <w:szCs w:val="20"/>
+          <w:shd w:fill="F2F2F2" w:val="clear"/>
+        </w:rPr>
+        <w:t xml:space="preserve">fel.txt</w:t>
+      </w:r>
+      <w:r>
+        <w:t xml:space="preserve"> säger *sträcknummer '12A' (BRUNN → BRUNN) … läst som nr 265*. Radbrytningar inne i kommentarsfält bryter inte heller inläsningen. Saknas sträckan ändå: kontrollera att rätt TV3-fil står i listfilen (en annan export i samma mapp kan innehålla fler sträckor) och sök på brunnslitterat i filen.</w:t>
       </w:r>
     </w:p>
     <w:p>

</xml_diff>

<commit_message>
ArcMap: Python-modulerna i undermappen arcmap/moduler
Verktygslådan tv3_verktyg.pyt, .lyr-filerna och senaste_val.json ligger kvar
i arcmap-mappen; alla .py-filer flyttas till arcmap/moduler. Verktygslådan
lägger moduler först i sökvägen, så gamla kopior i arcmap-mappen används
inte. Modulerna letar efter .lyr-filerna i arcmap-mappen som förut.

Co-Authored-By: Claude Opus 5.5 <noreply@anthropic.com>
Claude-Session: https://claude.ai/code/session_011fdqX3JEZje1LF9LqpaqR8
</commit_message>
<xml_diff>
--- a/Anvandarhandledning tv3_analys.docx
+++ b/Anvandarhandledning tv3_analys.docx
@@ -10208,7 +10208,31 @@
         <w:t xml:space="preserve">arcmap/tv3_verktyg.pyt</w:t>
       </w:r>
       <w:r>
-        <w:t xml:space="preserve">. Verktygslådan </w:t>
+        <w:t xml:space="preserve">. Verktygslådan och dina </w:t>
+      </w:r>
+      <w:r>
+        <w:rPr>
+          <w:rFonts w:ascii="Consolas" w:cs="Consolas" w:eastAsia="Consolas" w:hAnsi="Consolas"/>
+          <w:sz w:val="20"/>
+          <w:szCs w:val="20"/>
+          <w:shd w:fill="F2F2F2" w:val="clear"/>
+        </w:rPr>
+        <w:t xml:space="preserve">.lyr</w:t>
+      </w:r>
+      <w:r>
+        <w:t xml:space="preserve">-filer ligger i arcmap-mappen; Python-filerna som gör jobbet ligger i undermappen </w:t>
+      </w:r>
+      <w:r>
+        <w:rPr>
+          <w:rFonts w:ascii="Consolas" w:cs="Consolas" w:eastAsia="Consolas" w:hAnsi="Consolas"/>
+          <w:sz w:val="20"/>
+          <w:szCs w:val="20"/>
+          <w:shd w:fill="F2F2F2" w:val="clear"/>
+        </w:rPr>
+        <w:t xml:space="preserve">arcmap/moduler</w:t>
+      </w:r>
+      <w:r>
+        <w:t xml:space="preserve"> och ska inte flyttas (verktygslådan hittar dem där). Uppdaterar du från en äldre version där .py-filerna låg direkt i arcmap-mappen kan de gamla .py- och .pyc-filerna där tas bort. Verktygslådan </w:t>
       </w:r>
       <w:r>
         <w:rPr>
@@ -10769,7 +10793,7 @@
           <w:sz w:val="19"/>
           <w:szCs w:val="19"/>
         </w:rPr>
-        <w:t xml:space="preserve">execfile(r'H:\PY\tv3analys\arcmap\skapa_ledningslager.py')</w:t>
+        <w:t xml:space="preserve">execfile(r'H:\PY\tv3analys\arcmap\moduler\skapa_ledningslager.py')</w:t>
       </w:r>
     </w:p>
     <w:p>
@@ -13699,7 +13723,7 @@
           <w:szCs w:val="20"/>
           <w:shd w:fill="F2F2F2" w:val="clear"/>
         </w:rPr>
-        <w:t xml:space="preserve">execfile(r'...\arcmap\lista_falt.py')</w:t>
+        <w:t xml:space="preserve">execfile(r'...\arcmap\moduler\lista_falt.py')</w:t>
       </w:r>
       <w:r>
         <w:t xml:space="preserve">. Lämnas ett fält tomt i dialogen exporteras värdet inte, och analysen rapporterar *vattengång saknas i GIS* för alla sträckor.</w:t>

</xml_diff>

<commit_message>
Skapa ledningslager: ledningar i många bitar mellan två brunnar matchas
En sträcka fick bestå av högst 8 ledningsbitar, och gränsen gick inte att
ändra i dialogen. Nu 50 bitar; bitar mellan skarvar räknas aldrig som hopp.
En kartväg mer än dubbelt så lång som filmen flaggas i GIS_AVVIK. Valet av
parallell ledning (spill/dag) görs med Dijkstra i stället för uppräkning, som
inte hann fram när ledningarna var delade i många bitar.

Co-Authored-By: Claude Opus 5.5 <noreply@anthropic.com>
Claude-Session: https://claude.ai/code/session_011fdqX3JEZje1LF9LqpaqR8
</commit_message>
<xml_diff>
--- a/Anvandarhandledning tv3_analys.docx
+++ b/Anvandarhandledning tv3_analys.docx
@@ -10668,7 +10668,43 @@
         <w:t xml:space="preserve">kartunderlag.json</w:t>
       </w:r>
       <w:r>
-        <w:t xml:space="preserve">, letar upp varje brunnspar i brunnslagren och klipper ut ledningen mellan brunnarna som ett eget objekt. Matchningen bygger ett nätverk av kartans ledningar: varje ledning delas där en av inspektionens brunnar ligger inom toleransen från linjen (även mitt på ett segment, utan egen brytpunkt), fria ledningsändar inom toleransen kopplas ihop, och vägen brunn till brunn söks genom nätet. Så hittas också sträckor som i kartan består av flera ledningsobjekt eller passerar brunnar utan att vara uppdelade; max-hopp styr hur många andra brunnar en sträcka får passera. Utdata i en filgeodatabas rekommenderas; en shapefil fungerar men visar inte fältalias.</w:t>
+        <w:t xml:space="preserve">, letar upp varje brunnspar i brunnslagren och klipper ut ledningen mellan brunnarna som ett eget objekt. Matchningen bygger ett nätverk av kartans ledningar: varje ledning delas där en av inspektionens brunnar ligger inom toleransen från linjen (även mitt på ett segment, utan egen brytpunkt), fria ledningsändar inom toleransen kopplas ihop, och vägen brunn till brunn söks genom nätet. Så hittas också sträckor som i kartan består av flera ledningsobjekt eller passerar brunnar utan att vara uppdelade; max-hopp styr hur många andra brunnar en sträcka får passera. Ledningsbitar mellan skarvar och brunnar som inte ingår i inspektionen räknas inte som hopp; en sträcka får bestå av upp till 50 bitar (</w:t>
+      </w:r>
+      <w:r>
+        <w:rPr>
+          <w:rFonts w:ascii="Consolas" w:cs="Consolas" w:eastAsia="Consolas" w:hAnsi="Consolas"/>
+          <w:sz w:val="20"/>
+          <w:szCs w:val="20"/>
+          <w:shd w:fill="F2F2F2" w:val="clear"/>
+        </w:rPr>
+        <w:t xml:space="preserve">MAX_DELAR</w:t>
+      </w:r>
+      <w:r>
+        <w:t xml:space="preserve"> i </w:t>
+      </w:r>
+      <w:r>
+        <w:rPr>
+          <w:rFonts w:ascii="Consolas" w:cs="Consolas" w:eastAsia="Consolas" w:hAnsi="Consolas"/>
+          <w:sz w:val="20"/>
+          <w:szCs w:val="20"/>
+          <w:shd w:fill="F2F2F2" w:val="clear"/>
+        </w:rPr>
+        <w:t xml:space="preserve">skapa_ledningslager.py</w:t>
+      </w:r>
+      <w:r>
+        <w:t xml:space="preserve">). Blir kartvägen mer än dubbelt så lång som filmen (+ 20 m) skrivs det i fältet </w:t>
+      </w:r>
+      <w:r>
+        <w:rPr>
+          <w:rFonts w:ascii="Consolas" w:cs="Consolas" w:eastAsia="Consolas" w:hAnsi="Consolas"/>
+          <w:sz w:val="20"/>
+          <w:szCs w:val="20"/>
+          <w:shd w:fill="F2F2F2" w:val="clear"/>
+        </w:rPr>
+        <w:t xml:space="preserve">GIS_AVVIK</w:t>
+      </w:r>
+      <w:r>
+        <w:t xml:space="preserve">, t.ex. *kartvagen 110 m, filmen 10 m*, och loggen listar sträckorna. Utdata i en filgeodatabas rekommenderas; en shapefil fungerar men visar inte fältalias.</w:t>
       </w:r>
     </w:p>
     <w:p>

</xml_diff>

<commit_message>
Skapa ledningslager: grenrör utan koordinat, glapp vid brunnar, DAG/SAG
Grenrör, servisar och ändar utan brunn (AG, DAG4, SAG, ÄND35 …) söks nu i
kartan på filmens längd från den kända brunnen när analysen inte gav någon
koordinat. DAG/SAG/KAG känns igen som grenrör även i analysen. Ledningar som
slutar på var sin sida om en brunn som inte ingår i inspektionen hänger ihop
via brunnen. Avbrutna filmer via GIS-vägen får fler hopp, och två brunnar på
samma punkt får en egen diagnos.

Co-Authored-By: Claude Opus 5.5 <noreply@anthropic.com>
Claude-Session: https://claude.ai/code/session_011fdqX3JEZje1LF9LqpaqR8
</commit_message>
<xml_diff>
--- a/Anvandarhandledning tv3_analys.docx
+++ b/Anvandarhandledning tv3_analys.docx
@@ -3179,7 +3179,7 @@
         <w:t xml:space="preserve">Ände utan brunn: grenrör, servis eller propp.</w:t>
       </w:r>
       <w:r>
-        <w:t xml:space="preserve"> Slutar filmen i ett påstick på en annan ledning, i en servisanslutning eller i en ledningsände utan brunn finns ingen brunn att matcha. Littera som AG, AAG1, AAG2 … (mönstret </w:t>
+        <w:t xml:space="preserve"> Slutar filmen i ett påstick på en annan ledning, i en servisanslutning eller i en ledningsände utan brunn finns ingen brunn att matcha. Littera som AG, AAG1, AAG2, DAG4, SAG … (mönstret </w:t>
       </w:r>
       <w:r>
         <w:rPr>
@@ -3191,7 +3191,7 @@
         <w:t xml:space="preserve">GRENROR_LITTERA</w:t>
       </w:r>
       <w:r>
-        <w:t xml:space="preserve"> i KONFIG) tolkas automatiskt som grenrör och ÄND 35, ÄNDE1 … (</w:t>
+        <w:t xml:space="preserve"> i KONFIG; en inledande D, S eller K anger systemet) tolkas automatiskt som grenrör och ÄND 35, ÄNDE1 … (</w:t>
       </w:r>
       <w:r>
         <w:rPr>
@@ -8092,7 +8092,7 @@
                 <w:szCs w:val="20"/>
                 <w:shd w:fill="F2F2F2" w:val="clear"/>
               </w:rPr>
-              <w:t xml:space="preserve">^A{1,2}G\d*$</w:t>
+              <w:t xml:space="preserve">^[DSK]?A{1,2}G\d*$</w:t>
             </w:r>
             <w:r>
               <w:t xml:space="preserve">, </w:t>
@@ -10795,6 +10795,60 @@
       </w:r>
       <w:r>
         <w:t xml:space="preserve"> säger t.ex. *94,6 av 127,2 m från BdNB1015633*; svackor och bakfall läggs ut längs den filmade delen. Har analysen hittat GIS-vägen via andra brunnar (filmen gick förbi brunnar utan att stanna, se 7.11) får sträckan passera just de brunnarna även om max hopp är lägre, och loggen räknar dem.</w:t>
+      </w:r>
+    </w:p>
+    <w:p>
+      <w:pPr>
+        <w:spacing w:after="120"/>
+      </w:pPr>
+      <w:r>
+        <w:rPr>
+          <w:b/>
+          <w:bCs/>
+        </w:rPr>
+        <w:t xml:space="preserve">Grenrör och ändar utan brunn i kartan.</w:t>
+      </w:r>
+      <w:r>
+        <w:t xml:space="preserve"> En sträcka som slutar i ett grenrör, en servis eller en ände utan brunn (AG, DAG4, SAG, ÄND35 …, eller markerad i litterafilen) klipps ut från den kända brunnen till den fria ledningsände som analysen hittade i GIS-exporten. Saknas den koordinaten – analysen kördes utan </w:t>
+      </w:r>
+      <w:r>
+        <w:rPr>
+          <w:rFonts w:ascii="Consolas" w:cs="Consolas" w:eastAsia="Consolas" w:hAnsi="Consolas"/>
+          <w:sz w:val="20"/>
+          <w:szCs w:val="20"/>
+          <w:shd w:fill="F2F2F2" w:val="clear"/>
+        </w:rPr>
+        <w:t xml:space="preserve">gis:</w:t>
+      </w:r>
+      <w:r>
+        <w:t xml:space="preserve"> eller hittade ingen ledning – söker verktyget själv den fria ledningsände (en återvändsände eller en knutpunkt på en annan ledning) vars avstånd från brunnen längs ledningarna ligger närmast filmens längd, inom 30 % + 3 m (</w:t>
+      </w:r>
+      <w:r>
+        <w:rPr>
+          <w:rFonts w:ascii="Consolas" w:cs="Consolas" w:eastAsia="Consolas" w:hAnsi="Consolas"/>
+          <w:sz w:val="20"/>
+          <w:szCs w:val="20"/>
+          <w:shd w:fill="F2F2F2" w:val="clear"/>
+        </w:rPr>
+        <w:t xml:space="preserve">GRENROR_LANGD_TOL</w:t>
+      </w:r>
+      <w:r>
+        <w:t xml:space="preserve">). Loggen räknar dem som *hittade på filmens längd*.</w:t>
+      </w:r>
+    </w:p>
+    <w:p>
+      <w:pPr>
+        <w:spacing w:after="120"/>
+      </w:pPr>
+      <w:r>
+        <w:rPr>
+          <w:b/>
+          <w:bCs/>
+        </w:rPr>
+        <w:t xml:space="preserve">Ledningar som är brutna vid en brunn.</w:t>
+      </w:r>
+      <w:r>
+        <w:t xml:space="preserve"> Kartans ledningar slutar ofta vid brunnens kant i stället för i dess mittpunkt, så att ändarna på var sin sida om en stor brunn ligger mer än toleransen isär. Brunnar som inte ingår i inspektionen används därför som skarvar: ledningsändar inom toleransen från en sådan brunn hänger ihop via den, och brunnen räknas inte som hopp. Ligger två inspekterade brunnar på samma punkt i kartan (t.ex. en rensbrunn i en nedstigningsbrunn) får sträckan diagnosen *brunnarna ligger på samma plats i kartan*.</w:t>
       </w:r>
     </w:p>
     <w:p>

</xml_diff>

<commit_message>
Skapa ledningslager: ofilmad del av avbrutna sträckor som eget lager
Resten av en avbruten sträcka - den del kameran inte nådde - kan skrivas som
ett eget linjelager med samma fält som den filmade delen (rapport, film,
klass, index) och KLIPPT 'ej filmad: X av Y m'. Lagret får en egen färg via
arcmap/ej_filmad.lyr. Namnet föreslås bredvid utdata i dialogen.

Co-Authored-By: Claude Opus 5.5 <noreply@anthropic.com>
Claude-Session: https://claude.ai/code/session_011fdqX3JEZje1LF9LqpaqR8
</commit_message>
<xml_diff>
--- a/Anvandarhandledning tv3_analys.docx
+++ b/Anvandarhandledning tv3_analys.docx
@@ -10794,7 +10794,53 @@
         <w:t xml:space="preserve">KLIPPT</w:t>
       </w:r>
       <w:r>
-        <w:t xml:space="preserve"> säger t.ex. *94,6 av 127,2 m från BdNB1015633*; svackor och bakfall läggs ut längs den filmade delen. Har analysen hittat GIS-vägen via andra brunnar (filmen gick förbi brunnar utan att stanna, se 7.11) får sträckan passera just de brunnarna även om max hopp är lägre, och loggen räknar dem.</w:t>
+        <w:t xml:space="preserve"> säger t.ex. *94,6 av 127,2 m från BdNB1015633*; svackor och bakfall läggs ut längs den filmade delen. Vill du visa den del som inte filmades fyller du i </w:t>
+      </w:r>
+      <w:r>
+        <w:rPr>
+          <w:b/>
+          <w:bCs/>
+        </w:rPr>
+        <w:t xml:space="preserve">Ej filmad del av avbrutna sträckor</w:t>
+      </w:r>
+      <w:r>
+        <w:t xml:space="preserve"> under Avbrutna inspektioner (namnet föreslås bredvid utdata, </w:t>
+      </w:r>
+      <w:r>
+        <w:rPr>
+          <w:rFonts w:ascii="Consolas" w:cs="Consolas" w:eastAsia="Consolas" w:hAnsi="Consolas"/>
+          <w:sz w:val="20"/>
+          <w:szCs w:val="20"/>
+          <w:shd w:fill="F2F2F2" w:val="clear"/>
+        </w:rPr>
+        <w:t xml:space="preserve">&lt;namn&gt;_ej_filmad</w:t>
+      </w:r>
+      <w:r>
+        <w:t xml:space="preserve">): resten av sträckan skrivs då som ett eget linjelager med samma fält som den filmade delen – rapport, film, klass och index – och fältet </w:t>
+      </w:r>
+      <w:r>
+        <w:rPr>
+          <w:rFonts w:ascii="Consolas" w:cs="Consolas" w:eastAsia="Consolas" w:hAnsi="Consolas"/>
+          <w:sz w:val="20"/>
+          <w:szCs w:val="20"/>
+          <w:shd w:fill="F2F2F2" w:val="clear"/>
+        </w:rPr>
+        <w:t xml:space="preserve">KLIPPT</w:t>
+      </w:r>
+      <w:r>
+        <w:t xml:space="preserve"> säger t.ex. *ej filmad: 32,6 av 127,2 m (kameran kom 94,6 m från BdNB1015633)*. Ge lagret en egen färg en gång (t.ex. grå streckad linje) och spara det som </w:t>
+      </w:r>
+      <w:r>
+        <w:rPr>
+          <w:rFonts w:ascii="Consolas" w:cs="Consolas" w:eastAsia="Consolas" w:hAnsi="Consolas"/>
+          <w:sz w:val="20"/>
+          <w:szCs w:val="20"/>
+          <w:shd w:fill="F2F2F2" w:val="clear"/>
+        </w:rPr>
+        <w:t xml:space="preserve">arcmap/ej_filmad.lyr</w:t>
+      </w:r>
+      <w:r>
+        <w:t xml:space="preserve">, så används symbologin automatiskt nästa gång. Har analysen hittat GIS-vägen via andra brunnar (filmen gick förbi brunnar utan att stanna, se 7.11) får sträckan passera just de brunnarna även om max hopp är lägre, och loggen räknar dem.</w:t>
       </w:r>
     </w:p>
     <w:p>

</xml_diff>

<commit_message>
Brunnar orimligt långt isär flaggas som troligt fel littera
Ligger sträckans två brunnar mer än 1 000 m isär (eller mer än tre gånger
filmens längd + 50 m för en hel film) och det finns ingen direkt ledning,
flaggar analysen det i GIS-flaggan, använder inget avstånd som kartlängd och
lägger båda brunnarna i littera_forslag.csv. Skapa ledningslager matchar inte
sådana sträckor och säger varför i CSV:n över omatchade.

Co-Authored-By: Claude Opus 5.5 <noreply@anthropic.com>
Claude-Session: https://claude.ai/code/session_011fdqX3JEZje1LF9LqpaqR8
</commit_message>
<xml_diff>
--- a/Anvandarhandledning tv3_analys.docx
+++ b/Anvandarhandledning tv3_analys.docx
@@ -6585,7 +6585,19 @@
                 <w:szCs w:val="20"/>
                 <w:shd w:fill="F2F2F2" w:val="clear"/>
               </w:rPr>
-              <w:t xml:space="preserve">GIS_DIM_TOL</w:t>
+              <w:t xml:space="preserve">GIS_BRUNN_AVSTAND_MAX_M</w:t>
+            </w:r>
+            <w:r>
+              <w:t xml:space="preserve">, </w:t>
+            </w:r>
+            <w:r>
+              <w:rPr>
+                <w:rFonts w:ascii="Consolas" w:cs="Consolas" w:eastAsia="Consolas" w:hAnsi="Consolas"/>
+                <w:sz w:val="20"/>
+                <w:szCs w:val="20"/>
+                <w:shd w:fill="F2F2F2" w:val="clear"/>
+              </w:rPr>
+              <w:t xml:space="preserve">GIS_BRUNN_AVSTAND_ANDEL</w:t>
             </w:r>
           </w:p>
         </w:tc>
@@ -6611,7 +6623,31 @@
               <w:spacing w:after="0"/>
             </w:pPr>
             <w:r>
-              <w:t xml:space="preserve">Finns flera ledningar mellan samma brunnar i GIS (spill och dag parallellt, bräddbrunnar) väljs den med filmens ledningstyp, sedan den vars dimension ligger inom denna andel av filmens, sist den med längd närmast filmens.</w:t>
+              <w:t xml:space="preserve">Ligger sträckans två brunnar längre isär i GIS än så (eller längre än andelen × filmens längd + 50 m, utom för avbrutna filmer) och det finns ingen direkt ledning mellan dem, har en av dem troligen fel littera: GIS-flaggan säger *brunnarna ligger X m isär i GIS*, ingen kartlängd används och båda brunnarna hamnar i littera_forslag.csv. Samma gränser i Skapa ledningslager (</w:t>
+            </w:r>
+            <w:r>
+              <w:rPr>
+                <w:rFonts w:ascii="Consolas" w:cs="Consolas" w:eastAsia="Consolas" w:hAnsi="Consolas"/>
+                <w:sz w:val="20"/>
+                <w:szCs w:val="20"/>
+                <w:shd w:fill="F2F2F2" w:val="clear"/>
+              </w:rPr>
+              <w:t xml:space="preserve">BRUNN_AVSTAND_MAX_M</w:t>
+            </w:r>
+            <w:r>
+              <w:t xml:space="preserve">, </w:t>
+            </w:r>
+            <w:r>
+              <w:rPr>
+                <w:rFonts w:ascii="Consolas" w:cs="Consolas" w:eastAsia="Consolas" w:hAnsi="Consolas"/>
+                <w:sz w:val="20"/>
+                <w:szCs w:val="20"/>
+                <w:shd w:fill="F2F2F2" w:val="clear"/>
+              </w:rPr>
+              <w:t xml:space="preserve">BRUNN_AVSTAND_ANDEL</w:t>
+            </w:r>
+            <w:r>
+              <w:t xml:space="preserve">), där sträckan då inte matchas.</w:t>
             </w:r>
           </w:p>
         </w:tc>
@@ -6637,7 +6673,7 @@
               <w:spacing w:after="0"/>
             </w:pPr>
             <w:r>
-              <w:t xml:space="preserve">0,1</w:t>
+              <w:t xml:space="preserve">1000, 3,0</w:t>
             </w:r>
           </w:p>
         </w:tc>
@@ -6670,19 +6706,7 @@
                 <w:szCs w:val="20"/>
                 <w:shd w:fill="F2F2F2" w:val="clear"/>
               </w:rPr>
-              <w:t xml:space="preserve">HOJD_SAKNAS_UNDER</w:t>
-            </w:r>
-            <w:r>
-              <w:t xml:space="preserve">, </w:t>
-            </w:r>
-            <w:r>
-              <w:rPr>
-                <w:rFonts w:ascii="Consolas" w:cs="Consolas" w:eastAsia="Consolas" w:hAnsi="Consolas"/>
-                <w:sz w:val="20"/>
-                <w:szCs w:val="20"/>
-                <w:shd w:fill="F2F2F2" w:val="clear"/>
-              </w:rPr>
-              <w:t xml:space="preserve">HOJD_ORIMLIG_M</w:t>
+              <w:t xml:space="preserve">GIS_DIM_TOL</w:t>
             </w:r>
           </w:p>
         </w:tc>
@@ -6707,7 +6731,7 @@
               <w:spacing w:after="0"/>
             </w:pPr>
             <w:r>
-              <w:t xml:space="preserve">Rimlighet hos höjderna i TV3-filen: värden under det första (SVOA skriver −9999 för saknad) räknas som saknade; skiljer brunnshöjderna i PROFILADM mer än det andra, eller spänner inklinometerprofilen över mer än så, är höjderna fel i filen och används inte (Höjdflagga *Höjdfel i filen*, lutning *okänd*, profilen ritas inte).</w:t>
+              <w:t xml:space="preserve">Finns flera ledningar mellan samma brunnar i GIS (spill och dag parallellt, bräddbrunnar) väljs den med filmens ledningstyp, sedan den vars dimension ligger inom denna andel av filmens, sist den med längd närmast filmens.</w:t>
             </w:r>
           </w:p>
         </w:tc>
@@ -6732,7 +6756,7 @@
               <w:spacing w:after="0"/>
             </w:pPr>
             <w:r>
-              <w:t xml:space="preserve">−999, 50</w:t>
+              <w:t xml:space="preserve">0,1</w:t>
             </w:r>
           </w:p>
         </w:tc>
@@ -6766,7 +6790,19 @@
                 <w:szCs w:val="20"/>
                 <w:shd w:fill="F2F2F2" w:val="clear"/>
               </w:rPr>
-              <w:t xml:space="preserve">DELFILMER_SEPARAT</w:t>
+              <w:t xml:space="preserve">HOJD_SAKNAS_UNDER</w:t>
+            </w:r>
+            <w:r>
+              <w:t xml:space="preserve">, </w:t>
+            </w:r>
+            <w:r>
+              <w:rPr>
+                <w:rFonts w:ascii="Consolas" w:cs="Consolas" w:eastAsia="Consolas" w:hAnsi="Consolas"/>
+                <w:sz w:val="20"/>
+                <w:szCs w:val="20"/>
+                <w:shd w:fill="F2F2F2" w:val="clear"/>
+              </w:rPr>
+              <w:t xml:space="preserve">HOJD_ORIMLIG_M</w:t>
             </w:r>
           </w:p>
         </w:tc>
@@ -6792,16 +6828,7 @@
               <w:spacing w:after="0"/>
             </w:pPr>
             <w:r>
-              <w:rPr>
-                <w:rFonts w:ascii="Consolas" w:cs="Consolas" w:eastAsia="Consolas" w:hAnsi="Consolas"/>
-                <w:sz w:val="20"/>
-                <w:szCs w:val="20"/>
-                <w:shd w:fill="F2F2F2" w:val="clear"/>
-              </w:rPr>
-              <w:t xml:space="preserve">True</w:t>
-            </w:r>
-            <w:r>
-              <w:t xml:space="preserve"> listar delfilmerna i en sammanslagning även var för sig i Prioritering och Observationer och ger dem egna protokoll.</w:t>
+              <w:t xml:space="preserve">Rimlighet hos höjderna i TV3-filen: värden under det första (SVOA skriver −9999 för saknad) räknas som saknade; skiljer brunnshöjderna i PROFILADM mer än det andra, eller spänner inklinometerprofilen över mer än så, är höjderna fel i filen och används inte (Höjdflagga *Höjdfel i filen*, lutning *okänd*, profilen ritas inte).</w:t>
             </w:r>
           </w:p>
         </w:tc>
@@ -6827,13 +6854,7 @@
               <w:spacing w:after="0"/>
             </w:pPr>
             <w:r>
-              <w:rPr>
-                <w:rFonts w:ascii="Consolas" w:cs="Consolas" w:eastAsia="Consolas" w:hAnsi="Consolas"/>
-                <w:sz w:val="20"/>
-                <w:szCs w:val="20"/>
-                <w:shd w:fill="F2F2F2" w:val="clear"/>
-              </w:rPr>
-              <w:t xml:space="preserve">False</w:t>
+              <w:t xml:space="preserve">−999, 50</w:t>
             </w:r>
           </w:p>
         </w:tc>
@@ -6866,19 +6887,7 @@
                 <w:szCs w:val="20"/>
                 <w:shd w:fill="F2F2F2" w:val="clear"/>
               </w:rPr>
-              <w:t xml:space="preserve">OMFILMNING_OVER_FILER</w:t>
-            </w:r>
-            <w:r>
-              <w:t xml:space="preserve">, </w:t>
-            </w:r>
-            <w:r>
-              <w:rPr>
-                <w:rFonts w:ascii="Consolas" w:cs="Consolas" w:eastAsia="Consolas" w:hAnsi="Consolas"/>
-                <w:sz w:val="20"/>
-                <w:szCs w:val="20"/>
-                <w:shd w:fill="F2F2F2" w:val="clear"/>
-              </w:rPr>
-              <w:t xml:space="preserve">TIDIGARE_INDEX_ANDEL</w:t>
+              <w:t xml:space="preserve">DELFILMER_SEPARAT</w:t>
             </w:r>
           </w:p>
         </w:tc>
@@ -6903,7 +6912,16 @@
               <w:spacing w:after="0"/>
             </w:pPr>
             <w:r>
-              <w:t xml:space="preserve">Samma brunnspar i olika TV3-filer (olika inspektionsomgångar): den nyaste filmen gäller, äldre markeras *ersatt av ny inspektion* och den gällande får kolumnen Tidigare inspektion (klass och konstruktionsindex då → nu). Inom samma klass räknas sträckan som förvärrad/förbättrad när indexet ändrats mer än andelen (och minst 5 p/100 m).</w:t>
+              <w:rPr>
+                <w:rFonts w:ascii="Consolas" w:cs="Consolas" w:eastAsia="Consolas" w:hAnsi="Consolas"/>
+                <w:sz w:val="20"/>
+                <w:szCs w:val="20"/>
+                <w:shd w:fill="F2F2F2" w:val="clear"/>
+              </w:rPr>
+              <w:t xml:space="preserve">True</w:t>
+            </w:r>
+            <w:r>
+              <w:t xml:space="preserve"> listar delfilmerna i en sammanslagning även var för sig i Prioritering och Observationer och ger dem egna protokoll.</w:t>
             </w:r>
           </w:p>
         </w:tc>
@@ -6934,10 +6952,7 @@
                 <w:szCs w:val="20"/>
                 <w:shd w:fill="F2F2F2" w:val="clear"/>
               </w:rPr>
-              <w:t xml:space="preserve">True</w:t>
-            </w:r>
-            <w:r>
-              <w:t xml:space="preserve">, 0,2</w:t>
+              <w:t xml:space="preserve">False</w:t>
             </w:r>
           </w:p>
         </w:tc>
@@ -6971,7 +6986,7 @@
                 <w:szCs w:val="20"/>
                 <w:shd w:fill="F2F2F2" w:val="clear"/>
               </w:rPr>
-              <w:t xml:space="preserve">GIS_LANGD_TOL</w:t>
+              <w:t xml:space="preserve">OMFILMNING_OVER_FILER</w:t>
             </w:r>
             <w:r>
               <w:t xml:space="preserve">, </w:t>
@@ -6983,7 +6998,7 @@
                 <w:szCs w:val="20"/>
                 <w:shd w:fill="F2F2F2" w:val="clear"/>
               </w:rPr>
-              <w:t xml:space="preserve">GIS_LITTERA_LIKHET</w:t>
+              <w:t xml:space="preserve">TIDIGARE_INDEX_ANDEL</w:t>
             </w:r>
           </w:p>
         </w:tc>
@@ -7009,7 +7024,7 @@
               <w:spacing w:after="0"/>
             </w:pPr>
             <w:r>
-              <w:t xml:space="preserve">Förslag på rätt littera för okända brunnar: en GIS-ledning från den kända brunnen med längd inom så stor andel av filmens föreslås; annars littera med minst så stor namnlikhet (0–1).</w:t>
+              <w:t xml:space="preserve">Samma brunnspar i olika TV3-filer (olika inspektionsomgångar): den nyaste filmen gäller, äldre markeras *ersatt av ny inspektion* och den gällande får kolumnen Tidigare inspektion (klass och konstruktionsindex då → nu). Inom samma klass räknas sträckan som förvärrad/förbättrad när indexet ändrats mer än andelen (och minst 5 p/100 m).</w:t>
             </w:r>
           </w:p>
         </w:tc>
@@ -7035,7 +7050,16 @@
               <w:spacing w:after="0"/>
             </w:pPr>
             <w:r>
-              <w:t xml:space="preserve">0,15, 0,75</w:t>
+              <w:rPr>
+                <w:rFonts w:ascii="Consolas" w:cs="Consolas" w:eastAsia="Consolas" w:hAnsi="Consolas"/>
+                <w:sz w:val="20"/>
+                <w:szCs w:val="20"/>
+                <w:shd w:fill="F2F2F2" w:val="clear"/>
+              </w:rPr>
+              <w:t xml:space="preserve">True</w:t>
+            </w:r>
+            <w:r>
+              <w:t xml:space="preserve">, 0,2</w:t>
             </w:r>
           </w:p>
         </w:tc>
@@ -7068,7 +7092,19 @@
                 <w:szCs w:val="20"/>
                 <w:shd w:fill="F2F2F2" w:val="clear"/>
               </w:rPr>
-              <w:t xml:space="preserve">GIS_MATERIAL</w:t>
+              <w:t xml:space="preserve">GIS_LANGD_TOL</w:t>
+            </w:r>
+            <w:r>
+              <w:t xml:space="preserve">, </w:t>
+            </w:r>
+            <w:r>
+              <w:rPr>
+                <w:rFonts w:ascii="Consolas" w:cs="Consolas" w:eastAsia="Consolas" w:hAnsi="Consolas"/>
+                <w:sz w:val="20"/>
+                <w:szCs w:val="20"/>
+                <w:shd w:fill="F2F2F2" w:val="clear"/>
+              </w:rPr>
+              <w:t xml:space="preserve">GIS_LITTERA_LIKHET</w:t>
             </w:r>
           </w:p>
         </w:tc>
@@ -7093,7 +7129,7 @@
               <w:spacing w:after="0"/>
             </w:pPr>
             <w:r>
-              <w:t xml:space="preserve">Materialnamn i film och GIS som räknas som samma (BTG = Betong, PVC/PE/PP = Plast …).</w:t>
+              <w:t xml:space="preserve">Förslag på rätt littera för okända brunnar: en GIS-ledning från den kända brunnen med längd inom så stor andel av filmens föreslås; annars littera med minst så stor namnlikhet (0–1).</w:t>
             </w:r>
           </w:p>
         </w:tc>
@@ -7118,7 +7154,7 @@
               <w:spacing w:after="0"/>
             </w:pPr>
             <w:r>
-              <w:t xml:space="preserve">se skriptet</w:t>
+              <w:t xml:space="preserve">0,15, 0,75</w:t>
             </w:r>
           </w:p>
         </w:tc>
@@ -7152,19 +7188,7 @@
                 <w:szCs w:val="20"/>
                 <w:shd w:fill="F2F2F2" w:val="clear"/>
               </w:rPr>
-              <w:t xml:space="preserve">FOTO_MAX_PX</w:t>
-            </w:r>
-            <w:r>
-              <w:t xml:space="preserve">, </w:t>
-            </w:r>
-            <w:r>
-              <w:rPr>
-                <w:rFonts w:ascii="Consolas" w:cs="Consolas" w:eastAsia="Consolas" w:hAnsi="Consolas"/>
-                <w:sz w:val="20"/>
-                <w:szCs w:val="20"/>
-                <w:shd w:fill="F2F2F2" w:val="clear"/>
-              </w:rPr>
-              <w:t xml:space="preserve">FOTO_JPEG_KVALITET</w:t>
+              <w:t xml:space="preserve">GIS_MATERIAL</w:t>
             </w:r>
           </w:p>
         </w:tc>
@@ -7190,19 +7214,7 @@
               <w:spacing w:after="0"/>
             </w:pPr>
             <w:r>
-              <w:t xml:space="preserve">Fotona i PDF-rapporterna förminskas till högst så många pixlar på längsta sidan (JPEG-kvalitet enligt den andra; 76 ger ~30 % mindre filer än 82 utan synlig skillnad i A4). </w:t>
-            </w:r>
-            <w:r>
-              <w:rPr>
-                <w:rFonts w:ascii="Consolas" w:cs="Consolas" w:eastAsia="Consolas" w:hAnsi="Consolas"/>
-                <w:sz w:val="20"/>
-                <w:szCs w:val="20"/>
-                <w:shd w:fill="F2F2F2" w:val="clear"/>
-              </w:rPr>
-              <w:t xml:space="preserve">None</w:t>
-            </w:r>
-            <w:r>
-              <w:t xml:space="preserve"> = originalstorlek.</w:t>
+              <w:t xml:space="preserve">Materialnamn i film och GIS som räknas som samma (BTG = Betong, PVC/PE/PP = Plast …).</w:t>
             </w:r>
           </w:p>
         </w:tc>
@@ -7228,7 +7240,7 @@
               <w:spacing w:after="0"/>
             </w:pPr>
             <w:r>
-              <w:t xml:space="preserve">960, 76</w:t>
+              <w:t xml:space="preserve">se skriptet</w:t>
             </w:r>
           </w:p>
         </w:tc>
@@ -7261,7 +7273,7 @@
                 <w:szCs w:val="20"/>
                 <w:shd w:fill="F2F2F2" w:val="clear"/>
               </w:rPr>
-              <w:t xml:space="preserve">RAPPORT_BILD_DPI</w:t>
+              <w:t xml:space="preserve">FOTO_MAX_PX</w:t>
             </w:r>
             <w:r>
               <w:t xml:space="preserve">, </w:t>
@@ -7273,7 +7285,7 @@
                 <w:szCs w:val="20"/>
                 <w:shd w:fill="F2F2F2" w:val="clear"/>
               </w:rPr>
-              <w:t xml:space="preserve">RAPPORT_BILD_PALETT</w:t>
+              <w:t xml:space="preserve">FOTO_JPEG_KVALITET</w:t>
             </w:r>
           </w:p>
         </w:tc>
@@ -7298,7 +7310,19 @@
               <w:spacing w:after="0"/>
             </w:pPr>
             <w:r>
-              <w:t xml:space="preserve">Upplösning på översikts- och profilbilden i rapporten, och om de sparas som palett-PNG (256 färger, ca 65 % mindre).</w:t>
+              <w:t xml:space="preserve">Fotona i PDF-rapporterna förminskas till högst så många pixlar på längsta sidan (JPEG-kvalitet enligt den andra; 76 ger ~30 % mindre filer än 82 utan synlig skillnad i A4). </w:t>
+            </w:r>
+            <w:r>
+              <w:rPr>
+                <w:rFonts w:ascii="Consolas" w:cs="Consolas" w:eastAsia="Consolas" w:hAnsi="Consolas"/>
+                <w:sz w:val="20"/>
+                <w:szCs w:val="20"/>
+                <w:shd w:fill="F2F2F2" w:val="clear"/>
+              </w:rPr>
+              <w:t xml:space="preserve">None</w:t>
+            </w:r>
+            <w:r>
+              <w:t xml:space="preserve"> = originalstorlek.</w:t>
             </w:r>
           </w:p>
         </w:tc>
@@ -7323,16 +7347,7 @@
               <w:spacing w:after="0"/>
             </w:pPr>
             <w:r>
-              <w:t xml:space="preserve">150, </w:t>
-            </w:r>
-            <w:r>
-              <w:rPr>
-                <w:rFonts w:ascii="Consolas" w:cs="Consolas" w:eastAsia="Consolas" w:hAnsi="Consolas"/>
-                <w:sz w:val="20"/>
-                <w:szCs w:val="20"/>
-                <w:shd w:fill="F2F2F2" w:val="clear"/>
-              </w:rPr>
-              <w:t xml:space="preserve">True</w:t>
+              <w:t xml:space="preserve">960, 76</w:t>
             </w:r>
           </w:p>
         </w:tc>
@@ -7366,7 +7381,19 @@
                 <w:szCs w:val="20"/>
                 <w:shd w:fill="F2F2F2" w:val="clear"/>
               </w:rPr>
-              <w:t xml:space="preserve">RAPPORT_PROCESSER</w:t>
+              <w:t xml:space="preserve">RAPPORT_BILD_DPI</w:t>
+            </w:r>
+            <w:r>
+              <w:t xml:space="preserve">, </w:t>
+            </w:r>
+            <w:r>
+              <w:rPr>
+                <w:rFonts w:ascii="Consolas" w:cs="Consolas" w:eastAsia="Consolas" w:hAnsi="Consolas"/>
+                <w:sz w:val="20"/>
+                <w:szCs w:val="20"/>
+                <w:shd w:fill="F2F2F2" w:val="clear"/>
+              </w:rPr>
+              <w:t xml:space="preserve">RAPPORT_BILD_PALETT</w:t>
             </w:r>
           </w:p>
         </w:tc>
@@ -7392,31 +7419,7 @@
               <w:spacing w:after="0"/>
             </w:pPr>
             <w:r>
-              <w:t xml:space="preserve">Antal parallella processer för PDF-rapporterna. </w:t>
-            </w:r>
-            <w:r>
-              <w:rPr>
-                <w:rFonts w:ascii="Consolas" w:cs="Consolas" w:eastAsia="Consolas" w:hAnsi="Consolas"/>
-                <w:sz w:val="20"/>
-                <w:szCs w:val="20"/>
-                <w:shd w:fill="F2F2F2" w:val="clear"/>
-              </w:rPr>
-              <w:t xml:space="preserve">None</w:t>
-            </w:r>
-            <w:r>
-              <w:t xml:space="preserve"> = antal kärnor − 1, </w:t>
-            </w:r>
-            <w:r>
-              <w:rPr>
-                <w:rFonts w:ascii="Consolas" w:cs="Consolas" w:eastAsia="Consolas" w:hAnsi="Consolas"/>
-                <w:sz w:val="20"/>
-                <w:szCs w:val="20"/>
-                <w:shd w:fill="F2F2F2" w:val="clear"/>
-              </w:rPr>
-              <w:t xml:space="preserve">1</w:t>
-            </w:r>
-            <w:r>
-              <w:t xml:space="preserve"> = en i taget.</w:t>
+              <w:t xml:space="preserve">Upplösning på översikts- och profilbilden i rapporten, och om de sparas som palett-PNG (256 färger, ca 65 % mindre).</w:t>
             </w:r>
           </w:p>
         </w:tc>
@@ -7442,13 +7445,16 @@
               <w:spacing w:after="0"/>
             </w:pPr>
             <w:r>
-              <w:rPr>
-                <w:rFonts w:ascii="Consolas" w:cs="Consolas" w:eastAsia="Consolas" w:hAnsi="Consolas"/>
-                <w:sz w:val="20"/>
-                <w:szCs w:val="20"/>
-                <w:shd w:fill="F2F2F2" w:val="clear"/>
-              </w:rPr>
-              <w:t xml:space="preserve">None</w:t>
+              <w:t xml:space="preserve">150, </w:t>
+            </w:r>
+            <w:r>
+              <w:rPr>
+                <w:rFonts w:ascii="Consolas" w:cs="Consolas" w:eastAsia="Consolas" w:hAnsi="Consolas"/>
+                <w:sz w:val="20"/>
+                <w:szCs w:val="20"/>
+                <w:shd w:fill="F2F2F2" w:val="clear"/>
+              </w:rPr>
+              <w:t xml:space="preserve">True</w:t>
             </w:r>
           </w:p>
         </w:tc>
@@ -7481,7 +7487,7 @@
                 <w:szCs w:val="20"/>
                 <w:shd w:fill="F2F2F2" w:val="clear"/>
               </w:rPr>
-              <w:t xml:space="preserve">DOLDA_KOLUMNER</w:t>
+              <w:t xml:space="preserve">RAPPORT_PROCESSER</w:t>
             </w:r>
           </w:p>
         </w:tc>
@@ -7506,7 +7512,31 @@
               <w:spacing w:after="0"/>
             </w:pPr>
             <w:r>
-              <w:t xml:space="preserve">Kolumner per flik som döljs som standard i Excel (grupperade, fälls ut med plustecknet ovanför rubrikraden). Rubrik utan enhet. Tom lista = visa allt.</w:t>
+              <w:t xml:space="preserve">Antal parallella processer för PDF-rapporterna. </w:t>
+            </w:r>
+            <w:r>
+              <w:rPr>
+                <w:rFonts w:ascii="Consolas" w:cs="Consolas" w:eastAsia="Consolas" w:hAnsi="Consolas"/>
+                <w:sz w:val="20"/>
+                <w:szCs w:val="20"/>
+                <w:shd w:fill="F2F2F2" w:val="clear"/>
+              </w:rPr>
+              <w:t xml:space="preserve">None</w:t>
+            </w:r>
+            <w:r>
+              <w:t xml:space="preserve"> = antal kärnor − 1, </w:t>
+            </w:r>
+            <w:r>
+              <w:rPr>
+                <w:rFonts w:ascii="Consolas" w:cs="Consolas" w:eastAsia="Consolas" w:hAnsi="Consolas"/>
+                <w:sz w:val="20"/>
+                <w:szCs w:val="20"/>
+                <w:shd w:fill="F2F2F2" w:val="clear"/>
+              </w:rPr>
+              <w:t xml:space="preserve">1</w:t>
+            </w:r>
+            <w:r>
+              <w:t xml:space="preserve"> = en i taget.</w:t>
             </w:r>
           </w:p>
         </w:tc>
@@ -7531,7 +7561,13 @@
               <w:spacing w:after="0"/>
             </w:pPr>
             <w:r>
-              <w:t xml:space="preserve">se skriptet</w:t>
+              <w:rPr>
+                <w:rFonts w:ascii="Consolas" w:cs="Consolas" w:eastAsia="Consolas" w:hAnsi="Consolas"/>
+                <w:sz w:val="20"/>
+                <w:szCs w:val="20"/>
+                <w:shd w:fill="F2F2F2" w:val="clear"/>
+              </w:rPr>
+              <w:t xml:space="preserve">None</w:t>
             </w:r>
           </w:p>
         </w:tc>
@@ -7565,7 +7601,7 @@
                 <w:szCs w:val="20"/>
                 <w:shd w:fill="F2F2F2" w:val="clear"/>
               </w:rPr>
-              <w:t xml:space="preserve">OFULLSTANDIG_ANDEL</w:t>
+              <w:t xml:space="preserve">DOLDA_KOLUMNER</w:t>
             </w:r>
           </w:p>
         </w:tc>
@@ -7591,7 +7627,7 @@
               <w:spacing w:after="0"/>
             </w:pPr>
             <w:r>
-              <w:t xml:space="preserve">Är filmad längd kortare än så gånger kartlängden nådde kameran inte fram; profilen hängs då bara upp i startbrunnen.</w:t>
+              <w:t xml:space="preserve">Kolumner per flik som döljs som standard i Excel (grupperade, fälls ut med plustecknet ovanför rubrikraden). Rubrik utan enhet. Tom lista = visa allt.</w:t>
             </w:r>
           </w:p>
         </w:tc>
@@ -7617,7 +7653,7 @@
               <w:spacing w:after="0"/>
             </w:pPr>
             <w:r>
-              <w:t xml:space="preserve">0,85</w:t>
+              <w:t xml:space="preserve">se skriptet</w:t>
             </w:r>
           </w:p>
         </w:tc>
@@ -7650,7 +7686,7 @@
                 <w:szCs w:val="20"/>
                 <w:shd w:fill="F2F2F2" w:val="clear"/>
               </w:rPr>
-              <w:t xml:space="preserve">SVACKA_MAX_M</w:t>
+              <w:t xml:space="preserve">OFULLSTANDIG_ANDEL</w:t>
             </w:r>
           </w:p>
         </w:tc>
@@ -7675,7 +7711,7 @@
               <w:spacing w:after="0"/>
             </w:pPr>
             <w:r>
-              <w:t xml:space="preserve">Större beräknat svackdjup (m) än så är en inklinometerartefakt: svackan sätts till okänd och profilen markeras osäker.</w:t>
+              <w:t xml:space="preserve">Är filmad längd kortare än så gånger kartlängden nådde kameran inte fram; profilen hängs då bara upp i startbrunnen.</w:t>
             </w:r>
           </w:p>
         </w:tc>
@@ -7700,7 +7736,7 @@
               <w:spacing w:after="0"/>
             </w:pPr>
             <w:r>
-              <w:t xml:space="preserve">1,0</w:t>
+              <w:t xml:space="preserve">0,85</w:t>
             </w:r>
           </w:p>
         </w:tc>
@@ -7734,19 +7770,7 @@
                 <w:szCs w:val="20"/>
                 <w:shd w:fill="F2F2F2" w:val="clear"/>
               </w:rPr>
-              <w:t xml:space="preserve">BAKFALL_MIN_PROMILLE</w:t>
-            </w:r>
-            <w:r>
-              <w:t xml:space="preserve">, </w:t>
-            </w:r>
-            <w:r>
-              <w:rPr>
-                <w:rFonts w:ascii="Consolas" w:cs="Consolas" w:eastAsia="Consolas" w:hAnsi="Consolas"/>
-                <w:sz w:val="20"/>
-                <w:szCs w:val="20"/>
-                <w:shd w:fill="F2F2F2" w:val="clear"/>
-              </w:rPr>
-              <w:t xml:space="preserve">BAKFALL_SEGMENT_MIN_M</w:t>
+              <w:t xml:space="preserve">SVACKA_MAX_M</w:t>
             </w:r>
           </w:p>
         </w:tc>
@@ -7772,7 +7796,7 @@
               <w:spacing w:after="0"/>
             </w:pPr>
             <w:r>
-              <w:t xml:space="preserve">Lutning mot flödet (‰) som räknas som bakfall, och kortaste bakfallssegment (m) som redovisas i kartan.</w:t>
+              <w:t xml:space="preserve">Större beräknat svackdjup (m) än så är en inklinometerartefakt: svackan sätts till okänd och profilen markeras osäker.</w:t>
             </w:r>
           </w:p>
         </w:tc>
@@ -7798,7 +7822,7 @@
               <w:spacing w:after="0"/>
             </w:pPr>
             <w:r>
-              <w:t xml:space="preserve">5; 1</w:t>
+              <w:t xml:space="preserve">1,0</w:t>
             </w:r>
           </w:p>
         </w:tc>
@@ -7831,7 +7855,7 @@
                 <w:szCs w:val="20"/>
                 <w:shd w:fill="F2F2F2" w:val="clear"/>
               </w:rPr>
-              <w:t xml:space="preserve">GIS_SAKNAS_UNDER</w:t>
+              <w:t xml:space="preserve">BAKFALL_MIN_PROMILLE</w:t>
             </w:r>
             <w:r>
               <w:t xml:space="preserve">, </w:t>
@@ -7843,7 +7867,7 @@
                 <w:szCs w:val="20"/>
                 <w:shd w:fill="F2F2F2" w:val="clear"/>
               </w:rPr>
-              <w:t xml:space="preserve">GIS_FALL_ORIMLIGT_M</w:t>
+              <w:t xml:space="preserve">BAKFALL_SEGMENT_MIN_M</w:t>
             </w:r>
           </w:p>
         </w:tc>
@@ -7868,7 +7892,7 @@
               <w:spacing w:after="0"/>
             </w:pPr>
             <w:r>
-              <w:t xml:space="preserve">Vattengång/locknivå i GIS under det första räknas som saknad (SVOA skriver −9999); större fall mellan brunnarna i GIS än det andra (m) flaggas som orimligt i stället för att jämföras med filmen.</w:t>
+              <w:t xml:space="preserve">Lutning mot flödet (‰) som räknas som bakfall, och kortaste bakfallssegment (m) som redovisas i kartan.</w:t>
             </w:r>
           </w:p>
         </w:tc>
@@ -7893,7 +7917,7 @@
               <w:spacing w:after="0"/>
             </w:pPr>
             <w:r>
-              <w:t xml:space="preserve">−999, 50</w:t>
+              <w:t xml:space="preserve">5; 1</w:t>
             </w:r>
           </w:p>
         </w:tc>
@@ -7927,7 +7951,19 @@
                 <w:szCs w:val="20"/>
                 <w:shd w:fill="F2F2F2" w:val="clear"/>
               </w:rPr>
-              <w:t xml:space="preserve">GIS_PLATSHALLARE</w:t>
+              <w:t xml:space="preserve">GIS_SAKNAS_UNDER</w:t>
+            </w:r>
+            <w:r>
+              <w:t xml:space="preserve">, </w:t>
+            </w:r>
+            <w:r>
+              <w:rPr>
+                <w:rFonts w:ascii="Consolas" w:cs="Consolas" w:eastAsia="Consolas" w:hAnsi="Consolas"/>
+                <w:sz w:val="20"/>
+                <w:szCs w:val="20"/>
+                <w:shd w:fill="F2F2F2" w:val="clear"/>
+              </w:rPr>
+              <w:t xml:space="preserve">GIS_FALL_ORIMLIGT_M</w:t>
             </w:r>
           </w:p>
         </w:tc>
@@ -7953,7 +7989,7 @@
               <w:spacing w:after="0"/>
             </w:pPr>
             <w:r>
-              <w:t xml:space="preserve">Littera i TV3-filen som inte är riktiga brunnar och därför inte kontrolleras mot GIS.</w:t>
+              <w:t xml:space="preserve">Vattengång/locknivå i GIS under det första räknas som saknad (SVOA skriver −9999); större fall mellan brunnarna i GIS än det andra (m) flaggas som orimligt i stället för att jämföras med filmen.</w:t>
             </w:r>
           </w:p>
         </w:tc>
@@ -7979,7 +8015,7 @@
               <w:spacing w:after="0"/>
             </w:pPr>
             <w:r>
-              <w:t xml:space="preserve">AG, STBEXTRA</w:t>
+              <w:t xml:space="preserve">−999, 50</w:t>
             </w:r>
           </w:p>
         </w:tc>
@@ -8012,31 +8048,7 @@
                 <w:szCs w:val="20"/>
                 <w:shd w:fill="F2F2F2" w:val="clear"/>
               </w:rPr>
-              <w:t xml:space="preserve">GRENROR_LITTERA</w:t>
-            </w:r>
-            <w:r>
-              <w:t xml:space="preserve">, </w:t>
-            </w:r>
-            <w:r>
-              <w:rPr>
-                <w:rFonts w:ascii="Consolas" w:cs="Consolas" w:eastAsia="Consolas" w:hAnsi="Consolas"/>
-                <w:sz w:val="20"/>
-                <w:szCs w:val="20"/>
-                <w:shd w:fill="F2F2F2" w:val="clear"/>
-              </w:rPr>
-              <w:t xml:space="preserve">ANDE_LITTERA</w:t>
-            </w:r>
-            <w:r>
-              <w:t xml:space="preserve">, </w:t>
-            </w:r>
-            <w:r>
-              <w:rPr>
-                <w:rFonts w:ascii="Consolas" w:cs="Consolas" w:eastAsia="Consolas" w:hAnsi="Consolas"/>
-                <w:sz w:val="20"/>
-                <w:szCs w:val="20"/>
-                <w:shd w:fill="F2F2F2" w:val="clear"/>
-              </w:rPr>
-              <w:t xml:space="preserve">GIS_GRENROR_LANGD_TOL</w:t>
+              <w:t xml:space="preserve">GIS_PLATSHALLARE</w:t>
             </w:r>
           </w:p>
         </w:tc>
@@ -8061,7 +8073,7 @@
               <w:spacing w:after="0"/>
             </w:pPr>
             <w:r>
-              <w:t xml:space="preserve">Reguljära uttryck för littera som betyder anslutning till grenrör respektive ledningsände utan brunn, och hur mycket GIS-ledningen med fri ände får avvika från filmens längd (andel, + 3 m) för att kopplas.</w:t>
+              <w:t xml:space="preserve">Littera i TV3-filen som inte är riktiga brunnar och därför inte kontrolleras mot GIS.</w:t>
             </w:r>
           </w:p>
         </w:tc>
@@ -8086,28 +8098,7 @@
               <w:spacing w:after="0"/>
             </w:pPr>
             <w:r>
-              <w:rPr>
-                <w:rFonts w:ascii="Consolas" w:cs="Consolas" w:eastAsia="Consolas" w:hAnsi="Consolas"/>
-                <w:sz w:val="20"/>
-                <w:szCs w:val="20"/>
-                <w:shd w:fill="F2F2F2" w:val="clear"/>
-              </w:rPr>
-              <w:t xml:space="preserve">^[DSK]?A{1,2}G\d*$</w:t>
-            </w:r>
-            <w:r>
-              <w:t xml:space="preserve">, </w:t>
-            </w:r>
-            <w:r>
-              <w:rPr>
-                <w:rFonts w:ascii="Consolas" w:cs="Consolas" w:eastAsia="Consolas" w:hAnsi="Consolas"/>
-                <w:sz w:val="20"/>
-                <w:szCs w:val="20"/>
-                <w:shd w:fill="F2F2F2" w:val="clear"/>
-              </w:rPr>
-              <w:t xml:space="preserve">^[ÄA]NDE?\d*$</w:t>
-            </w:r>
-            <w:r>
-              <w:t xml:space="preserve">, 0,3</w:t>
+              <w:t xml:space="preserve">AG, STBEXTRA</w:t>
             </w:r>
           </w:p>
         </w:tc>
@@ -8141,7 +8132,31 @@
                 <w:szCs w:val="20"/>
                 <w:shd w:fill="F2F2F2" w:val="clear"/>
               </w:rPr>
-              <w:t xml:space="preserve">RELINAD_SOM_MATERIAL</w:t>
+              <w:t xml:space="preserve">GRENROR_LITTERA</w:t>
+            </w:r>
+            <w:r>
+              <w:t xml:space="preserve">, </w:t>
+            </w:r>
+            <w:r>
+              <w:rPr>
+                <w:rFonts w:ascii="Consolas" w:cs="Consolas" w:eastAsia="Consolas" w:hAnsi="Consolas"/>
+                <w:sz w:val="20"/>
+                <w:szCs w:val="20"/>
+                <w:shd w:fill="F2F2F2" w:val="clear"/>
+              </w:rPr>
+              <w:t xml:space="preserve">ANDE_LITTERA</w:t>
+            </w:r>
+            <w:r>
+              <w:t xml:space="preserve">, </w:t>
+            </w:r>
+            <w:r>
+              <w:rPr>
+                <w:rFonts w:ascii="Consolas" w:cs="Consolas" w:eastAsia="Consolas" w:hAnsi="Consolas"/>
+                <w:sz w:val="20"/>
+                <w:szCs w:val="20"/>
+                <w:shd w:fill="F2F2F2" w:val="clear"/>
+              </w:rPr>
+              <w:t xml:space="preserve">GIS_GRENROR_LANGD_TOL</w:t>
             </w:r>
           </w:p>
         </w:tc>
@@ -8167,7 +8182,7 @@
               <w:spacing w:after="0"/>
             </w:pPr>
             <w:r>
-              <w:t xml:space="preserve">Relinade sträckor redovisas som eget material i fliken Material och diagram 4.</w:t>
+              <w:t xml:space="preserve">Reguljära uttryck för littera som betyder anslutning till grenrör respektive ledningsände utan brunn, och hur mycket GIS-ledningen med fri ände får avvika från filmens längd (andel, + 3 m) för att kopplas.</w:t>
             </w:r>
           </w:p>
         </w:tc>
@@ -8199,7 +8214,22 @@
                 <w:szCs w:val="20"/>
                 <w:shd w:fill="F2F2F2" w:val="clear"/>
               </w:rPr>
-              <w:t xml:space="preserve">True</w:t>
+              <w:t xml:space="preserve">^[DSK]?A{1,2}G\d*$</w:t>
+            </w:r>
+            <w:r>
+              <w:t xml:space="preserve">, </w:t>
+            </w:r>
+            <w:r>
+              <w:rPr>
+                <w:rFonts w:ascii="Consolas" w:cs="Consolas" w:eastAsia="Consolas" w:hAnsi="Consolas"/>
+                <w:sz w:val="20"/>
+                <w:szCs w:val="20"/>
+                <w:shd w:fill="F2F2F2" w:val="clear"/>
+              </w:rPr>
+              <w:t xml:space="preserve">^[ÄA]NDE?\d*$</w:t>
+            </w:r>
+            <w:r>
+              <w:t xml:space="preserve">, 0,3</w:t>
             </w:r>
           </w:p>
         </w:tc>
@@ -8232,31 +8262,7 @@
                 <w:szCs w:val="20"/>
                 <w:shd w:fill="F2F2F2" w:val="clear"/>
               </w:rPr>
-              <w:t xml:space="preserve">BEHALL_RAPPORTER</w:t>
-            </w:r>
-            <w:r>
-              <w:t xml:space="preserve">, </w:t>
-            </w:r>
-            <w:r>
-              <w:rPr>
-                <w:rFonts w:ascii="Consolas" w:cs="Consolas" w:eastAsia="Consolas" w:hAnsi="Consolas"/>
-                <w:sz w:val="20"/>
-                <w:szCs w:val="20"/>
-                <w:shd w:fill="F2F2F2" w:val="clear"/>
-              </w:rPr>
-              <w:t xml:space="preserve">SPARA_DIAGRAM</w:t>
-            </w:r>
-            <w:r>
-              <w:t xml:space="preserve">, </w:t>
-            </w:r>
-            <w:r>
-              <w:rPr>
-                <w:rFonts w:ascii="Consolas" w:cs="Consolas" w:eastAsia="Consolas" w:hAnsi="Consolas"/>
-                <w:sz w:val="20"/>
-                <w:szCs w:val="20"/>
-                <w:shd w:fill="F2F2F2" w:val="clear"/>
-              </w:rPr>
-              <w:t xml:space="preserve">SKRIV_KARTUNDERLAG</w:t>
+              <w:t xml:space="preserve">RELINAD_SOM_MATERIAL</w:t>
             </w:r>
           </w:p>
         </w:tc>
@@ -8281,43 +8287,7 @@
               <w:spacing w:after="0"/>
             </w:pPr>
             <w:r>
-              <w:t xml:space="preserve">Standardvärden för </w:t>
-            </w:r>
-            <w:r>
-              <w:rPr>
-                <w:rFonts w:ascii="Consolas" w:cs="Consolas" w:eastAsia="Consolas" w:hAnsi="Consolas"/>
-                <w:sz w:val="20"/>
-                <w:szCs w:val="20"/>
-                <w:shd w:fill="F2F2F2" w:val="clear"/>
-              </w:rPr>
-              <w:t xml:space="preserve">--behall-rapporter</w:t>
-            </w:r>
-            <w:r>
-              <w:t xml:space="preserve">, </w:t>
-            </w:r>
-            <w:r>
-              <w:rPr>
-                <w:rFonts w:ascii="Consolas" w:cs="Consolas" w:eastAsia="Consolas" w:hAnsi="Consolas"/>
-                <w:sz w:val="20"/>
-                <w:szCs w:val="20"/>
-                <w:shd w:fill="F2F2F2" w:val="clear"/>
-              </w:rPr>
-              <w:t xml:space="preserve">--diagram</w:t>
-            </w:r>
-            <w:r>
-              <w:t xml:space="preserve"> och </w:t>
-            </w:r>
-            <w:r>
-              <w:rPr>
-                <w:rFonts w:ascii="Consolas" w:cs="Consolas" w:eastAsia="Consolas" w:hAnsi="Consolas"/>
-                <w:sz w:val="20"/>
-                <w:szCs w:val="20"/>
-                <w:shd w:fill="F2F2F2" w:val="clear"/>
-              </w:rPr>
-              <w:t xml:space="preserve">--karta</w:t>
-            </w:r>
-            <w:r>
-              <w:t xml:space="preserve">.</w:t>
+              <w:t xml:space="preserve">Relinade sträckor redovisas som eget material i fliken Material och diagram 4.</w:t>
             </w:r>
           </w:p>
         </w:tc>
@@ -8341,30 +8311,6 @@
             <w:pPr>
               <w:spacing w:after="0"/>
             </w:pPr>
-            <w:r>
-              <w:rPr>
-                <w:rFonts w:ascii="Consolas" w:cs="Consolas" w:eastAsia="Consolas" w:hAnsi="Consolas"/>
-                <w:sz w:val="20"/>
-                <w:szCs w:val="20"/>
-                <w:shd w:fill="F2F2F2" w:val="clear"/>
-              </w:rPr>
-              <w:t xml:space="preserve">False</w:t>
-            </w:r>
-            <w:r>
-              <w:t xml:space="preserve">, </w:t>
-            </w:r>
-            <w:r>
-              <w:rPr>
-                <w:rFonts w:ascii="Consolas" w:cs="Consolas" w:eastAsia="Consolas" w:hAnsi="Consolas"/>
-                <w:sz w:val="20"/>
-                <w:szCs w:val="20"/>
-                <w:shd w:fill="F2F2F2" w:val="clear"/>
-              </w:rPr>
-              <w:t xml:space="preserve">False</w:t>
-            </w:r>
-            <w:r>
-              <w:t xml:space="preserve">, </w:t>
-            </w:r>
             <w:r>
               <w:rPr>
                 <w:rFonts w:ascii="Consolas" w:cs="Consolas" w:eastAsia="Consolas" w:hAnsi="Consolas"/>
@@ -8406,7 +8352,31 @@
                 <w:szCs w:val="20"/>
                 <w:shd w:fill="F2F2F2" w:val="clear"/>
               </w:rPr>
-              <w:t xml:space="preserve">KODER</w:t>
+              <w:t xml:space="preserve">BEHALL_RAPPORTER</w:t>
+            </w:r>
+            <w:r>
+              <w:t xml:space="preserve">, </w:t>
+            </w:r>
+            <w:r>
+              <w:rPr>
+                <w:rFonts w:ascii="Consolas" w:cs="Consolas" w:eastAsia="Consolas" w:hAnsi="Consolas"/>
+                <w:sz w:val="20"/>
+                <w:szCs w:val="20"/>
+                <w:shd w:fill="F2F2F2" w:val="clear"/>
+              </w:rPr>
+              <w:t xml:space="preserve">SPARA_DIAGRAM</w:t>
+            </w:r>
+            <w:r>
+              <w:t xml:space="preserve">, </w:t>
+            </w:r>
+            <w:r>
+              <w:rPr>
+                <w:rFonts w:ascii="Consolas" w:cs="Consolas" w:eastAsia="Consolas" w:hAnsi="Consolas"/>
+                <w:sz w:val="20"/>
+                <w:szCs w:val="20"/>
+                <w:shd w:fill="F2F2F2" w:val="clear"/>
+              </w:rPr>
+              <w:t xml:space="preserve">SKRIV_KARTUNDERLAG</w:t>
             </w:r>
           </w:p>
         </w:tc>
@@ -8432,7 +8402,43 @@
               <w:spacing w:after="0"/>
             </w:pPr>
             <w:r>
-              <w:t xml:space="preserve">Skadekoder med klartext och typ (K = konstruktion, D = drift, I = information).</w:t>
+              <w:t xml:space="preserve">Standardvärden för </w:t>
+            </w:r>
+            <w:r>
+              <w:rPr>
+                <w:rFonts w:ascii="Consolas" w:cs="Consolas" w:eastAsia="Consolas" w:hAnsi="Consolas"/>
+                <w:sz w:val="20"/>
+                <w:szCs w:val="20"/>
+                <w:shd w:fill="F2F2F2" w:val="clear"/>
+              </w:rPr>
+              <w:t xml:space="preserve">--behall-rapporter</w:t>
+            </w:r>
+            <w:r>
+              <w:t xml:space="preserve">, </w:t>
+            </w:r>
+            <w:r>
+              <w:rPr>
+                <w:rFonts w:ascii="Consolas" w:cs="Consolas" w:eastAsia="Consolas" w:hAnsi="Consolas"/>
+                <w:sz w:val="20"/>
+                <w:szCs w:val="20"/>
+                <w:shd w:fill="F2F2F2" w:val="clear"/>
+              </w:rPr>
+              <w:t xml:space="preserve">--diagram</w:t>
+            </w:r>
+            <w:r>
+              <w:t xml:space="preserve"> och </w:t>
+            </w:r>
+            <w:r>
+              <w:rPr>
+                <w:rFonts w:ascii="Consolas" w:cs="Consolas" w:eastAsia="Consolas" w:hAnsi="Consolas"/>
+                <w:sz w:val="20"/>
+                <w:szCs w:val="20"/>
+                <w:shd w:fill="F2F2F2" w:val="clear"/>
+              </w:rPr>
+              <w:t xml:space="preserve">--karta</w:t>
+            </w:r>
+            <w:r>
+              <w:t xml:space="preserve">.</w:t>
             </w:r>
           </w:p>
         </w:tc>
@@ -8458,7 +8464,37 @@
               <w:spacing w:after="0"/>
             </w:pPr>
             <w:r>
-              <w:t xml:space="preserve">P93</w:t>
+              <w:rPr>
+                <w:rFonts w:ascii="Consolas" w:cs="Consolas" w:eastAsia="Consolas" w:hAnsi="Consolas"/>
+                <w:sz w:val="20"/>
+                <w:szCs w:val="20"/>
+                <w:shd w:fill="F2F2F2" w:val="clear"/>
+              </w:rPr>
+              <w:t xml:space="preserve">False</w:t>
+            </w:r>
+            <w:r>
+              <w:t xml:space="preserve">, </w:t>
+            </w:r>
+            <w:r>
+              <w:rPr>
+                <w:rFonts w:ascii="Consolas" w:cs="Consolas" w:eastAsia="Consolas" w:hAnsi="Consolas"/>
+                <w:sz w:val="20"/>
+                <w:szCs w:val="20"/>
+                <w:shd w:fill="F2F2F2" w:val="clear"/>
+              </w:rPr>
+              <w:t xml:space="preserve">False</w:t>
+            </w:r>
+            <w:r>
+              <w:t xml:space="preserve">, </w:t>
+            </w:r>
+            <w:r>
+              <w:rPr>
+                <w:rFonts w:ascii="Consolas" w:cs="Consolas" w:eastAsia="Consolas" w:hAnsi="Consolas"/>
+                <w:sz w:val="20"/>
+                <w:szCs w:val="20"/>
+                <w:shd w:fill="F2F2F2" w:val="clear"/>
+              </w:rPr>
+              <w:t xml:space="preserve">True</w:t>
             </w:r>
           </w:p>
         </w:tc>
@@ -8491,6 +8527,90 @@
                 <w:szCs w:val="20"/>
                 <w:shd w:fill="F2F2F2" w:val="clear"/>
               </w:rPr>
+              <w:t xml:space="preserve">KODER</w:t>
+            </w:r>
+          </w:p>
+        </w:tc>
+        <w:tc>
+          <w:tcPr>
+            <w:tcW w:type="dxa" w:w="5000"/>
+            <w:tcBorders>
+              <w:top w:val="single" w:color="BFBFBF" w:sz="4"/>
+              <w:left w:val="single" w:color="BFBFBF" w:sz="4"/>
+              <w:bottom w:val="single" w:color="BFBFBF" w:sz="4"/>
+              <w:right w:val="single" w:color="BFBFBF" w:sz="4"/>
+            </w:tcBorders>
+            <w:tcMar>
+              <w:top w:type="dxa" w:w="60"/>
+              <w:left w:type="dxa" w:w="100"/>
+              <w:bottom w:type="dxa" w:w="60"/>
+              <w:right w:type="dxa" w:w="100"/>
+            </w:tcMar>
+          </w:tcPr>
+          <w:p>
+            <w:pPr>
+              <w:spacing w:after="0"/>
+            </w:pPr>
+            <w:r>
+              <w:t xml:space="preserve">Skadekoder med klartext och typ (K = konstruktion, D = drift, I = information).</w:t>
+            </w:r>
+          </w:p>
+        </w:tc>
+        <w:tc>
+          <w:tcPr>
+            <w:tcW w:type="dxa" w:w="1760"/>
+            <w:tcBorders>
+              <w:top w:val="single" w:color="BFBFBF" w:sz="4"/>
+              <w:left w:val="single" w:color="BFBFBF" w:sz="4"/>
+              <w:bottom w:val="single" w:color="BFBFBF" w:sz="4"/>
+              <w:right w:val="single" w:color="BFBFBF" w:sz="4"/>
+            </w:tcBorders>
+            <w:tcMar>
+              <w:top w:type="dxa" w:w="60"/>
+              <w:left w:type="dxa" w:w="100"/>
+              <w:bottom w:type="dxa" w:w="60"/>
+              <w:right w:type="dxa" w:w="100"/>
+            </w:tcMar>
+          </w:tcPr>
+          <w:p>
+            <w:pPr>
+              <w:spacing w:after="0"/>
+            </w:pPr>
+            <w:r>
+              <w:t xml:space="preserve">P93</w:t>
+            </w:r>
+          </w:p>
+        </w:tc>
+      </w:tr>
+      <w:tr>
+        <w:tc>
+          <w:tcPr>
+            <w:tcW w:type="dxa" w:w="2600"/>
+            <w:tcBorders>
+              <w:top w:val="single" w:color="BFBFBF" w:sz="4"/>
+              <w:left w:val="single" w:color="BFBFBF" w:sz="4"/>
+              <w:bottom w:val="single" w:color="BFBFBF" w:sz="4"/>
+              <w:right w:val="single" w:color="BFBFBF" w:sz="4"/>
+            </w:tcBorders>
+            <w:shd w:fill="F7F9FC" w:val="clear"/>
+            <w:tcMar>
+              <w:top w:type="dxa" w:w="60"/>
+              <w:left w:type="dxa" w:w="100"/>
+              <w:bottom w:type="dxa" w:w="60"/>
+              <w:right w:type="dxa" w:w="100"/>
+            </w:tcMar>
+          </w:tcPr>
+          <w:p>
+            <w:pPr>
+              <w:spacing w:after="0"/>
+            </w:pPr>
+            <w:r>
+              <w:rPr>
+                <w:rFonts w:ascii="Consolas" w:cs="Consolas" w:eastAsia="Consolas" w:hAnsi="Consolas"/>
+                <w:sz w:val="20"/>
+                <w:szCs w:val="20"/>
+                <w:shd w:fill="F2F2F2" w:val="clear"/>
+              </w:rPr>
               <w:t xml:space="preserve">ATTRIBUT</w:t>
             </w:r>
             <w:r>
@@ -8516,6 +8636,7 @@
               <w:bottom w:val="single" w:color="BFBFBF" w:sz="4"/>
               <w:right w:val="single" w:color="BFBFBF" w:sz="4"/>
             </w:tcBorders>
+            <w:shd w:fill="F7F9FC" w:val="clear"/>
             <w:tcMar>
               <w:top w:type="dxa" w:w="60"/>
               <w:left w:type="dxa" w:w="100"/>
@@ -8541,6 +8662,7 @@
               <w:bottom w:val="single" w:color="BFBFBF" w:sz="4"/>
               <w:right w:val="single" w:color="BFBFBF" w:sz="4"/>
             </w:tcBorders>
+            <w:shd w:fill="F7F9FC" w:val="clear"/>
             <w:tcMar>
               <w:top w:type="dxa" w:w="60"/>
               <w:left w:type="dxa" w:w="100"/>
@@ -10894,7 +11016,7 @@
         <w:t xml:space="preserve">Ledningar som är brutna vid en brunn.</w:t>
       </w:r>
       <w:r>
-        <w:t xml:space="preserve"> Kartans ledningar slutar ofta vid brunnens kant i stället för i dess mittpunkt, så att ändarna på var sin sida om en stor brunn ligger mer än toleransen isär. Brunnar som inte ingår i inspektionen används därför som skarvar: ledningsändar inom toleransen från en sådan brunn hänger ihop via den, och brunnen räknas inte som hopp. Ligger två inspekterade brunnar på samma punkt i kartan (t.ex. en rensbrunn i en nedstigningsbrunn) får sträckan diagnosen *brunnarna ligger på samma plats i kartan*.</w:t>
+        <w:t xml:space="preserve"> Kartans ledningar slutar ofta vid brunnens kant i stället för i dess mittpunkt, så att ändarna på var sin sida om en stor brunn ligger mer än toleransen isär. Brunnar som inte ingår i inspektionen används därför som skarvar: ledningsändar inom toleransen från en sådan brunn hänger ihop via den, och brunnen räknas inte som hopp. Ligger sträckans brunnar orimligt långt isär – mer än 1 000 m, eller mer än tre gånger filmens längd + 50 m för en film som inte är avbruten – matchas sträckan inte, och diagnosen säger *brunnarna ligger X m isär i kartan – troligen fel littera*; rätta litterat i brunnslittera.csv. Ligger två inspekterade brunnar på samma punkt i kartan (t.ex. en rensbrunn i en nedstigningsbrunn) får sträckan diagnosen *brunnarna ligger på samma plats i kartan*.</w:t>
       </w:r>
     </w:p>
     <w:p>

</xml_diff>

<commit_message>
Brunnar långt isär: peka ut brunnen som ligger utanför filens område
När sträckans två brunnar ligger orimligt långt isär listades båda i
littera_forslag.csv, så samma sträcka kom två gånger med vänd riktning.
Nu jämförs varje brunn med de övriga brunnarna i samma TV3-fil: den som
ligger mer än 500 m från närmaste annan brunn i filen, medan den andra
ligger i området, pekas ut som felaktig och listas ensam - med förifyllt
förslag när längden ger en tydlig kandidat.

Co-Authored-By: Claude Opus 5.5 <noreply@anthropic.com>
Claude-Session: https://claude.ai/code/session_011fdqX3JEZje1LF9LqpaqR8
</commit_message>
<xml_diff>
--- a/Anvandarhandledning tv3_analys.docx
+++ b/Anvandarhandledning tv3_analys.docx
@@ -6599,6 +6599,18 @@
               </w:rPr>
               <w:t xml:space="preserve">GIS_BRUNN_AVSTAND_ANDEL</w:t>
             </w:r>
+            <w:r>
+              <w:t xml:space="preserve">, </w:t>
+            </w:r>
+            <w:r>
+              <w:rPr>
+                <w:rFonts w:ascii="Consolas" w:cs="Consolas" w:eastAsia="Consolas" w:hAnsi="Consolas"/>
+                <w:sz w:val="20"/>
+                <w:szCs w:val="20"/>
+                <w:shd w:fill="F2F2F2" w:val="clear"/>
+              </w:rPr>
+              <w:t xml:space="preserve">GIS_BRUNN_OMRADE_M</w:t>
+            </w:r>
           </w:p>
         </w:tc>
         <w:tc>
@@ -6623,7 +6635,31 @@
               <w:spacing w:after="0"/>
             </w:pPr>
             <w:r>
-              <w:t xml:space="preserve">Ligger sträckans två brunnar längre isär i GIS än så (eller längre än andelen × filmens längd + 50 m, utom för avbrutna filmer) och det finns ingen direkt ledning mellan dem, har en av dem troligen fel littera: GIS-flaggan säger *brunnarna ligger X m isär i GIS*, ingen kartlängd används och båda brunnarna hamnar i littera_forslag.csv. Samma gränser i Skapa ledningslager (</w:t>
+              <w:t xml:space="preserve">Ligger sträckans två brunnar längre isär i GIS än så (eller längre än andelen × filmens längd + 50 m, utom för avbrutna filmer) och det finns ingen direkt ledning mellan dem, har en av dem troligen fel littera: GIS-flaggan säger *brunnarna ligger X m isär i GIS*, ingen kartlängd används. Ligger den ena brunnen mer än </w:t>
+            </w:r>
+            <w:r>
+              <w:rPr>
+                <w:rFonts w:ascii="Consolas" w:cs="Consolas" w:eastAsia="Consolas" w:hAnsi="Consolas"/>
+                <w:sz w:val="20"/>
+                <w:szCs w:val="20"/>
+                <w:shd w:fill="F2F2F2" w:val="clear"/>
+              </w:rPr>
+              <w:t xml:space="preserve">GIS_BRUNN_OMRADE_M</w:t>
+            </w:r>
+            <w:r>
+              <w:t xml:space="preserve"> (500 m) från närmaste andra brunn i samma TV3-fil men den andra inom området, pekas den ut som den felaktiga: bara den hamnar i littera_forslag.csv, och finns en granne till den andra brunnen med filmens längd fylls </w:t>
+            </w:r>
+            <w:r>
+              <w:rPr>
+                <w:rFonts w:ascii="Consolas" w:cs="Consolas" w:eastAsia="Consolas" w:hAnsi="Consolas"/>
+                <w:sz w:val="20"/>
+                <w:szCs w:val="20"/>
+                <w:shd w:fill="F2F2F2" w:val="clear"/>
+              </w:rPr>
+              <w:t xml:space="preserve">ratt</w:t>
+            </w:r>
+            <w:r>
+              <w:t xml:space="preserve"> i. Går det inte att avgöra hamnar båda brunnarna i filen. Samma gränser i Skapa ledningslager (</w:t>
             </w:r>
             <w:r>
               <w:rPr>
@@ -6673,7 +6709,7 @@
               <w:spacing w:after="0"/>
             </w:pPr>
             <w:r>
-              <w:t xml:space="preserve">1000, 3,0</w:t>
+              <w:t xml:space="preserve">1000, 3,0, 500</w:t>
             </w:r>
           </w:p>
         </w:tc>
@@ -15348,6 +15384,21 @@
   <w:style w:type="paragraph" w:styleId="Normal" w:default="1">
     <w:name w:val="Normal"/>
     <w:qFormat/>
+  </w:style>
+  <w:style w:type="table" w:styleId="TableNormal" w:default="true">
+    <w:name w:val="Normal Table"/>
+    <w:uiPriority w:val="99"/>
+    <w:semiHidden/>
+    <w:unhideWhenUsed/>
+    <w:tblPr>
+      <w:tblInd w:type="dxa" w:w="0"/>
+      <w:tblCellMar>
+        <w:top w:type="dxa" w:w="0"/>
+        <w:left w:type="dxa" w:w="108"/>
+        <w:bottom w:type="dxa" w:w="0"/>
+        <w:right w:type="dxa" w:w="108"/>
+      </w:tblCellMar>
+    </w:tblPr>
   </w:style>
   <w:style w:type="paragraph" w:styleId="Heading3">
     <w:name w:val="Heading 3"/>

</xml_diff>

<commit_message>
Läs WinCan-export (Project.xml + .inc) utan TV3-fil
- las_wincan: S_T/SI_T/SO_T i Project.xml blir sträckor och observationer
  som ur en TV3-fil (las_tv3 skickar vidare automatiskt)
- .inc-filernas inklinometer (lutning i %) integreras till höjdprofil;
  KONFIG INC_LUTNING_ENHET och INC_POSITIV_UPPAT
- WinCans kombinerade inspektion hoppas över när delfilmerna finns –
  analysen slår ihop dem själv
- mappar hittar Project.xml, men inte när en TV3-fil ligger bredvid
- gemensam _avsluta_inlasning för TV3 och WinCan
- etappernas sträckordning i kartunderlaget är nu deterministisk
- testdata/WinCan 13-62-245, handledning 3.5, CLAUDE.md

Co-Authored-By: Claude Opus 5.5 <noreply@anthropic.com>
Claude-Session: https://claude.ai/code/session_011fdqX3JEZje1LF9LqpaqR8
</commit_message>
<xml_diff>
--- a/Anvandarhandledning tv3_analys.docx
+++ b/Anvandarhandledning tv3_analys.docx
@@ -1049,6 +1049,21 @@
           <w:szCs w:val="19"/>
         </w:rPr>
         <w:t xml:space="preserve">python tv3_analys.py filer.txt                    # listfil utan -l</w:t>
+      </w:r>
+    </w:p>
+    <w:p>
+      <w:pPr>
+        <w:shd w:fill="F2F2F2" w:val="clear"/>
+        <w:spacing w:after="0"/>
+        <w:ind w:left="280"/>
+      </w:pPr>
+      <w:r>
+        <w:rPr>
+          <w:rFonts w:ascii="Consolas" w:cs="Consolas" w:eastAsia="Consolas" w:hAnsi="Consolas"/>
+          <w:sz w:val="19"/>
+          <w:szCs w:val="19"/>
+        </w:rPr>
+        <w:t xml:space="preserve">python tv3_analys.py "D:\Uppdrag\13-62-245\Project.xml"   # WinCan-export (3.5)</w:t>
       </w:r>
     </w:p>
     <w:p>
@@ -3396,6 +3411,439 @@
     </w:p>
     <w:p>
       <w:pPr>
+        <w:pStyle w:val="Heading2"/>
+      </w:pPr>
+      <w:r>
+        <w:t xml:space="preserve">3.5 WinCan-export utan TV3-fil (Project.xml och .inc)</w:t>
+      </w:r>
+    </w:p>
+    <w:p>
+      <w:pPr>
+        <w:spacing w:after="120"/>
+      </w:pPr>
+      <w:r>
+        <w:t xml:space="preserve">Ibland levereras ett uppdrag utan TV3-fil, bara med WinCans projektexport: </w:t>
+      </w:r>
+      <w:r>
+        <w:rPr>
+          <w:rFonts w:ascii="Consolas" w:cs="Consolas" w:eastAsia="Consolas" w:hAnsi="Consolas"/>
+          <w:sz w:val="20"/>
+          <w:szCs w:val="20"/>
+          <w:shd w:fill="F2F2F2" w:val="clear"/>
+        </w:rPr>
+        <w:t xml:space="preserve">Project.xml</w:t>
+      </w:r>
+      <w:r>
+        <w:t xml:space="preserve">, </w:t>
+      </w:r>
+      <w:r>
+        <w:rPr>
+          <w:rFonts w:ascii="Consolas" w:cs="Consolas" w:eastAsia="Consolas" w:hAnsi="Consolas"/>
+          <w:sz w:val="20"/>
+          <w:szCs w:val="20"/>
+          <w:shd w:fill="F2F2F2" w:val="clear"/>
+        </w:rPr>
+        <w:t xml:space="preserve">DataBaseSchema.xsd</w:t>
+      </w:r>
+      <w:r>
+        <w:t xml:space="preserve">, en databas (</w:t>
+      </w:r>
+      <w:r>
+        <w:rPr>
+          <w:rFonts w:ascii="Consolas" w:cs="Consolas" w:eastAsia="Consolas" w:hAnsi="Consolas"/>
+          <w:sz w:val="20"/>
+          <w:szCs w:val="20"/>
+          <w:shd w:fill="F2F2F2" w:val="clear"/>
+        </w:rPr>
+        <w:t xml:space="preserve">…_Viewer.mdb</w:t>
+      </w:r>
+      <w:r>
+        <w:t xml:space="preserve">) och en </w:t>
+      </w:r>
+      <w:r>
+        <w:rPr>
+          <w:rFonts w:ascii="Consolas" w:cs="Consolas" w:eastAsia="Consolas" w:hAnsi="Consolas"/>
+          <w:sz w:val="20"/>
+          <w:szCs w:val="20"/>
+          <w:shd w:fill="F2F2F2" w:val="clear"/>
+        </w:rPr>
+        <w:t xml:space="preserve">.inc</w:t>
+      </w:r>
+      <w:r>
+        <w:t xml:space="preserve">-fil per inspektion. Project.xml innehåller hela projektdatabasen och samma uppgifter som en TV3-fil, och analysen läser den direkt – ange </w:t>
+      </w:r>
+      <w:r>
+        <w:rPr>
+          <w:rFonts w:ascii="Consolas" w:cs="Consolas" w:eastAsia="Consolas" w:hAnsi="Consolas"/>
+          <w:sz w:val="20"/>
+          <w:szCs w:val="20"/>
+          <w:shd w:fill="F2F2F2" w:val="clear"/>
+        </w:rPr>
+        <w:t xml:space="preserve">Project.xml</w:t>
+      </w:r>
+      <w:r>
+        <w:t xml:space="preserve"> (eller mappen den ligger i) i listfilen eller på kommandoraden precis som en TV3-fil. Databasen och .xsd-filen behövs inte.</w:t>
+      </w:r>
+    </w:p>
+    <w:tbl>
+      <w:tblPr>
+        <w:tblW w:type="dxa" w:w="9360"/>
+        <w:tblBorders>
+          <w:top w:val="single" w:color="auto" w:sz="4"/>
+          <w:left w:val="single" w:color="auto" w:sz="4"/>
+          <w:bottom w:val="single" w:color="auto" w:sz="4"/>
+          <w:right w:val="single" w:color="auto" w:sz="4"/>
+          <w:insideH w:val="single" w:color="auto" w:sz="4"/>
+          <w:insideV w:val="single" w:color="auto" w:sz="4"/>
+        </w:tblBorders>
+      </w:tblPr>
+      <w:tblGrid>
+        <w:gridCol w:w="2600"/>
+        <w:gridCol w:w="6760"/>
+      </w:tblGrid>
+      <w:tr>
+        <w:trPr>
+          <w:tblHeader/>
+        </w:trPr>
+        <w:tc>
+          <w:tcPr>
+            <w:tcW w:type="dxa" w:w="2600"/>
+            <w:tcBorders>
+              <w:top w:val="single" w:color="BFBFBF" w:sz="4"/>
+              <w:left w:val="single" w:color="BFBFBF" w:sz="4"/>
+              <w:bottom w:val="single" w:color="BFBFBF" w:sz="4"/>
+              <w:right w:val="single" w:color="BFBFBF" w:sz="4"/>
+            </w:tcBorders>
+            <w:shd w:fill="1F3864" w:val="clear"/>
+            <w:tcMar>
+              <w:top w:type="dxa" w:w="60"/>
+              <w:left w:type="dxa" w:w="100"/>
+              <w:bottom w:type="dxa" w:w="60"/>
+              <w:right w:type="dxa" w:w="100"/>
+            </w:tcMar>
+          </w:tcPr>
+          <w:p>
+            <w:pPr>
+              <w:spacing w:after="0"/>
+            </w:pPr>
+            <w:r>
+              <w:rPr>
+                <w:b/>
+                <w:bCs/>
+                <w:color w:val="FFFFFF"/>
+                <w:sz w:val="20"/>
+                <w:szCs w:val="20"/>
+              </w:rPr>
+              <w:t xml:space="preserve">I TV3-filen</w:t>
+            </w:r>
+          </w:p>
+        </w:tc>
+        <w:tc>
+          <w:tcPr>
+            <w:tcW w:type="dxa" w:w="6760"/>
+            <w:tcBorders>
+              <w:top w:val="single" w:color="BFBFBF" w:sz="4"/>
+              <w:left w:val="single" w:color="BFBFBF" w:sz="4"/>
+              <w:bottom w:val="single" w:color="BFBFBF" w:sz="4"/>
+              <w:right w:val="single" w:color="BFBFBF" w:sz="4"/>
+            </w:tcBorders>
+            <w:shd w:fill="1F3864" w:val="clear"/>
+            <w:tcMar>
+              <w:top w:type="dxa" w:w="60"/>
+              <w:left w:type="dxa" w:w="100"/>
+              <w:bottom w:type="dxa" w:w="60"/>
+              <w:right w:type="dxa" w:w="100"/>
+            </w:tcMar>
+          </w:tcPr>
+          <w:p>
+            <w:pPr>
+              <w:spacing w:after="0"/>
+            </w:pPr>
+            <w:r>
+              <w:rPr>
+                <w:b/>
+                <w:bCs/>
+                <w:color w:val="FFFFFF"/>
+                <w:sz w:val="20"/>
+                <w:szCs w:val="20"/>
+              </w:rPr>
+              <w:t xml:space="preserve">I Project.xml</w:t>
+            </w:r>
+          </w:p>
+        </w:tc>
+      </w:tr>
+      <w:tr>
+        <w:tc>
+          <w:tcPr>
+            <w:tcW w:type="dxa" w:w="2600"/>
+            <w:tcBorders>
+              <w:top w:val="single" w:color="BFBFBF" w:sz="4"/>
+              <w:left w:val="single" w:color="BFBFBF" w:sz="4"/>
+              <w:bottom w:val="single" w:color="BFBFBF" w:sz="4"/>
+              <w:right w:val="single" w:color="BFBFBF" w:sz="4"/>
+            </w:tcBorders>
+            <w:tcMar>
+              <w:top w:type="dxa" w:w="60"/>
+              <w:left w:type="dxa" w:w="100"/>
+              <w:bottom w:type="dxa" w:w="60"/>
+              <w:right w:type="dxa" w:w="100"/>
+            </w:tcMar>
+          </w:tcPr>
+          <w:p>
+            <w:pPr>
+              <w:spacing w:after="0"/>
+            </w:pPr>
+            <w:r>
+              <w:t xml:space="preserve">TVADM (sträcka)</w:t>
+            </w:r>
+          </w:p>
+        </w:tc>
+        <w:tc>
+          <w:tcPr>
+            <w:tcW w:type="dxa" w:w="6760"/>
+            <w:tcBorders>
+              <w:top w:val="single" w:color="BFBFBF" w:sz="4"/>
+              <w:left w:val="single" w:color="BFBFBF" w:sz="4"/>
+              <w:bottom w:val="single" w:color="BFBFBF" w:sz="4"/>
+              <w:right w:val="single" w:color="BFBFBF" w:sz="4"/>
+            </w:tcBorders>
+            <w:tcMar>
+              <w:top w:type="dxa" w:w="60"/>
+              <w:left w:type="dxa" w:w="100"/>
+              <w:bottom w:type="dxa" w:w="60"/>
+              <w:right w:type="dxa" w:w="100"/>
+            </w:tcMar>
+          </w:tcPr>
+          <w:p>
+            <w:pPr>
+              <w:spacing w:after="0"/>
+            </w:pPr>
+            <w:r>
+              <w:t xml:space="preserve">Tabellerna S_T (start-/slutbrunn, dimension, form, material, ledningstyp, område) och SI_T (riktning, datum, klockslag, operatör, väder, inklinometerfil)</w:t>
+            </w:r>
+          </w:p>
+        </w:tc>
+      </w:tr>
+      <w:tr>
+        <w:tc>
+          <w:tcPr>
+            <w:tcW w:type="dxa" w:w="2600"/>
+            <w:tcBorders>
+              <w:top w:val="single" w:color="BFBFBF" w:sz="4"/>
+              <w:left w:val="single" w:color="BFBFBF" w:sz="4"/>
+              <w:bottom w:val="single" w:color="BFBFBF" w:sz="4"/>
+              <w:right w:val="single" w:color="BFBFBF" w:sz="4"/>
+            </w:tcBorders>
+            <w:shd w:fill="F7F9FC" w:val="clear"/>
+            <w:tcMar>
+              <w:top w:type="dxa" w:w="60"/>
+              <w:left w:type="dxa" w:w="100"/>
+              <w:bottom w:type="dxa" w:w="60"/>
+              <w:right w:type="dxa" w:w="100"/>
+            </w:tcMar>
+          </w:tcPr>
+          <w:p>
+            <w:pPr>
+              <w:spacing w:after="0"/>
+            </w:pPr>
+            <w:r>
+              <w:t xml:space="preserve">TVDAT (observationer)</w:t>
+            </w:r>
+          </w:p>
+        </w:tc>
+        <w:tc>
+          <w:tcPr>
+            <w:tcW w:type="dxa" w:w="6760"/>
+            <w:tcBorders>
+              <w:top w:val="single" w:color="BFBFBF" w:sz="4"/>
+              <w:left w:val="single" w:color="BFBFBF" w:sz="4"/>
+              <w:bottom w:val="single" w:color="BFBFBF" w:sz="4"/>
+              <w:right w:val="single" w:color="BFBFBF" w:sz="4"/>
+            </w:tcBorders>
+            <w:shd w:fill="F7F9FC" w:val="clear"/>
+            <w:tcMar>
+              <w:top w:type="dxa" w:w="60"/>
+              <w:left w:type="dxa" w:w="100"/>
+              <w:bottom w:type="dxa" w:w="60"/>
+              <w:right w:type="dxa" w:w="100"/>
+            </w:tcMar>
+          </w:tcPr>
+          <w:p>
+            <w:pPr>
+              <w:spacing w:after="0"/>
+            </w:pPr>
+            <w:r>
+              <w:t xml:space="preserve">Tabellen SO_T: position, tid i filmen, kod, grad (SO_Level), attribut, klockslag, vattennivå, foto A/B, videofil och anmärkning. Löpande skador B1…S1 blir A1…B1; anslutningens dimension (t.ex. 150 mm) och dimensionsförändringens nya dimension hamnar i kommentaren.</w:t>
+            </w:r>
+          </w:p>
+        </w:tc>
+      </w:tr>
+      <w:tr>
+        <w:tc>
+          <w:tcPr>
+            <w:tcW w:type="dxa" w:w="2600"/>
+            <w:tcBorders>
+              <w:top w:val="single" w:color="BFBFBF" w:sz="4"/>
+              <w:left w:val="single" w:color="BFBFBF" w:sz="4"/>
+              <w:bottom w:val="single" w:color="BFBFBF" w:sz="4"/>
+              <w:right w:val="single" w:color="BFBFBF" w:sz="4"/>
+            </w:tcBorders>
+            <w:tcMar>
+              <w:top w:type="dxa" w:w="60"/>
+              <w:left w:type="dxa" w:w="100"/>
+              <w:bottom w:type="dxa" w:w="60"/>
+              <w:right w:type="dxa" w:w="100"/>
+            </w:tcMar>
+          </w:tcPr>
+          <w:p>
+            <w:pPr>
+              <w:spacing w:after="0"/>
+            </w:pPr>
+            <w:r>
+              <w:t xml:space="preserve">PROFILDAT (inklinometer)</w:t>
+            </w:r>
+          </w:p>
+        </w:tc>
+        <w:tc>
+          <w:tcPr>
+            <w:tcW w:type="dxa" w:w="6760"/>
+            <w:tcBorders>
+              <w:top w:val="single" w:color="BFBFBF" w:sz="4"/>
+              <w:left w:val="single" w:color="BFBFBF" w:sz="4"/>
+              <w:bottom w:val="single" w:color="BFBFBF" w:sz="4"/>
+              <w:right w:val="single" w:color="BFBFBF" w:sz="4"/>
+            </w:tcBorders>
+            <w:tcMar>
+              <w:top w:type="dxa" w:w="60"/>
+              <w:left w:type="dxa" w:w="100"/>
+              <w:bottom w:type="dxa" w:w="60"/>
+              <w:right w:type="dxa" w:w="100"/>
+            </w:tcMar>
+          </w:tcPr>
+          <w:p>
+            <w:pPr>
+              <w:spacing w:after="0"/>
+            </w:pPr>
+            <w:r>
+              <w:rPr>
+                <w:rFonts w:ascii="Consolas" w:cs="Consolas" w:eastAsia="Consolas" w:hAnsi="Consolas"/>
+                <w:sz w:val="20"/>
+                <w:szCs w:val="20"/>
+                <w:shd w:fill="F2F2F2" w:val="clear"/>
+              </w:rPr>
+              <w:t xml:space="preserve">.inc</w:t>
+            </w:r>
+            <w:r>
+              <w:t xml:space="preserve">-filen som SI_InclinationFileName pekar på – söks i Project.xml:s mapp med undermappar. Den innehåller lutningen i procent längs kamerans väg, som räknas om till en höjdprofil.</w:t>
+            </w:r>
+          </w:p>
+        </w:tc>
+      </w:tr>
+    </w:tbl>
+    <w:p>
+      <w:pPr>
+        <w:pStyle w:val="ListParagraph"/>
+        <w:numPr>
+          <w:ilvl w:val="0"/>
+          <w:numId w:val="3"/>
+        </w:numPr>
+        <w:spacing w:after="80"/>
+      </w:pPr>
+      <w:r>
+        <w:t xml:space="preserve">Filen heter i resultatet som projektet i WinCan plus </w:t>
+      </w:r>
+      <w:r>
+        <w:rPr>
+          <w:rFonts w:ascii="Consolas" w:cs="Consolas" w:eastAsia="Consolas" w:hAnsi="Consolas"/>
+          <w:sz w:val="20"/>
+          <w:szCs w:val="20"/>
+          <w:shd w:fill="F2F2F2" w:val="clear"/>
+        </w:rPr>
+        <w:t xml:space="preserve">.xml</w:t>
+      </w:r>
+      <w:r>
+        <w:t xml:space="preserve">, t.ex. *13-62-245 Asbjörnens väg 2013_04_12.xml*, och sträcknumret är WinCans sträcknummer. Använd det namnet i kolumnen </w:t>
+      </w:r>
+      <w:r>
+        <w:rPr>
+          <w:rFonts w:ascii="Consolas" w:cs="Consolas" w:eastAsia="Consolas" w:hAnsi="Consolas"/>
+          <w:sz w:val="20"/>
+          <w:szCs w:val="20"/>
+          <w:shd w:fill="F2F2F2" w:val="clear"/>
+        </w:rPr>
+        <w:t xml:space="preserve">fil</w:t>
+      </w:r>
+      <w:r>
+        <w:t xml:space="preserve"> i brunnslittera.csv.</w:t>
+      </w:r>
+    </w:p>
+    <w:p>
+      <w:pPr>
+        <w:pStyle w:val="ListParagraph"/>
+        <w:numPr>
+          <w:ilvl w:val="0"/>
+          <w:numId w:val="3"/>
+        </w:numPr>
+        <w:spacing w:after="80"/>
+      </w:pPr>
+      <w:r>
+        <w:t xml:space="preserve">Kamerans startbrunn tas ur raden *Inspektionen börjar*, annars ur riktningen. Startbrunnen ska vara uppströms som i TV3-filen.</w:t>
+      </w:r>
+    </w:p>
+    <w:p>
+      <w:pPr>
+        <w:pStyle w:val="ListParagraph"/>
+        <w:numPr>
+          <w:ilvl w:val="0"/>
+          <w:numId w:val="3"/>
+        </w:numPr>
+        <w:spacing w:after="80"/>
+      </w:pPr>
+      <w:r>
+        <w:t xml:space="preserve">Har WinCan själv slagit ihop två avbrutna filmer av samma sträcka till en *kombinerad* inspektion hoppas den över, och analysen slår ihop delfilmerna själv (se avsnitt 8) – WinCans kombinerade inspektion har felaktiga klockslag på den speglade delen.</w:t>
+      </w:r>
+    </w:p>
+    <w:p>
+      <w:pPr>
+        <w:pStyle w:val="ListParagraph"/>
+        <w:numPr>
+          <w:ilvl w:val="0"/>
+          <w:numId w:val="3"/>
+        </w:numPr>
+        <w:spacing w:after="80"/>
+      </w:pPr>
+      <w:r>
+        <w:t xml:space="preserve">Inklinometerprofilen får ett eget nollplan (0 vid kamerans startbrunn) eftersom .inc-filerna oftast saknar brunnshöjder. Lutning och svackor beräknas som vanligt, och med GIS-data eller markprofil (7.5, 7.11) hängs profilen upp på vattengången i brunnarna. Saknas en .inc-fil skriver konsolen vilka, och sträckan får ingen profil.</w:t>
+      </w:r>
+    </w:p>
+    <w:p>
+      <w:pPr>
+        <w:pStyle w:val="ListParagraph"/>
+        <w:numPr>
+          <w:ilvl w:val="0"/>
+          <w:numId w:val="3"/>
+        </w:numPr>
+        <w:spacing w:after="80"/>
+      </w:pPr>
+      <w:r>
+        <w:t xml:space="preserve">Ligger både en TV3-fil och Project.xml i samma mapp används TV3-filen (de innehåller samma inspektioner).</w:t>
+      </w:r>
+    </w:p>
+    <w:p>
+      <w:pPr>
+        <w:pStyle w:val="ListParagraph"/>
+        <w:numPr>
+          <w:ilvl w:val="0"/>
+          <w:numId w:val="3"/>
+        </w:numPr>
+        <w:spacing w:after="80"/>
+      </w:pPr>
+      <w:r>
+        <w:t xml:space="preserve">Koderna tolkas som P93. Är inspektionsnormen en annan eller finns okända koder säger konsolen det; de räknas inte som skador.</w:t>
+      </w:r>
+    </w:p>
+    <w:p>
+      <w:pPr>
         <w:pStyle w:val="Heading1"/>
       </w:pPr>
       <w:r>
@@ -6826,7 +7274,7 @@
                 <w:szCs w:val="20"/>
                 <w:shd w:fill="F2F2F2" w:val="clear"/>
               </w:rPr>
-              <w:t xml:space="preserve">HOJD_SAKNAS_UNDER</w:t>
+              <w:t xml:space="preserve">INC_LUTNING_ENHET</w:t>
             </w:r>
             <w:r>
               <w:t xml:space="preserve">, </w:t>
@@ -6838,7 +7286,7 @@
                 <w:szCs w:val="20"/>
                 <w:shd w:fill="F2F2F2" w:val="clear"/>
               </w:rPr>
-              <w:t xml:space="preserve">HOJD_ORIMLIG_M</w:t>
+              <w:t xml:space="preserve">INC_POSITIV_UPPAT</w:t>
             </w:r>
           </w:p>
         </w:tc>
@@ -6864,7 +7312,7 @@
               <w:spacing w:after="0"/>
             </w:pPr>
             <w:r>
-              <w:t xml:space="preserve">Rimlighet hos höjderna i TV3-filen: värden under det första (SVOA skriver −9999 för saknad) räknas som saknade; skiljer brunnshöjderna i PROFILADM mer än det andra, eller spänner inklinometerprofilen över mer än så, är höjderna fel i filen och används inte (Höjdflagga *Höjdfel i filen*, lutning *okänd*, profilen ritas inte).</w:t>
+              <w:t xml:space="preserve">Inklinometern i WinCans .inc-filer (3.5): enhet för värdena (0,01 = procent) och tecken (True = positivt värde när ledningen stiger i kamerans riktning). Stämmer inte lutningen med GIS för medströms och motströms filmade sträckor – byt tecken.</w:t>
             </w:r>
           </w:p>
         </w:tc>
@@ -6890,7 +7338,7 @@
               <w:spacing w:after="0"/>
             </w:pPr>
             <w:r>
-              <w:t xml:space="preserve">−999, 50</w:t>
+              <w:t xml:space="preserve">0,01, True</w:t>
             </w:r>
           </w:p>
         </w:tc>
@@ -6923,7 +7371,19 @@
                 <w:szCs w:val="20"/>
                 <w:shd w:fill="F2F2F2" w:val="clear"/>
               </w:rPr>
-              <w:t xml:space="preserve">DELFILMER_SEPARAT</w:t>
+              <w:t xml:space="preserve">HOJD_SAKNAS_UNDER</w:t>
+            </w:r>
+            <w:r>
+              <w:t xml:space="preserve">, </w:t>
+            </w:r>
+            <w:r>
+              <w:rPr>
+                <w:rFonts w:ascii="Consolas" w:cs="Consolas" w:eastAsia="Consolas" w:hAnsi="Consolas"/>
+                <w:sz w:val="20"/>
+                <w:szCs w:val="20"/>
+                <w:shd w:fill="F2F2F2" w:val="clear"/>
+              </w:rPr>
+              <w:t xml:space="preserve">HOJD_ORIMLIG_M</w:t>
             </w:r>
           </w:p>
         </w:tc>
@@ -6948,16 +7408,7 @@
               <w:spacing w:after="0"/>
             </w:pPr>
             <w:r>
-              <w:rPr>
-                <w:rFonts w:ascii="Consolas" w:cs="Consolas" w:eastAsia="Consolas" w:hAnsi="Consolas"/>
-                <w:sz w:val="20"/>
-                <w:szCs w:val="20"/>
-                <w:shd w:fill="F2F2F2" w:val="clear"/>
-              </w:rPr>
-              <w:t xml:space="preserve">True</w:t>
-            </w:r>
-            <w:r>
-              <w:t xml:space="preserve"> listar delfilmerna i en sammanslagning även var för sig i Prioritering och Observationer och ger dem egna protokoll.</w:t>
+              <w:t xml:space="preserve">Rimlighet hos höjderna i TV3-filen: värden under det första (SVOA skriver −9999 för saknad) räknas som saknade; skiljer brunnshöjderna i PROFILADM mer än det andra, eller spänner inklinometerprofilen över mer än så, är höjderna fel i filen och används inte (Höjdflagga *Höjdfel i filen*, lutning *okänd*, profilen ritas inte).</w:t>
             </w:r>
           </w:p>
         </w:tc>
@@ -6982,13 +7433,7 @@
               <w:spacing w:after="0"/>
             </w:pPr>
             <w:r>
-              <w:rPr>
-                <w:rFonts w:ascii="Consolas" w:cs="Consolas" w:eastAsia="Consolas" w:hAnsi="Consolas"/>
-                <w:sz w:val="20"/>
-                <w:szCs w:val="20"/>
-                <w:shd w:fill="F2F2F2" w:val="clear"/>
-              </w:rPr>
-              <w:t xml:space="preserve">False</w:t>
+              <w:t xml:space="preserve">−999, 50</w:t>
             </w:r>
           </w:p>
         </w:tc>
@@ -7022,19 +7467,7 @@
                 <w:szCs w:val="20"/>
                 <w:shd w:fill="F2F2F2" w:val="clear"/>
               </w:rPr>
-              <w:t xml:space="preserve">OMFILMNING_OVER_FILER</w:t>
-            </w:r>
-            <w:r>
-              <w:t xml:space="preserve">, </w:t>
-            </w:r>
-            <w:r>
-              <w:rPr>
-                <w:rFonts w:ascii="Consolas" w:cs="Consolas" w:eastAsia="Consolas" w:hAnsi="Consolas"/>
-                <w:sz w:val="20"/>
-                <w:szCs w:val="20"/>
-                <w:shd w:fill="F2F2F2" w:val="clear"/>
-              </w:rPr>
-              <w:t xml:space="preserve">TIDIGARE_INDEX_ANDEL</w:t>
+              <w:t xml:space="preserve">DELFILMER_SEPARAT</w:t>
             </w:r>
           </w:p>
         </w:tc>
@@ -7060,7 +7493,16 @@
               <w:spacing w:after="0"/>
             </w:pPr>
             <w:r>
-              <w:t xml:space="preserve">Samma brunnspar i olika TV3-filer (olika inspektionsomgångar): den nyaste filmen gäller, äldre markeras *ersatt av ny inspektion* och den gällande får kolumnen Tidigare inspektion (klass och konstruktionsindex då → nu). Inom samma klass räknas sträckan som förvärrad/förbättrad när indexet ändrats mer än andelen (och minst 5 p/100 m).</w:t>
+              <w:rPr>
+                <w:rFonts w:ascii="Consolas" w:cs="Consolas" w:eastAsia="Consolas" w:hAnsi="Consolas"/>
+                <w:sz w:val="20"/>
+                <w:szCs w:val="20"/>
+                <w:shd w:fill="F2F2F2" w:val="clear"/>
+              </w:rPr>
+              <w:t xml:space="preserve">True</w:t>
+            </w:r>
+            <w:r>
+              <w:t xml:space="preserve"> listar delfilmerna i en sammanslagning även var för sig i Prioritering och Observationer och ger dem egna protokoll.</w:t>
             </w:r>
           </w:p>
         </w:tc>
@@ -7092,10 +7534,7 @@
                 <w:szCs w:val="20"/>
                 <w:shd w:fill="F2F2F2" w:val="clear"/>
               </w:rPr>
-              <w:t xml:space="preserve">True</w:t>
-            </w:r>
-            <w:r>
-              <w:t xml:space="preserve">, 0,2</w:t>
+              <w:t xml:space="preserve">False</w:t>
             </w:r>
           </w:p>
         </w:tc>
@@ -7128,7 +7567,7 @@
                 <w:szCs w:val="20"/>
                 <w:shd w:fill="F2F2F2" w:val="clear"/>
               </w:rPr>
-              <w:t xml:space="preserve">GIS_LANGD_TOL</w:t>
+              <w:t xml:space="preserve">OMFILMNING_OVER_FILER</w:t>
             </w:r>
             <w:r>
               <w:t xml:space="preserve">, </w:t>
@@ -7140,7 +7579,7 @@
                 <w:szCs w:val="20"/>
                 <w:shd w:fill="F2F2F2" w:val="clear"/>
               </w:rPr>
-              <w:t xml:space="preserve">GIS_LITTERA_LIKHET</w:t>
+              <w:t xml:space="preserve">TIDIGARE_INDEX_ANDEL</w:t>
             </w:r>
           </w:p>
         </w:tc>
@@ -7165,7 +7604,7 @@
               <w:spacing w:after="0"/>
             </w:pPr>
             <w:r>
-              <w:t xml:space="preserve">Förslag på rätt littera för okända brunnar: en GIS-ledning från den kända brunnen med längd inom så stor andel av filmens föreslås; annars littera med minst så stor namnlikhet (0–1).</w:t>
+              <w:t xml:space="preserve">Samma brunnspar i olika TV3-filer (olika inspektionsomgångar): den nyaste filmen gäller, äldre markeras *ersatt av ny inspektion* och den gällande får kolumnen Tidigare inspektion (klass och konstruktionsindex då → nu). Inom samma klass räknas sträckan som förvärrad/förbättrad när indexet ändrats mer än andelen (och minst 5 p/100 m).</w:t>
             </w:r>
           </w:p>
         </w:tc>
@@ -7190,7 +7629,16 @@
               <w:spacing w:after="0"/>
             </w:pPr>
             <w:r>
-              <w:t xml:space="preserve">0,15, 0,75</w:t>
+              <w:rPr>
+                <w:rFonts w:ascii="Consolas" w:cs="Consolas" w:eastAsia="Consolas" w:hAnsi="Consolas"/>
+                <w:sz w:val="20"/>
+                <w:szCs w:val="20"/>
+                <w:shd w:fill="F2F2F2" w:val="clear"/>
+              </w:rPr>
+              <w:t xml:space="preserve">True</w:t>
+            </w:r>
+            <w:r>
+              <w:t xml:space="preserve">, 0,2</w:t>
             </w:r>
           </w:p>
         </w:tc>
@@ -7224,7 +7672,19 @@
                 <w:szCs w:val="20"/>
                 <w:shd w:fill="F2F2F2" w:val="clear"/>
               </w:rPr>
-              <w:t xml:space="preserve">GIS_MATERIAL</w:t>
+              <w:t xml:space="preserve">GIS_LANGD_TOL</w:t>
+            </w:r>
+            <w:r>
+              <w:t xml:space="preserve">, </w:t>
+            </w:r>
+            <w:r>
+              <w:rPr>
+                <w:rFonts w:ascii="Consolas" w:cs="Consolas" w:eastAsia="Consolas" w:hAnsi="Consolas"/>
+                <w:sz w:val="20"/>
+                <w:szCs w:val="20"/>
+                <w:shd w:fill="F2F2F2" w:val="clear"/>
+              </w:rPr>
+              <w:t xml:space="preserve">GIS_LITTERA_LIKHET</w:t>
             </w:r>
           </w:p>
         </w:tc>
@@ -7250,7 +7710,7 @@
               <w:spacing w:after="0"/>
             </w:pPr>
             <w:r>
-              <w:t xml:space="preserve">Materialnamn i film och GIS som räknas som samma (BTG = Betong, PVC/PE/PP = Plast …).</w:t>
+              <w:t xml:space="preserve">Förslag på rätt littera för okända brunnar: en GIS-ledning från den kända brunnen med längd inom så stor andel av filmens föreslås; annars littera med minst så stor namnlikhet (0–1).</w:t>
             </w:r>
           </w:p>
         </w:tc>
@@ -7276,7 +7736,7 @@
               <w:spacing w:after="0"/>
             </w:pPr>
             <w:r>
-              <w:t xml:space="preserve">se skriptet</w:t>
+              <w:t xml:space="preserve">0,15, 0,75</w:t>
             </w:r>
           </w:p>
         </w:tc>
@@ -7309,19 +7769,7 @@
                 <w:szCs w:val="20"/>
                 <w:shd w:fill="F2F2F2" w:val="clear"/>
               </w:rPr>
-              <w:t xml:space="preserve">FOTO_MAX_PX</w:t>
-            </w:r>
-            <w:r>
-              <w:t xml:space="preserve">, </w:t>
-            </w:r>
-            <w:r>
-              <w:rPr>
-                <w:rFonts w:ascii="Consolas" w:cs="Consolas" w:eastAsia="Consolas" w:hAnsi="Consolas"/>
-                <w:sz w:val="20"/>
-                <w:szCs w:val="20"/>
-                <w:shd w:fill="F2F2F2" w:val="clear"/>
-              </w:rPr>
-              <w:t xml:space="preserve">FOTO_JPEG_KVALITET</w:t>
+              <w:t xml:space="preserve">GIS_MATERIAL</w:t>
             </w:r>
           </w:p>
         </w:tc>
@@ -7346,19 +7794,7 @@
               <w:spacing w:after="0"/>
             </w:pPr>
             <w:r>
-              <w:t xml:space="preserve">Fotona i PDF-rapporterna förminskas till högst så många pixlar på längsta sidan (JPEG-kvalitet enligt den andra; 76 ger ~30 % mindre filer än 82 utan synlig skillnad i A4). </w:t>
-            </w:r>
-            <w:r>
-              <w:rPr>
-                <w:rFonts w:ascii="Consolas" w:cs="Consolas" w:eastAsia="Consolas" w:hAnsi="Consolas"/>
-                <w:sz w:val="20"/>
-                <w:szCs w:val="20"/>
-                <w:shd w:fill="F2F2F2" w:val="clear"/>
-              </w:rPr>
-              <w:t xml:space="preserve">None</w:t>
-            </w:r>
-            <w:r>
-              <w:t xml:space="preserve"> = originalstorlek.</w:t>
+              <w:t xml:space="preserve">Materialnamn i film och GIS som räknas som samma (BTG = Betong, PVC/PE/PP = Plast …).</w:t>
             </w:r>
           </w:p>
         </w:tc>
@@ -7383,7 +7819,7 @@
               <w:spacing w:after="0"/>
             </w:pPr>
             <w:r>
-              <w:t xml:space="preserve">960, 76</w:t>
+              <w:t xml:space="preserve">se skriptet</w:t>
             </w:r>
           </w:p>
         </w:tc>
@@ -7417,7 +7853,7 @@
                 <w:szCs w:val="20"/>
                 <w:shd w:fill="F2F2F2" w:val="clear"/>
               </w:rPr>
-              <w:t xml:space="preserve">RAPPORT_BILD_DPI</w:t>
+              <w:t xml:space="preserve">FOTO_MAX_PX</w:t>
             </w:r>
             <w:r>
               <w:t xml:space="preserve">, </w:t>
@@ -7429,7 +7865,7 @@
                 <w:szCs w:val="20"/>
                 <w:shd w:fill="F2F2F2" w:val="clear"/>
               </w:rPr>
-              <w:t xml:space="preserve">RAPPORT_BILD_PALETT</w:t>
+              <w:t xml:space="preserve">FOTO_JPEG_KVALITET</w:t>
             </w:r>
           </w:p>
         </w:tc>
@@ -7455,7 +7891,19 @@
               <w:spacing w:after="0"/>
             </w:pPr>
             <w:r>
-              <w:t xml:space="preserve">Upplösning på översikts- och profilbilden i rapporten, och om de sparas som palett-PNG (256 färger, ca 65 % mindre).</w:t>
+              <w:t xml:space="preserve">Fotona i PDF-rapporterna förminskas till högst så många pixlar på längsta sidan (JPEG-kvalitet enligt den andra; 76 ger ~30 % mindre filer än 82 utan synlig skillnad i A4). </w:t>
+            </w:r>
+            <w:r>
+              <w:rPr>
+                <w:rFonts w:ascii="Consolas" w:cs="Consolas" w:eastAsia="Consolas" w:hAnsi="Consolas"/>
+                <w:sz w:val="20"/>
+                <w:szCs w:val="20"/>
+                <w:shd w:fill="F2F2F2" w:val="clear"/>
+              </w:rPr>
+              <w:t xml:space="preserve">None</w:t>
+            </w:r>
+            <w:r>
+              <w:t xml:space="preserve"> = originalstorlek.</w:t>
             </w:r>
           </w:p>
         </w:tc>
@@ -7481,16 +7929,7 @@
               <w:spacing w:after="0"/>
             </w:pPr>
             <w:r>
-              <w:t xml:space="preserve">150, </w:t>
-            </w:r>
-            <w:r>
-              <w:rPr>
-                <w:rFonts w:ascii="Consolas" w:cs="Consolas" w:eastAsia="Consolas" w:hAnsi="Consolas"/>
-                <w:sz w:val="20"/>
-                <w:szCs w:val="20"/>
-                <w:shd w:fill="F2F2F2" w:val="clear"/>
-              </w:rPr>
-              <w:t xml:space="preserve">True</w:t>
+              <w:t xml:space="preserve">960, 76</w:t>
             </w:r>
           </w:p>
         </w:tc>
@@ -7523,7 +7962,19 @@
                 <w:szCs w:val="20"/>
                 <w:shd w:fill="F2F2F2" w:val="clear"/>
               </w:rPr>
-              <w:t xml:space="preserve">RAPPORT_PROCESSER</w:t>
+              <w:t xml:space="preserve">RAPPORT_BILD_DPI</w:t>
+            </w:r>
+            <w:r>
+              <w:t xml:space="preserve">, </w:t>
+            </w:r>
+            <w:r>
+              <w:rPr>
+                <w:rFonts w:ascii="Consolas" w:cs="Consolas" w:eastAsia="Consolas" w:hAnsi="Consolas"/>
+                <w:sz w:val="20"/>
+                <w:szCs w:val="20"/>
+                <w:shd w:fill="F2F2F2" w:val="clear"/>
+              </w:rPr>
+              <w:t xml:space="preserve">RAPPORT_BILD_PALETT</w:t>
             </w:r>
           </w:p>
         </w:tc>
@@ -7548,31 +7999,7 @@
               <w:spacing w:after="0"/>
             </w:pPr>
             <w:r>
-              <w:t xml:space="preserve">Antal parallella processer för PDF-rapporterna. </w:t>
-            </w:r>
-            <w:r>
-              <w:rPr>
-                <w:rFonts w:ascii="Consolas" w:cs="Consolas" w:eastAsia="Consolas" w:hAnsi="Consolas"/>
-                <w:sz w:val="20"/>
-                <w:szCs w:val="20"/>
-                <w:shd w:fill="F2F2F2" w:val="clear"/>
-              </w:rPr>
-              <w:t xml:space="preserve">None</w:t>
-            </w:r>
-            <w:r>
-              <w:t xml:space="preserve"> = antal kärnor − 1, </w:t>
-            </w:r>
-            <w:r>
-              <w:rPr>
-                <w:rFonts w:ascii="Consolas" w:cs="Consolas" w:eastAsia="Consolas" w:hAnsi="Consolas"/>
-                <w:sz w:val="20"/>
-                <w:szCs w:val="20"/>
-                <w:shd w:fill="F2F2F2" w:val="clear"/>
-              </w:rPr>
-              <w:t xml:space="preserve">1</w:t>
-            </w:r>
-            <w:r>
-              <w:t xml:space="preserve"> = en i taget.</w:t>
+              <w:t xml:space="preserve">Upplösning på översikts- och profilbilden i rapporten, och om de sparas som palett-PNG (256 färger, ca 65 % mindre).</w:t>
             </w:r>
           </w:p>
         </w:tc>
@@ -7597,13 +8024,16 @@
               <w:spacing w:after="0"/>
             </w:pPr>
             <w:r>
-              <w:rPr>
-                <w:rFonts w:ascii="Consolas" w:cs="Consolas" w:eastAsia="Consolas" w:hAnsi="Consolas"/>
-                <w:sz w:val="20"/>
-                <w:szCs w:val="20"/>
-                <w:shd w:fill="F2F2F2" w:val="clear"/>
-              </w:rPr>
-              <w:t xml:space="preserve">None</w:t>
+              <w:t xml:space="preserve">150, </w:t>
+            </w:r>
+            <w:r>
+              <w:rPr>
+                <w:rFonts w:ascii="Consolas" w:cs="Consolas" w:eastAsia="Consolas" w:hAnsi="Consolas"/>
+                <w:sz w:val="20"/>
+                <w:szCs w:val="20"/>
+                <w:shd w:fill="F2F2F2" w:val="clear"/>
+              </w:rPr>
+              <w:t xml:space="preserve">True</w:t>
             </w:r>
           </w:p>
         </w:tc>
@@ -7637,7 +8067,7 @@
                 <w:szCs w:val="20"/>
                 <w:shd w:fill="F2F2F2" w:val="clear"/>
               </w:rPr>
-              <w:t xml:space="preserve">DOLDA_KOLUMNER</w:t>
+              <w:t xml:space="preserve">RAPPORT_PROCESSER</w:t>
             </w:r>
           </w:p>
         </w:tc>
@@ -7663,7 +8093,31 @@
               <w:spacing w:after="0"/>
             </w:pPr>
             <w:r>
-              <w:t xml:space="preserve">Kolumner per flik som döljs som standard i Excel (grupperade, fälls ut med plustecknet ovanför rubrikraden). Rubrik utan enhet. Tom lista = visa allt.</w:t>
+              <w:t xml:space="preserve">Antal parallella processer för PDF-rapporterna. </w:t>
+            </w:r>
+            <w:r>
+              <w:rPr>
+                <w:rFonts w:ascii="Consolas" w:cs="Consolas" w:eastAsia="Consolas" w:hAnsi="Consolas"/>
+                <w:sz w:val="20"/>
+                <w:szCs w:val="20"/>
+                <w:shd w:fill="F2F2F2" w:val="clear"/>
+              </w:rPr>
+              <w:t xml:space="preserve">None</w:t>
+            </w:r>
+            <w:r>
+              <w:t xml:space="preserve"> = antal kärnor − 1, </w:t>
+            </w:r>
+            <w:r>
+              <w:rPr>
+                <w:rFonts w:ascii="Consolas" w:cs="Consolas" w:eastAsia="Consolas" w:hAnsi="Consolas"/>
+                <w:sz w:val="20"/>
+                <w:szCs w:val="20"/>
+                <w:shd w:fill="F2F2F2" w:val="clear"/>
+              </w:rPr>
+              <w:t xml:space="preserve">1</w:t>
+            </w:r>
+            <w:r>
+              <w:t xml:space="preserve"> = en i taget.</w:t>
             </w:r>
           </w:p>
         </w:tc>
@@ -7689,7 +8143,13 @@
               <w:spacing w:after="0"/>
             </w:pPr>
             <w:r>
-              <w:t xml:space="preserve">se skriptet</w:t>
+              <w:rPr>
+                <w:rFonts w:ascii="Consolas" w:cs="Consolas" w:eastAsia="Consolas" w:hAnsi="Consolas"/>
+                <w:sz w:val="20"/>
+                <w:szCs w:val="20"/>
+                <w:shd w:fill="F2F2F2" w:val="clear"/>
+              </w:rPr>
+              <w:t xml:space="preserve">None</w:t>
             </w:r>
           </w:p>
         </w:tc>
@@ -7722,7 +8182,7 @@
                 <w:szCs w:val="20"/>
                 <w:shd w:fill="F2F2F2" w:val="clear"/>
               </w:rPr>
-              <w:t xml:space="preserve">OFULLSTANDIG_ANDEL</w:t>
+              <w:t xml:space="preserve">DOLDA_KOLUMNER</w:t>
             </w:r>
           </w:p>
         </w:tc>
@@ -7747,7 +8207,7 @@
               <w:spacing w:after="0"/>
             </w:pPr>
             <w:r>
-              <w:t xml:space="preserve">Är filmad längd kortare än så gånger kartlängden nådde kameran inte fram; profilen hängs då bara upp i startbrunnen.</w:t>
+              <w:t xml:space="preserve">Kolumner per flik som döljs som standard i Excel (grupperade, fälls ut med plustecknet ovanför rubrikraden). Rubrik utan enhet. Tom lista = visa allt.</w:t>
             </w:r>
           </w:p>
         </w:tc>
@@ -7772,7 +8232,7 @@
               <w:spacing w:after="0"/>
             </w:pPr>
             <w:r>
-              <w:t xml:space="preserve">0,85</w:t>
+              <w:t xml:space="preserve">se skriptet</w:t>
             </w:r>
           </w:p>
         </w:tc>
@@ -7806,7 +8266,7 @@
                 <w:szCs w:val="20"/>
                 <w:shd w:fill="F2F2F2" w:val="clear"/>
               </w:rPr>
-              <w:t xml:space="preserve">SVACKA_MAX_M</w:t>
+              <w:t xml:space="preserve">OFULLSTANDIG_ANDEL</w:t>
             </w:r>
           </w:p>
         </w:tc>
@@ -7832,7 +8292,7 @@
               <w:spacing w:after="0"/>
             </w:pPr>
             <w:r>
-              <w:t xml:space="preserve">Större beräknat svackdjup (m) än så är en inklinometerartefakt: svackan sätts till okänd och profilen markeras osäker.</w:t>
+              <w:t xml:space="preserve">Är filmad längd kortare än så gånger kartlängden nådde kameran inte fram; profilen hängs då bara upp i startbrunnen.</w:t>
             </w:r>
           </w:p>
         </w:tc>
@@ -7858,7 +8318,7 @@
               <w:spacing w:after="0"/>
             </w:pPr>
             <w:r>
-              <w:t xml:space="preserve">1,0</w:t>
+              <w:t xml:space="preserve">0,85</w:t>
             </w:r>
           </w:p>
         </w:tc>
@@ -7891,19 +8351,7 @@
                 <w:szCs w:val="20"/>
                 <w:shd w:fill="F2F2F2" w:val="clear"/>
               </w:rPr>
-              <w:t xml:space="preserve">BAKFALL_MIN_PROMILLE</w:t>
-            </w:r>
-            <w:r>
-              <w:t xml:space="preserve">, </w:t>
-            </w:r>
-            <w:r>
-              <w:rPr>
-                <w:rFonts w:ascii="Consolas" w:cs="Consolas" w:eastAsia="Consolas" w:hAnsi="Consolas"/>
-                <w:sz w:val="20"/>
-                <w:szCs w:val="20"/>
-                <w:shd w:fill="F2F2F2" w:val="clear"/>
-              </w:rPr>
-              <w:t xml:space="preserve">BAKFALL_SEGMENT_MIN_M</w:t>
+              <w:t xml:space="preserve">SVACKA_MAX_M</w:t>
             </w:r>
           </w:p>
         </w:tc>
@@ -7928,7 +8376,7 @@
               <w:spacing w:after="0"/>
             </w:pPr>
             <w:r>
-              <w:t xml:space="preserve">Lutning mot flödet (‰) som räknas som bakfall, och kortaste bakfallssegment (m) som redovisas i kartan.</w:t>
+              <w:t xml:space="preserve">Större beräknat svackdjup (m) än så är en inklinometerartefakt: svackan sätts till okänd och profilen markeras osäker.</w:t>
             </w:r>
           </w:p>
         </w:tc>
@@ -7953,7 +8401,7 @@
               <w:spacing w:after="0"/>
             </w:pPr>
             <w:r>
-              <w:t xml:space="preserve">5; 1</w:t>
+              <w:t xml:space="preserve">1,0</w:t>
             </w:r>
           </w:p>
         </w:tc>
@@ -7987,7 +8435,7 @@
                 <w:szCs w:val="20"/>
                 <w:shd w:fill="F2F2F2" w:val="clear"/>
               </w:rPr>
-              <w:t xml:space="preserve">GIS_SAKNAS_UNDER</w:t>
+              <w:t xml:space="preserve">BAKFALL_MIN_PROMILLE</w:t>
             </w:r>
             <w:r>
               <w:t xml:space="preserve">, </w:t>
@@ -7999,7 +8447,7 @@
                 <w:szCs w:val="20"/>
                 <w:shd w:fill="F2F2F2" w:val="clear"/>
               </w:rPr>
-              <w:t xml:space="preserve">GIS_FALL_ORIMLIGT_M</w:t>
+              <w:t xml:space="preserve">BAKFALL_SEGMENT_MIN_M</w:t>
             </w:r>
           </w:p>
         </w:tc>
@@ -8025,7 +8473,7 @@
               <w:spacing w:after="0"/>
             </w:pPr>
             <w:r>
-              <w:t xml:space="preserve">Vattengång/locknivå i GIS under det första räknas som saknad (SVOA skriver −9999); större fall mellan brunnarna i GIS än det andra (m) flaggas som orimligt i stället för att jämföras med filmen.</w:t>
+              <w:t xml:space="preserve">Lutning mot flödet (‰) som räknas som bakfall, och kortaste bakfallssegment (m) som redovisas i kartan.</w:t>
             </w:r>
           </w:p>
         </w:tc>
@@ -8051,7 +8499,7 @@
               <w:spacing w:after="0"/>
             </w:pPr>
             <w:r>
-              <w:t xml:space="preserve">−999, 50</w:t>
+              <w:t xml:space="preserve">5; 1</w:t>
             </w:r>
           </w:p>
         </w:tc>
@@ -8084,7 +8532,19 @@
                 <w:szCs w:val="20"/>
                 <w:shd w:fill="F2F2F2" w:val="clear"/>
               </w:rPr>
-              <w:t xml:space="preserve">GIS_PLATSHALLARE</w:t>
+              <w:t xml:space="preserve">GIS_SAKNAS_UNDER</w:t>
+            </w:r>
+            <w:r>
+              <w:t xml:space="preserve">, </w:t>
+            </w:r>
+            <w:r>
+              <w:rPr>
+                <w:rFonts w:ascii="Consolas" w:cs="Consolas" w:eastAsia="Consolas" w:hAnsi="Consolas"/>
+                <w:sz w:val="20"/>
+                <w:szCs w:val="20"/>
+                <w:shd w:fill="F2F2F2" w:val="clear"/>
+              </w:rPr>
+              <w:t xml:space="preserve">GIS_FALL_ORIMLIGT_M</w:t>
             </w:r>
           </w:p>
         </w:tc>
@@ -8109,7 +8569,7 @@
               <w:spacing w:after="0"/>
             </w:pPr>
             <w:r>
-              <w:t xml:space="preserve">Littera i TV3-filen som inte är riktiga brunnar och därför inte kontrolleras mot GIS.</w:t>
+              <w:t xml:space="preserve">Vattengång/locknivå i GIS under det första räknas som saknad (SVOA skriver −9999); större fall mellan brunnarna i GIS än det andra (m) flaggas som orimligt i stället för att jämföras med filmen.</w:t>
             </w:r>
           </w:p>
         </w:tc>
@@ -8134,7 +8594,7 @@
               <w:spacing w:after="0"/>
             </w:pPr>
             <w:r>
-              <w:t xml:space="preserve">AG, STBEXTRA</w:t>
+              <w:t xml:space="preserve">−999, 50</w:t>
             </w:r>
           </w:p>
         </w:tc>
@@ -8168,31 +8628,7 @@
                 <w:szCs w:val="20"/>
                 <w:shd w:fill="F2F2F2" w:val="clear"/>
               </w:rPr>
-              <w:t xml:space="preserve">GRENROR_LITTERA</w:t>
-            </w:r>
-            <w:r>
-              <w:t xml:space="preserve">, </w:t>
-            </w:r>
-            <w:r>
-              <w:rPr>
-                <w:rFonts w:ascii="Consolas" w:cs="Consolas" w:eastAsia="Consolas" w:hAnsi="Consolas"/>
-                <w:sz w:val="20"/>
-                <w:szCs w:val="20"/>
-                <w:shd w:fill="F2F2F2" w:val="clear"/>
-              </w:rPr>
-              <w:t xml:space="preserve">ANDE_LITTERA</w:t>
-            </w:r>
-            <w:r>
-              <w:t xml:space="preserve">, </w:t>
-            </w:r>
-            <w:r>
-              <w:rPr>
-                <w:rFonts w:ascii="Consolas" w:cs="Consolas" w:eastAsia="Consolas" w:hAnsi="Consolas"/>
-                <w:sz w:val="20"/>
-                <w:szCs w:val="20"/>
-                <w:shd w:fill="F2F2F2" w:val="clear"/>
-              </w:rPr>
-              <w:t xml:space="preserve">GIS_GRENROR_LANGD_TOL</w:t>
+              <w:t xml:space="preserve">GIS_PLATSHALLARE</w:t>
             </w:r>
           </w:p>
         </w:tc>
@@ -8218,7 +8654,7 @@
               <w:spacing w:after="0"/>
             </w:pPr>
             <w:r>
-              <w:t xml:space="preserve">Reguljära uttryck för littera som betyder anslutning till grenrör respektive ledningsände utan brunn, och hur mycket GIS-ledningen med fri ände får avvika från filmens längd (andel, + 3 m) för att kopplas.</w:t>
+              <w:t xml:space="preserve">Littera i TV3-filen som inte är riktiga brunnar och därför inte kontrolleras mot GIS.</w:t>
             </w:r>
           </w:p>
         </w:tc>
@@ -8244,28 +8680,7 @@
               <w:spacing w:after="0"/>
             </w:pPr>
             <w:r>
-              <w:rPr>
-                <w:rFonts w:ascii="Consolas" w:cs="Consolas" w:eastAsia="Consolas" w:hAnsi="Consolas"/>
-                <w:sz w:val="20"/>
-                <w:szCs w:val="20"/>
-                <w:shd w:fill="F2F2F2" w:val="clear"/>
-              </w:rPr>
-              <w:t xml:space="preserve">^[DSK]?A{1,2}G\d*$</w:t>
-            </w:r>
-            <w:r>
-              <w:t xml:space="preserve">, </w:t>
-            </w:r>
-            <w:r>
-              <w:rPr>
-                <w:rFonts w:ascii="Consolas" w:cs="Consolas" w:eastAsia="Consolas" w:hAnsi="Consolas"/>
-                <w:sz w:val="20"/>
-                <w:szCs w:val="20"/>
-                <w:shd w:fill="F2F2F2" w:val="clear"/>
-              </w:rPr>
-              <w:t xml:space="preserve">^[ÄA]NDE?\d*$</w:t>
-            </w:r>
-            <w:r>
-              <w:t xml:space="preserve">, 0,3</w:t>
+              <w:t xml:space="preserve">AG, STBEXTRA</w:t>
             </w:r>
           </w:p>
         </w:tc>
@@ -8298,7 +8713,31 @@
                 <w:szCs w:val="20"/>
                 <w:shd w:fill="F2F2F2" w:val="clear"/>
               </w:rPr>
-              <w:t xml:space="preserve">RELINAD_SOM_MATERIAL</w:t>
+              <w:t xml:space="preserve">GRENROR_LITTERA</w:t>
+            </w:r>
+            <w:r>
+              <w:t xml:space="preserve">, </w:t>
+            </w:r>
+            <w:r>
+              <w:rPr>
+                <w:rFonts w:ascii="Consolas" w:cs="Consolas" w:eastAsia="Consolas" w:hAnsi="Consolas"/>
+                <w:sz w:val="20"/>
+                <w:szCs w:val="20"/>
+                <w:shd w:fill="F2F2F2" w:val="clear"/>
+              </w:rPr>
+              <w:t xml:space="preserve">ANDE_LITTERA</w:t>
+            </w:r>
+            <w:r>
+              <w:t xml:space="preserve">, </w:t>
+            </w:r>
+            <w:r>
+              <w:rPr>
+                <w:rFonts w:ascii="Consolas" w:cs="Consolas" w:eastAsia="Consolas" w:hAnsi="Consolas"/>
+                <w:sz w:val="20"/>
+                <w:szCs w:val="20"/>
+                <w:shd w:fill="F2F2F2" w:val="clear"/>
+              </w:rPr>
+              <w:t xml:space="preserve">GIS_GRENROR_LANGD_TOL</w:t>
             </w:r>
           </w:p>
         </w:tc>
@@ -8323,7 +8762,7 @@
               <w:spacing w:after="0"/>
             </w:pPr>
             <w:r>
-              <w:t xml:space="preserve">Relinade sträckor redovisas som eget material i fliken Material och diagram 4.</w:t>
+              <w:t xml:space="preserve">Reguljära uttryck för littera som betyder anslutning till grenrör respektive ledningsände utan brunn, och hur mycket GIS-ledningen med fri ände får avvika från filmens längd (andel, + 3 m) för att kopplas.</w:t>
             </w:r>
           </w:p>
         </w:tc>
@@ -8354,7 +8793,22 @@
                 <w:szCs w:val="20"/>
                 <w:shd w:fill="F2F2F2" w:val="clear"/>
               </w:rPr>
-              <w:t xml:space="preserve">True</w:t>
+              <w:t xml:space="preserve">^[DSK]?A{1,2}G\d*$</w:t>
+            </w:r>
+            <w:r>
+              <w:t xml:space="preserve">, </w:t>
+            </w:r>
+            <w:r>
+              <w:rPr>
+                <w:rFonts w:ascii="Consolas" w:cs="Consolas" w:eastAsia="Consolas" w:hAnsi="Consolas"/>
+                <w:sz w:val="20"/>
+                <w:szCs w:val="20"/>
+                <w:shd w:fill="F2F2F2" w:val="clear"/>
+              </w:rPr>
+              <w:t xml:space="preserve">^[ÄA]NDE?\d*$</w:t>
+            </w:r>
+            <w:r>
+              <w:t xml:space="preserve">, 0,3</w:t>
             </w:r>
           </w:p>
         </w:tc>
@@ -8388,31 +8842,7 @@
                 <w:szCs w:val="20"/>
                 <w:shd w:fill="F2F2F2" w:val="clear"/>
               </w:rPr>
-              <w:t xml:space="preserve">BEHALL_RAPPORTER</w:t>
-            </w:r>
-            <w:r>
-              <w:t xml:space="preserve">, </w:t>
-            </w:r>
-            <w:r>
-              <w:rPr>
-                <w:rFonts w:ascii="Consolas" w:cs="Consolas" w:eastAsia="Consolas" w:hAnsi="Consolas"/>
-                <w:sz w:val="20"/>
-                <w:szCs w:val="20"/>
-                <w:shd w:fill="F2F2F2" w:val="clear"/>
-              </w:rPr>
-              <w:t xml:space="preserve">SPARA_DIAGRAM</w:t>
-            </w:r>
-            <w:r>
-              <w:t xml:space="preserve">, </w:t>
-            </w:r>
-            <w:r>
-              <w:rPr>
-                <w:rFonts w:ascii="Consolas" w:cs="Consolas" w:eastAsia="Consolas" w:hAnsi="Consolas"/>
-                <w:sz w:val="20"/>
-                <w:szCs w:val="20"/>
-                <w:shd w:fill="F2F2F2" w:val="clear"/>
-              </w:rPr>
-              <w:t xml:space="preserve">SKRIV_KARTUNDERLAG</w:t>
+              <w:t xml:space="preserve">RELINAD_SOM_MATERIAL</w:t>
             </w:r>
           </w:p>
         </w:tc>
@@ -8438,43 +8868,7 @@
               <w:spacing w:after="0"/>
             </w:pPr>
             <w:r>
-              <w:t xml:space="preserve">Standardvärden för </w:t>
-            </w:r>
-            <w:r>
-              <w:rPr>
-                <w:rFonts w:ascii="Consolas" w:cs="Consolas" w:eastAsia="Consolas" w:hAnsi="Consolas"/>
-                <w:sz w:val="20"/>
-                <w:szCs w:val="20"/>
-                <w:shd w:fill="F2F2F2" w:val="clear"/>
-              </w:rPr>
-              <w:t xml:space="preserve">--behall-rapporter</w:t>
-            </w:r>
-            <w:r>
-              <w:t xml:space="preserve">, </w:t>
-            </w:r>
-            <w:r>
-              <w:rPr>
-                <w:rFonts w:ascii="Consolas" w:cs="Consolas" w:eastAsia="Consolas" w:hAnsi="Consolas"/>
-                <w:sz w:val="20"/>
-                <w:szCs w:val="20"/>
-                <w:shd w:fill="F2F2F2" w:val="clear"/>
-              </w:rPr>
-              <w:t xml:space="preserve">--diagram</w:t>
-            </w:r>
-            <w:r>
-              <w:t xml:space="preserve"> och </w:t>
-            </w:r>
-            <w:r>
-              <w:rPr>
-                <w:rFonts w:ascii="Consolas" w:cs="Consolas" w:eastAsia="Consolas" w:hAnsi="Consolas"/>
-                <w:sz w:val="20"/>
-                <w:szCs w:val="20"/>
-                <w:shd w:fill="F2F2F2" w:val="clear"/>
-              </w:rPr>
-              <w:t xml:space="preserve">--karta</w:t>
-            </w:r>
-            <w:r>
-              <w:t xml:space="preserve">.</w:t>
+              <w:t xml:space="preserve">Relinade sträckor redovisas som eget material i fliken Material och diagram 4.</w:t>
             </w:r>
           </w:p>
         </w:tc>
@@ -8499,30 +8893,6 @@
             <w:pPr>
               <w:spacing w:after="0"/>
             </w:pPr>
-            <w:r>
-              <w:rPr>
-                <w:rFonts w:ascii="Consolas" w:cs="Consolas" w:eastAsia="Consolas" w:hAnsi="Consolas"/>
-                <w:sz w:val="20"/>
-                <w:szCs w:val="20"/>
-                <w:shd w:fill="F2F2F2" w:val="clear"/>
-              </w:rPr>
-              <w:t xml:space="preserve">False</w:t>
-            </w:r>
-            <w:r>
-              <w:t xml:space="preserve">, </w:t>
-            </w:r>
-            <w:r>
-              <w:rPr>
-                <w:rFonts w:ascii="Consolas" w:cs="Consolas" w:eastAsia="Consolas" w:hAnsi="Consolas"/>
-                <w:sz w:val="20"/>
-                <w:szCs w:val="20"/>
-                <w:shd w:fill="F2F2F2" w:val="clear"/>
-              </w:rPr>
-              <w:t xml:space="preserve">False</w:t>
-            </w:r>
-            <w:r>
-              <w:t xml:space="preserve">, </w:t>
-            </w:r>
             <w:r>
               <w:rPr>
                 <w:rFonts w:ascii="Consolas" w:cs="Consolas" w:eastAsia="Consolas" w:hAnsi="Consolas"/>
@@ -8563,7 +8933,31 @@
                 <w:szCs w:val="20"/>
                 <w:shd w:fill="F2F2F2" w:val="clear"/>
               </w:rPr>
-              <w:t xml:space="preserve">KODER</w:t>
+              <w:t xml:space="preserve">BEHALL_RAPPORTER</w:t>
+            </w:r>
+            <w:r>
+              <w:t xml:space="preserve">, </w:t>
+            </w:r>
+            <w:r>
+              <w:rPr>
+                <w:rFonts w:ascii="Consolas" w:cs="Consolas" w:eastAsia="Consolas" w:hAnsi="Consolas"/>
+                <w:sz w:val="20"/>
+                <w:szCs w:val="20"/>
+                <w:shd w:fill="F2F2F2" w:val="clear"/>
+              </w:rPr>
+              <w:t xml:space="preserve">SPARA_DIAGRAM</w:t>
+            </w:r>
+            <w:r>
+              <w:t xml:space="preserve">, </w:t>
+            </w:r>
+            <w:r>
+              <w:rPr>
+                <w:rFonts w:ascii="Consolas" w:cs="Consolas" w:eastAsia="Consolas" w:hAnsi="Consolas"/>
+                <w:sz w:val="20"/>
+                <w:szCs w:val="20"/>
+                <w:shd w:fill="F2F2F2" w:val="clear"/>
+              </w:rPr>
+              <w:t xml:space="preserve">SKRIV_KARTUNDERLAG</w:t>
             </w:r>
           </w:p>
         </w:tc>
@@ -8588,7 +8982,43 @@
               <w:spacing w:after="0"/>
             </w:pPr>
             <w:r>
-              <w:t xml:space="preserve">Skadekoder med klartext och typ (K = konstruktion, D = drift, I = information).</w:t>
+              <w:t xml:space="preserve">Standardvärden för </w:t>
+            </w:r>
+            <w:r>
+              <w:rPr>
+                <w:rFonts w:ascii="Consolas" w:cs="Consolas" w:eastAsia="Consolas" w:hAnsi="Consolas"/>
+                <w:sz w:val="20"/>
+                <w:szCs w:val="20"/>
+                <w:shd w:fill="F2F2F2" w:val="clear"/>
+              </w:rPr>
+              <w:t xml:space="preserve">--behall-rapporter</w:t>
+            </w:r>
+            <w:r>
+              <w:t xml:space="preserve">, </w:t>
+            </w:r>
+            <w:r>
+              <w:rPr>
+                <w:rFonts w:ascii="Consolas" w:cs="Consolas" w:eastAsia="Consolas" w:hAnsi="Consolas"/>
+                <w:sz w:val="20"/>
+                <w:szCs w:val="20"/>
+                <w:shd w:fill="F2F2F2" w:val="clear"/>
+              </w:rPr>
+              <w:t xml:space="preserve">--diagram</w:t>
+            </w:r>
+            <w:r>
+              <w:t xml:space="preserve"> och </w:t>
+            </w:r>
+            <w:r>
+              <w:rPr>
+                <w:rFonts w:ascii="Consolas" w:cs="Consolas" w:eastAsia="Consolas" w:hAnsi="Consolas"/>
+                <w:sz w:val="20"/>
+                <w:szCs w:val="20"/>
+                <w:shd w:fill="F2F2F2" w:val="clear"/>
+              </w:rPr>
+              <w:t xml:space="preserve">--karta</w:t>
+            </w:r>
+            <w:r>
+              <w:t xml:space="preserve">.</w:t>
             </w:r>
           </w:p>
         </w:tc>
@@ -8613,7 +9043,37 @@
               <w:spacing w:after="0"/>
             </w:pPr>
             <w:r>
-              <w:t xml:space="preserve">P93</w:t>
+              <w:rPr>
+                <w:rFonts w:ascii="Consolas" w:cs="Consolas" w:eastAsia="Consolas" w:hAnsi="Consolas"/>
+                <w:sz w:val="20"/>
+                <w:szCs w:val="20"/>
+                <w:shd w:fill="F2F2F2" w:val="clear"/>
+              </w:rPr>
+              <w:t xml:space="preserve">False</w:t>
+            </w:r>
+            <w:r>
+              <w:t xml:space="preserve">, </w:t>
+            </w:r>
+            <w:r>
+              <w:rPr>
+                <w:rFonts w:ascii="Consolas" w:cs="Consolas" w:eastAsia="Consolas" w:hAnsi="Consolas"/>
+                <w:sz w:val="20"/>
+                <w:szCs w:val="20"/>
+                <w:shd w:fill="F2F2F2" w:val="clear"/>
+              </w:rPr>
+              <w:t xml:space="preserve">False</w:t>
+            </w:r>
+            <w:r>
+              <w:t xml:space="preserve">, </w:t>
+            </w:r>
+            <w:r>
+              <w:rPr>
+                <w:rFonts w:ascii="Consolas" w:cs="Consolas" w:eastAsia="Consolas" w:hAnsi="Consolas"/>
+                <w:sz w:val="20"/>
+                <w:szCs w:val="20"/>
+                <w:shd w:fill="F2F2F2" w:val="clear"/>
+              </w:rPr>
+              <w:t xml:space="preserve">True</w:t>
             </w:r>
           </w:p>
         </w:tc>
@@ -8647,6 +9107,91 @@
                 <w:szCs w:val="20"/>
                 <w:shd w:fill="F2F2F2" w:val="clear"/>
               </w:rPr>
+              <w:t xml:space="preserve">KODER</w:t>
+            </w:r>
+          </w:p>
+        </w:tc>
+        <w:tc>
+          <w:tcPr>
+            <w:tcW w:type="dxa" w:w="5000"/>
+            <w:tcBorders>
+              <w:top w:val="single" w:color="BFBFBF" w:sz="4"/>
+              <w:left w:val="single" w:color="BFBFBF" w:sz="4"/>
+              <w:bottom w:val="single" w:color="BFBFBF" w:sz="4"/>
+              <w:right w:val="single" w:color="BFBFBF" w:sz="4"/>
+            </w:tcBorders>
+            <w:shd w:fill="F7F9FC" w:val="clear"/>
+            <w:tcMar>
+              <w:top w:type="dxa" w:w="60"/>
+              <w:left w:type="dxa" w:w="100"/>
+              <w:bottom w:type="dxa" w:w="60"/>
+              <w:right w:type="dxa" w:w="100"/>
+            </w:tcMar>
+          </w:tcPr>
+          <w:p>
+            <w:pPr>
+              <w:spacing w:after="0"/>
+            </w:pPr>
+            <w:r>
+              <w:t xml:space="preserve">Skadekoder med klartext och typ (K = konstruktion, D = drift, I = information).</w:t>
+            </w:r>
+          </w:p>
+        </w:tc>
+        <w:tc>
+          <w:tcPr>
+            <w:tcW w:type="dxa" w:w="1760"/>
+            <w:tcBorders>
+              <w:top w:val="single" w:color="BFBFBF" w:sz="4"/>
+              <w:left w:val="single" w:color="BFBFBF" w:sz="4"/>
+              <w:bottom w:val="single" w:color="BFBFBF" w:sz="4"/>
+              <w:right w:val="single" w:color="BFBFBF" w:sz="4"/>
+            </w:tcBorders>
+            <w:shd w:fill="F7F9FC" w:val="clear"/>
+            <w:tcMar>
+              <w:top w:type="dxa" w:w="60"/>
+              <w:left w:type="dxa" w:w="100"/>
+              <w:bottom w:type="dxa" w:w="60"/>
+              <w:right w:type="dxa" w:w="100"/>
+            </w:tcMar>
+          </w:tcPr>
+          <w:p>
+            <w:pPr>
+              <w:spacing w:after="0"/>
+            </w:pPr>
+            <w:r>
+              <w:t xml:space="preserve">P93</w:t>
+            </w:r>
+          </w:p>
+        </w:tc>
+      </w:tr>
+      <w:tr>
+        <w:tc>
+          <w:tcPr>
+            <w:tcW w:type="dxa" w:w="2600"/>
+            <w:tcBorders>
+              <w:top w:val="single" w:color="BFBFBF" w:sz="4"/>
+              <w:left w:val="single" w:color="BFBFBF" w:sz="4"/>
+              <w:bottom w:val="single" w:color="BFBFBF" w:sz="4"/>
+              <w:right w:val="single" w:color="BFBFBF" w:sz="4"/>
+            </w:tcBorders>
+            <w:tcMar>
+              <w:top w:type="dxa" w:w="60"/>
+              <w:left w:type="dxa" w:w="100"/>
+              <w:bottom w:type="dxa" w:w="60"/>
+              <w:right w:type="dxa" w:w="100"/>
+            </w:tcMar>
+          </w:tcPr>
+          <w:p>
+            <w:pPr>
+              <w:spacing w:after="0"/>
+            </w:pPr>
+            <w:r>
+              <w:rPr>
+                <w:rFonts w:ascii="Consolas" w:cs="Consolas" w:eastAsia="Consolas" w:hAnsi="Consolas"/>
+                <w:sz w:val="20"/>
+                <w:szCs w:val="20"/>
+                <w:shd w:fill="F2F2F2" w:val="clear"/>
+              </w:rPr>
               <w:t xml:space="preserve">ATTRIBUT</w:t>
             </w:r>
             <w:r>
@@ -8672,7 +9217,6 @@
               <w:bottom w:val="single" w:color="BFBFBF" w:sz="4"/>
               <w:right w:val="single" w:color="BFBFBF" w:sz="4"/>
             </w:tcBorders>
-            <w:shd w:fill="F7F9FC" w:val="clear"/>
             <w:tcMar>
               <w:top w:type="dxa" w:w="60"/>
               <w:left w:type="dxa" w:w="100"/>
@@ -8698,7 +9242,6 @@
               <w:bottom w:val="single" w:color="BFBFBF" w:sz="4"/>
               <w:right w:val="single" w:color="BFBFBF" w:sz="4"/>
             </w:tcBorders>
-            <w:shd w:fill="F7F9FC" w:val="clear"/>
             <w:tcMar>
               <w:top w:type="dxa" w:w="60"/>
               <w:left w:type="dxa" w:w="100"/>

</xml_diff>

<commit_message>
Rotmapp för filmningen: .inc-filer söks även i film-/rotmapparna
- rot:/rotmapp: är alias för filmmapp, globalt och per rad i listfilen
  (exakt fil ; rot: MAPP)
- hitta_inc söker i Project.xml:s mapp, radens och de gemensamma
  filmmapparna och sist mappen ovanför Project.xml; .inc med andra
  brunnar i huvudet hoppas över
- OBS om saknade .inc listar sökta mappar och tipsar om rot:
- kartunderlag inc_kataloger, som tv3_pptx använder
- handledning 3.1 och 3.5, CLAUDE.md

Co-Authored-By: Claude Opus 5.5 <noreply@anthropic.com>
Claude-Session: https://claude.ai/code/session_011fdqX3JEZje1LF9LqpaqR8
</commit_message>
<xml_diff>
--- a/Anvandarhandledning tv3_analys.docx
+++ b/Anvandarhandledning tv3_analys.docx
@@ -385,6 +385,21 @@
           <w:sz w:val="19"/>
           <w:szCs w:val="19"/>
         </w:rPr>
+        <w:t xml:space="preserve">D:\Filmning\Asbjörnens väg\Export\Project.xml ; rot: D:\Filmning\Asbjörnens väg   # WinCan, se 3.5</w:t>
+      </w:r>
+    </w:p>
+    <w:p>
+      <w:pPr>
+        <w:shd w:fill="F2F2F2" w:val="clear"/>
+        <w:spacing w:after="0"/>
+        <w:ind w:left="280"/>
+      </w:pPr>
+      <w:r>
+        <w:rPr>
+          <w:rFonts w:ascii="Consolas" w:cs="Consolas" w:eastAsia="Consolas" w:hAnsi="Consolas"/>
+          <w:sz w:val="19"/>
+          <w:szCs w:val="19"/>
+        </w:rPr>
         <w:t xml:space="preserve">../andra_omradet/                          # mapp: alla TV3-filer i den</w:t>
       </w:r>
     </w:p>
@@ -837,7 +852,19 @@
         <w:t xml:space="preserve">just den filen</w:t>
       </w:r>
       <w:r>
-        <w:t xml:space="preserve">: utan prefix filmmappar, med </w:t>
+        <w:t xml:space="preserve">: utan prefix (eller med </w:t>
+      </w:r>
+      <w:r>
+        <w:rPr>
+          <w:rFonts w:ascii="Consolas" w:cs="Consolas" w:eastAsia="Consolas" w:hAnsi="Consolas"/>
+          <w:sz w:val="20"/>
+          <w:szCs w:val="20"/>
+          <w:shd w:fill="F2F2F2" w:val="clear"/>
+        </w:rPr>
+        <w:t xml:space="preserve">rot:</w:t>
+      </w:r>
+      <w:r>
+        <w:t xml:space="preserve">) filmmappar, med </w:t>
       </w:r>
       <w:r>
         <w:rPr>
@@ -862,6 +889,62 @@
       </w:r>
       <w:r>
         <w:t xml:space="preserve">.</w:t>
+      </w:r>
+    </w:p>
+    <w:p>
+      <w:pPr>
+        <w:pStyle w:val="ListParagraph"/>
+        <w:numPr>
+          <w:ilvl w:val="0"/>
+          <w:numId w:val="3"/>
+        </w:numPr>
+        <w:spacing w:after="80"/>
+      </w:pPr>
+      <w:r>
+        <w:rPr>
+          <w:b/>
+          <w:bCs/>
+        </w:rPr>
+        <w:t xml:space="preserve">Exakt fil + filmningens rotmapp.</w:t>
+      </w:r>
+      <w:r>
+        <w:t xml:space="preserve"> Ligger flera TV3-filer i samma mapp, eller ligger exporten i en undermapp till filmningen, anger du den fil som ska gälla med hela sökvägen och filmningens rotmapp efter </w:t>
+      </w:r>
+      <w:r>
+        <w:rPr>
+          <w:rFonts w:ascii="Consolas" w:cs="Consolas" w:eastAsia="Consolas" w:hAnsi="Consolas"/>
+          <w:sz w:val="20"/>
+          <w:szCs w:val="20"/>
+          <w:shd w:fill="F2F2F2" w:val="clear"/>
+        </w:rPr>
+        <w:t xml:space="preserve">;</w:t>
+      </w:r>
+      <w:r>
+        <w:t xml:space="preserve"> – </w:t>
+      </w:r>
+      <w:r>
+        <w:rPr>
+          <w:rFonts w:ascii="Consolas" w:cs="Consolas" w:eastAsia="Consolas" w:hAnsi="Consolas"/>
+          <w:sz w:val="20"/>
+          <w:szCs w:val="20"/>
+          <w:shd w:fill="F2F2F2" w:val="clear"/>
+        </w:rPr>
+        <w:t xml:space="preserve">…\DUF 701\Export\DUF 701 slutlig.TV3 ; rot: D:\Filmning\DUF 701</w:t>
+      </w:r>
+      <w:r>
+        <w:t xml:space="preserve">. Bara den filen läses, och filmer, bilder och (för WinCan) .inc-filer söks i hela rotmappen med undermappar. </w:t>
+      </w:r>
+      <w:r>
+        <w:rPr>
+          <w:rFonts w:ascii="Consolas" w:cs="Consolas" w:eastAsia="Consolas" w:hAnsi="Consolas"/>
+          <w:sz w:val="20"/>
+          <w:szCs w:val="20"/>
+          <w:shd w:fill="F2F2F2" w:val="clear"/>
+        </w:rPr>
+        <w:t xml:space="preserve">rot:</w:t>
+      </w:r>
+      <w:r>
+        <w:t xml:space="preserve"> är samma sak som en filmmapp; ordet gör bara listfilen lättare att läsa. Ange en mapp i stället för en fil bara när alla TV3-filer i den ska med.</w:t>
       </w:r>
     </w:p>
     <w:p>
@@ -3734,7 +3817,7 @@
               <w:t xml:space="preserve">.inc</w:t>
             </w:r>
             <w:r>
-              <w:t xml:space="preserve">-filen som SI_InclinationFileName pekar på – söks i Project.xml:s mapp med undermappar. Den innehåller lutningen i procent längs kamerans väg, som räknas om till en höjdprofil.</w:t>
+              <w:t xml:space="preserve">-filen som SI_InclinationFileName pekar på. Den innehåller lutningen i procent längs kamerans väg, som räknas om till en höjdprofil.</w:t>
             </w:r>
           </w:p>
         </w:tc>
@@ -3826,7 +3909,87 @@
         <w:spacing w:after="80"/>
       </w:pPr>
       <w:r>
-        <w:t xml:space="preserve">Ligger både en TV3-fil och Project.xml i samma mapp används TV3-filen (de innehåller samma inspektioner).</w:t>
+        <w:rPr>
+          <w:b/>
+          <w:bCs/>
+        </w:rPr>
+        <w:t xml:space="preserve">Var .inc-filerna söks.</w:t>
+      </w:r>
+      <w:r>
+        <w:t xml:space="preserve"> Med undermappar, i ordningen: Project.xml:s egen mapp, filmmapparna för filen (</w:t>
+      </w:r>
+      <w:r>
+        <w:rPr>
+          <w:rFonts w:ascii="Consolas" w:cs="Consolas" w:eastAsia="Consolas" w:hAnsi="Consolas"/>
+          <w:sz w:val="20"/>
+          <w:szCs w:val="20"/>
+          <w:shd w:fill="F2F2F2" w:val="clear"/>
+        </w:rPr>
+        <w:t xml:space="preserve">; rot: …</w:t>
+      </w:r>
+      <w:r>
+        <w:t xml:space="preserve"> eller </w:t>
+      </w:r>
+      <w:r>
+        <w:rPr>
+          <w:rFonts w:ascii="Consolas" w:cs="Consolas" w:eastAsia="Consolas" w:hAnsi="Consolas"/>
+          <w:sz w:val="20"/>
+          <w:szCs w:val="20"/>
+          <w:shd w:fill="F2F2F2" w:val="clear"/>
+        </w:rPr>
+        <w:t xml:space="preserve">; mapp</w:t>
+      </w:r>
+      <w:r>
+        <w:t xml:space="preserve"> på raden, sedan </w:t>
+      </w:r>
+      <w:r>
+        <w:rPr>
+          <w:rFonts w:ascii="Consolas" w:cs="Consolas" w:eastAsia="Consolas" w:hAnsi="Consolas"/>
+          <w:sz w:val="20"/>
+          <w:szCs w:val="20"/>
+          <w:shd w:fill="F2F2F2" w:val="clear"/>
+        </w:rPr>
+        <w:t xml:space="preserve">media:</w:t>
+      </w:r>
+      <w:r>
+        <w:t xml:space="preserve">/</w:t>
+      </w:r>
+      <w:r>
+        <w:rPr>
+          <w:rFonts w:ascii="Consolas" w:cs="Consolas" w:eastAsia="Consolas" w:hAnsi="Consolas"/>
+          <w:sz w:val="20"/>
+          <w:szCs w:val="20"/>
+          <w:shd w:fill="F2F2F2" w:val="clear"/>
+        </w:rPr>
+        <w:t xml:space="preserve">--media</w:t>
+      </w:r>
+      <w:r>
+        <w:t xml:space="preserve">) och sist mappen ovanför Project.xml. Ligger exporten i en undermapp till filmningen och .inc-filerna i en annan undermapp hittas de alltså utan inställning; ligger de längre bort anger du filmningens rotmapp på raden: </w:t>
+      </w:r>
+      <w:r>
+        <w:rPr>
+          <w:rFonts w:ascii="Consolas" w:cs="Consolas" w:eastAsia="Consolas" w:hAnsi="Consolas"/>
+          <w:sz w:val="20"/>
+          <w:szCs w:val="20"/>
+          <w:shd w:fill="F2F2F2" w:val="clear"/>
+        </w:rPr>
+        <w:t xml:space="preserve">D:\Filmning\Asbjörnens väg\Export\Project.xml ; rot: D:\Filmning\Asbjörnens väg</w:t>
+      </w:r>
+      <w:r>
+        <w:t xml:space="preserve">. En .inc-fil med rätt namn men andra brunnar i huvudet (ett annat projekt under samma mapp) används inte. Hittas inte alla säger konsolen hur många och var den letat.</w:t>
+      </w:r>
+    </w:p>
+    <w:p>
+      <w:pPr>
+        <w:pStyle w:val="ListParagraph"/>
+        <w:numPr>
+          <w:ilvl w:val="0"/>
+          <w:numId w:val="3"/>
+        </w:numPr>
+        <w:spacing w:after="80"/>
+      </w:pPr>
+      <w:r>
+        <w:t xml:space="preserve">Ligger både en TV3-fil och Project.xml i samma mapp används TV3-filen (de innehåller samma inspektioner) när du anger mappen; anger du Project.xml med hela sökvägen läses den.</w:t>
       </w:r>
     </w:p>
     <w:p>

</xml_diff>

<commit_message>
.inc-lutningen är fall i flödesriktningen, oavsett kamerans riktning
Fem nya .inc-filer (fyra medströms filmade) visar att värdet är positivt
även medströms – den tidigare tolkningen (stigning i kamerans riktning)
gav bakfall på alla medströms sträckor. INC_POSITIV_UPPAT ersätts av
INC_POSITIV_FALL och inc_profil vänder tecknet efter riktningen.
Sju .inc-filer i testdata, handledning och CLAUDE.md uppdaterade.

Co-Authored-By: Claude Opus 5.5 <noreply@anthropic.com>
Claude-Session: https://claude.ai/code/session_011fdqX3JEZje1LF9LqpaqR8
</commit_message>
<xml_diff>
--- a/Anvandarhandledning tv3_analys.docx
+++ b/Anvandarhandledning tv3_analys.docx
@@ -3817,7 +3817,7 @@
               <w:t xml:space="preserve">.inc</w:t>
             </w:r>
             <w:r>
-              <w:t xml:space="preserve">-filen som SI_InclinationFileName pekar på. Den innehåller lutningen i procent längs kamerans väg, som räknas om till en höjdprofil.</w:t>
+              <w:t xml:space="preserve">-filen som SI_InclinationFileName pekar på. Den innehåller ledningens lutning i procent längs kamerans väg – positivt värde är fall i flödesriktningen, oavsett om kameran kört med- eller motströms – som räknas om till en höjdprofil.</w:t>
             </w:r>
           </w:p>
         </w:tc>
@@ -7449,7 +7449,7 @@
                 <w:szCs w:val="20"/>
                 <w:shd w:fill="F2F2F2" w:val="clear"/>
               </w:rPr>
-              <w:t xml:space="preserve">INC_POSITIV_UPPAT</w:t>
+              <w:t xml:space="preserve">INC_POSITIV_FALL</w:t>
             </w:r>
           </w:p>
         </w:tc>
@@ -7475,7 +7475,7 @@
               <w:spacing w:after="0"/>
             </w:pPr>
             <w:r>
-              <w:t xml:space="preserve">Inklinometern i WinCans .inc-filer (3.5): enhet för värdena (0,01 = procent) och tecken (True = positivt värde när ledningen stiger i kamerans riktning). Stämmer inte lutningen med GIS för medströms och motströms filmade sträckor – byt tecken.</w:t>
+              <w:t xml:space="preserve">Inklinometern i WinCans .inc-filer (3.5): enhet för värdena (0,01 = procent) och tecken (True = positivt värde är fall i flödesriktningen oavsett kamerans riktning, kontrollerat på sju filer – fyra medströms och tre motströms filmade; False = positivt är stigning i kamerans riktning). Får medströms filmade sträckor bakfall längs hela ledningen är tecknet fel för den leverantören.</w:t>
             </w:r>
           </w:p>
         </w:tc>

</xml_diff>

<commit_message>
Slå ihop avbrutna delfilmer i olika TV3-filer (inom ett år)
Två avbrutna filmer av samma brunnspar, en från vardera brunnen, som
ligger i olika TV3-filer (DUF 700 Del 4 / Ålsten Del 5) behandlades som
ny inspektion – den nyare ersatte den äldre. Nu slås de ihop som inom en
fil när de är filmade inom SAMMANSLAGNING_MAX_DAGAR (365) dagar.
Filmstatus, observationer, översikt och TV3-filraden i protokollet
anger vilken fil varje delfilm kommer från; Videofil 2-länken använder
Observation.film_b i stället för numret (kan krocka mellan filer).

Co-Authored-By: Claude Opus 5.5 <noreply@anthropic.com>
Claude-Session: https://claude.ai/code/session_011fdqX3JEZje1LF9LqpaqR8
</commit_message>
<xml_diff>
--- a/Anvandarhandledning tv3_analys.docx
+++ b/Anvandarhandledning tv3_analys.docx
@@ -7835,19 +7835,7 @@
                 <w:szCs w:val="20"/>
                 <w:shd w:fill="F2F2F2" w:val="clear"/>
               </w:rPr>
-              <w:t xml:space="preserve">GIS_LANGD_TOL</w:t>
-            </w:r>
-            <w:r>
-              <w:t xml:space="preserve">, </w:t>
-            </w:r>
-            <w:r>
-              <w:rPr>
-                <w:rFonts w:ascii="Consolas" w:cs="Consolas" w:eastAsia="Consolas" w:hAnsi="Consolas"/>
-                <w:sz w:val="20"/>
-                <w:szCs w:val="20"/>
-                <w:shd w:fill="F2F2F2" w:val="clear"/>
-              </w:rPr>
-              <w:t xml:space="preserve">GIS_LITTERA_LIKHET</w:t>
+              <w:t xml:space="preserve">SAMMANSLAGNING_MAX_DAGAR</w:t>
             </w:r>
           </w:p>
         </w:tc>
@@ -7873,7 +7861,19 @@
               <w:spacing w:after="0"/>
             </w:pPr>
             <w:r>
-              <w:t xml:space="preserve">Förslag på rätt littera för okända brunnar: en GIS-ledning från den kända brunnen med längd inom så stor andel av filmens föreslås; annars littera med minst så stor namnlikhet (0–1).</w:t>
+              <w:t xml:space="preserve">Två avbrutna delfilmer av samma brunnspar, en från vardera brunnen, som ligger i olika TV3-filer slås ihop till en sträcka (som inom en fil) när de är filmade inom så många dagar från varandra. Ligger de längre isär räknas den nyare som en ny inspektion. </w:t>
+            </w:r>
+            <w:r>
+              <w:rPr>
+                <w:rFonts w:ascii="Consolas" w:cs="Consolas" w:eastAsia="Consolas" w:hAnsi="Consolas"/>
+                <w:sz w:val="20"/>
+                <w:szCs w:val="20"/>
+                <w:shd w:fill="F2F2F2" w:val="clear"/>
+              </w:rPr>
+              <w:t xml:space="preserve">None</w:t>
+            </w:r>
+            <w:r>
+              <w:t xml:space="preserve"> = aldrig över filgränser.</w:t>
             </w:r>
           </w:p>
         </w:tc>
@@ -7899,7 +7899,7 @@
               <w:spacing w:after="0"/>
             </w:pPr>
             <w:r>
-              <w:t xml:space="preserve">0,15, 0,75</w:t>
+              <w:t xml:space="preserve">365</w:t>
             </w:r>
           </w:p>
         </w:tc>
@@ -7932,7 +7932,19 @@
                 <w:szCs w:val="20"/>
                 <w:shd w:fill="F2F2F2" w:val="clear"/>
               </w:rPr>
-              <w:t xml:space="preserve">GIS_MATERIAL</w:t>
+              <w:t xml:space="preserve">GIS_LANGD_TOL</w:t>
+            </w:r>
+            <w:r>
+              <w:t xml:space="preserve">, </w:t>
+            </w:r>
+            <w:r>
+              <w:rPr>
+                <w:rFonts w:ascii="Consolas" w:cs="Consolas" w:eastAsia="Consolas" w:hAnsi="Consolas"/>
+                <w:sz w:val="20"/>
+                <w:szCs w:val="20"/>
+                <w:shd w:fill="F2F2F2" w:val="clear"/>
+              </w:rPr>
+              <w:t xml:space="preserve">GIS_LITTERA_LIKHET</w:t>
             </w:r>
           </w:p>
         </w:tc>
@@ -7957,7 +7969,7 @@
               <w:spacing w:after="0"/>
             </w:pPr>
             <w:r>
-              <w:t xml:space="preserve">Materialnamn i film och GIS som räknas som samma (BTG = Betong, PVC/PE/PP = Plast …).</w:t>
+              <w:t xml:space="preserve">Förslag på rätt littera för okända brunnar: en GIS-ledning från den kända brunnen med längd inom så stor andel av filmens föreslås; annars littera med minst så stor namnlikhet (0–1).</w:t>
             </w:r>
           </w:p>
         </w:tc>
@@ -7982,7 +7994,7 @@
               <w:spacing w:after="0"/>
             </w:pPr>
             <w:r>
-              <w:t xml:space="preserve">se skriptet</w:t>
+              <w:t xml:space="preserve">0,15, 0,75</w:t>
             </w:r>
           </w:p>
         </w:tc>
@@ -8016,19 +8028,7 @@
                 <w:szCs w:val="20"/>
                 <w:shd w:fill="F2F2F2" w:val="clear"/>
               </w:rPr>
-              <w:t xml:space="preserve">FOTO_MAX_PX</w:t>
-            </w:r>
-            <w:r>
-              <w:t xml:space="preserve">, </w:t>
-            </w:r>
-            <w:r>
-              <w:rPr>
-                <w:rFonts w:ascii="Consolas" w:cs="Consolas" w:eastAsia="Consolas" w:hAnsi="Consolas"/>
-                <w:sz w:val="20"/>
-                <w:szCs w:val="20"/>
-                <w:shd w:fill="F2F2F2" w:val="clear"/>
-              </w:rPr>
-              <w:t xml:space="preserve">FOTO_JPEG_KVALITET</w:t>
+              <w:t xml:space="preserve">GIS_MATERIAL</w:t>
             </w:r>
           </w:p>
         </w:tc>
@@ -8054,19 +8054,7 @@
               <w:spacing w:after="0"/>
             </w:pPr>
             <w:r>
-              <w:t xml:space="preserve">Fotona i PDF-rapporterna förminskas till högst så många pixlar på längsta sidan (JPEG-kvalitet enligt den andra; 76 ger ~30 % mindre filer än 82 utan synlig skillnad i A4). </w:t>
-            </w:r>
-            <w:r>
-              <w:rPr>
-                <w:rFonts w:ascii="Consolas" w:cs="Consolas" w:eastAsia="Consolas" w:hAnsi="Consolas"/>
-                <w:sz w:val="20"/>
-                <w:szCs w:val="20"/>
-                <w:shd w:fill="F2F2F2" w:val="clear"/>
-              </w:rPr>
-              <w:t xml:space="preserve">None</w:t>
-            </w:r>
-            <w:r>
-              <w:t xml:space="preserve"> = originalstorlek.</w:t>
+              <w:t xml:space="preserve">Materialnamn i film och GIS som räknas som samma (BTG = Betong, PVC/PE/PP = Plast …).</w:t>
             </w:r>
           </w:p>
         </w:tc>
@@ -8092,7 +8080,7 @@
               <w:spacing w:after="0"/>
             </w:pPr>
             <w:r>
-              <w:t xml:space="preserve">960, 76</w:t>
+              <w:t xml:space="preserve">se skriptet</w:t>
             </w:r>
           </w:p>
         </w:tc>
@@ -8125,7 +8113,7 @@
                 <w:szCs w:val="20"/>
                 <w:shd w:fill="F2F2F2" w:val="clear"/>
               </w:rPr>
-              <w:t xml:space="preserve">RAPPORT_BILD_DPI</w:t>
+              <w:t xml:space="preserve">FOTO_MAX_PX</w:t>
             </w:r>
             <w:r>
               <w:t xml:space="preserve">, </w:t>
@@ -8137,7 +8125,7 @@
                 <w:szCs w:val="20"/>
                 <w:shd w:fill="F2F2F2" w:val="clear"/>
               </w:rPr>
-              <w:t xml:space="preserve">RAPPORT_BILD_PALETT</w:t>
+              <w:t xml:space="preserve">FOTO_JPEG_KVALITET</w:t>
             </w:r>
           </w:p>
         </w:tc>
@@ -8162,7 +8150,19 @@
               <w:spacing w:after="0"/>
             </w:pPr>
             <w:r>
-              <w:t xml:space="preserve">Upplösning på översikts- och profilbilden i rapporten, och om de sparas som palett-PNG (256 färger, ca 65 % mindre).</w:t>
+              <w:t xml:space="preserve">Fotona i PDF-rapporterna förminskas till högst så många pixlar på längsta sidan (JPEG-kvalitet enligt den andra; 76 ger ~30 % mindre filer än 82 utan synlig skillnad i A4). </w:t>
+            </w:r>
+            <w:r>
+              <w:rPr>
+                <w:rFonts w:ascii="Consolas" w:cs="Consolas" w:eastAsia="Consolas" w:hAnsi="Consolas"/>
+                <w:sz w:val="20"/>
+                <w:szCs w:val="20"/>
+                <w:shd w:fill="F2F2F2" w:val="clear"/>
+              </w:rPr>
+              <w:t xml:space="preserve">None</w:t>
+            </w:r>
+            <w:r>
+              <w:t xml:space="preserve"> = originalstorlek.</w:t>
             </w:r>
           </w:p>
         </w:tc>
@@ -8187,16 +8187,7 @@
               <w:spacing w:after="0"/>
             </w:pPr>
             <w:r>
-              <w:t xml:space="preserve">150, </w:t>
-            </w:r>
-            <w:r>
-              <w:rPr>
-                <w:rFonts w:ascii="Consolas" w:cs="Consolas" w:eastAsia="Consolas" w:hAnsi="Consolas"/>
-                <w:sz w:val="20"/>
-                <w:szCs w:val="20"/>
-                <w:shd w:fill="F2F2F2" w:val="clear"/>
-              </w:rPr>
-              <w:t xml:space="preserve">True</w:t>
+              <w:t xml:space="preserve">960, 76</w:t>
             </w:r>
           </w:p>
         </w:tc>
@@ -8230,7 +8221,19 @@
                 <w:szCs w:val="20"/>
                 <w:shd w:fill="F2F2F2" w:val="clear"/>
               </w:rPr>
-              <w:t xml:space="preserve">RAPPORT_PROCESSER</w:t>
+              <w:t xml:space="preserve">RAPPORT_BILD_DPI</w:t>
+            </w:r>
+            <w:r>
+              <w:t xml:space="preserve">, </w:t>
+            </w:r>
+            <w:r>
+              <w:rPr>
+                <w:rFonts w:ascii="Consolas" w:cs="Consolas" w:eastAsia="Consolas" w:hAnsi="Consolas"/>
+                <w:sz w:val="20"/>
+                <w:szCs w:val="20"/>
+                <w:shd w:fill="F2F2F2" w:val="clear"/>
+              </w:rPr>
+              <w:t xml:space="preserve">RAPPORT_BILD_PALETT</w:t>
             </w:r>
           </w:p>
         </w:tc>
@@ -8256,31 +8259,7 @@
               <w:spacing w:after="0"/>
             </w:pPr>
             <w:r>
-              <w:t xml:space="preserve">Antal parallella processer för PDF-rapporterna. </w:t>
-            </w:r>
-            <w:r>
-              <w:rPr>
-                <w:rFonts w:ascii="Consolas" w:cs="Consolas" w:eastAsia="Consolas" w:hAnsi="Consolas"/>
-                <w:sz w:val="20"/>
-                <w:szCs w:val="20"/>
-                <w:shd w:fill="F2F2F2" w:val="clear"/>
-              </w:rPr>
-              <w:t xml:space="preserve">None</w:t>
-            </w:r>
-            <w:r>
-              <w:t xml:space="preserve"> = antal kärnor − 1, </w:t>
-            </w:r>
-            <w:r>
-              <w:rPr>
-                <w:rFonts w:ascii="Consolas" w:cs="Consolas" w:eastAsia="Consolas" w:hAnsi="Consolas"/>
-                <w:sz w:val="20"/>
-                <w:szCs w:val="20"/>
-                <w:shd w:fill="F2F2F2" w:val="clear"/>
-              </w:rPr>
-              <w:t xml:space="preserve">1</w:t>
-            </w:r>
-            <w:r>
-              <w:t xml:space="preserve"> = en i taget.</w:t>
+              <w:t xml:space="preserve">Upplösning på översikts- och profilbilden i rapporten, och om de sparas som palett-PNG (256 färger, ca 65 % mindre).</w:t>
             </w:r>
           </w:p>
         </w:tc>
@@ -8306,13 +8285,16 @@
               <w:spacing w:after="0"/>
             </w:pPr>
             <w:r>
-              <w:rPr>
-                <w:rFonts w:ascii="Consolas" w:cs="Consolas" w:eastAsia="Consolas" w:hAnsi="Consolas"/>
-                <w:sz w:val="20"/>
-                <w:szCs w:val="20"/>
-                <w:shd w:fill="F2F2F2" w:val="clear"/>
-              </w:rPr>
-              <w:t xml:space="preserve">None</w:t>
+              <w:t xml:space="preserve">150, </w:t>
+            </w:r>
+            <w:r>
+              <w:rPr>
+                <w:rFonts w:ascii="Consolas" w:cs="Consolas" w:eastAsia="Consolas" w:hAnsi="Consolas"/>
+                <w:sz w:val="20"/>
+                <w:szCs w:val="20"/>
+                <w:shd w:fill="F2F2F2" w:val="clear"/>
+              </w:rPr>
+              <w:t xml:space="preserve">True</w:t>
             </w:r>
           </w:p>
         </w:tc>
@@ -8345,7 +8327,7 @@
                 <w:szCs w:val="20"/>
                 <w:shd w:fill="F2F2F2" w:val="clear"/>
               </w:rPr>
-              <w:t xml:space="preserve">DOLDA_KOLUMNER</w:t>
+              <w:t xml:space="preserve">RAPPORT_PROCESSER</w:t>
             </w:r>
           </w:p>
         </w:tc>
@@ -8370,7 +8352,31 @@
               <w:spacing w:after="0"/>
             </w:pPr>
             <w:r>
-              <w:t xml:space="preserve">Kolumner per flik som döljs som standard i Excel (grupperade, fälls ut med plustecknet ovanför rubrikraden). Rubrik utan enhet. Tom lista = visa allt.</w:t>
+              <w:t xml:space="preserve">Antal parallella processer för PDF-rapporterna. </w:t>
+            </w:r>
+            <w:r>
+              <w:rPr>
+                <w:rFonts w:ascii="Consolas" w:cs="Consolas" w:eastAsia="Consolas" w:hAnsi="Consolas"/>
+                <w:sz w:val="20"/>
+                <w:szCs w:val="20"/>
+                <w:shd w:fill="F2F2F2" w:val="clear"/>
+              </w:rPr>
+              <w:t xml:space="preserve">None</w:t>
+            </w:r>
+            <w:r>
+              <w:t xml:space="preserve"> = antal kärnor − 1, </w:t>
+            </w:r>
+            <w:r>
+              <w:rPr>
+                <w:rFonts w:ascii="Consolas" w:cs="Consolas" w:eastAsia="Consolas" w:hAnsi="Consolas"/>
+                <w:sz w:val="20"/>
+                <w:szCs w:val="20"/>
+                <w:shd w:fill="F2F2F2" w:val="clear"/>
+              </w:rPr>
+              <w:t xml:space="preserve">1</w:t>
+            </w:r>
+            <w:r>
+              <w:t xml:space="preserve"> = en i taget.</w:t>
             </w:r>
           </w:p>
         </w:tc>
@@ -8395,7 +8401,13 @@
               <w:spacing w:after="0"/>
             </w:pPr>
             <w:r>
-              <w:t xml:space="preserve">se skriptet</w:t>
+              <w:rPr>
+                <w:rFonts w:ascii="Consolas" w:cs="Consolas" w:eastAsia="Consolas" w:hAnsi="Consolas"/>
+                <w:sz w:val="20"/>
+                <w:szCs w:val="20"/>
+                <w:shd w:fill="F2F2F2" w:val="clear"/>
+              </w:rPr>
+              <w:t xml:space="preserve">None</w:t>
             </w:r>
           </w:p>
         </w:tc>
@@ -8429,7 +8441,7 @@
                 <w:szCs w:val="20"/>
                 <w:shd w:fill="F2F2F2" w:val="clear"/>
               </w:rPr>
-              <w:t xml:space="preserve">OFULLSTANDIG_ANDEL</w:t>
+              <w:t xml:space="preserve">DOLDA_KOLUMNER</w:t>
             </w:r>
           </w:p>
         </w:tc>
@@ -8455,7 +8467,7 @@
               <w:spacing w:after="0"/>
             </w:pPr>
             <w:r>
-              <w:t xml:space="preserve">Är filmad längd kortare än så gånger kartlängden nådde kameran inte fram; profilen hängs då bara upp i startbrunnen.</w:t>
+              <w:t xml:space="preserve">Kolumner per flik som döljs som standard i Excel (grupperade, fälls ut med plustecknet ovanför rubrikraden). Rubrik utan enhet. Tom lista = visa allt.</w:t>
             </w:r>
           </w:p>
         </w:tc>
@@ -8481,7 +8493,7 @@
               <w:spacing w:after="0"/>
             </w:pPr>
             <w:r>
-              <w:t xml:space="preserve">0,85</w:t>
+              <w:t xml:space="preserve">se skriptet</w:t>
             </w:r>
           </w:p>
         </w:tc>
@@ -8514,7 +8526,7 @@
                 <w:szCs w:val="20"/>
                 <w:shd w:fill="F2F2F2" w:val="clear"/>
               </w:rPr>
-              <w:t xml:space="preserve">SVACKA_MAX_M</w:t>
+              <w:t xml:space="preserve">OFULLSTANDIG_ANDEL</w:t>
             </w:r>
           </w:p>
         </w:tc>
@@ -8539,7 +8551,7 @@
               <w:spacing w:after="0"/>
             </w:pPr>
             <w:r>
-              <w:t xml:space="preserve">Större beräknat svackdjup (m) än så är en inklinometerartefakt: svackan sätts till okänd och profilen markeras osäker.</w:t>
+              <w:t xml:space="preserve">Är filmad längd kortare än så gånger kartlängden nådde kameran inte fram; profilen hängs då bara upp i startbrunnen.</w:t>
             </w:r>
           </w:p>
         </w:tc>
@@ -8564,7 +8576,7 @@
               <w:spacing w:after="0"/>
             </w:pPr>
             <w:r>
-              <w:t xml:space="preserve">1,0</w:t>
+              <w:t xml:space="preserve">0,85</w:t>
             </w:r>
           </w:p>
         </w:tc>
@@ -8598,19 +8610,7 @@
                 <w:szCs w:val="20"/>
                 <w:shd w:fill="F2F2F2" w:val="clear"/>
               </w:rPr>
-              <w:t xml:space="preserve">BAKFALL_MIN_PROMILLE</w:t>
-            </w:r>
-            <w:r>
-              <w:t xml:space="preserve">, </w:t>
-            </w:r>
-            <w:r>
-              <w:rPr>
-                <w:rFonts w:ascii="Consolas" w:cs="Consolas" w:eastAsia="Consolas" w:hAnsi="Consolas"/>
-                <w:sz w:val="20"/>
-                <w:szCs w:val="20"/>
-                <w:shd w:fill="F2F2F2" w:val="clear"/>
-              </w:rPr>
-              <w:t xml:space="preserve">BAKFALL_SEGMENT_MIN_M</w:t>
+              <w:t xml:space="preserve">SVACKA_MAX_M</w:t>
             </w:r>
           </w:p>
         </w:tc>
@@ -8636,7 +8636,7 @@
               <w:spacing w:after="0"/>
             </w:pPr>
             <w:r>
-              <w:t xml:space="preserve">Lutning mot flödet (‰) som räknas som bakfall, och kortaste bakfallssegment (m) som redovisas i kartan.</w:t>
+              <w:t xml:space="preserve">Större beräknat svackdjup (m) än så är en inklinometerartefakt: svackan sätts till okänd och profilen markeras osäker.</w:t>
             </w:r>
           </w:p>
         </w:tc>
@@ -8662,7 +8662,7 @@
               <w:spacing w:after="0"/>
             </w:pPr>
             <w:r>
-              <w:t xml:space="preserve">5; 1</w:t>
+              <w:t xml:space="preserve">1,0</w:t>
             </w:r>
           </w:p>
         </w:tc>
@@ -8695,7 +8695,7 @@
                 <w:szCs w:val="20"/>
                 <w:shd w:fill="F2F2F2" w:val="clear"/>
               </w:rPr>
-              <w:t xml:space="preserve">GIS_SAKNAS_UNDER</w:t>
+              <w:t xml:space="preserve">BAKFALL_MIN_PROMILLE</w:t>
             </w:r>
             <w:r>
               <w:t xml:space="preserve">, </w:t>
@@ -8707,7 +8707,7 @@
                 <w:szCs w:val="20"/>
                 <w:shd w:fill="F2F2F2" w:val="clear"/>
               </w:rPr>
-              <w:t xml:space="preserve">GIS_FALL_ORIMLIGT_M</w:t>
+              <w:t xml:space="preserve">BAKFALL_SEGMENT_MIN_M</w:t>
             </w:r>
           </w:p>
         </w:tc>
@@ -8732,7 +8732,7 @@
               <w:spacing w:after="0"/>
             </w:pPr>
             <w:r>
-              <w:t xml:space="preserve">Vattengång/locknivå i GIS under det första räknas som saknad (SVOA skriver −9999); större fall mellan brunnarna i GIS än det andra (m) flaggas som orimligt i stället för att jämföras med filmen.</w:t>
+              <w:t xml:space="preserve">Lutning mot flödet (‰) som räknas som bakfall, och kortaste bakfallssegment (m) som redovisas i kartan.</w:t>
             </w:r>
           </w:p>
         </w:tc>
@@ -8757,7 +8757,7 @@
               <w:spacing w:after="0"/>
             </w:pPr>
             <w:r>
-              <w:t xml:space="preserve">−999, 50</w:t>
+              <w:t xml:space="preserve">5; 1</w:t>
             </w:r>
           </w:p>
         </w:tc>
@@ -8791,7 +8791,19 @@
                 <w:szCs w:val="20"/>
                 <w:shd w:fill="F2F2F2" w:val="clear"/>
               </w:rPr>
-              <w:t xml:space="preserve">GIS_PLATSHALLARE</w:t>
+              <w:t xml:space="preserve">GIS_SAKNAS_UNDER</w:t>
+            </w:r>
+            <w:r>
+              <w:t xml:space="preserve">, </w:t>
+            </w:r>
+            <w:r>
+              <w:rPr>
+                <w:rFonts w:ascii="Consolas" w:cs="Consolas" w:eastAsia="Consolas" w:hAnsi="Consolas"/>
+                <w:sz w:val="20"/>
+                <w:szCs w:val="20"/>
+                <w:shd w:fill="F2F2F2" w:val="clear"/>
+              </w:rPr>
+              <w:t xml:space="preserve">GIS_FALL_ORIMLIGT_M</w:t>
             </w:r>
           </w:p>
         </w:tc>
@@ -8817,7 +8829,7 @@
               <w:spacing w:after="0"/>
             </w:pPr>
             <w:r>
-              <w:t xml:space="preserve">Littera i TV3-filen som inte är riktiga brunnar och därför inte kontrolleras mot GIS.</w:t>
+              <w:t xml:space="preserve">Vattengång/locknivå i GIS under det första räknas som saknad (SVOA skriver −9999); större fall mellan brunnarna i GIS än det andra (m) flaggas som orimligt i stället för att jämföras med filmen.</w:t>
             </w:r>
           </w:p>
         </w:tc>
@@ -8843,7 +8855,7 @@
               <w:spacing w:after="0"/>
             </w:pPr>
             <w:r>
-              <w:t xml:space="preserve">AG, STBEXTRA</w:t>
+              <w:t xml:space="preserve">−999, 50</w:t>
             </w:r>
           </w:p>
         </w:tc>
@@ -8876,31 +8888,7 @@
                 <w:szCs w:val="20"/>
                 <w:shd w:fill="F2F2F2" w:val="clear"/>
               </w:rPr>
-              <w:t xml:space="preserve">GRENROR_LITTERA</w:t>
-            </w:r>
-            <w:r>
-              <w:t xml:space="preserve">, </w:t>
-            </w:r>
-            <w:r>
-              <w:rPr>
-                <w:rFonts w:ascii="Consolas" w:cs="Consolas" w:eastAsia="Consolas" w:hAnsi="Consolas"/>
-                <w:sz w:val="20"/>
-                <w:szCs w:val="20"/>
-                <w:shd w:fill="F2F2F2" w:val="clear"/>
-              </w:rPr>
-              <w:t xml:space="preserve">ANDE_LITTERA</w:t>
-            </w:r>
-            <w:r>
-              <w:t xml:space="preserve">, </w:t>
-            </w:r>
-            <w:r>
-              <w:rPr>
-                <w:rFonts w:ascii="Consolas" w:cs="Consolas" w:eastAsia="Consolas" w:hAnsi="Consolas"/>
-                <w:sz w:val="20"/>
-                <w:szCs w:val="20"/>
-                <w:shd w:fill="F2F2F2" w:val="clear"/>
-              </w:rPr>
-              <w:t xml:space="preserve">GIS_GRENROR_LANGD_TOL</w:t>
+              <w:t xml:space="preserve">GIS_PLATSHALLARE</w:t>
             </w:r>
           </w:p>
         </w:tc>
@@ -8925,7 +8913,7 @@
               <w:spacing w:after="0"/>
             </w:pPr>
             <w:r>
-              <w:t xml:space="preserve">Reguljära uttryck för littera som betyder anslutning till grenrör respektive ledningsände utan brunn, och hur mycket GIS-ledningen med fri ände får avvika från filmens längd (andel, + 3 m) för att kopplas.</w:t>
+              <w:t xml:space="preserve">Littera i TV3-filen som inte är riktiga brunnar och därför inte kontrolleras mot GIS.</w:t>
             </w:r>
           </w:p>
         </w:tc>
@@ -8950,28 +8938,7 @@
               <w:spacing w:after="0"/>
             </w:pPr>
             <w:r>
-              <w:rPr>
-                <w:rFonts w:ascii="Consolas" w:cs="Consolas" w:eastAsia="Consolas" w:hAnsi="Consolas"/>
-                <w:sz w:val="20"/>
-                <w:szCs w:val="20"/>
-                <w:shd w:fill="F2F2F2" w:val="clear"/>
-              </w:rPr>
-              <w:t xml:space="preserve">^[DSK]?A{1,2}G\d*$</w:t>
-            </w:r>
-            <w:r>
-              <w:t xml:space="preserve">, </w:t>
-            </w:r>
-            <w:r>
-              <w:rPr>
-                <w:rFonts w:ascii="Consolas" w:cs="Consolas" w:eastAsia="Consolas" w:hAnsi="Consolas"/>
-                <w:sz w:val="20"/>
-                <w:szCs w:val="20"/>
-                <w:shd w:fill="F2F2F2" w:val="clear"/>
-              </w:rPr>
-              <w:t xml:space="preserve">^[ÄA]NDE?\d*$</w:t>
-            </w:r>
-            <w:r>
-              <w:t xml:space="preserve">, 0,3</w:t>
+              <w:t xml:space="preserve">AG, STBEXTRA</w:t>
             </w:r>
           </w:p>
         </w:tc>
@@ -9005,7 +8972,31 @@
                 <w:szCs w:val="20"/>
                 <w:shd w:fill="F2F2F2" w:val="clear"/>
               </w:rPr>
-              <w:t xml:space="preserve">RELINAD_SOM_MATERIAL</w:t>
+              <w:t xml:space="preserve">GRENROR_LITTERA</w:t>
+            </w:r>
+            <w:r>
+              <w:t xml:space="preserve">, </w:t>
+            </w:r>
+            <w:r>
+              <w:rPr>
+                <w:rFonts w:ascii="Consolas" w:cs="Consolas" w:eastAsia="Consolas" w:hAnsi="Consolas"/>
+                <w:sz w:val="20"/>
+                <w:szCs w:val="20"/>
+                <w:shd w:fill="F2F2F2" w:val="clear"/>
+              </w:rPr>
+              <w:t xml:space="preserve">ANDE_LITTERA</w:t>
+            </w:r>
+            <w:r>
+              <w:t xml:space="preserve">, </w:t>
+            </w:r>
+            <w:r>
+              <w:rPr>
+                <w:rFonts w:ascii="Consolas" w:cs="Consolas" w:eastAsia="Consolas" w:hAnsi="Consolas"/>
+                <w:sz w:val="20"/>
+                <w:szCs w:val="20"/>
+                <w:shd w:fill="F2F2F2" w:val="clear"/>
+              </w:rPr>
+              <w:t xml:space="preserve">GIS_GRENROR_LANGD_TOL</w:t>
             </w:r>
           </w:p>
         </w:tc>
@@ -9031,7 +9022,7 @@
               <w:spacing w:after="0"/>
             </w:pPr>
             <w:r>
-              <w:t xml:space="preserve">Relinade sträckor redovisas som eget material i fliken Material och diagram 4.</w:t>
+              <w:t xml:space="preserve">Reguljära uttryck för littera som betyder anslutning till grenrör respektive ledningsände utan brunn, och hur mycket GIS-ledningen med fri ände får avvika från filmens längd (andel, + 3 m) för att kopplas.</w:t>
             </w:r>
           </w:p>
         </w:tc>
@@ -9063,7 +9054,22 @@
                 <w:szCs w:val="20"/>
                 <w:shd w:fill="F2F2F2" w:val="clear"/>
               </w:rPr>
-              <w:t xml:space="preserve">True</w:t>
+              <w:t xml:space="preserve">^[DSK]?A{1,2}G\d*$</w:t>
+            </w:r>
+            <w:r>
+              <w:t xml:space="preserve">, </w:t>
+            </w:r>
+            <w:r>
+              <w:rPr>
+                <w:rFonts w:ascii="Consolas" w:cs="Consolas" w:eastAsia="Consolas" w:hAnsi="Consolas"/>
+                <w:sz w:val="20"/>
+                <w:szCs w:val="20"/>
+                <w:shd w:fill="F2F2F2" w:val="clear"/>
+              </w:rPr>
+              <w:t xml:space="preserve">^[ÄA]NDE?\d*$</w:t>
+            </w:r>
+            <w:r>
+              <w:t xml:space="preserve">, 0,3</w:t>
             </w:r>
           </w:p>
         </w:tc>
@@ -9096,31 +9102,7 @@
                 <w:szCs w:val="20"/>
                 <w:shd w:fill="F2F2F2" w:val="clear"/>
               </w:rPr>
-              <w:t xml:space="preserve">BEHALL_RAPPORTER</w:t>
-            </w:r>
-            <w:r>
-              <w:t xml:space="preserve">, </w:t>
-            </w:r>
-            <w:r>
-              <w:rPr>
-                <w:rFonts w:ascii="Consolas" w:cs="Consolas" w:eastAsia="Consolas" w:hAnsi="Consolas"/>
-                <w:sz w:val="20"/>
-                <w:szCs w:val="20"/>
-                <w:shd w:fill="F2F2F2" w:val="clear"/>
-              </w:rPr>
-              <w:t xml:space="preserve">SPARA_DIAGRAM</w:t>
-            </w:r>
-            <w:r>
-              <w:t xml:space="preserve">, </w:t>
-            </w:r>
-            <w:r>
-              <w:rPr>
-                <w:rFonts w:ascii="Consolas" w:cs="Consolas" w:eastAsia="Consolas" w:hAnsi="Consolas"/>
-                <w:sz w:val="20"/>
-                <w:szCs w:val="20"/>
-                <w:shd w:fill="F2F2F2" w:val="clear"/>
-              </w:rPr>
-              <w:t xml:space="preserve">SKRIV_KARTUNDERLAG</w:t>
+              <w:t xml:space="preserve">RELINAD_SOM_MATERIAL</w:t>
             </w:r>
           </w:p>
         </w:tc>
@@ -9145,43 +9127,7 @@
               <w:spacing w:after="0"/>
             </w:pPr>
             <w:r>
-              <w:t xml:space="preserve">Standardvärden för </w:t>
-            </w:r>
-            <w:r>
-              <w:rPr>
-                <w:rFonts w:ascii="Consolas" w:cs="Consolas" w:eastAsia="Consolas" w:hAnsi="Consolas"/>
-                <w:sz w:val="20"/>
-                <w:szCs w:val="20"/>
-                <w:shd w:fill="F2F2F2" w:val="clear"/>
-              </w:rPr>
-              <w:t xml:space="preserve">--behall-rapporter</w:t>
-            </w:r>
-            <w:r>
-              <w:t xml:space="preserve">, </w:t>
-            </w:r>
-            <w:r>
-              <w:rPr>
-                <w:rFonts w:ascii="Consolas" w:cs="Consolas" w:eastAsia="Consolas" w:hAnsi="Consolas"/>
-                <w:sz w:val="20"/>
-                <w:szCs w:val="20"/>
-                <w:shd w:fill="F2F2F2" w:val="clear"/>
-              </w:rPr>
-              <w:t xml:space="preserve">--diagram</w:t>
-            </w:r>
-            <w:r>
-              <w:t xml:space="preserve"> och </w:t>
-            </w:r>
-            <w:r>
-              <w:rPr>
-                <w:rFonts w:ascii="Consolas" w:cs="Consolas" w:eastAsia="Consolas" w:hAnsi="Consolas"/>
-                <w:sz w:val="20"/>
-                <w:szCs w:val="20"/>
-                <w:shd w:fill="F2F2F2" w:val="clear"/>
-              </w:rPr>
-              <w:t xml:space="preserve">--karta</w:t>
-            </w:r>
-            <w:r>
-              <w:t xml:space="preserve">.</w:t>
+              <w:t xml:space="preserve">Relinade sträckor redovisas som eget material i fliken Material och diagram 4.</w:t>
             </w:r>
           </w:p>
         </w:tc>
@@ -9205,30 +9151,6 @@
             <w:pPr>
               <w:spacing w:after="0"/>
             </w:pPr>
-            <w:r>
-              <w:rPr>
-                <w:rFonts w:ascii="Consolas" w:cs="Consolas" w:eastAsia="Consolas" w:hAnsi="Consolas"/>
-                <w:sz w:val="20"/>
-                <w:szCs w:val="20"/>
-                <w:shd w:fill="F2F2F2" w:val="clear"/>
-              </w:rPr>
-              <w:t xml:space="preserve">False</w:t>
-            </w:r>
-            <w:r>
-              <w:t xml:space="preserve">, </w:t>
-            </w:r>
-            <w:r>
-              <w:rPr>
-                <w:rFonts w:ascii="Consolas" w:cs="Consolas" w:eastAsia="Consolas" w:hAnsi="Consolas"/>
-                <w:sz w:val="20"/>
-                <w:szCs w:val="20"/>
-                <w:shd w:fill="F2F2F2" w:val="clear"/>
-              </w:rPr>
-              <w:t xml:space="preserve">False</w:t>
-            </w:r>
-            <w:r>
-              <w:t xml:space="preserve">, </w:t>
-            </w:r>
             <w:r>
               <w:rPr>
                 <w:rFonts w:ascii="Consolas" w:cs="Consolas" w:eastAsia="Consolas" w:hAnsi="Consolas"/>
@@ -9270,7 +9192,31 @@
                 <w:szCs w:val="20"/>
                 <w:shd w:fill="F2F2F2" w:val="clear"/>
               </w:rPr>
-              <w:t xml:space="preserve">KODER</w:t>
+              <w:t xml:space="preserve">BEHALL_RAPPORTER</w:t>
+            </w:r>
+            <w:r>
+              <w:t xml:space="preserve">, </w:t>
+            </w:r>
+            <w:r>
+              <w:rPr>
+                <w:rFonts w:ascii="Consolas" w:cs="Consolas" w:eastAsia="Consolas" w:hAnsi="Consolas"/>
+                <w:sz w:val="20"/>
+                <w:szCs w:val="20"/>
+                <w:shd w:fill="F2F2F2" w:val="clear"/>
+              </w:rPr>
+              <w:t xml:space="preserve">SPARA_DIAGRAM</w:t>
+            </w:r>
+            <w:r>
+              <w:t xml:space="preserve">, </w:t>
+            </w:r>
+            <w:r>
+              <w:rPr>
+                <w:rFonts w:ascii="Consolas" w:cs="Consolas" w:eastAsia="Consolas" w:hAnsi="Consolas"/>
+                <w:sz w:val="20"/>
+                <w:szCs w:val="20"/>
+                <w:shd w:fill="F2F2F2" w:val="clear"/>
+              </w:rPr>
+              <w:t xml:space="preserve">SKRIV_KARTUNDERLAG</w:t>
             </w:r>
           </w:p>
         </w:tc>
@@ -9296,7 +9242,43 @@
               <w:spacing w:after="0"/>
             </w:pPr>
             <w:r>
-              <w:t xml:space="preserve">Skadekoder med klartext och typ (K = konstruktion, D = drift, I = information).</w:t>
+              <w:t xml:space="preserve">Standardvärden för </w:t>
+            </w:r>
+            <w:r>
+              <w:rPr>
+                <w:rFonts w:ascii="Consolas" w:cs="Consolas" w:eastAsia="Consolas" w:hAnsi="Consolas"/>
+                <w:sz w:val="20"/>
+                <w:szCs w:val="20"/>
+                <w:shd w:fill="F2F2F2" w:val="clear"/>
+              </w:rPr>
+              <w:t xml:space="preserve">--behall-rapporter</w:t>
+            </w:r>
+            <w:r>
+              <w:t xml:space="preserve">, </w:t>
+            </w:r>
+            <w:r>
+              <w:rPr>
+                <w:rFonts w:ascii="Consolas" w:cs="Consolas" w:eastAsia="Consolas" w:hAnsi="Consolas"/>
+                <w:sz w:val="20"/>
+                <w:szCs w:val="20"/>
+                <w:shd w:fill="F2F2F2" w:val="clear"/>
+              </w:rPr>
+              <w:t xml:space="preserve">--diagram</w:t>
+            </w:r>
+            <w:r>
+              <w:t xml:space="preserve"> och </w:t>
+            </w:r>
+            <w:r>
+              <w:rPr>
+                <w:rFonts w:ascii="Consolas" w:cs="Consolas" w:eastAsia="Consolas" w:hAnsi="Consolas"/>
+                <w:sz w:val="20"/>
+                <w:szCs w:val="20"/>
+                <w:shd w:fill="F2F2F2" w:val="clear"/>
+              </w:rPr>
+              <w:t xml:space="preserve">--karta</w:t>
+            </w:r>
+            <w:r>
+              <w:t xml:space="preserve">.</w:t>
             </w:r>
           </w:p>
         </w:tc>
@@ -9322,7 +9304,37 @@
               <w:spacing w:after="0"/>
             </w:pPr>
             <w:r>
-              <w:t xml:space="preserve">P93</w:t>
+              <w:rPr>
+                <w:rFonts w:ascii="Consolas" w:cs="Consolas" w:eastAsia="Consolas" w:hAnsi="Consolas"/>
+                <w:sz w:val="20"/>
+                <w:szCs w:val="20"/>
+                <w:shd w:fill="F2F2F2" w:val="clear"/>
+              </w:rPr>
+              <w:t xml:space="preserve">False</w:t>
+            </w:r>
+            <w:r>
+              <w:t xml:space="preserve">, </w:t>
+            </w:r>
+            <w:r>
+              <w:rPr>
+                <w:rFonts w:ascii="Consolas" w:cs="Consolas" w:eastAsia="Consolas" w:hAnsi="Consolas"/>
+                <w:sz w:val="20"/>
+                <w:szCs w:val="20"/>
+                <w:shd w:fill="F2F2F2" w:val="clear"/>
+              </w:rPr>
+              <w:t xml:space="preserve">False</w:t>
+            </w:r>
+            <w:r>
+              <w:t xml:space="preserve">, </w:t>
+            </w:r>
+            <w:r>
+              <w:rPr>
+                <w:rFonts w:ascii="Consolas" w:cs="Consolas" w:eastAsia="Consolas" w:hAnsi="Consolas"/>
+                <w:sz w:val="20"/>
+                <w:szCs w:val="20"/>
+                <w:shd w:fill="F2F2F2" w:val="clear"/>
+              </w:rPr>
+              <w:t xml:space="preserve">True</w:t>
             </w:r>
           </w:p>
         </w:tc>
@@ -9355,6 +9367,90 @@
                 <w:szCs w:val="20"/>
                 <w:shd w:fill="F2F2F2" w:val="clear"/>
               </w:rPr>
+              <w:t xml:space="preserve">KODER</w:t>
+            </w:r>
+          </w:p>
+        </w:tc>
+        <w:tc>
+          <w:tcPr>
+            <w:tcW w:type="dxa" w:w="5000"/>
+            <w:tcBorders>
+              <w:top w:val="single" w:color="BFBFBF" w:sz="4"/>
+              <w:left w:val="single" w:color="BFBFBF" w:sz="4"/>
+              <w:bottom w:val="single" w:color="BFBFBF" w:sz="4"/>
+              <w:right w:val="single" w:color="BFBFBF" w:sz="4"/>
+            </w:tcBorders>
+            <w:tcMar>
+              <w:top w:type="dxa" w:w="60"/>
+              <w:left w:type="dxa" w:w="100"/>
+              <w:bottom w:type="dxa" w:w="60"/>
+              <w:right w:type="dxa" w:w="100"/>
+            </w:tcMar>
+          </w:tcPr>
+          <w:p>
+            <w:pPr>
+              <w:spacing w:after="0"/>
+            </w:pPr>
+            <w:r>
+              <w:t xml:space="preserve">Skadekoder med klartext och typ (K = konstruktion, D = drift, I = information).</w:t>
+            </w:r>
+          </w:p>
+        </w:tc>
+        <w:tc>
+          <w:tcPr>
+            <w:tcW w:type="dxa" w:w="1760"/>
+            <w:tcBorders>
+              <w:top w:val="single" w:color="BFBFBF" w:sz="4"/>
+              <w:left w:val="single" w:color="BFBFBF" w:sz="4"/>
+              <w:bottom w:val="single" w:color="BFBFBF" w:sz="4"/>
+              <w:right w:val="single" w:color="BFBFBF" w:sz="4"/>
+            </w:tcBorders>
+            <w:tcMar>
+              <w:top w:type="dxa" w:w="60"/>
+              <w:left w:type="dxa" w:w="100"/>
+              <w:bottom w:type="dxa" w:w="60"/>
+              <w:right w:type="dxa" w:w="100"/>
+            </w:tcMar>
+          </w:tcPr>
+          <w:p>
+            <w:pPr>
+              <w:spacing w:after="0"/>
+            </w:pPr>
+            <w:r>
+              <w:t xml:space="preserve">P93</w:t>
+            </w:r>
+          </w:p>
+        </w:tc>
+      </w:tr>
+      <w:tr>
+        <w:tc>
+          <w:tcPr>
+            <w:tcW w:type="dxa" w:w="2600"/>
+            <w:tcBorders>
+              <w:top w:val="single" w:color="BFBFBF" w:sz="4"/>
+              <w:left w:val="single" w:color="BFBFBF" w:sz="4"/>
+              <w:bottom w:val="single" w:color="BFBFBF" w:sz="4"/>
+              <w:right w:val="single" w:color="BFBFBF" w:sz="4"/>
+            </w:tcBorders>
+            <w:shd w:fill="F7F9FC" w:val="clear"/>
+            <w:tcMar>
+              <w:top w:type="dxa" w:w="60"/>
+              <w:left w:type="dxa" w:w="100"/>
+              <w:bottom w:type="dxa" w:w="60"/>
+              <w:right w:type="dxa" w:w="100"/>
+            </w:tcMar>
+          </w:tcPr>
+          <w:p>
+            <w:pPr>
+              <w:spacing w:after="0"/>
+            </w:pPr>
+            <w:r>
+              <w:rPr>
+                <w:rFonts w:ascii="Consolas" w:cs="Consolas" w:eastAsia="Consolas" w:hAnsi="Consolas"/>
+                <w:sz w:val="20"/>
+                <w:szCs w:val="20"/>
+                <w:shd w:fill="F2F2F2" w:val="clear"/>
+              </w:rPr>
               <w:t xml:space="preserve">ATTRIBUT</w:t>
             </w:r>
             <w:r>
@@ -9380,6 +9476,7 @@
               <w:bottom w:val="single" w:color="BFBFBF" w:sz="4"/>
               <w:right w:val="single" w:color="BFBFBF" w:sz="4"/>
             </w:tcBorders>
+            <w:shd w:fill="F7F9FC" w:val="clear"/>
             <w:tcMar>
               <w:top w:type="dxa" w:w="60"/>
               <w:left w:type="dxa" w:w="100"/>
@@ -9405,6 +9502,7 @@
               <w:bottom w:val="single" w:color="BFBFBF" w:sz="4"/>
               <w:right w:val="single" w:color="BFBFBF" w:sz="4"/>
             </w:tcBorders>
+            <w:shd w:fill="F7F9FC" w:val="clear"/>
             <w:tcMar>
               <w:top w:type="dxa" w:w="60"/>
               <w:left w:type="dxa" w:w="100"/>
@@ -15640,6 +15738,33 @@
       </w:r>
       <w:r>
         <w:t xml:space="preserve">) och i sträcksidorna i PowerPoint, och fliken Sammanfattning summerar hur många som förvärrats, förbättrats eller är oförändrade. Är den nya filmen ofullständig (avbruten) gäller den ändå, men den ersatta raden får en OBS med båda längderna. Två filmer med samma datum i olika filer antas vara samma film i två exporter: en räknas, den andra markeras *samma datum – dubblett?*. Saknar filmerna tolkbart datum kan de inte ordnas – båda räknas och en OBS skrivs i konsolen.</w:t>
+      </w:r>
+    </w:p>
+    <w:p>
+      <w:pPr>
+        <w:spacing w:after="120"/>
+      </w:pPr>
+      <w:r>
+        <w:rPr>
+          <w:b/>
+          <w:bCs/>
+        </w:rPr>
+        <w:t xml:space="preserve">En sträcka filmad från två håll med avbrott i mitten, men filmerna ligger i olika TV3-filer</w:t>
+      </w:r>
+      <w:r>
+        <w:t xml:space="preserve"> (t.ex. *DUF 700 Del 4* och *DUF 700 Ålsten Del 5*). Är båda filmerna avbrutna, den ena från startbrunnen och den andra från slutbrunnen, och filmade inom ett år från varandra (</w:t>
+      </w:r>
+      <w:r>
+        <w:rPr>
+          <w:rFonts w:ascii="Consolas" w:cs="Consolas" w:eastAsia="Consolas" w:hAnsi="Consolas"/>
+          <w:sz w:val="20"/>
+          <w:szCs w:val="20"/>
+          <w:shd w:fill="F2F2F2" w:val="clear"/>
+        </w:rPr>
+        <w:t xml:space="preserve">SAMMANSLAGNING_MAX_DAGAR</w:t>
+      </w:r>
+      <w:r>
+        <w:t xml:space="preserve">, 365 dagar) slås de ihop precis som två delfilmer i samma fil. Den sammanslagna sträckan hamnar i filen med filmen från startbrunnen och får ett nytt nummer där. Filmstatus, observationernas kommentar och översiktsritningen anger vilken fil varje delfilm kommer från, och protokollets rad TV3-fil visar båda filerna. Ligger filmerna mer än ett år isär räknas den nyare som en ny inspektion (frågan ovan). Konsolen listar de brunnspar som slagits ihop över filgränser.</w:t>
       </w:r>
     </w:p>
     <w:p>

</xml_diff>

<commit_message>
Exportera område: VA-nät inom polygoner till lokal filgeodatabas
Steg 1 i PLAN_ledningsinventering.md. Nytt ArcMap-verktyg och modulen
omrade_export: hela objekt som berör områdespolygonerna (valda om några
är valda, buffert valfri) kopieras per källager till <mapp>/<namn>.gdb
med alla fält plus OMRADE, KORSAR_GRANS och KALLAGER; lagren läggs i
kartan med källagrets symbologi; export_info.json beskriver exporten.
Planen uppdaterad med användarens beslut F11–F17, handledning 7.13.

Co-Authored-By: Claude Fable 5.1 <noreply@anthropic.com>
Claude-Session: https://claude.ai/code/session_011fdqX3JEZje1LF9LqpaqR8
</commit_message>
<xml_diff>
--- a/Anvandarhandledning tv3_analys.docx
+++ b/Anvandarhandledning tv3_analys.docx
@@ -11615,6 +11615,26 @@
     </w:p>
     <w:p>
       <w:pPr>
+        <w:pStyle w:val="ListParagraph"/>
+        <w:numPr>
+          <w:ilvl w:val="0"/>
+          <w:numId w:val="3"/>
+        </w:numPr>
+        <w:spacing w:after="80"/>
+      </w:pPr>
+      <w:r>
+        <w:rPr>
+          <w:b/>
+          <w:bCs/>
+        </w:rPr>
+        <w:t xml:space="preserve">Exportera område</w:t>
+      </w:r>
+      <w:r>
+        <w:t xml:space="preserve"> – kopierar allt VA-nät inom valda polygoner till en lokal filgeodatabas (avsnitt 7.13); första steget i ledningsinventeringen.</w:t>
+      </w:r>
+    </w:p>
+    <w:p>
+      <w:pPr>
         <w:spacing w:after="120"/>
       </w:pPr>
       <w:r>
@@ -15420,6 +15440,191 @@
     </w:p>
     <w:p>
       <w:pPr>
+        <w:pStyle w:val="Heading2"/>
+      </w:pPr>
+      <w:r>
+        <w:t xml:space="preserve">7.13 Exportera område – lokala lager att arbeta med</w:t>
+      </w:r>
+    </w:p>
+    <w:p>
+      <w:pPr>
+        <w:spacing w:after="120"/>
+      </w:pPr>
+      <w:r>
+        <w:t xml:space="preserve">Första steget i ledningsinventeringen (</w:t>
+      </w:r>
+      <w:r>
+        <w:rPr>
+          <w:rFonts w:ascii="Consolas" w:cs="Consolas" w:eastAsia="Consolas" w:hAnsi="Consolas"/>
+          <w:sz w:val="20"/>
+          <w:szCs w:val="20"/>
+          <w:shd w:fill="F2F2F2" w:val="clear"/>
+        </w:rPr>
+        <w:t xml:space="preserve">PLAN_ledningsinventering.md</w:t>
+      </w:r>
+      <w:r>
+        <w:t xml:space="preserve">). Verktyget </w:t>
+      </w:r>
+      <w:r>
+        <w:rPr>
+          <w:b/>
+          <w:bCs/>
+        </w:rPr>
+        <w:t xml:space="preserve">Exportera område</w:t>
+      </w:r>
+      <w:r>
+        <w:t xml:space="preserve"> kopierar alla VA-objekt som berör ett eller flera områden till en lokal filgeodatabas, så att inventering, profiler och kartor kan köras utan kontakt med databasen. Dialogen: områdeslager (polygoner – är några polygoner valda i kartan används bara de), fältet med områdets namn (gissas: NAMN, OMRADE, DUF …), lagren att exportera (förvalt: alla featurelager under grupperna *Avlopp* och *Vatten*), utdatamapp, geodatabasens namn, buffert i meter och om de lokala lagren ska läggas i kartan.</w:t>
+      </w:r>
+    </w:p>
+    <w:p>
+      <w:pPr>
+        <w:pStyle w:val="ListParagraph"/>
+        <w:numPr>
+          <w:ilvl w:val="0"/>
+          <w:numId w:val="3"/>
+        </w:numPr>
+        <w:spacing w:after="80"/>
+      </w:pPr>
+      <w:r>
+        <w:rPr>
+          <w:b/>
+          <w:bCs/>
+        </w:rPr>
+        <w:t xml:space="preserve">Hela objekt kopieras, inte klippta.</w:t>
+      </w:r>
+      <w:r>
+        <w:t xml:space="preserve"> Längder, vattengångar och brunnspar förblir riktiga. Varje objekt får fälten </w:t>
+      </w:r>
+      <w:r>
+        <w:rPr>
+          <w:rFonts w:ascii="Consolas" w:cs="Consolas" w:eastAsia="Consolas" w:hAnsi="Consolas"/>
+          <w:sz w:val="20"/>
+          <w:szCs w:val="20"/>
+          <w:shd w:fill="F2F2F2" w:val="clear"/>
+        </w:rPr>
+        <w:t xml:space="preserve">OMRADE</w:t>
+      </w:r>
+      <w:r>
+        <w:t xml:space="preserve"> (polygonens namn, flera med </w:t>
+      </w:r>
+      <w:r>
+        <w:rPr>
+          <w:rFonts w:ascii="Consolas" w:cs="Consolas" w:eastAsia="Consolas" w:hAnsi="Consolas"/>
+          <w:sz w:val="20"/>
+          <w:szCs w:val="20"/>
+          <w:shd w:fill="F2F2F2" w:val="clear"/>
+        </w:rPr>
+        <w:t xml:space="preserve">;</w:t>
+      </w:r>
+      <w:r>
+        <w:t xml:space="preserve">), </w:t>
+      </w:r>
+      <w:r>
+        <w:rPr>
+          <w:rFonts w:ascii="Consolas" w:cs="Consolas" w:eastAsia="Consolas" w:hAnsi="Consolas"/>
+          <w:sz w:val="20"/>
+          <w:szCs w:val="20"/>
+          <w:shd w:fill="F2F2F2" w:val="clear"/>
+        </w:rPr>
+        <w:t xml:space="preserve">KORSAR_GRANS</w:t>
+      </w:r>
+      <w:r>
+        <w:t xml:space="preserve"> (1 när objektet sticker ut ur området) och </w:t>
+      </w:r>
+      <w:r>
+        <w:rPr>
+          <w:rFonts w:ascii="Consolas" w:cs="Consolas" w:eastAsia="Consolas" w:hAnsi="Consolas"/>
+          <w:sz w:val="20"/>
+          <w:szCs w:val="20"/>
+          <w:shd w:fill="F2F2F2" w:val="clear"/>
+        </w:rPr>
+        <w:t xml:space="preserve">KALLAGER</w:t>
+      </w:r>
+      <w:r>
+        <w:t xml:space="preserve"> (källagrets namn) utöver alla originalfält.</w:t>
+      </w:r>
+    </w:p>
+    <w:p>
+      <w:pPr>
+        <w:pStyle w:val="ListParagraph"/>
+        <w:numPr>
+          <w:ilvl w:val="0"/>
+          <w:numId w:val="3"/>
+        </w:numPr>
+        <w:spacing w:after="80"/>
+      </w:pPr>
+      <w:r>
+        <w:rPr>
+          <w:b/>
+          <w:bCs/>
+        </w:rPr>
+        <w:t xml:space="preserve">Buffert.</w:t>
+      </w:r>
+      <w:r>
+        <w:t xml:space="preserve"> Med t.ex. 5 m tas även objekt strax utanför området med, så att nätet hänger ihop vid gränsen (serviser och parallella ledningar till en gränsledning). Objekt som bara ligger i bufferten får tomt </w:t>
+      </w:r>
+      <w:r>
+        <w:rPr>
+          <w:rFonts w:ascii="Consolas" w:cs="Consolas" w:eastAsia="Consolas" w:hAnsi="Consolas"/>
+          <w:sz w:val="20"/>
+          <w:szCs w:val="20"/>
+          <w:shd w:fill="F2F2F2" w:val="clear"/>
+        </w:rPr>
+        <w:t xml:space="preserve">OMRADE</w:t>
+      </w:r>
+      <w:r>
+        <w:t xml:space="preserve"> och </w:t>
+      </w:r>
+      <w:r>
+        <w:rPr>
+          <w:rFonts w:ascii="Consolas" w:cs="Consolas" w:eastAsia="Consolas" w:hAnsi="Consolas"/>
+          <w:sz w:val="20"/>
+          <w:szCs w:val="20"/>
+          <w:shd w:fill="F2F2F2" w:val="clear"/>
+        </w:rPr>
+        <w:t xml:space="preserve">KORSAR_GRANS</w:t>
+      </w:r>
+      <w:r>
+        <w:t xml:space="preserve"> = 1.</w:t>
+      </w:r>
+    </w:p>
+    <w:p>
+      <w:pPr>
+        <w:pStyle w:val="ListParagraph"/>
+        <w:numPr>
+          <w:ilvl w:val="0"/>
+          <w:numId w:val="3"/>
+        </w:numPr>
+        <w:spacing w:after="80"/>
+      </w:pPr>
+      <w:r>
+        <w:t xml:space="preserve">Lagren får källagrets namn med tillägget *(lokal)* i kartan och källagrets symbologi. Lagrens definitionsfrågor följer med i urvalet. Befintliga lager med samma namn i geodatabasen skrivs över, och det gamla lagret tas bort ur kartan först.</w:t>
+      </w:r>
+    </w:p>
+    <w:p>
+      <w:pPr>
+        <w:pStyle w:val="ListParagraph"/>
+        <w:numPr>
+          <w:ilvl w:val="0"/>
+          <w:numId w:val="3"/>
+        </w:numPr>
+        <w:spacing w:after="80"/>
+      </w:pPr>
+      <w:r>
+        <w:rPr>
+          <w:rFonts w:ascii="Consolas" w:cs="Consolas" w:eastAsia="Consolas" w:hAnsi="Consolas"/>
+          <w:sz w:val="20"/>
+          <w:szCs w:val="20"/>
+          <w:shd w:fill="F2F2F2" w:val="clear"/>
+        </w:rPr>
+        <w:t xml:space="preserve">export_info.json</w:t>
+      </w:r>
+      <w:r>
+        <w:t xml:space="preserve"> i mappen anger datum, områden, lager, antal objekt per lager, hur många som korsar gränsen och koordinatsystemet – de senare verktygen läser den.</w:t>
+      </w:r>
+    </w:p>
+    <w:p>
+      <w:pPr>
         <w:pStyle w:val="Heading1"/>
       </w:pPr>
       <w:r>
@@ -16000,14 +16205,77 @@
         <w:szCs w:val="18"/>
       </w:rPr>
       <w:t xml:space="preserve">Sida </w:t>
+    </w:r>
+    <w:r>
+      <w:rPr>
+        <w:color w:val="898781"/>
+        <w:sz w:val="18"/>
+        <w:szCs w:val="18"/>
+      </w:rPr>
       <w:fldChar w:fldCharType="begin"/>
+    </w:r>
+    <w:r>
+      <w:rPr>
+        <w:color w:val="898781"/>
+        <w:sz w:val="18"/>
+        <w:szCs w:val="18"/>
+      </w:rPr>
       <w:instrText xml:space="preserve">PAGE</w:instrText>
+    </w:r>
+    <w:r>
+      <w:rPr>
+        <w:color w:val="898781"/>
+        <w:sz w:val="18"/>
+        <w:szCs w:val="18"/>
+      </w:rPr>
       <w:fldChar w:fldCharType="separate"/>
+    </w:r>
+    <w:r>
+      <w:rPr>
+        <w:color w:val="898781"/>
+        <w:sz w:val="18"/>
+        <w:szCs w:val="18"/>
+      </w:rPr>
       <w:fldChar w:fldCharType="end"/>
+    </w:r>
+    <w:r>
+      <w:rPr>
+        <w:color w:val="898781"/>
+        <w:sz w:val="18"/>
+        <w:szCs w:val="18"/>
+      </w:rPr>
       <w:t xml:space="preserve"> av </w:t>
+    </w:r>
+    <w:r>
+      <w:rPr>
+        <w:color w:val="898781"/>
+        <w:sz w:val="18"/>
+        <w:szCs w:val="18"/>
+      </w:rPr>
       <w:fldChar w:fldCharType="begin"/>
+    </w:r>
+    <w:r>
+      <w:rPr>
+        <w:color w:val="898781"/>
+        <w:sz w:val="18"/>
+        <w:szCs w:val="18"/>
+      </w:rPr>
       <w:instrText xml:space="preserve">NUMPAGES</w:instrText>
+    </w:r>
+    <w:r>
+      <w:rPr>
+        <w:color w:val="898781"/>
+        <w:sz w:val="18"/>
+        <w:szCs w:val="18"/>
+      </w:rPr>
       <w:fldChar w:fldCharType="separate"/>
+    </w:r>
+    <w:r>
+      <w:rPr>
+        <w:color w:val="898781"/>
+        <w:sz w:val="18"/>
+        <w:szCs w:val="18"/>
+      </w:rPr>
       <w:fldChar w:fldCharType="end"/>
     </w:r>
   </w:p>

</xml_diff>

<commit_message>
Ledningsinventering: ventiler, brandposter och anordningar per ledning
Efter användarens fältlista för vattenlagren (PLAN F10):
- inventering.py läser punktlager med anordningar, kategoriserar dem ur
  lagernamn och typkod, kopplar dem till närmaste ledning av rätt slag
  (servisventiler och brandposter via servisen) och räknar per ledning
  (merparten av modulkoden kom av misstag med i föregående commit).
- Verktyget får lagerparametern och avståndet; förvalen klassar de lokala
  lagren på namn och geometri (V Huvudledning hamnade förut bland
  avloppsledningarna, V Servisventil bland serviserna).
- ledning_analys: en ventilgrop per ventil och brandpost vid rörspräckning,
  kolumner, flik Anordningar och sammanfattningsblock.

Co-Authored-By: Claude Opus 5.5 <noreply@anthropic.com>
Claude-Session: https://claude.ai/code/session_011fdqX3JEZje1LF9LqpaqR8
</commit_message>
<xml_diff>
--- a/Anvandarhandledning tv3_analys.docx
+++ b/Anvandarhandledning tv3_analys.docx
@@ -15758,6 +15758,18 @@
         <w:t xml:space="preserve">_parallella.csv</w:t>
       </w:r>
       <w:r>
+        <w:t xml:space="preserve">, </w:t>
+      </w:r>
+      <w:r>
+        <w:rPr>
+          <w:rFonts w:ascii="Consolas" w:cs="Consolas" w:eastAsia="Consolas" w:hAnsi="Consolas"/>
+          <w:sz w:val="20"/>
+          <w:szCs w:val="20"/>
+          <w:shd w:fill="F2F2F2" w:val="clear"/>
+        </w:rPr>
+        <w:t xml:space="preserve">_korsningar.csv</w:t>
+      </w:r>
+      <w:r>
         <w:t xml:space="preserve"> och </w:t>
       </w:r>
       <w:r>
@@ -15767,7 +15779,7 @@
           <w:szCs w:val="20"/>
           <w:shd w:fill="F2F2F2" w:val="clear"/>
         </w:rPr>
-        <w:t xml:space="preserve">_korsningar.csv</w:t>
+        <w:t xml:space="preserve">_anordningar.csv</w:t>
       </w:r>
       <w:r>
         <w:t xml:space="preserve"> för en snabb titt i Excel (semikolon, decimalkomma). Filen har samma uppbyggnad som </w:t>
@@ -15806,7 +15818,7 @@
         <w:t xml:space="preserve">gis:</w:t>
       </w:r>
       <w:r>
-        <w:t xml:space="preserve"> också, och är underlaget för Excel- och kostnadsverktyget i nästa steg. Dialogen: ledningslager (avlopp), vattenledningar, brunnslager, servislager, brunnsfält, utdata; under *Fält* gissas SVOA:s fältnamn (LevelFrom/LevelTo, PipeDimension, PipeMaterial, PipeType, ConstructionYear, RestorationYear, Slope, EntityID; CoverLevel, BottomLevel, WellFunction); under *Markhöjd* väljs höjdmodellen (raster) eller ett punktlager med höjder; under *Inställningar* tolerans, parallellavstånd, andel för samschakt, provtäthet, vattenledningarnas schablondjup, område och höjdsystem.</w:t>
+        <w:t xml:space="preserve"> också, och är underlaget för Excel- och kostnadsverktyget i nästa steg. Dialogen: ledningslager (avlopp), vattenledningar, brunnslager, servislager, brunnsfält, utdata, anordningar (ventiler, brandposter m.m.); under *Fält* gissas SVOA:s fältnamn (LevelFrom/LevelTo, PipeDimension, PipeMaterial, PipeType, ConstructionYear, RestorationYear, Slope, EntityID; CoverLevel, BottomLevel, WellFunction); under *Markhöjd* väljs höjdmodellen (raster) eller ett punktlager med höjder; under *Inställningar* tolerans, parallellavstånd, andel för samschakt, provtäthet, vattenledningarnas schablondjup, område och höjdsystem.</w:t>
       </w:r>
     </w:p>
     <w:p>
@@ -16023,80 +16035,22 @@
           <w:b/>
           <w:bCs/>
         </w:rPr>
-        <w:t xml:space="preserve">Parallella ledningar och samschakt.</w:t>
-      </w:r>
-      <w:r>
-        <w:t xml:space="preserve"> Varje ledning provas var 1 m mot alla andra ledningar inom parallellavståndet (3,0 m c–c). Per par: andel av vardera ledningens längd med den andra inom avståndet, medelavstånd och gemensam längd. Har någon av de två minst 60 % (</w:t>
-      </w:r>
-      <w:r>
-        <w:rPr>
-          <w:rFonts w:ascii="Consolas" w:cs="Consolas" w:eastAsia="Consolas" w:hAnsi="Consolas"/>
-          <w:sz w:val="20"/>
-          <w:szCs w:val="20"/>
-          <w:shd w:fill="F2F2F2" w:val="clear"/>
-        </w:rPr>
-        <w:t xml:space="preserve">parallell_andel</w:t>
-      </w:r>
-      <w:r>
-        <w:t xml:space="preserve">) räknas paret som samschakt, och sammanhängande par bildar en </w:t>
-      </w:r>
-      <w:r>
-        <w:rPr>
-          <w:b/>
-          <w:bCs/>
-        </w:rPr>
-        <w:t xml:space="preserve">schaktgrupp</w:t>
-      </w:r>
-      <w:r>
-        <w:t xml:space="preserve"> (</w:t>
-      </w:r>
-      <w:r>
-        <w:rPr>
-          <w:rFonts w:ascii="Consolas" w:cs="Consolas" w:eastAsia="Consolas" w:hAnsi="Consolas"/>
-          <w:sz w:val="20"/>
-          <w:szCs w:val="20"/>
-          <w:shd w:fill="F2F2F2" w:val="clear"/>
-        </w:rPr>
-        <w:t xml:space="preserve">schaktgrupp</w:t>
-      </w:r>
-      <w:r>
-        <w:t xml:space="preserve">, </w:t>
-      </w:r>
-      <w:r>
-        <w:rPr>
-          <w:rFonts w:ascii="Consolas" w:cs="Consolas" w:eastAsia="Consolas" w:hAnsi="Consolas"/>
-          <w:sz w:val="20"/>
-          <w:szCs w:val="20"/>
-          <w:shd w:fill="F2F2F2" w:val="clear"/>
-        </w:rPr>
-        <w:t xml:space="preserve">schakt_system</w:t>
-      </w:r>
-      <w:r>
-        <w:t xml:space="preserve"> t.ex. *D+S+V*, </w:t>
-      </w:r>
-      <w:r>
-        <w:rPr>
-          <w:rFonts w:ascii="Consolas" w:cs="Consolas" w:eastAsia="Consolas" w:hAnsi="Consolas"/>
-          <w:sz w:val="20"/>
-          <w:szCs w:val="20"/>
-          <w:shd w:fill="F2F2F2" w:val="clear"/>
-        </w:rPr>
-        <w:t xml:space="preserve">schakt_antal</w:t>
-      </w:r>
-      <w:r>
-        <w:t xml:space="preserve">, </w:t>
-      </w:r>
-      <w:r>
-        <w:rPr>
-          <w:rFonts w:ascii="Consolas" w:cs="Consolas" w:eastAsia="Consolas" w:hAnsi="Consolas"/>
-          <w:sz w:val="20"/>
-          <w:szCs w:val="20"/>
-          <w:shd w:fill="F2F2F2" w:val="clear"/>
-        </w:rPr>
-        <w:t xml:space="preserve">schakt_ledningar</w:t>
-      </w:r>
-      <w:r>
-        <w:t xml:space="preserve">) – det som kostnadsdatabasen behöver för 1, 2 eller 3 ledningar i samma grav. Anslutningar i gemensam brunn och korsningar räknas inte som parallella (par under 20 % listas inte).</w:t>
+        <w:t xml:space="preserve">Anordningar</w:t>
+      </w:r>
+      <w:r>
+        <w:t xml:space="preserve"> – ventiler, servisventiler, brandposter, övriga anordningar (t.ex. förgreningar och reduktioner) och ledningsändar ur punktlagren. Kategorin tas ur lagernamnet (*V Ventil (ej servisventil)*, *V Servisventil*, *V Brandpost*, *V Anordning*, *V Ledningsände* …) och typkoden ur ValveFunction/HydrantType/ApplianceType/PipeEndType. Varje anordning kopplas till närmaste ledning av rätt slag inom 3 m (lager i gruppen Vatten eller med V-prefix till vattenledningar, A-lager till avlopp); servisventiler och brandposter kopplas via servisen eller brandpostledningen när den ligger närmare. Per ledning: antal per kategori. Samma objekt i två lager (t.ex. *V Brandpost* och *V Brandpost Avstängningskarta*) räknas en gång; anordningar utan ledning listas under </w:t>
+      </w:r>
+      <w:r>
+        <w:rPr>
+          <w:rFonts w:ascii="Consolas" w:cs="Consolas" w:eastAsia="Consolas" w:hAnsi="Consolas"/>
+          <w:sz w:val="20"/>
+          <w:szCs w:val="20"/>
+          <w:shd w:fill="F2F2F2" w:val="clear"/>
+        </w:rPr>
+        <w:t xml:space="preserve">datakvalitet</w:t>
+      </w:r>
+      <w:r>
+        <w:t xml:space="preserve">. I dialogen förväljs de lokala punktlagren med ventil, brandpost, anordning eller ledningsände i namnet.</w:t>
       </w:r>
     </w:p>
     <w:p>
@@ -16113,10 +16067,80 @@
           <w:b/>
           <w:bCs/>
         </w:rPr>
-        <w:t xml:space="preserve">Korsningar</w:t>
-      </w:r>
-      <w:r>
-        <w:t xml:space="preserve"> med andra ledningar (geometrisk skärning, inte i gemensam brunn eller ände): läge längs båda ledningarna, nivå på båda (vattengång, för vatten markhöjd minus schablondjup) och höjdskillnaden – styr schaktdjupet vid en omläggning.</w:t>
+        <w:t xml:space="preserve">Parallella ledningar och samschakt.</w:t>
+      </w:r>
+      <w:r>
+        <w:t xml:space="preserve"> Varje ledning provas var 1 m mot alla andra ledningar inom parallellavståndet (3,0 m c–c). Per par: andel av vardera ledningens längd med den andra inom avståndet, medelavstånd och gemensam längd. Har någon av de två minst 60 % (</w:t>
+      </w:r>
+      <w:r>
+        <w:rPr>
+          <w:rFonts w:ascii="Consolas" w:cs="Consolas" w:eastAsia="Consolas" w:hAnsi="Consolas"/>
+          <w:sz w:val="20"/>
+          <w:szCs w:val="20"/>
+          <w:shd w:fill="F2F2F2" w:val="clear"/>
+        </w:rPr>
+        <w:t xml:space="preserve">parallell_andel</w:t>
+      </w:r>
+      <w:r>
+        <w:t xml:space="preserve">) räknas paret som samschakt, och sammanhängande par bildar en </w:t>
+      </w:r>
+      <w:r>
+        <w:rPr>
+          <w:b/>
+          <w:bCs/>
+        </w:rPr>
+        <w:t xml:space="preserve">schaktgrupp</w:t>
+      </w:r>
+      <w:r>
+        <w:t xml:space="preserve"> (</w:t>
+      </w:r>
+      <w:r>
+        <w:rPr>
+          <w:rFonts w:ascii="Consolas" w:cs="Consolas" w:eastAsia="Consolas" w:hAnsi="Consolas"/>
+          <w:sz w:val="20"/>
+          <w:szCs w:val="20"/>
+          <w:shd w:fill="F2F2F2" w:val="clear"/>
+        </w:rPr>
+        <w:t xml:space="preserve">schaktgrupp</w:t>
+      </w:r>
+      <w:r>
+        <w:t xml:space="preserve">, </w:t>
+      </w:r>
+      <w:r>
+        <w:rPr>
+          <w:rFonts w:ascii="Consolas" w:cs="Consolas" w:eastAsia="Consolas" w:hAnsi="Consolas"/>
+          <w:sz w:val="20"/>
+          <w:szCs w:val="20"/>
+          <w:shd w:fill="F2F2F2" w:val="clear"/>
+        </w:rPr>
+        <w:t xml:space="preserve">schakt_system</w:t>
+      </w:r>
+      <w:r>
+        <w:t xml:space="preserve"> t.ex. *D+S+V*, </w:t>
+      </w:r>
+      <w:r>
+        <w:rPr>
+          <w:rFonts w:ascii="Consolas" w:cs="Consolas" w:eastAsia="Consolas" w:hAnsi="Consolas"/>
+          <w:sz w:val="20"/>
+          <w:szCs w:val="20"/>
+          <w:shd w:fill="F2F2F2" w:val="clear"/>
+        </w:rPr>
+        <w:t xml:space="preserve">schakt_antal</w:t>
+      </w:r>
+      <w:r>
+        <w:t xml:space="preserve">, </w:t>
+      </w:r>
+      <w:r>
+        <w:rPr>
+          <w:rFonts w:ascii="Consolas" w:cs="Consolas" w:eastAsia="Consolas" w:hAnsi="Consolas"/>
+          <w:sz w:val="20"/>
+          <w:szCs w:val="20"/>
+          <w:shd w:fill="F2F2F2" w:val="clear"/>
+        </w:rPr>
+        <w:t xml:space="preserve">schakt_ledningar</w:t>
+      </w:r>
+      <w:r>
+        <w:t xml:space="preserve">) – det som kostnadsdatabasen behöver för 1, 2 eller 3 ledningar i samma grav. Anslutningar i gemensam brunn och korsningar räknas inte som parallella (par under 20 % listas inte).</w:t>
       </w:r>
     </w:p>
     <w:p>
@@ -16133,22 +16157,10 @@
           <w:b/>
           <w:bCs/>
         </w:rPr>
-        <w:t xml:space="preserve">Brunnar</w:t>
-      </w:r>
-      <w:r>
-        <w:t xml:space="preserve">: locknivå, bottennivå, antal anslutna ledningar, lägsta vattengång och djup (lock minus lägsta vattengång, annars lock minus botten) samt alla fält. Brunnar utan ledning och utan locknivå listas under </w:t>
-      </w:r>
-      <w:r>
-        <w:rPr>
-          <w:rFonts w:ascii="Consolas" w:cs="Consolas" w:eastAsia="Consolas" w:hAnsi="Consolas"/>
-          <w:sz w:val="20"/>
-          <w:szCs w:val="20"/>
-          <w:shd w:fill="F2F2F2" w:val="clear"/>
-        </w:rPr>
-        <w:t xml:space="preserve">datakvalitet</w:t>
-      </w:r>
-      <w:r>
-        <w:t xml:space="preserve">, liksom ledningarnas flaggor.</w:t>
+        <w:t xml:space="preserve">Korsningar</w:t>
+      </w:r>
+      <w:r>
+        <w:t xml:space="preserve"> med andra ledningar (geometrisk skärning, inte i gemensam brunn eller ände): läge längs båda ledningarna, nivå på båda (vattengång, för vatten markhöjd minus schablondjup) och höjdskillnaden – styr schaktdjupet vid en omläggning.</w:t>
       </w:r>
     </w:p>
     <w:p>
@@ -16161,185 +16173,26 @@
         <w:spacing w:after="80"/>
       </w:pPr>
       <w:r>
-        <w:t xml:space="preserve">Grunderna sitter överst i </w:t>
-      </w:r>
-      <w:r>
-        <w:rPr>
-          <w:rFonts w:ascii="Consolas" w:cs="Consolas" w:eastAsia="Consolas" w:hAnsi="Consolas"/>
-          <w:sz w:val="20"/>
-          <w:szCs w:val="20"/>
-          <w:shd w:fill="F2F2F2" w:val="clear"/>
-        </w:rPr>
-        <w:t xml:space="preserve">arcmap/moduler/inventering.py</w:t>
-      </w:r>
-      <w:r>
-        <w:t xml:space="preserve">: </w:t>
-      </w:r>
-      <w:r>
-        <w:rPr>
-          <w:rFonts w:ascii="Consolas" w:cs="Consolas" w:eastAsia="Consolas" w:hAnsi="Consolas"/>
-          <w:sz w:val="20"/>
-          <w:szCs w:val="20"/>
-          <w:shd w:fill="F2F2F2" w:val="clear"/>
-        </w:rPr>
-        <w:t xml:space="preserve">FLACK_PROMILLE</w:t>
-      </w:r>
-      <w:r>
-        <w:t xml:space="preserve"> 2, </w:t>
-      </w:r>
-      <w:r>
-        <w:rPr>
-          <w:rFonts w:ascii="Consolas" w:cs="Consolas" w:eastAsia="Consolas" w:hAnsi="Consolas"/>
-          <w:sz w:val="20"/>
-          <w:szCs w:val="20"/>
-          <w:shd w:fill="F2F2F2" w:val="clear"/>
-        </w:rPr>
-        <w:t xml:space="preserve">ORIMLIG_PROMILLE</w:t>
-      </w:r>
-      <w:r>
-        <w:t xml:space="preserve"> 200, </w:t>
-      </w:r>
-      <w:r>
-        <w:rPr>
-          <w:rFonts w:ascii="Consolas" w:cs="Consolas" w:eastAsia="Consolas" w:hAnsi="Consolas"/>
-          <w:sz w:val="20"/>
-          <w:szCs w:val="20"/>
-          <w:shd w:fill="F2F2F2" w:val="clear"/>
-        </w:rPr>
-        <w:t xml:space="preserve">DJUPKLASSER</w:t>
-      </w:r>
-      <w:r>
-        <w:t xml:space="preserve"> (2, 3, 4) och </w:t>
-      </w:r>
-      <w:r>
-        <w:rPr>
-          <w:rFonts w:ascii="Consolas" w:cs="Consolas" w:eastAsia="Consolas" w:hAnsi="Consolas"/>
-          <w:sz w:val="20"/>
-          <w:szCs w:val="20"/>
-          <w:shd w:fill="F2F2F2" w:val="clear"/>
-        </w:rPr>
-        <w:t xml:space="preserve">PARALLELL_MIN_ANDEL</w:t>
-      </w:r>
-      <w:r>
-        <w:t xml:space="preserve"> 0,2. Sammanfattningen i filen (</w:t>
-      </w:r>
-      <w:r>
-        <w:rPr>
-          <w:rFonts w:ascii="Consolas" w:cs="Consolas" w:eastAsia="Consolas" w:hAnsi="Consolas"/>
-          <w:sz w:val="20"/>
-          <w:szCs w:val="20"/>
-          <w:shd w:fill="F2F2F2" w:val="clear"/>
-        </w:rPr>
-        <w:t xml:space="preserve">sammanfattning</w:t>
-      </w:r>
-      <w:r>
-        <w:t xml:space="preserve">) och verktygets sista rad anger antal ledningar, brunnar, kopplade serviser, samschakt-par, schaktgrupper och korsningar.</w:t>
-      </w:r>
-    </w:p>
-    <w:p>
-      <w:pPr>
-        <w:pStyle w:val="Heading2"/>
-      </w:pPr>
-      <w:r>
-        <w:t xml:space="preserve">7.15 Inventeringsbok och kostnad – ledning_analys.py</w:t>
-      </w:r>
-    </w:p>
-    <w:p>
-      <w:pPr>
-        <w:spacing w:after="120"/>
-      </w:pPr>
-      <w:r>
-        <w:t xml:space="preserve">Tredje steget i ledningsinventeringen körs på din dator, inte i ArcMap. Skriptet läser </w:t>
-      </w:r>
-      <w:r>
-        <w:rPr>
-          <w:rFonts w:ascii="Consolas" w:cs="Consolas" w:eastAsia="Consolas" w:hAnsi="Consolas"/>
-          <w:sz w:val="20"/>
-          <w:szCs w:val="20"/>
-          <w:shd w:fill="F2F2F2" w:val="clear"/>
-        </w:rPr>
-        <w:t xml:space="preserve">ledningsdata.json</w:t>
-      </w:r>
-      <w:r>
-        <w:t xml:space="preserve"> från Ledningsinventering och räknar vad det kostar att lägga om hela nätet jämfört med att strumpinfodra det, med priserna ur SVOA:s kalkylverktyg i </w:t>
-      </w:r>
-      <w:r>
-        <w:rPr>
-          <w:rFonts w:ascii="Consolas" w:cs="Consolas" w:eastAsia="Consolas" w:hAnsi="Consolas"/>
-          <w:sz w:val="20"/>
-          <w:szCs w:val="20"/>
-          <w:shd w:fill="F2F2F2" w:val="clear"/>
-        </w:rPr>
-        <w:t xml:space="preserve">kostnader_inventering.csv</w:t>
-      </w:r>
-      <w:r>
-        <w:t xml:space="preserve">. Resultatet blir </w:t>
-      </w:r>
-      <w:r>
-        <w:rPr>
-          <w:rFonts w:ascii="Consolas" w:cs="Consolas" w:eastAsia="Consolas" w:hAnsi="Consolas"/>
-          <w:sz w:val="20"/>
-          <w:szCs w:val="20"/>
-          <w:shd w:fill="F2F2F2" w:val="clear"/>
-        </w:rPr>
-        <w:t xml:space="preserve">ledningsinventering.xlsx</w:t>
-      </w:r>
-      <w:r>
-        <w:t xml:space="preserve"> och </w:t>
-      </w:r>
-      <w:r>
-        <w:rPr>
-          <w:rFonts w:ascii="Consolas" w:cs="Consolas" w:eastAsia="Consolas" w:hAnsi="Consolas"/>
-          <w:sz w:val="20"/>
-          <w:szCs w:val="20"/>
-          <w:shd w:fill="F2F2F2" w:val="clear"/>
-        </w:rPr>
-        <w:t xml:space="preserve">ledningsresultat.json</w:t>
-      </w:r>
-      <w:r>
-        <w:t xml:space="preserve"> i samma mapp (eller i mappen efter </w:t>
-      </w:r>
-      <w:r>
-        <w:rPr>
-          <w:rFonts w:ascii="Consolas" w:cs="Consolas" w:eastAsia="Consolas" w:hAnsi="Consolas"/>
-          <w:sz w:val="20"/>
-          <w:szCs w:val="20"/>
-          <w:shd w:fill="F2F2F2" w:val="clear"/>
-        </w:rPr>
-        <w:t xml:space="preserve">-o</w:t>
-      </w:r>
-      <w:r>
-        <w:t xml:space="preserve">). Skriptet ger inga rekommendationer – bara beräkningar.</w:t>
-      </w:r>
-    </w:p>
-    <w:p>
-      <w:pPr>
-        <w:shd w:fill="F2F2F2" w:val="clear"/>
-        <w:spacing w:after="0"/>
-        <w:ind w:left="280"/>
-      </w:pPr>
-      <w:r>
-        <w:rPr>
-          <w:rFonts w:ascii="Consolas" w:cs="Consolas" w:eastAsia="Consolas" w:hAnsi="Consolas"/>
-          <w:sz w:val="19"/>
-          <w:szCs w:val="19"/>
-        </w:rPr>
-        <w:t xml:space="preserve">python ledning_analys.py ledningsdata.json</w:t>
-      </w:r>
-    </w:p>
-    <w:p>
-      <w:pPr>
-        <w:shd w:fill="F2F2F2" w:val="clear"/>
-        <w:spacing w:after="0"/>
-        <w:ind w:left="280"/>
-      </w:pPr>
-      <w:r>
-        <w:rPr>
-          <w:rFonts w:ascii="Consolas" w:cs="Consolas" w:eastAsia="Consolas" w:hAnsi="Consolas"/>
-          <w:sz w:val="19"/>
-          <w:szCs w:val="19"/>
-        </w:rPr>
-        <w:t xml:space="preserve">python ledning_analys.py ledningsdata.json -o utdata --schakttyp bergschakt</w:t>
+        <w:rPr>
+          <w:b/>
+          <w:bCs/>
+        </w:rPr>
+        <w:t xml:space="preserve">Brunnar</w:t>
+      </w:r>
+      <w:r>
+        <w:t xml:space="preserve">: locknivå, bottennivå, antal anslutna ledningar, lägsta vattengång och djup (lock minus lägsta vattengång, annars lock minus botten) samt alla fält. Brunnar utan ledning och utan locknivå listas under </w:t>
+      </w:r>
+      <w:r>
+        <w:rPr>
+          <w:rFonts w:ascii="Consolas" w:cs="Consolas" w:eastAsia="Consolas" w:hAnsi="Consolas"/>
+          <w:sz w:val="20"/>
+          <w:szCs w:val="20"/>
+          <w:shd w:fill="F2F2F2" w:val="clear"/>
+        </w:rPr>
+        <w:t xml:space="preserve">datakvalitet</w:t>
+      </w:r>
+      <w:r>
+        <w:t xml:space="preserve">, liksom ledningarnas flaggor.</w:t>
       </w:r>
     </w:p>
     <w:p>
@@ -16352,26 +16205,185 @@
         <w:spacing w:after="80"/>
       </w:pPr>
       <w:r>
-        <w:rPr>
-          <w:b/>
-          <w:bCs/>
-        </w:rPr>
-        <w:t xml:space="preserve">Alt. lägg om</w:t>
-      </w:r>
-      <w:r>
-        <w:t xml:space="preserve"> – alla ledningar läggs om i helschakt. Ledningar som ligger i samma grav (samschakt) delar graven: priset per meter grav tas efter antal ledningar i graven (1–3), hur många av dem som är större än 400 mm och den största dimensionen, och delas lika mellan ledningarna. Schaktpriset gäller till 2,5 m djup; därunder tillkommer djuptillägget per påbörjade 1,5 m (3 750 kr/m upp till Ø 600, 7 500 kr/m över), räknat punkt för punkt längs profilen. Dessutom en halv ny brunn per brunnsände (schablon) och serviserna i helschakt. Alternativet räknas för alla fyra schakttyperna – ledningschakt, med spontsläde, bergschakt och KC-förstärkning – och sammanfattningen visar alla fyra; </w:t>
-      </w:r>
-      <w:r>
-        <w:rPr>
-          <w:rFonts w:ascii="Consolas" w:cs="Consolas" w:eastAsia="Consolas" w:hAnsi="Consolas"/>
-          <w:sz w:val="20"/>
-          <w:szCs w:val="20"/>
-          <w:shd w:fill="F2F2F2" w:val="clear"/>
-        </w:rPr>
-        <w:t xml:space="preserve">--schakttyp</w:t>
-      </w:r>
-      <w:r>
-        <w:t xml:space="preserve"> väljer vilken som används i jämförelsen (standard ledningschakt).</w:t>
+        <w:t xml:space="preserve">Grunderna sitter överst i </w:t>
+      </w:r>
+      <w:r>
+        <w:rPr>
+          <w:rFonts w:ascii="Consolas" w:cs="Consolas" w:eastAsia="Consolas" w:hAnsi="Consolas"/>
+          <w:sz w:val="20"/>
+          <w:szCs w:val="20"/>
+          <w:shd w:fill="F2F2F2" w:val="clear"/>
+        </w:rPr>
+        <w:t xml:space="preserve">arcmap/moduler/inventering.py</w:t>
+      </w:r>
+      <w:r>
+        <w:t xml:space="preserve">: </w:t>
+      </w:r>
+      <w:r>
+        <w:rPr>
+          <w:rFonts w:ascii="Consolas" w:cs="Consolas" w:eastAsia="Consolas" w:hAnsi="Consolas"/>
+          <w:sz w:val="20"/>
+          <w:szCs w:val="20"/>
+          <w:shd w:fill="F2F2F2" w:val="clear"/>
+        </w:rPr>
+        <w:t xml:space="preserve">FLACK_PROMILLE</w:t>
+      </w:r>
+      <w:r>
+        <w:t xml:space="preserve"> 2, </w:t>
+      </w:r>
+      <w:r>
+        <w:rPr>
+          <w:rFonts w:ascii="Consolas" w:cs="Consolas" w:eastAsia="Consolas" w:hAnsi="Consolas"/>
+          <w:sz w:val="20"/>
+          <w:szCs w:val="20"/>
+          <w:shd w:fill="F2F2F2" w:val="clear"/>
+        </w:rPr>
+        <w:t xml:space="preserve">ORIMLIG_PROMILLE</w:t>
+      </w:r>
+      <w:r>
+        <w:t xml:space="preserve"> 200, </w:t>
+      </w:r>
+      <w:r>
+        <w:rPr>
+          <w:rFonts w:ascii="Consolas" w:cs="Consolas" w:eastAsia="Consolas" w:hAnsi="Consolas"/>
+          <w:sz w:val="20"/>
+          <w:szCs w:val="20"/>
+          <w:shd w:fill="F2F2F2" w:val="clear"/>
+        </w:rPr>
+        <w:t xml:space="preserve">DJUPKLASSER</w:t>
+      </w:r>
+      <w:r>
+        <w:t xml:space="preserve"> (2, 3, 4) och </w:t>
+      </w:r>
+      <w:r>
+        <w:rPr>
+          <w:rFonts w:ascii="Consolas" w:cs="Consolas" w:eastAsia="Consolas" w:hAnsi="Consolas"/>
+          <w:sz w:val="20"/>
+          <w:szCs w:val="20"/>
+          <w:shd w:fill="F2F2F2" w:val="clear"/>
+        </w:rPr>
+        <w:t xml:space="preserve">PARALLELL_MIN_ANDEL</w:t>
+      </w:r>
+      <w:r>
+        <w:t xml:space="preserve"> 0,2. Sammanfattningen i filen (</w:t>
+      </w:r>
+      <w:r>
+        <w:rPr>
+          <w:rFonts w:ascii="Consolas" w:cs="Consolas" w:eastAsia="Consolas" w:hAnsi="Consolas"/>
+          <w:sz w:val="20"/>
+          <w:szCs w:val="20"/>
+          <w:shd w:fill="F2F2F2" w:val="clear"/>
+        </w:rPr>
+        <w:t xml:space="preserve">sammanfattning</w:t>
+      </w:r>
+      <w:r>
+        <w:t xml:space="preserve">) och verktygets sista rad anger antal ledningar, brunnar, kopplade serviser, samschakt-par, schaktgrupper och korsningar.</w:t>
+      </w:r>
+    </w:p>
+    <w:p>
+      <w:pPr>
+        <w:pStyle w:val="Heading2"/>
+      </w:pPr>
+      <w:r>
+        <w:t xml:space="preserve">7.15 Inventeringsbok och kostnad – ledning_analys.py</w:t>
+      </w:r>
+    </w:p>
+    <w:p>
+      <w:pPr>
+        <w:spacing w:after="120"/>
+      </w:pPr>
+      <w:r>
+        <w:t xml:space="preserve">Tredje steget i ledningsinventeringen körs på din dator, inte i ArcMap. Skriptet läser </w:t>
+      </w:r>
+      <w:r>
+        <w:rPr>
+          <w:rFonts w:ascii="Consolas" w:cs="Consolas" w:eastAsia="Consolas" w:hAnsi="Consolas"/>
+          <w:sz w:val="20"/>
+          <w:szCs w:val="20"/>
+          <w:shd w:fill="F2F2F2" w:val="clear"/>
+        </w:rPr>
+        <w:t xml:space="preserve">ledningsdata.json</w:t>
+      </w:r>
+      <w:r>
+        <w:t xml:space="preserve"> från Ledningsinventering och räknar vad det kostar att lägga om hela nätet jämfört med att strumpinfodra det, med priserna ur SVOA:s kalkylverktyg i </w:t>
+      </w:r>
+      <w:r>
+        <w:rPr>
+          <w:rFonts w:ascii="Consolas" w:cs="Consolas" w:eastAsia="Consolas" w:hAnsi="Consolas"/>
+          <w:sz w:val="20"/>
+          <w:szCs w:val="20"/>
+          <w:shd w:fill="F2F2F2" w:val="clear"/>
+        </w:rPr>
+        <w:t xml:space="preserve">kostnader_inventering.csv</w:t>
+      </w:r>
+      <w:r>
+        <w:t xml:space="preserve">. Resultatet blir </w:t>
+      </w:r>
+      <w:r>
+        <w:rPr>
+          <w:rFonts w:ascii="Consolas" w:cs="Consolas" w:eastAsia="Consolas" w:hAnsi="Consolas"/>
+          <w:sz w:val="20"/>
+          <w:szCs w:val="20"/>
+          <w:shd w:fill="F2F2F2" w:val="clear"/>
+        </w:rPr>
+        <w:t xml:space="preserve">ledningsinventering.xlsx</w:t>
+      </w:r>
+      <w:r>
+        <w:t xml:space="preserve"> och </w:t>
+      </w:r>
+      <w:r>
+        <w:rPr>
+          <w:rFonts w:ascii="Consolas" w:cs="Consolas" w:eastAsia="Consolas" w:hAnsi="Consolas"/>
+          <w:sz w:val="20"/>
+          <w:szCs w:val="20"/>
+          <w:shd w:fill="F2F2F2" w:val="clear"/>
+        </w:rPr>
+        <w:t xml:space="preserve">ledningsresultat.json</w:t>
+      </w:r>
+      <w:r>
+        <w:t xml:space="preserve"> i samma mapp (eller i mappen efter </w:t>
+      </w:r>
+      <w:r>
+        <w:rPr>
+          <w:rFonts w:ascii="Consolas" w:cs="Consolas" w:eastAsia="Consolas" w:hAnsi="Consolas"/>
+          <w:sz w:val="20"/>
+          <w:szCs w:val="20"/>
+          <w:shd w:fill="F2F2F2" w:val="clear"/>
+        </w:rPr>
+        <w:t xml:space="preserve">-o</w:t>
+      </w:r>
+      <w:r>
+        <w:t xml:space="preserve">). Skriptet ger inga rekommendationer – bara beräkningar.</w:t>
+      </w:r>
+    </w:p>
+    <w:p>
+      <w:pPr>
+        <w:shd w:fill="F2F2F2" w:val="clear"/>
+        <w:spacing w:after="0"/>
+        <w:ind w:left="280"/>
+      </w:pPr>
+      <w:r>
+        <w:rPr>
+          <w:rFonts w:ascii="Consolas" w:cs="Consolas" w:eastAsia="Consolas" w:hAnsi="Consolas"/>
+          <w:sz w:val="19"/>
+          <w:szCs w:val="19"/>
+        </w:rPr>
+        <w:t xml:space="preserve">python ledning_analys.py ledningsdata.json</w:t>
+      </w:r>
+    </w:p>
+    <w:p>
+      <w:pPr>
+        <w:shd w:fill="F2F2F2" w:val="clear"/>
+        <w:spacing w:after="0"/>
+        <w:ind w:left="280"/>
+      </w:pPr>
+      <w:r>
+        <w:rPr>
+          <w:rFonts w:ascii="Consolas" w:cs="Consolas" w:eastAsia="Consolas" w:hAnsi="Consolas"/>
+          <w:sz w:val="19"/>
+          <w:szCs w:val="19"/>
+        </w:rPr>
+        <w:t xml:space="preserve">python ledning_analys.py ledningsdata.json -o utdata --schakttyp bergschakt</w:t>
       </w:r>
     </w:p>
     <w:p>
@@ -16388,10 +16400,22 @@
           <w:b/>
           <w:bCs/>
         </w:rPr>
-        <w:t xml:space="preserve">Alt. strumpa</w:t>
-      </w:r>
-      <w:r>
-        <w:t xml:space="preserve"> – spill-, dag- och kombinerade ledningar infodras (från 100 mm, så långt prislistan räcker – i dag Ø 900). Går infodring inte rörspräcks ledningen om den är högst 400 mm, annars läggs den om. Vattenledningar infodras inte: de rörspräcks (högst 400 mm), men bara när avloppsledningarna i samma grav också klaras utan schakt. Läggs någon avloppsledning i graven om, läggs vattenledningen om i samma grav. Ledningar som läggs om i alternativet delar grav med varandra, inte med dem som infodras.</w:t>
+        <w:t xml:space="preserve">Alt. lägg om</w:t>
+      </w:r>
+      <w:r>
+        <w:t xml:space="preserve"> – alla ledningar läggs om i helschakt. Ledningar som ligger i samma grav (samschakt) delar graven: priset per meter grav tas efter antal ledningar i graven (1–3), hur många av dem som är större än 400 mm och den största dimensionen, och delas lika mellan ledningarna. Schaktpriset gäller till 2,5 m djup; därunder tillkommer djuptillägget per påbörjade 1,5 m (3 750 kr/m upp till Ø 600, 7 500 kr/m över), räknat punkt för punkt längs profilen. Dessutom en halv ny brunn per brunnsände (schablon) och serviserna i helschakt. Alternativet räknas för alla fyra schakttyperna – ledningschakt, med spontsläde, bergschakt och KC-förstärkning – och sammanfattningen visar alla fyra; </w:t>
+      </w:r>
+      <w:r>
+        <w:rPr>
+          <w:rFonts w:ascii="Consolas" w:cs="Consolas" w:eastAsia="Consolas" w:hAnsi="Consolas"/>
+          <w:sz w:val="20"/>
+          <w:szCs w:val="20"/>
+          <w:shd w:fill="F2F2F2" w:val="clear"/>
+        </w:rPr>
+        <w:t xml:space="preserve">--schakttyp</w:t>
+      </w:r>
+      <w:r>
+        <w:t xml:space="preserve"> väljer vilken som används i jämförelsen (standard ledningschakt).</w:t>
       </w:r>
     </w:p>
     <w:p>
@@ -16408,10 +16432,10 @@
           <w:b/>
           <w:bCs/>
         </w:rPr>
-        <w:t xml:space="preserve">Rörspräckning</w:t>
-      </w:r>
-      <w:r>
-        <w:t xml:space="preserve"> = pris per meter efter DN (Ø 100–400) + en införingsgrop och en maskingrop per påbörjade 50 m ledning + en servisgrop per servis. Ventilgropar räknas inte, eftersom ventilerna inte finns i underlaget.</w:t>
+        <w:t xml:space="preserve">Alt. strumpa</w:t>
+      </w:r>
+      <w:r>
+        <w:t xml:space="preserve"> – spill-, dag- och kombinerade ledningar infodras (från 100 mm, så långt prislistan räcker – i dag Ø 900). Går infodring inte rörspräcks ledningen om den är högst 400 mm, annars läggs den om. Vattenledningar infodras inte: de rörspräcks (högst 400 mm), men bara när avloppsledningarna i samma grav också klaras utan schakt. Läggs någon avloppsledning i graven om, läggs vattenledningen om i samma grav. Ledningar som läggs om i alternativet delar grav med varandra, inte med dem som infodras.</w:t>
       </w:r>
     </w:p>
     <w:p>
@@ -16428,10 +16452,10 @@
           <w:b/>
           <w:bCs/>
         </w:rPr>
-        <w:t xml:space="preserve">Serviser</w:t>
-      </w:r>
-      <w:r>
-        <w:t xml:space="preserve"> förnyas i båda alternativen, per meter servisledning. I helschakt delar serviser till samma fastighet servisgrav (båda ändarna inom 3 m från varandra): en ensam dricksvattenservis kostar som dricksvattenservis helschakt, en ensam spill- eller dagvattenservis som komplett servis (spillen ligger oftast djupast), två eller tre i samma grav som komplett servis, delat lika. Raderna för en större ledning ”Ø 700” gäller över 400 till och med Ø 800, raderna för två och tre större ledningar Ø 700–1000. Bergschakt och spontsläde ger servistillägget per meter. Schaktfritt infodras servisen (dricksvatten respektive spill-/dagvattenservis per meter).</w:t>
+        <w:t xml:space="preserve">Rörspräckning</w:t>
+      </w:r>
+      <w:r>
+        <w:t xml:space="preserve"> = pris per meter efter DN (Ø 100–400) + en införingsgrop och en maskingrop per påbörjade 50 m ledning + en servisgrop per servis + en ventilgrop per ventil och brandpost på ledningen (ur inventeringens anordningar; servisventiler ligger i servisgropen). Byte av ventiler och brandposter vid omläggning ingår inte – det finns inget pris för det i kalkylverktyget.</w:t>
       </w:r>
     </w:p>
     <w:p>
@@ -16448,10 +16472,30 @@
           <w:b/>
           <w:bCs/>
         </w:rPr>
+        <w:t xml:space="preserve">Serviser</w:t>
+      </w:r>
+      <w:r>
+        <w:t xml:space="preserve"> förnyas i båda alternativen, per meter servisledning. I helschakt delar serviser till samma fastighet servisgrav (båda ändarna inom 3 m från varandra): en ensam dricksvattenservis kostar som dricksvattenservis helschakt, en ensam spill- eller dagvattenservis som komplett servis (spillen ligger oftast djupast), två eller tre i samma grav som komplett servis, delat lika. Raderna för en större ledning ”Ø 700” gäller över 400 till och med Ø 800, raderna för två och tre större ledningar Ø 700–1000. Bergschakt och spontsläde ger servistillägget per meter. Schaktfritt infodras servisen (dricksvatten respektive spill-/dagvattenservis per meter).</w:t>
+      </w:r>
+    </w:p>
+    <w:p>
+      <w:pPr>
+        <w:pStyle w:val="ListParagraph"/>
+        <w:numPr>
+          <w:ilvl w:val="0"/>
+          <w:numId w:val="3"/>
+        </w:numPr>
+        <w:spacing w:after="80"/>
+      </w:pPr>
+      <w:r>
+        <w:rPr>
+          <w:b/>
+          <w:bCs/>
+        </w:rPr>
         <w:t xml:space="preserve">Flikar.</w:t>
       </w:r>
       <w:r>
-        <w:t xml:space="preserve"> *Sammanfattning* (de två alternativen per system med infodrad, rörspräckt och omlagd längd; alt. lägg om per schakttyp; nätets längd, serviser, medeldjup och andel i samschakt; längd per material, dimension, anläggningsdecennium och djupklass; datakvalitet), *Ledningar* (per ledning kostnad i alt. lägg om, metod och kostnad i alt. strumpa och en anmärkning – kostnaden per schakttyp, detaljposterna och alla GIS-fält är dolda och fälls ut med plustecknet), *Kostnad per schaktgrupp*, *Serviser* (med antal serviser i samma servisgrav), *Parallella*, *Korsningar*, *Brunnar*, *Datakvalitet* och *Kostnadsposter* (beloppen som använts).</w:t>
+        <w:t xml:space="preserve"> *Sammanfattning* (de två alternativen per system med infodrad, rörspräckt och omlagd längd; alt. lägg om per schakttyp; nätets längd, serviser, medeldjup och andel i samschakt; längd per material, dimension, anläggningsdecennium och djupklass; datakvalitet), *Ledningar* (per ledning kostnad i alt. lägg om, metod och kostnad i alt. strumpa och en anmärkning – kostnaden per schakttyp, detaljposterna och alla GIS-fält är dolda och fälls ut med plustecknet), *Kostnad per schaktgrupp*, *Serviser* (med antal serviser i samma servisgrav), *Anordningar* (när inventeringen har anordningar), *Parallella*, *Korsningar*, *Brunnar*, *Datakvalitet* och *Kostnadsposter* (beloppen som använts).</w:t>
       </w:r>
     </w:p>
     <w:p>

</xml_diff>

<commit_message>
Ledningsinventering: vattenledningar klipps vid områdesgränsen
Vattenledningar klipps mot områdespolygonerna (de kunde sträcka sig flera
hundra meter utanför). Avloppsledningarna behålls hela, brunn till brunn:
brunnar och avloppsserviser läses även utanför området, och Exportera
område tar med avloppsbrunnar inom 2 m från exporterade avloppsledningar
så att ledningar som korsar gränsen får sina ändbrunnar. Områdeslagret
föreslås ur export_info.json; klippt längd redovisas (klippt_m).

Co-Authored-By: Claude Opus 5.5 <noreply@anthropic.com>
Claude-Session: https://claude.ai/code/session_011fdqX3JEZje1LF9LqpaqR8
</commit_message>
<xml_diff>
--- a/Anvandarhandledning tv3_analys.docx
+++ b/Anvandarhandledning tv3_analys.docx
@@ -15593,7 +15593,19 @@
         <w:t xml:space="preserve">KALLAGER</w:t>
       </w:r>
       <w:r>
-        <w:t xml:space="preserve"> (källagrets namn) utöver alla originalfält. SVOA:s featureklasser har ett klasstillägg som följer med kopian; då fylls de tre fälten i en redigeringssession, och går inte heller det blir fälten tomma (det står i loggen) medan själva exporten blir klar. Lager med en koppling (join) i kartan, som *A Platsgjutenbrunn*, har en definitionsfråga med tabellprefix; då provas frågan utan prefix och sist lagret med sin koppling. Ett lager som ändå inte går att exportera hoppas över med en OBS-rad, och de övriga exporteras.</w:t>
+        <w:t xml:space="preserve"> (källagrets namn) utöver alla originalfält. Brunnar och ledningsändar i avloppet som ligger högst 2 m från en exporterad avloppsledning tas med även utanför området, så att ledningar som korsar gränsen går brunn till brunn (</w:t>
+      </w:r>
+      <w:r>
+        <w:rPr>
+          <w:rFonts w:ascii="Consolas" w:cs="Consolas" w:eastAsia="Consolas" w:hAnsi="Consolas"/>
+          <w:sz w:val="20"/>
+          <w:szCs w:val="20"/>
+          <w:shd w:fill="F2F2F2" w:val="clear"/>
+        </w:rPr>
+        <w:t xml:space="preserve">ANDBRUNN_AVSTAND_M</w:t>
+      </w:r>
+      <w:r>
+        <w:t xml:space="preserve">). SVOA:s featureklasser har ett klasstillägg som följer med kopian; då fylls de tre fälten i en redigeringssession, och går inte heller det blir fälten tomma (det står i loggen) medan själva exporten blir klar. Lager med en koppling (join) i kartan, som *A Platsgjutenbrunn*, har en definitionsfråga med tabellprefix; då provas frågan utan prefix och sist lagret med sin koppling. Ett lager som ändå inte går att exportera hoppas över med en OBS-rad, och de övriga exporteras.</w:t>
       </w:r>
     </w:p>
     <w:p>
@@ -16019,6 +16031,50 @@
       </w:r>
       <w:r>
         <w:t xml:space="preserve">.</w:t>
+      </w:r>
+    </w:p>
+    <w:p>
+      <w:pPr>
+        <w:pStyle w:val="ListParagraph"/>
+        <w:numPr>
+          <w:ilvl w:val="0"/>
+          <w:numId w:val="3"/>
+        </w:numPr>
+        <w:spacing w:after="80"/>
+      </w:pPr>
+      <w:r>
+        <w:rPr>
+          <w:b/>
+          <w:bCs/>
+        </w:rPr>
+        <w:t xml:space="preserve">Vattenledningar klipps vid områdesgränsen</w:t>
+      </w:r>
+      <w:r>
+        <w:t xml:space="preserve"> när ett områdeslager är valt (Inställningar – förvalt ur </w:t>
+      </w:r>
+      <w:r>
+        <w:rPr>
+          <w:rFonts w:ascii="Consolas" w:cs="Consolas" w:eastAsia="Consolas" w:hAnsi="Consolas"/>
+          <w:sz w:val="20"/>
+          <w:szCs w:val="20"/>
+          <w:shd w:fill="F2F2F2" w:val="clear"/>
+        </w:rPr>
+        <w:t xml:space="preserve">export_info.json</w:t>
+      </w:r>
+      <w:r>
+        <w:t xml:space="preserve"> från Exportera område) och rutan *Klipp vattenledningarna* är ikryssad (standard). Bara delen inom området räknas; hur många meter som klipptes bort står i </w:t>
+      </w:r>
+      <w:r>
+        <w:rPr>
+          <w:rFonts w:ascii="Consolas" w:cs="Consolas" w:eastAsia="Consolas" w:hAnsi="Consolas"/>
+          <w:sz w:val="20"/>
+          <w:szCs w:val="20"/>
+          <w:shd w:fill="F2F2F2" w:val="clear"/>
+        </w:rPr>
+        <w:t xml:space="preserve">klippt_m</w:t>
+      </w:r>
+      <w:r>
+        <w:t xml:space="preserve"> (Excel: dold kolumn *Klippt vid områdesgränsen*). Avloppsledningarna behålls hela, brunn till brunn, med brunnar och serviser även utanför området. Vattenserviser och vattenanordningar utanför området tas inte med.</w:t>
       </w:r>
     </w:p>
     <w:p>

</xml_diff>

<commit_message>
ledning_analys: saknad dimension antas ur uppstroms ledning
Avloppsledningar utan dimension i GIS gick varken att infodra eller
rorspracka, lades om utan kostnad och drog vattnet i samma grav med sig.
Nu far de dimensionen fran uppstroms ledning av samma system (storsta vid
forgrening, kedjor fylls uppifran, nedstroms som reserv); anmarkningen
och fliken Datakvalitet visar varifran den kommer.

Co-Authored-By: Claude Opus 5.5 <noreply@anthropic.com>
Claude-Session: https://claude.ai/code/session_011fdqX3JEZje1LF9LqpaqR8
</commit_message>
<xml_diff>
--- a/Anvandarhandledning tv3_analys.docx
+++ b/Anvandarhandledning tv3_analys.docx
@@ -16552,6 +16552,50 @@
       </w:r>
       <w:r>
         <w:t xml:space="preserve"> *Sammanfattning* (de två alternativen per system med infodrad, rörspräckt och omlagd längd; alt. lägg om per schakttyp; nätets längd, serviser, medeldjup och andel i samschakt; längd per material, dimension, anläggningsdecennium och djupklass; datakvalitet), *Ledningar* (per ledning kostnad i alt. lägg om, metod och kostnad i alt. strumpa och en anmärkning – kostnaden per schakttyp, detaljposterna och alla GIS-fält är dolda och fälls ut med plustecknet), *Kostnad per schaktgrupp*, *Serviser* (med antal serviser i samma servisgrav), *Anordningar* (när inventeringen har anordningar), *Parallella*, *Korsningar*, *Brunnar*, *Datakvalitet* och *Kostnadsposter* (beloppen som använts).</w:t>
+      </w:r>
+    </w:p>
+    <w:p>
+      <w:pPr>
+        <w:pStyle w:val="ListParagraph"/>
+        <w:numPr>
+          <w:ilvl w:val="0"/>
+          <w:numId w:val="3"/>
+        </w:numPr>
+        <w:spacing w:after="80"/>
+      </w:pPr>
+      <w:r>
+        <w:rPr>
+          <w:b/>
+          <w:bCs/>
+        </w:rPr>
+        <w:t xml:space="preserve">Saknad dimension.</w:t>
+      </w:r>
+      <w:r>
+        <w:t xml:space="preserve"> Saknar en ledning dimension i GIS antas den ha samma dimension som ledningen uppströms av samma system (spill, dag, kombinerat eller vatten) – den som ansluter i ledningens uppströms ände. Flödesriktningen tas ur vattengången, annars ritriktningen. Flyter flera ledningar in tas den största. En kedja av ledningar utan dimension fylls steg för steg uppifrån. Finns ingen ledning uppströms med dimension tas ledningen nedströms. Anmärkningen säger vilken ledning dimensionen kommer från (t.ex. *Ø 225 antagen från uppströms ledning SSL123*) och fliken Datakvalitet listar dem. Stäng av med </w:t>
+      </w:r>
+      <w:r>
+        <w:rPr>
+          <w:rFonts w:ascii="Consolas" w:cs="Consolas" w:eastAsia="Consolas" w:hAnsi="Consolas"/>
+          <w:sz w:val="20"/>
+          <w:szCs w:val="20"/>
+          <w:shd w:fill="F2F2F2" w:val="clear"/>
+        </w:rPr>
+        <w:t xml:space="preserve">DIMENSION_UR_GRANNE = False</w:t>
+      </w:r>
+      <w:r>
+        <w:t xml:space="preserve"> (bara nedströms-reserven: </w:t>
+      </w:r>
+      <w:r>
+        <w:rPr>
+          <w:rFonts w:ascii="Consolas" w:cs="Consolas" w:eastAsia="Consolas" w:hAnsi="Consolas"/>
+          <w:sz w:val="20"/>
+          <w:szCs w:val="20"/>
+          <w:shd w:fill="F2F2F2" w:val="clear"/>
+        </w:rPr>
+        <w:t xml:space="preserve">DIMENSION_NEDSTROMS_RESERV = False</w:t>
+      </w:r>
+      <w:r>
+        <w:t xml:space="preserve">) i KONFIG.</w:t>
       </w:r>
     </w:p>
     <w:p>

</xml_diff>

<commit_message>
Kodgranskning av ledningsinventeringen: rattelser
- ledning_analys: vattendjupet raknas efter antagna dimensioner; djupklass
  med decimalkomma; dimension 0 = saknad; uppstroms/nedstroms vaxlas tills
  inget andras; GIS-dimensionen sparas och kolumnen Dimension antagen fran
- gisexport: punktlager tas bort innan koordinatsystemet valjs
- projektering: linjar transformation over straket i stallet for projectAs
  per provpunkt; cachenyckel med bada koordinatsystemen
- omrade_export: kartans urval begransar inte exporten via joinlagret;
  tabellprefix tas inte bort inom apostrofer

Co-Authored-By: Claude Opus 5.5 <noreply@anthropic.com>
Claude-Session: https://claude.ai/code/session_011fdqX3JEZje1LF9LqpaqR8
</commit_message>
<xml_diff>
--- a/Anvandarhandledning tv3_analys.docx
+++ b/Anvandarhandledning tv3_analys.docx
@@ -16571,7 +16571,31 @@
         <w:t xml:space="preserve">Saknad dimension.</w:t>
       </w:r>
       <w:r>
-        <w:t xml:space="preserve"> Saknar en ledning dimension i GIS antas den ha samma dimension som ledningen uppströms av samma system (spill, dag, kombinerat eller vatten) – den som ansluter i ledningens uppströms ände. Flödesriktningen tas ur vattengången, annars ritriktningen. Flyter flera ledningar in tas den största. En kedja av ledningar utan dimension fylls steg för steg uppifrån. Finns ingen ledning uppströms med dimension tas ledningen nedströms. Anmärkningen säger vilken ledning dimensionen kommer från (t.ex. *Ø 225 antagen från uppströms ledning SSL123*) och fliken Datakvalitet listar dem. Stäng av med </w:t>
+        <w:t xml:space="preserve"> Saknar en ledning dimension i GIS antas den ha samma dimension som ledningen uppströms av samma system (spill, dag, kombinerat eller vatten) – den som ansluter i ledningens uppströms ände. Flödesriktningen tas ur vattengången, annars ritriktningen. Flyter flera ledningar in tas den största. En kedja av ledningar utan dimension fylls steg för steg uppifrån. Finns ingen ledning uppströms med dimension tas ledningen nedströms. Dimension 0 i GIS räknas som saknad. Kolumnen *Dimension antagen från* bredvid Dimension och anmärkningen säger vilken ledning dimensionen kommer från (t.ex. *Ø 225 antagen från uppströms ledning SSL123*), fliken Datakvalitet listar dem och </w:t>
+      </w:r>
+      <w:r>
+        <w:rPr>
+          <w:rFonts w:ascii="Consolas" w:cs="Consolas" w:eastAsia="Consolas" w:hAnsi="Consolas"/>
+          <w:sz w:val="20"/>
+          <w:szCs w:val="20"/>
+          <w:shd w:fill="F2F2F2" w:val="clear"/>
+        </w:rPr>
+        <w:t xml:space="preserve">ledningsresultat.json</w:t>
+      </w:r>
+      <w:r>
+        <w:t xml:space="preserve"> har både den använda dimensionen och GIS-värdet (</w:t>
+      </w:r>
+      <w:r>
+        <w:rPr>
+          <w:rFonts w:ascii="Consolas" w:cs="Consolas" w:eastAsia="Consolas" w:hAnsi="Consolas"/>
+          <w:sz w:val="20"/>
+          <w:szCs w:val="20"/>
+          <w:shd w:fill="F2F2F2" w:val="clear"/>
+        </w:rPr>
+        <w:t xml:space="preserve">dimension_gis</w:t>
+      </w:r>
+      <w:r>
+        <w:t xml:space="preserve">). Stäng av med </w:t>
       </w:r>
       <w:r>
         <w:rPr>

</xml_diff>

<commit_message>
ledning_analys: spont efter djup (spontlada och slagen spont)
Ny standardschakttyp "djup": gravens medeldjup under 2 m ledningschakt,
2-3 m spontlada (spontsladespriset), fran 3 m ledningschakt + slagen spont
pa bada sidor med hojden medeldjup + 3 m, 3 500 kr/m2 (ny post slagen_spont).
Excel visar schaktsattet per ledning och ett block per schaktsatt.

Co-Authored-By: Claude Opus 5.5 <noreply@anthropic.com>
Claude-Session: https://claude.ai/code/session_011fdqX3JEZje1LF9LqpaqR8
</commit_message>
<xml_diff>
--- a/Anvandarhandledning tv3_analys.docx
+++ b/Anvandarhandledning tv3_analys.docx
@@ -16459,7 +16459,77 @@
         <w:t xml:space="preserve">Alt. lägg om</w:t>
       </w:r>
       <w:r>
-        <w:t xml:space="preserve"> – alla ledningar läggs om i helschakt. Ledningar som ligger i samma grav (samschakt) delar graven: priset per meter grav tas efter antal ledningar i graven (1–3), hur många av dem som är större än 400 mm och den största dimensionen, och delas lika mellan ledningarna. Schaktpriset gäller till 2,5 m djup; därunder tillkommer djuptillägget per påbörjade 1,5 m (3 750 kr/m upp till Ø 600, 7 500 kr/m över), räknat punkt för punkt längs profilen. Dessutom en halv ny brunn per brunnsände (schablon) och serviserna i helschakt. Alternativet räknas för alla fyra schakttyperna – ledningschakt, med spontsläde, bergschakt och KC-förstärkning – och sammanfattningen visar alla fyra; </w:t>
+        <w:t xml:space="preserve"> – alla ledningar läggs om i helschakt. Ledningar som ligger i samma grav (samschakt) delar graven: priset per meter grav tas efter antal ledningar i graven (1–3), hur många av dem som är större än 400 mm och den största dimensionen, och delas lika mellan ledningarna. Schaktpriset gäller till 2,5 m djup; därunder tillkommer djuptillägget per påbörjade 1,5 m (3 750 kr/m upp till Ø 600, 7 500 kr/m över), räknat punkt för punkt längs profilen. Dessutom en halv ny brunn per brunnsände (schablon) och serviserna i helschakt. Standard är schakttypen </w:t>
+      </w:r>
+      <w:r>
+        <w:rPr>
+          <w:b/>
+          <w:bCs/>
+        </w:rPr>
+        <w:t xml:space="preserve">efter djup</w:t>
+      </w:r>
+      <w:r>
+        <w:t xml:space="preserve">: gravens medeldjup (den djupaste ledningen i graven) avgör schaktsättet – under 2 m ledningschakt, 2–3 m spontlåda (priset med spontsläde), från 3 m ledningschakt plus slagen spont. Slagen spont räknas på båda sidor av graven med höjden medeldjup + 3 m: 2 × (medeldjup + 3 m) × längd × 3 500 kr/m² (post </w:t>
+      </w:r>
+      <w:r>
+        <w:rPr>
+          <w:rFonts w:ascii="Consolas" w:cs="Consolas" w:eastAsia="Consolas" w:hAnsi="Consolas"/>
+          <w:sz w:val="20"/>
+          <w:szCs w:val="20"/>
+          <w:shd w:fill="F2F2F2" w:val="clear"/>
+        </w:rPr>
+        <w:t xml:space="preserve">slagen_spont</w:t>
+      </w:r>
+      <w:r>
+        <w:t xml:space="preserve">, delas mellan ledningarna i graven). Serviserna får spontslädetillägget vid spontlåda. Saknas djupet räknas ledningschakt utan spont och det står i anmärkningen. Gränserna står i KONFIG (</w:t>
+      </w:r>
+      <w:r>
+        <w:rPr>
+          <w:rFonts w:ascii="Consolas" w:cs="Consolas" w:eastAsia="Consolas" w:hAnsi="Consolas"/>
+          <w:sz w:val="20"/>
+          <w:szCs w:val="20"/>
+          <w:shd w:fill="F2F2F2" w:val="clear"/>
+        </w:rPr>
+        <w:t xml:space="preserve">SPONTLADA_FRAN_M</w:t>
+      </w:r>
+      <w:r>
+        <w:t xml:space="preserve">, </w:t>
+      </w:r>
+      <w:r>
+        <w:rPr>
+          <w:rFonts w:ascii="Consolas" w:cs="Consolas" w:eastAsia="Consolas" w:hAnsi="Consolas"/>
+          <w:sz w:val="20"/>
+          <w:szCs w:val="20"/>
+          <w:shd w:fill="F2F2F2" w:val="clear"/>
+        </w:rPr>
+        <w:t xml:space="preserve">SLAGEN_SPONT_FRAN_M</w:t>
+      </w:r>
+      <w:r>
+        <w:t xml:space="preserve">, </w:t>
+      </w:r>
+      <w:r>
+        <w:rPr>
+          <w:rFonts w:ascii="Consolas" w:cs="Consolas" w:eastAsia="Consolas" w:hAnsi="Consolas"/>
+          <w:sz w:val="20"/>
+          <w:szCs w:val="20"/>
+          <w:shd w:fill="F2F2F2" w:val="clear"/>
+        </w:rPr>
+        <w:t xml:space="preserve">SPONT_NEDSLAGNING_M</w:t>
+      </w:r>
+      <w:r>
+        <w:t xml:space="preserve">, </w:t>
+      </w:r>
+      <w:r>
+        <w:rPr>
+          <w:rFonts w:ascii="Consolas" w:cs="Consolas" w:eastAsia="Consolas" w:hAnsi="Consolas"/>
+          <w:sz w:val="20"/>
+          <w:szCs w:val="20"/>
+          <w:shd w:fill="F2F2F2" w:val="clear"/>
+        </w:rPr>
+        <w:t xml:space="preserve">SPONT_SIDOR</w:t>
+      </w:r>
+      <w:r>
+        <w:t xml:space="preserve">). Alternativet räknas också för de fyra fasta schakttyperna – ledningschakt, med spontsläde, bergschakt och KC-förstärkning – och sammanfattningen visar alla fem samt ett block med längd, kvadratmeter spont och kostnad per schaktsätt; </w:t>
       </w:r>
       <w:r>
         <w:rPr>
@@ -16471,7 +16541,19 @@
         <w:t xml:space="preserve">--schakttyp</w:t>
       </w:r>
       <w:r>
-        <w:t xml:space="preserve"> väljer vilken som används i jämförelsen (standard ledningschakt).</w:t>
+        <w:t xml:space="preserve"> väljer vilken som används i jämförelsen (standard </w:t>
+      </w:r>
+      <w:r>
+        <w:rPr>
+          <w:rFonts w:ascii="Consolas" w:cs="Consolas" w:eastAsia="Consolas" w:hAnsi="Consolas"/>
+          <w:sz w:val="20"/>
+          <w:szCs w:val="20"/>
+          <w:shd w:fill="F2F2F2" w:val="clear"/>
+        </w:rPr>
+        <w:t xml:space="preserve">djup</w:t>
+      </w:r>
+      <w:r>
+        <w:t xml:space="preserve">). Fliken Ledningar visar schaktsättet per ledning (gravdjup, spont i m² och kr finns bland de dolda kolumnerna).</w:t>
       </w:r>
     </w:p>
     <w:p>
@@ -16652,7 +16734,7 @@
         <w:t xml:space="preserve">Kostnadsfilen `kostnader_inventering.csv`</w:t>
       </w:r>
       <w:r>
-        <w:t xml:space="preserve"> har kolumnerna post, schakttyp, ledningar, storre (antal större än 400 mm i graven), system, dimension från/till, enhet, kr och kommentar; rubrikraden styr ordningen och en tom cell gäller alla. Posterna är infodring, servis_infodring, schakt, djuptillagg, servis_helschakt, servis_tillagg, rorsprackning, inforingsgrop, maskingrop, servisgrop, brunn_ny, aterstallning, framschaktning och ny_brunn. Belopp som inte finns i kalkylverktyget är märkta ANTAGET eller SCHABLON i kommentaren, och sammanfattningen listar dem.</w:t>
+        <w:t xml:space="preserve"> har kolumnerna post, schakttyp, ledningar, storre (antal större än 400 mm i graven), system, dimension från/till, enhet, kr och kommentar; rubrikraden styr ordningen och en tom cell gäller alla. Posterna är infodring, servis_infodring, schakt, djuptillagg, servis_helschakt, servis_tillagg, rorsprackning, inforingsgrop, maskingrop, servisgrop, brunn_ny, aterstallning, slagen_spont (kr/m²), framschaktning och ny_brunn. Belopp som inte finns i kalkylverktyget är märkta ANTAGET eller SCHABLON i kommentaren, och sammanfattningen listar dem.</w:t>
       </w:r>
     </w:p>
     <w:p>

</xml_diff>

<commit_message>
Exportera omrade: klipp vattenledningarna vid omradesgransen
Vattenledningar (gruppen Vatten eller V-lager) kortas vid omradet (+ buffert)
i den lokala gdb:n; KLIPPT_M anger bortklippt langd, objekt helt utanfor tas
bort. Avloppet klipps inte (brunn till brunn). Ny kryssruta i verktyget,
forvald.

Co-Authored-By: Claude Opus 5.5 <noreply@anthropic.com>
Claude-Session: https://claude.ai/code/session_011fdqX3JEZje1LF9LqpaqR8
</commit_message>
<xml_diff>
--- a/Anvandarhandledning tv3_analys.docx
+++ b/Anvandarhandledning tv3_analys.docx
@@ -15542,10 +15542,10 @@
           <w:b/>
           <w:bCs/>
         </w:rPr>
-        <w:t xml:space="preserve">Hela objekt kopieras, inte klippta.</w:t>
-      </w:r>
-      <w:r>
-        <w:t xml:space="preserve"> Längder, vattengångar och brunnspar förblir riktiga. Varje objekt får fälten </w:t>
+        <w:t xml:space="preserve">Hela objekt kopieras, inte klippta</w:t>
+      </w:r>
+      <w:r>
+        <w:t xml:space="preserve"> (utom vattenledningarna, se nedan). Längder, vattengångar och brunnspar förblir riktiga. Varje objekt får fälten </w:t>
       </w:r>
       <w:r>
         <w:rPr>
@@ -15606,6 +15606,50 @@
       </w:r>
       <w:r>
         <w:t xml:space="preserve">). SVOA:s featureklasser har ett klasstillägg som följer med kopian; då fylls de tre fälten i en redigeringssession, och går inte heller det blir fälten tomma (det står i loggen) medan själva exporten blir klar. Lager med en koppling (join) i kartan, som *A Platsgjutenbrunn*, har en definitionsfråga med tabellprefix; då provas frågan utan prefix och sist lagret med sin koppling. Ett lager som ändå inte går att exportera hoppas över med en OBS-rad, och de övriga exporteras.</w:t>
+      </w:r>
+    </w:p>
+    <w:p>
+      <w:pPr>
+        <w:pStyle w:val="ListParagraph"/>
+        <w:numPr>
+          <w:ilvl w:val="0"/>
+          <w:numId w:val="3"/>
+        </w:numPr>
+        <w:spacing w:after="80"/>
+      </w:pPr>
+      <w:r>
+        <w:rPr>
+          <w:b/>
+          <w:bCs/>
+        </w:rPr>
+        <w:t xml:space="preserve">Vattenledningar klipps vid områdesgränsen</w:t>
+      </w:r>
+      <w:r>
+        <w:t xml:space="preserve"> (kryssrutan *Klipp vattenledningarna vid områdesgränsen*, förvald). Vattenledningar (lager under gruppen Vatten eller med namn som börjar på *V*) kan sträcka sig hundratals meter utanför området; de kortas vid gränsen (plus bufferten) och fältet </w:t>
+      </w:r>
+      <w:r>
+        <w:rPr>
+          <w:rFonts w:ascii="Consolas" w:cs="Consolas" w:eastAsia="Consolas" w:hAnsi="Consolas"/>
+          <w:sz w:val="20"/>
+          <w:szCs w:val="20"/>
+          <w:shd w:fill="F2F2F2" w:val="clear"/>
+        </w:rPr>
+        <w:t xml:space="preserve">KLIPPT_M</w:t>
+      </w:r>
+      <w:r>
+        <w:t xml:space="preserve"> anger hur många meter av objektet som togs bort. En ledning som går ut och in igen blir en flerdelad ledning med bara delarna inom området. Avloppet klipps aldrig – det ska gå brunn till brunn. I loggen och i </w:t>
+      </w:r>
+      <w:r>
+        <w:rPr>
+          <w:rFonts w:ascii="Consolas" w:cs="Consolas" w:eastAsia="Consolas" w:hAnsi="Consolas"/>
+          <w:sz w:val="20"/>
+          <w:szCs w:val="20"/>
+          <w:shd w:fill="F2F2F2" w:val="clear"/>
+        </w:rPr>
+        <w:t xml:space="preserve">export_info.json</w:t>
+      </w:r>
+      <w:r>
+        <w:t xml:space="preserve"> står hur många ledningar som klipptes och hur många meter som togs bort; Excel-kolumnen *Klippt vid områdesgränsen* i ledning_analys visar värdet.</w:t>
       </w:r>
     </w:p>
     <w:p>

</xml_diff>

<commit_message>
ledning_analys: hatt pa spill-, dag- och kombinerade serviser upp till 6 m
Nar huvudledningen infodras eller rorspracks kostar servisen 35 000 kr/st
(ny post servis_hatt) om den ar hogst 6 m; langre serviser och vattenserviser
per meter som forut.

Co-Authored-By: Claude Opus 5.5 <noreply@anthropic.com>
Claude-Session: https://claude.ai/code/session_011fdqX3JEZje1LF9LqpaqR8
</commit_message>
<xml_diff>
--- a/Anvandarhandledning tv3_analys.docx
+++ b/Anvandarhandledning tv3_analys.docx
@@ -16657,7 +16657,41 @@
         <w:t xml:space="preserve">Serviser</w:t>
       </w:r>
       <w:r>
-        <w:t xml:space="preserve"> förnyas i båda alternativen, per meter servisledning. I helschakt delar serviser till samma fastighet servisgrav (båda ändarna inom 3 m från varandra): en ensam dricksvattenservis kostar som dricksvattenservis helschakt, en ensam spill- eller dagvattenservis som komplett servis (spillen ligger oftast djupast), två eller tre i samma grav som komplett servis, delat lika. Raderna för en större ledning ”Ø 700” gäller över 400 till och med Ø 800, raderna för två och tre större ledningar Ø 700–1000. Bergschakt och spontsläde ger servistillägget per meter. Schaktfritt infodras servisen (dricksvatten respektive spill-/dagvattenservis per meter).</w:t>
+        <w:t xml:space="preserve"> förnyas i båda alternativen, per meter servisledning. I helschakt delar serviser till samma fastighet servisgrav (båda ändarna inom 3 m från varandra): en ensam dricksvattenservis kostar som dricksvattenservis helschakt, en ensam spill- eller dagvattenservis som komplett servis (spillen ligger oftast djupast), två eller tre i samma grav som komplett servis, delat lika. Raderna för en större ledning ”Ø 700” gäller över 400 till och med Ø 800, raderna för två och tre större ledningar Ø 700–1000. Bergschakt och spontsläde ger servistillägget per meter. Schaktfritt (när huvudledningen infodras eller rörspräcks) infodras spill-, dag- och kombinerade serviser på högst 6 m med </w:t>
+      </w:r>
+      <w:r>
+        <w:rPr>
+          <w:b/>
+          <w:bCs/>
+        </w:rPr>
+        <w:t xml:space="preserve">hatt</w:t>
+      </w:r>
+      <w:r>
+        <w:t xml:space="preserve"> för 35 000 kr/st (post </w:t>
+      </w:r>
+      <w:r>
+        <w:rPr>
+          <w:rFonts w:ascii="Consolas" w:cs="Consolas" w:eastAsia="Consolas" w:hAnsi="Consolas"/>
+          <w:sz w:val="20"/>
+          <w:szCs w:val="20"/>
+          <w:shd w:fill="F2F2F2" w:val="clear"/>
+        </w:rPr>
+        <w:t xml:space="preserve">servis_hatt</w:t>
+      </w:r>
+      <w:r>
+        <w:t xml:space="preserve">, </w:t>
+      </w:r>
+      <w:r>
+        <w:rPr>
+          <w:rFonts w:ascii="Consolas" w:cs="Consolas" w:eastAsia="Consolas" w:hAnsi="Consolas"/>
+          <w:sz w:val="20"/>
+          <w:szCs w:val="20"/>
+          <w:shd w:fill="F2F2F2" w:val="clear"/>
+        </w:rPr>
+        <w:t xml:space="preserve">SERVIS_HATT_MAX_M</w:t>
+      </w:r>
+      <w:r>
+        <w:t xml:space="preserve"> i KONFIG); längre serviser och dricksvattenserviser infodras per meter. Antalet hattar per ledning står i den dolda kolumnen *Hattar*.</w:t>
       </w:r>
     </w:p>
     <w:p>

</xml_diff>

<commit_message>
ledning_analys: "Alt. schaktfritt" i stallet for "Alt. strumpa"
Alternativet omfattar bade strumpa och rorspräckning. Rubriker, texter,
handledning och JSON-nycklar (alt_schaktfritt_metod/_kr) heter nu
schaktfritt.

Co-Authored-By: Claude Opus 5.5 <noreply@anthropic.com>
Claude-Session: https://claude.ai/code/session_011fdqX3JEZje1LF9LqpaqR8
</commit_message>
<xml_diff>
--- a/Anvandarhandledning tv3_analys.docx
+++ b/Anvandarhandledning tv3_analys.docx
@@ -16405,7 +16405,7 @@
         <w:t xml:space="preserve">ledningsdata.json</w:t>
       </w:r>
       <w:r>
-        <w:t xml:space="preserve"> från Ledningsinventering och räknar vad det kostar att lägga om hela nätet jämfört med att strumpinfodra det, med priserna ur SVOA:s kalkylverktyg i </w:t>
+        <w:t xml:space="preserve"> från Ledningsinventering och räknar vad det kostar att lägga om hela nätet jämfört med att renovera det schaktfritt (strumpa eller rörspräckning – *Alt. schaktfritt*), med priserna ur SVOA:s kalkylverktyg i </w:t>
       </w:r>
       <w:r>
         <w:rPr>
@@ -16614,7 +16614,7 @@
           <w:b/>
           <w:bCs/>
         </w:rPr>
-        <w:t xml:space="preserve">Alt. strumpa</w:t>
+        <w:t xml:space="preserve">Alt. schaktfritt</w:t>
       </w:r>
       <w:r>
         <w:t xml:space="preserve"> – spill-, dag- och kombinerade ledningar infodras (från 100 mm, så långt prislistan räcker – i dag Ø 1300). Går infodring inte rörspräcks ledningen om den är högst 400 mm, annars läggs den om. Vattenledningar infodras inte: de rörspräcks (högst 400 mm), men bara när avloppsledningarna i samma grav också klaras utan schakt. Läggs någon avloppsledning i graven om, läggs vattenledningen om i samma grav. Ledningar som läggs om i alternativet delar grav med varandra, inte med dem som infodras.</w:t>
@@ -16711,7 +16711,7 @@
         <w:t xml:space="preserve">Flikar.</w:t>
       </w:r>
       <w:r>
-        <w:t xml:space="preserve"> *Sammanfattning* (de två alternativen per system med infodrad, rörspräckt och omlagd längd; alt. lägg om per schakttyp; nätets längd, serviser, medeldjup och andel i samschakt; längd per material, dimension, anläggningsdecennium och djupklass; datakvalitet), *Ledningar* (per ledning kostnad i alt. lägg om, metod och kostnad i alt. strumpa och en anmärkning – kostnaden per schakttyp, detaljposterna och alla GIS-fält är dolda och fälls ut med plustecknet), *Kostnad per schaktgrupp* (med </w:t>
+        <w:t xml:space="preserve"> *Sammanfattning* (de två alternativen per system med infodrad, rörspräckt och omlagd längd; alt. lägg om per schakttyp; nätets längd, serviser, medeldjup och andel i samschakt; längd per material, dimension, anläggningsdecennium och djupklass; datakvalitet), *Ledningar* (per ledning kostnad i alt. lägg om, metod och kostnad i alt. schaktfritt och en anmärkning – kostnaden per schakttyp, detaljposterna och alla GIS-fält är dolda och fälls ut med plustecknet), *Kostnad per schaktgrupp* (med </w:t>
       </w:r>
       <w:r>
         <w:rPr>

</xml_diff>

<commit_message>
ledning_analys: formler i Excel i stallet for fasta summor
Sammanfattning och Kostnad per schaktgrupp raknas med SUMIFS/COUNTIFS mot
fliken Ledningar; radtotalerna i Ledningar ar formler av delposterna.

Co-Authored-By: Claude Opus 5.5 <noreply@anthropic.com>
Claude-Session: https://claude.ai/code/session_011fdqX3JEZje1LF9LqpaqR8
</commit_message>
<xml_diff>
--- a/Anvandarhandledning tv3_analys.docx
+++ b/Anvandarhandledning tv3_analys.docx
@@ -16738,58 +16738,10 @@
           <w:b/>
           <w:bCs/>
         </w:rPr>
-        <w:t xml:space="preserve">Saknad dimension.</w:t>
-      </w:r>
-      <w:r>
-        <w:t xml:space="preserve"> Saknar en ledning dimension i GIS antas den ha samma dimension som ledningen uppströms av samma system (spill, dag, kombinerat eller vatten) – den som ansluter i ledningens uppströms ände. Flödesriktningen tas ur vattengången, annars ritriktningen. Flyter flera ledningar in tas den största. En kedja av ledningar utan dimension fylls steg för steg uppifrån. Finns ingen ledning uppströms med dimension tas ledningen nedströms. Dimension 0 i GIS räknas som saknad. Kolumnen *Dimension antagen från* bredvid Dimension och anmärkningen säger vilken ledning dimensionen kommer från (t.ex. *Ø 225 antagen från uppströms ledning SSL123*), fliken Datakvalitet listar dem och </w:t>
-      </w:r>
-      <w:r>
-        <w:rPr>
-          <w:rFonts w:ascii="Consolas" w:cs="Consolas" w:eastAsia="Consolas" w:hAnsi="Consolas"/>
-          <w:sz w:val="20"/>
-          <w:szCs w:val="20"/>
-          <w:shd w:fill="F2F2F2" w:val="clear"/>
-        </w:rPr>
-        <w:t xml:space="preserve">ledningsresultat.json</w:t>
-      </w:r>
-      <w:r>
-        <w:t xml:space="preserve"> har både den använda dimensionen och GIS-värdet (</w:t>
-      </w:r>
-      <w:r>
-        <w:rPr>
-          <w:rFonts w:ascii="Consolas" w:cs="Consolas" w:eastAsia="Consolas" w:hAnsi="Consolas"/>
-          <w:sz w:val="20"/>
-          <w:szCs w:val="20"/>
-          <w:shd w:fill="F2F2F2" w:val="clear"/>
-        </w:rPr>
-        <w:t xml:space="preserve">dimension_gis</w:t>
-      </w:r>
-      <w:r>
-        <w:t xml:space="preserve">). Stäng av med </w:t>
-      </w:r>
-      <w:r>
-        <w:rPr>
-          <w:rFonts w:ascii="Consolas" w:cs="Consolas" w:eastAsia="Consolas" w:hAnsi="Consolas"/>
-          <w:sz w:val="20"/>
-          <w:szCs w:val="20"/>
-          <w:shd w:fill="F2F2F2" w:val="clear"/>
-        </w:rPr>
-        <w:t xml:space="preserve">DIMENSION_UR_GRANNE = False</w:t>
-      </w:r>
-      <w:r>
-        <w:t xml:space="preserve"> (bara nedströms-reserven: </w:t>
-      </w:r>
-      <w:r>
-        <w:rPr>
-          <w:rFonts w:ascii="Consolas" w:cs="Consolas" w:eastAsia="Consolas" w:hAnsi="Consolas"/>
-          <w:sz w:val="20"/>
-          <w:szCs w:val="20"/>
-          <w:shd w:fill="F2F2F2" w:val="clear"/>
-        </w:rPr>
-        <w:t xml:space="preserve">DIMENSION_NEDSTROMS_RESERV = False</w:t>
-      </w:r>
-      <w:r>
-        <w:t xml:space="preserve">) i KONFIG.</w:t>
+        <w:t xml:space="preserve">Formler.</w:t>
+      </w:r>
+      <w:r>
+        <w:t xml:space="preserve"> Talen i Sammanfattning och Kostnad per schaktgrupp är Excel-formler (SUMIFS/COUNTIFS) mot fliken Ledningar, och radtotalerna i Ledningar (Alt. lägg om, Infodring totalt, Rörspräckning totalt, Alt. schaktfritt) är formler av delposterna på raden. Ändras en delpost eller ett meterpris i Ledningar räknas summorna om när filen räknas (Excel gör det när filen öppnas). Kostnaden per schakttyp och priserna i Kostnadsposter är fasta tal – vill man prova andra priser körs ledning_analys.py om med en ändrad kostnadsfil.</w:t>
       </w:r>
     </w:p>
     <w:p>
@@ -16802,7 +16754,62 @@
         <w:spacing w:after="80"/>
       </w:pPr>
       <w:r>
-        <w:t xml:space="preserve">Summorna omfattar bara ledningar som har kostnad i båda alternativen, så att de går att jämföra. Ledningar där dimensionen saknas eller prislistan inte räcker räknas under *Utan kostnad* och listas i fliken Datakvalitet. Saknas djupet räknas omläggningen utan djuptillägg och det står i anmärkningen.</w:t>
+        <w:rPr>
+          <w:b/>
+          <w:bCs/>
+        </w:rPr>
+        <w:t xml:space="preserve">Saknad dimension.</w:t>
+      </w:r>
+      <w:r>
+        <w:t xml:space="preserve"> Saknar en ledning dimension i GIS antas den ha samma dimension som ledningen uppströms av samma system (spill, dag, kombinerat eller vatten) – den som ansluter i ledningens uppströms ände. Flödesriktningen tas ur vattengången, annars ritriktningen. Flyter flera ledningar in tas den största. En kedja av ledningar utan dimension fylls steg för steg uppifrån. Finns ingen ledning uppströms med dimension tas ledningen nedströms. Dimension 0 i GIS räknas som saknad. Kolumnen *Dimension antagen från* bredvid Dimension och anmärkningen säger vilken ledning dimensionen kommer från (t.ex. *Ø 225 antagen från uppströms ledning SSL123*), fliken Datakvalitet listar dem och </w:t>
+      </w:r>
+      <w:r>
+        <w:rPr>
+          <w:rFonts w:ascii="Consolas" w:cs="Consolas" w:eastAsia="Consolas" w:hAnsi="Consolas"/>
+          <w:sz w:val="20"/>
+          <w:szCs w:val="20"/>
+          <w:shd w:fill="F2F2F2" w:val="clear"/>
+        </w:rPr>
+        <w:t xml:space="preserve">ledningsresultat.json</w:t>
+      </w:r>
+      <w:r>
+        <w:t xml:space="preserve"> har både den använda dimensionen och GIS-värdet (</w:t>
+      </w:r>
+      <w:r>
+        <w:rPr>
+          <w:rFonts w:ascii="Consolas" w:cs="Consolas" w:eastAsia="Consolas" w:hAnsi="Consolas"/>
+          <w:sz w:val="20"/>
+          <w:szCs w:val="20"/>
+          <w:shd w:fill="F2F2F2" w:val="clear"/>
+        </w:rPr>
+        <w:t xml:space="preserve">dimension_gis</w:t>
+      </w:r>
+      <w:r>
+        <w:t xml:space="preserve">). Stäng av med </w:t>
+      </w:r>
+      <w:r>
+        <w:rPr>
+          <w:rFonts w:ascii="Consolas" w:cs="Consolas" w:eastAsia="Consolas" w:hAnsi="Consolas"/>
+          <w:sz w:val="20"/>
+          <w:szCs w:val="20"/>
+          <w:shd w:fill="F2F2F2" w:val="clear"/>
+        </w:rPr>
+        <w:t xml:space="preserve">DIMENSION_UR_GRANNE = False</w:t>
+      </w:r>
+      <w:r>
+        <w:t xml:space="preserve"> (bara nedströms-reserven: </w:t>
+      </w:r>
+      <w:r>
+        <w:rPr>
+          <w:rFonts w:ascii="Consolas" w:cs="Consolas" w:eastAsia="Consolas" w:hAnsi="Consolas"/>
+          <w:sz w:val="20"/>
+          <w:szCs w:val="20"/>
+          <w:shd w:fill="F2F2F2" w:val="clear"/>
+        </w:rPr>
+        <w:t xml:space="preserve">DIMENSION_NEDSTROMS_RESERV = False</w:t>
+      </w:r>
+      <w:r>
+        <w:t xml:space="preserve">) i KONFIG.</w:t>
       </w:r>
     </w:p>
     <w:p>
@@ -16815,14 +16822,7 @@
         <w:spacing w:after="80"/>
       </w:pPr>
       <w:r>
-        <w:rPr>
-          <w:b/>
-          <w:bCs/>
-        </w:rPr>
-        <w:t xml:space="preserve">Kostnadsfilen `kostnader_inventering.csv`</w:t>
-      </w:r>
-      <w:r>
-        <w:t xml:space="preserve"> har kolumnerna post, schakttyp, ledningar, storre (antal större än 400 mm i graven), system, dimension från/till, enhet, kr och kommentar; rubrikraden styr ordningen och en tom cell gäller alla. Posterna är infodring, servis_infodring, schakt, djuptillagg, servis_helschakt, servis_tillagg, rorsprackning, inforingsgrop, maskingrop, servisgrop, brunn_ny, aterstallning, slagen_spont (kr/m²), framschaktning och ny_brunn. Belopp som inte finns i kalkylverktyget är märkta ANTAGET eller SCHABLON i kommentaren, och sammanfattningen listar dem.</w:t>
+        <w:t xml:space="preserve">Summorna omfattar bara ledningar som har kostnad i båda alternativen, så att de går att jämföra. Ledningar där dimensionen saknas eller prislistan inte räcker räknas under *Utan kostnad* och listas i fliken Datakvalitet. Saknas djupet räknas omläggningen utan djuptillägg och det står i anmärkningen.</w:t>
       </w:r>
     </w:p>
     <w:p>
@@ -16836,38 +16836,43 @@
       </w:pPr>
       <w:r>
         <w:rPr>
-          <w:rFonts w:ascii="Consolas" w:cs="Consolas" w:eastAsia="Consolas" w:hAnsi="Consolas"/>
-          <w:sz w:val="20"/>
-          <w:szCs w:val="20"/>
-          <w:shd w:fill="F2F2F2" w:val="clear"/>
-        </w:rPr>
-        <w:t xml:space="preserve">ledningsresultat.json</w:t>
-      </w:r>
-      <w:r>
-        <w:t xml:space="preserve"> har djup, serviser, schaktgrupp och kostnaderna per ledning (lager, OID, del), även alt. lägg om per schakttyp – underlaget för att fylla fält i kartan i ett senare steg.</w:t>
-      </w:r>
-    </w:p>
-    <w:p>
-      <w:pPr>
-        <w:pStyle w:val="Heading1"/>
-      </w:pPr>
-      <w:r>
-        <w:t xml:space="preserve">8. Vanliga frågor</w:t>
-      </w:r>
-    </w:p>
-    <w:p>
-      <w:pPr>
-        <w:spacing w:after="120"/>
-      </w:pPr>
-      <w:r>
-        <w:rPr>
           <w:b/>
           <w:bCs/>
         </w:rPr>
-        <w:t xml:space="preserve">PDF-rapporterna saknar bilder.</w:t>
-      </w:r>
-      <w:r>
-        <w:t xml:space="preserve"> Bilderna hämtas från samma mediamappar som länkarna i Excel; bara bilder som hittats tas med, och terminalen anger hur många filmer och bilder som hittades. Positionerna i rapporten räknas från den brunn kameran startade i (Kamera från), precis som i entreprenörens protokoll, medan Startbrunn/Slutbrunn anger uppströms/nedströms.</w:t>
+        <w:t xml:space="preserve">Kostnadsfilen `kostnader_inventering.csv`</w:t>
+      </w:r>
+      <w:r>
+        <w:t xml:space="preserve"> har kolumnerna post, schakttyp, ledningar, storre (antal större än 400 mm i graven), system, dimension från/till, enhet, kr och kommentar; rubrikraden styr ordningen och en tom cell gäller alla. Posterna är infodring, servis_infodring, schakt, djuptillagg, servis_helschakt, servis_tillagg, rorsprackning, inforingsgrop, maskingrop, servisgrop, brunn_ny, aterstallning, slagen_spont (kr/m²), framschaktning och ny_brunn. Belopp som inte finns i kalkylverktyget är märkta ANTAGET eller SCHABLON i kommentaren, och sammanfattningen listar dem.</w:t>
+      </w:r>
+    </w:p>
+    <w:p>
+      <w:pPr>
+        <w:pStyle w:val="ListParagraph"/>
+        <w:numPr>
+          <w:ilvl w:val="0"/>
+          <w:numId w:val="3"/>
+        </w:numPr>
+        <w:spacing w:after="80"/>
+      </w:pPr>
+      <w:r>
+        <w:rPr>
+          <w:rFonts w:ascii="Consolas" w:cs="Consolas" w:eastAsia="Consolas" w:hAnsi="Consolas"/>
+          <w:sz w:val="20"/>
+          <w:szCs w:val="20"/>
+          <w:shd w:fill="F2F2F2" w:val="clear"/>
+        </w:rPr>
+        <w:t xml:space="preserve">ledningsresultat.json</w:t>
+      </w:r>
+      <w:r>
+        <w:t xml:space="preserve"> har djup, serviser, schaktgrupp och kostnaderna per ledning (lager, OID, del), även alt. lägg om per schakttyp – underlaget för att fylla fält i kartan i ett senare steg.</w:t>
+      </w:r>
+    </w:p>
+    <w:p>
+      <w:pPr>
+        <w:pStyle w:val="Heading1"/>
+      </w:pPr>
+      <w:r>
+        <w:t xml:space="preserve">8. Vanliga frågor</w:t>
       </w:r>
     </w:p>
     <w:p>
@@ -16879,106 +16884,10 @@
           <w:b/>
           <w:bCs/>
         </w:rPr>
-        <w:t xml:space="preserve">Körningen tar lång tid.</w:t>
-      </w:r>
-      <w:r>
-        <w:t xml:space="preserve"> PDF-rapporterna skrivs parallellt i flera processer (</w:t>
-      </w:r>
-      <w:r>
-        <w:rPr>
-          <w:rFonts w:ascii="Consolas" w:cs="Consolas" w:eastAsia="Consolas" w:hAnsi="Consolas"/>
-          <w:sz w:val="20"/>
-          <w:szCs w:val="20"/>
-          <w:shd w:fill="F2F2F2" w:val="clear"/>
-        </w:rPr>
-        <w:t xml:space="preserve">--processer</w:t>
-      </w:r>
-      <w:r>
-        <w:t xml:space="preserve">), fotona förminskas till rapportstorlek innan de bäddas in (</w:t>
-      </w:r>
-      <w:r>
-        <w:rPr>
-          <w:rFonts w:ascii="Consolas" w:cs="Consolas" w:eastAsia="Consolas" w:hAnsi="Consolas"/>
-          <w:sz w:val="20"/>
-          <w:szCs w:val="20"/>
-          <w:shd w:fill="F2F2F2" w:val="clear"/>
-        </w:rPr>
-        <w:t xml:space="preserve">FOTO_MAX_PX</w:t>
-      </w:r>
-      <w:r>
-        <w:t xml:space="preserve">, standard 960 px på längsta sidan – 290 dpi i A4) och bilddata lagras binärt i stället för textkodat. DUF 701 med 488 foton i full HD tar ungefär en halv minut på en dator med fyra kärnor, mot tre och en halv minut tidigare, och rapportmappen blir mindre än en sjundedel så stor. Vill ni ha ännu mindre filer: sänk </w:t>
-      </w:r>
-      <w:r>
-        <w:rPr>
-          <w:rFonts w:ascii="Consolas" w:cs="Consolas" w:eastAsia="Consolas" w:hAnsi="Consolas"/>
-          <w:sz w:val="20"/>
-          <w:szCs w:val="20"/>
-          <w:shd w:fill="F2F2F2" w:val="clear"/>
-        </w:rPr>
-        <w:t xml:space="preserve">FOTO_MAX_PX</w:t>
-      </w:r>
-      <w:r>
-        <w:t xml:space="preserve"> till 800 eller </w:t>
-      </w:r>
-      <w:r>
-        <w:rPr>
-          <w:rFonts w:ascii="Consolas" w:cs="Consolas" w:eastAsia="Consolas" w:hAnsi="Consolas"/>
-          <w:sz w:val="20"/>
-          <w:szCs w:val="20"/>
-          <w:shd w:fill="F2F2F2" w:val="clear"/>
-        </w:rPr>
-        <w:t xml:space="preserve">FOTO_JPEG_KVALITET</w:t>
-      </w:r>
-      <w:r>
-        <w:t xml:space="preserve"> till 70 i KONFIG – fotona är det som tar plats, diagrambilderna är små. Använd dessutom </w:t>
-      </w:r>
-      <w:r>
-        <w:rPr>
-          <w:rFonts w:ascii="Consolas" w:cs="Consolas" w:eastAsia="Consolas" w:hAnsi="Consolas"/>
-          <w:sz w:val="20"/>
-          <w:szCs w:val="20"/>
-          <w:shd w:fill="F2F2F2" w:val="clear"/>
-        </w:rPr>
-        <w:t xml:space="preserve">--behall-rapporter</w:t>
-      </w:r>
-      <w:r>
-        <w:t xml:space="preserve"> vid omkörningar så skrivs bara rapporter som saknas, </w:t>
-      </w:r>
-      <w:r>
-        <w:rPr>
-          <w:rFonts w:ascii="Consolas" w:cs="Consolas" w:eastAsia="Consolas" w:hAnsi="Consolas"/>
-          <w:sz w:val="20"/>
-          <w:szCs w:val="20"/>
-          <w:shd w:fill="F2F2F2" w:val="clear"/>
-        </w:rPr>
-        <w:t xml:space="preserve">--rapporter AB</w:t>
-      </w:r>
-      <w:r>
-        <w:t xml:space="preserve"> för att bara skapa rapporter för sträckor i klass A och B, eller </w:t>
-      </w:r>
-      <w:r>
-        <w:rPr>
-          <w:rFonts w:ascii="Consolas" w:cs="Consolas" w:eastAsia="Consolas" w:hAnsi="Consolas"/>
-          <w:sz w:val="20"/>
-          <w:szCs w:val="20"/>
-          <w:shd w:fill="F2F2F2" w:val="clear"/>
-        </w:rPr>
-        <w:t xml:space="preserve">--rapporter inga</w:t>
-      </w:r>
-      <w:r>
-        <w:t xml:space="preserve"> när du bara vill uppdatera Excel-filen. Sätt </w:t>
-      </w:r>
-      <w:r>
-        <w:rPr>
-          <w:rFonts w:ascii="Consolas" w:cs="Consolas" w:eastAsia="Consolas" w:hAnsi="Consolas"/>
-          <w:sz w:val="20"/>
-          <w:szCs w:val="20"/>
-          <w:shd w:fill="F2F2F2" w:val="clear"/>
-        </w:rPr>
-        <w:t xml:space="preserve">FOTO_MAX_PX = None</w:t>
-      </w:r>
-      <w:r>
-        <w:t xml:space="preserve"> i KONFIG om fotona ska bäddas in i originalstorlek.</w:t>
+        <w:t xml:space="preserve">PDF-rapporterna saknar bilder.</w:t>
+      </w:r>
+      <w:r>
+        <w:t xml:space="preserve"> Bilderna hämtas från samma mediamappar som länkarna i Excel; bara bilder som hittats tas med, och terminalen anger hur många filmer och bilder som hittades. Positionerna i rapporten räknas från den brunn kameran startade i (Kamera från), precis som i entreprenörens protokoll, medan Startbrunn/Slutbrunn anger uppströms/nedströms.</w:t>
       </w:r>
     </w:p>
     <w:p>
@@ -16990,10 +16899,106 @@
           <w:b/>
           <w:bCs/>
         </w:rPr>
-        <w:t xml:space="preserve">Åäö blir fel i resultatet.</w:t>
-      </w:r>
-      <w:r>
-        <w:t xml:space="preserve"> TV3-filer är normalt sparade i Windows-1252/ISO-8859-1. Skriptet provar UTF-8 först och faller sedan tillbaka till Windows-1252, så det ska fungera automatiskt. Om en fil ändå blir fel: öppna den i Anteckningar och spara om som UTF-8.</w:t>
+        <w:t xml:space="preserve">Körningen tar lång tid.</w:t>
+      </w:r>
+      <w:r>
+        <w:t xml:space="preserve"> PDF-rapporterna skrivs parallellt i flera processer (</w:t>
+      </w:r>
+      <w:r>
+        <w:rPr>
+          <w:rFonts w:ascii="Consolas" w:cs="Consolas" w:eastAsia="Consolas" w:hAnsi="Consolas"/>
+          <w:sz w:val="20"/>
+          <w:szCs w:val="20"/>
+          <w:shd w:fill="F2F2F2" w:val="clear"/>
+        </w:rPr>
+        <w:t xml:space="preserve">--processer</w:t>
+      </w:r>
+      <w:r>
+        <w:t xml:space="preserve">), fotona förminskas till rapportstorlek innan de bäddas in (</w:t>
+      </w:r>
+      <w:r>
+        <w:rPr>
+          <w:rFonts w:ascii="Consolas" w:cs="Consolas" w:eastAsia="Consolas" w:hAnsi="Consolas"/>
+          <w:sz w:val="20"/>
+          <w:szCs w:val="20"/>
+          <w:shd w:fill="F2F2F2" w:val="clear"/>
+        </w:rPr>
+        <w:t xml:space="preserve">FOTO_MAX_PX</w:t>
+      </w:r>
+      <w:r>
+        <w:t xml:space="preserve">, standard 960 px på längsta sidan – 290 dpi i A4) och bilddata lagras binärt i stället för textkodat. DUF 701 med 488 foton i full HD tar ungefär en halv minut på en dator med fyra kärnor, mot tre och en halv minut tidigare, och rapportmappen blir mindre än en sjundedel så stor. Vill ni ha ännu mindre filer: sänk </w:t>
+      </w:r>
+      <w:r>
+        <w:rPr>
+          <w:rFonts w:ascii="Consolas" w:cs="Consolas" w:eastAsia="Consolas" w:hAnsi="Consolas"/>
+          <w:sz w:val="20"/>
+          <w:szCs w:val="20"/>
+          <w:shd w:fill="F2F2F2" w:val="clear"/>
+        </w:rPr>
+        <w:t xml:space="preserve">FOTO_MAX_PX</w:t>
+      </w:r>
+      <w:r>
+        <w:t xml:space="preserve"> till 800 eller </w:t>
+      </w:r>
+      <w:r>
+        <w:rPr>
+          <w:rFonts w:ascii="Consolas" w:cs="Consolas" w:eastAsia="Consolas" w:hAnsi="Consolas"/>
+          <w:sz w:val="20"/>
+          <w:szCs w:val="20"/>
+          <w:shd w:fill="F2F2F2" w:val="clear"/>
+        </w:rPr>
+        <w:t xml:space="preserve">FOTO_JPEG_KVALITET</w:t>
+      </w:r>
+      <w:r>
+        <w:t xml:space="preserve"> till 70 i KONFIG – fotona är det som tar plats, diagrambilderna är små. Använd dessutom </w:t>
+      </w:r>
+      <w:r>
+        <w:rPr>
+          <w:rFonts w:ascii="Consolas" w:cs="Consolas" w:eastAsia="Consolas" w:hAnsi="Consolas"/>
+          <w:sz w:val="20"/>
+          <w:szCs w:val="20"/>
+          <w:shd w:fill="F2F2F2" w:val="clear"/>
+        </w:rPr>
+        <w:t xml:space="preserve">--behall-rapporter</w:t>
+      </w:r>
+      <w:r>
+        <w:t xml:space="preserve"> vid omkörningar så skrivs bara rapporter som saknas, </w:t>
+      </w:r>
+      <w:r>
+        <w:rPr>
+          <w:rFonts w:ascii="Consolas" w:cs="Consolas" w:eastAsia="Consolas" w:hAnsi="Consolas"/>
+          <w:sz w:val="20"/>
+          <w:szCs w:val="20"/>
+          <w:shd w:fill="F2F2F2" w:val="clear"/>
+        </w:rPr>
+        <w:t xml:space="preserve">--rapporter AB</w:t>
+      </w:r>
+      <w:r>
+        <w:t xml:space="preserve"> för att bara skapa rapporter för sträckor i klass A och B, eller </w:t>
+      </w:r>
+      <w:r>
+        <w:rPr>
+          <w:rFonts w:ascii="Consolas" w:cs="Consolas" w:eastAsia="Consolas" w:hAnsi="Consolas"/>
+          <w:sz w:val="20"/>
+          <w:szCs w:val="20"/>
+          <w:shd w:fill="F2F2F2" w:val="clear"/>
+        </w:rPr>
+        <w:t xml:space="preserve">--rapporter inga</w:t>
+      </w:r>
+      <w:r>
+        <w:t xml:space="preserve"> när du bara vill uppdatera Excel-filen. Sätt </w:t>
+      </w:r>
+      <w:r>
+        <w:rPr>
+          <w:rFonts w:ascii="Consolas" w:cs="Consolas" w:eastAsia="Consolas" w:hAnsi="Consolas"/>
+          <w:sz w:val="20"/>
+          <w:szCs w:val="20"/>
+          <w:shd w:fill="F2F2F2" w:val="clear"/>
+        </w:rPr>
+        <w:t xml:space="preserve">FOTO_MAX_PX = None</w:t>
+      </w:r>
+      <w:r>
+        <w:t xml:space="preserve"> i KONFIG om fotona ska bäddas in i originalstorlek.</w:t>
       </w:r>
     </w:p>
     <w:p>
@@ -17005,119 +17010,83 @@
           <w:b/>
           <w:bCs/>
         </w:rPr>
-        <w:t xml:space="preserve">Samma sträcka finns flera gånger i listan.</w:t>
-      </w:r>
-      <w:r>
-        <w:t xml:space="preserve"> Det händer när entreprenören filmat om efter spolning eller från andra hållet efter ett avbrott. Kolumnen Inspekterad flera ggr markerar dessa och kolumnen </w:t>
-      </w:r>
+        <w:t xml:space="preserve">Åäö blir fel i resultatet.</w:t>
+      </w:r>
+      <w:r>
+        <w:t xml:space="preserve"> TV3-filer är normalt sparade i Windows-1252/ISO-8859-1. Skriptet provar UTF-8 först och faller sedan tillbaka till Windows-1252, så det ska fungera automatiskt. Om en fil ändå blir fel: öppna den i Anteckningar och spara om som UTF-8.</w:t>
+      </w:r>
+    </w:p>
+    <w:p>
+      <w:pPr>
+        <w:spacing w:after="120"/>
+      </w:pPr>
       <w:r>
         <w:rPr>
           <w:b/>
           <w:bCs/>
         </w:rPr>
-        <w:t xml:space="preserve">Filmstatus</w:t>
-      </w:r>
-      <w:r>
-        <w:t xml:space="preserve"> säger hur de hanterats: en hel film ersätter ofullständiga filmer och äldre hela filmer av samma brunnspar (*ersatt av nr X*), och två ofullständiga filmer från var sin brunn slås ihop till en extra sträcka (*sammanslagen av nr 72 + 73*) med alla observationer på en gemensam axel från startbrunnen – delfilmerna markeras *ingår i sammanslagen nr Y*. Finns kartlängd (markprofil eller GIS-data) används den för totallängd och överlapp: i överlappet gäller den nyare filmens observationer och den äldre filmens löpande skador kapas vid snittet. Annars antas filmerna mötas utan överlapp, och ett hinder som båda kamerorna stannade vid räknas en gång. Varje rad i den sammanslagna sträckans observationstabell anger vilken film den kommer från (och länkar till just den filmen i fliken Observationer), kolumnen Videofil 2 i Prioritering länkar till den andra filmen, och översikten i protokollet ritar de två filmernas täckning i olika ton med en streckad skarvlinje där de möts (överlapp skrafferat, ofilmad lucka vit) samt en pil per film med brunn och täckt del. Datum och klockslag tas från den nyare filmen. Ersatta filmer ligger kvar i Prioritering utan rang och får egna protokoll, men räknas inte i statistik, karta, åtgärdspaket eller inspektionsgrad. Delfilmerna i en sammanslagning redovisas bara genom den sammanslagna sträckan (en rad, ett protokoll, observationerna med *film nr X* i kommentaren); vill du ha dem var för sig också sätter du </w:t>
-      </w:r>
-      <w:r>
-        <w:rPr>
-          <w:rFonts w:ascii="Consolas" w:cs="Consolas" w:eastAsia="Consolas" w:hAnsi="Consolas"/>
-          <w:sz w:val="20"/>
-          <w:szCs w:val="20"/>
-          <w:shd w:fill="F2F2F2" w:val="clear"/>
-        </w:rPr>
-        <w:t xml:space="preserve">DELFILMER_SEPARAT = True</w:t>
-      </w:r>
-      <w:r>
-        <w:t xml:space="preserve"> i KONFIG. En nyare hel film ersätter en äldre bara om den är minst 85 % av den äldres längd (</w:t>
-      </w:r>
-      <w:r>
-        <w:rPr>
-          <w:rFonts w:ascii="Consolas" w:cs="Consolas" w:eastAsia="Consolas" w:hAnsi="Consolas"/>
-          <w:sz w:val="20"/>
-          <w:szCs w:val="20"/>
-          <w:shd w:fill="F2F2F2" w:val="clear"/>
-        </w:rPr>
-        <w:t xml:space="preserve">OMFILMNING_MIN_ANDEL</w:t>
-      </w:r>
-      <w:r>
-        <w:t xml:space="preserve">); stäng av med </w:t>
-      </w:r>
-      <w:r>
-        <w:rPr>
-          <w:rFonts w:ascii="Consolas" w:cs="Consolas" w:eastAsia="Consolas" w:hAnsi="Consolas"/>
-          <w:sz w:val="20"/>
-          <w:szCs w:val="20"/>
-          <w:shd w:fill="F2F2F2" w:val="clear"/>
-        </w:rPr>
-        <w:t xml:space="preserve">OMFILMNING = False</w:t>
-      </w:r>
-      <w:r>
-        <w:t xml:space="preserve"> respektive </w:t>
-      </w:r>
-      <w:r>
-        <w:rPr>
-          <w:rFonts w:ascii="Consolas" w:cs="Consolas" w:eastAsia="Consolas" w:hAnsi="Consolas"/>
-          <w:sz w:val="20"/>
-          <w:szCs w:val="20"/>
-          <w:shd w:fill="F2F2F2" w:val="clear"/>
-        </w:rPr>
-        <w:t xml:space="preserve">SAMMANSLAGNING = False</w:t>
-      </w:r>
-      <w:r>
-        <w:t xml:space="preserve"> i KONFIG.</w:t>
-      </w:r>
-    </w:p>
-    <w:p>
-      <w:pPr>
-        <w:spacing w:after="120"/>
-      </w:pPr>
+        <w:t xml:space="preserve">Samma sträcka finns flera gånger i listan.</w:t>
+      </w:r>
+      <w:r>
+        <w:t xml:space="preserve"> Det händer när entreprenören filmat om efter spolning eller från andra hållet efter ett avbrott. Kolumnen Inspekterad flera ggr markerar dessa och kolumnen </w:t>
+      </w:r>
       <w:r>
         <w:rPr>
           <w:b/>
           <w:bCs/>
         </w:rPr>
-        <w:t xml:space="preserve">Lutningen är tusentals promille och profilen ser orimlig ut.</w:t>
-      </w:r>
-      <w:r>
-        <w:t xml:space="preserve"> Då är höjderna fel i TV3-filen – brunnshöjderna i PROFILADM eller inklinometerns absoluta höjder ligger i fel storleksordning (t.ex. 29,30 och 2 444,33 m) eller är ett saknat-värde som −9999. Analysen kontrollerar detta vid inläsningen: höjder under </w:t>
-      </w:r>
-      <w:r>
-        <w:rPr>
-          <w:rFonts w:ascii="Consolas" w:cs="Consolas" w:eastAsia="Consolas" w:hAnsi="Consolas"/>
-          <w:sz w:val="20"/>
-          <w:szCs w:val="20"/>
-          <w:shd w:fill="F2F2F2" w:val="clear"/>
-        </w:rPr>
-        <w:t xml:space="preserve">HOJD_SAKNAS_UNDER</w:t>
-      </w:r>
-      <w:r>
-        <w:t xml:space="preserve"> räknas som saknade, och skiljer brunnshöjderna mer än </w:t>
-      </w:r>
-      <w:r>
-        <w:rPr>
-          <w:rFonts w:ascii="Consolas" w:cs="Consolas" w:eastAsia="Consolas" w:hAnsi="Consolas"/>
-          <w:sz w:val="20"/>
-          <w:szCs w:val="20"/>
-          <w:shd w:fill="F2F2F2" w:val="clear"/>
-        </w:rPr>
-        <w:t xml:space="preserve">HOJD_ORIMLIG_M</w:t>
-      </w:r>
-      <w:r>
-        <w:t xml:space="preserve"> (50 m) eller spänner profilen över mer än så används de inte. Sträckan får Höjdflagga *Höjdfel i filen: …* (kolumnen i Prioritering, fältet </w:t>
-      </w:r>
-      <w:r>
-        <w:rPr>
-          <w:rFonts w:ascii="Consolas" w:cs="Consolas" w:eastAsia="Consolas" w:hAnsi="Consolas"/>
-          <w:sz w:val="20"/>
-          <w:szCs w:val="20"/>
-          <w:shd w:fill="F2F2F2" w:val="clear"/>
-        </w:rPr>
-        <w:t xml:space="preserve">hojdfel</w:t>
-      </w:r>
-      <w:r>
-        <w:t xml:space="preserve"> i kartunderlaget, raden Höjdfel i protokollet och raden Höjdfel i TV3-filen i Sammanfattning), lutningen blir *okänd (höjdfel i filen)* och profilen ritas inte. Är bara brunnshöjderna fel men inklinometern hel räknas lutningen på inklinometerns ändpunkter (*ur inklinometern* i protokollet) och profilen ritas med en OBS om att den inte kunnat kontrolleras mot brunnshöjderna. Konsolen listar sträckorna med OBS per fil. Rätta gärna höjderna i filen eller hämta vattengången från GIS (Exportera GIS-data) så att höjdanpassningen tar över.</w:t>
+        <w:t xml:space="preserve">Filmstatus</w:t>
+      </w:r>
+      <w:r>
+        <w:t xml:space="preserve"> säger hur de hanterats: en hel film ersätter ofullständiga filmer och äldre hela filmer av samma brunnspar (*ersatt av nr X*), och två ofullständiga filmer från var sin brunn slås ihop till en extra sträcka (*sammanslagen av nr 72 + 73*) med alla observationer på en gemensam axel från startbrunnen – delfilmerna markeras *ingår i sammanslagen nr Y*. Finns kartlängd (markprofil eller GIS-data) används den för totallängd och överlapp: i överlappet gäller den nyare filmens observationer och den äldre filmens löpande skador kapas vid snittet. Annars antas filmerna mötas utan överlapp, och ett hinder som båda kamerorna stannade vid räknas en gång. Varje rad i den sammanslagna sträckans observationstabell anger vilken film den kommer från (och länkar till just den filmen i fliken Observationer), kolumnen Videofil 2 i Prioritering länkar till den andra filmen, och översikten i protokollet ritar de två filmernas täckning i olika ton med en streckad skarvlinje där de möts (överlapp skrafferat, ofilmad lucka vit) samt en pil per film med brunn och täckt del. Datum och klockslag tas från den nyare filmen. Ersatta filmer ligger kvar i Prioritering utan rang och får egna protokoll, men räknas inte i statistik, karta, åtgärdspaket eller inspektionsgrad. Delfilmerna i en sammanslagning redovisas bara genom den sammanslagna sträckan (en rad, ett protokoll, observationerna med *film nr X* i kommentaren); vill du ha dem var för sig också sätter du </w:t>
+      </w:r>
+      <w:r>
+        <w:rPr>
+          <w:rFonts w:ascii="Consolas" w:cs="Consolas" w:eastAsia="Consolas" w:hAnsi="Consolas"/>
+          <w:sz w:val="20"/>
+          <w:szCs w:val="20"/>
+          <w:shd w:fill="F2F2F2" w:val="clear"/>
+        </w:rPr>
+        <w:t xml:space="preserve">DELFILMER_SEPARAT = True</w:t>
+      </w:r>
+      <w:r>
+        <w:t xml:space="preserve"> i KONFIG. En nyare hel film ersätter en äldre bara om den är minst 85 % av den äldres längd (</w:t>
+      </w:r>
+      <w:r>
+        <w:rPr>
+          <w:rFonts w:ascii="Consolas" w:cs="Consolas" w:eastAsia="Consolas" w:hAnsi="Consolas"/>
+          <w:sz w:val="20"/>
+          <w:szCs w:val="20"/>
+          <w:shd w:fill="F2F2F2" w:val="clear"/>
+        </w:rPr>
+        <w:t xml:space="preserve">OMFILMNING_MIN_ANDEL</w:t>
+      </w:r>
+      <w:r>
+        <w:t xml:space="preserve">); stäng av med </w:t>
+      </w:r>
+      <w:r>
+        <w:rPr>
+          <w:rFonts w:ascii="Consolas" w:cs="Consolas" w:eastAsia="Consolas" w:hAnsi="Consolas"/>
+          <w:sz w:val="20"/>
+          <w:szCs w:val="20"/>
+          <w:shd w:fill="F2F2F2" w:val="clear"/>
+        </w:rPr>
+        <w:t xml:space="preserve">OMFILMNING = False</w:t>
+      </w:r>
+      <w:r>
+        <w:t xml:space="preserve"> respektive </w:t>
+      </w:r>
+      <w:r>
+        <w:rPr>
+          <w:rFonts w:ascii="Consolas" w:cs="Consolas" w:eastAsia="Consolas" w:hAnsi="Consolas"/>
+          <w:sz w:val="20"/>
+          <w:szCs w:val="20"/>
+          <w:shd w:fill="F2F2F2" w:val="clear"/>
+        </w:rPr>
+        <w:t xml:space="preserve">SAMMANSLAGNING = False</w:t>
+      </w:r>
+      <w:r>
+        <w:t xml:space="preserve"> i KONFIG.</w:t>
       </w:r>
     </w:p>
     <w:p>
@@ -17129,71 +17098,95 @@
           <w:b/>
           <w:bCs/>
         </w:rPr>
-        <w:t xml:space="preserve">Samma sträcka finns i flera TV3-filer (ny inspektion ett senare år).</w:t>
-      </w:r>
-      <w:r>
-        <w:t xml:space="preserve"> Analyserar du flera filer tillsammans gäller den nyaste filmen av brunnsparet oavsett fil (</w:t>
-      </w:r>
-      <w:r>
-        <w:rPr>
-          <w:rFonts w:ascii="Consolas" w:cs="Consolas" w:eastAsia="Consolas" w:hAnsi="Consolas"/>
-          <w:sz w:val="20"/>
-          <w:szCs w:val="20"/>
-          <w:shd w:fill="F2F2F2" w:val="clear"/>
-        </w:rPr>
-        <w:t xml:space="preserve">OMFILMNING_OVER_FILER</w:t>
-      </w:r>
-      <w:r>
-        <w:t xml:space="preserve">). Den äldre raden ligger kvar i Prioritering utan rang med Filmstatus *ersatt av ny inspektion nr X i FIL datum* och räknas inte i statistik, karta, åtgärdspaket eller inspektionsgrad, men behåller sitt protokoll. Den gällande sträckan får kolumnen </w:t>
-      </w:r>
+        <w:t xml:space="preserve">Lutningen är tusentals promille och profilen ser orimlig ut.</w:t>
+      </w:r>
+      <w:r>
+        <w:t xml:space="preserve"> Då är höjderna fel i TV3-filen – brunnshöjderna i PROFILADM eller inklinometerns absoluta höjder ligger i fel storleksordning (t.ex. 29,30 och 2 444,33 m) eller är ett saknat-värde som −9999. Analysen kontrollerar detta vid inläsningen: höjder under </w:t>
+      </w:r>
+      <w:r>
+        <w:rPr>
+          <w:rFonts w:ascii="Consolas" w:cs="Consolas" w:eastAsia="Consolas" w:hAnsi="Consolas"/>
+          <w:sz w:val="20"/>
+          <w:szCs w:val="20"/>
+          <w:shd w:fill="F2F2F2" w:val="clear"/>
+        </w:rPr>
+        <w:t xml:space="preserve">HOJD_SAKNAS_UNDER</w:t>
+      </w:r>
+      <w:r>
+        <w:t xml:space="preserve"> räknas som saknade, och skiljer brunnshöjderna mer än </w:t>
+      </w:r>
+      <w:r>
+        <w:rPr>
+          <w:rFonts w:ascii="Consolas" w:cs="Consolas" w:eastAsia="Consolas" w:hAnsi="Consolas"/>
+          <w:sz w:val="20"/>
+          <w:szCs w:val="20"/>
+          <w:shd w:fill="F2F2F2" w:val="clear"/>
+        </w:rPr>
+        <w:t xml:space="preserve">HOJD_ORIMLIG_M</w:t>
+      </w:r>
+      <w:r>
+        <w:t xml:space="preserve"> (50 m) eller spänner profilen över mer än så används de inte. Sträckan får Höjdflagga *Höjdfel i filen: …* (kolumnen i Prioritering, fältet </w:t>
+      </w:r>
+      <w:r>
+        <w:rPr>
+          <w:rFonts w:ascii="Consolas" w:cs="Consolas" w:eastAsia="Consolas" w:hAnsi="Consolas"/>
+          <w:sz w:val="20"/>
+          <w:szCs w:val="20"/>
+          <w:shd w:fill="F2F2F2" w:val="clear"/>
+        </w:rPr>
+        <w:t xml:space="preserve">hojdfel</w:t>
+      </w:r>
+      <w:r>
+        <w:t xml:space="preserve"> i kartunderlaget, raden Höjdfel i protokollet och raden Höjdfel i TV3-filen i Sammanfattning), lutningen blir *okänd (höjdfel i filen)* och profilen ritas inte. Är bara brunnshöjderna fel men inklinometern hel räknas lutningen på inklinometerns ändpunkter (*ur inklinometern* i protokollet) och profilen ritas med en OBS om att den inte kunnat kontrolleras mot brunnshöjderna. Konsolen listar sträckorna med OBS per fil. Rätta gärna höjderna i filen eller hämta vattengången från GIS (Exportera GIS-data) så att höjdanpassningen tar över.</w:t>
+      </w:r>
+    </w:p>
+    <w:p>
+      <w:pPr>
+        <w:spacing w:after="120"/>
+      </w:pPr>
       <w:r>
         <w:rPr>
           <w:b/>
           <w:bCs/>
         </w:rPr>
-        <w:t xml:space="preserve">Tidigare inspektion</w:t>
-      </w:r>
-      <w:r>
-        <w:t xml:space="preserve"> – t.ex. *2021-05-27 (DUF 701.TV3 nr 12): C 21 → B 45 p/100 m – förvärrad* – som visar hur sträckan utvecklats; samma uppgift finns i protokollets infotabell, i kartunderlaget (</w:t>
-      </w:r>
-      <w:r>
-        <w:rPr>
-          <w:rFonts w:ascii="Consolas" w:cs="Consolas" w:eastAsia="Consolas" w:hAnsi="Consolas"/>
-          <w:sz w:val="20"/>
-          <w:szCs w:val="20"/>
-          <w:shd w:fill="F2F2F2" w:val="clear"/>
-        </w:rPr>
-        <w:t xml:space="preserve">tidigare_inspektion</w:t>
-      </w:r>
-      <w:r>
-        <w:t xml:space="preserve">) och i sträcksidorna i PowerPoint, och fliken Sammanfattning summerar hur många som förvärrats, förbättrats eller är oförändrade. Är den nya filmen ofullständig (avbruten) gäller den ändå, men den ersatta raden får en OBS med båda längderna. Två filmer med samma datum i olika filer antas vara samma film i två exporter: en räknas, den andra markeras *samma datum – dubblett?*. Saknar filmerna tolkbart datum kan de inte ordnas – båda räknas och en OBS skrivs i konsolen.</w:t>
-      </w:r>
-    </w:p>
-    <w:p>
-      <w:pPr>
-        <w:spacing w:after="120"/>
-      </w:pPr>
+        <w:t xml:space="preserve">Samma sträcka finns i flera TV3-filer (ny inspektion ett senare år).</w:t>
+      </w:r>
+      <w:r>
+        <w:t xml:space="preserve"> Analyserar du flera filer tillsammans gäller den nyaste filmen av brunnsparet oavsett fil (</w:t>
+      </w:r>
+      <w:r>
+        <w:rPr>
+          <w:rFonts w:ascii="Consolas" w:cs="Consolas" w:eastAsia="Consolas" w:hAnsi="Consolas"/>
+          <w:sz w:val="20"/>
+          <w:szCs w:val="20"/>
+          <w:shd w:fill="F2F2F2" w:val="clear"/>
+        </w:rPr>
+        <w:t xml:space="preserve">OMFILMNING_OVER_FILER</w:t>
+      </w:r>
+      <w:r>
+        <w:t xml:space="preserve">). Den äldre raden ligger kvar i Prioritering utan rang med Filmstatus *ersatt av ny inspektion nr X i FIL datum* och räknas inte i statistik, karta, åtgärdspaket eller inspektionsgrad, men behåller sitt protokoll. Den gällande sträckan får kolumnen </w:t>
+      </w:r>
       <w:r>
         <w:rPr>
           <w:b/>
           <w:bCs/>
         </w:rPr>
-        <w:t xml:space="preserve">En sträcka filmad från två håll med avbrott i mitten, men filmerna ligger i olika TV3-filer</w:t>
-      </w:r>
-      <w:r>
-        <w:t xml:space="preserve"> (t.ex. *DUF 700 Del 4* och *DUF 700 Ålsten Del 5*). Är båda filmerna avbrutna, den ena från startbrunnen och den andra från slutbrunnen, och filmade inom ett år från varandra (</w:t>
-      </w:r>
-      <w:r>
-        <w:rPr>
-          <w:rFonts w:ascii="Consolas" w:cs="Consolas" w:eastAsia="Consolas" w:hAnsi="Consolas"/>
-          <w:sz w:val="20"/>
-          <w:szCs w:val="20"/>
-          <w:shd w:fill="F2F2F2" w:val="clear"/>
-        </w:rPr>
-        <w:t xml:space="preserve">SAMMANSLAGNING_MAX_DAGAR</w:t>
-      </w:r>
-      <w:r>
-        <w:t xml:space="preserve">, 365 dagar) slås de ihop precis som två delfilmer i samma fil. Den sammanslagna sträckan hamnar i filen med filmen från startbrunnen och får ett nytt nummer där. Filmstatus, observationernas kommentar och översiktsritningen anger vilken fil varje delfilm kommer från, och protokollets rad TV3-fil visar båda filerna. Ligger filmerna mer än ett år isär räknas den nyare som en ny inspektion (frågan ovan). Konsolen listar de brunnspar som slagits ihop över filgränser.</w:t>
+        <w:t xml:space="preserve">Tidigare inspektion</w:t>
+      </w:r>
+      <w:r>
+        <w:t xml:space="preserve"> – t.ex. *2021-05-27 (DUF 701.TV3 nr 12): C 21 → B 45 p/100 m – förvärrad* – som visar hur sträckan utvecklats; samma uppgift finns i protokollets infotabell, i kartunderlaget (</w:t>
+      </w:r>
+      <w:r>
+        <w:rPr>
+          <w:rFonts w:ascii="Consolas" w:cs="Consolas" w:eastAsia="Consolas" w:hAnsi="Consolas"/>
+          <w:sz w:val="20"/>
+          <w:szCs w:val="20"/>
+          <w:shd w:fill="F2F2F2" w:val="clear"/>
+        </w:rPr>
+        <w:t xml:space="preserve">tidigare_inspektion</w:t>
+      </w:r>
+      <w:r>
+        <w:t xml:space="preserve">) och i sträcksidorna i PowerPoint, och fliken Sammanfattning summerar hur många som förvärrats, förbättrats eller är oförändrade. Är den nya filmen ofullständig (avbruten) gäller den ändå, men den ersatta raden får en OBS med båda längderna. Två filmer med samma datum i olika filer antas vara samma film i två exporter: en räknas, den andra markeras *samma datum – dubblett?*. Saknar filmerna tolkbart datum kan de inte ordnas – båda räknas och en OBS skrivs i konsolen.</w:t>
       </w:r>
     </w:p>
     <w:p>
@@ -17205,22 +17198,22 @@
           <w:b/>
           <w:bCs/>
         </w:rPr>
-        <w:t xml:space="preserve">Samma film i två filer i samma mapp (delexport och hel export).</w:t>
-      </w:r>
-      <w:r>
-        <w:t xml:space="preserve"> Entreprenören levererar ibland en delexport och sedan hela uppdraget i en större fil, t.ex. </w:t>
-      </w:r>
-      <w:r>
-        <w:rPr>
-          <w:rFonts w:ascii="Consolas" w:cs="Consolas" w:eastAsia="Consolas" w:hAnsi="Consolas"/>
-          <w:sz w:val="20"/>
-          <w:szCs w:val="20"/>
-          <w:shd w:fill="F2F2F2" w:val="clear"/>
-        </w:rPr>
-        <w:t xml:space="preserve">DUF 701.TV3</w:t>
-      </w:r>
-      <w:r>
-        <w:t xml:space="preserve"> med 185 sträckor och en fil med 264 sträckor där de 185 ingår. Filmer som är identiska (brunnspar, datum, klockslag, längd, videofil och antal observationer) räknas en gång, i filen med flest sträckor; kopian får Filmstatus *ersatt av samma film nr X i FIL (dubblett)*. Ingår hela filen i den andra säger konsolen *filen är en delmängd och räknas inte* – ta då bort den mindre filen ur listfilen. Analyserar du bara den mindre filen saknas de sträckor som bara finns i den större.</w:t>
+        <w:t xml:space="preserve">En sträcka filmad från två håll med avbrott i mitten, men filmerna ligger i olika TV3-filer</w:t>
+      </w:r>
+      <w:r>
+        <w:t xml:space="preserve"> (t.ex. *DUF 700 Del 4* och *DUF 700 Ålsten Del 5*). Är båda filmerna avbrutna, den ena från startbrunnen och den andra från slutbrunnen, och filmade inom ett år från varandra (</w:t>
+      </w:r>
+      <w:r>
+        <w:rPr>
+          <w:rFonts w:ascii="Consolas" w:cs="Consolas" w:eastAsia="Consolas" w:hAnsi="Consolas"/>
+          <w:sz w:val="20"/>
+          <w:szCs w:val="20"/>
+          <w:shd w:fill="F2F2F2" w:val="clear"/>
+        </w:rPr>
+        <w:t xml:space="preserve">SAMMANSLAGNING_MAX_DAGAR</w:t>
+      </w:r>
+      <w:r>
+        <w:t xml:space="preserve">, 365 dagar) slås de ihop precis som två delfilmer i samma fil. Den sammanslagna sträckan hamnar i filen med filmen från startbrunnen och får ett nytt nummer där. Filmstatus, observationernas kommentar och översiktsritningen anger vilken fil varje delfilm kommer från, och protokollets rad TV3-fil visar båda filerna. Ligger filmerna mer än ett år isär räknas den nyare som en ny inspektion (frågan ovan). Konsolen listar de brunnspar som slagits ihop över filgränser.</w:t>
       </w:r>
     </w:p>
     <w:p>
@@ -17232,22 +17225,22 @@
           <w:b/>
           <w:bCs/>
         </w:rPr>
-        <w:t xml:space="preserve">En sträcka i TV3-filen saknas i Excel.</w:t>
-      </w:r>
-      <w:r>
-        <w:t xml:space="preserve"> Inläsningen tappar inga rader: sträcknummer som inte är heltal (t.ex. *12A*) eller som förekommer två gånger i filen får ett nytt nummer efter filens största, och konsolen och </w:t>
-      </w:r>
-      <w:r>
-        <w:rPr>
-          <w:rFonts w:ascii="Consolas" w:cs="Consolas" w:eastAsia="Consolas" w:hAnsi="Consolas"/>
-          <w:sz w:val="20"/>
-          <w:szCs w:val="20"/>
-          <w:shd w:fill="F2F2F2" w:val="clear"/>
-        </w:rPr>
-        <w:t xml:space="preserve">fel.txt</w:t>
-      </w:r>
-      <w:r>
-        <w:t xml:space="preserve"> säger *sträcknummer '12A' (BRUNN → BRUNN) … läst som nr 265*. Radbrytningar inne i kommentarsfält bryter inte heller inläsningen. Saknas sträckan ändå: kontrollera att rätt TV3-fil står i listfilen (en annan export i samma mapp kan innehålla fler sträckor) och sök på brunnslitterat i filen.</w:t>
+        <w:t xml:space="preserve">Samma film i två filer i samma mapp (delexport och hel export).</w:t>
+      </w:r>
+      <w:r>
+        <w:t xml:space="preserve"> Entreprenören levererar ibland en delexport och sedan hela uppdraget i en större fil, t.ex. </w:t>
+      </w:r>
+      <w:r>
+        <w:rPr>
+          <w:rFonts w:ascii="Consolas" w:cs="Consolas" w:eastAsia="Consolas" w:hAnsi="Consolas"/>
+          <w:sz w:val="20"/>
+          <w:szCs w:val="20"/>
+          <w:shd w:fill="F2F2F2" w:val="clear"/>
+        </w:rPr>
+        <w:t xml:space="preserve">DUF 701.TV3</w:t>
+      </w:r>
+      <w:r>
+        <w:t xml:space="preserve"> med 185 sträckor och en fil med 264 sträckor där de 185 ingår. Filmer som är identiska (brunnspar, datum, klockslag, längd, videofil och antal observationer) räknas en gång, i filen med flest sträckor; kopian får Filmstatus *ersatt av samma film nr X i FIL (dubblett)*. Ingår hela filen i den andra säger konsolen *filen är en delmängd och räknas inte* – ta då bort den mindre filen ur listfilen. Analyserar du bara den mindre filen saknas de sträckor som bara finns i den större.</w:t>
       </w:r>
     </w:p>
     <w:p>
@@ -17259,10 +17252,22 @@
           <w:b/>
           <w:bCs/>
         </w:rPr>
-        <w:t xml:space="preserve">Sträckor i klass E.</w:t>
-      </w:r>
-      <w:r>
-        <w:t xml:space="preserve"> Sträckor utan inspekterad längd (ingen film gjord, bara brunnsregistrering). De behöver inspekteras innan de kan bedömas.</w:t>
+        <w:t xml:space="preserve">En sträcka i TV3-filen saknas i Excel.</w:t>
+      </w:r>
+      <w:r>
+        <w:t xml:space="preserve"> Inläsningen tappar inga rader: sträcknummer som inte är heltal (t.ex. *12A*) eller som förekommer två gånger i filen får ett nytt nummer efter filens största, och konsolen och </w:t>
+      </w:r>
+      <w:r>
+        <w:rPr>
+          <w:rFonts w:ascii="Consolas" w:cs="Consolas" w:eastAsia="Consolas" w:hAnsi="Consolas"/>
+          <w:sz w:val="20"/>
+          <w:szCs w:val="20"/>
+          <w:shd w:fill="F2F2F2" w:val="clear"/>
+        </w:rPr>
+        <w:t xml:space="preserve">fel.txt</w:t>
+      </w:r>
+      <w:r>
+        <w:t xml:space="preserve"> säger *sträcknummer '12A' (BRUNN → BRUNN) … läst som nr 265*. Radbrytningar inne i kommentarsfält bryter inte heller inläsningen. Saknas sträckan ändå: kontrollera att rätt TV3-fil står i listfilen (en annan export i samma mapp kan innehålla fler sträckor) och sök på brunnslitterat i filen.</w:t>
       </w:r>
     </w:p>
     <w:p>
@@ -17274,82 +17279,10 @@
           <w:b/>
           <w:bCs/>
         </w:rPr>
-        <w:t xml:space="preserve">Länkarna till film och bilder fungerar inte.</w:t>
-      </w:r>
-      <w:r>
-        <w:t xml:space="preserve"> TV3-filen innehåller bara filnamnen (t.ex. </w:t>
-      </w:r>
-      <w:r>
-        <w:rPr>
-          <w:rFonts w:ascii="Consolas" w:cs="Consolas" w:eastAsia="Consolas" w:hAnsi="Consolas"/>
-          <w:sz w:val="20"/>
-          <w:szCs w:val="20"/>
-          <w:shd w:fill="F2F2F2" w:val="clear"/>
-        </w:rPr>
-        <w:t xml:space="preserve">1105202111.mp4</w:t>
-      </w:r>
-      <w:r>
-        <w:t xml:space="preserve">), inte var filerna ligger. Skriptet söker igenom mappen där TV3-filen ligger, inklusive undermappar, samt de mappar du anger i listfilen (</w:t>
-      </w:r>
-      <w:r>
-        <w:rPr>
-          <w:rFonts w:ascii="Consolas" w:cs="Consolas" w:eastAsia="Consolas" w:hAnsi="Consolas"/>
-          <w:sz w:val="20"/>
-          <w:szCs w:val="20"/>
-          <w:shd w:fill="F2F2F2" w:val="clear"/>
-        </w:rPr>
-        <w:t xml:space="preserve">media:</w:t>
-      </w:r>
-      <w:r>
-        <w:t xml:space="preserve">, </w:t>
-      </w:r>
-      <w:r>
-        <w:rPr>
-          <w:rFonts w:ascii="Consolas" w:cs="Consolas" w:eastAsia="Consolas" w:hAnsi="Consolas"/>
-          <w:sz w:val="20"/>
-          <w:szCs w:val="20"/>
-          <w:shd w:fill="F2F2F2" w:val="clear"/>
-        </w:rPr>
-        <w:t xml:space="preserve">bild:</w:t>
-      </w:r>
-      <w:r>
-        <w:t xml:space="preserve"> eller </w:t>
-      </w:r>
-      <w:r>
-        <w:rPr>
-          <w:rFonts w:ascii="Consolas" w:cs="Consolas" w:eastAsia="Consolas" w:hAnsi="Consolas"/>
-          <w:sz w:val="20"/>
-          <w:szCs w:val="20"/>
-          <w:shd w:fill="F2F2F2" w:val="clear"/>
-        </w:rPr>
-        <w:t xml:space="preserve">; mapp</w:t>
-      </w:r>
-      <w:r>
-        <w:t xml:space="preserve"> efter TV3-filen) eller med </w:t>
-      </w:r>
-      <w:r>
-        <w:rPr>
-          <w:rFonts w:ascii="Consolas" w:cs="Consolas" w:eastAsia="Consolas" w:hAnsi="Consolas"/>
-          <w:sz w:val="20"/>
-          <w:szCs w:val="20"/>
-          <w:shd w:fill="F2F2F2" w:val="clear"/>
-        </w:rPr>
-        <w:t xml:space="preserve">--media</w:t>
-      </w:r>
-      <w:r>
-        <w:t xml:space="preserve"> och </w:t>
-      </w:r>
-      <w:r>
-        <w:rPr>
-          <w:rFonts w:ascii="Consolas" w:cs="Consolas" w:eastAsia="Consolas" w:hAnsi="Consolas"/>
-          <w:sz w:val="20"/>
-          <w:szCs w:val="20"/>
-          <w:shd w:fill="F2F2F2" w:val="clear"/>
-        </w:rPr>
-        <w:t xml:space="preserve">--bilder</w:t>
-      </w:r>
-      <w:r>
-        <w:t xml:space="preserve">. Terminalen visar hur många filmer och bilder som hittades. Om filmerna ligger på en annan disk eller server: lägg till mappen i listfilen och kör om. Länkarna är absoluta sökvägar, så Excel-filen måste öppnas på en dator som når samma mapp (samma nätverksenhet/enhetsbokstav).</w:t>
+        <w:t xml:space="preserve">Sträckor i klass E.</w:t>
+      </w:r>
+      <w:r>
+        <w:t xml:space="preserve"> Sträckor utan inspekterad längd (ingen film gjord, bara brunnsregistrering). De behöver inspekteras innan de kan bedömas.</w:t>
       </w:r>
     </w:p>
     <w:p>
@@ -17361,6 +17294,93 @@
           <w:b/>
           <w:bCs/>
         </w:rPr>
+        <w:t xml:space="preserve">Länkarna till film och bilder fungerar inte.</w:t>
+      </w:r>
+      <w:r>
+        <w:t xml:space="preserve"> TV3-filen innehåller bara filnamnen (t.ex. </w:t>
+      </w:r>
+      <w:r>
+        <w:rPr>
+          <w:rFonts w:ascii="Consolas" w:cs="Consolas" w:eastAsia="Consolas" w:hAnsi="Consolas"/>
+          <w:sz w:val="20"/>
+          <w:szCs w:val="20"/>
+          <w:shd w:fill="F2F2F2" w:val="clear"/>
+        </w:rPr>
+        <w:t xml:space="preserve">1105202111.mp4</w:t>
+      </w:r>
+      <w:r>
+        <w:t xml:space="preserve">), inte var filerna ligger. Skriptet söker igenom mappen där TV3-filen ligger, inklusive undermappar, samt de mappar du anger i listfilen (</w:t>
+      </w:r>
+      <w:r>
+        <w:rPr>
+          <w:rFonts w:ascii="Consolas" w:cs="Consolas" w:eastAsia="Consolas" w:hAnsi="Consolas"/>
+          <w:sz w:val="20"/>
+          <w:szCs w:val="20"/>
+          <w:shd w:fill="F2F2F2" w:val="clear"/>
+        </w:rPr>
+        <w:t xml:space="preserve">media:</w:t>
+      </w:r>
+      <w:r>
+        <w:t xml:space="preserve">, </w:t>
+      </w:r>
+      <w:r>
+        <w:rPr>
+          <w:rFonts w:ascii="Consolas" w:cs="Consolas" w:eastAsia="Consolas" w:hAnsi="Consolas"/>
+          <w:sz w:val="20"/>
+          <w:szCs w:val="20"/>
+          <w:shd w:fill="F2F2F2" w:val="clear"/>
+        </w:rPr>
+        <w:t xml:space="preserve">bild:</w:t>
+      </w:r>
+      <w:r>
+        <w:t xml:space="preserve"> eller </w:t>
+      </w:r>
+      <w:r>
+        <w:rPr>
+          <w:rFonts w:ascii="Consolas" w:cs="Consolas" w:eastAsia="Consolas" w:hAnsi="Consolas"/>
+          <w:sz w:val="20"/>
+          <w:szCs w:val="20"/>
+          <w:shd w:fill="F2F2F2" w:val="clear"/>
+        </w:rPr>
+        <w:t xml:space="preserve">; mapp</w:t>
+      </w:r>
+      <w:r>
+        <w:t xml:space="preserve"> efter TV3-filen) eller med </w:t>
+      </w:r>
+      <w:r>
+        <w:rPr>
+          <w:rFonts w:ascii="Consolas" w:cs="Consolas" w:eastAsia="Consolas" w:hAnsi="Consolas"/>
+          <w:sz w:val="20"/>
+          <w:szCs w:val="20"/>
+          <w:shd w:fill="F2F2F2" w:val="clear"/>
+        </w:rPr>
+        <w:t xml:space="preserve">--media</w:t>
+      </w:r>
+      <w:r>
+        <w:t xml:space="preserve"> och </w:t>
+      </w:r>
+      <w:r>
+        <w:rPr>
+          <w:rFonts w:ascii="Consolas" w:cs="Consolas" w:eastAsia="Consolas" w:hAnsi="Consolas"/>
+          <w:sz w:val="20"/>
+          <w:szCs w:val="20"/>
+          <w:shd w:fill="F2F2F2" w:val="clear"/>
+        </w:rPr>
+        <w:t xml:space="preserve">--bilder</w:t>
+      </w:r>
+      <w:r>
+        <w:t xml:space="preserve">. Terminalen visar hur många filmer och bilder som hittades. Om filmerna ligger på en annan disk eller server: lägg till mappen i listfilen och kör om. Länkarna är absoluta sökvägar, så Excel-filen måste öppnas på en dator som når samma mapp (samma nätverksenhet/enhetsbokstav).</w:t>
+      </w:r>
+    </w:p>
+    <w:p>
+      <w:pPr>
+        <w:spacing w:after="120"/>
+      </w:pPr>
+      <w:r>
+        <w:rPr>
+          <w:b/>
+          <w:bCs/>
+        </w:rPr>
         <w:t xml:space="preserve">Excel varnar när jag klickar på en länk.</w:t>
       </w:r>
       <w:r>
@@ -17368,8 +17388,8 @@
       </w:r>
     </w:p>
     <w:sectPr>
-      <w:headerReference w:type="default" r:id="rId6"/>
-      <w:footerReference w:type="default" r:id="rId7"/>
+      <w:headerReference w:type="default" r:id="rId7"/>
+      <w:footerReference w:type="default" r:id="rId8"/>
       <w:pgSz w:w="11906" w:h="16838" w:orient="portrait"/>
       <w:pgMar w:top="1440" w:right="1440" w:bottom="1440" w:left="1440" w:header="708" w:footer="708" w:gutter="0"/>
       <w:pgNumType/>
@@ -17377,6 +17397,10 @@
     </w:sectPr>
   </w:body>
 </w:document>
+</file>
+
+<file path=word/comments.xml><?xml version="1.0" encoding="utf-8"?>
+<w:comments xmlns:cx="http://schemas.microsoft.com/office/drawing/2014/chartex" xmlns:cx1="http://schemas.microsoft.com/office/drawing/2015/9/8/chartex" xmlns:cx2="http://schemas.microsoft.com/office/drawing/2015/10/21/chartex" xmlns:cx3="http://schemas.microsoft.com/office/drawing/2016/5/9/chartex" xmlns:cx4="http://schemas.microsoft.com/office/drawing/2016/5/10/chartex" xmlns:cx5="http://schemas.microsoft.com/office/drawing/2016/5/11/chartex" xmlns:cx6="http://schemas.microsoft.com/office/drawing/2016/5/12/chartex" xmlns:cx7="http://schemas.microsoft.com/office/drawing/2016/5/13/chartex" xmlns:cx8="http://schemas.microsoft.com/office/drawing/2016/5/14/chartex" xmlns:mc="http://schemas.openxmlformats.org/markup-compatibility/2006" xmlns:aink="http://schemas.microsoft.com/office/drawing/2016/ink" xmlns:am3d="http://schemas.microsoft.com/office/drawing/2017/model3d" xmlns:o="urn:schemas-microsoft-com:office:office" xmlns:r="http://schemas.openxmlformats.org/officeDocument/2006/relationships" xmlns:m="http://schemas.openxmlformats.org/officeDocument/2006/math" xmlns:v="urn:schemas-microsoft-com:vml" xmlns:wp14="http://schemas.microsoft.com/office/word/2010/wordprocessingDrawing" xmlns:wp="http://schemas.openxmlformats.org/drawingml/2006/wordprocessingDrawing" xmlns:w10="urn:schemas-microsoft-com:office:word" xmlns:w="http://schemas.openxmlformats.org/wordprocessingml/2006/main" xmlns:w14="http://schemas.microsoft.com/office/word/2010/wordml" xmlns:w15="http://schemas.microsoft.com/office/word/2012/wordml" xmlns:w16cex="http://schemas.microsoft.com/office/word/2018/wordml/cex" xmlns:w16cid="http://schemas.microsoft.com/office/word/2016/wordml/cid" xmlns:w16="http://schemas.microsoft.com/office/word/2018/wordml" xmlns:w16sdtdh="http://schemas.microsoft.com/office/word/2020/wordml/sdtdatahash" xmlns:w16se="http://schemas.microsoft.com/office/word/2015/wordml/symex" xmlns:wpg="http://schemas.microsoft.com/office/word/2010/wordprocessingGroup" xmlns:wpi="http://schemas.microsoft.com/office/word/2010/wordprocessingInk" xmlns:wne="http://schemas.microsoft.com/office/word/2006/wordml" xmlns:wps="http://schemas.microsoft.com/office/word/2010/wordprocessingShape"/>
 </file>
 
 <file path=word/endnotes.xml><?xml version="1.0" encoding="utf-8"?>
@@ -17429,77 +17453,14 @@
         <w:szCs w:val="18"/>
       </w:rPr>
       <w:t xml:space="preserve">Sida </w:t>
-    </w:r>
-    <w:r>
-      <w:rPr>
-        <w:color w:val="898781"/>
-        <w:sz w:val="18"/>
-        <w:szCs w:val="18"/>
-      </w:rPr>
       <w:fldChar w:fldCharType="begin"/>
-    </w:r>
-    <w:r>
-      <w:rPr>
-        <w:color w:val="898781"/>
-        <w:sz w:val="18"/>
-        <w:szCs w:val="18"/>
-      </w:rPr>
       <w:instrText xml:space="preserve">PAGE</w:instrText>
-    </w:r>
-    <w:r>
-      <w:rPr>
-        <w:color w:val="898781"/>
-        <w:sz w:val="18"/>
-        <w:szCs w:val="18"/>
-      </w:rPr>
       <w:fldChar w:fldCharType="separate"/>
-    </w:r>
-    <w:r>
-      <w:rPr>
-        <w:color w:val="898781"/>
-        <w:sz w:val="18"/>
-        <w:szCs w:val="18"/>
-      </w:rPr>
       <w:fldChar w:fldCharType="end"/>
-    </w:r>
-    <w:r>
-      <w:rPr>
-        <w:color w:val="898781"/>
-        <w:sz w:val="18"/>
-        <w:szCs w:val="18"/>
-      </w:rPr>
       <w:t xml:space="preserve"> av </w:t>
-    </w:r>
-    <w:r>
-      <w:rPr>
-        <w:color w:val="898781"/>
-        <w:sz w:val="18"/>
-        <w:szCs w:val="18"/>
-      </w:rPr>
       <w:fldChar w:fldCharType="begin"/>
-    </w:r>
-    <w:r>
-      <w:rPr>
-        <w:color w:val="898781"/>
-        <w:sz w:val="18"/>
-        <w:szCs w:val="18"/>
-      </w:rPr>
       <w:instrText xml:space="preserve">NUMPAGES</w:instrText>
-    </w:r>
-    <w:r>
-      <w:rPr>
-        <w:color w:val="898781"/>
-        <w:sz w:val="18"/>
-        <w:szCs w:val="18"/>
-      </w:rPr>
       <w:fldChar w:fldCharType="separate"/>
-    </w:r>
-    <w:r>
-      <w:rPr>
-        <w:color w:val="898781"/>
-        <w:sz w:val="18"/>
-        <w:szCs w:val="18"/>
-      </w:rPr>
       <w:fldChar w:fldCharType="end"/>
     </w:r>
   </w:p>
@@ -17565,7 +17526,7 @@
 <w:numbering xmlns:wpc="http://schemas.microsoft.com/office/word/2010/wordprocessingCanvas" xmlns:mc="http://schemas.openxmlformats.org/markup-compatibility/2006" xmlns:o="urn:schemas-microsoft-com:office:office" xmlns:r="http://schemas.openxmlformats.org/officeDocument/2006/relationships" xmlns:m="http://schemas.openxmlformats.org/officeDocument/2006/math" xmlns:v="urn:schemas-microsoft-com:vml" xmlns:wp14="http://schemas.microsoft.com/office/word/2010/wordprocessingDrawing" xmlns:wp="http://schemas.openxmlformats.org/drawingml/2006/wordprocessingDrawing" xmlns:w10="urn:schemas-microsoft-com:office:word" xmlns:w="http://schemas.openxmlformats.org/wordprocessingml/2006/main" xmlns:w14="http://schemas.microsoft.com/office/word/2010/wordml" xmlns:w15="http://schemas.microsoft.com/office/word/2012/wordml" xmlns:wpg="http://schemas.microsoft.com/office/word/2010/wordprocessingGroup" xmlns:wpi="http://schemas.microsoft.com/office/word/2010/wordprocessingInk" xmlns:wne="http://schemas.microsoft.com/office/word/2006/wordml" xmlns:wps="http://schemas.microsoft.com/office/word/2010/wordprocessingShape" mc:Ignorable="w14 w15 wp14">
   <w:abstractNum w:abstractNumId="1" w15:restartNumberingAfterBreak="0">
     <w:multiLevelType w:val="hybridMultilevel"/>
-    <w:lvl w:ilvl="0" w:tentative="1">
+    <w:lvl w:ilvl="0" w15:tentative="1">
       <w:start w:val="1"/>
       <w:numFmt w:val="bullet"/>
       <w:lvlText w:val="●"/>
@@ -17574,7 +17535,7 @@
         <w:ind w:left="720" w:hanging="360"/>
       </w:pPr>
     </w:lvl>
-    <w:lvl w:ilvl="1" w:tentative="1">
+    <w:lvl w:ilvl="1" w15:tentative="1">
       <w:start w:val="1"/>
       <w:numFmt w:val="bullet"/>
       <w:lvlText w:val="○"/>
@@ -17583,7 +17544,7 @@
         <w:ind w:left="1440" w:hanging="360"/>
       </w:pPr>
     </w:lvl>
-    <w:lvl w:ilvl="2" w:tentative="1">
+    <w:lvl w:ilvl="2" w15:tentative="1">
       <w:start w:val="1"/>
       <w:numFmt w:val="bullet"/>
       <w:lvlText w:val="■"/>
@@ -17592,7 +17553,7 @@
         <w:ind w:left="2160" w:hanging="360"/>
       </w:pPr>
     </w:lvl>
-    <w:lvl w:ilvl="3" w:tentative="1">
+    <w:lvl w:ilvl="3" w15:tentative="1">
       <w:start w:val="1"/>
       <w:numFmt w:val="bullet"/>
       <w:lvlText w:val="●"/>
@@ -17601,7 +17562,7 @@
         <w:ind w:left="2880" w:hanging="360"/>
       </w:pPr>
     </w:lvl>
-    <w:lvl w:ilvl="4" w:tentative="1">
+    <w:lvl w:ilvl="4" w15:tentative="1">
       <w:start w:val="1"/>
       <w:numFmt w:val="bullet"/>
       <w:lvlText w:val="○"/>
@@ -17610,7 +17571,7 @@
         <w:ind w:left="3600" w:hanging="360"/>
       </w:pPr>
     </w:lvl>
-    <w:lvl w:ilvl="5" w:tentative="1">
+    <w:lvl w:ilvl="5" w15:tentative="1">
       <w:start w:val="1"/>
       <w:numFmt w:val="bullet"/>
       <w:lvlText w:val="■"/>
@@ -17619,7 +17580,7 @@
         <w:ind w:left="4320" w:hanging="360"/>
       </w:pPr>
     </w:lvl>
-    <w:lvl w:ilvl="6" w:tentative="1">
+    <w:lvl w:ilvl="6" w15:tentative="1">
       <w:start w:val="1"/>
       <w:numFmt w:val="bullet"/>
       <w:lvlText w:val="●"/>
@@ -17628,7 +17589,7 @@
         <w:ind w:left="5040" w:hanging="360"/>
       </w:pPr>
     </w:lvl>
-    <w:lvl w:ilvl="7" w:tentative="1">
+    <w:lvl w:ilvl="7" w15:tentative="1">
       <w:start w:val="1"/>
       <w:numFmt w:val="bullet"/>
       <w:lvlText w:val="●"/>
@@ -17637,7 +17598,7 @@
         <w:ind w:left="5760" w:hanging="360"/>
       </w:pPr>
     </w:lvl>
-    <w:lvl w:ilvl="8" w:tentative="1">
+    <w:lvl w:ilvl="8" w15:tentative="1">
       <w:start w:val="1"/>
       <w:numFmt w:val="bullet"/>
       <w:lvlText w:val="●"/>
@@ -17649,7 +17610,7 @@
   </w:abstractNum>
   <w:abstractNum w:abstractNumId="2" w15:restartNumberingAfterBreak="0">
     <w:multiLevelType w:val="hybridMultilevel"/>
-    <w:lvl w:ilvl="0" w:tentative="1">
+    <w:lvl w:ilvl="0" w15:tentative="1">
       <w:start w:val="1"/>
       <w:numFmt w:val="bullet"/>
       <w:lvlText w:val="•"/>
@@ -17661,7 +17622,7 @@
   </w:abstractNum>
   <w:abstractNum w:abstractNumId="3" w15:restartNumberingAfterBreak="0">
     <w:multiLevelType w:val="hybridMultilevel"/>
-    <w:lvl w:ilvl="0" w:tentative="1">
+    <w:lvl w:ilvl="0" w15:tentative="1">
       <w:start w:val="1"/>
       <w:numFmt w:val="decimal"/>
       <w:lvlText w:val="%1."/>
@@ -17704,24 +17665,37 @@
     </w:rPrDefault>
     <w:pPrDefault/>
   </w:docDefaults>
-  <w:style w:type="paragraph" w:styleId="Normal" w:default="1">
-    <w:name w:val="Normal"/>
+  <w:style w:type="paragraph" w:styleId="Title">
+    <w:name w:val="Title"/>
+    <w:basedOn w:val="Normal"/>
+    <w:next w:val="Normal"/>
     <w:qFormat/>
+    <w:rPr>
+      <w:sz w:val="56"/>
+      <w:szCs w:val="56"/>
+    </w:rPr>
   </w:style>
-  <w:style w:type="table" w:styleId="TableNormal" w:default="true">
-    <w:name w:val="Normal Table"/>
-    <w:uiPriority w:val="99"/>
-    <w:semiHidden/>
-    <w:unhideWhenUsed/>
-    <w:tblPr>
-      <w:tblInd w:type="dxa" w:w="0"/>
-      <w:tblCellMar>
-        <w:top w:type="dxa" w:w="0"/>
-        <w:left w:type="dxa" w:w="108"/>
-        <w:bottom w:type="dxa" w:w="0"/>
-        <w:right w:type="dxa" w:w="108"/>
-      </w:tblCellMar>
-    </w:tblPr>
+  <w:style w:type="paragraph" w:styleId="Heading1">
+    <w:name w:val="Heading 1"/>
+    <w:basedOn w:val="Normal"/>
+    <w:next w:val="Normal"/>
+    <w:qFormat/>
+    <w:rPr>
+      <w:color w:val="2E74B5"/>
+      <w:sz w:val="32"/>
+      <w:szCs w:val="32"/>
+    </w:rPr>
+  </w:style>
+  <w:style w:type="paragraph" w:styleId="Heading2">
+    <w:name w:val="Heading 2"/>
+    <w:basedOn w:val="Normal"/>
+    <w:next w:val="Normal"/>
+    <w:qFormat/>
+    <w:rPr>
+      <w:color w:val="2E74B5"/>
+      <w:sz w:val="26"/>
+      <w:szCs w:val="26"/>
+    </w:rPr>
   </w:style>
   <w:style w:type="paragraph" w:styleId="Heading3">
     <w:name w:val="Heading 3"/>
@@ -17915,294 +17889,4 @@
     </w:rPr>
   </w:style>
 </w:styles>
-</file>
-
-<file path=word/theme/theme1.xml><?xml version="1.0" encoding="utf-8"?>
-<a:theme xmlns:a="http://schemas.openxmlformats.org/drawingml/2006/main" name="Office Theme">
-  <a:themeElements>
-    <a:clrScheme name="Office">
-      <a:dk1>
-        <a:sysClr val="windowText" lastClr="000000"/>
-      </a:dk1>
-      <a:lt1>
-        <a:sysClr val="window" lastClr="FFFFFF"/>
-      </a:lt1>
-      <a:dk2>
-        <a:srgbClr val="44546A"/>
-      </a:dk2>
-      <a:lt2>
-        <a:srgbClr val="E7E6E6"/>
-      </a:lt2>
-      <a:accent1>
-        <a:srgbClr val="4472C4"/>
-      </a:accent1>
-      <a:accent2>
-        <a:srgbClr val="ED7D31"/>
-      </a:accent2>
-      <a:accent3>
-        <a:srgbClr val="A5A5A5"/>
-      </a:accent3>
-      <a:accent4>
-        <a:srgbClr val="FFC000"/>
-      </a:accent4>
-      <a:accent5>
-        <a:srgbClr val="5B9BD5"/>
-      </a:accent5>
-      <a:accent6>
-        <a:srgbClr val="70AD47"/>
-      </a:accent6>
-      <a:hlink>
-        <a:srgbClr val="0563C1"/>
-      </a:hlink>
-      <a:folHlink>
-        <a:srgbClr val="954F72"/>
-      </a:folHlink>
-    </a:clrScheme>
-    <a:fontScheme name="Office">
-      <a:majorFont>
-        <a:latin typeface="Calibri Light" panose="020F0302020204030204"/>
-        <a:ea typeface=""/>
-        <a:cs typeface=""/>
-        <a:font script="Jpan" typeface="游ゴシック Light"/>
-        <a:font script="Hang" typeface="맑은 고딕"/>
-        <a:font script="Hans" typeface="等线 Light"/>
-        <a:font script="Hant" typeface="新細明體"/>
-        <a:font script="Arab" typeface="Times New Roman"/>
-        <a:font script="Hebr" typeface="Times New Roman"/>
-        <a:font script="Thai" typeface="Angsana New"/>
-        <a:font script="Ethi" typeface="Nyala"/>
-        <a:font script="Beng" typeface="Vrinda"/>
-        <a:font script="Gujr" typeface="Shruti"/>
-        <a:font script="Khmr" typeface="MoolBoran"/>
-        <a:font script="Knda" typeface="Tunga"/>
-        <a:font script="Guru" typeface="Raavi"/>
-        <a:font script="Cans" typeface="Euphemia"/>
-        <a:font script="Cher" typeface="Plantagenet Cherokee"/>
-        <a:font script="Yiii" typeface="Microsoft Yi Baiti"/>
-        <a:font script="Tibt" typeface="Microsoft Himalaya"/>
-        <a:font script="Thaa" typeface="MV Boli"/>
-        <a:font script="Deva" typeface="Mangal"/>
-        <a:font script="Telu" typeface="Gautami"/>
-        <a:font script="Taml" typeface="Latha"/>
-        <a:font script="Syrc" typeface="Estrangelo Edessa"/>
-        <a:font script="Orya" typeface="Kalinga"/>
-        <a:font script="Mlym" typeface="Kartika"/>
-        <a:font script="Laoo" typeface="DokChampa"/>
-        <a:font script="Sinh" typeface="Iskoola Pota"/>
-        <a:font script="Mong" typeface="Mongolian Baiti"/>
-        <a:font script="Viet" typeface="Times New Roman"/>
-        <a:font script="Uigh" typeface="Microsoft Uighur"/>
-        <a:font script="Geor" typeface="Sylfaen"/>
-        <a:font script="Armn" typeface="Arial"/>
-        <a:font script="Bugi" typeface="Leelawadee UI"/>
-        <a:font script="Bopo" typeface="Microsoft JhengHei"/>
-        <a:font script="Java" typeface="Javanese Text"/>
-        <a:font script="Lisu" typeface="Segoe UI"/>
-        <a:font script="Mymr" typeface="Myanmar Text"/>
-        <a:font script="Nkoo" typeface="Ebrima"/>
-        <a:font script="Olck" typeface="Nirmala UI"/>
-        <a:font script="Osma" typeface="Ebrima"/>
-        <a:font script="Phag" typeface="Phagspa"/>
-        <a:font script="Syrn" typeface="Estrangelo Edessa"/>
-        <a:font script="Syrj" typeface="Estrangelo Edessa"/>
-        <a:font script="Syre" typeface="Estrangelo Edessa"/>
-        <a:font script="Sora" typeface="Nirmala UI"/>
-        <a:font script="Tale" typeface="Microsoft Tai Le"/>
-        <a:font script="Talu" typeface="Microsoft New Tai Lue"/>
-        <a:font script="Tfng" typeface="Ebrima"/>
-      </a:majorFont>
-      <a:minorFont>
-        <a:latin typeface="Calibri" panose="020F0502020204030204"/>
-        <a:ea typeface=""/>
-        <a:cs typeface=""/>
-        <a:font script="Jpan" typeface="游明朝"/>
-        <a:font script="Hang" typeface="맑은 고딕"/>
-        <a:font script="Hans" typeface="等线"/>
-        <a:font script="Hant" typeface="新細明體"/>
-        <a:font script="Arab" typeface="Arial"/>
-        <a:font script="Hebr" typeface="Arial"/>
-        <a:font script="Thai" typeface="Cordia New"/>
-        <a:font script="Ethi" typeface="Nyala"/>
-        <a:font script="Beng" typeface="Vrinda"/>
-        <a:font script="Gujr" typeface="Shruti"/>
-        <a:font script="Khmr" typeface="DaunPenh"/>
-        <a:font script="Knda" typeface="Tunga"/>
-        <a:font script="Guru" typeface="Raavi"/>
-        <a:font script="Cans" typeface="Euphemia"/>
-        <a:font script="Cher" typeface="Plantagenet Cherokee"/>
-        <a:font script="Yiii" typeface="Microsoft Yi Baiti"/>
-        <a:font script="Tibt" typeface="Microsoft Himalaya"/>
-        <a:font script="Thaa" typeface="MV Boli"/>
-        <a:font script="Deva" typeface="Mangal"/>
-        <a:font script="Telu" typeface="Gautami"/>
-        <a:font script="Taml" typeface="Latha"/>
-        <a:font script="Syrc" typeface="Estrangelo Edessa"/>
-        <a:font script="Orya" typeface="Kalinga"/>
-        <a:font script="Mlym" typeface="Kartika"/>
-        <a:font script="Laoo" typeface="DokChampa"/>
-        <a:font script="Sinh" typeface="Iskoola Pota"/>
-        <a:font script="Mong" typeface="Mongolian Baiti"/>
-        <a:font script="Viet" typeface="Arial"/>
-        <a:font script="Uigh" typeface="Microsoft Uighur"/>
-        <a:font script="Geor" typeface="Sylfaen"/>
-        <a:font script="Armn" typeface="Arial"/>
-        <a:font script="Bugi" typeface="Leelawadee UI"/>
-        <a:font script="Bopo" typeface="Microsoft JhengHei"/>
-        <a:font script="Java" typeface="Javanese Text"/>
-        <a:font script="Lisu" typeface="Segoe UI"/>
-        <a:font script="Mymr" typeface="Myanmar Text"/>
-        <a:font script="Nkoo" typeface="Ebrima"/>
-        <a:font script="Olck" typeface="Nirmala UI"/>
-        <a:font script="Osma" typeface="Ebrima"/>
-        <a:font script="Phag" typeface="Phagspa"/>
-        <a:font script="Syrn" typeface="Estrangelo Edessa"/>
-        <a:font script="Syrj" typeface="Estrangelo Edessa"/>
-        <a:font script="Syre" typeface="Estrangelo Edessa"/>
-        <a:font script="Sora" typeface="Nirmala UI"/>
-        <a:font script="Tale" typeface="Microsoft Tai Le"/>
-        <a:font script="Talu" typeface="Microsoft New Tai Lue"/>
-        <a:font script="Tfng" typeface="Ebrima"/>
-      </a:minorFont>
-    </a:fontScheme>
-    <a:fmtScheme name="Office">
-      <a:fillStyleLst>
-        <a:solidFill>
-          <a:schemeClr val="phClr"/>
-        </a:solidFill>
-        <a:gradFill rotWithShape="true">
-          <a:gsLst>
-            <a:gs pos="0">
-              <a:schemeClr val="phClr">
-                <a:lumMod val="110000"/>
-                <a:satMod val="105000"/>
-                <a:tint val="67000"/>
-              </a:schemeClr>
-            </a:gs>
-            <a:gs pos="50000">
-              <a:schemeClr val="phClr">
-                <a:lumMod val="105000"/>
-                <a:satMod val="103000"/>
-                <a:tint val="73000"/>
-              </a:schemeClr>
-            </a:gs>
-            <a:gs pos="100000">
-              <a:schemeClr val="phClr">
-                <a:lumMod val="105000"/>
-                <a:satMod val="109000"/>
-                <a:tint val="81000"/>
-              </a:schemeClr>
-            </a:gs>
-          </a:gsLst>
-          <a:lin ang="5400000" scaled="false"/>
-        </a:gradFill>
-        <a:gradFill rotWithShape="true">
-          <a:gsLst>
-            <a:gs pos="0">
-              <a:schemeClr val="phClr">
-                <a:satMod val="103000"/>
-                <a:lumMod val="102000"/>
-                <a:tint val="94000"/>
-              </a:schemeClr>
-            </a:gs>
-            <a:gs pos="50000">
-              <a:schemeClr val="phClr">
-                <a:satMod val="110000"/>
-                <a:lumMod val="100000"/>
-                <a:shade val="100000"/>
-              </a:schemeClr>
-            </a:gs>
-            <a:gs pos="100000">
-              <a:schemeClr val="phClr">
-                <a:lumMod val="99000"/>
-                <a:satMod val="120000"/>
-                <a:shade val="78000"/>
-              </a:schemeClr>
-            </a:gs>
-          </a:gsLst>
-          <a:lin ang="5400000" scaled="false"/>
-        </a:gradFill>
-      </a:fillStyleLst>
-      <a:lnStyleLst>
-        <a:ln w="6350" cap="flat" cmpd="sng" algn="ctr">
-          <a:solidFill>
-            <a:schemeClr val="phClr"/>
-          </a:solidFill>
-          <a:prstDash val="solid"/>
-          <a:miter lim="800000"/>
-        </a:ln>
-        <a:ln w="12700" cap="flat" cmpd="sng" algn="ctr">
-          <a:solidFill>
-            <a:schemeClr val="phClr"/>
-          </a:solidFill>
-          <a:prstDash val="solid"/>
-          <a:miter lim="800000"/>
-        </a:ln>
-        <a:ln w="19050" cap="flat" cmpd="sng" algn="ctr">
-          <a:solidFill>
-            <a:schemeClr val="phClr"/>
-          </a:solidFill>
-          <a:prstDash val="solid"/>
-          <a:miter lim="800000"/>
-        </a:ln>
-      </a:lnStyleLst>
-      <a:effectStyleLst>
-        <a:effectStyle>
-          <a:effectLst/>
-        </a:effectStyle>
-        <a:effectStyle>
-          <a:effectLst/>
-        </a:effectStyle>
-        <a:effectStyle>
-          <a:effectLst>
-            <a:outerShdw blurRad="57150" dist="19050" dir="5400000" algn="ctr" rotWithShape="false">
-              <a:srgbClr val="000000">
-                <a:alpha val="63000"/>
-              </a:srgbClr>
-            </a:outerShdw>
-          </a:effectLst>
-        </a:effectStyle>
-      </a:effectStyleLst>
-      <a:bgFillStyleLst>
-        <a:solidFill>
-          <a:schemeClr val="phClr"/>
-        </a:solidFill>
-        <a:solidFill>
-          <a:schemeClr val="phClr">
-            <a:tint val="95000"/>
-            <a:satMod val="170000"/>
-          </a:schemeClr>
-        </a:solidFill>
-        <a:gradFill rotWithShape="true">
-          <a:gsLst>
-            <a:gs pos="0">
-              <a:schemeClr val="phClr">
-                <a:tint val="93000"/>
-                <a:satMod val="150000"/>
-                <a:shade val="98000"/>
-                <a:lumMod val="102000"/>
-              </a:schemeClr>
-            </a:gs>
-            <a:gs pos="50000">
-              <a:schemeClr val="phClr">
-                <a:tint val="98000"/>
-                <a:satMod val="130000"/>
-                <a:shade val="90000"/>
-                <a:lumMod val="103000"/>
-              </a:schemeClr>
-            </a:gs>
-            <a:gs pos="100000">
-              <a:schemeClr val="phClr">
-                <a:shade val="63000"/>
-                <a:satMod val="120000"/>
-              </a:schemeClr>
-            </a:gs>
-          </a:gsLst>
-          <a:lin ang="5400000" scaled="false"/>
-        </a:gradFill>
-      </a:bgFillStyleLst>
-    </a:fmtScheme>
-  </a:themeElements>
-  <a:objectDefaults/>
-  <a:extraClrSchemeLst/>
-</a:theme>
 </file>
</xml_diff>

<commit_message>
Samma grav raknas delstracka for delstracka
Ledningsinventering delar varje ledning i grav_delar efter vilka ledningar
som ligger i samma grav (minsta parallella stracka i meter i stallet for
andel). ledning_analys raknar schakt, spont, djuptillagg och aterstallning
per delstracka.

Co-Authored-By: Claude Opus 5.5 <noreply@anthropic.com>
Claude-Session: https://claude.ai/code/session_011fdqX3JEZje1LF9LqpaqR8
</commit_message>
<xml_diff>
--- a/Anvandarhandledning tv3_analys.docx
+++ b/Anvandarhandledning tv3_analys.docx
@@ -15874,7 +15874,7 @@
         <w:t xml:space="preserve">gis:</w:t>
       </w:r>
       <w:r>
-        <w:t xml:space="preserve"> också, och är underlaget för Excel- och kostnadsverktyget i nästa steg. Dialogen: ledningslager (avlopp), vattenledningar, brunnslager, servislager, brunnsfält, utdata, anordningar (ventiler, brandposter m.m.); under *Fält* gissas SVOA:s fältnamn (LevelFrom/LevelTo, PipeDimension, PipeMaterial, PipeType, ConstructionYear, RestorationYear, Slope, EntityID; CoverLevel, BottomLevel, WellFunction); under *Markhöjd* väljs höjdmodellen (ett eller flera raster – t.ex. fyra geotif-rutor som lagts in i kartan, de behöver inte slås ihop först) eller ett punktlager med höjder; under *Inställningar* tolerans, parallellavstånd, andel för samschakt, provtäthet, vattenledningarnas schablondjup, område och höjdsystem.</w:t>
+        <w:t xml:space="preserve"> också, och är underlaget för Excel- och kostnadsverktyget i nästa steg. Dialogen: ledningslager (avlopp), vattenledningar, brunnslager, servislager, brunnsfält, utdata, anordningar (ventiler, brandposter m.m.); under *Fält* gissas SVOA:s fältnamn (LevelFrom/LevelTo, PipeDimension, PipeMaterial, PipeType, ConstructionYear, RestorationYear, Slope, EntityID; CoverLevel, BottomLevel, WellFunction); under *Markhöjd* väljs höjdmodellen (ett eller flera raster – t.ex. fyra geotif-rutor som lagts in i kartan, de behöver inte slås ihop först) eller ett punktlager med höjder; under *Inställningar* tolerans, parallellavstånd, minsta parallella sträcka för samschakt, provtäthet, vattenledningarnas schablondjup, område och höjdsystem.</w:t>
       </w:r>
     </w:p>
     <w:p>
@@ -16170,16 +16170,16 @@
         <w:t xml:space="preserve">Parallella ledningar och samschakt.</w:t>
       </w:r>
       <w:r>
-        <w:t xml:space="preserve"> Varje ledning provas var 1 m mot alla andra ledningar inom parallellavståndet (3,0 m c–c). Per par: andel av vardera ledningens längd med den andra inom avståndet, medelavstånd och gemensam längd. Har någon av de två minst 60 % (</w:t>
-      </w:r>
-      <w:r>
-        <w:rPr>
-          <w:rFonts w:ascii="Consolas" w:cs="Consolas" w:eastAsia="Consolas" w:hAnsi="Consolas"/>
-          <w:sz w:val="20"/>
-          <w:szCs w:val="20"/>
-          <w:shd w:fill="F2F2F2" w:val="clear"/>
-        </w:rPr>
-        <w:t xml:space="preserve">parallell_andel</w:t>
+        <w:t xml:space="preserve"> Varje ledning provas var 1 m mot alla andra ledningar inom parallellavståndet (3,0 m c–c). Per par: andel av vardera ledningens längd med den andra inom avståndet, medelavstånd och gemensam längd. Går de parallellt minst 10 m (</w:t>
+      </w:r>
+      <w:r>
+        <w:rPr>
+          <w:rFonts w:ascii="Consolas" w:cs="Consolas" w:eastAsia="Consolas" w:hAnsi="Consolas"/>
+          <w:sz w:val="20"/>
+          <w:szCs w:val="20"/>
+          <w:shd w:fill="F2F2F2" w:val="clear"/>
+        </w:rPr>
+        <w:t xml:space="preserve">parallell_min_m</w:t>
       </w:r>
       <w:r>
         <w:t xml:space="preserve">) räknas paret som samschakt, och sammanhängande par bildar en </w:t>
@@ -16240,7 +16240,29 @@
         <w:t xml:space="preserve">schakt_ledningar</w:t>
       </w:r>
       <w:r>
-        <w:t xml:space="preserve">) – det som kostnadsdatabasen behöver för 1, 2 eller 3 ledningar i samma grav. Anslutningar i gemensam brunn och korsningar räknas inte som parallella (par under 20 % listas inte).</w:t>
+        <w:t xml:space="preserve">). Varje ledning delas dessutom upp längs sin längd i </w:t>
+      </w:r>
+      <w:r>
+        <w:rPr>
+          <w:b/>
+          <w:bCs/>
+        </w:rPr>
+        <w:t xml:space="preserve">delsträckor</w:t>
+      </w:r>
+      <w:r>
+        <w:t xml:space="preserve"> (</w:t>
+      </w:r>
+      <w:r>
+        <w:rPr>
+          <w:rFonts w:ascii="Consolas" w:cs="Consolas" w:eastAsia="Consolas" w:hAnsi="Consolas"/>
+          <w:sz w:val="20"/>
+          <w:szCs w:val="20"/>
+          <w:shd w:fill="F2F2F2" w:val="clear"/>
+        </w:rPr>
+        <w:t xml:space="preserve">grav_delar</w:t>
+      </w:r>
+      <w:r>
+        <w:t xml:space="preserve">): vilka andra ledningar i schaktgruppen som ligger i samma grav på varje bit. Går två ledningar parallellt 50 m och den ena fortsätter ensam 20 m blir det två delsträckor – 50 m med två ledningar och 20 m med en. En granne som bara ligger intill kortare än 10 m i följd (korsning, snett förbi) räknas inte. Anslutningar i gemensam brunn och korsningar räknas inte som parallella (par under 20 % som inte är samschakt listas inte).</w:t>
       </w:r>
     </w:p>
     <w:p>
@@ -16503,7 +16525,17 @@
         <w:t xml:space="preserve">Alt. lägg om</w:t>
       </w:r>
       <w:r>
-        <w:t xml:space="preserve"> – alla ledningar läggs om i helschakt. Ledningar som ligger i samma grav (samschakt) delar graven: priset per meter grav tas efter antal ledningar i graven (1–3), hur många av dem som är större än 400 mm och den största dimensionen, och delas lika mellan ledningarna. Schaktpriset gäller till 2,5 m djup; därunder tillkommer djuptillägget per påbörjade 1,5 m (3 750 kr/m upp till Ø 600, 7 500 kr/m över), räknat punkt för punkt längs profilen. Dessutom en halv ny brunn per brunnsände (schablon) och serviserna i helschakt. Standard är schakttypen </w:t>
+        <w:t xml:space="preserve"> – alla ledningar läggs om i helschakt. Ledningar som ligger i samma grav delar graven, och det räknas </w:t>
+      </w:r>
+      <w:r>
+        <w:rPr>
+          <w:b/>
+          <w:bCs/>
+        </w:rPr>
+        <w:t xml:space="preserve">delsträcka för delsträcka</w:t>
+      </w:r>
+      <w:r>
+        <w:t xml:space="preserve"> längs ledningen: där ledningarna går parallellt tas priset per meter grav efter antal ledningar i graven (1–3), hur många av dem som är större än 400 mm och den största dimensionen, och delas lika mellan ledningarna; där ledningen går ensam gäller priset för en ledning. Kolumnen *Grav längs ledningen* visar delsträckorna (t.ex. *0–50 m: DSL1; 50–70 m: ensam*) och *Delad grav* hur många meter som delas. Saknar prislistan kombinationen (t.ex. tre ledningar där en är Ø 1200) räknas den största av de andra ledningarna i egen grav på den biten, och saknar en granne dimension räknas graven utan den – båda står i anmärkningen. Äldre ledningsdata.json (före delsträckorna) uppskattas ur andelarna: en granne som går parallellt minst 10 m antas ligga intill på sin andel av längden. Schaktpriset gäller till 2,5 m djup; därunder tillkommer djuptillägget per påbörjade 1,5 m (3 750 kr/m upp till Ø 600, 7 500 kr/m över), räknat punkt för punkt längs profilen. Dessutom en halv ny brunn per brunnsände (schablon) och serviserna i helschakt. Standard är schakttypen </w:t>
       </w:r>
       <w:r>
         <w:rPr>
@@ -16617,7 +16649,19 @@
         <w:t xml:space="preserve">Alt. schaktfritt</w:t>
       </w:r>
       <w:r>
-        <w:t xml:space="preserve"> – spill-, dag- och kombinerade ledningar infodras (från 100 mm, så långt prislistan räcker – i dag Ø 1300). Går infodring inte rörspräcks ledningen om den är högst 400 mm, annars läggs den om. Vattenledningar infodras inte: de rörspräcks (högst 400 mm), men bara när avloppsledningarna i samma grav också klaras utan schakt. Läggs någon avloppsledning i graven om, läggs vattenledningen om i samma grav. Ledningar som läggs om i alternativet delar grav med varandra, inte med dem som infodras.</w:t>
+        <w:t xml:space="preserve"> – spill-, dag- och kombinerade ledningar infodras (från 100 mm, så långt prislistan räcker – i dag Ø 1300). Går infodring inte rörspräcks ledningen om den är högst 400 mm, annars läggs den om. Vattenledningar infodras inte: de rörspräcks (högst 400 mm), men bara när avloppsledningarna i samma grav också klaras utan schakt. Ligger minst halva vattenledningen (</w:t>
+      </w:r>
+      <w:r>
+        <w:rPr>
+          <w:rFonts w:ascii="Consolas" w:cs="Consolas" w:eastAsia="Consolas" w:hAnsi="Consolas"/>
+          <w:sz w:val="20"/>
+          <w:szCs w:val="20"/>
+          <w:shd w:fill="F2F2F2" w:val="clear"/>
+        </w:rPr>
+        <w:t xml:space="preserve">VATTEN_OMLAGGNING_ANDEL</w:t>
+      </w:r>
+      <w:r>
+        <w:t xml:space="preserve"> 0,5) i samma grav som avloppsledningar som läggs om, läggs vattenledningen om tillsammans med dem. Ledningar som läggs om i alternativet delar grav med varandra, inte med dem som infodras.</w:t>
       </w:r>
     </w:p>
     <w:p>

</xml_diff>

<commit_message>
Verktygsladan uppdelad i verktygsgrupper
TV-inspektion, Omradesanalys, Projektering och Hjalpverktyg som undermappar
(self.category) i tv3_verktyg.pyt.

Co-Authored-By: Claude Opus 5.5 <noreply@anthropic.com>
Claude-Session: https://claude.ai/code/session_011fdqX3JEZje1LF9LqpaqR8
</commit_message>
<xml_diff>
--- a/Anvandarhandledning tv3_analys.docx
+++ b/Anvandarhandledning tv3_analys.docx
@@ -11204,7 +11204,7 @@
         <w:t xml:space="preserve">tv3_analys</w:t>
       </w:r>
       <w:r>
-        <w:t xml:space="preserve"> innehåller följande verktyg (dialogerna kommer ihåg de värden du valde senast, i </w:t>
+        <w:t xml:space="preserve"> är uppdelad i fyra undermappar (verktygsgrupper). Dialogerna kommer ihåg de värden du valde senast, i </w:t>
       </w:r>
       <w:r>
         <w:rPr>
@@ -11216,7 +11216,22 @@
         <w:t xml:space="preserve">arcmap/senaste_val.json</w:t>
       </w:r>
       <w:r>
-        <w:t xml:space="preserve">):</w:t>
+        <w:t xml:space="preserve">.</w:t>
+      </w:r>
+    </w:p>
+    <w:p>
+      <w:pPr>
+        <w:spacing w:after="120"/>
+      </w:pPr>
+      <w:r>
+        <w:rPr>
+          <w:b/>
+          <w:bCs/>
+        </w:rPr>
+        <w:t xml:space="preserve">TV-inspektion</w:t>
+      </w:r>
+      <w:r>
+        <w:t xml:space="preserve"> – verktygen som bygger på analysen av TV3-filerna</w:t>
       </w:r>
     </w:p>
     <w:p>
@@ -11233,10 +11248,158 @@
           <w:b/>
           <w:bCs/>
         </w:rPr>
-        <w:t xml:space="preserve">Lista fält</w:t>
-      </w:r>
-      <w:r>
-        <w:t xml:space="preserve"> – skriver en textfil med kartans lager, deras fält och exempelvärden, så att rätt fält kan väljas i de andra verktygen (avsnitt 7.11).</w:t>
+        <w:t xml:space="preserve">Skapa ledningslager</w:t>
+      </w:r>
+      <w:r>
+        <w:t xml:space="preserve"> – välj </w:t>
+      </w:r>
+      <w:r>
+        <w:rPr>
+          <w:rFonts w:ascii="Consolas" w:cs="Consolas" w:eastAsia="Consolas" w:hAnsi="Consolas"/>
+          <w:sz w:val="20"/>
+          <w:szCs w:val="20"/>
+          <w:shd w:fill="F2F2F2" w:val="clear"/>
+        </w:rPr>
+        <w:t xml:space="preserve">kartunderlag.json</w:t>
+      </w:r>
+      <w:r>
+        <w:t xml:space="preserve">, ledningslager, brunnslager, fältet med brunnsbeteckning (standard </w:t>
+      </w:r>
+      <w:r>
+        <w:rPr>
+          <w:rFonts w:ascii="Consolas" w:cs="Consolas" w:eastAsia="Consolas" w:hAnsi="Consolas"/>
+          <w:sz w:val="20"/>
+          <w:szCs w:val="20"/>
+          <w:shd w:fill="F2F2F2" w:val="clear"/>
+        </w:rPr>
+        <w:t xml:space="preserve">EntityID</w:t>
+      </w:r>
+      <w:r>
+        <w:t xml:space="preserve">) och var utdata ska sparas. Lagervalen är rullistor med kartans lager; </w:t>
+      </w:r>
+      <w:r>
+        <w:rPr>
+          <w:rFonts w:ascii="Consolas" w:cs="Consolas" w:eastAsia="Consolas" w:hAnsi="Consolas"/>
+          <w:sz w:val="20"/>
+          <w:szCs w:val="20"/>
+          <w:shd w:fill="F2F2F2" w:val="clear"/>
+        </w:rPr>
+        <w:t xml:space="preserve">A Ledning</w:t>
+      </w:r>
+      <w:r>
+        <w:t xml:space="preserve">, </w:t>
+      </w:r>
+      <w:r>
+        <w:rPr>
+          <w:rFonts w:ascii="Consolas" w:cs="Consolas" w:eastAsia="Consolas" w:hAnsi="Consolas"/>
+          <w:sz w:val="20"/>
+          <w:szCs w:val="20"/>
+          <w:shd w:fill="F2F2F2" w:val="clear"/>
+        </w:rPr>
+        <w:t xml:space="preserve">A Nedstign och övriga brunnar</w:t>
+      </w:r>
+      <w:r>
+        <w:t xml:space="preserve">, </w:t>
+      </w:r>
+      <w:r>
+        <w:rPr>
+          <w:rFonts w:ascii="Consolas" w:cs="Consolas" w:eastAsia="Consolas" w:hAnsi="Consolas"/>
+          <w:sz w:val="20"/>
+          <w:szCs w:val="20"/>
+          <w:shd w:fill="F2F2F2" w:val="clear"/>
+        </w:rPr>
+        <w:t xml:space="preserve">A Rensbrunn/tillsynsbrunn</w:t>
+      </w:r>
+      <w:r>
+        <w:t xml:space="preserve"> och </w:t>
+      </w:r>
+      <w:r>
+        <w:rPr>
+          <w:rFonts w:ascii="Consolas" w:cs="Consolas" w:eastAsia="Consolas" w:hAnsi="Consolas"/>
+          <w:sz w:val="20"/>
+          <w:szCs w:val="20"/>
+          <w:shd w:fill="F2F2F2" w:val="clear"/>
+        </w:rPr>
+        <w:t xml:space="preserve">A Platsgjuten brunnspunkt</w:t>
+      </w:r>
+      <w:r>
+        <w:t xml:space="preserve"> är förifyllda när de finns. Ta med </w:t>
+      </w:r>
+      <w:r>
+        <w:rPr>
+          <w:b/>
+          <w:bCs/>
+        </w:rPr>
+        <w:t xml:space="preserve">alla</w:t>
+      </w:r>
+      <w:r>
+        <w:t xml:space="preserve"> lager där brunnar kan ligga – nedstigningsbrunnar och rens-/tillsynsbrunnar ligger i olika lager, och loggen visar hur många av inspektionens brunnar som hittades och vilka brunnstyper som saknas. Valfritt: ett polygonlager som begränsar sökningen, en </w:t>
+      </w:r>
+      <w:r>
+        <w:rPr>
+          <w:rFonts w:ascii="Consolas" w:cs="Consolas" w:eastAsia="Consolas" w:hAnsi="Consolas"/>
+          <w:sz w:val="20"/>
+          <w:szCs w:val="20"/>
+          <w:shd w:fill="F2F2F2" w:val="clear"/>
+        </w:rPr>
+        <w:t xml:space="preserve">.lyr</w:t>
+      </w:r>
+      <w:r>
+        <w:t xml:space="preserve">-fil med symbologi och en CSV-rapport över brunnspar som inte hittades. Under </w:t>
+      </w:r>
+      <w:r>
+        <w:rPr>
+          <w:b/>
+          <w:bCs/>
+        </w:rPr>
+        <w:t xml:space="preserve">Matchning</w:t>
+      </w:r>
+      <w:r>
+        <w:t xml:space="preserve"> finns tolerans (2 m), max antal brunnar en sträcka får passera (2) och fält från ledningslagret som ska följa med. Under </w:t>
+      </w:r>
+      <w:r>
+        <w:rPr>
+          <w:b/>
+          <w:bCs/>
+        </w:rPr>
+        <w:t xml:space="preserve">Parallella ledningar</w:t>
+      </w:r>
+      <w:r>
+        <w:t xml:space="preserve"> anges fälten med ledningstyp och dimension i ledningslagret (gissas: </w:t>
+      </w:r>
+      <w:r>
+        <w:rPr>
+          <w:rFonts w:ascii="Consolas" w:cs="Consolas" w:eastAsia="Consolas" w:hAnsi="Consolas"/>
+          <w:sz w:val="20"/>
+          <w:szCs w:val="20"/>
+          <w:shd w:fill="F2F2F2" w:val="clear"/>
+        </w:rPr>
+        <w:t xml:space="preserve">PipeType</w:t>
+      </w:r>
+      <w:r>
+        <w:t xml:space="preserve">, </w:t>
+      </w:r>
+      <w:r>
+        <w:rPr>
+          <w:rFonts w:ascii="Consolas" w:cs="Consolas" w:eastAsia="Consolas" w:hAnsi="Consolas"/>
+          <w:sz w:val="20"/>
+          <w:szCs w:val="20"/>
+          <w:shd w:fill="F2F2F2" w:val="clear"/>
+        </w:rPr>
+        <w:t xml:space="preserve">PipeDimension</w:t>
+      </w:r>
+      <w:r>
+        <w:t xml:space="preserve">), se nedan. Under </w:t>
+      </w:r>
+      <w:r>
+        <w:rPr>
+          <w:b/>
+          <w:bCs/>
+        </w:rPr>
+        <w:t xml:space="preserve">Avbrutna inspektioner</w:t>
+      </w:r>
+      <w:r>
+        <w:t xml:space="preserve"> styrs om avbrutna filmer ritas bara så långt kameran kom (förval ja).</w:t>
       </w:r>
     </w:p>
     <w:p>
@@ -11253,158 +11416,10 @@
           <w:b/>
           <w:bCs/>
         </w:rPr>
-        <w:t xml:space="preserve">Skapa ledningslager</w:t>
-      </w:r>
-      <w:r>
-        <w:t xml:space="preserve"> – välj </w:t>
-      </w:r>
-      <w:r>
-        <w:rPr>
-          <w:rFonts w:ascii="Consolas" w:cs="Consolas" w:eastAsia="Consolas" w:hAnsi="Consolas"/>
-          <w:sz w:val="20"/>
-          <w:szCs w:val="20"/>
-          <w:shd w:fill="F2F2F2" w:val="clear"/>
-        </w:rPr>
-        <w:t xml:space="preserve">kartunderlag.json</w:t>
-      </w:r>
-      <w:r>
-        <w:t xml:space="preserve">, ledningslager, brunnslager, fältet med brunnsbeteckning (standard </w:t>
-      </w:r>
-      <w:r>
-        <w:rPr>
-          <w:rFonts w:ascii="Consolas" w:cs="Consolas" w:eastAsia="Consolas" w:hAnsi="Consolas"/>
-          <w:sz w:val="20"/>
-          <w:szCs w:val="20"/>
-          <w:shd w:fill="F2F2F2" w:val="clear"/>
-        </w:rPr>
-        <w:t xml:space="preserve">EntityID</w:t>
-      </w:r>
-      <w:r>
-        <w:t xml:space="preserve">) och var utdata ska sparas. Lagervalen är rullistor med kartans lager; </w:t>
-      </w:r>
-      <w:r>
-        <w:rPr>
-          <w:rFonts w:ascii="Consolas" w:cs="Consolas" w:eastAsia="Consolas" w:hAnsi="Consolas"/>
-          <w:sz w:val="20"/>
-          <w:szCs w:val="20"/>
-          <w:shd w:fill="F2F2F2" w:val="clear"/>
-        </w:rPr>
-        <w:t xml:space="preserve">A Ledning</w:t>
-      </w:r>
-      <w:r>
-        <w:t xml:space="preserve">, </w:t>
-      </w:r>
-      <w:r>
-        <w:rPr>
-          <w:rFonts w:ascii="Consolas" w:cs="Consolas" w:eastAsia="Consolas" w:hAnsi="Consolas"/>
-          <w:sz w:val="20"/>
-          <w:szCs w:val="20"/>
-          <w:shd w:fill="F2F2F2" w:val="clear"/>
-        </w:rPr>
-        <w:t xml:space="preserve">A Nedstign och övriga brunnar</w:t>
-      </w:r>
-      <w:r>
-        <w:t xml:space="preserve">, </w:t>
-      </w:r>
-      <w:r>
-        <w:rPr>
-          <w:rFonts w:ascii="Consolas" w:cs="Consolas" w:eastAsia="Consolas" w:hAnsi="Consolas"/>
-          <w:sz w:val="20"/>
-          <w:szCs w:val="20"/>
-          <w:shd w:fill="F2F2F2" w:val="clear"/>
-        </w:rPr>
-        <w:t xml:space="preserve">A Rensbrunn/tillsynsbrunn</w:t>
-      </w:r>
-      <w:r>
-        <w:t xml:space="preserve"> och </w:t>
-      </w:r>
-      <w:r>
-        <w:rPr>
-          <w:rFonts w:ascii="Consolas" w:cs="Consolas" w:eastAsia="Consolas" w:hAnsi="Consolas"/>
-          <w:sz w:val="20"/>
-          <w:szCs w:val="20"/>
-          <w:shd w:fill="F2F2F2" w:val="clear"/>
-        </w:rPr>
-        <w:t xml:space="preserve">A Platsgjuten brunnspunkt</w:t>
-      </w:r>
-      <w:r>
-        <w:t xml:space="preserve"> är förifyllda när de finns. Ta med </w:t>
-      </w:r>
-      <w:r>
-        <w:rPr>
-          <w:b/>
-          <w:bCs/>
-        </w:rPr>
-        <w:t xml:space="preserve">alla</w:t>
-      </w:r>
-      <w:r>
-        <w:t xml:space="preserve"> lager där brunnar kan ligga – nedstigningsbrunnar och rens-/tillsynsbrunnar ligger i olika lager, och loggen visar hur många av inspektionens brunnar som hittades och vilka brunnstyper som saknas. Valfritt: ett polygonlager som begränsar sökningen, en </w:t>
-      </w:r>
-      <w:r>
-        <w:rPr>
-          <w:rFonts w:ascii="Consolas" w:cs="Consolas" w:eastAsia="Consolas" w:hAnsi="Consolas"/>
-          <w:sz w:val="20"/>
-          <w:szCs w:val="20"/>
-          <w:shd w:fill="F2F2F2" w:val="clear"/>
-        </w:rPr>
-        <w:t xml:space="preserve">.lyr</w:t>
-      </w:r>
-      <w:r>
-        <w:t xml:space="preserve">-fil med symbologi och en CSV-rapport över brunnspar som inte hittades. Under </w:t>
-      </w:r>
-      <w:r>
-        <w:rPr>
-          <w:b/>
-          <w:bCs/>
-        </w:rPr>
-        <w:t xml:space="preserve">Matchning</w:t>
-      </w:r>
-      <w:r>
-        <w:t xml:space="preserve"> finns tolerans (2 m), max antal brunnar en sträcka får passera (2) och fält från ledningslagret som ska följa med. Under </w:t>
-      </w:r>
-      <w:r>
-        <w:rPr>
-          <w:b/>
-          <w:bCs/>
-        </w:rPr>
-        <w:t xml:space="preserve">Parallella ledningar</w:t>
-      </w:r>
-      <w:r>
-        <w:t xml:space="preserve"> anges fälten med ledningstyp och dimension i ledningslagret (gissas: </w:t>
-      </w:r>
-      <w:r>
-        <w:rPr>
-          <w:rFonts w:ascii="Consolas" w:cs="Consolas" w:eastAsia="Consolas" w:hAnsi="Consolas"/>
-          <w:sz w:val="20"/>
-          <w:szCs w:val="20"/>
-          <w:shd w:fill="F2F2F2" w:val="clear"/>
-        </w:rPr>
-        <w:t xml:space="preserve">PipeType</w:t>
-      </w:r>
-      <w:r>
-        <w:t xml:space="preserve">, </w:t>
-      </w:r>
-      <w:r>
-        <w:rPr>
-          <w:rFonts w:ascii="Consolas" w:cs="Consolas" w:eastAsia="Consolas" w:hAnsi="Consolas"/>
-          <w:sz w:val="20"/>
-          <w:szCs w:val="20"/>
-          <w:shd w:fill="F2F2F2" w:val="clear"/>
-        </w:rPr>
-        <w:t xml:space="preserve">PipeDimension</w:t>
-      </w:r>
-      <w:r>
-        <w:t xml:space="preserve">), se nedan. Under </w:t>
-      </w:r>
-      <w:r>
-        <w:rPr>
-          <w:b/>
-          <w:bCs/>
-        </w:rPr>
-        <w:t xml:space="preserve">Avbrutna inspektioner</w:t>
-      </w:r>
-      <w:r>
-        <w:t xml:space="preserve"> styrs om avbrutna filmer ritas bara så långt kameran kom (förval ja).</w:t>
+        <w:t xml:space="preserve">Uppdatera bedömning</w:t>
+      </w:r>
+      <w:r>
+        <w:t xml:space="preserve"> – välj lagret när du fyllt i manuella bedömningar, så räknas Gällande bedömning, Bedömningstyp och STIL om utan att geometrin rörs.</w:t>
       </w:r>
     </w:p>
     <w:p>
@@ -11421,10 +11436,10 @@
           <w:b/>
           <w:bCs/>
         </w:rPr>
-        <w:t xml:space="preserve">Uppdatera bedömning</w:t>
-      </w:r>
-      <w:r>
-        <w:t xml:space="preserve"> – välj lagret när du fyllt i manuella bedömningar, så räknas Gällande bedömning, Bedömningstyp och STIL om utan att geometrin rörs.</w:t>
+        <w:t xml:space="preserve">Etapplager (åtgärdspaket)</w:t>
+      </w:r>
+      <w:r>
+        <w:t xml:space="preserve"> – en linje per etapp ur det bedömda lagret, med etappnummer, metod, kostnad och brunnar att schakta fram (avsnitt 7.12).</w:t>
       </w:r>
     </w:p>
     <w:p>
@@ -11441,10 +11456,22 @@
           <w:b/>
           <w:bCs/>
         </w:rPr>
-        <w:t xml:space="preserve">Etapplager (åtgärdspaket)</w:t>
-      </w:r>
-      <w:r>
-        <w:t xml:space="preserve"> – en linje per etapp ur det bedömda lagret, med etappnummer, metod, kostnad och brunnar att schakta fram (avsnitt 7.12).</w:t>
+        <w:t xml:space="preserve">Markprofil</w:t>
+      </w:r>
+      <w:r>
+        <w:t xml:space="preserve"> – markhöjd längs sträckorna och vattengång i brunnarna till </w:t>
+      </w:r>
+      <w:r>
+        <w:rPr>
+          <w:rFonts w:ascii="Consolas" w:cs="Consolas" w:eastAsia="Consolas" w:hAnsi="Consolas"/>
+          <w:sz w:val="20"/>
+          <w:szCs w:val="20"/>
+          <w:shd w:fill="F2F2F2" w:val="clear"/>
+        </w:rPr>
+        <w:t xml:space="preserve">markprofil.json</w:t>
+      </w:r>
+      <w:r>
+        <w:t xml:space="preserve"> (avsnitt 7.5).</w:t>
       </w:r>
     </w:p>
     <w:p>
@@ -11461,22 +11488,10 @@
           <w:b/>
           <w:bCs/>
         </w:rPr>
-        <w:t xml:space="preserve">Markprofil</w:t>
-      </w:r>
-      <w:r>
-        <w:t xml:space="preserve"> – markhöjd längs sträckorna och vattengång i brunnarna till </w:t>
-      </w:r>
-      <w:r>
-        <w:rPr>
-          <w:rFonts w:ascii="Consolas" w:cs="Consolas" w:eastAsia="Consolas" w:hAnsi="Consolas"/>
-          <w:sz w:val="20"/>
-          <w:szCs w:val="20"/>
-          <w:shd w:fill="F2F2F2" w:val="clear"/>
-        </w:rPr>
-        <w:t xml:space="preserve">markprofil.json</w:t>
-      </w:r>
-      <w:r>
-        <w:t xml:space="preserve"> (avsnitt 7.5).</w:t>
+        <w:t xml:space="preserve">Uppströms</w:t>
+      </w:r>
+      <w:r>
+        <w:t xml:space="preserve"> – allt som ligger uppströms om en brunn eller markerad ledning, och i batchläge serviser och längd uppströms per bedömd sträcka (avsnitt 7.9).</w:t>
       </w:r>
     </w:p>
     <w:p>
@@ -11493,10 +11508,22 @@
           <w:b/>
           <w:bCs/>
         </w:rPr>
-        <w:t xml:space="preserve">Uppströms</w:t>
-      </w:r>
-      <w:r>
-        <w:t xml:space="preserve"> – allt som ligger uppströms om en brunn eller markerad ledning, och i batchläge serviser och längd uppströms per bedömd sträcka (avsnitt 7.9).</w:t>
+        <w:t xml:space="preserve">Exportera GIS-data</w:t>
+      </w:r>
+      <w:r>
+        <w:t xml:space="preserve"> – brunnar och ledningar ur kartan till </w:t>
+      </w:r>
+      <w:r>
+        <w:rPr>
+          <w:rFonts w:ascii="Consolas" w:cs="Consolas" w:eastAsia="Consolas" w:hAnsi="Consolas"/>
+          <w:sz w:val="20"/>
+          <w:szCs w:val="20"/>
+          <w:shd w:fill="F2F2F2" w:val="clear"/>
+        </w:rPr>
+        <w:t xml:space="preserve">gisdata.json</w:t>
+      </w:r>
+      <w:r>
+        <w:t xml:space="preserve">, som analysen kontrollerar filmerna mot (avsnitt 7.11).</w:t>
       </w:r>
     </w:p>
     <w:p>
@@ -11513,22 +11540,25 @@
           <w:b/>
           <w:bCs/>
         </w:rPr>
-        <w:t xml:space="preserve">Exportera GIS-data</w:t>
-      </w:r>
-      <w:r>
-        <w:t xml:space="preserve"> – brunnar och ledningar ur kartan till </w:t>
-      </w:r>
-      <w:r>
-        <w:rPr>
-          <w:rFonts w:ascii="Consolas" w:cs="Consolas" w:eastAsia="Consolas" w:hAnsi="Consolas"/>
-          <w:sz w:val="20"/>
-          <w:szCs w:val="20"/>
-          <w:shd w:fill="F2F2F2" w:val="clear"/>
-        </w:rPr>
-        <w:t xml:space="preserve">gisdata.json</w:t>
-      </w:r>
-      <w:r>
-        <w:t xml:space="preserve">, som analysen kontrollerar filmerna mot (avsnitt 7.11).</w:t>
+        <w:t xml:space="preserve">Exportera kartor (PDF per sträcka)</w:t>
+      </w:r>
+      <w:r>
+        <w:t xml:space="preserve"> – en PDF-karta per åtgärdssträcka eller etapp ur layouten, i minsta skala där sträckan ryms (1:200, 1:300, 1:400 …), med automatiskt val mellan liggande och stående mall, samlad PDF och hyperlänkfältet KARTA (avsnitt 7.10).</w:t>
+      </w:r>
+    </w:p>
+    <w:p>
+      <w:pPr>
+        <w:spacing w:after="120"/>
+      </w:pPr>
+      <w:r>
+        <w:rPr>
+          <w:b/>
+          <w:bCs/>
+        </w:rPr>
+        <w:t xml:space="preserve">Områdesanalys</w:t>
+      </w:r>
+      <w:r>
+        <w:t xml:space="preserve"> – analys av ett område oberoende av TV-inspektionerna</w:t>
       </w:r>
     </w:p>
     <w:p>
@@ -11545,10 +11575,10 @@
           <w:b/>
           <w:bCs/>
         </w:rPr>
-        <w:t xml:space="preserve">Exportera kartor (PDF per sträcka)</w:t>
-      </w:r>
-      <w:r>
-        <w:t xml:space="preserve"> – en PDF-karta per åtgärdssträcka eller etapp ur layouten, i minsta skala där sträckan ryms (1:200, 1:300, 1:400 …), med automatiskt val mellan liggande och stående mall, samlad PDF och hyperlänkfältet KARTA (avsnitt 7.10).</w:t>
+        <w:t xml:space="preserve">Exportera område</w:t>
+      </w:r>
+      <w:r>
+        <w:t xml:space="preserve"> – kopierar allt VA-nät inom valda polygoner till en lokal filgeodatabas (avsnitt 7.13); första steget i ledningsinventeringen.</w:t>
       </w:r>
     </w:p>
     <w:p>
@@ -11565,22 +11595,37 @@
           <w:b/>
           <w:bCs/>
         </w:rPr>
-        <w:t xml:space="preserve">Exportera kartbild</w:t>
-      </w:r>
-      <w:r>
-        <w:t xml:space="preserve"> – sparar kartans aktuella vy som </w:t>
-      </w:r>
-      <w:r>
-        <w:rPr>
-          <w:rFonts w:ascii="Consolas" w:cs="Consolas" w:eastAsia="Consolas" w:hAnsi="Consolas"/>
-          <w:sz w:val="20"/>
-          <w:szCs w:val="20"/>
-          <w:shd w:fill="F2F2F2" w:val="clear"/>
-        </w:rPr>
-        <w:t xml:space="preserve">kartbild.png</w:t>
-      </w:r>
-      <w:r>
-        <w:t xml:space="preserve"> i utdatamappen, så att presentationen (6.2) får en kartsida. Zooma och tänd rätt lager först.</w:t>
+        <w:t xml:space="preserve">Ledningsinventering</w:t>
+      </w:r>
+      <w:r>
+        <w:t xml:space="preserve"> – en post per ledningssträcka med alla fält, lutning, djup, serviser, parallella ledningar och korsningar till </w:t>
+      </w:r>
+      <w:r>
+        <w:rPr>
+          <w:rFonts w:ascii="Consolas" w:cs="Consolas" w:eastAsia="Consolas" w:hAnsi="Consolas"/>
+          <w:sz w:val="20"/>
+          <w:szCs w:val="20"/>
+          <w:shd w:fill="F2F2F2" w:val="clear"/>
+        </w:rPr>
+        <w:t xml:space="preserve">ledningsdata.json</w:t>
+      </w:r>
+      <w:r>
+        <w:t xml:space="preserve"> + CSV (avsnitt 7.14); andra steget i ledningsinventeringen.</w:t>
+      </w:r>
+    </w:p>
+    <w:p>
+      <w:pPr>
+        <w:spacing w:after="120"/>
+      </w:pPr>
+      <w:r>
+        <w:rPr>
+          <w:b/>
+          <w:bCs/>
+        </w:rPr>
+        <w:t xml:space="preserve">Projektering</w:t>
+      </w:r>
+      <w:r>
+        <w:t xml:space="preserve"> – nya VA-stråk</w:t>
       </w:r>
     </w:p>
     <w:p>
@@ -11615,6 +11660,18 @@
     </w:p>
     <w:p>
       <w:pPr>
+        <w:spacing w:after="120"/>
+      </w:pPr>
+      <w:r>
+        <w:rPr>
+          <w:b/>
+          <w:bCs/>
+        </w:rPr>
+        <w:t xml:space="preserve">Hjälpverktyg</w:t>
+      </w:r>
+    </w:p>
+    <w:p>
+      <w:pPr>
         <w:pStyle w:val="ListParagraph"/>
         <w:numPr>
           <w:ilvl w:val="0"/>
@@ -11627,10 +11684,10 @@
           <w:b/>
           <w:bCs/>
         </w:rPr>
-        <w:t xml:space="preserve">Exportera område</w:t>
-      </w:r>
-      <w:r>
-        <w:t xml:space="preserve"> – kopierar allt VA-nät inom valda polygoner till en lokal filgeodatabas (avsnitt 7.13); första steget i ledningsinventeringen.</w:t>
+        <w:t xml:space="preserve">Lista fält</w:t>
+      </w:r>
+      <w:r>
+        <w:t xml:space="preserve"> – skriver en textfil med kartans lager, deras fält och exempelvärden, så att rätt fält kan väljas i de andra verktygen (avsnitt 7.11).</w:t>
       </w:r>
     </w:p>
     <w:p>
@@ -11647,22 +11704,22 @@
           <w:b/>
           <w:bCs/>
         </w:rPr>
-        <w:t xml:space="preserve">Ledningsinventering</w:t>
-      </w:r>
-      <w:r>
-        <w:t xml:space="preserve"> – en post per ledningssträcka med alla fält, lutning, djup, serviser, parallella ledningar och korsningar till </w:t>
-      </w:r>
-      <w:r>
-        <w:rPr>
-          <w:rFonts w:ascii="Consolas" w:cs="Consolas" w:eastAsia="Consolas" w:hAnsi="Consolas"/>
-          <w:sz w:val="20"/>
-          <w:szCs w:val="20"/>
-          <w:shd w:fill="F2F2F2" w:val="clear"/>
-        </w:rPr>
-        <w:t xml:space="preserve">ledningsdata.json</w:t>
-      </w:r>
-      <w:r>
-        <w:t xml:space="preserve"> + CSV (avsnitt 7.14); andra steget i ledningsinventeringen.</w:t>
+        <w:t xml:space="preserve">Exportera kartbild</w:t>
+      </w:r>
+      <w:r>
+        <w:t xml:space="preserve"> – sparar kartans aktuella vy som </w:t>
+      </w:r>
+      <w:r>
+        <w:rPr>
+          <w:rFonts w:ascii="Consolas" w:cs="Consolas" w:eastAsia="Consolas" w:hAnsi="Consolas"/>
+          <w:sz w:val="20"/>
+          <w:szCs w:val="20"/>
+          <w:shd w:fill="F2F2F2" w:val="clear"/>
+        </w:rPr>
+        <w:t xml:space="preserve">kartbild.png</w:t>
+      </w:r>
+      <w:r>
+        <w:t xml:space="preserve"> i utdatamappen, så att presentationen (6.2) får en kartsida. Zooma och tänd rätt lager först.</w:t>
       </w:r>
     </w:p>
     <w:p>

</xml_diff>

<commit_message>
Investeringskalkyl (BP2) och trafiktillagg/provisorier per omrade
Ny flik Investeringskalkyl enligt SVOA:s kalkylmall; Ledningsinventering
laser omradets namn och procentpaslag fran omradeslagret.

Co-Authored-By: Claude Opus 5.5 <noreply@anthropic.com>
Claude-Session: https://claude.ai/code/session_011fdqX3JEZje1LF9LqpaqR8
</commit_message>
<xml_diff>
--- a/Anvandarhandledning tv3_analys.docx
+++ b/Anvandarhandledning tv3_analys.docx
@@ -16336,10 +16336,46 @@
           <w:b/>
           <w:bCs/>
         </w:rPr>
-        <w:t xml:space="preserve">Korsningar</w:t>
-      </w:r>
-      <w:r>
-        <w:t xml:space="preserve"> med andra ledningar (geometrisk skärning, inte i gemensam brunn eller ände): läge längs båda ledningarna, nivå på båda (vattengång, för vatten markhöjd minus schablondjup) och höjdskillnaden – styr schaktdjupet vid en omläggning.</w:t>
+        <w:t xml:space="preserve">Områden, trafiktillägg och provisorier.</w:t>
+      </w:r>
+      <w:r>
+        <w:t xml:space="preserve"> Under Inställningar väljs fältet med områdets namn i områdeslagret och, om de finns, fälten med procentpåslag för trafiktillägg (</w:t>
+      </w:r>
+      <w:r>
+        <w:rPr>
+          <w:rFonts w:ascii="Consolas" w:cs="Consolas" w:eastAsia="Consolas" w:hAnsi="Consolas"/>
+          <w:sz w:val="20"/>
+          <w:szCs w:val="20"/>
+          <w:shd w:fill="F2F2F2" w:val="clear"/>
+        </w:rPr>
+        <w:t xml:space="preserve">TRAFIKPASLAG</w:t>
+      </w:r>
+      <w:r>
+        <w:t xml:space="preserve">, t.ex. 10, 30 eller 60) och provisorier (</w:t>
+      </w:r>
+      <w:r>
+        <w:rPr>
+          <w:rFonts w:ascii="Consolas" w:cs="Consolas" w:eastAsia="Consolas" w:hAnsi="Consolas"/>
+          <w:sz w:val="20"/>
+          <w:szCs w:val="20"/>
+          <w:shd w:fill="F2F2F2" w:val="clear"/>
+        </w:rPr>
+        <w:t xml:space="preserve">PROVISORIER</w:t>
+      </w:r>
+      <w:r>
+        <w:t xml:space="preserve">). Varje ledning får området där dess mittpunkt ligger och områdets påslag; områdena listas i </w:t>
+      </w:r>
+      <w:r>
+        <w:rPr>
+          <w:rFonts w:ascii="Consolas" w:cs="Consolas" w:eastAsia="Consolas" w:hAnsi="Consolas"/>
+          <w:sz w:val="20"/>
+          <w:szCs w:val="20"/>
+          <w:shd w:fill="F2F2F2" w:val="clear"/>
+        </w:rPr>
+        <w:t xml:space="preserve">ledningsdata.json</w:t>
+      </w:r>
+      <w:r>
+        <w:t xml:space="preserve">. Lägg fälten på områdespolygonerna i GIS och fyll i dem per område (t.ex. 30 för Lövstavägen) innan du kör verktyget.</w:t>
       </w:r>
     </w:p>
     <w:p>
@@ -16356,22 +16392,10 @@
           <w:b/>
           <w:bCs/>
         </w:rPr>
-        <w:t xml:space="preserve">Brunnar</w:t>
-      </w:r>
-      <w:r>
-        <w:t xml:space="preserve">: locknivå, bottennivå, antal anslutna ledningar, lägsta vattengång och djup (lock minus lägsta vattengång, annars lock minus botten) samt alla fält. Brunnar utan ledning och utan locknivå listas under </w:t>
-      </w:r>
-      <w:r>
-        <w:rPr>
-          <w:rFonts w:ascii="Consolas" w:cs="Consolas" w:eastAsia="Consolas" w:hAnsi="Consolas"/>
-          <w:sz w:val="20"/>
-          <w:szCs w:val="20"/>
-          <w:shd w:fill="F2F2F2" w:val="clear"/>
-        </w:rPr>
-        <w:t xml:space="preserve">datakvalitet</w:t>
-      </w:r>
-      <w:r>
-        <w:t xml:space="preserve">, liksom ledningarnas flaggor.</w:t>
+        <w:t xml:space="preserve">Korsningar</w:t>
+      </w:r>
+      <w:r>
+        <w:t xml:space="preserve"> med andra ledningar (geometrisk skärning, inte i gemensam brunn eller ände): läge längs båda ledningarna, nivå på båda (vattengång, för vatten markhöjd minus schablondjup) och höjdskillnaden – styr schaktdjupet vid en omläggning.</w:t>
       </w:r>
     </w:p>
     <w:p>
@@ -16384,185 +16408,26 @@
         <w:spacing w:after="80"/>
       </w:pPr>
       <w:r>
-        <w:t xml:space="preserve">Grunderna sitter överst i </w:t>
-      </w:r>
-      <w:r>
-        <w:rPr>
-          <w:rFonts w:ascii="Consolas" w:cs="Consolas" w:eastAsia="Consolas" w:hAnsi="Consolas"/>
-          <w:sz w:val="20"/>
-          <w:szCs w:val="20"/>
-          <w:shd w:fill="F2F2F2" w:val="clear"/>
-        </w:rPr>
-        <w:t xml:space="preserve">arcmap/moduler/inventering.py</w:t>
-      </w:r>
-      <w:r>
-        <w:t xml:space="preserve">: </w:t>
-      </w:r>
-      <w:r>
-        <w:rPr>
-          <w:rFonts w:ascii="Consolas" w:cs="Consolas" w:eastAsia="Consolas" w:hAnsi="Consolas"/>
-          <w:sz w:val="20"/>
-          <w:szCs w:val="20"/>
-          <w:shd w:fill="F2F2F2" w:val="clear"/>
-        </w:rPr>
-        <w:t xml:space="preserve">FLACK_PROMILLE</w:t>
-      </w:r>
-      <w:r>
-        <w:t xml:space="preserve"> 2, </w:t>
-      </w:r>
-      <w:r>
-        <w:rPr>
-          <w:rFonts w:ascii="Consolas" w:cs="Consolas" w:eastAsia="Consolas" w:hAnsi="Consolas"/>
-          <w:sz w:val="20"/>
-          <w:szCs w:val="20"/>
-          <w:shd w:fill="F2F2F2" w:val="clear"/>
-        </w:rPr>
-        <w:t xml:space="preserve">ORIMLIG_PROMILLE</w:t>
-      </w:r>
-      <w:r>
-        <w:t xml:space="preserve"> 200, </w:t>
-      </w:r>
-      <w:r>
-        <w:rPr>
-          <w:rFonts w:ascii="Consolas" w:cs="Consolas" w:eastAsia="Consolas" w:hAnsi="Consolas"/>
-          <w:sz w:val="20"/>
-          <w:szCs w:val="20"/>
-          <w:shd w:fill="F2F2F2" w:val="clear"/>
-        </w:rPr>
-        <w:t xml:space="preserve">DJUPKLASSER</w:t>
-      </w:r>
-      <w:r>
-        <w:t xml:space="preserve"> (2, 3, 4) och </w:t>
-      </w:r>
-      <w:r>
-        <w:rPr>
-          <w:rFonts w:ascii="Consolas" w:cs="Consolas" w:eastAsia="Consolas" w:hAnsi="Consolas"/>
-          <w:sz w:val="20"/>
-          <w:szCs w:val="20"/>
-          <w:shd w:fill="F2F2F2" w:val="clear"/>
-        </w:rPr>
-        <w:t xml:space="preserve">PARALLELL_MIN_ANDEL</w:t>
-      </w:r>
-      <w:r>
-        <w:t xml:space="preserve"> 0,2. Sammanfattningen i filen (</w:t>
-      </w:r>
-      <w:r>
-        <w:rPr>
-          <w:rFonts w:ascii="Consolas" w:cs="Consolas" w:eastAsia="Consolas" w:hAnsi="Consolas"/>
-          <w:sz w:val="20"/>
-          <w:szCs w:val="20"/>
-          <w:shd w:fill="F2F2F2" w:val="clear"/>
-        </w:rPr>
-        <w:t xml:space="preserve">sammanfattning</w:t>
-      </w:r>
-      <w:r>
-        <w:t xml:space="preserve">) och verktygets sista rad anger antal ledningar, brunnar, kopplade serviser, samschakt-par, schaktgrupper och korsningar.</w:t>
-      </w:r>
-    </w:p>
-    <w:p>
-      <w:pPr>
-        <w:pStyle w:val="Heading2"/>
-      </w:pPr>
-      <w:r>
-        <w:t xml:space="preserve">7.15 Inventeringsbok och kostnad – ledning_analys.py</w:t>
-      </w:r>
-    </w:p>
-    <w:p>
-      <w:pPr>
-        <w:spacing w:after="120"/>
-      </w:pPr>
-      <w:r>
-        <w:t xml:space="preserve">Tredje steget i ledningsinventeringen körs på din dator, inte i ArcMap. Skriptet läser </w:t>
-      </w:r>
-      <w:r>
-        <w:rPr>
-          <w:rFonts w:ascii="Consolas" w:cs="Consolas" w:eastAsia="Consolas" w:hAnsi="Consolas"/>
-          <w:sz w:val="20"/>
-          <w:szCs w:val="20"/>
-          <w:shd w:fill="F2F2F2" w:val="clear"/>
-        </w:rPr>
-        <w:t xml:space="preserve">ledningsdata.json</w:t>
-      </w:r>
-      <w:r>
-        <w:t xml:space="preserve"> från Ledningsinventering och räknar vad det kostar att lägga om hela nätet jämfört med att renovera det schaktfritt (strumpa eller rörspräckning – *Alt. schaktfritt*), med priserna ur SVOA:s kalkylverktyg i </w:t>
-      </w:r>
-      <w:r>
-        <w:rPr>
-          <w:rFonts w:ascii="Consolas" w:cs="Consolas" w:eastAsia="Consolas" w:hAnsi="Consolas"/>
-          <w:sz w:val="20"/>
-          <w:szCs w:val="20"/>
-          <w:shd w:fill="F2F2F2" w:val="clear"/>
-        </w:rPr>
-        <w:t xml:space="preserve">kostnader_inventering.csv</w:t>
-      </w:r>
-      <w:r>
-        <w:t xml:space="preserve">. Resultatet blir </w:t>
-      </w:r>
-      <w:r>
-        <w:rPr>
-          <w:rFonts w:ascii="Consolas" w:cs="Consolas" w:eastAsia="Consolas" w:hAnsi="Consolas"/>
-          <w:sz w:val="20"/>
-          <w:szCs w:val="20"/>
-          <w:shd w:fill="F2F2F2" w:val="clear"/>
-        </w:rPr>
-        <w:t xml:space="preserve">ledningsinventering.xlsx</w:t>
-      </w:r>
-      <w:r>
-        <w:t xml:space="preserve"> och </w:t>
-      </w:r>
-      <w:r>
-        <w:rPr>
-          <w:rFonts w:ascii="Consolas" w:cs="Consolas" w:eastAsia="Consolas" w:hAnsi="Consolas"/>
-          <w:sz w:val="20"/>
-          <w:szCs w:val="20"/>
-          <w:shd w:fill="F2F2F2" w:val="clear"/>
-        </w:rPr>
-        <w:t xml:space="preserve">ledningsresultat.json</w:t>
-      </w:r>
-      <w:r>
-        <w:t xml:space="preserve"> i samma mapp (eller i mappen efter </w:t>
-      </w:r>
-      <w:r>
-        <w:rPr>
-          <w:rFonts w:ascii="Consolas" w:cs="Consolas" w:eastAsia="Consolas" w:hAnsi="Consolas"/>
-          <w:sz w:val="20"/>
-          <w:szCs w:val="20"/>
-          <w:shd w:fill="F2F2F2" w:val="clear"/>
-        </w:rPr>
-        <w:t xml:space="preserve">-o</w:t>
-      </w:r>
-      <w:r>
-        <w:t xml:space="preserve">). Skriptet ger inga rekommendationer – bara beräkningar.</w:t>
-      </w:r>
-    </w:p>
-    <w:p>
-      <w:pPr>
-        <w:shd w:fill="F2F2F2" w:val="clear"/>
-        <w:spacing w:after="0"/>
-        <w:ind w:left="280"/>
-      </w:pPr>
-      <w:r>
-        <w:rPr>
-          <w:rFonts w:ascii="Consolas" w:cs="Consolas" w:eastAsia="Consolas" w:hAnsi="Consolas"/>
-          <w:sz w:val="19"/>
-          <w:szCs w:val="19"/>
-        </w:rPr>
-        <w:t xml:space="preserve">python ledning_analys.py ledningsdata.json</w:t>
-      </w:r>
-    </w:p>
-    <w:p>
-      <w:pPr>
-        <w:shd w:fill="F2F2F2" w:val="clear"/>
-        <w:spacing w:after="0"/>
-        <w:ind w:left="280"/>
-      </w:pPr>
-      <w:r>
-        <w:rPr>
-          <w:rFonts w:ascii="Consolas" w:cs="Consolas" w:eastAsia="Consolas" w:hAnsi="Consolas"/>
-          <w:sz w:val="19"/>
-          <w:szCs w:val="19"/>
-        </w:rPr>
-        <w:t xml:space="preserve">python ledning_analys.py ledningsdata.json -o utdata --schakttyp bergschakt</w:t>
+        <w:rPr>
+          <w:b/>
+          <w:bCs/>
+        </w:rPr>
+        <w:t xml:space="preserve">Brunnar</w:t>
+      </w:r>
+      <w:r>
+        <w:t xml:space="preserve">: locknivå, bottennivå, antal anslutna ledningar, lägsta vattengång och djup (lock minus lägsta vattengång, annars lock minus botten) samt alla fält. Brunnar utan ledning och utan locknivå listas under </w:t>
+      </w:r>
+      <w:r>
+        <w:rPr>
+          <w:rFonts w:ascii="Consolas" w:cs="Consolas" w:eastAsia="Consolas" w:hAnsi="Consolas"/>
+          <w:sz w:val="20"/>
+          <w:szCs w:val="20"/>
+          <w:shd w:fill="F2F2F2" w:val="clear"/>
+        </w:rPr>
+        <w:t xml:space="preserve">datakvalitet</w:t>
+      </w:r>
+      <w:r>
+        <w:t xml:space="preserve">, liksom ledningarnas flaggor.</w:t>
       </w:r>
     </w:p>
     <w:p>
@@ -16575,118 +16440,185 @@
         <w:spacing w:after="80"/>
       </w:pPr>
       <w:r>
-        <w:rPr>
-          <w:b/>
-          <w:bCs/>
-        </w:rPr>
-        <w:t xml:space="preserve">Alt. lägg om</w:t>
-      </w:r>
-      <w:r>
-        <w:t xml:space="preserve"> – alla ledningar läggs om i helschakt. Ledningar som ligger i samma grav delar graven, och det räknas </w:t>
-      </w:r>
-      <w:r>
-        <w:rPr>
-          <w:b/>
-          <w:bCs/>
-        </w:rPr>
-        <w:t xml:space="preserve">delsträcka för delsträcka</w:t>
-      </w:r>
-      <w:r>
-        <w:t xml:space="preserve"> längs ledningen: där ledningarna går parallellt tas priset per meter grav efter antal ledningar i graven (1–3), hur många av dem som är större än 400 mm och den största dimensionen, och delas lika mellan ledningarna; där ledningen går ensam gäller priset för en ledning. Kolumnen *Grav längs ledningen* visar delsträckorna (t.ex. *0–50 m: DSL1; 50–70 m: ensam*) och *Delad grav* hur många meter som delas. Saknar prislistan kombinationen (t.ex. tre ledningar där en är Ø 1200) räknas den största av de andra ledningarna i egen grav på den biten, och saknar en granne dimension räknas graven utan den – båda står i anmärkningen. Äldre ledningsdata.json (före delsträckorna) uppskattas ur andelarna: en granne som går parallellt minst 10 m antas ligga intill på sin andel av längden. Schaktpriset gäller till 2,5 m djup; därunder tillkommer djuptillägget per påbörjade 1,5 m (3 750 kr/m upp till Ø 600, 7 500 kr/m över), räknat punkt för punkt längs profilen. Dessutom en halv ny brunn per brunnsände (schablon) och serviserna i helschakt. Standard är schakttypen </w:t>
-      </w:r>
-      <w:r>
-        <w:rPr>
-          <w:b/>
-          <w:bCs/>
-        </w:rPr>
-        <w:t xml:space="preserve">efter djup</w:t>
-      </w:r>
-      <w:r>
-        <w:t xml:space="preserve">: gravens medeldjup (den djupaste ledningen i graven) avgör schaktsättet – under 2 m ledningschakt, 2–3 m spontlåda (priset med spontsläde), från 3 m ledningschakt plus slagen spont. Slagen spont räknas på båda sidor av graven med höjden medeldjup + 3 m: 2 × (medeldjup + 3 m) × längd × 3 500 kr/m² (post </w:t>
-      </w:r>
-      <w:r>
-        <w:rPr>
-          <w:rFonts w:ascii="Consolas" w:cs="Consolas" w:eastAsia="Consolas" w:hAnsi="Consolas"/>
-          <w:sz w:val="20"/>
-          <w:szCs w:val="20"/>
-          <w:shd w:fill="F2F2F2" w:val="clear"/>
-        </w:rPr>
-        <w:t xml:space="preserve">slagen_spont</w:t>
-      </w:r>
-      <w:r>
-        <w:t xml:space="preserve">, delas mellan ledningarna i graven). Serviserna får spontslädetillägget vid spontlåda. Saknas djupet räknas ledningschakt utan spont och det står i anmärkningen. Gränserna står i KONFIG (</w:t>
-      </w:r>
-      <w:r>
-        <w:rPr>
-          <w:rFonts w:ascii="Consolas" w:cs="Consolas" w:eastAsia="Consolas" w:hAnsi="Consolas"/>
-          <w:sz w:val="20"/>
-          <w:szCs w:val="20"/>
-          <w:shd w:fill="F2F2F2" w:val="clear"/>
-        </w:rPr>
-        <w:t xml:space="preserve">SPONTLADA_FRAN_M</w:t>
-      </w:r>
-      <w:r>
-        <w:t xml:space="preserve">, </w:t>
-      </w:r>
-      <w:r>
-        <w:rPr>
-          <w:rFonts w:ascii="Consolas" w:cs="Consolas" w:eastAsia="Consolas" w:hAnsi="Consolas"/>
-          <w:sz w:val="20"/>
-          <w:szCs w:val="20"/>
-          <w:shd w:fill="F2F2F2" w:val="clear"/>
-        </w:rPr>
-        <w:t xml:space="preserve">SLAGEN_SPONT_FRAN_M</w:t>
-      </w:r>
-      <w:r>
-        <w:t xml:space="preserve">, </w:t>
-      </w:r>
-      <w:r>
-        <w:rPr>
-          <w:rFonts w:ascii="Consolas" w:cs="Consolas" w:eastAsia="Consolas" w:hAnsi="Consolas"/>
-          <w:sz w:val="20"/>
-          <w:szCs w:val="20"/>
-          <w:shd w:fill="F2F2F2" w:val="clear"/>
-        </w:rPr>
-        <w:t xml:space="preserve">SPONT_NEDSLAGNING_M</w:t>
-      </w:r>
-      <w:r>
-        <w:t xml:space="preserve">, </w:t>
-      </w:r>
-      <w:r>
-        <w:rPr>
-          <w:rFonts w:ascii="Consolas" w:cs="Consolas" w:eastAsia="Consolas" w:hAnsi="Consolas"/>
-          <w:sz w:val="20"/>
-          <w:szCs w:val="20"/>
-          <w:shd w:fill="F2F2F2" w:val="clear"/>
-        </w:rPr>
-        <w:t xml:space="preserve">SPONT_SIDOR</w:t>
-      </w:r>
-      <w:r>
-        <w:t xml:space="preserve">). Alternativet räknas också för de fyra fasta schakttyperna – ledningschakt, med spontsläde, bergschakt och KC-förstärkning – och sammanfattningen visar alla fem samt ett block med längd, kvadratmeter spont och kostnad per schaktsätt; </w:t>
-      </w:r>
-      <w:r>
-        <w:rPr>
-          <w:rFonts w:ascii="Consolas" w:cs="Consolas" w:eastAsia="Consolas" w:hAnsi="Consolas"/>
-          <w:sz w:val="20"/>
-          <w:szCs w:val="20"/>
-          <w:shd w:fill="F2F2F2" w:val="clear"/>
-        </w:rPr>
-        <w:t xml:space="preserve">--schakttyp</w:t>
-      </w:r>
-      <w:r>
-        <w:t xml:space="preserve"> väljer vilken som används i jämförelsen (standard </w:t>
-      </w:r>
-      <w:r>
-        <w:rPr>
-          <w:rFonts w:ascii="Consolas" w:cs="Consolas" w:eastAsia="Consolas" w:hAnsi="Consolas"/>
-          <w:sz w:val="20"/>
-          <w:szCs w:val="20"/>
-          <w:shd w:fill="F2F2F2" w:val="clear"/>
-        </w:rPr>
-        <w:t xml:space="preserve">djup</w:t>
-      </w:r>
-      <w:r>
-        <w:t xml:space="preserve">). Fliken Ledningar visar schaktsättet per ledning (gravdjup, spont i m² och kr finns bland de dolda kolumnerna).</w:t>
+        <w:t xml:space="preserve">Grunderna sitter överst i </w:t>
+      </w:r>
+      <w:r>
+        <w:rPr>
+          <w:rFonts w:ascii="Consolas" w:cs="Consolas" w:eastAsia="Consolas" w:hAnsi="Consolas"/>
+          <w:sz w:val="20"/>
+          <w:szCs w:val="20"/>
+          <w:shd w:fill="F2F2F2" w:val="clear"/>
+        </w:rPr>
+        <w:t xml:space="preserve">arcmap/moduler/inventering.py</w:t>
+      </w:r>
+      <w:r>
+        <w:t xml:space="preserve">: </w:t>
+      </w:r>
+      <w:r>
+        <w:rPr>
+          <w:rFonts w:ascii="Consolas" w:cs="Consolas" w:eastAsia="Consolas" w:hAnsi="Consolas"/>
+          <w:sz w:val="20"/>
+          <w:szCs w:val="20"/>
+          <w:shd w:fill="F2F2F2" w:val="clear"/>
+        </w:rPr>
+        <w:t xml:space="preserve">FLACK_PROMILLE</w:t>
+      </w:r>
+      <w:r>
+        <w:t xml:space="preserve"> 2, </w:t>
+      </w:r>
+      <w:r>
+        <w:rPr>
+          <w:rFonts w:ascii="Consolas" w:cs="Consolas" w:eastAsia="Consolas" w:hAnsi="Consolas"/>
+          <w:sz w:val="20"/>
+          <w:szCs w:val="20"/>
+          <w:shd w:fill="F2F2F2" w:val="clear"/>
+        </w:rPr>
+        <w:t xml:space="preserve">ORIMLIG_PROMILLE</w:t>
+      </w:r>
+      <w:r>
+        <w:t xml:space="preserve"> 200, </w:t>
+      </w:r>
+      <w:r>
+        <w:rPr>
+          <w:rFonts w:ascii="Consolas" w:cs="Consolas" w:eastAsia="Consolas" w:hAnsi="Consolas"/>
+          <w:sz w:val="20"/>
+          <w:szCs w:val="20"/>
+          <w:shd w:fill="F2F2F2" w:val="clear"/>
+        </w:rPr>
+        <w:t xml:space="preserve">DJUPKLASSER</w:t>
+      </w:r>
+      <w:r>
+        <w:t xml:space="preserve"> (2, 3, 4) och </w:t>
+      </w:r>
+      <w:r>
+        <w:rPr>
+          <w:rFonts w:ascii="Consolas" w:cs="Consolas" w:eastAsia="Consolas" w:hAnsi="Consolas"/>
+          <w:sz w:val="20"/>
+          <w:szCs w:val="20"/>
+          <w:shd w:fill="F2F2F2" w:val="clear"/>
+        </w:rPr>
+        <w:t xml:space="preserve">PARALLELL_MIN_ANDEL</w:t>
+      </w:r>
+      <w:r>
+        <w:t xml:space="preserve"> 0,2. Sammanfattningen i filen (</w:t>
+      </w:r>
+      <w:r>
+        <w:rPr>
+          <w:rFonts w:ascii="Consolas" w:cs="Consolas" w:eastAsia="Consolas" w:hAnsi="Consolas"/>
+          <w:sz w:val="20"/>
+          <w:szCs w:val="20"/>
+          <w:shd w:fill="F2F2F2" w:val="clear"/>
+        </w:rPr>
+        <w:t xml:space="preserve">sammanfattning</w:t>
+      </w:r>
+      <w:r>
+        <w:t xml:space="preserve">) och verktygets sista rad anger antal ledningar, brunnar, kopplade serviser, samschakt-par, schaktgrupper och korsningar.</w:t>
+      </w:r>
+    </w:p>
+    <w:p>
+      <w:pPr>
+        <w:pStyle w:val="Heading2"/>
+      </w:pPr>
+      <w:r>
+        <w:t xml:space="preserve">7.15 Inventeringsbok och kostnad – ledning_analys.py</w:t>
+      </w:r>
+    </w:p>
+    <w:p>
+      <w:pPr>
+        <w:spacing w:after="120"/>
+      </w:pPr>
+      <w:r>
+        <w:t xml:space="preserve">Tredje steget i ledningsinventeringen körs på din dator, inte i ArcMap. Skriptet läser </w:t>
+      </w:r>
+      <w:r>
+        <w:rPr>
+          <w:rFonts w:ascii="Consolas" w:cs="Consolas" w:eastAsia="Consolas" w:hAnsi="Consolas"/>
+          <w:sz w:val="20"/>
+          <w:szCs w:val="20"/>
+          <w:shd w:fill="F2F2F2" w:val="clear"/>
+        </w:rPr>
+        <w:t xml:space="preserve">ledningsdata.json</w:t>
+      </w:r>
+      <w:r>
+        <w:t xml:space="preserve"> från Ledningsinventering och räknar vad det kostar att lägga om hela nätet jämfört med att renovera det schaktfritt (strumpa eller rörspräckning – *Alt. schaktfritt*), med priserna ur SVOA:s kalkylverktyg i </w:t>
+      </w:r>
+      <w:r>
+        <w:rPr>
+          <w:rFonts w:ascii="Consolas" w:cs="Consolas" w:eastAsia="Consolas" w:hAnsi="Consolas"/>
+          <w:sz w:val="20"/>
+          <w:szCs w:val="20"/>
+          <w:shd w:fill="F2F2F2" w:val="clear"/>
+        </w:rPr>
+        <w:t xml:space="preserve">kostnader_inventering.csv</w:t>
+      </w:r>
+      <w:r>
+        <w:t xml:space="preserve">. Resultatet blir </w:t>
+      </w:r>
+      <w:r>
+        <w:rPr>
+          <w:rFonts w:ascii="Consolas" w:cs="Consolas" w:eastAsia="Consolas" w:hAnsi="Consolas"/>
+          <w:sz w:val="20"/>
+          <w:szCs w:val="20"/>
+          <w:shd w:fill="F2F2F2" w:val="clear"/>
+        </w:rPr>
+        <w:t xml:space="preserve">ledningsinventering.xlsx</w:t>
+      </w:r>
+      <w:r>
+        <w:t xml:space="preserve"> och </w:t>
+      </w:r>
+      <w:r>
+        <w:rPr>
+          <w:rFonts w:ascii="Consolas" w:cs="Consolas" w:eastAsia="Consolas" w:hAnsi="Consolas"/>
+          <w:sz w:val="20"/>
+          <w:szCs w:val="20"/>
+          <w:shd w:fill="F2F2F2" w:val="clear"/>
+        </w:rPr>
+        <w:t xml:space="preserve">ledningsresultat.json</w:t>
+      </w:r>
+      <w:r>
+        <w:t xml:space="preserve"> i samma mapp (eller i mappen efter </w:t>
+      </w:r>
+      <w:r>
+        <w:rPr>
+          <w:rFonts w:ascii="Consolas" w:cs="Consolas" w:eastAsia="Consolas" w:hAnsi="Consolas"/>
+          <w:sz w:val="20"/>
+          <w:szCs w:val="20"/>
+          <w:shd w:fill="F2F2F2" w:val="clear"/>
+        </w:rPr>
+        <w:t xml:space="preserve">-o</w:t>
+      </w:r>
+      <w:r>
+        <w:t xml:space="preserve">). Skriptet ger inga rekommendationer – bara beräkningar.</w:t>
+      </w:r>
+    </w:p>
+    <w:p>
+      <w:pPr>
+        <w:shd w:fill="F2F2F2" w:val="clear"/>
+        <w:spacing w:after="0"/>
+        <w:ind w:left="280"/>
+      </w:pPr>
+      <w:r>
+        <w:rPr>
+          <w:rFonts w:ascii="Consolas" w:cs="Consolas" w:eastAsia="Consolas" w:hAnsi="Consolas"/>
+          <w:sz w:val="19"/>
+          <w:szCs w:val="19"/>
+        </w:rPr>
+        <w:t xml:space="preserve">python ledning_analys.py ledningsdata.json</w:t>
+      </w:r>
+    </w:p>
+    <w:p>
+      <w:pPr>
+        <w:shd w:fill="F2F2F2" w:val="clear"/>
+        <w:spacing w:after="0"/>
+        <w:ind w:left="280"/>
+      </w:pPr>
+      <w:r>
+        <w:rPr>
+          <w:rFonts w:ascii="Consolas" w:cs="Consolas" w:eastAsia="Consolas" w:hAnsi="Consolas"/>
+          <w:sz w:val="19"/>
+          <w:szCs w:val="19"/>
+        </w:rPr>
+        <w:t xml:space="preserve">python ledning_analys.py ledningsdata.json -o utdata --schakttyp bergschakt</w:t>
       </w:r>
     </w:p>
     <w:p>
@@ -16703,22 +16635,114 @@
           <w:b/>
           <w:bCs/>
         </w:rPr>
-        <w:t xml:space="preserve">Alt. schaktfritt</w:t>
-      </w:r>
-      <w:r>
-        <w:t xml:space="preserve"> – spill-, dag- och kombinerade ledningar infodras (från 100 mm, så långt prislistan räcker – i dag Ø 1300). Går infodring inte rörspräcks ledningen om den är högst 400 mm, annars läggs den om. Vattenledningar infodras inte: de rörspräcks (högst 400 mm), men bara när avloppsledningarna i samma grav också klaras utan schakt. Ligger minst halva vattenledningen (</w:t>
-      </w:r>
-      <w:r>
-        <w:rPr>
-          <w:rFonts w:ascii="Consolas" w:cs="Consolas" w:eastAsia="Consolas" w:hAnsi="Consolas"/>
-          <w:sz w:val="20"/>
-          <w:szCs w:val="20"/>
-          <w:shd w:fill="F2F2F2" w:val="clear"/>
-        </w:rPr>
-        <w:t xml:space="preserve">VATTEN_OMLAGGNING_ANDEL</w:t>
-      </w:r>
-      <w:r>
-        <w:t xml:space="preserve"> 0,5) i samma grav som avloppsledningar som läggs om, läggs vattenledningen om tillsammans med dem. Ledningar som läggs om i alternativet delar grav med varandra, inte med dem som infodras.</w:t>
+        <w:t xml:space="preserve">Alt. lägg om</w:t>
+      </w:r>
+      <w:r>
+        <w:t xml:space="preserve"> – alla ledningar läggs om i helschakt. Ledningar som ligger i samma grav delar graven, och det räknas </w:t>
+      </w:r>
+      <w:r>
+        <w:rPr>
+          <w:b/>
+          <w:bCs/>
+        </w:rPr>
+        <w:t xml:space="preserve">delsträcka för delsträcka</w:t>
+      </w:r>
+      <w:r>
+        <w:t xml:space="preserve"> längs ledningen: där ledningarna går parallellt tas priset per meter grav efter antal ledningar i graven (1–3), hur många av dem som är större än 400 mm och den största dimensionen, och delas lika mellan ledningarna; där ledningen går ensam gäller priset för en ledning. Kolumnen *Grav längs ledningen* visar delsträckorna (t.ex. *0–50 m: DSL1; 50–70 m: ensam*) och *Delad grav* hur många meter som delas. Saknar prislistan kombinationen (t.ex. tre ledningar där en är Ø 1200) räknas den största av de andra ledningarna i egen grav på den biten, och saknar en granne dimension räknas graven utan den – båda står i anmärkningen. Äldre ledningsdata.json (före delsträckorna) uppskattas ur andelarna: en granne som går parallellt minst 10 m antas ligga intill på sin andel av längden. Schaktpriset gäller till 2,5 m djup; därunder tillkommer djuptillägget per påbörjade 1,5 m (3 750 kr/m upp till Ø 600, 7 500 kr/m över), räknat punkt för punkt längs profilen. Dessutom en halv ny brunn per brunnsände (schablon) och serviserna i helschakt. Standard är schakttypen </w:t>
+      </w:r>
+      <w:r>
+        <w:rPr>
+          <w:b/>
+          <w:bCs/>
+        </w:rPr>
+        <w:t xml:space="preserve">efter djup</w:t>
+      </w:r>
+      <w:r>
+        <w:t xml:space="preserve">: gravens medeldjup (den djupaste ledningen i graven) avgör schaktsättet – under 2 m ledningschakt, 2–3 m spontlåda (priset med spontsläde), från 3 m ledningschakt plus slagen spont. Slagen spont räknas på båda sidor av graven med höjden medeldjup + 3 m: 2 × (medeldjup + 3 m) × längd × 3 500 kr/m² (post </w:t>
+      </w:r>
+      <w:r>
+        <w:rPr>
+          <w:rFonts w:ascii="Consolas" w:cs="Consolas" w:eastAsia="Consolas" w:hAnsi="Consolas"/>
+          <w:sz w:val="20"/>
+          <w:szCs w:val="20"/>
+          <w:shd w:fill="F2F2F2" w:val="clear"/>
+        </w:rPr>
+        <w:t xml:space="preserve">slagen_spont</w:t>
+      </w:r>
+      <w:r>
+        <w:t xml:space="preserve">, delas mellan ledningarna i graven). Serviserna får spontslädetillägget vid spontlåda. Saknas djupet räknas ledningschakt utan spont och det står i anmärkningen. Gränserna står i KONFIG (</w:t>
+      </w:r>
+      <w:r>
+        <w:rPr>
+          <w:rFonts w:ascii="Consolas" w:cs="Consolas" w:eastAsia="Consolas" w:hAnsi="Consolas"/>
+          <w:sz w:val="20"/>
+          <w:szCs w:val="20"/>
+          <w:shd w:fill="F2F2F2" w:val="clear"/>
+        </w:rPr>
+        <w:t xml:space="preserve">SPONTLADA_FRAN_M</w:t>
+      </w:r>
+      <w:r>
+        <w:t xml:space="preserve">, </w:t>
+      </w:r>
+      <w:r>
+        <w:rPr>
+          <w:rFonts w:ascii="Consolas" w:cs="Consolas" w:eastAsia="Consolas" w:hAnsi="Consolas"/>
+          <w:sz w:val="20"/>
+          <w:szCs w:val="20"/>
+          <w:shd w:fill="F2F2F2" w:val="clear"/>
+        </w:rPr>
+        <w:t xml:space="preserve">SLAGEN_SPONT_FRAN_M</w:t>
+      </w:r>
+      <w:r>
+        <w:t xml:space="preserve">, </w:t>
+      </w:r>
+      <w:r>
+        <w:rPr>
+          <w:rFonts w:ascii="Consolas" w:cs="Consolas" w:eastAsia="Consolas" w:hAnsi="Consolas"/>
+          <w:sz w:val="20"/>
+          <w:szCs w:val="20"/>
+          <w:shd w:fill="F2F2F2" w:val="clear"/>
+        </w:rPr>
+        <w:t xml:space="preserve">SPONT_NEDSLAGNING_M</w:t>
+      </w:r>
+      <w:r>
+        <w:t xml:space="preserve">, </w:t>
+      </w:r>
+      <w:r>
+        <w:rPr>
+          <w:rFonts w:ascii="Consolas" w:cs="Consolas" w:eastAsia="Consolas" w:hAnsi="Consolas"/>
+          <w:sz w:val="20"/>
+          <w:szCs w:val="20"/>
+          <w:shd w:fill="F2F2F2" w:val="clear"/>
+        </w:rPr>
+        <w:t xml:space="preserve">SPONT_SIDOR</w:t>
+      </w:r>
+      <w:r>
+        <w:t xml:space="preserve">). Alternativet räknas också för de fyra fasta schakttyperna – ledningschakt, med spontsläde, bergschakt och KC-förstärkning – och sammanfattningen visar alla fem samt ett block med längd, kvadratmeter spont och kostnad per schaktsätt; </w:t>
+      </w:r>
+      <w:r>
+        <w:rPr>
+          <w:rFonts w:ascii="Consolas" w:cs="Consolas" w:eastAsia="Consolas" w:hAnsi="Consolas"/>
+          <w:sz w:val="20"/>
+          <w:szCs w:val="20"/>
+          <w:shd w:fill="F2F2F2" w:val="clear"/>
+        </w:rPr>
+        <w:t xml:space="preserve">--schakttyp</w:t>
+      </w:r>
+      <w:r>
+        <w:t xml:space="preserve"> väljer vilken som används i jämförelsen (standard </w:t>
+      </w:r>
+      <w:r>
+        <w:rPr>
+          <w:rFonts w:ascii="Consolas" w:cs="Consolas" w:eastAsia="Consolas" w:hAnsi="Consolas"/>
+          <w:sz w:val="20"/>
+          <w:szCs w:val="20"/>
+          <w:shd w:fill="F2F2F2" w:val="clear"/>
+        </w:rPr>
+        <w:t xml:space="preserve">djup</w:t>
+      </w:r>
+      <w:r>
+        <w:t xml:space="preserve">). Fliken Ledningar visar schaktsättet per ledning (gravdjup, spont i m² och kr finns bland de dolda kolumnerna).</w:t>
       </w:r>
     </w:p>
     <w:p>
@@ -16735,10 +16759,22 @@
           <w:b/>
           <w:bCs/>
         </w:rPr>
-        <w:t xml:space="preserve">Rörspräckning</w:t>
-      </w:r>
-      <w:r>
-        <w:t xml:space="preserve"> = pris per meter efter DN (Ø 100–400) + en införingsgrop och en maskingrop per påbörjade 50 m ledning + en servisgrop per servis + en ventilgrop per ventil och brandpost på ledningen (ur inventeringens anordningar; servisventiler ligger i servisgropen). Byte av ventiler och brandposter vid omläggning ingår inte – det finns inget pris för det i kalkylverktyget.</w:t>
+        <w:t xml:space="preserve">Alt. schaktfritt</w:t>
+      </w:r>
+      <w:r>
+        <w:t xml:space="preserve"> – spill-, dag- och kombinerade ledningar infodras (från 100 mm, så långt prislistan räcker – i dag Ø 1300). Går infodring inte rörspräcks ledningen om den är högst 400 mm, annars läggs den om. Vattenledningar infodras inte: de rörspräcks (högst 400 mm), men bara när avloppsledningarna i samma grav också klaras utan schakt. Ligger minst halva vattenledningen (</w:t>
+      </w:r>
+      <w:r>
+        <w:rPr>
+          <w:rFonts w:ascii="Consolas" w:cs="Consolas" w:eastAsia="Consolas" w:hAnsi="Consolas"/>
+          <w:sz w:val="20"/>
+          <w:szCs w:val="20"/>
+          <w:shd w:fill="F2F2F2" w:val="clear"/>
+        </w:rPr>
+        <w:t xml:space="preserve">VATTEN_OMLAGGNING_ANDEL</w:t>
+      </w:r>
+      <w:r>
+        <w:t xml:space="preserve"> 0,5) i samma grav som avloppsledningar som läggs om, läggs vattenledningen om tillsammans med dem. Ledningar som läggs om i alternativet delar grav med varandra, inte med dem som infodras.</w:t>
       </w:r>
     </w:p>
     <w:p>
@@ -16755,44 +16791,10 @@
           <w:b/>
           <w:bCs/>
         </w:rPr>
-        <w:t xml:space="preserve">Serviser</w:t>
-      </w:r>
-      <w:r>
-        <w:t xml:space="preserve"> förnyas i båda alternativen, per meter servisledning. I helschakt delar serviser till samma fastighet servisgrav (båda ändarna inom 3 m från varandra): en ensam dricksvattenservis kostar som dricksvattenservis helschakt, en ensam spill- eller dagvattenservis som komplett servis (spillen ligger oftast djupast), två eller tre i samma grav som komplett servis, delat lika. Raderna för en större ledning ”Ø 700” gäller över 400 till och med Ø 800, raderna för två och tre större ledningar Ø 700–1000. Bergschakt och spontsläde ger servistillägget per meter. Schaktfritt (när huvudledningen infodras eller rörspräcks) infodras spill-, dag- och kombinerade serviser på högst 6 m med </w:t>
-      </w:r>
-      <w:r>
-        <w:rPr>
-          <w:b/>
-          <w:bCs/>
-        </w:rPr>
-        <w:t xml:space="preserve">hatt</w:t>
-      </w:r>
-      <w:r>
-        <w:t xml:space="preserve"> för 30 000 kr/st (post </w:t>
-      </w:r>
-      <w:r>
-        <w:rPr>
-          <w:rFonts w:ascii="Consolas" w:cs="Consolas" w:eastAsia="Consolas" w:hAnsi="Consolas"/>
-          <w:sz w:val="20"/>
-          <w:szCs w:val="20"/>
-          <w:shd w:fill="F2F2F2" w:val="clear"/>
-        </w:rPr>
-        <w:t xml:space="preserve">servis_hatt</w:t>
-      </w:r>
-      <w:r>
-        <w:t xml:space="preserve">, </w:t>
-      </w:r>
-      <w:r>
-        <w:rPr>
-          <w:rFonts w:ascii="Consolas" w:cs="Consolas" w:eastAsia="Consolas" w:hAnsi="Consolas"/>
-          <w:sz w:val="20"/>
-          <w:szCs w:val="20"/>
-          <w:shd w:fill="F2F2F2" w:val="clear"/>
-        </w:rPr>
-        <w:t xml:space="preserve">SERVIS_HATT_MAX_M</w:t>
-      </w:r>
-      <w:r>
-        <w:t xml:space="preserve"> i KONFIG); längre serviser och dricksvattenserviser infodras per meter. Antalet hattar per ledning står i den dolda kolumnen *Hattar*.</w:t>
+        <w:t xml:space="preserve">Rörspräckning</w:t>
+      </w:r>
+      <w:r>
+        <w:t xml:space="preserve"> = pris per meter efter DN (Ø 100–400) + en införingsgrop och en maskingrop per påbörjade 50 m ledning + en servisgrop per servis + en ventilgrop per ventil och brandpost på ledningen (ur inventeringens anordningar; servisventiler ligger i servisgropen). Byte av ventiler och brandposter vid omläggning ingår inte – det finns inget pris för det i kalkylverktyget.</w:t>
       </w:r>
     </w:p>
     <w:p>
@@ -16809,20 +16811,44 @@
           <w:b/>
           <w:bCs/>
         </w:rPr>
-        <w:t xml:space="preserve">Flikar.</w:t>
-      </w:r>
-      <w:r>
-        <w:t xml:space="preserve"> *Sammanfattning* (de två alternativen per system med infodrad, rörspräckt och omlagd längd; alt. lägg om per schakttyp; nätets längd, serviser, medeldjup och andel i samschakt; längd per material, dimension, anläggningsdecennium och djupklass; datakvalitet), *Ledningar* (per ledning kostnad i alt. lägg om, metod och kostnad i alt. schaktfritt och en anmärkning – kostnaden per schakttyp, detaljposterna och alla GIS-fält är dolda och fälls ut med plustecknet), *Kostnad per schaktgrupp* (med </w:t>
+        <w:t xml:space="preserve">Serviser</w:t>
+      </w:r>
+      <w:r>
+        <w:t xml:space="preserve"> förnyas i båda alternativen, per meter servisledning. I helschakt delar serviser till samma fastighet servisgrav (båda ändarna inom 3 m från varandra): en ensam dricksvattenservis kostar som dricksvattenservis helschakt, en ensam spill- eller dagvattenservis som komplett servis (spillen ligger oftast djupast), två eller tre i samma grav som komplett servis, delat lika. Raderna för en större ledning ”Ø 700” gäller över 400 till och med Ø 800, raderna för två och tre större ledningar Ø 700–1000. Bergschakt och spontsläde ger servistillägget per meter. Schaktfritt (när huvudledningen infodras eller rörspräcks) infodras spill-, dag- och kombinerade serviser på högst 6 m med </w:t>
       </w:r>
       <w:r>
         <w:rPr>
           <w:b/>
           <w:bCs/>
         </w:rPr>
-        <w:t xml:space="preserve">Schaktlängd</w:t>
-      </w:r>
-      <w:r>
-        <w:t xml:space="preserve"> – hur långt schaktet blir när gruppens ledningar läggs om; delar där flera ledningar ligger i samma schakt räknas en gång, till skillnad från Längd som är summan av ledningarnas längder), *Serviser* (med antal serviser i samma servisgrav), *Anordningar* (när inventeringen har anordningar), *Parallella*, *Korsningar*, *Brunnar*, *Datakvalitet* och *Kostnadsposter* (beloppen som använts).</w:t>
+        <w:t xml:space="preserve">hatt</w:t>
+      </w:r>
+      <w:r>
+        <w:t xml:space="preserve"> för 30 000 kr/st (post </w:t>
+      </w:r>
+      <w:r>
+        <w:rPr>
+          <w:rFonts w:ascii="Consolas" w:cs="Consolas" w:eastAsia="Consolas" w:hAnsi="Consolas"/>
+          <w:sz w:val="20"/>
+          <w:szCs w:val="20"/>
+          <w:shd w:fill="F2F2F2" w:val="clear"/>
+        </w:rPr>
+        <w:t xml:space="preserve">servis_hatt</w:t>
+      </w:r>
+      <w:r>
+        <w:t xml:space="preserve">, </w:t>
+      </w:r>
+      <w:r>
+        <w:rPr>
+          <w:rFonts w:ascii="Consolas" w:cs="Consolas" w:eastAsia="Consolas" w:hAnsi="Consolas"/>
+          <w:sz w:val="20"/>
+          <w:szCs w:val="20"/>
+          <w:shd w:fill="F2F2F2" w:val="clear"/>
+        </w:rPr>
+        <w:t xml:space="preserve">SERVIS_HATT_MAX_M</w:t>
+      </w:r>
+      <w:r>
+        <w:t xml:space="preserve"> i KONFIG); längre serviser och dricksvattenserviser infodras per meter. Antalet hattar per ledning står i den dolda kolumnen *Hattar*.</w:t>
       </w:r>
     </w:p>
     <w:p>
@@ -16839,10 +16865,60 @@
           <w:b/>
           <w:bCs/>
         </w:rPr>
+        <w:t xml:space="preserve">Flikar.</w:t>
+      </w:r>
+      <w:r>
+        <w:t xml:space="preserve"> *Sammanfattning* (de två alternativen per system med infodrad, rörspräckt och omlagd längd; alt. lägg om per schakttyp; nätets längd, serviser, medeldjup och andel i samschakt; längd per material, dimension, anläggningsdecennium och djupklass; datakvalitet), *Ledningar* (per ledning kostnad i alt. lägg om, metod och kostnad i alt. schaktfritt och en anmärkning – kostnaden per schakttyp, detaljposterna och alla GIS-fält är dolda och fälls ut med plustecknet), *Kostnad per schaktgrupp* (med </w:t>
+      </w:r>
+      <w:r>
+        <w:rPr>
+          <w:b/>
+          <w:bCs/>
+        </w:rPr>
+        <w:t xml:space="preserve">Schaktlängd</w:t>
+      </w:r>
+      <w:r>
+        <w:t xml:space="preserve"> – hur långt schaktet blir när gruppens ledningar läggs om; delar där flera ledningar ligger i samma schakt räknas en gång, till skillnad från Längd som är summan av ledningarnas längder), *Serviser* (med antal serviser i samma servisgrav), *Anordningar* (när inventeringen har anordningar), *Parallella*, *Korsningar*, *Brunnar*, *Datakvalitet* och *Kostnadsposter* (beloppen som använts).</w:t>
+      </w:r>
+    </w:p>
+    <w:p>
+      <w:pPr>
+        <w:pStyle w:val="ListParagraph"/>
+        <w:numPr>
+          <w:ilvl w:val="0"/>
+          <w:numId w:val="3"/>
+        </w:numPr>
+        <w:spacing w:after="80"/>
+      </w:pPr>
+      <w:r>
+        <w:rPr>
+          <w:b/>
+          <w:bCs/>
+        </w:rPr>
         <w:t xml:space="preserve">Formler.</w:t>
       </w:r>
       <w:r>
         <w:t xml:space="preserve"> Talen i Sammanfattning och Kostnad per schaktgrupp är Excel-formler (SUMIFS/COUNTIFS) mot fliken Ledningar, och radtotalerna i Ledningar (Alt. lägg om, Infodring totalt, Rörspräckning totalt, Alt. schaktfritt) är formler av delposterna på raden. Ändras en delpost eller ett meterpris i Ledningar räknas summorna om när filen räknas (Excel gör det när filen öppnas). Kostnaden per schakttyp och priserna i Kostnadsposter är fasta tal – vill man prova andra priser körs ledning_analys.py om med en ändrad kostnadsfil.</w:t>
+      </w:r>
+    </w:p>
+    <w:p>
+      <w:pPr>
+        <w:pStyle w:val="ListParagraph"/>
+        <w:numPr>
+          <w:ilvl w:val="0"/>
+          <w:numId w:val="3"/>
+        </w:numPr>
+        <w:spacing w:after="80"/>
+      </w:pPr>
+      <w:r>
+        <w:rPr>
+          <w:b/>
+          <w:bCs/>
+        </w:rPr>
+        <w:t xml:space="preserve">Investeringskalkyl.</w:t>
+      </w:r>
+      <w:r>
+        <w:t xml:space="preserve"> Fliken räknar fram Tabell A (planeringsbudget) och Tabell B (indikativ totalbudget) för inriktningsbeslut (BP2) som i SVOA:s kalkylmall, för båda alternativen. Entreprenaden är de jämförbara ledningarnas kostnad plus påslagen för material som SVOA tillhandahåller (AFC.1522, 3 %) och arbeten som SVOA utför (AFC.114, 3 %) på rörspräckning och helschakt (inte infodring), trafiktillägg och provisorier per område och ett vintertillägg. Byggherrekostnaderna är procent av entreprenaden: planerafasen projekt- och byggledning 1 %, projektering 5 %, geo/mark/miljö 3 %, övrigt 1 %; genomförafasen 5, 1, 2 och 2 %. Kända risker 20 % och oförutsett 20 % av summan ovanför. Beloppen avrundas till närmaste 100 000-tal. Alla procentsatser står i gula celler överst och kan ändras.</w:t>
       </w:r>
     </w:p>
     <w:p>

</xml_diff>

<commit_message>
Fyll i SVOA:s kalkylmall per omrade och alternativ
kalkylmall.py fyller i Mall Kalkyl inriktningsbeslut LEDN pa XML-niva (rullistor
och bilder foljer med): en fil per omrade for alt. schakt och alt. schaktfritt.

Co-Authored-By: Claude Opus 5.5 <noreply@anthropic.com>
Claude-Session: https://claude.ai/code/session_011fdqX3JEZje1LF9LqpaqR8
</commit_message>
<xml_diff>
--- a/Anvandarhandledning tv3_analys.docx
+++ b/Anvandarhandledning tv3_analys.docx
@@ -16919,6 +16919,98 @@
       </w:r>
       <w:r>
         <w:t xml:space="preserve"> Fliken räknar fram Tabell A (planeringsbudget) och Tabell B (indikativ totalbudget) för inriktningsbeslut (BP2) som i SVOA:s kalkylmall, för båda alternativen. Entreprenaden är de jämförbara ledningarnas kostnad plus påslagen för material som SVOA tillhandahåller (AFC.1522, 3 %) och arbeten som SVOA utför (AFC.114, 3 %) på rörspräckning och helschakt (inte infodring), trafiktillägg och provisorier per område och ett vintertillägg. Byggherrekostnaderna är procent av entreprenaden: planerafasen projekt- och byggledning 1 %, projektering 5 %, geo/mark/miljö 3 %, övrigt 1 %; genomförafasen 5, 1, 2 och 2 %. Kända risker 20 % och oförutsett 20 % av summan ovanför. Beloppen avrundas till närmaste 100 000-tal. Alla procentsatser står i gula celler överst och kan ändras.</w:t>
+      </w:r>
+    </w:p>
+    <w:p>
+      <w:pPr>
+        <w:pStyle w:val="ListParagraph"/>
+        <w:numPr>
+          <w:ilvl w:val="0"/>
+          <w:numId w:val="3"/>
+        </w:numPr>
+        <w:spacing w:after="80"/>
+      </w:pPr>
+      <w:r>
+        <w:rPr>
+          <w:b/>
+          <w:bCs/>
+        </w:rPr>
+        <w:t xml:space="preserve">SVOA:s kalkylmall per område.</w:t>
+      </w:r>
+      <w:r>
+        <w:t xml:space="preserve"> Lägg mallen *Mall Kalkyl inriktningsbeslut LEDN* (.xlsx) i samma mapp som </w:t>
+      </w:r>
+      <w:r>
+        <w:rPr>
+          <w:rFonts w:ascii="Consolas" w:cs="Consolas" w:eastAsia="Consolas" w:hAnsi="Consolas"/>
+          <w:sz w:val="20"/>
+          <w:szCs w:val="20"/>
+          <w:shd w:fill="F2F2F2" w:val="clear"/>
+        </w:rPr>
+        <w:t xml:space="preserve">ledning_analys.py</w:t>
+      </w:r>
+      <w:r>
+        <w:t xml:space="preserve"> (eller ange den med </w:t>
+      </w:r>
+      <w:r>
+        <w:rPr>
+          <w:rFonts w:ascii="Consolas" w:cs="Consolas" w:eastAsia="Consolas" w:hAnsi="Consolas"/>
+          <w:sz w:val="20"/>
+          <w:szCs w:val="20"/>
+          <w:shd w:fill="F2F2F2" w:val="clear"/>
+        </w:rPr>
+        <w:t xml:space="preserve">--mall</w:t>
+      </w:r>
+      <w:r>
+        <w:t xml:space="preserve">), så fyller skriptet i en kopia per område och alternativ i undermappen </w:t>
+      </w:r>
+      <w:r>
+        <w:rPr>
+          <w:rFonts w:ascii="Consolas" w:cs="Consolas" w:eastAsia="Consolas" w:hAnsi="Consolas"/>
+          <w:sz w:val="20"/>
+          <w:szCs w:val="20"/>
+          <w:shd w:fill="F2F2F2" w:val="clear"/>
+        </w:rPr>
+        <w:t xml:space="preserve">kalkyler</w:t>
+      </w:r>
+      <w:r>
+        <w:t xml:space="preserve">: </w:t>
+      </w:r>
+      <w:r>
+        <w:rPr>
+          <w:rFonts w:ascii="Consolas" w:cs="Consolas" w:eastAsia="Consolas" w:hAnsi="Consolas"/>
+          <w:sz w:val="20"/>
+          <w:szCs w:val="20"/>
+          <w:shd w:fill="F2F2F2" w:val="clear"/>
+        </w:rPr>
+        <w:t xml:space="preserve">Kalkyl_&lt;område&gt;_schakt.xlsx</w:t>
+      </w:r>
+      <w:r>
+        <w:t xml:space="preserve"> (alla ledningar läggs om) och </w:t>
+      </w:r>
+      <w:r>
+        <w:rPr>
+          <w:rFonts w:ascii="Consolas" w:cs="Consolas" w:eastAsia="Consolas" w:hAnsi="Consolas"/>
+          <w:sz w:val="20"/>
+          <w:szCs w:val="20"/>
+          <w:shd w:fill="F2F2F2" w:val="clear"/>
+        </w:rPr>
+        <w:t xml:space="preserve">Kalkyl_&lt;område&gt;_schaktfritt.xlsx</w:t>
+      </w:r>
+      <w:r>
+        <w:t xml:space="preserve">. Området är ledningens område från Ledningsinventering (fältet med områdets namn), annars fältet OMRADE från Exportera område. Mallen fylls i som om du gjort det för hand: meter per prisrad i fliken Uppgifter (en delsträcka per prisrad), rullistornas prisrad i Entreprenadkalkyl, gropar, servismeter, servistillägg och djuptillägg, slagen spont och provisorier som fritextrader i tabell D och trafiktillägget i tabell E (områdets procent). Byggherrekostnaderna tas som procentsatserna i fliken Alternativ (Rimlighetskontrollens summarader pekar på dem) och kända risker som en fritextrad med 20 % per fas, så att Investeringsärende BP2 blir ifyllt. Bara mallens poster används – hattar räknas som servisinfodring per meter, och ny brunn och framschaktning ingår inte – så summorna skiljer sig något från fliken Investeringskalkyl. Ett pris som saknas i mallen (t.ex. infodring Ø 1000) skrivs som fast pris på raden. Rullistor, bilder och kommentarer i mallen följer med; formlerna räknas när filen öppnas i Excel. </w:t>
+      </w:r>
+      <w:r>
+        <w:rPr>
+          <w:rFonts w:ascii="Consolas" w:cs="Consolas" w:eastAsia="Consolas" w:hAnsi="Consolas"/>
+          <w:sz w:val="20"/>
+          <w:szCs w:val="20"/>
+          <w:shd w:fill="F2F2F2" w:val="clear"/>
+        </w:rPr>
+        <w:t xml:space="preserve">--mall nej</w:t>
+      </w:r>
+      <w:r>
+        <w:t xml:space="preserve"> hoppar över mallarna. Mallen och de ifyllda kalkylerna checkas inte in i repot.</w:t>
       </w:r>
     </w:p>
     <w:p>

</xml_diff>

<commit_message>
Uppdatera inventeringslager och Kartor for omradet (omradeskarta, schaktgrupp, kartblad)
Co-Authored-By: Claude Opus 5.5 <noreply@anthropic.com>
Claude-Session: https://claude.ai/code/session_011fdqX3JEZje1LF9LqpaqR8
</commit_message>
<xml_diff>
--- a/Anvandarhandledning tv3_analys.docx
+++ b/Anvandarhandledning tv3_analys.docx
@@ -11615,6 +11615,70 @@
     </w:p>
     <w:p>
       <w:pPr>
+        <w:pStyle w:val="ListParagraph"/>
+        <w:numPr>
+          <w:ilvl w:val="0"/>
+          <w:numId w:val="3"/>
+        </w:numPr>
+        <w:spacing w:after="80"/>
+      </w:pPr>
+      <w:r>
+        <w:rPr>
+          <w:b/>
+          <w:bCs/>
+        </w:rPr>
+        <w:t xml:space="preserve">Uppdatera inventeringslager</w:t>
+      </w:r>
+      <w:r>
+        <w:t xml:space="preserve"> – skriver resultatet från </w:t>
+      </w:r>
+      <w:r>
+        <w:rPr>
+          <w:rFonts w:ascii="Consolas" w:cs="Consolas" w:eastAsia="Consolas" w:hAnsi="Consolas"/>
+          <w:sz w:val="20"/>
+          <w:szCs w:val="20"/>
+          <w:shd w:fill="F2F2F2" w:val="clear"/>
+        </w:rPr>
+        <w:t xml:space="preserve">ledning_analys.py</w:t>
+      </w:r>
+      <w:r>
+        <w:t xml:space="preserve"> (</w:t>
+      </w:r>
+      <w:r>
+        <w:rPr>
+          <w:rFonts w:ascii="Consolas" w:cs="Consolas" w:eastAsia="Consolas" w:hAnsi="Consolas"/>
+          <w:sz w:val="20"/>
+          <w:szCs w:val="20"/>
+          <w:shd w:fill="F2F2F2" w:val="clear"/>
+        </w:rPr>
+        <w:t xml:space="preserve">ledningsresultat.json</w:t>
+      </w:r>
+      <w:r>
+        <w:t xml:space="preserve">) till fält på de lokala ledningslagren, så att kartan kan färgas efter schaktgrupp, djupklass eller metod (avsnitt 7.16).</w:t>
+      </w:r>
+    </w:p>
+    <w:p>
+      <w:pPr>
+        <w:pStyle w:val="ListParagraph"/>
+        <w:numPr>
+          <w:ilvl w:val="0"/>
+          <w:numId w:val="3"/>
+        </w:numPr>
+        <w:spacing w:after="80"/>
+      </w:pPr>
+      <w:r>
+        <w:rPr>
+          <w:b/>
+          <w:bCs/>
+        </w:rPr>
+        <w:t xml:space="preserve">Kartor för området (PDF)</w:t>
+      </w:r>
+      <w:r>
+        <w:t xml:space="preserve"> – en översiktskarta per område med informationsruta, en karta per schaktgrupp och kartblad med ledningarnas id (avsnitt 7.17).</w:t>
+      </w:r>
+    </w:p>
+    <w:p>
+      <w:pPr>
         <w:spacing w:after="120"/>
       </w:pPr>
       <w:r>
@@ -17133,7 +17197,537 @@
         <w:t xml:space="preserve">ledningsresultat.json</w:t>
       </w:r>
       <w:r>
-        <w:t xml:space="preserve"> har djup, serviser, schaktgrupp och kostnaderna per ledning (lager, OID, del), även alt. lägg om per schakttyp – underlaget för att fylla fält i kartan i ett senare steg.</w:t>
+        <w:t xml:space="preserve"> har djup, serviser, schaktgrupp, schaktlängd och kostnaderna per ledning (lager, OID, del), även alt. lägg om per schakttyp – underlaget för verktygen Uppdatera inventeringslager och Kartor för området (7.16, 7.17).</w:t>
+      </w:r>
+    </w:p>
+    <w:p>
+      <w:pPr>
+        <w:pStyle w:val="ListParagraph"/>
+        <w:numPr>
+          <w:ilvl w:val="0"/>
+          <w:numId w:val="3"/>
+        </w:numPr>
+        <w:spacing w:after="80"/>
+      </w:pPr>
+      <w:r>
+        <w:rPr>
+          <w:b/>
+          <w:bCs/>
+        </w:rPr>
+        <w:t xml:space="preserve">Kartblad i Excel.</w:t>
+      </w:r>
+      <w:r>
+        <w:t xml:space="preserve"> När verktyget Kartor för området har körts ligger </w:t>
+      </w:r>
+      <w:r>
+        <w:rPr>
+          <w:rFonts w:ascii="Consolas" w:cs="Consolas" w:eastAsia="Consolas" w:hAnsi="Consolas"/>
+          <w:sz w:val="20"/>
+          <w:szCs w:val="20"/>
+          <w:shd w:fill="F2F2F2" w:val="clear"/>
+        </w:rPr>
+        <w:t xml:space="preserve">kartblad.csv</w:t>
+      </w:r>
+      <w:r>
+        <w:t xml:space="preserve"> bredvid </w:t>
+      </w:r>
+      <w:r>
+        <w:rPr>
+          <w:rFonts w:ascii="Consolas" w:cs="Consolas" w:eastAsia="Consolas" w:hAnsi="Consolas"/>
+          <w:sz w:val="20"/>
+          <w:szCs w:val="20"/>
+          <w:shd w:fill="F2F2F2" w:val="clear"/>
+        </w:rPr>
+        <w:t xml:space="preserve">ledningsresultat.json</w:t>
+      </w:r>
+      <w:r>
+        <w:t xml:space="preserve">. Kör du </w:t>
+      </w:r>
+      <w:r>
+        <w:rPr>
+          <w:rFonts w:ascii="Consolas" w:cs="Consolas" w:eastAsia="Consolas" w:hAnsi="Consolas"/>
+          <w:sz w:val="20"/>
+          <w:szCs w:val="20"/>
+          <w:shd w:fill="F2F2F2" w:val="clear"/>
+        </w:rPr>
+        <w:t xml:space="preserve">ledning_analys.py</w:t>
+      </w:r>
+      <w:r>
+        <w:t xml:space="preserve"> igen får fliken Ledningar kolumnen </w:t>
+      </w:r>
+      <w:r>
+        <w:rPr>
+          <w:b/>
+          <w:bCs/>
+        </w:rPr>
+        <w:t xml:space="preserve">Kartblad</w:t>
+      </w:r>
+      <w:r>
+        <w:t xml:space="preserve"> (t.ex. *3, 4*) med länk till bladets PDF, och schaktgruppens nummer länkar till schaktgruppens karta.</w:t>
+      </w:r>
+    </w:p>
+    <w:p>
+      <w:pPr>
+        <w:pStyle w:val="Heading2"/>
+      </w:pPr>
+      <w:r>
+        <w:t xml:space="preserve">7.16 Uppdatera inventeringslager – resultatet i kartan</w:t>
+      </w:r>
+    </w:p>
+    <w:p>
+      <w:pPr>
+        <w:spacing w:after="120"/>
+      </w:pPr>
+      <w:r>
+        <w:t xml:space="preserve">Verktyget läser </w:t>
+      </w:r>
+      <w:r>
+        <w:rPr>
+          <w:rFonts w:ascii="Consolas" w:cs="Consolas" w:eastAsia="Consolas" w:hAnsi="Consolas"/>
+          <w:sz w:val="20"/>
+          <w:szCs w:val="20"/>
+          <w:shd w:fill="F2F2F2" w:val="clear"/>
+        </w:rPr>
+        <w:t xml:space="preserve">ledningsresultat.json</w:t>
+      </w:r>
+      <w:r>
+        <w:t xml:space="preserve"> och skriver fält på de lokala ledningslagren (samma lager som valdes i Ledningsinventering, de hittas på namnet): </w:t>
+      </w:r>
+      <w:r>
+        <w:rPr>
+          <w:b/>
+          <w:bCs/>
+        </w:rPr>
+        <w:t xml:space="preserve">LEDN_ID</w:t>
+      </w:r>
+      <w:r>
+        <w:t xml:space="preserve"> (ledningens id), </w:t>
+      </w:r>
+      <w:r>
+        <w:rPr>
+          <w:b/>
+          <w:bCs/>
+        </w:rPr>
+        <w:t xml:space="preserve">SYS</w:t>
+      </w:r>
+      <w:r>
+        <w:t xml:space="preserve"> (S, D, K, V), </w:t>
+      </w:r>
+      <w:r>
+        <w:rPr>
+          <w:b/>
+          <w:bCs/>
+        </w:rPr>
+        <w:t xml:space="preserve">DIM_MM</w:t>
+      </w:r>
+      <w:r>
+        <w:t xml:space="preserve">, </w:t>
+      </w:r>
+      <w:r>
+        <w:rPr>
+          <w:b/>
+          <w:bCs/>
+        </w:rPr>
+        <w:t xml:space="preserve">LANGD_M</w:t>
+      </w:r>
+      <w:r>
+        <w:t xml:space="preserve">, </w:t>
+      </w:r>
+      <w:r>
+        <w:rPr>
+          <w:b/>
+          <w:bCs/>
+        </w:rPr>
+        <w:t xml:space="preserve">SCHAKT_M</w:t>
+      </w:r>
+      <w:r>
+        <w:t xml:space="preserve"> (ledningens del av schaktlängden), </w:t>
+      </w:r>
+      <w:r>
+        <w:rPr>
+          <w:b/>
+          <w:bCs/>
+        </w:rPr>
+        <w:t xml:space="preserve">DJUP_MEDEL</w:t>
+      </w:r>
+      <w:r>
+        <w:t xml:space="preserve">, </w:t>
+      </w:r>
+      <w:r>
+        <w:rPr>
+          <w:b/>
+          <w:bCs/>
+        </w:rPr>
+        <w:t xml:space="preserve">DJUPKLASS</w:t>
+      </w:r>
+      <w:r>
+        <w:t xml:space="preserve">, </w:t>
+      </w:r>
+      <w:r>
+        <w:rPr>
+          <w:b/>
+          <w:bCs/>
+        </w:rPr>
+        <w:t xml:space="preserve">SCHAKTGRP</w:t>
+      </w:r>
+      <w:r>
+        <w:t xml:space="preserve">, </w:t>
+      </w:r>
+      <w:r>
+        <w:rPr>
+          <w:b/>
+          <w:bCs/>
+        </w:rPr>
+        <w:t xml:space="preserve">I_GRAV</w:t>
+      </w:r>
+      <w:r>
+        <w:t xml:space="preserve"> (ledningar i graven), </w:t>
+      </w:r>
+      <w:r>
+        <w:rPr>
+          <w:b/>
+          <w:bCs/>
+        </w:rPr>
+        <w:t xml:space="preserve">ALT_OMLAGG</w:t>
+      </w:r>
+      <w:r>
+        <w:t xml:space="preserve"> och </w:t>
+      </w:r>
+      <w:r>
+        <w:rPr>
+          <w:b/>
+          <w:bCs/>
+        </w:rPr>
+        <w:t xml:space="preserve">ALT_SKFRI</w:t>
+      </w:r>
+      <w:r>
+        <w:t xml:space="preserve"> (kr), </w:t>
+      </w:r>
+      <w:r>
+        <w:rPr>
+          <w:b/>
+          <w:bCs/>
+        </w:rPr>
+        <w:t xml:space="preserve">METOD_SKFR</w:t>
+      </w:r>
+      <w:r>
+        <w:t xml:space="preserve"> (strumpa, rörspräckning eller läggs om), </w:t>
+      </w:r>
+      <w:r>
+        <w:rPr>
+          <w:b/>
+          <w:bCs/>
+        </w:rPr>
+        <w:t xml:space="preserve">SCHAKTSATT</w:t>
+      </w:r>
+      <w:r>
+        <w:t xml:space="preserve"> och </w:t>
+      </w:r>
+      <w:r>
+        <w:rPr>
+          <w:b/>
+          <w:bCs/>
+        </w:rPr>
+        <w:t xml:space="preserve">ANMARKNING</w:t>
+      </w:r>
+      <w:r>
+        <w:t xml:space="preserve">. Är ett GIS-objekt delat i flera ledningar i inventeringen (en brunn mitt på objektet) summeras längder och kostnader, medeldjupet viktas med längden och schaktgrupp, djupklass och schaktsätt tas från den längsta delen. Objekt som inte finns i resultatet får tomma fält, så att gamla värden inte ligger kvar. Fältnamnen är högst tio tecken, så det fungerar även för shapefiler.</w:t>
+      </w:r>
+    </w:p>
+    <w:p>
+      <w:pPr>
+        <w:spacing w:after="120"/>
+      </w:pPr>
+      <w:r>
+        <w:t xml:space="preserve">Symbolisera sedan som vanligt i ArcMap, t.ex. *Unique values* på SCHAKTGRP eller METOD_SKFR, eller på DJUPKLASS, och sätt etiketter med LEDN_ID. Kör verktyget igen när </w:t>
+      </w:r>
+      <w:r>
+        <w:rPr>
+          <w:rFonts w:ascii="Consolas" w:cs="Consolas" w:eastAsia="Consolas" w:hAnsi="Consolas"/>
+          <w:sz w:val="20"/>
+          <w:szCs w:val="20"/>
+          <w:shd w:fill="F2F2F2" w:val="clear"/>
+        </w:rPr>
+        <w:t xml:space="preserve">ledning_analys.py</w:t>
+      </w:r>
+      <w:r>
+        <w:t xml:space="preserve"> har körts om. Lager med klasstillägg (SVOA:s featureklasser) uppdateras automatiskt i en redigeringssession.</w:t>
+      </w:r>
+    </w:p>
+    <w:p>
+      <w:pPr>
+        <w:pStyle w:val="Heading2"/>
+      </w:pPr>
+      <w:r>
+        <w:t xml:space="preserve">7.17 Kartor för området – översikt, schaktgrupper och kartblad</w:t>
+      </w:r>
+    </w:p>
+    <w:p>
+      <w:pPr>
+        <w:spacing w:after="120"/>
+      </w:pPr>
+      <w:r>
+        <w:t xml:space="preserve">Verktyget gör PDF-kartor ur </w:t>
+      </w:r>
+      <w:r>
+        <w:rPr>
+          <w:rFonts w:ascii="Consolas" w:cs="Consolas" w:eastAsia="Consolas" w:hAnsi="Consolas"/>
+          <w:sz w:val="20"/>
+          <w:szCs w:val="20"/>
+          <w:shd w:fill="F2F2F2" w:val="clear"/>
+        </w:rPr>
+        <w:t xml:space="preserve">ledningsresultat.json</w:t>
+      </w:r>
+      <w:r>
+        <w:t xml:space="preserve"> i dina A3-mallar (eller i den öppna kartans layout). Kör </w:t>
+      </w:r>
+      <w:r>
+        <w:rPr>
+          <w:b/>
+          <w:bCs/>
+        </w:rPr>
+        <w:t xml:space="preserve">Uppdatera inventeringslager</w:t>
+      </w:r>
+      <w:r>
+        <w:t xml:space="preserve"> först, så får kartorna etiketter med ledningens id. Välj resultatfilen (föreslås bredvid den senaste ledningsdata.json), områdeslagret och fältet med områdets namn (samma som i Ledningsinventering) och kryssa i vilka kartor du vill ha. PDF:erna hamnar i undermappen </w:t>
+      </w:r>
+      <w:r>
+        <w:rPr>
+          <w:rFonts w:ascii="Consolas" w:cs="Consolas" w:eastAsia="Consolas" w:hAnsi="Consolas"/>
+          <w:sz w:val="20"/>
+          <w:szCs w:val="20"/>
+          <w:shd w:fill="F2F2F2" w:val="clear"/>
+        </w:rPr>
+        <w:t xml:space="preserve">kartor</w:t>
+      </w:r>
+      <w:r>
+        <w:t xml:space="preserve">.</w:t>
+      </w:r>
+    </w:p>
+    <w:p>
+      <w:pPr>
+        <w:pStyle w:val="ListParagraph"/>
+        <w:numPr>
+          <w:ilvl w:val="0"/>
+          <w:numId w:val="3"/>
+        </w:numPr>
+        <w:spacing w:after="80"/>
+      </w:pPr>
+      <w:r>
+        <w:rPr>
+          <w:b/>
+          <w:bCs/>
+        </w:rPr>
+        <w:t xml:space="preserve">Områdeskarta</w:t>
+      </w:r>
+      <w:r>
+        <w:t xml:space="preserve"> – en sida per område i den största skala där hela polygonen ryms (1:500 … 1:50 000); verktyget väljer den mall, liggande eller stående, som ger störst skala. En </w:t>
+      </w:r>
+      <w:r>
+        <w:rPr>
+          <w:b/>
+          <w:bCs/>
+        </w:rPr>
+        <w:t xml:space="preserve">informationsruta</w:t>
+      </w:r>
+      <w:r>
+        <w:t xml:space="preserve"> visar ledningslängden per ledningstyp på var sin rad (t.ex. *Spillvatten (SSL): 3 210 m*), den totala ledningslängden och den totala schaktlängden – där flera ledningar ligger i samma schakt räknas schaktet en gång. Rutan hamnar i mallens textelement </w:t>
+      </w:r>
+      <w:r>
+        <w:rPr>
+          <w:b/>
+          <w:bCs/>
+        </w:rPr>
+        <w:t xml:space="preserve">INFO</w:t>
+      </w:r>
+      <w:r>
+        <w:t xml:space="preserve"> om det finns (lägg in ett textelement och ge det namnet INFO under *Properties &gt; Size and Position &gt; Element Name*, så bestämmer du själv var rutan står); annars läggs den till höger om kartan och kartramen görs smalare. Med kartblad visas bladindelningen med bladnummer på översikten.</w:t>
+      </w:r>
+    </w:p>
+    <w:p>
+      <w:pPr>
+        <w:pStyle w:val="ListParagraph"/>
+        <w:numPr>
+          <w:ilvl w:val="0"/>
+          <w:numId w:val="3"/>
+        </w:numPr>
+        <w:spacing w:after="80"/>
+      </w:pPr>
+      <w:r>
+        <w:rPr>
+          <w:b/>
+          <w:bCs/>
+        </w:rPr>
+        <w:t xml:space="preserve">Schaktgrupp</w:t>
+      </w:r>
+      <w:r>
+        <w:t xml:space="preserve"> – en karta per schaktgrupp (ledningar som läggs i samma schakt) i minsta skala där gruppen ryms, gruppens ledningar markerade med markeringssymbolen (</w:t>
+      </w:r>
+      <w:r>
+        <w:rPr>
+          <w:rFonts w:ascii="Consolas" w:cs="Consolas" w:eastAsia="Consolas" w:hAnsi="Consolas"/>
+          <w:sz w:val="20"/>
+          <w:szCs w:val="20"/>
+          <w:shd w:fill="F2F2F2" w:val="clear"/>
+        </w:rPr>
+        <w:t xml:space="preserve">arcmap/markering.lyr</w:t>
+      </w:r>
+      <w:r>
+        <w:t xml:space="preserve">, bred gul genomskinlig linje – samma som i Exportera kartor) och etiketter med ledningarnas id. Undertiteln anger område, ledningstyper och antal ledningar.</w:t>
+      </w:r>
+    </w:p>
+    <w:p>
+      <w:pPr>
+        <w:pStyle w:val="ListParagraph"/>
+        <w:numPr>
+          <w:ilvl w:val="0"/>
+          <w:numId w:val="3"/>
+        </w:numPr>
+        <w:spacing w:after="80"/>
+      </w:pPr>
+      <w:r>
+        <w:rPr>
+          <w:b/>
+          <w:bCs/>
+        </w:rPr>
+        <w:t xml:space="preserve">Kartblad</w:t>
+      </w:r>
+      <w:r>
+        <w:t xml:space="preserve"> – området delat i blad i en fast skala (standard 1:1000) med 5 % överlapp; bara blad som täcker området eller dess ledningar tas med. Verktyget väljer den orientering som ger minst antal blad. Varje blad har ledningarnas id som etiketter, titeln *Område X – kartblad 3 av 12* och de angränsande bladen i undertiteln. Översikten och bladen samlas i </w:t>
+      </w:r>
+      <w:r>
+        <w:rPr>
+          <w:rFonts w:ascii="Consolas" w:cs="Consolas" w:eastAsia="Consolas" w:hAnsi="Consolas"/>
+          <w:sz w:val="20"/>
+          <w:szCs w:val="20"/>
+          <w:shd w:fill="F2F2F2" w:val="clear"/>
+        </w:rPr>
+        <w:t xml:space="preserve">kartblad_&lt;område&gt;.pdf</w:t>
+      </w:r>
+      <w:r>
+        <w:t xml:space="preserve">. Bladnumren skrivs till ledningarna i fältet </w:t>
+      </w:r>
+      <w:r>
+        <w:rPr>
+          <w:b/>
+          <w:bCs/>
+        </w:rPr>
+        <w:t xml:space="preserve">KARTBLAD</w:t>
+      </w:r>
+      <w:r>
+        <w:t xml:space="preserve"> (en ledning i överlappet får båda numren) och sökvägen till bladets PDF i </w:t>
+      </w:r>
+      <w:r>
+        <w:rPr>
+          <w:b/>
+          <w:bCs/>
+        </w:rPr>
+        <w:t xml:space="preserve">KARTA</w:t>
+      </w:r>
+      <w:r>
+        <w:t xml:space="preserve">; </w:t>
+      </w:r>
+      <w:r>
+        <w:rPr>
+          <w:b/>
+          <w:bCs/>
+        </w:rPr>
+        <w:t xml:space="preserve">GRUPPKARTA</w:t>
+      </w:r>
+      <w:r>
+        <w:t xml:space="preserve"> pekar på schaktgruppens karta – båda fungerar som hyperlänkar (*Display &gt; Support Hyperlinks using field*). Samma uppgifter skrivs till </w:t>
+      </w:r>
+      <w:r>
+        <w:rPr>
+          <w:rFonts w:ascii="Consolas" w:cs="Consolas" w:eastAsia="Consolas" w:hAnsi="Consolas"/>
+          <w:sz w:val="20"/>
+          <w:szCs w:val="20"/>
+          <w:shd w:fill="F2F2F2" w:val="clear"/>
+        </w:rPr>
+        <w:t xml:space="preserve">kartblad.csv</w:t>
+      </w:r>
+      <w:r>
+        <w:t xml:space="preserve"> bredvid </w:t>
+      </w:r>
+      <w:r>
+        <w:rPr>
+          <w:rFonts w:ascii="Consolas" w:cs="Consolas" w:eastAsia="Consolas" w:hAnsi="Consolas"/>
+          <w:sz w:val="20"/>
+          <w:szCs w:val="20"/>
+          <w:shd w:fill="F2F2F2" w:val="clear"/>
+        </w:rPr>
+        <w:t xml:space="preserve">ledningsresultat.json</w:t>
+      </w:r>
+      <w:r>
+        <w:t xml:space="preserve">, som </w:t>
+      </w:r>
+      <w:r>
+        <w:rPr>
+          <w:rFonts w:ascii="Consolas" w:cs="Consolas" w:eastAsia="Consolas" w:hAnsi="Consolas"/>
+          <w:sz w:val="20"/>
+          <w:szCs w:val="20"/>
+          <w:shd w:fill="F2F2F2" w:val="clear"/>
+        </w:rPr>
+        <w:t xml:space="preserve">ledning_analys.py</w:t>
+      </w:r>
+      <w:r>
+        <w:t xml:space="preserve"> lägger i Excel (7.15). Bladgränserna kan få en egen symbol: spara en linjesymbol som </w:t>
+      </w:r>
+      <w:r>
+        <w:rPr>
+          <w:rFonts w:ascii="Consolas" w:cs="Consolas" w:eastAsia="Consolas" w:hAnsi="Consolas"/>
+          <w:sz w:val="20"/>
+          <w:szCs w:val="20"/>
+          <w:shd w:fill="F2F2F2" w:val="clear"/>
+        </w:rPr>
+        <w:t xml:space="preserve">arcmap/kartblad.lyr</w:t>
+      </w:r>
+      <w:r>
+        <w:t xml:space="preserve">.</w:t>
+      </w:r>
+    </w:p>
+    <w:p>
+      <w:pPr>
+        <w:spacing w:after="120"/>
+      </w:pPr>
+      <w:r>
+        <w:t xml:space="preserve">Mallarna sparas inte, och i den öppna kartan återställs allt efteråt – de tillfälliga lagren tas bort, etiketterna och kartramens storlek blir som förut. Textelementen TITEL, UNDERTITEL och SKALA fylls i om de finns. Samlade PDF:er: </w:t>
+      </w:r>
+      <w:r>
+        <w:rPr>
+          <w:rFonts w:ascii="Consolas" w:cs="Consolas" w:eastAsia="Consolas" w:hAnsi="Consolas"/>
+          <w:sz w:val="20"/>
+          <w:szCs w:val="20"/>
+          <w:shd w:fill="F2F2F2" w:val="clear"/>
+        </w:rPr>
+        <w:t xml:space="preserve">kartor_omraden.pdf</w:t>
+      </w:r>
+      <w:r>
+        <w:t xml:space="preserve">, </w:t>
+      </w:r>
+      <w:r>
+        <w:rPr>
+          <w:rFonts w:ascii="Consolas" w:cs="Consolas" w:eastAsia="Consolas" w:hAnsi="Consolas"/>
+          <w:sz w:val="20"/>
+          <w:szCs w:val="20"/>
+          <w:shd w:fill="F2F2F2" w:val="clear"/>
+        </w:rPr>
+        <w:t xml:space="preserve">kartor_schaktgrupper.pdf</w:t>
+      </w:r>
+      <w:r>
+        <w:t xml:space="preserve"> och </w:t>
+      </w:r>
+      <w:r>
+        <w:rPr>
+          <w:rFonts w:ascii="Consolas" w:cs="Consolas" w:eastAsia="Consolas" w:hAnsi="Consolas"/>
+          <w:sz w:val="20"/>
+          <w:szCs w:val="20"/>
+          <w:shd w:fill="F2F2F2" w:val="clear"/>
+        </w:rPr>
+        <w:t xml:space="preserve">kartblad_&lt;område&gt;.pdf</w:t>
+      </w:r>
+      <w:r>
+        <w:t xml:space="preserve">. Mappen för Citrix (*Mapp med kartorna som den här datorn ser den*) används i fälten och i kartblad.csv i stället för utdatamappen.</w:t>
       </w:r>
     </w:p>
     <w:p>

</xml_diff>

<commit_message>
Flik Reinvestering: reinvestering nu mot nar livslangden ar uppnadd (nuvarde)
Co-Authored-By: Claude Opus 5.5 <noreply@anthropic.com>
Claude-Session: https://claude.ai/code/session_011fdqX3JEZje1LF9LqpaqR8
</commit_message>
<xml_diff>
--- a/Anvandarhandledning tv3_analys.docx
+++ b/Anvandarhandledning tv3_analys.docx
@@ -16983,6 +16983,26 @@
       </w:r>
       <w:r>
         <w:t xml:space="preserve"> Fliken räknar fram Tabell A (planeringsbudget) och Tabell B (indikativ totalbudget) för inriktningsbeslut (BP2) som i SVOA:s kalkylmall, för båda alternativen. Entreprenaden är de jämförbara ledningarnas kostnad plus påslagen för material som SVOA tillhandahåller (AFC.1522, 3 %) och arbeten som SVOA utför (AFC.114, 3 %) på rörspräckning och helschakt (inte infodring), trafiktillägg och provisorier per område och ett vintertillägg. Byggherrekostnaderna är procent av entreprenaden: planerafasen projekt- och byggledning 1 %, projektering 5 %, geo/mark/miljö 3 %, övrigt 1 %; genomförafasen 5, 1, 2 och 2 %. Kända risker 20 % och oförutsett 20 % av summan ovanför. Beloppen avrundas till närmaste 100 000-tal. Alla procentsatser står i gula celler överst och kan ändras. Sammanfattningens block *Lägga om eller schaktfritt* visar samma entreprenad med påslagen (kolumnerna *Alt. lägg om inkl. påslag* och *Alt. schaktfritt inkl. påslag* i fliken Ledningar), så att summorna stämmer med Investeringskalkyl; ändras en procentsats där följer sammanfattningen med. Kostnad per schaktgrupp och kolumnerna Alt. lägg om/Alt. schaktfritt är utan påslag.</w:t>
+      </w:r>
+    </w:p>
+    <w:p>
+      <w:pPr>
+        <w:pStyle w:val="ListParagraph"/>
+        <w:numPr>
+          <w:ilvl w:val="0"/>
+          <w:numId w:val="3"/>
+        </w:numPr>
+        <w:spacing w:after="80"/>
+      </w:pPr>
+      <w:r>
+        <w:rPr>
+          <w:b/>
+          <w:bCs/>
+        </w:rPr>
+        <w:t xml:space="preserve">Reinvestering.</w:t>
+      </w:r>
+      <w:r>
+        <w:t xml:space="preserve"> Fliken jämför att reinvestera nu med att vänta tills den tekniska livslängden är uppnådd, per system och anläggningsdecennium, som nuvärde. Gula celler överst: andel av ledningslängden som åtgärdas (10 %), kalkylränta (3 %), teknisk livslängd (100 år), basår, och förvalda andelar schaktfritt (70 % när livslängden är uppnådd, 0 % nu – resten helschakt). Kostnaden per meter är snittet för ledningarna i raden (Alt. schaktfritt respektive Alt. lägg om inkl. påslag); saknas jämförbara ledningar i raden används systemets snitt. Livslängd kvar = decenniets mitt + livslängden − basår (minst 0, utan anläggningsår halva livslängden) och kan skrivas över per rad, liksom andelarna. Planerad reinvestering diskonteras: kostnad / (1 + ränta)^år kvar; reinvestering nu diskonteras inte. Kolumnen Merkostnad nu är skillnaden i nuvärde. Jämförelsen räknar en cykel – nästa förnyelse efter ytterligare en livslängd ingår inte.</w:t>
       </w:r>
     </w:p>
     <w:p>

</xml_diff>

<commit_message>
Markprofilen i ledningsinventeringen samplas med höjdmodellens cellstorlek
Profilen (mark och vattengång längs ledningen) tas per rastercell i stället för
var 1 m; ett eget avstånd kan anges i dialogen. Provtätheten för parallella
ledningar, serviser och samma grav är oförändrad.

Co-Authored-By: Claude Opus 5.5 <noreply@anthropic.com>
Claude-Session: https://claude.ai/code/session_011fdqX3JEZje1LF9LqpaqR8
</commit_message>
<xml_diff>
--- a/Anvandarhandledning tv3_analys.docx
+++ b/Anvandarhandledning tv3_analys.docx
@@ -16115,7 +16115,7 @@
         <w:t xml:space="preserve">Djup</w:t>
       </w:r>
       <w:r>
-        <w:t xml:space="preserve"> = markhöjd minus vattengång i provpunkter var 1 m (</w:t>
+        <w:t xml:space="preserve"> = markhöjd minus vattengång i provpunkter längs ledningen (</w:t>
       </w:r>
       <w:r>
         <w:rPr>
@@ -16127,7 +16127,7 @@
         <w:t xml:space="preserve">profil</w:t>
       </w:r>
       <w:r>
-        <w:t xml:space="preserve"> i filen: meter, mark, vattengång): medel, min, max, djupklass (0–2, 2–3, 3–4, &gt; 4 m) och minsta täckning (djup minus dimension). </w:t>
+        <w:t xml:space="preserve"> i filen: meter, mark, vattengång). Med en höjdmodell som raster tas en markhöjd per rastercell (cellstorleken läses ur rastret, t.ex. 0,25 m eller 1 m, och höjden interpoleras mellan cellmitterna) så att profilen får höjdmodellens detaljeringsgrad; med flera rutor gäller den minsta cellstorleken. Ett annat avstånd kan anges under *Markhöjd* (*avstånd mellan markhöjderna*, minst 0,1 m); med ett punktlager används provtätheten (1 m). Provtätheten under Inställningar styr bara parallella ledningar, serviser och samma grav: medel, min, max, djupklass (0–2, 2–3, 3–4, &gt; 4 m) och minsta täckning (djup minus dimension). </w:t>
       </w:r>
       <w:r>
         <w:rPr>

</xml_diff>

<commit_message>
Ledningsinventering: brunnen närmast ledningsänden och rätt system (spill/dag/vatten)
Vid varje ledningsände behålls bara brunnen närmast änden, och en ledning delas
inte av brunnar av annat system (dagvattenbrunn på spillledning). Brunnens system
tas ur WellFunction/littera, ledningens ur ledningstypen.

Co-Authored-By: Claude Opus 5.5 <noreply@anthropic.com>
Claude-Session: https://claude.ai/code/session_011fdqX3JEZje1LF9LqpaqR8
</commit_message>
<xml_diff>
--- a/Anvandarhandledning tv3_analys.docx
+++ b/Anvandarhandledning tv3_analys.docx
@@ -16164,6 +16164,26 @@
       </w:r>
       <w:r>
         <w:t xml:space="preserve"> ur locknivå minus vattengång i brunnarna. Negativ täckning flaggas *ledning över mark*.</w:t>
+      </w:r>
+    </w:p>
+    <w:p>
+      <w:pPr>
+        <w:pStyle w:val="ListParagraph"/>
+        <w:numPr>
+          <w:ilvl w:val="0"/>
+          <w:numId w:val="3"/>
+        </w:numPr>
+        <w:spacing w:after="80"/>
+      </w:pPr>
+      <w:r>
+        <w:rPr>
+          <w:b/>
+          <w:bCs/>
+        </w:rPr>
+        <w:t xml:space="preserve">Brunnar vid ledningarna.</w:t>
+      </w:r>
+      <w:r>
+        <w:t xml:space="preserve"> En ledning delas där en brunn ligger inom toleransen från linjen. Vid varje ledningsände används bara den brunn som ligger närmast änden; andra brunnar inom toleransen där (t.ex. dagvattenbrunnen bredvid spillbrunnen) delar inte ledningen. Spill och dag blandas inte: brunnens system tas ur brunnstypen (*WellFunction*: SNBL, DNB, KNB …) eller littera, ledningens ur ledningstypen (SSL, DSL, KSL) och vattenlagren är vatten. En spillledning delas aldrig av en dagvattenbrunn den passerar och tvärtom; kombinerade brunnar och ledningar passar till båda, vatten och avlopp hålls isär. Finns bara en brunn av fel system vid en ände används den ändå (hellre än en fri ände). Loggen räknar hur ofta det hände.</w:t>
       </w:r>
     </w:p>
     <w:p>

</xml_diff>